<commit_message>
Update Systeem-Audit NL 05-10-2026 15:27
</commit_message>
<xml_diff>
--- a/nl/docx/document-0.docx
+++ b/nl/docx/document-0.docx
@@ -7,7 +7,7 @@
         <w:spacing w:after="480"/>
         <w:jc w:val="center"/>
         <w:outlineLvl w:val="1"/>
-        <w:divId w:val="1408964286"/>
+        <w:divId w:val="588344898"/>
         <w:rPr>
           <w:rFonts w:ascii="Aptos Display" w:eastAsia="Times New Roman" w:hAnsi="Aptos Display"/>
           <w:b/>
@@ -36,7 +36,7 @@
     <w:p>
       <w:pPr>
         <w:pStyle w:val="ondertitel2"/>
-        <w:divId w:val="1408964286"/>
+        <w:divId w:val="588344898"/>
         <w:rPr>
           <w:lang w:val="nl-NL"/>
         </w:rPr>
@@ -51,7 +51,7 @@
     <w:p>
       <w:pPr>
         <w:pStyle w:val="documentaanduiding2"/>
-        <w:divId w:val="1408964286"/>
+        <w:divId w:val="588344898"/>
         <w:rPr>
           <w:lang w:val="nl-NL"/>
         </w:rPr>
@@ -66,7 +66,7 @@
     <w:p>
       <w:pPr>
         <w:pStyle w:val="auteur2"/>
-        <w:divId w:val="1408964286"/>
+        <w:divId w:val="588344898"/>
         <w:rPr>
           <w:lang w:val="nl-NL"/>
         </w:rPr>
@@ -81,23 +81,23 @@
     <w:p>
       <w:pPr>
         <w:pStyle w:val="meta-lijn2"/>
-        <w:divId w:val="1408964286"/>
-        <w:rPr>
-          <w:lang w:val="nl-NL"/>
-        </w:rPr>
-      </w:pPr>
-      <w:r>
-        <w:rPr>
-          <w:lang w:val="nl-NL"/>
-        </w:rPr>
-        <w:t>Versie bijgewerkt: 1 oktober 2026, 13:02</w:t>
+        <w:divId w:val="588344898"/>
+        <w:rPr>
+          <w:lang w:val="nl-NL"/>
+        </w:rPr>
+      </w:pPr>
+      <w:r>
+        <w:rPr>
+          <w:lang w:val="nl-NL"/>
+        </w:rPr>
+        <w:t>Versie bijgewerkt: 5 oktober 2026, 15:27</w:t>
       </w:r>
     </w:p>
     <w:p>
       <w:pPr>
         <w:pStyle w:val="marker"/>
         <w:ind w:left="800" w:right="800"/>
-        <w:divId w:val="657154799"/>
+        <w:divId w:val="1635794162"/>
         <w:rPr>
           <w:lang w:val="nl-NL"/>
         </w:rPr>
@@ -110,13 +110,13 @@
       <w:pPr>
         <w:pStyle w:val="Kop2"/>
         <w:pageBreakBefore/>
-        <w:divId w:val="61294296"/>
+        <w:divId w:val="62677467"/>
         <w:rPr>
           <w:rFonts w:eastAsia="Times New Roman"/>
           <w:lang w:val="nl-NL"/>
         </w:rPr>
       </w:pPr>
-      <w:bookmarkStart w:id="0" w:name="_Toc241752273"/>
+      <w:bookmarkStart w:id="0" w:name="_Toc242106546"/>
       <w:r>
         <w:rPr>
           <w:rFonts w:eastAsia="Times New Roman"/>
@@ -133,7 +133,7 @@
         <w:tabs>
           <w:tab w:val="right" w:leader="dot" w:pos="9062"/>
         </w:tabs>
-        <w:divId w:val="61294296"/>
+        <w:divId w:val="62677467"/>
         <w:rPr>
           <w:rFonts w:asciiTheme="minorHAnsi" w:hAnsiTheme="minorHAnsi" w:cstheme="minorBidi"/>
           <w:noProof/>
@@ -184,7 +184,7 @@
         <w:rPr>
           <w:noProof/>
         </w:rPr>
-        <w:instrText xml:space="preserve"> PAGEREF _Toc241752273 \h </w:instrText>
+        <w:instrText xml:space="preserve"> PAGEREF _Toc242106546 \h </w:instrText>
       </w:r>
       <w:r>
         <w:rPr>
@@ -216,7 +216,7 @@
         <w:tabs>
           <w:tab w:val="right" w:leader="dot" w:pos="9062"/>
         </w:tabs>
-        <w:divId w:val="61294296"/>
+        <w:divId w:val="62677467"/>
         <w:rPr>
           <w:rFonts w:asciiTheme="minorHAnsi" w:hAnsiTheme="minorHAnsi" w:cstheme="minorBidi"/>
           <w:noProof/>
@@ -249,7 +249,7 @@
         <w:rPr>
           <w:noProof/>
         </w:rPr>
-        <w:instrText xml:space="preserve"> PAGEREF _Toc241752274 \h </w:instrText>
+        <w:instrText xml:space="preserve"> PAGEREF _Toc242106547 \h </w:instrText>
       </w:r>
       <w:r>
         <w:rPr>
@@ -281,7 +281,7 @@
         <w:tabs>
           <w:tab w:val="right" w:leader="dot" w:pos="9062"/>
         </w:tabs>
-        <w:divId w:val="61294296"/>
+        <w:divId w:val="62677467"/>
         <w:rPr>
           <w:rFonts w:asciiTheme="minorHAnsi" w:hAnsiTheme="minorHAnsi" w:cstheme="minorBidi"/>
           <w:noProof/>
@@ -314,7 +314,7 @@
         <w:rPr>
           <w:noProof/>
         </w:rPr>
-        <w:instrText xml:space="preserve"> PAGEREF _Toc241752275 \h </w:instrText>
+        <w:instrText xml:space="preserve"> PAGEREF _Toc242106548 \h </w:instrText>
       </w:r>
       <w:r>
         <w:rPr>
@@ -346,7 +346,7 @@
         <w:tabs>
           <w:tab w:val="right" w:leader="dot" w:pos="9062"/>
         </w:tabs>
-        <w:divId w:val="61294296"/>
+        <w:divId w:val="62677467"/>
         <w:rPr>
           <w:rFonts w:asciiTheme="minorHAnsi" w:hAnsiTheme="minorHAnsi" w:cstheme="minorBidi"/>
           <w:noProof/>
@@ -379,7 +379,7 @@
         <w:rPr>
           <w:noProof/>
         </w:rPr>
-        <w:instrText xml:space="preserve"> PAGEREF _Toc241752276 \h </w:instrText>
+        <w:instrText xml:space="preserve"> PAGEREF _Toc242106549 \h </w:instrText>
       </w:r>
       <w:r>
         <w:rPr>
@@ -411,7 +411,7 @@
         <w:tabs>
           <w:tab w:val="right" w:leader="dot" w:pos="9062"/>
         </w:tabs>
-        <w:divId w:val="61294296"/>
+        <w:divId w:val="62677467"/>
         <w:rPr>
           <w:rFonts w:asciiTheme="minorHAnsi" w:hAnsiTheme="minorHAnsi" w:cstheme="minorBidi"/>
           <w:noProof/>
@@ -444,7 +444,7 @@
         <w:rPr>
           <w:noProof/>
         </w:rPr>
-        <w:instrText xml:space="preserve"> PAGEREF _Toc241752277 \h </w:instrText>
+        <w:instrText xml:space="preserve"> PAGEREF _Toc242106550 \h </w:instrText>
       </w:r>
       <w:r>
         <w:rPr>
@@ -476,7 +476,7 @@
         <w:tabs>
           <w:tab w:val="right" w:leader="dot" w:pos="9062"/>
         </w:tabs>
-        <w:divId w:val="61294296"/>
+        <w:divId w:val="62677467"/>
         <w:rPr>
           <w:rFonts w:asciiTheme="minorHAnsi" w:hAnsiTheme="minorHAnsi" w:cstheme="minorBidi"/>
           <w:noProof/>
@@ -509,7 +509,7 @@
         <w:rPr>
           <w:noProof/>
         </w:rPr>
-        <w:instrText xml:space="preserve"> PAGEREF _Toc241752278 \h </w:instrText>
+        <w:instrText xml:space="preserve"> PAGEREF _Toc242106551 \h </w:instrText>
       </w:r>
       <w:r>
         <w:rPr>
@@ -541,7 +541,7 @@
         <w:tabs>
           <w:tab w:val="right" w:leader="dot" w:pos="9062"/>
         </w:tabs>
-        <w:divId w:val="61294296"/>
+        <w:divId w:val="62677467"/>
         <w:rPr>
           <w:rFonts w:asciiTheme="minorHAnsi" w:hAnsiTheme="minorHAnsi" w:cstheme="minorBidi"/>
           <w:noProof/>
@@ -574,7 +574,7 @@
         <w:rPr>
           <w:noProof/>
         </w:rPr>
-        <w:instrText xml:space="preserve"> PAGEREF _Toc241752279 \h </w:instrText>
+        <w:instrText xml:space="preserve"> PAGEREF _Toc242106552 \h </w:instrText>
       </w:r>
       <w:r>
         <w:rPr>
@@ -606,7 +606,7 @@
         <w:tabs>
           <w:tab w:val="right" w:leader="dot" w:pos="9062"/>
         </w:tabs>
-        <w:divId w:val="61294296"/>
+        <w:divId w:val="62677467"/>
         <w:rPr>
           <w:rFonts w:asciiTheme="minorHAnsi" w:hAnsiTheme="minorHAnsi" w:cstheme="minorBidi"/>
           <w:noProof/>
@@ -639,7 +639,7 @@
         <w:rPr>
           <w:noProof/>
         </w:rPr>
-        <w:instrText xml:space="preserve"> PAGEREF _Toc241752280 \h </w:instrText>
+        <w:instrText xml:space="preserve"> PAGEREF _Toc242106553 \h </w:instrText>
       </w:r>
       <w:r>
         <w:rPr>
@@ -671,7 +671,7 @@
         <w:tabs>
           <w:tab w:val="right" w:leader="dot" w:pos="9062"/>
         </w:tabs>
-        <w:divId w:val="61294296"/>
+        <w:divId w:val="62677467"/>
         <w:rPr>
           <w:rFonts w:asciiTheme="minorHAnsi" w:hAnsiTheme="minorHAnsi" w:cstheme="minorBidi"/>
           <w:noProof/>
@@ -704,7 +704,7 @@
         <w:rPr>
           <w:noProof/>
         </w:rPr>
-        <w:instrText xml:space="preserve"> PAGEREF _Toc241752281 \h </w:instrText>
+        <w:instrText xml:space="preserve"> PAGEREF _Toc242106554 \h </w:instrText>
       </w:r>
       <w:r>
         <w:rPr>
@@ -736,7 +736,7 @@
         <w:tabs>
           <w:tab w:val="right" w:leader="dot" w:pos="9062"/>
         </w:tabs>
-        <w:divId w:val="61294296"/>
+        <w:divId w:val="62677467"/>
         <w:rPr>
           <w:rFonts w:asciiTheme="minorHAnsi" w:hAnsiTheme="minorHAnsi" w:cstheme="minorBidi"/>
           <w:noProof/>
@@ -769,7 +769,7 @@
         <w:rPr>
           <w:noProof/>
         </w:rPr>
-        <w:instrText xml:space="preserve"> PAGEREF _Toc241752282 \h </w:instrText>
+        <w:instrText xml:space="preserve"> PAGEREF _Toc242106555 \h </w:instrText>
       </w:r>
       <w:r>
         <w:rPr>
@@ -801,7 +801,7 @@
         <w:tabs>
           <w:tab w:val="right" w:leader="dot" w:pos="9062"/>
         </w:tabs>
-        <w:divId w:val="61294296"/>
+        <w:divId w:val="62677467"/>
         <w:rPr>
           <w:rFonts w:asciiTheme="minorHAnsi" w:hAnsiTheme="minorHAnsi" w:cstheme="minorBidi"/>
           <w:noProof/>
@@ -834,7 +834,7 @@
         <w:rPr>
           <w:noProof/>
         </w:rPr>
-        <w:instrText xml:space="preserve"> PAGEREF _Toc241752283 \h </w:instrText>
+        <w:instrText xml:space="preserve"> PAGEREF _Toc242106556 \h </w:instrText>
       </w:r>
       <w:r>
         <w:rPr>
@@ -866,7 +866,7 @@
         <w:tabs>
           <w:tab w:val="right" w:leader="dot" w:pos="9062"/>
         </w:tabs>
-        <w:divId w:val="61294296"/>
+        <w:divId w:val="62677467"/>
         <w:rPr>
           <w:rFonts w:asciiTheme="minorHAnsi" w:hAnsiTheme="minorHAnsi" w:cstheme="minorBidi"/>
           <w:noProof/>
@@ -899,7 +899,7 @@
         <w:rPr>
           <w:noProof/>
         </w:rPr>
-        <w:instrText xml:space="preserve"> PAGEREF _Toc241752284 \h </w:instrText>
+        <w:instrText xml:space="preserve"> PAGEREF _Toc242106557 \h </w:instrText>
       </w:r>
       <w:r>
         <w:rPr>
@@ -928,7 +928,7 @@
     <w:p>
       <w:pPr>
         <w:pStyle w:val="marker"/>
-        <w:divId w:val="61294296"/>
+        <w:divId w:val="62677467"/>
         <w:rPr>
           <w:lang w:val="nl-NL"/>
         </w:rPr>
@@ -944,7 +944,7 @@
       <w:pPr>
         <w:pStyle w:val="marker"/>
         <w:ind w:left="800" w:right="800"/>
-        <w:divId w:val="657154799"/>
+        <w:divId w:val="1635794162"/>
         <w:rPr>
           <w:lang w:val="nl-NL"/>
         </w:rPr>
@@ -956,13 +956,13 @@
     <w:p>
       <w:pPr>
         <w:pStyle w:val="Kop2"/>
-        <w:divId w:val="657154799"/>
+        <w:divId w:val="1635794162"/>
         <w:rPr>
           <w:rFonts w:eastAsia="Times New Roman"/>
           <w:lang w:val="nl-NL"/>
         </w:rPr>
       </w:pPr>
-      <w:bookmarkStart w:id="1" w:name="_Toc241752274"/>
+      <w:bookmarkStart w:id="1" w:name="_Toc242106547"/>
       <w:r>
         <w:rPr>
           <w:rFonts w:eastAsia="Times New Roman"/>
@@ -975,7 +975,7 @@
     <w:p>
       <w:pPr>
         <w:pStyle w:val="Normaalweb"/>
-        <w:divId w:val="657154799"/>
+        <w:divId w:val="1635794162"/>
         <w:rPr>
           <w:lang w:val="nl-NL"/>
         </w:rPr>
@@ -990,7 +990,7 @@
     <w:p>
       <w:pPr>
         <w:pStyle w:val="Normaalweb"/>
-        <w:divId w:val="657154799"/>
+        <w:divId w:val="1635794162"/>
         <w:rPr>
           <w:lang w:val="nl-NL"/>
         </w:rPr>
@@ -1018,7 +1018,7 @@
     <w:p>
       <w:pPr>
         <w:pStyle w:val="Normaalweb"/>
-        <w:divId w:val="657154799"/>
+        <w:divId w:val="1635794162"/>
         <w:rPr>
           <w:lang w:val="nl-NL"/>
         </w:rPr>
@@ -1039,7 +1039,7 @@
     <w:p>
       <w:pPr>
         <w:pStyle w:val="Normaalweb"/>
-        <w:divId w:val="657154799"/>
+        <w:divId w:val="1635794162"/>
         <w:rPr>
           <w:lang w:val="nl-NL"/>
         </w:rPr>
@@ -1086,7 +1086,7 @@
     <w:p>
       <w:pPr>
         <w:pStyle w:val="Normaalweb"/>
-        <w:divId w:val="657154799"/>
+        <w:divId w:val="1635794162"/>
         <w:rPr>
           <w:lang w:val="nl-NL"/>
         </w:rPr>
@@ -1107,7 +1107,7 @@
     <w:p>
       <w:pPr>
         <w:pStyle w:val="Normaalweb"/>
-        <w:divId w:val="657154799"/>
+        <w:divId w:val="1635794162"/>
         <w:rPr>
           <w:lang w:val="nl-NL"/>
         </w:rPr>
@@ -1142,7 +1142,7 @@
     <w:p>
       <w:pPr>
         <w:pStyle w:val="Normaalweb"/>
-        <w:divId w:val="657154799"/>
+        <w:divId w:val="1635794162"/>
         <w:rPr>
           <w:lang w:val="nl-NL"/>
         </w:rPr>
@@ -1169,7 +1169,7 @@
     <w:p>
       <w:pPr>
         <w:pStyle w:val="Normaalweb"/>
-        <w:divId w:val="657154799"/>
+        <w:divId w:val="1635794162"/>
         <w:rPr>
           <w:lang w:val="nl-NL"/>
         </w:rPr>
@@ -1197,7 +1197,7 @@
     <w:p>
       <w:pPr>
         <w:pStyle w:val="Normaalweb"/>
-        <w:divId w:val="657154799"/>
+        <w:divId w:val="1635794162"/>
         <w:rPr>
           <w:lang w:val="nl-NL"/>
         </w:rPr>
@@ -1212,7 +1212,7 @@
     <w:p>
       <w:pPr>
         <w:pStyle w:val="Normaalweb"/>
-        <w:divId w:val="657154799"/>
+        <w:divId w:val="1635794162"/>
         <w:rPr>
           <w:lang w:val="nl-NL"/>
         </w:rPr>
@@ -1278,7 +1278,7 @@
     <w:p>
       <w:pPr>
         <w:pStyle w:val="Normaalweb"/>
-        <w:divId w:val="657154799"/>
+        <w:divId w:val="1635794162"/>
         <w:rPr>
           <w:lang w:val="nl-NL"/>
         </w:rPr>
@@ -1293,7 +1293,7 @@
     <w:p>
       <w:pPr>
         <w:pStyle w:val="Normaalweb"/>
-        <w:divId w:val="657154799"/>
+        <w:divId w:val="1635794162"/>
         <w:rPr>
           <w:lang w:val="nl-NL"/>
         </w:rPr>
@@ -1321,7 +1321,7 @@
     <w:p>
       <w:pPr>
         <w:pStyle w:val="Normaalweb"/>
-        <w:divId w:val="657154799"/>
+        <w:divId w:val="1635794162"/>
         <w:rPr>
           <w:lang w:val="nl-NL"/>
         </w:rPr>
@@ -1336,7 +1336,7 @@
     <w:p>
       <w:pPr>
         <w:pStyle w:val="Normaalweb"/>
-        <w:divId w:val="657154799"/>
+        <w:divId w:val="1635794162"/>
         <w:rPr>
           <w:lang w:val="nl-NL"/>
         </w:rPr>
@@ -1351,7 +1351,7 @@
     <w:p>
       <w:pPr>
         <w:pStyle w:val="Normaalweb"/>
-        <w:divId w:val="657154799"/>
+        <w:divId w:val="1635794162"/>
         <w:rPr>
           <w:lang w:val="nl-NL"/>
         </w:rPr>
@@ -1366,7 +1366,7 @@
     <w:p>
       <w:pPr>
         <w:spacing w:before="300" w:after="200"/>
-        <w:divId w:val="657154799"/>
+        <w:divId w:val="1635794162"/>
         <w:rPr>
           <w:rFonts w:eastAsia="Times New Roman"/>
           <w:lang w:val="nl-NL"/>
@@ -1377,14 +1377,14 @@
           <w:rFonts w:eastAsia="Times New Roman"/>
           <w:lang w:val="nl-NL"/>
         </w:rPr>
-        <w:pict w14:anchorId="64F27031">
+        <w:pict w14:anchorId="2CE34F55">
           <v:rect id="_x0000_i1025" style="width:0;height:1.5pt" o:hralign="center" o:hrstd="t" o:hr="t" fillcolor="#a0a0a0" stroked="f"/>
         </w:pict>
       </w:r>
     </w:p>
     <w:p>
       <w:pPr>
-        <w:divId w:val="2043675193"/>
+        <w:divId w:val="590554341"/>
         <w:rPr>
           <w:color w:val="555555"/>
           <w:sz w:val="20"/>
@@ -1423,7 +1423,7 @@
     </w:p>
     <w:p>
       <w:pPr>
-        <w:divId w:val="2043675193"/>
+        <w:divId w:val="590554341"/>
         <w:rPr>
           <w:color w:val="555555"/>
           <w:sz w:val="20"/>
@@ -1453,7 +1453,7 @@
     </w:p>
     <w:p>
       <w:pPr>
-        <w:divId w:val="2043675193"/>
+        <w:divId w:val="590554341"/>
         <w:rPr>
           <w:color w:val="555555"/>
           <w:sz w:val="20"/>
@@ -1493,7 +1493,7 @@
     </w:p>
     <w:p>
       <w:pPr>
-        <w:divId w:val="2043675193"/>
+        <w:divId w:val="590554341"/>
         <w:rPr>
           <w:color w:val="555555"/>
           <w:sz w:val="20"/>
@@ -1525,7 +1525,7 @@
       <w:pPr>
         <w:pStyle w:val="marker"/>
         <w:ind w:left="800" w:right="800"/>
-        <w:divId w:val="657154799"/>
+        <w:divId w:val="1635794162"/>
         <w:rPr>
           <w:lang w:val="nl-NL"/>
         </w:rPr>
@@ -1537,13 +1537,13 @@
     <w:p>
       <w:pPr>
         <w:pStyle w:val="Kop2"/>
-        <w:divId w:val="657154799"/>
+        <w:divId w:val="1635794162"/>
         <w:rPr>
           <w:rFonts w:eastAsia="Times New Roman"/>
           <w:lang w:val="nl-NL"/>
         </w:rPr>
       </w:pPr>
-      <w:bookmarkStart w:id="2" w:name="_Toc241752275"/>
+      <w:bookmarkStart w:id="2" w:name="_Toc242106548"/>
       <w:r>
         <w:rPr>
           <w:rFonts w:eastAsia="Times New Roman"/>
@@ -1556,7 +1556,7 @@
     <w:p>
       <w:pPr>
         <w:pStyle w:val="Normaalweb"/>
-        <w:divId w:val="657154799"/>
+        <w:divId w:val="1635794162"/>
         <w:rPr>
           <w:lang w:val="nl-NL"/>
         </w:rPr>
@@ -1571,7 +1571,7 @@
     <w:p>
       <w:pPr>
         <w:pStyle w:val="Normaalweb"/>
-        <w:divId w:val="657154799"/>
+        <w:divId w:val="1635794162"/>
         <w:rPr>
           <w:lang w:val="nl-NL"/>
         </w:rPr>
@@ -1586,7 +1586,7 @@
     <w:p>
       <w:pPr>
         <w:pStyle w:val="Normaalweb"/>
-        <w:divId w:val="657154799"/>
+        <w:divId w:val="1635794162"/>
         <w:rPr>
           <w:lang w:val="nl-NL"/>
         </w:rPr>
@@ -1601,13 +1601,13 @@
     <w:p>
       <w:pPr>
         <w:pStyle w:val="Kop2"/>
-        <w:divId w:val="657154799"/>
+        <w:divId w:val="1635794162"/>
         <w:rPr>
           <w:rFonts w:eastAsia="Times New Roman"/>
           <w:lang w:val="nl-NL"/>
         </w:rPr>
       </w:pPr>
-      <w:bookmarkStart w:id="3" w:name="_Toc241752276"/>
+      <w:bookmarkStart w:id="3" w:name="_Toc242106549"/>
       <w:r>
         <w:rPr>
           <w:rFonts w:eastAsia="Times New Roman"/>
@@ -1620,7 +1620,7 @@
     <w:p>
       <w:pPr>
         <w:pStyle w:val="Normaalweb"/>
-        <w:divId w:val="657154799"/>
+        <w:divId w:val="1635794162"/>
         <w:rPr>
           <w:lang w:val="nl-NL"/>
         </w:rPr>
@@ -1635,13 +1635,13 @@
     <w:p>
       <w:pPr>
         <w:pStyle w:val="Kop2"/>
-        <w:divId w:val="657154799"/>
+        <w:divId w:val="1635794162"/>
         <w:rPr>
           <w:rFonts w:eastAsia="Times New Roman"/>
           <w:lang w:val="nl-NL"/>
         </w:rPr>
       </w:pPr>
-      <w:bookmarkStart w:id="4" w:name="_Toc241752277"/>
+      <w:bookmarkStart w:id="4" w:name="_Toc242106550"/>
       <w:r>
         <w:rPr>
           <w:rFonts w:eastAsia="Times New Roman"/>
@@ -1654,7 +1654,7 @@
     <w:p>
       <w:pPr>
         <w:pStyle w:val="Normaalweb"/>
-        <w:divId w:val="657154799"/>
+        <w:divId w:val="1635794162"/>
         <w:rPr>
           <w:lang w:val="nl-NL"/>
         </w:rPr>
@@ -1669,13 +1669,13 @@
     <w:p>
       <w:pPr>
         <w:pStyle w:val="Kop3"/>
-        <w:divId w:val="657154799"/>
+        <w:divId w:val="1635794162"/>
         <w:rPr>
           <w:rFonts w:eastAsia="Times New Roman"/>
           <w:lang w:val="nl-NL"/>
         </w:rPr>
       </w:pPr>
-      <w:bookmarkStart w:id="5" w:name="_Toc241752278"/>
+      <w:bookmarkStart w:id="5" w:name="_Toc242106551"/>
       <w:r>
         <w:rPr>
           <w:rFonts w:eastAsia="Times New Roman"/>
@@ -1688,7 +1688,7 @@
     <w:p>
       <w:pPr>
         <w:pStyle w:val="Normaalweb"/>
-        <w:divId w:val="657154799"/>
+        <w:divId w:val="1635794162"/>
         <w:rPr>
           <w:lang w:val="nl-NL"/>
         </w:rPr>
@@ -1703,13 +1703,13 @@
     <w:p>
       <w:pPr>
         <w:pStyle w:val="Kop3"/>
-        <w:divId w:val="657154799"/>
+        <w:divId w:val="1635794162"/>
         <w:rPr>
           <w:rFonts w:eastAsia="Times New Roman"/>
           <w:lang w:val="nl-NL"/>
         </w:rPr>
       </w:pPr>
-      <w:bookmarkStart w:id="6" w:name="_Toc241752279"/>
+      <w:bookmarkStart w:id="6" w:name="_Toc242106552"/>
       <w:r>
         <w:rPr>
           <w:rFonts w:eastAsia="Times New Roman"/>
@@ -1722,7 +1722,7 @@
     <w:p>
       <w:pPr>
         <w:pStyle w:val="Normaalweb"/>
-        <w:divId w:val="657154799"/>
+        <w:divId w:val="1635794162"/>
         <w:rPr>
           <w:lang w:val="nl-NL"/>
         </w:rPr>
@@ -1737,13 +1737,13 @@
     <w:p>
       <w:pPr>
         <w:pStyle w:val="Kop3"/>
-        <w:divId w:val="657154799"/>
+        <w:divId w:val="1635794162"/>
         <w:rPr>
           <w:rFonts w:eastAsia="Times New Roman"/>
           <w:lang w:val="nl-NL"/>
         </w:rPr>
       </w:pPr>
-      <w:bookmarkStart w:id="7" w:name="_Toc241752280"/>
+      <w:bookmarkStart w:id="7" w:name="_Toc242106553"/>
       <w:r>
         <w:rPr>
           <w:rFonts w:eastAsia="Times New Roman"/>
@@ -1756,7 +1756,7 @@
     <w:p>
       <w:pPr>
         <w:pStyle w:val="Normaalweb"/>
-        <w:divId w:val="657154799"/>
+        <w:divId w:val="1635794162"/>
         <w:rPr>
           <w:lang w:val="nl-NL"/>
         </w:rPr>
@@ -1771,13 +1771,13 @@
     <w:p>
       <w:pPr>
         <w:pStyle w:val="Kop3"/>
-        <w:divId w:val="657154799"/>
+        <w:divId w:val="1635794162"/>
         <w:rPr>
           <w:rFonts w:eastAsia="Times New Roman"/>
           <w:lang w:val="nl-NL"/>
         </w:rPr>
       </w:pPr>
-      <w:bookmarkStart w:id="8" w:name="_Toc241752281"/>
+      <w:bookmarkStart w:id="8" w:name="_Toc242106554"/>
       <w:r>
         <w:rPr>
           <w:rFonts w:eastAsia="Times New Roman"/>
@@ -1790,7 +1790,7 @@
     <w:p>
       <w:pPr>
         <w:pStyle w:val="Normaalweb"/>
-        <w:divId w:val="657154799"/>
+        <w:divId w:val="1635794162"/>
         <w:rPr>
           <w:lang w:val="nl-NL"/>
         </w:rPr>
@@ -1806,13 +1806,13 @@
     <w:p>
       <w:pPr>
         <w:pStyle w:val="Kop2"/>
-        <w:divId w:val="657154799"/>
+        <w:divId w:val="1635794162"/>
         <w:rPr>
           <w:rFonts w:eastAsia="Times New Roman"/>
           <w:lang w:val="nl-NL"/>
         </w:rPr>
       </w:pPr>
-      <w:bookmarkStart w:id="9" w:name="_Toc241752282"/>
+      <w:bookmarkStart w:id="9" w:name="_Toc242106555"/>
       <w:r>
         <w:rPr>
           <w:rFonts w:eastAsia="Times New Roman"/>
@@ -1825,7 +1825,7 @@
     <w:p>
       <w:pPr>
         <w:pStyle w:val="Normaalweb"/>
-        <w:divId w:val="657154799"/>
+        <w:divId w:val="1635794162"/>
         <w:rPr>
           <w:lang w:val="nl-NL"/>
         </w:rPr>
@@ -1840,7 +1840,7 @@
     <w:p>
       <w:pPr>
         <w:pStyle w:val="Normaalweb"/>
-        <w:divId w:val="657154799"/>
+        <w:divId w:val="1635794162"/>
         <w:rPr>
           <w:lang w:val="nl-NL"/>
         </w:rPr>
@@ -1855,7 +1855,7 @@
     <w:p>
       <w:pPr>
         <w:pStyle w:val="Normaalweb"/>
-        <w:divId w:val="657154799"/>
+        <w:divId w:val="1635794162"/>
         <w:rPr>
           <w:lang w:val="nl-NL"/>
         </w:rPr>
@@ -1870,13 +1870,13 @@
     <w:p>
       <w:pPr>
         <w:pStyle w:val="Kop2"/>
-        <w:divId w:val="657154799"/>
+        <w:divId w:val="1635794162"/>
         <w:rPr>
           <w:rFonts w:eastAsia="Times New Roman"/>
           <w:lang w:val="nl-NL"/>
         </w:rPr>
       </w:pPr>
-      <w:bookmarkStart w:id="10" w:name="_Toc241752283"/>
+      <w:bookmarkStart w:id="10" w:name="_Toc242106556"/>
       <w:r>
         <w:rPr>
           <w:rFonts w:eastAsia="Times New Roman"/>
@@ -1889,7 +1889,7 @@
     <w:p>
       <w:pPr>
         <w:pStyle w:val="Normaalweb"/>
-        <w:divId w:val="657154799"/>
+        <w:divId w:val="1635794162"/>
         <w:rPr>
           <w:lang w:val="nl-NL"/>
         </w:rPr>
@@ -1904,7 +1904,7 @@
     <w:p>
       <w:pPr>
         <w:pStyle w:val="Normaalweb"/>
-        <w:divId w:val="657154799"/>
+        <w:divId w:val="1635794162"/>
         <w:rPr>
           <w:lang w:val="nl-NL"/>
         </w:rPr>
@@ -1919,13 +1919,13 @@
     <w:p>
       <w:pPr>
         <w:pStyle w:val="Kop2"/>
-        <w:divId w:val="657154799"/>
+        <w:divId w:val="1635794162"/>
         <w:rPr>
           <w:rFonts w:eastAsia="Times New Roman"/>
           <w:lang w:val="nl-NL"/>
         </w:rPr>
       </w:pPr>
-      <w:bookmarkStart w:id="11" w:name="_Toc241752284"/>
+      <w:bookmarkStart w:id="11" w:name="_Toc242106557"/>
       <w:r>
         <w:rPr>
           <w:rFonts w:eastAsia="Times New Roman"/>
@@ -1938,7 +1938,7 @@
     <w:p>
       <w:pPr>
         <w:pStyle w:val="Normaalweb"/>
-        <w:divId w:val="657154799"/>
+        <w:divId w:val="1635794162"/>
         <w:rPr>
           <w:lang w:val="nl-NL"/>
         </w:rPr>
@@ -1953,7 +1953,7 @@
     <w:p>
       <w:pPr>
         <w:pStyle w:val="Normaalweb"/>
-        <w:divId w:val="657154799"/>
+        <w:divId w:val="1635794162"/>
         <w:rPr>
           <w:lang w:val="nl-NL"/>
         </w:rPr>
@@ -1969,7 +1969,7 @@
       <w:pPr>
         <w:shd w:val="clear" w:color="auto" w:fill="FFFFFF"/>
         <w:jc w:val="both"/>
-        <w:divId w:val="1268661817"/>
+        <w:divId w:val="1998537745"/>
         <w:rPr>
           <w:szCs w:val="22"/>
           <w:lang w:val="nl-NL"/>
@@ -2145,7 +2145,7 @@
         <w:color w:val="808080"/>
         <w:sz w:val="18"/>
       </w:rPr>
-      <w:t>6</w:t>
+      <w:t>2</w:t>
     </w:r>
     <w:r>
       <w:rPr>
@@ -2237,7 +2237,7 @@
         <w:sz w:val="18"/>
       </w:rPr>
       <w:tab/>
-      <w:t>Laatst gewijzigd: 1 oktober 2026, 13:02</w:t>
+      <w:t>Laatst gewijzigd: 5 oktober 2026, 15:27</w:t>
     </w:r>
   </w:p>
 </w:hdr>
@@ -3489,7 +3489,7 @@
     <w:link w:val="KoptekstChar"/>
     <w:uiPriority w:val="99"/>
     <w:unhideWhenUsed/>
-    <w:rsid w:val="00594B8C"/>
+    <w:rsid w:val="00E14CB4"/>
     <w:pPr>
       <w:tabs>
         <w:tab w:val="center" w:pos="4536"/>
@@ -3502,7 +3502,7 @@
     <w:basedOn w:val="Standaardalinea-lettertype"/>
     <w:link w:val="Koptekst"/>
     <w:uiPriority w:val="99"/>
-    <w:rsid w:val="00594B8C"/>
+    <w:rsid w:val="00E14CB4"/>
     <w:rPr>
       <w:rFonts w:eastAsiaTheme="minorEastAsia"/>
       <w:sz w:val="24"/>
@@ -3515,7 +3515,7 @@
     <w:link w:val="VoettekstChar"/>
     <w:uiPriority w:val="99"/>
     <w:unhideWhenUsed/>
-    <w:rsid w:val="00594B8C"/>
+    <w:rsid w:val="00E14CB4"/>
     <w:pPr>
       <w:tabs>
         <w:tab w:val="center" w:pos="4536"/>
@@ -3528,7 +3528,7 @@
     <w:basedOn w:val="Standaardalinea-lettertype"/>
     <w:link w:val="Voettekst"/>
     <w:uiPriority w:val="99"/>
-    <w:rsid w:val="00594B8C"/>
+    <w:rsid w:val="00E14CB4"/>
     <w:rPr>
       <w:rFonts w:eastAsiaTheme="minorEastAsia"/>
       <w:sz w:val="24"/>
@@ -3542,7 +3542,7 @@
     <w:autoRedefine/>
     <w:uiPriority w:val="39"/>
     <w:unhideWhenUsed/>
-    <w:rsid w:val="00594B8C"/>
+    <w:rsid w:val="00E14CB4"/>
     <w:pPr>
       <w:spacing w:after="100"/>
       <w:ind w:left="220"/>
@@ -3555,7 +3555,7 @@
     <w:autoRedefine/>
     <w:uiPriority w:val="39"/>
     <w:unhideWhenUsed/>
-    <w:rsid w:val="00594B8C"/>
+    <w:rsid w:val="00E14CB4"/>
     <w:pPr>
       <w:spacing w:after="100"/>
       <w:ind w:left="440"/>

</xml_diff>

<commit_message>
Update Systeem-Audit NL 05-10-2026 15:55
</commit_message>
<xml_diff>
--- a/nl/docx/document-0.docx
+++ b/nl/docx/document-0.docx
@@ -7,7 +7,7 @@
         <w:spacing w:after="480"/>
         <w:jc w:val="center"/>
         <w:outlineLvl w:val="1"/>
-        <w:divId w:val="588344898"/>
+        <w:divId w:val="1401907706"/>
         <w:rPr>
           <w:rFonts w:ascii="Aptos Display" w:eastAsia="Times New Roman" w:hAnsi="Aptos Display"/>
           <w:b/>
@@ -36,7 +36,7 @@
     <w:p>
       <w:pPr>
         <w:pStyle w:val="ondertitel2"/>
-        <w:divId w:val="588344898"/>
+        <w:divId w:val="1401907706"/>
         <w:rPr>
           <w:lang w:val="nl-NL"/>
         </w:rPr>
@@ -51,7 +51,7 @@
     <w:p>
       <w:pPr>
         <w:pStyle w:val="documentaanduiding2"/>
-        <w:divId w:val="588344898"/>
+        <w:divId w:val="1401907706"/>
         <w:rPr>
           <w:lang w:val="nl-NL"/>
         </w:rPr>
@@ -66,7 +66,7 @@
     <w:p>
       <w:pPr>
         <w:pStyle w:val="auteur2"/>
-        <w:divId w:val="588344898"/>
+        <w:divId w:val="1401907706"/>
         <w:rPr>
           <w:lang w:val="nl-NL"/>
         </w:rPr>
@@ -81,23 +81,23 @@
     <w:p>
       <w:pPr>
         <w:pStyle w:val="meta-lijn2"/>
-        <w:divId w:val="588344898"/>
-        <w:rPr>
-          <w:lang w:val="nl-NL"/>
-        </w:rPr>
-      </w:pPr>
-      <w:r>
-        <w:rPr>
-          <w:lang w:val="nl-NL"/>
-        </w:rPr>
-        <w:t>Versie bijgewerkt: 5 oktober 2026, 15:27</w:t>
+        <w:divId w:val="1401907706"/>
+        <w:rPr>
+          <w:lang w:val="nl-NL"/>
+        </w:rPr>
+      </w:pPr>
+      <w:r>
+        <w:rPr>
+          <w:lang w:val="nl-NL"/>
+        </w:rPr>
+        <w:t>Versie bijgewerkt: 5 oktober 2026, 15:55</w:t>
       </w:r>
     </w:p>
     <w:p>
       <w:pPr>
         <w:pStyle w:val="marker"/>
         <w:ind w:left="800" w:right="800"/>
-        <w:divId w:val="1635794162"/>
+        <w:divId w:val="198474154"/>
         <w:rPr>
           <w:lang w:val="nl-NL"/>
         </w:rPr>
@@ -110,13 +110,13 @@
       <w:pPr>
         <w:pStyle w:val="Kop2"/>
         <w:pageBreakBefore/>
-        <w:divId w:val="62677467"/>
+        <w:divId w:val="962806740"/>
         <w:rPr>
           <w:rFonts w:eastAsia="Times New Roman"/>
           <w:lang w:val="nl-NL"/>
         </w:rPr>
       </w:pPr>
-      <w:bookmarkStart w:id="0" w:name="_Toc242106546"/>
+      <w:bookmarkStart w:id="0" w:name="_Toc242108262"/>
       <w:r>
         <w:rPr>
           <w:rFonts w:eastAsia="Times New Roman"/>
@@ -133,7 +133,7 @@
         <w:tabs>
           <w:tab w:val="right" w:leader="dot" w:pos="9062"/>
         </w:tabs>
-        <w:divId w:val="62677467"/>
+        <w:divId w:val="962806740"/>
         <w:rPr>
           <w:rFonts w:asciiTheme="minorHAnsi" w:hAnsiTheme="minorHAnsi" w:cstheme="minorBidi"/>
           <w:noProof/>
@@ -184,7 +184,7 @@
         <w:rPr>
           <w:noProof/>
         </w:rPr>
-        <w:instrText xml:space="preserve"> PAGEREF _Toc242106546 \h </w:instrText>
+        <w:instrText xml:space="preserve"> PAGEREF _Toc242108262 \h </w:instrText>
       </w:r>
       <w:r>
         <w:rPr>
@@ -216,7 +216,7 @@
         <w:tabs>
           <w:tab w:val="right" w:leader="dot" w:pos="9062"/>
         </w:tabs>
-        <w:divId w:val="62677467"/>
+        <w:divId w:val="962806740"/>
         <w:rPr>
           <w:rFonts w:asciiTheme="minorHAnsi" w:hAnsiTheme="minorHAnsi" w:cstheme="minorBidi"/>
           <w:noProof/>
@@ -249,7 +249,7 @@
         <w:rPr>
           <w:noProof/>
         </w:rPr>
-        <w:instrText xml:space="preserve"> PAGEREF _Toc242106547 \h </w:instrText>
+        <w:instrText xml:space="preserve"> PAGEREF _Toc242108263 \h </w:instrText>
       </w:r>
       <w:r>
         <w:rPr>
@@ -281,7 +281,7 @@
         <w:tabs>
           <w:tab w:val="right" w:leader="dot" w:pos="9062"/>
         </w:tabs>
-        <w:divId w:val="62677467"/>
+        <w:divId w:val="962806740"/>
         <w:rPr>
           <w:rFonts w:asciiTheme="minorHAnsi" w:hAnsiTheme="minorHAnsi" w:cstheme="minorBidi"/>
           <w:noProof/>
@@ -314,7 +314,7 @@
         <w:rPr>
           <w:noProof/>
         </w:rPr>
-        <w:instrText xml:space="preserve"> PAGEREF _Toc242106548 \h </w:instrText>
+        <w:instrText xml:space="preserve"> PAGEREF _Toc242108264 \h </w:instrText>
       </w:r>
       <w:r>
         <w:rPr>
@@ -346,7 +346,7 @@
         <w:tabs>
           <w:tab w:val="right" w:leader="dot" w:pos="9062"/>
         </w:tabs>
-        <w:divId w:val="62677467"/>
+        <w:divId w:val="962806740"/>
         <w:rPr>
           <w:rFonts w:asciiTheme="minorHAnsi" w:hAnsiTheme="minorHAnsi" w:cstheme="minorBidi"/>
           <w:noProof/>
@@ -379,7 +379,7 @@
         <w:rPr>
           <w:noProof/>
         </w:rPr>
-        <w:instrText xml:space="preserve"> PAGEREF _Toc242106549 \h </w:instrText>
+        <w:instrText xml:space="preserve"> PAGEREF _Toc242108265 \h </w:instrText>
       </w:r>
       <w:r>
         <w:rPr>
@@ -411,7 +411,7 @@
         <w:tabs>
           <w:tab w:val="right" w:leader="dot" w:pos="9062"/>
         </w:tabs>
-        <w:divId w:val="62677467"/>
+        <w:divId w:val="962806740"/>
         <w:rPr>
           <w:rFonts w:asciiTheme="minorHAnsi" w:hAnsiTheme="minorHAnsi" w:cstheme="minorBidi"/>
           <w:noProof/>
@@ -444,7 +444,7 @@
         <w:rPr>
           <w:noProof/>
         </w:rPr>
-        <w:instrText xml:space="preserve"> PAGEREF _Toc242106550 \h </w:instrText>
+        <w:instrText xml:space="preserve"> PAGEREF _Toc242108266 \h </w:instrText>
       </w:r>
       <w:r>
         <w:rPr>
@@ -476,7 +476,7 @@
         <w:tabs>
           <w:tab w:val="right" w:leader="dot" w:pos="9062"/>
         </w:tabs>
-        <w:divId w:val="62677467"/>
+        <w:divId w:val="962806740"/>
         <w:rPr>
           <w:rFonts w:asciiTheme="minorHAnsi" w:hAnsiTheme="minorHAnsi" w:cstheme="minorBidi"/>
           <w:noProof/>
@@ -509,7 +509,7 @@
         <w:rPr>
           <w:noProof/>
         </w:rPr>
-        <w:instrText xml:space="preserve"> PAGEREF _Toc242106551 \h </w:instrText>
+        <w:instrText xml:space="preserve"> PAGEREF _Toc242108267 \h </w:instrText>
       </w:r>
       <w:r>
         <w:rPr>
@@ -541,7 +541,7 @@
         <w:tabs>
           <w:tab w:val="right" w:leader="dot" w:pos="9062"/>
         </w:tabs>
-        <w:divId w:val="62677467"/>
+        <w:divId w:val="962806740"/>
         <w:rPr>
           <w:rFonts w:asciiTheme="minorHAnsi" w:hAnsiTheme="minorHAnsi" w:cstheme="minorBidi"/>
           <w:noProof/>
@@ -574,7 +574,7 @@
         <w:rPr>
           <w:noProof/>
         </w:rPr>
-        <w:instrText xml:space="preserve"> PAGEREF _Toc242106552 \h </w:instrText>
+        <w:instrText xml:space="preserve"> PAGEREF _Toc242108268 \h </w:instrText>
       </w:r>
       <w:r>
         <w:rPr>
@@ -606,7 +606,7 @@
         <w:tabs>
           <w:tab w:val="right" w:leader="dot" w:pos="9062"/>
         </w:tabs>
-        <w:divId w:val="62677467"/>
+        <w:divId w:val="962806740"/>
         <w:rPr>
           <w:rFonts w:asciiTheme="minorHAnsi" w:hAnsiTheme="minorHAnsi" w:cstheme="minorBidi"/>
           <w:noProof/>
@@ -639,7 +639,7 @@
         <w:rPr>
           <w:noProof/>
         </w:rPr>
-        <w:instrText xml:space="preserve"> PAGEREF _Toc242106553 \h </w:instrText>
+        <w:instrText xml:space="preserve"> PAGEREF _Toc242108269 \h </w:instrText>
       </w:r>
       <w:r>
         <w:rPr>
@@ -671,7 +671,7 @@
         <w:tabs>
           <w:tab w:val="right" w:leader="dot" w:pos="9062"/>
         </w:tabs>
-        <w:divId w:val="62677467"/>
+        <w:divId w:val="962806740"/>
         <w:rPr>
           <w:rFonts w:asciiTheme="minorHAnsi" w:hAnsiTheme="minorHAnsi" w:cstheme="minorBidi"/>
           <w:noProof/>
@@ -704,7 +704,7 @@
         <w:rPr>
           <w:noProof/>
         </w:rPr>
-        <w:instrText xml:space="preserve"> PAGEREF _Toc242106554 \h </w:instrText>
+        <w:instrText xml:space="preserve"> PAGEREF _Toc242108270 \h </w:instrText>
       </w:r>
       <w:r>
         <w:rPr>
@@ -736,7 +736,7 @@
         <w:tabs>
           <w:tab w:val="right" w:leader="dot" w:pos="9062"/>
         </w:tabs>
-        <w:divId w:val="62677467"/>
+        <w:divId w:val="962806740"/>
         <w:rPr>
           <w:rFonts w:asciiTheme="minorHAnsi" w:hAnsiTheme="minorHAnsi" w:cstheme="minorBidi"/>
           <w:noProof/>
@@ -769,7 +769,7 @@
         <w:rPr>
           <w:noProof/>
         </w:rPr>
-        <w:instrText xml:space="preserve"> PAGEREF _Toc242106555 \h </w:instrText>
+        <w:instrText xml:space="preserve"> PAGEREF _Toc242108271 \h </w:instrText>
       </w:r>
       <w:r>
         <w:rPr>
@@ -801,7 +801,7 @@
         <w:tabs>
           <w:tab w:val="right" w:leader="dot" w:pos="9062"/>
         </w:tabs>
-        <w:divId w:val="62677467"/>
+        <w:divId w:val="962806740"/>
         <w:rPr>
           <w:rFonts w:asciiTheme="minorHAnsi" w:hAnsiTheme="minorHAnsi" w:cstheme="minorBidi"/>
           <w:noProof/>
@@ -834,7 +834,7 @@
         <w:rPr>
           <w:noProof/>
         </w:rPr>
-        <w:instrText xml:space="preserve"> PAGEREF _Toc242106556 \h </w:instrText>
+        <w:instrText xml:space="preserve"> PAGEREF _Toc242108272 \h </w:instrText>
       </w:r>
       <w:r>
         <w:rPr>
@@ -866,7 +866,7 @@
         <w:tabs>
           <w:tab w:val="right" w:leader="dot" w:pos="9062"/>
         </w:tabs>
-        <w:divId w:val="62677467"/>
+        <w:divId w:val="962806740"/>
         <w:rPr>
           <w:rFonts w:asciiTheme="minorHAnsi" w:hAnsiTheme="minorHAnsi" w:cstheme="minorBidi"/>
           <w:noProof/>
@@ -899,7 +899,7 @@
         <w:rPr>
           <w:noProof/>
         </w:rPr>
-        <w:instrText xml:space="preserve"> PAGEREF _Toc242106557 \h </w:instrText>
+        <w:instrText xml:space="preserve"> PAGEREF _Toc242108273 \h </w:instrText>
       </w:r>
       <w:r>
         <w:rPr>
@@ -928,7 +928,7 @@
     <w:p>
       <w:pPr>
         <w:pStyle w:val="marker"/>
-        <w:divId w:val="62677467"/>
+        <w:divId w:val="962806740"/>
         <w:rPr>
           <w:lang w:val="nl-NL"/>
         </w:rPr>
@@ -944,7 +944,7 @@
       <w:pPr>
         <w:pStyle w:val="marker"/>
         <w:ind w:left="800" w:right="800"/>
-        <w:divId w:val="1635794162"/>
+        <w:divId w:val="198474154"/>
         <w:rPr>
           <w:lang w:val="nl-NL"/>
         </w:rPr>
@@ -956,13 +956,13 @@
     <w:p>
       <w:pPr>
         <w:pStyle w:val="Kop2"/>
-        <w:divId w:val="1635794162"/>
+        <w:divId w:val="198474154"/>
         <w:rPr>
           <w:rFonts w:eastAsia="Times New Roman"/>
           <w:lang w:val="nl-NL"/>
         </w:rPr>
       </w:pPr>
-      <w:bookmarkStart w:id="1" w:name="_Toc242106547"/>
+      <w:bookmarkStart w:id="1" w:name="_Toc242108263"/>
       <w:r>
         <w:rPr>
           <w:rFonts w:eastAsia="Times New Roman"/>
@@ -975,7 +975,7 @@
     <w:p>
       <w:pPr>
         <w:pStyle w:val="Normaalweb"/>
-        <w:divId w:val="1635794162"/>
+        <w:divId w:val="198474154"/>
         <w:rPr>
           <w:lang w:val="nl-NL"/>
         </w:rPr>
@@ -990,7 +990,7 @@
     <w:p>
       <w:pPr>
         <w:pStyle w:val="Normaalweb"/>
-        <w:divId w:val="1635794162"/>
+        <w:divId w:val="198474154"/>
         <w:rPr>
           <w:lang w:val="nl-NL"/>
         </w:rPr>
@@ -1018,7 +1018,7 @@
     <w:p>
       <w:pPr>
         <w:pStyle w:val="Normaalweb"/>
-        <w:divId w:val="1635794162"/>
+        <w:divId w:val="198474154"/>
         <w:rPr>
           <w:lang w:val="nl-NL"/>
         </w:rPr>
@@ -1039,7 +1039,7 @@
     <w:p>
       <w:pPr>
         <w:pStyle w:val="Normaalweb"/>
-        <w:divId w:val="1635794162"/>
+        <w:divId w:val="198474154"/>
         <w:rPr>
           <w:lang w:val="nl-NL"/>
         </w:rPr>
@@ -1086,7 +1086,7 @@
     <w:p>
       <w:pPr>
         <w:pStyle w:val="Normaalweb"/>
-        <w:divId w:val="1635794162"/>
+        <w:divId w:val="198474154"/>
         <w:rPr>
           <w:lang w:val="nl-NL"/>
         </w:rPr>
@@ -1107,7 +1107,7 @@
     <w:p>
       <w:pPr>
         <w:pStyle w:val="Normaalweb"/>
-        <w:divId w:val="1635794162"/>
+        <w:divId w:val="198474154"/>
         <w:rPr>
           <w:lang w:val="nl-NL"/>
         </w:rPr>
@@ -1142,7 +1142,7 @@
     <w:p>
       <w:pPr>
         <w:pStyle w:val="Normaalweb"/>
-        <w:divId w:val="1635794162"/>
+        <w:divId w:val="198474154"/>
         <w:rPr>
           <w:lang w:val="nl-NL"/>
         </w:rPr>
@@ -1169,7 +1169,7 @@
     <w:p>
       <w:pPr>
         <w:pStyle w:val="Normaalweb"/>
-        <w:divId w:val="1635794162"/>
+        <w:divId w:val="198474154"/>
         <w:rPr>
           <w:lang w:val="nl-NL"/>
         </w:rPr>
@@ -1197,7 +1197,7 @@
     <w:p>
       <w:pPr>
         <w:pStyle w:val="Normaalweb"/>
-        <w:divId w:val="1635794162"/>
+        <w:divId w:val="198474154"/>
         <w:rPr>
           <w:lang w:val="nl-NL"/>
         </w:rPr>
@@ -1212,7 +1212,7 @@
     <w:p>
       <w:pPr>
         <w:pStyle w:val="Normaalweb"/>
-        <w:divId w:val="1635794162"/>
+        <w:divId w:val="198474154"/>
         <w:rPr>
           <w:lang w:val="nl-NL"/>
         </w:rPr>
@@ -1278,7 +1278,7 @@
     <w:p>
       <w:pPr>
         <w:pStyle w:val="Normaalweb"/>
-        <w:divId w:val="1635794162"/>
+        <w:divId w:val="198474154"/>
         <w:rPr>
           <w:lang w:val="nl-NL"/>
         </w:rPr>
@@ -1293,7 +1293,7 @@
     <w:p>
       <w:pPr>
         <w:pStyle w:val="Normaalweb"/>
-        <w:divId w:val="1635794162"/>
+        <w:divId w:val="198474154"/>
         <w:rPr>
           <w:lang w:val="nl-NL"/>
         </w:rPr>
@@ -1321,7 +1321,7 @@
     <w:p>
       <w:pPr>
         <w:pStyle w:val="Normaalweb"/>
-        <w:divId w:val="1635794162"/>
+        <w:divId w:val="198474154"/>
         <w:rPr>
           <w:lang w:val="nl-NL"/>
         </w:rPr>
@@ -1336,7 +1336,7 @@
     <w:p>
       <w:pPr>
         <w:pStyle w:val="Normaalweb"/>
-        <w:divId w:val="1635794162"/>
+        <w:divId w:val="198474154"/>
         <w:rPr>
           <w:lang w:val="nl-NL"/>
         </w:rPr>
@@ -1351,7 +1351,7 @@
     <w:p>
       <w:pPr>
         <w:pStyle w:val="Normaalweb"/>
-        <w:divId w:val="1635794162"/>
+        <w:divId w:val="198474154"/>
         <w:rPr>
           <w:lang w:val="nl-NL"/>
         </w:rPr>
@@ -1366,7 +1366,7 @@
     <w:p>
       <w:pPr>
         <w:spacing w:before="300" w:after="200"/>
-        <w:divId w:val="1635794162"/>
+        <w:divId w:val="198474154"/>
         <w:rPr>
           <w:rFonts w:eastAsia="Times New Roman"/>
           <w:lang w:val="nl-NL"/>
@@ -1377,14 +1377,14 @@
           <w:rFonts w:eastAsia="Times New Roman"/>
           <w:lang w:val="nl-NL"/>
         </w:rPr>
-        <w:pict w14:anchorId="2CE34F55">
+        <w:pict w14:anchorId="16CA7CF8">
           <v:rect id="_x0000_i1025" style="width:0;height:1.5pt" o:hralign="center" o:hrstd="t" o:hr="t" fillcolor="#a0a0a0" stroked="f"/>
         </w:pict>
       </w:r>
     </w:p>
     <w:p>
       <w:pPr>
-        <w:divId w:val="590554341"/>
+        <w:divId w:val="830877494"/>
         <w:rPr>
           <w:color w:val="555555"/>
           <w:sz w:val="20"/>
@@ -1423,7 +1423,7 @@
     </w:p>
     <w:p>
       <w:pPr>
-        <w:divId w:val="590554341"/>
+        <w:divId w:val="830877494"/>
         <w:rPr>
           <w:color w:val="555555"/>
           <w:sz w:val="20"/>
@@ -1453,7 +1453,7 @@
     </w:p>
     <w:p>
       <w:pPr>
-        <w:divId w:val="590554341"/>
+        <w:divId w:val="830877494"/>
         <w:rPr>
           <w:color w:val="555555"/>
           <w:sz w:val="20"/>
@@ -1493,7 +1493,7 @@
     </w:p>
     <w:p>
       <w:pPr>
-        <w:divId w:val="590554341"/>
+        <w:divId w:val="830877494"/>
         <w:rPr>
           <w:color w:val="555555"/>
           <w:sz w:val="20"/>
@@ -1525,7 +1525,7 @@
       <w:pPr>
         <w:pStyle w:val="marker"/>
         <w:ind w:left="800" w:right="800"/>
-        <w:divId w:val="1635794162"/>
+        <w:divId w:val="198474154"/>
         <w:rPr>
           <w:lang w:val="nl-NL"/>
         </w:rPr>
@@ -1537,13 +1537,13 @@
     <w:p>
       <w:pPr>
         <w:pStyle w:val="Kop2"/>
-        <w:divId w:val="1635794162"/>
+        <w:divId w:val="198474154"/>
         <w:rPr>
           <w:rFonts w:eastAsia="Times New Roman"/>
           <w:lang w:val="nl-NL"/>
         </w:rPr>
       </w:pPr>
-      <w:bookmarkStart w:id="2" w:name="_Toc242106548"/>
+      <w:bookmarkStart w:id="2" w:name="_Toc242108264"/>
       <w:r>
         <w:rPr>
           <w:rFonts w:eastAsia="Times New Roman"/>
@@ -1556,7 +1556,7 @@
     <w:p>
       <w:pPr>
         <w:pStyle w:val="Normaalweb"/>
-        <w:divId w:val="1635794162"/>
+        <w:divId w:val="198474154"/>
         <w:rPr>
           <w:lang w:val="nl-NL"/>
         </w:rPr>
@@ -1571,7 +1571,7 @@
     <w:p>
       <w:pPr>
         <w:pStyle w:val="Normaalweb"/>
-        <w:divId w:val="1635794162"/>
+        <w:divId w:val="198474154"/>
         <w:rPr>
           <w:lang w:val="nl-NL"/>
         </w:rPr>
@@ -1586,7 +1586,7 @@
     <w:p>
       <w:pPr>
         <w:pStyle w:val="Normaalweb"/>
-        <w:divId w:val="1635794162"/>
+        <w:divId w:val="198474154"/>
         <w:rPr>
           <w:lang w:val="nl-NL"/>
         </w:rPr>
@@ -1601,13 +1601,13 @@
     <w:p>
       <w:pPr>
         <w:pStyle w:val="Kop2"/>
-        <w:divId w:val="1635794162"/>
+        <w:divId w:val="198474154"/>
         <w:rPr>
           <w:rFonts w:eastAsia="Times New Roman"/>
           <w:lang w:val="nl-NL"/>
         </w:rPr>
       </w:pPr>
-      <w:bookmarkStart w:id="3" w:name="_Toc242106549"/>
+      <w:bookmarkStart w:id="3" w:name="_Toc242108265"/>
       <w:r>
         <w:rPr>
           <w:rFonts w:eastAsia="Times New Roman"/>
@@ -1620,7 +1620,7 @@
     <w:p>
       <w:pPr>
         <w:pStyle w:val="Normaalweb"/>
-        <w:divId w:val="1635794162"/>
+        <w:divId w:val="198474154"/>
         <w:rPr>
           <w:lang w:val="nl-NL"/>
         </w:rPr>
@@ -1635,13 +1635,13 @@
     <w:p>
       <w:pPr>
         <w:pStyle w:val="Kop2"/>
-        <w:divId w:val="1635794162"/>
+        <w:divId w:val="198474154"/>
         <w:rPr>
           <w:rFonts w:eastAsia="Times New Roman"/>
           <w:lang w:val="nl-NL"/>
         </w:rPr>
       </w:pPr>
-      <w:bookmarkStart w:id="4" w:name="_Toc242106550"/>
+      <w:bookmarkStart w:id="4" w:name="_Toc242108266"/>
       <w:r>
         <w:rPr>
           <w:rFonts w:eastAsia="Times New Roman"/>
@@ -1654,7 +1654,7 @@
     <w:p>
       <w:pPr>
         <w:pStyle w:val="Normaalweb"/>
-        <w:divId w:val="1635794162"/>
+        <w:divId w:val="198474154"/>
         <w:rPr>
           <w:lang w:val="nl-NL"/>
         </w:rPr>
@@ -1669,13 +1669,13 @@
     <w:p>
       <w:pPr>
         <w:pStyle w:val="Kop3"/>
-        <w:divId w:val="1635794162"/>
+        <w:divId w:val="198474154"/>
         <w:rPr>
           <w:rFonts w:eastAsia="Times New Roman"/>
           <w:lang w:val="nl-NL"/>
         </w:rPr>
       </w:pPr>
-      <w:bookmarkStart w:id="5" w:name="_Toc242106551"/>
+      <w:bookmarkStart w:id="5" w:name="_Toc242108267"/>
       <w:r>
         <w:rPr>
           <w:rFonts w:eastAsia="Times New Roman"/>
@@ -1688,7 +1688,7 @@
     <w:p>
       <w:pPr>
         <w:pStyle w:val="Normaalweb"/>
-        <w:divId w:val="1635794162"/>
+        <w:divId w:val="198474154"/>
         <w:rPr>
           <w:lang w:val="nl-NL"/>
         </w:rPr>
@@ -1703,13 +1703,13 @@
     <w:p>
       <w:pPr>
         <w:pStyle w:val="Kop3"/>
-        <w:divId w:val="1635794162"/>
+        <w:divId w:val="198474154"/>
         <w:rPr>
           <w:rFonts w:eastAsia="Times New Roman"/>
           <w:lang w:val="nl-NL"/>
         </w:rPr>
       </w:pPr>
-      <w:bookmarkStart w:id="6" w:name="_Toc242106552"/>
+      <w:bookmarkStart w:id="6" w:name="_Toc242108268"/>
       <w:r>
         <w:rPr>
           <w:rFonts w:eastAsia="Times New Roman"/>
@@ -1722,7 +1722,7 @@
     <w:p>
       <w:pPr>
         <w:pStyle w:val="Normaalweb"/>
-        <w:divId w:val="1635794162"/>
+        <w:divId w:val="198474154"/>
         <w:rPr>
           <w:lang w:val="nl-NL"/>
         </w:rPr>
@@ -1737,13 +1737,13 @@
     <w:p>
       <w:pPr>
         <w:pStyle w:val="Kop3"/>
-        <w:divId w:val="1635794162"/>
+        <w:divId w:val="198474154"/>
         <w:rPr>
           <w:rFonts w:eastAsia="Times New Roman"/>
           <w:lang w:val="nl-NL"/>
         </w:rPr>
       </w:pPr>
-      <w:bookmarkStart w:id="7" w:name="_Toc242106553"/>
+      <w:bookmarkStart w:id="7" w:name="_Toc242108269"/>
       <w:r>
         <w:rPr>
           <w:rFonts w:eastAsia="Times New Roman"/>
@@ -1756,7 +1756,7 @@
     <w:p>
       <w:pPr>
         <w:pStyle w:val="Normaalweb"/>
-        <w:divId w:val="1635794162"/>
+        <w:divId w:val="198474154"/>
         <w:rPr>
           <w:lang w:val="nl-NL"/>
         </w:rPr>
@@ -1771,13 +1771,13 @@
     <w:p>
       <w:pPr>
         <w:pStyle w:val="Kop3"/>
-        <w:divId w:val="1635794162"/>
+        <w:divId w:val="198474154"/>
         <w:rPr>
           <w:rFonts w:eastAsia="Times New Roman"/>
           <w:lang w:val="nl-NL"/>
         </w:rPr>
       </w:pPr>
-      <w:bookmarkStart w:id="8" w:name="_Toc242106554"/>
+      <w:bookmarkStart w:id="8" w:name="_Toc242108270"/>
       <w:r>
         <w:rPr>
           <w:rFonts w:eastAsia="Times New Roman"/>
@@ -1790,7 +1790,7 @@
     <w:p>
       <w:pPr>
         <w:pStyle w:val="Normaalweb"/>
-        <w:divId w:val="1635794162"/>
+        <w:divId w:val="198474154"/>
         <w:rPr>
           <w:lang w:val="nl-NL"/>
         </w:rPr>
@@ -1806,13 +1806,13 @@
     <w:p>
       <w:pPr>
         <w:pStyle w:val="Kop2"/>
-        <w:divId w:val="1635794162"/>
+        <w:divId w:val="198474154"/>
         <w:rPr>
           <w:rFonts w:eastAsia="Times New Roman"/>
           <w:lang w:val="nl-NL"/>
         </w:rPr>
       </w:pPr>
-      <w:bookmarkStart w:id="9" w:name="_Toc242106555"/>
+      <w:bookmarkStart w:id="9" w:name="_Toc242108271"/>
       <w:r>
         <w:rPr>
           <w:rFonts w:eastAsia="Times New Roman"/>
@@ -1825,7 +1825,7 @@
     <w:p>
       <w:pPr>
         <w:pStyle w:val="Normaalweb"/>
-        <w:divId w:val="1635794162"/>
+        <w:divId w:val="198474154"/>
         <w:rPr>
           <w:lang w:val="nl-NL"/>
         </w:rPr>
@@ -1840,7 +1840,7 @@
     <w:p>
       <w:pPr>
         <w:pStyle w:val="Normaalweb"/>
-        <w:divId w:val="1635794162"/>
+        <w:divId w:val="198474154"/>
         <w:rPr>
           <w:lang w:val="nl-NL"/>
         </w:rPr>
@@ -1855,7 +1855,7 @@
     <w:p>
       <w:pPr>
         <w:pStyle w:val="Normaalweb"/>
-        <w:divId w:val="1635794162"/>
+        <w:divId w:val="198474154"/>
         <w:rPr>
           <w:lang w:val="nl-NL"/>
         </w:rPr>
@@ -1870,13 +1870,13 @@
     <w:p>
       <w:pPr>
         <w:pStyle w:val="Kop2"/>
-        <w:divId w:val="1635794162"/>
+        <w:divId w:val="198474154"/>
         <w:rPr>
           <w:rFonts w:eastAsia="Times New Roman"/>
           <w:lang w:val="nl-NL"/>
         </w:rPr>
       </w:pPr>
-      <w:bookmarkStart w:id="10" w:name="_Toc242106556"/>
+      <w:bookmarkStart w:id="10" w:name="_Toc242108272"/>
       <w:r>
         <w:rPr>
           <w:rFonts w:eastAsia="Times New Roman"/>
@@ -1889,7 +1889,7 @@
     <w:p>
       <w:pPr>
         <w:pStyle w:val="Normaalweb"/>
-        <w:divId w:val="1635794162"/>
+        <w:divId w:val="198474154"/>
         <w:rPr>
           <w:lang w:val="nl-NL"/>
         </w:rPr>
@@ -1904,7 +1904,7 @@
     <w:p>
       <w:pPr>
         <w:pStyle w:val="Normaalweb"/>
-        <w:divId w:val="1635794162"/>
+        <w:divId w:val="198474154"/>
         <w:rPr>
           <w:lang w:val="nl-NL"/>
         </w:rPr>
@@ -1919,13 +1919,13 @@
     <w:p>
       <w:pPr>
         <w:pStyle w:val="Kop2"/>
-        <w:divId w:val="1635794162"/>
+        <w:divId w:val="198474154"/>
         <w:rPr>
           <w:rFonts w:eastAsia="Times New Roman"/>
           <w:lang w:val="nl-NL"/>
         </w:rPr>
       </w:pPr>
-      <w:bookmarkStart w:id="11" w:name="_Toc242106557"/>
+      <w:bookmarkStart w:id="11" w:name="_Toc242108273"/>
       <w:r>
         <w:rPr>
           <w:rFonts w:eastAsia="Times New Roman"/>
@@ -1938,7 +1938,7 @@
     <w:p>
       <w:pPr>
         <w:pStyle w:val="Normaalweb"/>
-        <w:divId w:val="1635794162"/>
+        <w:divId w:val="198474154"/>
         <w:rPr>
           <w:lang w:val="nl-NL"/>
         </w:rPr>
@@ -1953,7 +1953,7 @@
     <w:p>
       <w:pPr>
         <w:pStyle w:val="Normaalweb"/>
-        <w:divId w:val="1635794162"/>
+        <w:divId w:val="198474154"/>
         <w:rPr>
           <w:lang w:val="nl-NL"/>
         </w:rPr>
@@ -1969,7 +1969,7 @@
       <w:pPr>
         <w:shd w:val="clear" w:color="auto" w:fill="FFFFFF"/>
         <w:jc w:val="both"/>
-        <w:divId w:val="1998537745"/>
+        <w:divId w:val="785345897"/>
         <w:rPr>
           <w:szCs w:val="22"/>
           <w:lang w:val="nl-NL"/>
@@ -2102,7 +2102,7 @@
         <w:color w:val="808080"/>
         <w:sz w:val="18"/>
       </w:rPr>
-      <w:t>1</w:t>
+      <w:t>2</w:t>
     </w:r>
     <w:r>
       <w:rPr>
@@ -2237,7 +2237,7 @@
         <w:sz w:val="18"/>
       </w:rPr>
       <w:tab/>
-      <w:t>Laatst gewijzigd: 5 oktober 2026, 15:27</w:t>
+      <w:t>Laatst gewijzigd: 5 oktober 2026, 15:55</w:t>
     </w:r>
   </w:p>
 </w:hdr>
@@ -3489,7 +3489,7 @@
     <w:link w:val="KoptekstChar"/>
     <w:uiPriority w:val="99"/>
     <w:unhideWhenUsed/>
-    <w:rsid w:val="00E14CB4"/>
+    <w:rsid w:val="00A8198A"/>
     <w:pPr>
       <w:tabs>
         <w:tab w:val="center" w:pos="4536"/>
@@ -3502,7 +3502,7 @@
     <w:basedOn w:val="Standaardalinea-lettertype"/>
     <w:link w:val="Koptekst"/>
     <w:uiPriority w:val="99"/>
-    <w:rsid w:val="00E14CB4"/>
+    <w:rsid w:val="00A8198A"/>
     <w:rPr>
       <w:rFonts w:eastAsiaTheme="minorEastAsia"/>
       <w:sz w:val="24"/>
@@ -3515,7 +3515,7 @@
     <w:link w:val="VoettekstChar"/>
     <w:uiPriority w:val="99"/>
     <w:unhideWhenUsed/>
-    <w:rsid w:val="00E14CB4"/>
+    <w:rsid w:val="00A8198A"/>
     <w:pPr>
       <w:tabs>
         <w:tab w:val="center" w:pos="4536"/>
@@ -3528,7 +3528,7 @@
     <w:basedOn w:val="Standaardalinea-lettertype"/>
     <w:link w:val="Voettekst"/>
     <w:uiPriority w:val="99"/>
-    <w:rsid w:val="00E14CB4"/>
+    <w:rsid w:val="00A8198A"/>
     <w:rPr>
       <w:rFonts w:eastAsiaTheme="minorEastAsia"/>
       <w:sz w:val="24"/>
@@ -3542,7 +3542,7 @@
     <w:autoRedefine/>
     <w:uiPriority w:val="39"/>
     <w:unhideWhenUsed/>
-    <w:rsid w:val="00E14CB4"/>
+    <w:rsid w:val="00A8198A"/>
     <w:pPr>
       <w:spacing w:after="100"/>
       <w:ind w:left="220"/>
@@ -3555,7 +3555,7 @@
     <w:autoRedefine/>
     <w:uiPriority w:val="39"/>
     <w:unhideWhenUsed/>
-    <w:rsid w:val="00E14CB4"/>
+    <w:rsid w:val="00A8198A"/>
     <w:pPr>
       <w:spacing w:after="100"/>
       <w:ind w:left="440"/>

</xml_diff>

<commit_message>
Update Systeem-Audit NL 06-10-2026 10:24
</commit_message>
<xml_diff>
--- a/nl/docx/document-0.docx
+++ b/nl/docx/document-0.docx
@@ -7,7 +7,7 @@
         <w:spacing w:after="480"/>
         <w:jc w:val="center"/>
         <w:outlineLvl w:val="1"/>
-        <w:divId w:val="1401907706"/>
+        <w:divId w:val="2037267177"/>
         <w:rPr>
           <w:rFonts w:ascii="Aptos Display" w:eastAsia="Times New Roman" w:hAnsi="Aptos Display"/>
           <w:b/>
@@ -36,7 +36,7 @@
     <w:p>
       <w:pPr>
         <w:pStyle w:val="ondertitel2"/>
-        <w:divId w:val="1401907706"/>
+        <w:divId w:val="2037267177"/>
         <w:rPr>
           <w:lang w:val="nl-NL"/>
         </w:rPr>
@@ -51,7 +51,7 @@
     <w:p>
       <w:pPr>
         <w:pStyle w:val="documentaanduiding2"/>
-        <w:divId w:val="1401907706"/>
+        <w:divId w:val="2037267177"/>
         <w:rPr>
           <w:lang w:val="nl-NL"/>
         </w:rPr>
@@ -66,7 +66,7 @@
     <w:p>
       <w:pPr>
         <w:pStyle w:val="auteur2"/>
-        <w:divId w:val="1401907706"/>
+        <w:divId w:val="2037267177"/>
         <w:rPr>
           <w:lang w:val="nl-NL"/>
         </w:rPr>
@@ -81,23 +81,23 @@
     <w:p>
       <w:pPr>
         <w:pStyle w:val="meta-lijn2"/>
-        <w:divId w:val="1401907706"/>
-        <w:rPr>
-          <w:lang w:val="nl-NL"/>
-        </w:rPr>
-      </w:pPr>
-      <w:r>
-        <w:rPr>
-          <w:lang w:val="nl-NL"/>
-        </w:rPr>
-        <w:t>Versie bijgewerkt: 5 oktober 2026, 15:55</w:t>
+        <w:divId w:val="2037267177"/>
+        <w:rPr>
+          <w:lang w:val="nl-NL"/>
+        </w:rPr>
+      </w:pPr>
+      <w:r>
+        <w:rPr>
+          <w:lang w:val="nl-NL"/>
+        </w:rPr>
+        <w:t>Versie bijgewerkt: 6 oktober 2026, 10:24</w:t>
       </w:r>
     </w:p>
     <w:p>
       <w:pPr>
         <w:pStyle w:val="marker"/>
         <w:ind w:left="800" w:right="800"/>
-        <w:divId w:val="198474154"/>
+        <w:divId w:val="349915568"/>
         <w:rPr>
           <w:lang w:val="nl-NL"/>
         </w:rPr>
@@ -110,13 +110,13 @@
       <w:pPr>
         <w:pStyle w:val="Kop2"/>
         <w:pageBreakBefore/>
-        <w:divId w:val="962806740"/>
+        <w:divId w:val="547453361"/>
         <w:rPr>
           <w:rFonts w:eastAsia="Times New Roman"/>
           <w:lang w:val="nl-NL"/>
         </w:rPr>
       </w:pPr>
-      <w:bookmarkStart w:id="0" w:name="_Toc242108262"/>
+      <w:bookmarkStart w:id="0" w:name="_Toc242177334"/>
       <w:r>
         <w:rPr>
           <w:rFonts w:eastAsia="Times New Roman"/>
@@ -133,7 +133,7 @@
         <w:tabs>
           <w:tab w:val="right" w:leader="dot" w:pos="9062"/>
         </w:tabs>
-        <w:divId w:val="962806740"/>
+        <w:divId w:val="547453361"/>
         <w:rPr>
           <w:rFonts w:asciiTheme="minorHAnsi" w:hAnsiTheme="minorHAnsi" w:cstheme="minorBidi"/>
           <w:noProof/>
@@ -184,7 +184,7 @@
         <w:rPr>
           <w:noProof/>
         </w:rPr>
-        <w:instrText xml:space="preserve"> PAGEREF _Toc242108262 \h </w:instrText>
+        <w:instrText xml:space="preserve"> PAGEREF _Toc242177334 \h </w:instrText>
       </w:r>
       <w:r>
         <w:rPr>
@@ -216,7 +216,7 @@
         <w:tabs>
           <w:tab w:val="right" w:leader="dot" w:pos="9062"/>
         </w:tabs>
-        <w:divId w:val="962806740"/>
+        <w:divId w:val="547453361"/>
         <w:rPr>
           <w:rFonts w:asciiTheme="minorHAnsi" w:hAnsiTheme="minorHAnsi" w:cstheme="minorBidi"/>
           <w:noProof/>
@@ -249,7 +249,7 @@
         <w:rPr>
           <w:noProof/>
         </w:rPr>
-        <w:instrText xml:space="preserve"> PAGEREF _Toc242108263 \h </w:instrText>
+        <w:instrText xml:space="preserve"> PAGEREF _Toc242177335 \h </w:instrText>
       </w:r>
       <w:r>
         <w:rPr>
@@ -281,7 +281,7 @@
         <w:tabs>
           <w:tab w:val="right" w:leader="dot" w:pos="9062"/>
         </w:tabs>
-        <w:divId w:val="962806740"/>
+        <w:divId w:val="547453361"/>
         <w:rPr>
           <w:rFonts w:asciiTheme="minorHAnsi" w:hAnsiTheme="minorHAnsi" w:cstheme="minorBidi"/>
           <w:noProof/>
@@ -314,7 +314,7 @@
         <w:rPr>
           <w:noProof/>
         </w:rPr>
-        <w:instrText xml:space="preserve"> PAGEREF _Toc242108264 \h </w:instrText>
+        <w:instrText xml:space="preserve"> PAGEREF _Toc242177336 \h </w:instrText>
       </w:r>
       <w:r>
         <w:rPr>
@@ -346,7 +346,7 @@
         <w:tabs>
           <w:tab w:val="right" w:leader="dot" w:pos="9062"/>
         </w:tabs>
-        <w:divId w:val="962806740"/>
+        <w:divId w:val="547453361"/>
         <w:rPr>
           <w:rFonts w:asciiTheme="minorHAnsi" w:hAnsiTheme="minorHAnsi" w:cstheme="minorBidi"/>
           <w:noProof/>
@@ -379,7 +379,7 @@
         <w:rPr>
           <w:noProof/>
         </w:rPr>
-        <w:instrText xml:space="preserve"> PAGEREF _Toc242108265 \h </w:instrText>
+        <w:instrText xml:space="preserve"> PAGEREF _Toc242177337 \h </w:instrText>
       </w:r>
       <w:r>
         <w:rPr>
@@ -411,7 +411,7 @@
         <w:tabs>
           <w:tab w:val="right" w:leader="dot" w:pos="9062"/>
         </w:tabs>
-        <w:divId w:val="962806740"/>
+        <w:divId w:val="547453361"/>
         <w:rPr>
           <w:rFonts w:asciiTheme="minorHAnsi" w:hAnsiTheme="minorHAnsi" w:cstheme="minorBidi"/>
           <w:noProof/>
@@ -444,7 +444,7 @@
         <w:rPr>
           <w:noProof/>
         </w:rPr>
-        <w:instrText xml:space="preserve"> PAGEREF _Toc242108266 \h </w:instrText>
+        <w:instrText xml:space="preserve"> PAGEREF _Toc242177338 \h </w:instrText>
       </w:r>
       <w:r>
         <w:rPr>
@@ -476,7 +476,7 @@
         <w:tabs>
           <w:tab w:val="right" w:leader="dot" w:pos="9062"/>
         </w:tabs>
-        <w:divId w:val="962806740"/>
+        <w:divId w:val="547453361"/>
         <w:rPr>
           <w:rFonts w:asciiTheme="minorHAnsi" w:hAnsiTheme="minorHAnsi" w:cstheme="minorBidi"/>
           <w:noProof/>
@@ -509,7 +509,7 @@
         <w:rPr>
           <w:noProof/>
         </w:rPr>
-        <w:instrText xml:space="preserve"> PAGEREF _Toc242108267 \h </w:instrText>
+        <w:instrText xml:space="preserve"> PAGEREF _Toc242177339 \h </w:instrText>
       </w:r>
       <w:r>
         <w:rPr>
@@ -541,7 +541,7 @@
         <w:tabs>
           <w:tab w:val="right" w:leader="dot" w:pos="9062"/>
         </w:tabs>
-        <w:divId w:val="962806740"/>
+        <w:divId w:val="547453361"/>
         <w:rPr>
           <w:rFonts w:asciiTheme="minorHAnsi" w:hAnsiTheme="minorHAnsi" w:cstheme="minorBidi"/>
           <w:noProof/>
@@ -574,7 +574,7 @@
         <w:rPr>
           <w:noProof/>
         </w:rPr>
-        <w:instrText xml:space="preserve"> PAGEREF _Toc242108268 \h </w:instrText>
+        <w:instrText xml:space="preserve"> PAGEREF _Toc242177340 \h </w:instrText>
       </w:r>
       <w:r>
         <w:rPr>
@@ -606,7 +606,7 @@
         <w:tabs>
           <w:tab w:val="right" w:leader="dot" w:pos="9062"/>
         </w:tabs>
-        <w:divId w:val="962806740"/>
+        <w:divId w:val="547453361"/>
         <w:rPr>
           <w:rFonts w:asciiTheme="minorHAnsi" w:hAnsiTheme="minorHAnsi" w:cstheme="minorBidi"/>
           <w:noProof/>
@@ -639,7 +639,7 @@
         <w:rPr>
           <w:noProof/>
         </w:rPr>
-        <w:instrText xml:space="preserve"> PAGEREF _Toc242108269 \h </w:instrText>
+        <w:instrText xml:space="preserve"> PAGEREF _Toc242177341 \h </w:instrText>
       </w:r>
       <w:r>
         <w:rPr>
@@ -671,7 +671,7 @@
         <w:tabs>
           <w:tab w:val="right" w:leader="dot" w:pos="9062"/>
         </w:tabs>
-        <w:divId w:val="962806740"/>
+        <w:divId w:val="547453361"/>
         <w:rPr>
           <w:rFonts w:asciiTheme="minorHAnsi" w:hAnsiTheme="minorHAnsi" w:cstheme="minorBidi"/>
           <w:noProof/>
@@ -704,7 +704,7 @@
         <w:rPr>
           <w:noProof/>
         </w:rPr>
-        <w:instrText xml:space="preserve"> PAGEREF _Toc242108270 \h </w:instrText>
+        <w:instrText xml:space="preserve"> PAGEREF _Toc242177342 \h </w:instrText>
       </w:r>
       <w:r>
         <w:rPr>
@@ -736,7 +736,7 @@
         <w:tabs>
           <w:tab w:val="right" w:leader="dot" w:pos="9062"/>
         </w:tabs>
-        <w:divId w:val="962806740"/>
+        <w:divId w:val="547453361"/>
         <w:rPr>
           <w:rFonts w:asciiTheme="minorHAnsi" w:hAnsiTheme="minorHAnsi" w:cstheme="minorBidi"/>
           <w:noProof/>
@@ -769,7 +769,7 @@
         <w:rPr>
           <w:noProof/>
         </w:rPr>
-        <w:instrText xml:space="preserve"> PAGEREF _Toc242108271 \h </w:instrText>
+        <w:instrText xml:space="preserve"> PAGEREF _Toc242177343 \h </w:instrText>
       </w:r>
       <w:r>
         <w:rPr>
@@ -801,7 +801,7 @@
         <w:tabs>
           <w:tab w:val="right" w:leader="dot" w:pos="9062"/>
         </w:tabs>
-        <w:divId w:val="962806740"/>
+        <w:divId w:val="547453361"/>
         <w:rPr>
           <w:rFonts w:asciiTheme="minorHAnsi" w:hAnsiTheme="minorHAnsi" w:cstheme="minorBidi"/>
           <w:noProof/>
@@ -834,7 +834,7 @@
         <w:rPr>
           <w:noProof/>
         </w:rPr>
-        <w:instrText xml:space="preserve"> PAGEREF _Toc242108272 \h </w:instrText>
+        <w:instrText xml:space="preserve"> PAGEREF _Toc242177344 \h </w:instrText>
       </w:r>
       <w:r>
         <w:rPr>
@@ -866,7 +866,7 @@
         <w:tabs>
           <w:tab w:val="right" w:leader="dot" w:pos="9062"/>
         </w:tabs>
-        <w:divId w:val="962806740"/>
+        <w:divId w:val="547453361"/>
         <w:rPr>
           <w:rFonts w:asciiTheme="minorHAnsi" w:hAnsiTheme="minorHAnsi" w:cstheme="minorBidi"/>
           <w:noProof/>
@@ -899,7 +899,7 @@
         <w:rPr>
           <w:noProof/>
         </w:rPr>
-        <w:instrText xml:space="preserve"> PAGEREF _Toc242108273 \h </w:instrText>
+        <w:instrText xml:space="preserve"> PAGEREF _Toc242177345 \h </w:instrText>
       </w:r>
       <w:r>
         <w:rPr>
@@ -928,7 +928,7 @@
     <w:p>
       <w:pPr>
         <w:pStyle w:val="marker"/>
-        <w:divId w:val="962806740"/>
+        <w:divId w:val="547453361"/>
         <w:rPr>
           <w:lang w:val="nl-NL"/>
         </w:rPr>
@@ -944,7 +944,7 @@
       <w:pPr>
         <w:pStyle w:val="marker"/>
         <w:ind w:left="800" w:right="800"/>
-        <w:divId w:val="198474154"/>
+        <w:divId w:val="349915568"/>
         <w:rPr>
           <w:lang w:val="nl-NL"/>
         </w:rPr>
@@ -956,13 +956,13 @@
     <w:p>
       <w:pPr>
         <w:pStyle w:val="Kop2"/>
-        <w:divId w:val="198474154"/>
+        <w:divId w:val="349915568"/>
         <w:rPr>
           <w:rFonts w:eastAsia="Times New Roman"/>
           <w:lang w:val="nl-NL"/>
         </w:rPr>
       </w:pPr>
-      <w:bookmarkStart w:id="1" w:name="_Toc242108263"/>
+      <w:bookmarkStart w:id="1" w:name="_Toc242177335"/>
       <w:r>
         <w:rPr>
           <w:rFonts w:eastAsia="Times New Roman"/>
@@ -975,7 +975,7 @@
     <w:p>
       <w:pPr>
         <w:pStyle w:val="Normaalweb"/>
-        <w:divId w:val="198474154"/>
+        <w:divId w:val="349915568"/>
         <w:rPr>
           <w:lang w:val="nl-NL"/>
         </w:rPr>
@@ -990,7 +990,7 @@
     <w:p>
       <w:pPr>
         <w:pStyle w:val="Normaalweb"/>
-        <w:divId w:val="198474154"/>
+        <w:divId w:val="349915568"/>
         <w:rPr>
           <w:lang w:val="nl-NL"/>
         </w:rPr>
@@ -1018,7 +1018,7 @@
     <w:p>
       <w:pPr>
         <w:pStyle w:val="Normaalweb"/>
-        <w:divId w:val="198474154"/>
+        <w:divId w:val="349915568"/>
         <w:rPr>
           <w:lang w:val="nl-NL"/>
         </w:rPr>
@@ -1039,7 +1039,7 @@
     <w:p>
       <w:pPr>
         <w:pStyle w:val="Normaalweb"/>
-        <w:divId w:val="198474154"/>
+        <w:divId w:val="349915568"/>
         <w:rPr>
           <w:lang w:val="nl-NL"/>
         </w:rPr>
@@ -1086,7 +1086,7 @@
     <w:p>
       <w:pPr>
         <w:pStyle w:val="Normaalweb"/>
-        <w:divId w:val="198474154"/>
+        <w:divId w:val="349915568"/>
         <w:rPr>
           <w:lang w:val="nl-NL"/>
         </w:rPr>
@@ -1101,257 +1101,257 @@
         <w:rPr>
           <w:lang w:val="nl-NL"/>
         </w:rPr>
-        <w:t xml:space="preserve"> Elke nieuwe gemeente eist een nieuwe inschrijving. Met elke verhuizing groeit de eenheid: van één naar twee. Twee mensen, twee dossiers, twee administratieve identiteiten die vanaf nu samen door de bureaucratie moeten.</w:t>
+        <w:t xml:space="preserve"> Elke nieuwe gemeente eist een nieuwe inschrijving. Met elke verhuizing groeit de eenheid: van één naar </w:t>
+      </w:r>
+      <w:r>
+        <w:rPr>
+          <w:lang w:val="nl-NL"/>
+        </w:rPr>
+        <w:lastRenderedPageBreak/>
+        <w:t>twee. Twee mensen, twee dossiers, twee administratieve identiteiten die vanaf nu samen door de bureaucratie moeten.</w:t>
       </w:r>
     </w:p>
     <w:p>
       <w:pPr>
         <w:pStyle w:val="Normaalweb"/>
-        <w:divId w:val="198474154"/>
-        <w:rPr>
-          <w:lang w:val="nl-NL"/>
-        </w:rPr>
-      </w:pPr>
+        <w:divId w:val="349915568"/>
+        <w:rPr>
+          <w:lang w:val="nl-NL"/>
+        </w:rPr>
+      </w:pPr>
+      <w:r>
+        <w:rPr>
+          <w:lang w:val="nl-NL"/>
+        </w:rPr>
+        <w:t>In 2014 verhuizen zij samen naar Zeeuws-Vlaanderen in Nederland. Europa telt dan 28 lidstaten. De fysieke grens is opgelost; je rijdt zonder remmen van België naar Nederland. Maar de administratieve grens is onzichtbaar opgetrokken. Daar begint de eerste wrijving. Hun Belgische rijbewijs is geldig in de hele Europese Unie, het Nederlandse ook. Toch moeten ze het Belgische inleveren. Nederland staat maar één geldig document per persoon toe.</w:t>
+      </w:r>
+      <w:r>
+        <w:rPr>
+          <w:vertAlign w:val="superscript"/>
+          <w:lang w:val="nl-NL"/>
+        </w:rPr>
+        <w:t>***</w:t>
+      </w:r>
+      <w:r>
+        <w:rPr>
+          <w:lang w:val="nl-NL"/>
+        </w:rPr>
+        <w:t xml:space="preserve"> Ze geven het af bij de gemeente en krijgen het nooit terug. Wat ze in de plaats krijgen, is een Nederlands document met exact dezelfde Europese geldigheid. Alleen het land van uitgifte is veranderd. Vanaf dat moment dragen ze de paradox in hun eigen portemonnee. Een Belgische identiteitskaart voor hun identiteit. Een Nederlands rijbewijs voor hun mobiliteit, dat in Nederland dient als wettig legitimatiebewijs. In België wordt datzelfde rijbewijs niet als identiteitsbewijs aanvaard; daar geldt uitsluiten</w:t>
+      </w:r>
+      <w:r>
+        <w:rPr>
+          <w:lang w:val="nl-NL"/>
+        </w:rPr>
+        <w:t>d de Belgische kaart. Twee documenten, twee landen, één mens. Hun leven verdeelt zich over twee staten: wonen in het ene, verzekerd zijn in het andere. In theorie horen ze zo bij beide landen en zou hun bestaan zich naadloos over de grens moeten plooien. In de praktijk is het administratieve systeem geprogrammeerd om telkens maar één land tegelijk te lezen. Zodra de systemen niet met elkaar spreken, word je onleesbaar.</w:t>
+      </w:r>
+    </w:p>
+    <w:p>
+      <w:pPr>
+        <w:pStyle w:val="Normaalweb"/>
+        <w:divId w:val="349915568"/>
+        <w:rPr>
+          <w:lang w:val="nl-NL"/>
+        </w:rPr>
+      </w:pPr>
+      <w:r>
+        <w:rPr>
+          <w:lang w:val="nl-NL"/>
+        </w:rPr>
+        <w:t>In 2016 wordt hun zoon geboren. Een kind dat in zich draagt wat zijn ouders en grootouders hem hebben doorgegeven. De Vlaamse wortels van zijn moeder. De talen van zijn grootouders — niet als nationaliteit, maar als oorsprong, als klank, als bloed. En Zeeuws-Vlaams omdat hij er woont, de lucht inademt en er vrienden maakt. Vier werelden in één lichaam. Vier oorsprongen in één kind. Hij steekt elke dag de grens over. Niet voor werk, zoals zijn ouders, maar voor school. Hij woont in Nederland, maar leert leze</w:t>
+      </w:r>
+      <w:r>
+        <w:rPr>
+          <w:lang w:val="nl-NL"/>
+        </w:rPr>
+        <w:t>n en schrijven in Vlaanderen. Op school leert hij de taal van zijn moeder, maar zijn bed staat in Hulst. En daar begint het onvermijdelijke. Voor de Vlamingen is hij een Nederlander, rijdend in een auto met een geel kenteken. Voor de Nederlanders is hij een Vlaming, herkenbaar aan zijn tongval. Op het speelplein steken de andere kinderen hem in het vakje 'Belg'. Niet omdat iemand hem dat gevraagd heeft. Niet omdat hij een keuze heeft gemaakt. Maar omdat de kinderen om hem heen al geleerd hebben dat er vakje</w:t>
+      </w:r>
+      <w:r>
+        <w:rPr>
+          <w:lang w:val="nl-NL"/>
+        </w:rPr>
+        <w:t>s bestaan, en dat alles wat afwijkt, geclassificeerd moet worden. Drie mensen, drie dossiers, twee landen, één gezin.</w:t>
+      </w:r>
+    </w:p>
+    <w:p>
+      <w:pPr>
+        <w:pStyle w:val="Normaalweb"/>
+        <w:divId w:val="349915568"/>
+        <w:rPr>
+          <w:lang w:val="nl-NL"/>
+        </w:rPr>
+      </w:pPr>
+      <w:r>
+        <w:rPr>
+          <w:lang w:val="nl-NL"/>
+        </w:rPr>
+        <w:t xml:space="preserve">Uiteindelijk krijgt ook hij een plastieken kaartje dat hem moet vertellen wie hij is. Daarop staat opnieuw dat ene woord. </w:t>
+      </w:r>
+      <w:r>
+        <w:rPr>
+          <w:rStyle w:val="Zwaar"/>
+          <w:lang w:val="nl-NL"/>
+        </w:rPr>
+        <w:t>BELG.</w:t>
+      </w:r>
+      <w:r>
+        <w:rPr>
+          <w:lang w:val="nl-NL"/>
+        </w:rPr>
+        <w:t xml:space="preserve"> De kleine Europese vlag in de hoek is het enige wat rest van het grotere ideaal. De rest is onzichtbaar gemaakt. Het systeem registreert één dimensie, terwijl het kind er vier draagt.</w:t>
+      </w:r>
+    </w:p>
+    <w:p>
+      <w:pPr>
+        <w:pStyle w:val="Normaalweb"/>
+        <w:divId w:val="349915568"/>
+        <w:rPr>
+          <w:lang w:val="nl-NL"/>
+        </w:rPr>
+      </w:pPr>
+      <w:r>
+        <w:rPr>
+          <w:lang w:val="nl-NL"/>
+        </w:rPr>
+        <w:t>Zo werkt het algoritme van de staat. Het ziet geen gezin. Het ziet geen organisme dat over twee landen is gegroeid. Het ziet uitsluitend losse eenheden in losse vakjes in losse landen. Wie niet in het vakje past, valt tussen de regels door.</w:t>
+      </w:r>
+    </w:p>
+    <w:p>
+      <w:pPr>
+        <w:pStyle w:val="Normaalweb"/>
+        <w:divId w:val="349915568"/>
+        <w:rPr>
+          <w:lang w:val="nl-NL"/>
+        </w:rPr>
+      </w:pPr>
+      <w:r>
+        <w:rPr>
+          <w:lang w:val="nl-NL"/>
+        </w:rPr>
+        <w:t xml:space="preserve">Het is 2025. De Europese Unie telt 27 lidstaten, na de uittreding van het Verenigd Koninkrijk. De overheden zijn gedigitaliseerd, datastromen verbinden de hoofdsteden en de theorie belooft een frictieloze unie. En het kind uit 1981? Hij is inmiddels vierenveertig. Hij wordt ernstig ziek en belandt in de kliniek. De tol van de suikerziekte is onomkeerbaar: de amputatie van twee tenen en het </w:t>
+      </w:r>
       <w:r>
         <w:rPr>
           <w:lang w:val="nl-NL"/>
         </w:rPr>
         <w:lastRenderedPageBreak/>
-        <w:t>In 2014 verhuizen zij samen naar Zeeuws-Vlaanderen in Nederland. Europa telt dan 28 lidstaten. De fysieke grens is opgelost; je rijdt zonder remmen van België naar Nederland. Maar de administratieve grens is onzichtbaar opgetrokken. Daar begint de eerste wrijving. Hun Belgische rijbewijs is geldig in de hele Europese Unie, het Nederlandse ook. Toch moeten ze het Belgische inleveren. Nederland staat maar één geldig document per persoon toe.</w:t>
+        <w:t>verlies van zicht in één oog. De Belgische artsen oordelen helder: u mag niet meer rijden. Hij kan en wil dat ook niet meer. De Nederlandse artsen in zijn woonland kennen hem niet, en mógen hem door de strikte wetgeving rond dubbele inschrijvingen niet eens kennen. Hoewel het Nederlandse rijbewijs tot de volgende oogtest fysiek nog in zijn portemonnee zit — Nederland weet nog van niets, omdat de database domweg weigert de Belgische medische realiteit in te lezen — is zijn grensoverschrijdende mobiliteit fei</w:t>
+      </w:r>
+      <w:r>
+        <w:rPr>
+          <w:lang w:val="nl-NL"/>
+        </w:rPr>
+        <w:t xml:space="preserve">telijk voorbij. Straks, wanneer dat document onvermijdelijk vervalt, wist het systeem de enige kaart uit die hem in Nederland nog een administratieve weerspiegeling gaf. Wat overblijft, is de Belgische identiteitskaart. Eén woord. </w:t>
+      </w:r>
+      <w:r>
+        <w:rPr>
+          <w:rStyle w:val="Zwaar"/>
+          <w:lang w:val="nl-NL"/>
+        </w:rPr>
+        <w:t>BELG.</w:t>
+      </w:r>
+      <w:r>
+        <w:rPr>
+          <w:lang w:val="nl-NL"/>
+        </w:rPr>
+        <w:t xml:space="preserve"> De man die zijn hele leven over grenzen bewoog, die zijn Italiaanse en Franse identiteit vrijwillig opgaf om Belg te worden, maar de wereld van zijn vader en moeder nooit kon uitwissen, wordt aan het einde van zijn rit genadeloos teruggebracht tot één land. Het systeem heeft</w:t>
+      </w:r>
+      <w:r>
+        <w:rPr>
+          <w:lang w:val="nl-NL"/>
+        </w:rPr>
+        <w:t xml:space="preserve"> hem ingehaald. De cirkel is rond. Hij is weer uitsluitend Belg. En zijn zoon, die vier werelden in zich draagt, staat met exact datzelfde woord in de database. </w:t>
+      </w:r>
+      <w:r>
+        <w:rPr>
+          <w:rStyle w:val="Zwaar"/>
+          <w:lang w:val="nl-NL"/>
+        </w:rPr>
+        <w:t>BELG.</w:t>
+      </w:r>
+      <w:r>
+        <w:rPr>
+          <w:lang w:val="nl-NL"/>
+        </w:rPr>
+        <w:t xml:space="preserve"> Niets meer. Een kleine Europese vlag in de hoek.</w:t>
+      </w:r>
+    </w:p>
+    <w:p>
+      <w:pPr>
+        <w:pStyle w:val="Normaalweb"/>
+        <w:divId w:val="349915568"/>
+        <w:rPr>
+          <w:lang w:val="nl-NL"/>
+        </w:rPr>
+      </w:pPr>
+      <w:r>
+        <w:rPr>
+          <w:lang w:val="nl-NL"/>
+        </w:rPr>
+        <w:t>Drie generaties. Drie identiteitskaarten. Eén woord. Het systeem reduceert iedereen tot een enkel datapunt. Zelfs degene die het probeerde te ontstijgen.</w:t>
+      </w:r>
+    </w:p>
+    <w:p>
+      <w:pPr>
+        <w:pStyle w:val="Normaalweb"/>
+        <w:divId w:val="349915568"/>
+        <w:rPr>
+          <w:lang w:val="nl-NL"/>
+        </w:rPr>
+      </w:pPr>
+      <w:r>
+        <w:rPr>
+          <w:lang w:val="nl-NL"/>
+        </w:rPr>
+        <w:t>Het is nu najaar 2026. Terwijl hij deze audit uittypt, valt er een traan op het toetsenbord. Niet uit zelfmedelijden, maar uit de pure, loden uitputting van een gevecht tegen de leegte. De bittere tragiek is dat Europa de fout inmiddels kent. In april 2026 bereikte de Europese wetgever in Brussel een politiek akkoord over de langverwachte herziening van de oude coördinatieregels; in juli 2026 werd de herziene tekst formeel aangenomen.</w:t>
       </w:r>
       <w:r>
         <w:rPr>
           <w:vertAlign w:val="superscript"/>
           <w:lang w:val="nl-NL"/>
         </w:rPr>
-        <w:t>***</w:t>
-      </w:r>
-      <w:r>
-        <w:rPr>
-          <w:lang w:val="nl-NL"/>
-        </w:rPr>
-        <w:t xml:space="preserve"> Ze geven het af bij de gemeente en krijgen het nooit terug. Wat ze in de plaats krijgen, is een Nederlands document met exact dezelfde Europese geldigheid. Alleen het land van uitgifte is veranderd. Vanaf dat moment dragen ze de paradox in hun eigen portemonnee. Een Belgische identiteitskaart voor hun identiteit. Een Nederlands rijbewijs voor hun mobiliteit, dat in Nederland dient als wettig legitimatiebewijs. In België wordt datzelfde rijbewijs niet als identiteitsbewijs aanvaard; daar geldt uitsluiten</w:t>
-      </w:r>
-      <w:r>
-        <w:rPr>
-          <w:lang w:val="nl-NL"/>
-        </w:rPr>
-        <w:t>d de Belgische kaart. Twee documenten, twee landen, één mens. Hun leven verdeelt zich over twee staten: wonen in het ene, verzekerd zijn in het andere. In theorie horen ze zo bij beide landen en zou hun bestaan zich naadloos over de grens moeten plooien. In de praktijk is het administratieve systeem geprogrammeerd om telkens maar één land tegelijk te lezen. Zodra de systemen niet met elkaar spreken, word je onleesbaar.</w:t>
+        <w:t>****</w:t>
+      </w:r>
+      <w:r>
+        <w:rPr>
+          <w:lang w:val="nl-NL"/>
+        </w:rPr>
+        <w:t xml:space="preserve"> De weeffouten worden erkend, het bevoegdheidsvacuüm is benoemd. Maar de inkt van de politiek stroomt eindeloos veel trager dan het bloed van de burger. De systemen worden pas omstreeks 2030 daadwerkelijk aangepast. Tot die tijd is de grensarbeider van vlees en bloed de enige overgebleven schokdemper voor de falende systemen van de staat.</w:t>
       </w:r>
     </w:p>
     <w:p>
       <w:pPr>
         <w:pStyle w:val="Normaalweb"/>
-        <w:divId w:val="198474154"/>
-        <w:rPr>
-          <w:lang w:val="nl-NL"/>
-        </w:rPr>
-      </w:pPr>
-      <w:r>
-        <w:rPr>
-          <w:lang w:val="nl-NL"/>
-        </w:rPr>
-        <w:t>In 2016 wordt hun zoon geboren. Een kind dat in zich draagt wat zijn ouders en grootouders hem hebben doorgegeven. De Vlaamse wortels van zijn moeder. De talen van zijn grootouders — niet als nationaliteit, maar als oorsprong, als klank, als bloed. En Zeeuws-Vlaams omdat hij er woont, de lucht inademt en er vrienden maakt. Vier werelden in één lichaam. Vier oorsprongen in één kind. Hij steekt elke dag de grens over. Niet voor werk, zoals zijn ouders, maar voor school. Hij woont in Nederland, maar leert leze</w:t>
-      </w:r>
-      <w:r>
-        <w:rPr>
-          <w:lang w:val="nl-NL"/>
-        </w:rPr>
-        <w:t>n en schrijven in Vlaanderen. Op school leert hij de taal van zijn moeder, maar zijn bed staat in Hulst. En daar begint het onvermijdelijke. Voor de Vlamingen is hij een Nederlander, rijdend in een auto met een geel kenteken. Voor de Nederlanders is hij een Vlaming, herkenbaar aan zijn tongval. Op het speelplein steken de andere kinderen hem in het vakje 'Belg'. Niet omdat iemand hem dat gevraagd heeft. Niet omdat hij een keuze heeft gemaakt. Maar omdat de kinderen om hem heen al geleerd hebben dat er vakje</w:t>
-      </w:r>
-      <w:r>
-        <w:rPr>
-          <w:lang w:val="nl-NL"/>
-        </w:rPr>
-        <w:t>s bestaan, en dat alles wat afwijkt, geclassificeerd moet worden. Drie mensen, drie dossiers, twee landen, één gezin.</w:t>
+        <w:divId w:val="349915568"/>
+        <w:rPr>
+          <w:lang w:val="nl-NL"/>
+        </w:rPr>
+      </w:pPr>
+      <w:r>
+        <w:rPr>
+          <w:lang w:val="nl-NL"/>
+        </w:rPr>
+        <w:t>En zelfs dán, in 2030, vormen die nieuwe regels slechts een technologische pleister op een veel diepere institutionele wonde. Zolang de natiestaten krampachtig vasthouden aan hun eigen gesloten loketten, blijft de grensarbeider in de kern de onbedoelde foutmelding van een half afgewerkt ontwerp.</w:t>
       </w:r>
     </w:p>
     <w:p>
       <w:pPr>
         <w:pStyle w:val="Normaalweb"/>
-        <w:divId w:val="198474154"/>
-        <w:rPr>
-          <w:lang w:val="nl-NL"/>
-        </w:rPr>
-      </w:pPr>
-      <w:r>
-        <w:rPr>
-          <w:lang w:val="nl-NL"/>
-        </w:rPr>
-        <w:t xml:space="preserve">Uiteindelijk krijgt ook hij een plastieken kaartje dat hem moet vertellen wie hij is. Daarop staat opnieuw dat ene woord. </w:t>
-      </w:r>
-      <w:r>
-        <w:rPr>
-          <w:rStyle w:val="Zwaar"/>
-          <w:lang w:val="nl-NL"/>
-        </w:rPr>
-        <w:t>BELG.</w:t>
-      </w:r>
-      <w:r>
-        <w:rPr>
-          <w:lang w:val="nl-NL"/>
-        </w:rPr>
-        <w:t xml:space="preserve"> De kleine Europese vlag in de hoek is het enige wat rest van het grotere ideaal. De rest is onzichtbaar gemaakt. Het systeem registreert één dimensie, terwijl het kind er vier draagt.</w:t>
+        <w:divId w:val="349915568"/>
+        <w:rPr>
+          <w:lang w:val="nl-NL"/>
+        </w:rPr>
+      </w:pPr>
+      <w:r>
+        <w:rPr>
+          <w:lang w:val="nl-NL"/>
+        </w:rPr>
+        <w:t>Dat is wat dit dossier onderzoekt. Niet de nationaliteit als juridisch statuut. Wel de oorsprong als menselijke werkelijkheid. En de vraag waarom een systeem dat zichzelf Europees noemt, de Europese werkelijkheid van zijn eigen burgers reduceert tot een eendimensionaal veld op een identiteitskaart.</w:t>
       </w:r>
     </w:p>
     <w:p>
       <w:pPr>
         <w:pStyle w:val="Normaalweb"/>
-        <w:divId w:val="198474154"/>
-        <w:rPr>
-          <w:lang w:val="nl-NL"/>
-        </w:rPr>
-      </w:pPr>
-      <w:r>
-        <w:rPr>
-          <w:lang w:val="nl-NL"/>
-        </w:rPr>
-        <w:t>Zo werkt het algoritme van de staat. Het ziet geen gezin. Het ziet geen organisme dat over twee landen is gegroeid. Het ziet uitsluitend losse eenheden in losse vakjes in losse landen. Wie niet in het vakje past, valt tussen de regels door.</w:t>
-      </w:r>
-    </w:p>
-    <w:p>
-      <w:pPr>
-        <w:pStyle w:val="Normaalweb"/>
-        <w:divId w:val="198474154"/>
-        <w:rPr>
-          <w:lang w:val="nl-NL"/>
-        </w:rPr>
-      </w:pPr>
-      <w:r>
-        <w:rPr>
-          <w:lang w:val="nl-NL"/>
-        </w:rPr>
-        <w:t xml:space="preserve">Het is 2025. De Europese Unie telt 27 lidstaten, na de uittreding van het Verenigd Koninkrijk. De overheden zijn gedigitaliseerd, datastromen verbinden de hoofdsteden en de theorie belooft een frictieloze unie. En het kind uit 1981? Hij is inmiddels vierenveertig. Hij wordt ernstig ziek en belandt in de kliniek. De tol van de suikerziekte is onomkeerbaar: de amputatie van twee tenen en het verlies van zicht in één oog. De Belgische artsen oordelen helder: u mag niet meer rijden. Hij kan en wil dat ook niet </w:t>
-      </w:r>
-      <w:r>
-        <w:rPr>
-          <w:lang w:val="nl-NL"/>
-        </w:rPr>
-        <w:t xml:space="preserve">meer. De Nederlandse artsen in zijn woonland kennen hem niet, en mógen hem door de strikte wetgeving rond dubbele inschrijvingen niet eens kennen. Hoewel het Nederlandse rijbewijs tot de </w:t>
-      </w:r>
-      <w:r>
-        <w:rPr>
-          <w:lang w:val="nl-NL"/>
-        </w:rPr>
-        <w:lastRenderedPageBreak/>
-        <w:t>volgende oogtest fysiek nog in zijn portemonnee zit — Nederland weet nog van niets, omdat de database domweg weigert de Belgische medische realiteit in te lezen — is zijn grensoverschrijdende mobiliteit feitelijk voorbij. Straks, wanneer dat document onvermijdelijk vervalt, wist het systeem de enige kaart uit die hem in Ned</w:t>
-      </w:r>
-      <w:r>
-        <w:rPr>
-          <w:lang w:val="nl-NL"/>
-        </w:rPr>
-        <w:t xml:space="preserve">erland nog een administratieve weerspiegeling gaf. Wat overblijft, is de Belgische identiteitskaart. Eén woord. </w:t>
-      </w:r>
-      <w:r>
-        <w:rPr>
-          <w:rStyle w:val="Zwaar"/>
-          <w:lang w:val="nl-NL"/>
-        </w:rPr>
-        <w:t>BELG.</w:t>
-      </w:r>
-      <w:r>
-        <w:rPr>
-          <w:lang w:val="nl-NL"/>
-        </w:rPr>
-        <w:t xml:space="preserve"> De man die zijn hele leven over grenzen bewoog, die zijn Italiaanse en Franse identiteit vrijwillig opgaf om Belg te worden, maar de wereld van zijn vader en moeder nooit kon uitwissen, wordt aan het einde van zijn rit genadeloos teruggebracht tot één land. Het systeem heeft hem ingehaald. De cirkel is rond. Hij is weer uitsluitend Belg. En zijn zoon, die vier werelden in zich draagt, staat </w:t>
-      </w:r>
-      <w:r>
-        <w:rPr>
-          <w:lang w:val="nl-NL"/>
-        </w:rPr>
-        <w:t xml:space="preserve">met exact datzelfde woord in de database. </w:t>
-      </w:r>
-      <w:r>
-        <w:rPr>
-          <w:rStyle w:val="Zwaar"/>
-          <w:lang w:val="nl-NL"/>
-        </w:rPr>
-        <w:t>BELG.</w:t>
-      </w:r>
-      <w:r>
-        <w:rPr>
-          <w:lang w:val="nl-NL"/>
-        </w:rPr>
-        <w:t xml:space="preserve"> Niets meer. Een kleine Europese vlag in de hoek.</w:t>
-      </w:r>
-    </w:p>
-    <w:p>
-      <w:pPr>
-        <w:pStyle w:val="Normaalweb"/>
-        <w:divId w:val="198474154"/>
-        <w:rPr>
-          <w:lang w:val="nl-NL"/>
-        </w:rPr>
-      </w:pPr>
-      <w:r>
-        <w:rPr>
-          <w:lang w:val="nl-NL"/>
-        </w:rPr>
-        <w:t>Drie generaties. Drie identiteitskaarten. Eén woord. Het systeem reduceert iedereen tot een enkel datapunt. Zelfs degene die het probeerde te ontstijgen.</w:t>
-      </w:r>
-    </w:p>
-    <w:p>
-      <w:pPr>
-        <w:pStyle w:val="Normaalweb"/>
-        <w:divId w:val="198474154"/>
-        <w:rPr>
-          <w:lang w:val="nl-NL"/>
-        </w:rPr>
-      </w:pPr>
-      <w:r>
-        <w:rPr>
-          <w:lang w:val="nl-NL"/>
-        </w:rPr>
-        <w:t>Het is nu najaar 2026. Terwijl hij deze audit uittypt, valt er een traan op het toetsenbord. Niet uit zelfmedelijden, maar uit de pure, loden uitputting van een gevecht tegen de leegte. De bittere tragiek is dat Europa de fout inmiddels kent. In april 2026 bereikte de Europese wetgever in Brussel een politiek akkoord over de langverwachte herziening van de oude coördinatieregels; in juli 2026 werd de herziene tekst formeel aangenomen.</w:t>
-      </w:r>
-      <w:r>
-        <w:rPr>
-          <w:vertAlign w:val="superscript"/>
-          <w:lang w:val="nl-NL"/>
-        </w:rPr>
-        <w:t>****</w:t>
-      </w:r>
-      <w:r>
-        <w:rPr>
-          <w:lang w:val="nl-NL"/>
-        </w:rPr>
-        <w:t xml:space="preserve"> De weeffouten worden erkend, het bevoegdheidsvacuüm is benoemd. Maar de inkt van de politiek stroomt eindeloos veel trager dan het bloed van de burger. De systemen worden pas omstreeks 2030 daadwerkelijk aangepast. Tot die tijd is de grensarbeider van vlees en bloed de enige overgebleven schokdemper voor de falende systemen van de staat.</w:t>
-      </w:r>
-    </w:p>
-    <w:p>
-      <w:pPr>
-        <w:pStyle w:val="Normaalweb"/>
-        <w:divId w:val="198474154"/>
-        <w:rPr>
-          <w:lang w:val="nl-NL"/>
-        </w:rPr>
-      </w:pPr>
-      <w:r>
-        <w:rPr>
-          <w:lang w:val="nl-NL"/>
-        </w:rPr>
-        <w:t>En zelfs dán, in 2030, vormen die nieuwe regels slechts een technologische pleister op een veel diepere institutionele wonde. Zolang de natiestaten krampachtig vasthouden aan hun eigen gesloten loketten, blijft de grensarbeider in de kern de onbedoelde foutmelding van een half afgewerkt ontwerp.</w:t>
-      </w:r>
-    </w:p>
-    <w:p>
-      <w:pPr>
-        <w:pStyle w:val="Normaalweb"/>
-        <w:divId w:val="198474154"/>
-        <w:rPr>
-          <w:lang w:val="nl-NL"/>
-        </w:rPr>
-      </w:pPr>
-      <w:r>
-        <w:rPr>
-          <w:lang w:val="nl-NL"/>
-        </w:rPr>
-        <w:t>Dat is wat dit dossier onderzoekt. Niet de nationaliteit als juridisch statuut. Wel de oorsprong als menselijke werkelijkheid. En de vraag waarom een systeem dat zichzelf Europees noemt, de Europese werkelijkheid van zijn eigen burgers reduceert tot een eendimensionaal veld op een identiteitskaart.</w:t>
-      </w:r>
-    </w:p>
-    <w:p>
-      <w:pPr>
-        <w:pStyle w:val="Normaalweb"/>
-        <w:divId w:val="198474154"/>
+        <w:divId w:val="349915568"/>
         <w:rPr>
           <w:lang w:val="nl-NL"/>
         </w:rPr>
@@ -1366,7 +1366,7 @@
     <w:p>
       <w:pPr>
         <w:spacing w:before="300" w:after="200"/>
-        <w:divId w:val="198474154"/>
+        <w:divId w:val="349915568"/>
         <w:rPr>
           <w:rFonts w:eastAsia="Times New Roman"/>
           <w:lang w:val="nl-NL"/>
@@ -1377,14 +1377,14 @@
           <w:rFonts w:eastAsia="Times New Roman"/>
           <w:lang w:val="nl-NL"/>
         </w:rPr>
-        <w:pict w14:anchorId="16CA7CF8">
+        <w:pict w14:anchorId="75B16C92">
           <v:rect id="_x0000_i1025" style="width:0;height:1.5pt" o:hralign="center" o:hrstd="t" o:hr="t" fillcolor="#a0a0a0" stroked="f"/>
         </w:pict>
       </w:r>
     </w:p>
     <w:p>
       <w:pPr>
-        <w:divId w:val="830877494"/>
+        <w:divId w:val="957370731"/>
         <w:rPr>
           <w:color w:val="555555"/>
           <w:sz w:val="20"/>
@@ -1423,7 +1423,7 @@
     </w:p>
     <w:p>
       <w:pPr>
-        <w:divId w:val="830877494"/>
+        <w:divId w:val="957370731"/>
         <w:rPr>
           <w:color w:val="555555"/>
           <w:sz w:val="20"/>
@@ -1448,12 +1448,22 @@
           <w:szCs w:val="20"/>
           <w:lang w:val="nl-NL"/>
         </w:rPr>
-        <w:t xml:space="preserve"> Met het Verdrag van Maastricht (getekend in 1992, in werking getreden eind 1993) werd het "Burgerschap van de Europese Unie" formeel ingevoerd. Elke persoon die de nationaliteit van een lidstaat bezit, is automatisch ook burger van de Unie, met het recht om vrij te reizen en te verblijven. Toch blijft de nationale administratieve uitvoering in de praktijk dominant over dit Europese basisrecht.</w:t>
-      </w:r>
-    </w:p>
-    <w:p>
-      <w:pPr>
-        <w:divId w:val="830877494"/>
+        <w:t xml:space="preserve"> Met het Verdrag van Maastricht (getekend in 1992, in werking getreden eind 1993) werd het "Burgerschap van de Europese Unie" formeel ingevoerd. Elke persoon die de nationaliteit van een lidstaat bezit, is automatisch ook burger van de Unie, met het </w:t>
+      </w:r>
+      <w:r>
+        <w:rPr>
+          <w:color w:val="555555"/>
+          <w:sz w:val="20"/>
+          <w:szCs w:val="20"/>
+          <w:lang w:val="nl-NL"/>
+        </w:rPr>
+        <w:lastRenderedPageBreak/>
+        <w:t>recht om vrij te reizen en te verblijven. Toch blijft de nationale administratieve uitvoering in de praktijk dominant over dit Europese basisrecht.</w:t>
+      </w:r>
+    </w:p>
+    <w:p>
+      <w:pPr>
+        <w:divId w:val="957370731"/>
         <w:rPr>
           <w:color w:val="555555"/>
           <w:sz w:val="20"/>
@@ -1478,22 +1488,12 @@
           <w:szCs w:val="20"/>
           <w:lang w:val="nl-NL"/>
         </w:rPr>
-        <w:t xml:space="preserve"> Conform de Europese Rijbewijsrichtlijn (2006/126/EG) is er een geharmoniseerd Europees model, maar blijft het beheer strikt gekoppeld aan het territorialiteitsbeginsel </w:t>
-      </w:r>
-      <w:r>
-        <w:rPr>
-          <w:color w:val="555555"/>
-          <w:sz w:val="20"/>
-          <w:szCs w:val="20"/>
-          <w:lang w:val="nl-NL"/>
-        </w:rPr>
-        <w:lastRenderedPageBreak/>
-        <w:t>van de lidstaat waar men de "normale verblijfplaats" heeft. Dit dwingt grensarbeiders om hun uitgevende land te veranderen na een verhuizing, ondanks de Europese status van het document.</w:t>
-      </w:r>
-    </w:p>
-    <w:p>
-      <w:pPr>
-        <w:divId w:val="830877494"/>
+        <w:t xml:space="preserve"> Conform de Europese Rijbewijsrichtlijn (2006/126/EG) is er een geharmoniseerd Europees model, maar blijft het beheer strikt gekoppeld aan het territorialiteitsbeginsel van de lidstaat waar men de "normale verblijfplaats" heeft. Dit dwingt grensarbeiders om hun uitgevende land te veranderen na een verhuizing, ondanks de Europese status van het document.</w:t>
+      </w:r>
+    </w:p>
+    <w:p>
+      <w:pPr>
+        <w:divId w:val="957370731"/>
         <w:rPr>
           <w:color w:val="555555"/>
           <w:sz w:val="20"/>
@@ -1525,7 +1525,7 @@
       <w:pPr>
         <w:pStyle w:val="marker"/>
         <w:ind w:left="800" w:right="800"/>
-        <w:divId w:val="198474154"/>
+        <w:divId w:val="349915568"/>
         <w:rPr>
           <w:lang w:val="nl-NL"/>
         </w:rPr>
@@ -1537,13 +1537,13 @@
     <w:p>
       <w:pPr>
         <w:pStyle w:val="Kop2"/>
-        <w:divId w:val="198474154"/>
+        <w:divId w:val="349915568"/>
         <w:rPr>
           <w:rFonts w:eastAsia="Times New Roman"/>
           <w:lang w:val="nl-NL"/>
         </w:rPr>
       </w:pPr>
-      <w:bookmarkStart w:id="2" w:name="_Toc242108264"/>
+      <w:bookmarkStart w:id="2" w:name="_Toc242177336"/>
       <w:r>
         <w:rPr>
           <w:rFonts w:eastAsia="Times New Roman"/>
@@ -1556,7 +1556,7 @@
     <w:p>
       <w:pPr>
         <w:pStyle w:val="Normaalweb"/>
-        <w:divId w:val="198474154"/>
+        <w:divId w:val="349915568"/>
         <w:rPr>
           <w:lang w:val="nl-NL"/>
         </w:rPr>
@@ -1571,7 +1571,7 @@
     <w:p>
       <w:pPr>
         <w:pStyle w:val="Normaalweb"/>
-        <w:divId w:val="198474154"/>
+        <w:divId w:val="349915568"/>
         <w:rPr>
           <w:lang w:val="nl-NL"/>
         </w:rPr>
@@ -1586,7 +1586,7 @@
     <w:p>
       <w:pPr>
         <w:pStyle w:val="Normaalweb"/>
-        <w:divId w:val="198474154"/>
+        <w:divId w:val="349915568"/>
         <w:rPr>
           <w:lang w:val="nl-NL"/>
         </w:rPr>
@@ -1601,13 +1601,13 @@
     <w:p>
       <w:pPr>
         <w:pStyle w:val="Kop2"/>
-        <w:divId w:val="198474154"/>
+        <w:divId w:val="349915568"/>
         <w:rPr>
           <w:rFonts w:eastAsia="Times New Roman"/>
           <w:lang w:val="nl-NL"/>
         </w:rPr>
       </w:pPr>
-      <w:bookmarkStart w:id="3" w:name="_Toc242108265"/>
+      <w:bookmarkStart w:id="3" w:name="_Toc242177337"/>
       <w:r>
         <w:rPr>
           <w:rFonts w:eastAsia="Times New Roman"/>
@@ -1620,7 +1620,7 @@
     <w:p>
       <w:pPr>
         <w:pStyle w:val="Normaalweb"/>
-        <w:divId w:val="198474154"/>
+        <w:divId w:val="349915568"/>
         <w:rPr>
           <w:lang w:val="nl-NL"/>
         </w:rPr>
@@ -1635,13 +1635,13 @@
     <w:p>
       <w:pPr>
         <w:pStyle w:val="Kop2"/>
-        <w:divId w:val="198474154"/>
+        <w:divId w:val="349915568"/>
         <w:rPr>
           <w:rFonts w:eastAsia="Times New Roman"/>
           <w:lang w:val="nl-NL"/>
         </w:rPr>
       </w:pPr>
-      <w:bookmarkStart w:id="4" w:name="_Toc242108266"/>
+      <w:bookmarkStart w:id="4" w:name="_Toc242177338"/>
       <w:r>
         <w:rPr>
           <w:rFonts w:eastAsia="Times New Roman"/>
@@ -1654,7 +1654,7 @@
     <w:p>
       <w:pPr>
         <w:pStyle w:val="Normaalweb"/>
-        <w:divId w:val="198474154"/>
+        <w:divId w:val="349915568"/>
         <w:rPr>
           <w:lang w:val="nl-NL"/>
         </w:rPr>
@@ -1669,13 +1669,13 @@
     <w:p>
       <w:pPr>
         <w:pStyle w:val="Kop3"/>
-        <w:divId w:val="198474154"/>
+        <w:divId w:val="349915568"/>
         <w:rPr>
           <w:rFonts w:eastAsia="Times New Roman"/>
           <w:lang w:val="nl-NL"/>
         </w:rPr>
       </w:pPr>
-      <w:bookmarkStart w:id="5" w:name="_Toc242108267"/>
+      <w:bookmarkStart w:id="5" w:name="_Toc242177339"/>
       <w:r>
         <w:rPr>
           <w:rFonts w:eastAsia="Times New Roman"/>
@@ -1688,7 +1688,7 @@
     <w:p>
       <w:pPr>
         <w:pStyle w:val="Normaalweb"/>
-        <w:divId w:val="198474154"/>
+        <w:divId w:val="349915568"/>
         <w:rPr>
           <w:lang w:val="nl-NL"/>
         </w:rPr>
@@ -1703,13 +1703,13 @@
     <w:p>
       <w:pPr>
         <w:pStyle w:val="Kop3"/>
-        <w:divId w:val="198474154"/>
+        <w:divId w:val="349915568"/>
         <w:rPr>
           <w:rFonts w:eastAsia="Times New Roman"/>
           <w:lang w:val="nl-NL"/>
         </w:rPr>
       </w:pPr>
-      <w:bookmarkStart w:id="6" w:name="_Toc242108268"/>
+      <w:bookmarkStart w:id="6" w:name="_Toc242177340"/>
       <w:r>
         <w:rPr>
           <w:rFonts w:eastAsia="Times New Roman"/>
@@ -1722,7 +1722,7 @@
     <w:p>
       <w:pPr>
         <w:pStyle w:val="Normaalweb"/>
-        <w:divId w:val="198474154"/>
+        <w:divId w:val="349915568"/>
         <w:rPr>
           <w:lang w:val="nl-NL"/>
         </w:rPr>
@@ -1737,13 +1737,13 @@
     <w:p>
       <w:pPr>
         <w:pStyle w:val="Kop3"/>
-        <w:divId w:val="198474154"/>
+        <w:divId w:val="349915568"/>
         <w:rPr>
           <w:rFonts w:eastAsia="Times New Roman"/>
           <w:lang w:val="nl-NL"/>
         </w:rPr>
       </w:pPr>
-      <w:bookmarkStart w:id="7" w:name="_Toc242108269"/>
+      <w:bookmarkStart w:id="7" w:name="_Toc242177341"/>
       <w:r>
         <w:rPr>
           <w:rFonts w:eastAsia="Times New Roman"/>
@@ -1756,7 +1756,7 @@
     <w:p>
       <w:pPr>
         <w:pStyle w:val="Normaalweb"/>
-        <w:divId w:val="198474154"/>
+        <w:divId w:val="349915568"/>
         <w:rPr>
           <w:lang w:val="nl-NL"/>
         </w:rPr>
@@ -1771,13 +1771,13 @@
     <w:p>
       <w:pPr>
         <w:pStyle w:val="Kop3"/>
-        <w:divId w:val="198474154"/>
+        <w:divId w:val="349915568"/>
         <w:rPr>
           <w:rFonts w:eastAsia="Times New Roman"/>
           <w:lang w:val="nl-NL"/>
         </w:rPr>
       </w:pPr>
-      <w:bookmarkStart w:id="8" w:name="_Toc242108270"/>
+      <w:bookmarkStart w:id="8" w:name="_Toc242177342"/>
       <w:r>
         <w:rPr>
           <w:rFonts w:eastAsia="Times New Roman"/>
@@ -1790,29 +1790,28 @@
     <w:p>
       <w:pPr>
         <w:pStyle w:val="Normaalweb"/>
-        <w:divId w:val="198474154"/>
-        <w:rPr>
-          <w:lang w:val="nl-NL"/>
-        </w:rPr>
-      </w:pPr>
-      <w:r>
-        <w:rPr>
-          <w:lang w:val="nl-NL"/>
-        </w:rPr>
-        <w:lastRenderedPageBreak/>
+        <w:divId w:val="349915568"/>
+        <w:rPr>
+          <w:lang w:val="nl-NL"/>
+        </w:rPr>
+      </w:pPr>
+      <w:r>
+        <w:rPr>
+          <w:lang w:val="nl-NL"/>
+        </w:rPr>
         <w:t>Brengt de patronen samen die uit het materiaal naar voren komen. Welke paradoxen komen terug, welke breuklijnen zijn systemisch, welke rol speelt de Europese Unie. Voor wie de optelsom wil.</w:t>
       </w:r>
     </w:p>
     <w:p>
       <w:pPr>
         <w:pStyle w:val="Kop2"/>
-        <w:divId w:val="198474154"/>
+        <w:divId w:val="349915568"/>
         <w:rPr>
           <w:rFonts w:eastAsia="Times New Roman"/>
           <w:lang w:val="nl-NL"/>
         </w:rPr>
       </w:pPr>
-      <w:bookmarkStart w:id="9" w:name="_Toc242108271"/>
+      <w:bookmarkStart w:id="9" w:name="_Toc242177343"/>
       <w:r>
         <w:rPr>
           <w:rFonts w:eastAsia="Times New Roman"/>
@@ -1825,7 +1824,7 @@
     <w:p>
       <w:pPr>
         <w:pStyle w:val="Normaalweb"/>
-        <w:divId w:val="198474154"/>
+        <w:divId w:val="349915568"/>
         <w:rPr>
           <w:lang w:val="nl-NL"/>
         </w:rPr>
@@ -1840,7 +1839,7 @@
     <w:p>
       <w:pPr>
         <w:pStyle w:val="Normaalweb"/>
-        <w:divId w:val="198474154"/>
+        <w:divId w:val="349915568"/>
         <w:rPr>
           <w:lang w:val="nl-NL"/>
         </w:rPr>
@@ -1855,7 +1854,7 @@
     <w:p>
       <w:pPr>
         <w:pStyle w:val="Normaalweb"/>
-        <w:divId w:val="198474154"/>
+        <w:divId w:val="349915568"/>
         <w:rPr>
           <w:lang w:val="nl-NL"/>
         </w:rPr>
@@ -1870,13 +1869,13 @@
     <w:p>
       <w:pPr>
         <w:pStyle w:val="Kop2"/>
-        <w:divId w:val="198474154"/>
+        <w:divId w:val="349915568"/>
         <w:rPr>
           <w:rFonts w:eastAsia="Times New Roman"/>
           <w:lang w:val="nl-NL"/>
         </w:rPr>
       </w:pPr>
-      <w:bookmarkStart w:id="10" w:name="_Toc242108272"/>
+      <w:bookmarkStart w:id="10" w:name="_Toc242177344"/>
       <w:r>
         <w:rPr>
           <w:rFonts w:eastAsia="Times New Roman"/>
@@ -1889,7 +1888,7 @@
     <w:p>
       <w:pPr>
         <w:pStyle w:val="Normaalweb"/>
-        <w:divId w:val="198474154"/>
+        <w:divId w:val="349915568"/>
         <w:rPr>
           <w:lang w:val="nl-NL"/>
         </w:rPr>
@@ -1904,7 +1903,7 @@
     <w:p>
       <w:pPr>
         <w:pStyle w:val="Normaalweb"/>
-        <w:divId w:val="198474154"/>
+        <w:divId w:val="349915568"/>
         <w:rPr>
           <w:lang w:val="nl-NL"/>
         </w:rPr>
@@ -1919,13 +1918,13 @@
     <w:p>
       <w:pPr>
         <w:pStyle w:val="Kop2"/>
-        <w:divId w:val="198474154"/>
+        <w:divId w:val="349915568"/>
         <w:rPr>
           <w:rFonts w:eastAsia="Times New Roman"/>
           <w:lang w:val="nl-NL"/>
         </w:rPr>
       </w:pPr>
-      <w:bookmarkStart w:id="11" w:name="_Toc242108273"/>
+      <w:bookmarkStart w:id="11" w:name="_Toc242177345"/>
       <w:r>
         <w:rPr>
           <w:rFonts w:eastAsia="Times New Roman"/>
@@ -1938,7 +1937,7 @@
     <w:p>
       <w:pPr>
         <w:pStyle w:val="Normaalweb"/>
-        <w:divId w:val="198474154"/>
+        <w:divId w:val="349915568"/>
         <w:rPr>
           <w:lang w:val="nl-NL"/>
         </w:rPr>
@@ -1953,7 +1952,7 @@
     <w:p>
       <w:pPr>
         <w:pStyle w:val="Normaalweb"/>
-        <w:divId w:val="198474154"/>
+        <w:divId w:val="349915568"/>
         <w:rPr>
           <w:lang w:val="nl-NL"/>
         </w:rPr>
@@ -1968,8 +1967,7 @@
     <w:p>
       <w:pPr>
         <w:shd w:val="clear" w:color="auto" w:fill="FFFFFF"/>
-        <w:jc w:val="both"/>
-        <w:divId w:val="785345897"/>
+        <w:divId w:val="238253265"/>
         <w:rPr>
           <w:szCs w:val="22"/>
           <w:lang w:val="nl-NL"/>
@@ -2102,7 +2100,7 @@
         <w:color w:val="808080"/>
         <w:sz w:val="18"/>
       </w:rPr>
-      <w:t>2</w:t>
+      <w:t>1</w:t>
     </w:r>
     <w:r>
       <w:rPr>
@@ -2237,7 +2235,7 @@
         <w:sz w:val="18"/>
       </w:rPr>
       <w:tab/>
-      <w:t>Laatst gewijzigd: 5 oktober 2026, 15:55</w:t>
+      <w:t>Laatst gewijzigd: 6 oktober 2026, 10:24</w:t>
     </w:r>
   </w:p>
 </w:hdr>
@@ -2885,7 +2883,6 @@
     <w:basedOn w:val="Standaard"/>
     <w:pPr>
       <w:spacing w:after="160"/>
-      <w:jc w:val="both"/>
     </w:pPr>
   </w:style>
   <w:style w:type="paragraph" w:styleId="Normaalweb">
@@ -2896,7 +2893,6 @@
     <w:unhideWhenUsed/>
     <w:pPr>
       <w:spacing w:after="160"/>
-      <w:jc w:val="both"/>
     </w:pPr>
   </w:style>
   <w:style w:type="paragraph" w:customStyle="1" w:styleId="subtitel">
@@ -2904,7 +2900,6 @@
     <w:basedOn w:val="Standaard"/>
     <w:pPr>
       <w:spacing w:after="200"/>
-      <w:jc w:val="both"/>
     </w:pPr>
     <w:rPr>
       <w:i/>
@@ -2918,7 +2913,6 @@
     <w:basedOn w:val="Standaard"/>
     <w:pPr>
       <w:spacing w:after="240"/>
-      <w:jc w:val="both"/>
     </w:pPr>
     <w:rPr>
       <w:i/>
@@ -2931,7 +2925,6 @@
     <w:basedOn w:val="Standaard"/>
     <w:pPr>
       <w:spacing w:after="80"/>
-      <w:jc w:val="both"/>
     </w:pPr>
     <w:rPr>
       <w:i/>
@@ -3339,6 +3332,86 @@
       <w:spacing w:before="600" w:after="100" w:afterAutospacing="1"/>
     </w:pPr>
   </w:style>
+  <w:style w:type="paragraph" w:customStyle="1" w:styleId="recht-kop">
+    <w:name w:val="recht-kop"/>
+    <w:basedOn w:val="Standaard"/>
+    <w:pPr>
+      <w:spacing w:before="100" w:beforeAutospacing="1" w:after="80"/>
+    </w:pPr>
+  </w:style>
+  <w:style w:type="paragraph" w:customStyle="1" w:styleId="recht-status">
+    <w:name w:val="recht-status"/>
+    <w:basedOn w:val="Standaard"/>
+    <w:pPr>
+      <w:spacing w:before="100" w:beforeAutospacing="1" w:after="100" w:afterAutospacing="1"/>
+    </w:pPr>
+    <w:rPr>
+      <w:b/>
+      <w:bCs/>
+      <w:caps/>
+      <w:color w:val="FFFFFF"/>
+      <w:spacing w:val="8"/>
+      <w:sz w:val="18"/>
+      <w:szCs w:val="18"/>
+    </w:rPr>
+  </w:style>
+  <w:style w:type="paragraph" w:customStyle="1" w:styleId="recht-kop-wrapper">
+    <w:name w:val="recht-kop-wrapper"/>
+    <w:basedOn w:val="Standaard"/>
+    <w:pPr>
+      <w:pBdr>
+        <w:bottom w:val="single" w:sz="12" w:space="6" w:color="8B1E1E"/>
+      </w:pBdr>
+      <w:spacing w:before="100" w:beforeAutospacing="1" w:after="240"/>
+    </w:pPr>
+  </w:style>
+  <w:style w:type="paragraph" w:customStyle="1" w:styleId="categorie-titel">
+    <w:name w:val="categorie-titel"/>
+    <w:basedOn w:val="Standaard"/>
+    <w:pPr>
+      <w:pBdr>
+        <w:bottom w:val="single" w:sz="6" w:space="4" w:color="CCCCCC"/>
+      </w:pBdr>
+      <w:spacing w:before="480" w:after="200"/>
+    </w:pPr>
+    <w:rPr>
+      <w:rFonts w:ascii="Aptos Display" w:hAnsi="Aptos Display"/>
+      <w:caps/>
+      <w:color w:val="555555"/>
+      <w:spacing w:val="20"/>
+      <w:sz w:val="28"/>
+      <w:szCs w:val="28"/>
+    </w:rPr>
+  </w:style>
+  <w:style w:type="paragraph" w:customStyle="1" w:styleId="sector-titel">
+    <w:name w:val="sector-titel"/>
+    <w:basedOn w:val="Standaard"/>
+    <w:pPr>
+      <w:spacing w:before="400" w:after="160"/>
+    </w:pPr>
+    <w:rPr>
+      <w:rFonts w:ascii="Aptos Display" w:hAnsi="Aptos Display"/>
+      <w:color w:val="8B1E1E"/>
+      <w:sz w:val="32"/>
+      <w:szCs w:val="32"/>
+    </w:rPr>
+  </w:style>
+  <w:style w:type="paragraph" w:customStyle="1" w:styleId="intro-rechten">
+    <w:name w:val="intro-rechten"/>
+    <w:basedOn w:val="Standaard"/>
+    <w:pPr>
+      <w:pBdr>
+        <w:left w:val="single" w:sz="24" w:space="14" w:color="8B1E1E"/>
+      </w:pBdr>
+      <w:shd w:val="clear" w:color="auto" w:fill="F7F5F1"/>
+      <w:spacing w:before="100" w:beforeAutospacing="1" w:after="480"/>
+    </w:pPr>
+    <w:rPr>
+      <w:i/>
+      <w:iCs/>
+      <w:color w:val="444444"/>
+    </w:rPr>
+  </w:style>
   <w:style w:type="paragraph" w:customStyle="1" w:styleId="ondertitel">
     <w:name w:val="ondertitel"/>
     <w:basedOn w:val="Standaard"/>
@@ -3372,7 +3445,6 @@
     <w:basedOn w:val="Standaard"/>
     <w:pPr>
       <w:spacing w:after="1200"/>
-      <w:jc w:val="both"/>
     </w:pPr>
     <w:rPr>
       <w:rFonts w:ascii="Aptos Display" w:hAnsi="Aptos Display"/>
@@ -3386,7 +3458,6 @@
     <w:basedOn w:val="Standaard"/>
     <w:pPr>
       <w:spacing w:after="1600"/>
-      <w:jc w:val="both"/>
     </w:pPr>
     <w:rPr>
       <w:rFonts w:ascii="Aptos Display" w:hAnsi="Aptos Display"/>
@@ -3402,7 +3473,6 @@
     <w:basedOn w:val="Standaard"/>
     <w:pPr>
       <w:spacing w:after="80"/>
-      <w:jc w:val="both"/>
     </w:pPr>
     <w:rPr>
       <w:color w:val="333333"/>
@@ -3415,7 +3485,6 @@
     <w:basedOn w:val="Standaard"/>
     <w:pPr>
       <w:spacing w:after="80"/>
-      <w:jc w:val="both"/>
     </w:pPr>
     <w:rPr>
       <w:color w:val="555555"/>
@@ -3426,7 +3495,6 @@
     <w:basedOn w:val="Standaard"/>
     <w:pPr>
       <w:spacing w:after="1200"/>
-      <w:jc w:val="both"/>
     </w:pPr>
     <w:rPr>
       <w:rFonts w:ascii="Aptos Display" w:hAnsi="Aptos Display"/>
@@ -3440,7 +3508,6 @@
     <w:basedOn w:val="Standaard"/>
     <w:pPr>
       <w:spacing w:after="1600"/>
-      <w:jc w:val="both"/>
     </w:pPr>
     <w:rPr>
       <w:rFonts w:ascii="Aptos Display" w:hAnsi="Aptos Display"/>
@@ -3456,7 +3523,6 @@
     <w:basedOn w:val="Standaard"/>
     <w:pPr>
       <w:spacing w:after="80"/>
-      <w:jc w:val="both"/>
     </w:pPr>
     <w:rPr>
       <w:color w:val="333333"/>
@@ -3469,7 +3535,6 @@
     <w:basedOn w:val="Standaard"/>
     <w:pPr>
       <w:spacing w:after="80"/>
-      <w:jc w:val="both"/>
     </w:pPr>
     <w:rPr>
       <w:color w:val="555555"/>
@@ -3480,7 +3545,6 @@
     <w:basedOn w:val="Standaard"/>
     <w:pPr>
       <w:spacing w:after="160"/>
-      <w:jc w:val="both"/>
     </w:pPr>
   </w:style>
   <w:style w:type="paragraph" w:styleId="Koptekst">
@@ -3489,7 +3553,7 @@
     <w:link w:val="KoptekstChar"/>
     <w:uiPriority w:val="99"/>
     <w:unhideWhenUsed/>
-    <w:rsid w:val="00A8198A"/>
+    <w:rsid w:val="00894FB3"/>
     <w:pPr>
       <w:tabs>
         <w:tab w:val="center" w:pos="4536"/>
@@ -3502,7 +3566,7 @@
     <w:basedOn w:val="Standaardalinea-lettertype"/>
     <w:link w:val="Koptekst"/>
     <w:uiPriority w:val="99"/>
-    <w:rsid w:val="00A8198A"/>
+    <w:rsid w:val="00894FB3"/>
     <w:rPr>
       <w:rFonts w:eastAsiaTheme="minorEastAsia"/>
       <w:sz w:val="24"/>
@@ -3515,7 +3579,7 @@
     <w:link w:val="VoettekstChar"/>
     <w:uiPriority w:val="99"/>
     <w:unhideWhenUsed/>
-    <w:rsid w:val="00A8198A"/>
+    <w:rsid w:val="00894FB3"/>
     <w:pPr>
       <w:tabs>
         <w:tab w:val="center" w:pos="4536"/>
@@ -3528,7 +3592,7 @@
     <w:basedOn w:val="Standaardalinea-lettertype"/>
     <w:link w:val="Voettekst"/>
     <w:uiPriority w:val="99"/>
-    <w:rsid w:val="00A8198A"/>
+    <w:rsid w:val="00894FB3"/>
     <w:rPr>
       <w:rFonts w:eastAsiaTheme="minorEastAsia"/>
       <w:sz w:val="24"/>
@@ -3542,7 +3606,7 @@
     <w:autoRedefine/>
     <w:uiPriority w:val="39"/>
     <w:unhideWhenUsed/>
-    <w:rsid w:val="00A8198A"/>
+    <w:rsid w:val="00894FB3"/>
     <w:pPr>
       <w:spacing w:after="100"/>
       <w:ind w:left="220"/>
@@ -3555,7 +3619,7 @@
     <w:autoRedefine/>
     <w:uiPriority w:val="39"/>
     <w:unhideWhenUsed/>
-    <w:rsid w:val="00A8198A"/>
+    <w:rsid w:val="00894FB3"/>
     <w:pPr>
       <w:spacing w:after="100"/>
       <w:ind w:left="440"/>

</xml_diff>

<commit_message>
Update Systeem-Audit NL 06-10-2026 11:20
</commit_message>
<xml_diff>
--- a/nl/docx/document-0.docx
+++ b/nl/docx/document-0.docx
@@ -7,7 +7,7 @@
         <w:spacing w:after="480"/>
         <w:jc w:val="center"/>
         <w:outlineLvl w:val="1"/>
-        <w:divId w:val="2037267177"/>
+        <w:divId w:val="435756730"/>
         <w:rPr>
           <w:rFonts w:ascii="Aptos Display" w:eastAsia="Times New Roman" w:hAnsi="Aptos Display"/>
           <w:b/>
@@ -36,7 +36,7 @@
     <w:p>
       <w:pPr>
         <w:pStyle w:val="ondertitel2"/>
-        <w:divId w:val="2037267177"/>
+        <w:divId w:val="435756730"/>
         <w:rPr>
           <w:lang w:val="nl-NL"/>
         </w:rPr>
@@ -51,7 +51,7 @@
     <w:p>
       <w:pPr>
         <w:pStyle w:val="documentaanduiding2"/>
-        <w:divId w:val="2037267177"/>
+        <w:divId w:val="435756730"/>
         <w:rPr>
           <w:lang w:val="nl-NL"/>
         </w:rPr>
@@ -66,7 +66,7 @@
     <w:p>
       <w:pPr>
         <w:pStyle w:val="auteur2"/>
-        <w:divId w:val="2037267177"/>
+        <w:divId w:val="435756730"/>
         <w:rPr>
           <w:lang w:val="nl-NL"/>
         </w:rPr>
@@ -81,23 +81,23 @@
     <w:p>
       <w:pPr>
         <w:pStyle w:val="meta-lijn2"/>
-        <w:divId w:val="2037267177"/>
-        <w:rPr>
-          <w:lang w:val="nl-NL"/>
-        </w:rPr>
-      </w:pPr>
-      <w:r>
-        <w:rPr>
-          <w:lang w:val="nl-NL"/>
-        </w:rPr>
-        <w:t>Versie bijgewerkt: 6 oktober 2026, 10:24</w:t>
+        <w:divId w:val="435756730"/>
+        <w:rPr>
+          <w:lang w:val="nl-NL"/>
+        </w:rPr>
+      </w:pPr>
+      <w:r>
+        <w:rPr>
+          <w:lang w:val="nl-NL"/>
+        </w:rPr>
+        <w:t>Versie bijgewerkt: 6 oktober 2026, 11:20</w:t>
       </w:r>
     </w:p>
     <w:p>
       <w:pPr>
         <w:pStyle w:val="marker"/>
         <w:ind w:left="800" w:right="800"/>
-        <w:divId w:val="349915568"/>
+        <w:divId w:val="1951474978"/>
         <w:rPr>
           <w:lang w:val="nl-NL"/>
         </w:rPr>
@@ -110,13 +110,13 @@
       <w:pPr>
         <w:pStyle w:val="Kop2"/>
         <w:pageBreakBefore/>
-        <w:divId w:val="547453361"/>
+        <w:divId w:val="1437558704"/>
         <w:rPr>
           <w:rFonts w:eastAsia="Times New Roman"/>
           <w:lang w:val="nl-NL"/>
         </w:rPr>
       </w:pPr>
-      <w:bookmarkStart w:id="0" w:name="_Toc242177334"/>
+      <w:bookmarkStart w:id="0" w:name="_Toc242180690"/>
       <w:r>
         <w:rPr>
           <w:rFonts w:eastAsia="Times New Roman"/>
@@ -133,7 +133,7 @@
         <w:tabs>
           <w:tab w:val="right" w:leader="dot" w:pos="9062"/>
         </w:tabs>
-        <w:divId w:val="547453361"/>
+        <w:divId w:val="1437558704"/>
         <w:rPr>
           <w:rFonts w:asciiTheme="minorHAnsi" w:hAnsiTheme="minorHAnsi" w:cstheme="minorBidi"/>
           <w:noProof/>
@@ -184,7 +184,7 @@
         <w:rPr>
           <w:noProof/>
         </w:rPr>
-        <w:instrText xml:space="preserve"> PAGEREF _Toc242177334 \h </w:instrText>
+        <w:instrText xml:space="preserve"> PAGEREF _Toc242180690 \h </w:instrText>
       </w:r>
       <w:r>
         <w:rPr>
@@ -216,7 +216,7 @@
         <w:tabs>
           <w:tab w:val="right" w:leader="dot" w:pos="9062"/>
         </w:tabs>
-        <w:divId w:val="547453361"/>
+        <w:divId w:val="1437558704"/>
         <w:rPr>
           <w:rFonts w:asciiTheme="minorHAnsi" w:hAnsiTheme="minorHAnsi" w:cstheme="minorBidi"/>
           <w:noProof/>
@@ -249,7 +249,7 @@
         <w:rPr>
           <w:noProof/>
         </w:rPr>
-        <w:instrText xml:space="preserve"> PAGEREF _Toc242177335 \h </w:instrText>
+        <w:instrText xml:space="preserve"> PAGEREF _Toc242180691 \h </w:instrText>
       </w:r>
       <w:r>
         <w:rPr>
@@ -281,7 +281,7 @@
         <w:tabs>
           <w:tab w:val="right" w:leader="dot" w:pos="9062"/>
         </w:tabs>
-        <w:divId w:val="547453361"/>
+        <w:divId w:val="1437558704"/>
         <w:rPr>
           <w:rFonts w:asciiTheme="minorHAnsi" w:hAnsiTheme="minorHAnsi" w:cstheme="minorBidi"/>
           <w:noProof/>
@@ -314,7 +314,7 @@
         <w:rPr>
           <w:noProof/>
         </w:rPr>
-        <w:instrText xml:space="preserve"> PAGEREF _Toc242177336 \h </w:instrText>
+        <w:instrText xml:space="preserve"> PAGEREF _Toc242180692 \h </w:instrText>
       </w:r>
       <w:r>
         <w:rPr>
@@ -346,7 +346,7 @@
         <w:tabs>
           <w:tab w:val="right" w:leader="dot" w:pos="9062"/>
         </w:tabs>
-        <w:divId w:val="547453361"/>
+        <w:divId w:val="1437558704"/>
         <w:rPr>
           <w:rFonts w:asciiTheme="minorHAnsi" w:hAnsiTheme="minorHAnsi" w:cstheme="minorBidi"/>
           <w:noProof/>
@@ -379,7 +379,7 @@
         <w:rPr>
           <w:noProof/>
         </w:rPr>
-        <w:instrText xml:space="preserve"> PAGEREF _Toc242177337 \h </w:instrText>
+        <w:instrText xml:space="preserve"> PAGEREF _Toc242180693 \h </w:instrText>
       </w:r>
       <w:r>
         <w:rPr>
@@ -411,7 +411,7 @@
         <w:tabs>
           <w:tab w:val="right" w:leader="dot" w:pos="9062"/>
         </w:tabs>
-        <w:divId w:val="547453361"/>
+        <w:divId w:val="1437558704"/>
         <w:rPr>
           <w:rFonts w:asciiTheme="minorHAnsi" w:hAnsiTheme="minorHAnsi" w:cstheme="minorBidi"/>
           <w:noProof/>
@@ -444,7 +444,7 @@
         <w:rPr>
           <w:noProof/>
         </w:rPr>
-        <w:instrText xml:space="preserve"> PAGEREF _Toc242177338 \h </w:instrText>
+        <w:instrText xml:space="preserve"> PAGEREF _Toc242180694 \h </w:instrText>
       </w:r>
       <w:r>
         <w:rPr>
@@ -476,7 +476,7 @@
         <w:tabs>
           <w:tab w:val="right" w:leader="dot" w:pos="9062"/>
         </w:tabs>
-        <w:divId w:val="547453361"/>
+        <w:divId w:val="1437558704"/>
         <w:rPr>
           <w:rFonts w:asciiTheme="minorHAnsi" w:hAnsiTheme="minorHAnsi" w:cstheme="minorBidi"/>
           <w:noProof/>
@@ -509,7 +509,7 @@
         <w:rPr>
           <w:noProof/>
         </w:rPr>
-        <w:instrText xml:space="preserve"> PAGEREF _Toc242177339 \h </w:instrText>
+        <w:instrText xml:space="preserve"> PAGEREF _Toc242180695 \h </w:instrText>
       </w:r>
       <w:r>
         <w:rPr>
@@ -541,7 +541,7 @@
         <w:tabs>
           <w:tab w:val="right" w:leader="dot" w:pos="9062"/>
         </w:tabs>
-        <w:divId w:val="547453361"/>
+        <w:divId w:val="1437558704"/>
         <w:rPr>
           <w:rFonts w:asciiTheme="minorHAnsi" w:hAnsiTheme="minorHAnsi" w:cstheme="minorBidi"/>
           <w:noProof/>
@@ -574,7 +574,7 @@
         <w:rPr>
           <w:noProof/>
         </w:rPr>
-        <w:instrText xml:space="preserve"> PAGEREF _Toc242177340 \h </w:instrText>
+        <w:instrText xml:space="preserve"> PAGEREF _Toc242180696 \h </w:instrText>
       </w:r>
       <w:r>
         <w:rPr>
@@ -606,7 +606,7 @@
         <w:tabs>
           <w:tab w:val="right" w:leader="dot" w:pos="9062"/>
         </w:tabs>
-        <w:divId w:val="547453361"/>
+        <w:divId w:val="1437558704"/>
         <w:rPr>
           <w:rFonts w:asciiTheme="minorHAnsi" w:hAnsiTheme="minorHAnsi" w:cstheme="minorBidi"/>
           <w:noProof/>
@@ -639,7 +639,7 @@
         <w:rPr>
           <w:noProof/>
         </w:rPr>
-        <w:instrText xml:space="preserve"> PAGEREF _Toc242177341 \h </w:instrText>
+        <w:instrText xml:space="preserve"> PAGEREF _Toc242180697 \h </w:instrText>
       </w:r>
       <w:r>
         <w:rPr>
@@ -671,7 +671,7 @@
         <w:tabs>
           <w:tab w:val="right" w:leader="dot" w:pos="9062"/>
         </w:tabs>
-        <w:divId w:val="547453361"/>
+        <w:divId w:val="1437558704"/>
         <w:rPr>
           <w:rFonts w:asciiTheme="minorHAnsi" w:hAnsiTheme="minorHAnsi" w:cstheme="minorBidi"/>
           <w:noProof/>
@@ -704,7 +704,7 @@
         <w:rPr>
           <w:noProof/>
         </w:rPr>
-        <w:instrText xml:space="preserve"> PAGEREF _Toc242177342 \h </w:instrText>
+        <w:instrText xml:space="preserve"> PAGEREF _Toc242180698 \h </w:instrText>
       </w:r>
       <w:r>
         <w:rPr>
@@ -736,7 +736,7 @@
         <w:tabs>
           <w:tab w:val="right" w:leader="dot" w:pos="9062"/>
         </w:tabs>
-        <w:divId w:val="547453361"/>
+        <w:divId w:val="1437558704"/>
         <w:rPr>
           <w:rFonts w:asciiTheme="minorHAnsi" w:hAnsiTheme="minorHAnsi" w:cstheme="minorBidi"/>
           <w:noProof/>
@@ -769,7 +769,7 @@
         <w:rPr>
           <w:noProof/>
         </w:rPr>
-        <w:instrText xml:space="preserve"> PAGEREF _Toc242177343 \h </w:instrText>
+        <w:instrText xml:space="preserve"> PAGEREF _Toc242180699 \h </w:instrText>
       </w:r>
       <w:r>
         <w:rPr>
@@ -801,7 +801,7 @@
         <w:tabs>
           <w:tab w:val="right" w:leader="dot" w:pos="9062"/>
         </w:tabs>
-        <w:divId w:val="547453361"/>
+        <w:divId w:val="1437558704"/>
         <w:rPr>
           <w:rFonts w:asciiTheme="minorHAnsi" w:hAnsiTheme="minorHAnsi" w:cstheme="minorBidi"/>
           <w:noProof/>
@@ -834,7 +834,7 @@
         <w:rPr>
           <w:noProof/>
         </w:rPr>
-        <w:instrText xml:space="preserve"> PAGEREF _Toc242177344 \h </w:instrText>
+        <w:instrText xml:space="preserve"> PAGEREF _Toc242180700 \h </w:instrText>
       </w:r>
       <w:r>
         <w:rPr>
@@ -866,7 +866,7 @@
         <w:tabs>
           <w:tab w:val="right" w:leader="dot" w:pos="9062"/>
         </w:tabs>
-        <w:divId w:val="547453361"/>
+        <w:divId w:val="1437558704"/>
         <w:rPr>
           <w:rFonts w:asciiTheme="minorHAnsi" w:hAnsiTheme="minorHAnsi" w:cstheme="minorBidi"/>
           <w:noProof/>
@@ -899,7 +899,7 @@
         <w:rPr>
           <w:noProof/>
         </w:rPr>
-        <w:instrText xml:space="preserve"> PAGEREF _Toc242177345 \h </w:instrText>
+        <w:instrText xml:space="preserve"> PAGEREF _Toc242180701 \h </w:instrText>
       </w:r>
       <w:r>
         <w:rPr>
@@ -928,7 +928,7 @@
     <w:p>
       <w:pPr>
         <w:pStyle w:val="marker"/>
-        <w:divId w:val="547453361"/>
+        <w:divId w:val="1437558704"/>
         <w:rPr>
           <w:lang w:val="nl-NL"/>
         </w:rPr>
@@ -944,7 +944,7 @@
       <w:pPr>
         <w:pStyle w:val="marker"/>
         <w:ind w:left="800" w:right="800"/>
-        <w:divId w:val="349915568"/>
+        <w:divId w:val="1951474978"/>
         <w:rPr>
           <w:lang w:val="nl-NL"/>
         </w:rPr>
@@ -956,13 +956,13 @@
     <w:p>
       <w:pPr>
         <w:pStyle w:val="Kop2"/>
-        <w:divId w:val="349915568"/>
+        <w:divId w:val="1951474978"/>
         <w:rPr>
           <w:rFonts w:eastAsia="Times New Roman"/>
           <w:lang w:val="nl-NL"/>
         </w:rPr>
       </w:pPr>
-      <w:bookmarkStart w:id="1" w:name="_Toc242177335"/>
+      <w:bookmarkStart w:id="1" w:name="_Toc242180691"/>
       <w:r>
         <w:rPr>
           <w:rFonts w:eastAsia="Times New Roman"/>
@@ -975,7 +975,7 @@
     <w:p>
       <w:pPr>
         <w:pStyle w:val="Normaalweb"/>
-        <w:divId w:val="349915568"/>
+        <w:divId w:val="1951474978"/>
         <w:rPr>
           <w:lang w:val="nl-NL"/>
         </w:rPr>
@@ -990,7 +990,7 @@
     <w:p>
       <w:pPr>
         <w:pStyle w:val="Normaalweb"/>
-        <w:divId w:val="349915568"/>
+        <w:divId w:val="1951474978"/>
         <w:rPr>
           <w:lang w:val="nl-NL"/>
         </w:rPr>
@@ -1018,7 +1018,7 @@
     <w:p>
       <w:pPr>
         <w:pStyle w:val="Normaalweb"/>
-        <w:divId w:val="349915568"/>
+        <w:divId w:val="1951474978"/>
         <w:rPr>
           <w:lang w:val="nl-NL"/>
         </w:rPr>
@@ -1039,7 +1039,7 @@
     <w:p>
       <w:pPr>
         <w:pStyle w:val="Normaalweb"/>
-        <w:divId w:val="349915568"/>
+        <w:divId w:val="1951474978"/>
         <w:rPr>
           <w:lang w:val="nl-NL"/>
         </w:rPr>
@@ -1086,7 +1086,7 @@
     <w:p>
       <w:pPr>
         <w:pStyle w:val="Normaalweb"/>
-        <w:divId w:val="349915568"/>
+        <w:divId w:val="1951474978"/>
         <w:rPr>
           <w:lang w:val="nl-NL"/>
         </w:rPr>
@@ -1114,7 +1114,7 @@
     <w:p>
       <w:pPr>
         <w:pStyle w:val="Normaalweb"/>
-        <w:divId w:val="349915568"/>
+        <w:divId w:val="1951474978"/>
         <w:rPr>
           <w:lang w:val="nl-NL"/>
         </w:rPr>
@@ -1148,7 +1148,7 @@
     <w:p>
       <w:pPr>
         <w:pStyle w:val="Normaalweb"/>
-        <w:divId w:val="349915568"/>
+        <w:divId w:val="1951474978"/>
         <w:rPr>
           <w:lang w:val="nl-NL"/>
         </w:rPr>
@@ -1175,7 +1175,7 @@
     <w:p>
       <w:pPr>
         <w:pStyle w:val="Normaalweb"/>
-        <w:divId w:val="349915568"/>
+        <w:divId w:val="1951474978"/>
         <w:rPr>
           <w:lang w:val="nl-NL"/>
         </w:rPr>
@@ -1203,7 +1203,7 @@
     <w:p>
       <w:pPr>
         <w:pStyle w:val="Normaalweb"/>
-        <w:divId w:val="349915568"/>
+        <w:divId w:val="1951474978"/>
         <w:rPr>
           <w:lang w:val="nl-NL"/>
         </w:rPr>
@@ -1218,7 +1218,7 @@
     <w:p>
       <w:pPr>
         <w:pStyle w:val="Normaalweb"/>
-        <w:divId w:val="349915568"/>
+        <w:divId w:val="1951474978"/>
         <w:rPr>
           <w:lang w:val="nl-NL"/>
         </w:rPr>
@@ -1278,7 +1278,7 @@
     <w:p>
       <w:pPr>
         <w:pStyle w:val="Normaalweb"/>
-        <w:divId w:val="349915568"/>
+        <w:divId w:val="1951474978"/>
         <w:rPr>
           <w:lang w:val="nl-NL"/>
         </w:rPr>
@@ -1293,7 +1293,7 @@
     <w:p>
       <w:pPr>
         <w:pStyle w:val="Normaalweb"/>
-        <w:divId w:val="349915568"/>
+        <w:divId w:val="1951474978"/>
         <w:rPr>
           <w:lang w:val="nl-NL"/>
         </w:rPr>
@@ -1321,7 +1321,7 @@
     <w:p>
       <w:pPr>
         <w:pStyle w:val="Normaalweb"/>
-        <w:divId w:val="349915568"/>
+        <w:divId w:val="1951474978"/>
         <w:rPr>
           <w:lang w:val="nl-NL"/>
         </w:rPr>
@@ -1336,7 +1336,7 @@
     <w:p>
       <w:pPr>
         <w:pStyle w:val="Normaalweb"/>
-        <w:divId w:val="349915568"/>
+        <w:divId w:val="1951474978"/>
         <w:rPr>
           <w:lang w:val="nl-NL"/>
         </w:rPr>
@@ -1351,7 +1351,7 @@
     <w:p>
       <w:pPr>
         <w:pStyle w:val="Normaalweb"/>
-        <w:divId w:val="349915568"/>
+        <w:divId w:val="1951474978"/>
         <w:rPr>
           <w:lang w:val="nl-NL"/>
         </w:rPr>
@@ -1366,7 +1366,7 @@
     <w:p>
       <w:pPr>
         <w:spacing w:before="300" w:after="200"/>
-        <w:divId w:val="349915568"/>
+        <w:divId w:val="1951474978"/>
         <w:rPr>
           <w:rFonts w:eastAsia="Times New Roman"/>
           <w:lang w:val="nl-NL"/>
@@ -1377,14 +1377,14 @@
           <w:rFonts w:eastAsia="Times New Roman"/>
           <w:lang w:val="nl-NL"/>
         </w:rPr>
-        <w:pict w14:anchorId="75B16C92">
+        <w:pict w14:anchorId="69B036C0">
           <v:rect id="_x0000_i1025" style="width:0;height:1.5pt" o:hralign="center" o:hrstd="t" o:hr="t" fillcolor="#a0a0a0" stroked="f"/>
         </w:pict>
       </w:r>
     </w:p>
     <w:p>
       <w:pPr>
-        <w:divId w:val="957370731"/>
+        <w:divId w:val="1886328103"/>
         <w:rPr>
           <w:color w:val="555555"/>
           <w:sz w:val="20"/>
@@ -1423,7 +1423,7 @@
     </w:p>
     <w:p>
       <w:pPr>
-        <w:divId w:val="957370731"/>
+        <w:divId w:val="1886328103"/>
         <w:rPr>
           <w:color w:val="555555"/>
           <w:sz w:val="20"/>
@@ -1463,7 +1463,7 @@
     </w:p>
     <w:p>
       <w:pPr>
-        <w:divId w:val="957370731"/>
+        <w:divId w:val="1886328103"/>
         <w:rPr>
           <w:color w:val="555555"/>
           <w:sz w:val="20"/>
@@ -1493,7 +1493,7 @@
     </w:p>
     <w:p>
       <w:pPr>
-        <w:divId w:val="957370731"/>
+        <w:divId w:val="1886328103"/>
         <w:rPr>
           <w:color w:val="555555"/>
           <w:sz w:val="20"/>
@@ -1525,7 +1525,7 @@
       <w:pPr>
         <w:pStyle w:val="marker"/>
         <w:ind w:left="800" w:right="800"/>
-        <w:divId w:val="349915568"/>
+        <w:divId w:val="1951474978"/>
         <w:rPr>
           <w:lang w:val="nl-NL"/>
         </w:rPr>
@@ -1537,13 +1537,13 @@
     <w:p>
       <w:pPr>
         <w:pStyle w:val="Kop2"/>
-        <w:divId w:val="349915568"/>
+        <w:divId w:val="1951474978"/>
         <w:rPr>
           <w:rFonts w:eastAsia="Times New Roman"/>
           <w:lang w:val="nl-NL"/>
         </w:rPr>
       </w:pPr>
-      <w:bookmarkStart w:id="2" w:name="_Toc242177336"/>
+      <w:bookmarkStart w:id="2" w:name="_Toc242180692"/>
       <w:r>
         <w:rPr>
           <w:rFonts w:eastAsia="Times New Roman"/>
@@ -1556,7 +1556,7 @@
     <w:p>
       <w:pPr>
         <w:pStyle w:val="Normaalweb"/>
-        <w:divId w:val="349915568"/>
+        <w:divId w:val="1951474978"/>
         <w:rPr>
           <w:lang w:val="nl-NL"/>
         </w:rPr>
@@ -1571,7 +1571,7 @@
     <w:p>
       <w:pPr>
         <w:pStyle w:val="Normaalweb"/>
-        <w:divId w:val="349915568"/>
+        <w:divId w:val="1951474978"/>
         <w:rPr>
           <w:lang w:val="nl-NL"/>
         </w:rPr>
@@ -1586,7 +1586,7 @@
     <w:p>
       <w:pPr>
         <w:pStyle w:val="Normaalweb"/>
-        <w:divId w:val="349915568"/>
+        <w:divId w:val="1951474978"/>
         <w:rPr>
           <w:lang w:val="nl-NL"/>
         </w:rPr>
@@ -1601,13 +1601,13 @@
     <w:p>
       <w:pPr>
         <w:pStyle w:val="Kop2"/>
-        <w:divId w:val="349915568"/>
+        <w:divId w:val="1951474978"/>
         <w:rPr>
           <w:rFonts w:eastAsia="Times New Roman"/>
           <w:lang w:val="nl-NL"/>
         </w:rPr>
       </w:pPr>
-      <w:bookmarkStart w:id="3" w:name="_Toc242177337"/>
+      <w:bookmarkStart w:id="3" w:name="_Toc242180693"/>
       <w:r>
         <w:rPr>
           <w:rFonts w:eastAsia="Times New Roman"/>
@@ -1620,7 +1620,7 @@
     <w:p>
       <w:pPr>
         <w:pStyle w:val="Normaalweb"/>
-        <w:divId w:val="349915568"/>
+        <w:divId w:val="1951474978"/>
         <w:rPr>
           <w:lang w:val="nl-NL"/>
         </w:rPr>
@@ -1635,13 +1635,13 @@
     <w:p>
       <w:pPr>
         <w:pStyle w:val="Kop2"/>
-        <w:divId w:val="349915568"/>
+        <w:divId w:val="1951474978"/>
         <w:rPr>
           <w:rFonts w:eastAsia="Times New Roman"/>
           <w:lang w:val="nl-NL"/>
         </w:rPr>
       </w:pPr>
-      <w:bookmarkStart w:id="4" w:name="_Toc242177338"/>
+      <w:bookmarkStart w:id="4" w:name="_Toc242180694"/>
       <w:r>
         <w:rPr>
           <w:rFonts w:eastAsia="Times New Roman"/>
@@ -1654,7 +1654,7 @@
     <w:p>
       <w:pPr>
         <w:pStyle w:val="Normaalweb"/>
-        <w:divId w:val="349915568"/>
+        <w:divId w:val="1951474978"/>
         <w:rPr>
           <w:lang w:val="nl-NL"/>
         </w:rPr>
@@ -1669,13 +1669,13 @@
     <w:p>
       <w:pPr>
         <w:pStyle w:val="Kop3"/>
-        <w:divId w:val="349915568"/>
+        <w:divId w:val="1951474978"/>
         <w:rPr>
           <w:rFonts w:eastAsia="Times New Roman"/>
           <w:lang w:val="nl-NL"/>
         </w:rPr>
       </w:pPr>
-      <w:bookmarkStart w:id="5" w:name="_Toc242177339"/>
+      <w:bookmarkStart w:id="5" w:name="_Toc242180695"/>
       <w:r>
         <w:rPr>
           <w:rFonts w:eastAsia="Times New Roman"/>
@@ -1688,7 +1688,7 @@
     <w:p>
       <w:pPr>
         <w:pStyle w:val="Normaalweb"/>
-        <w:divId w:val="349915568"/>
+        <w:divId w:val="1951474978"/>
         <w:rPr>
           <w:lang w:val="nl-NL"/>
         </w:rPr>
@@ -1703,13 +1703,13 @@
     <w:p>
       <w:pPr>
         <w:pStyle w:val="Kop3"/>
-        <w:divId w:val="349915568"/>
+        <w:divId w:val="1951474978"/>
         <w:rPr>
           <w:rFonts w:eastAsia="Times New Roman"/>
           <w:lang w:val="nl-NL"/>
         </w:rPr>
       </w:pPr>
-      <w:bookmarkStart w:id="6" w:name="_Toc242177340"/>
+      <w:bookmarkStart w:id="6" w:name="_Toc242180696"/>
       <w:r>
         <w:rPr>
           <w:rFonts w:eastAsia="Times New Roman"/>
@@ -1722,7 +1722,7 @@
     <w:p>
       <w:pPr>
         <w:pStyle w:val="Normaalweb"/>
-        <w:divId w:val="349915568"/>
+        <w:divId w:val="1951474978"/>
         <w:rPr>
           <w:lang w:val="nl-NL"/>
         </w:rPr>
@@ -1737,13 +1737,13 @@
     <w:p>
       <w:pPr>
         <w:pStyle w:val="Kop3"/>
-        <w:divId w:val="349915568"/>
+        <w:divId w:val="1951474978"/>
         <w:rPr>
           <w:rFonts w:eastAsia="Times New Roman"/>
           <w:lang w:val="nl-NL"/>
         </w:rPr>
       </w:pPr>
-      <w:bookmarkStart w:id="7" w:name="_Toc242177341"/>
+      <w:bookmarkStart w:id="7" w:name="_Toc242180697"/>
       <w:r>
         <w:rPr>
           <w:rFonts w:eastAsia="Times New Roman"/>
@@ -1756,7 +1756,7 @@
     <w:p>
       <w:pPr>
         <w:pStyle w:val="Normaalweb"/>
-        <w:divId w:val="349915568"/>
+        <w:divId w:val="1951474978"/>
         <w:rPr>
           <w:lang w:val="nl-NL"/>
         </w:rPr>
@@ -1771,13 +1771,13 @@
     <w:p>
       <w:pPr>
         <w:pStyle w:val="Kop3"/>
-        <w:divId w:val="349915568"/>
+        <w:divId w:val="1951474978"/>
         <w:rPr>
           <w:rFonts w:eastAsia="Times New Roman"/>
           <w:lang w:val="nl-NL"/>
         </w:rPr>
       </w:pPr>
-      <w:bookmarkStart w:id="8" w:name="_Toc242177342"/>
+      <w:bookmarkStart w:id="8" w:name="_Toc242180698"/>
       <w:r>
         <w:rPr>
           <w:rFonts w:eastAsia="Times New Roman"/>
@@ -1790,28 +1790,29 @@
     <w:p>
       <w:pPr>
         <w:pStyle w:val="Normaalweb"/>
-        <w:divId w:val="349915568"/>
-        <w:rPr>
-          <w:lang w:val="nl-NL"/>
-        </w:rPr>
-      </w:pPr>
-      <w:r>
-        <w:rPr>
-          <w:lang w:val="nl-NL"/>
-        </w:rPr>
+        <w:divId w:val="1951474978"/>
+        <w:rPr>
+          <w:lang w:val="nl-NL"/>
+        </w:rPr>
+      </w:pPr>
+      <w:r>
+        <w:rPr>
+          <w:lang w:val="nl-NL"/>
+        </w:rPr>
+        <w:lastRenderedPageBreak/>
         <w:t>Brengt de patronen samen die uit het materiaal naar voren komen. Welke paradoxen komen terug, welke breuklijnen zijn systemisch, welke rol speelt de Europese Unie. Voor wie de optelsom wil.</w:t>
       </w:r>
     </w:p>
     <w:p>
       <w:pPr>
         <w:pStyle w:val="Kop2"/>
-        <w:divId w:val="349915568"/>
+        <w:divId w:val="1951474978"/>
         <w:rPr>
           <w:rFonts w:eastAsia="Times New Roman"/>
           <w:lang w:val="nl-NL"/>
         </w:rPr>
       </w:pPr>
-      <w:bookmarkStart w:id="9" w:name="_Toc242177343"/>
+      <w:bookmarkStart w:id="9" w:name="_Toc242180699"/>
       <w:r>
         <w:rPr>
           <w:rFonts w:eastAsia="Times New Roman"/>
@@ -1824,7 +1825,7 @@
     <w:p>
       <w:pPr>
         <w:pStyle w:val="Normaalweb"/>
-        <w:divId w:val="349915568"/>
+        <w:divId w:val="1951474978"/>
         <w:rPr>
           <w:lang w:val="nl-NL"/>
         </w:rPr>
@@ -1839,7 +1840,7 @@
     <w:p>
       <w:pPr>
         <w:pStyle w:val="Normaalweb"/>
-        <w:divId w:val="349915568"/>
+        <w:divId w:val="1951474978"/>
         <w:rPr>
           <w:lang w:val="nl-NL"/>
         </w:rPr>
@@ -1854,7 +1855,7 @@
     <w:p>
       <w:pPr>
         <w:pStyle w:val="Normaalweb"/>
-        <w:divId w:val="349915568"/>
+        <w:divId w:val="1951474978"/>
         <w:rPr>
           <w:lang w:val="nl-NL"/>
         </w:rPr>
@@ -1869,13 +1870,13 @@
     <w:p>
       <w:pPr>
         <w:pStyle w:val="Kop2"/>
-        <w:divId w:val="349915568"/>
+        <w:divId w:val="1951474978"/>
         <w:rPr>
           <w:rFonts w:eastAsia="Times New Roman"/>
           <w:lang w:val="nl-NL"/>
         </w:rPr>
       </w:pPr>
-      <w:bookmarkStart w:id="10" w:name="_Toc242177344"/>
+      <w:bookmarkStart w:id="10" w:name="_Toc242180700"/>
       <w:r>
         <w:rPr>
           <w:rFonts w:eastAsia="Times New Roman"/>
@@ -1888,7 +1889,7 @@
     <w:p>
       <w:pPr>
         <w:pStyle w:val="Normaalweb"/>
-        <w:divId w:val="349915568"/>
+        <w:divId w:val="1951474978"/>
         <w:rPr>
           <w:lang w:val="nl-NL"/>
         </w:rPr>
@@ -1903,7 +1904,7 @@
     <w:p>
       <w:pPr>
         <w:pStyle w:val="Normaalweb"/>
-        <w:divId w:val="349915568"/>
+        <w:divId w:val="1951474978"/>
         <w:rPr>
           <w:lang w:val="nl-NL"/>
         </w:rPr>
@@ -1918,13 +1919,13 @@
     <w:p>
       <w:pPr>
         <w:pStyle w:val="Kop2"/>
-        <w:divId w:val="349915568"/>
+        <w:divId w:val="1951474978"/>
         <w:rPr>
           <w:rFonts w:eastAsia="Times New Roman"/>
           <w:lang w:val="nl-NL"/>
         </w:rPr>
       </w:pPr>
-      <w:bookmarkStart w:id="11" w:name="_Toc242177345"/>
+      <w:bookmarkStart w:id="11" w:name="_Toc242180701"/>
       <w:r>
         <w:rPr>
           <w:rFonts w:eastAsia="Times New Roman"/>
@@ -1937,7 +1938,7 @@
     <w:p>
       <w:pPr>
         <w:pStyle w:val="Normaalweb"/>
-        <w:divId w:val="349915568"/>
+        <w:divId w:val="1951474978"/>
         <w:rPr>
           <w:lang w:val="nl-NL"/>
         </w:rPr>
@@ -1952,7 +1953,7 @@
     <w:p>
       <w:pPr>
         <w:pStyle w:val="Normaalweb"/>
-        <w:divId w:val="349915568"/>
+        <w:divId w:val="1951474978"/>
         <w:rPr>
           <w:lang w:val="nl-NL"/>
         </w:rPr>
@@ -1967,7 +1968,7 @@
     <w:p>
       <w:pPr>
         <w:shd w:val="clear" w:color="auto" w:fill="FFFFFF"/>
-        <w:divId w:val="238253265"/>
+        <w:divId w:val="2092004543"/>
         <w:rPr>
           <w:szCs w:val="22"/>
           <w:lang w:val="nl-NL"/>
@@ -2235,7 +2236,7 @@
         <w:sz w:val="18"/>
       </w:rPr>
       <w:tab/>
-      <w:t>Laatst gewijzigd: 6 oktober 2026, 10:24</w:t>
+      <w:t>Laatst gewijzigd: 6 oktober 2026, 11:20</w:t>
     </w:r>
   </w:p>
 </w:hdr>
@@ -3365,24 +3366,6 @@
       <w:spacing w:before="100" w:beforeAutospacing="1" w:after="240"/>
     </w:pPr>
   </w:style>
-  <w:style w:type="paragraph" w:customStyle="1" w:styleId="categorie-titel">
-    <w:name w:val="categorie-titel"/>
-    <w:basedOn w:val="Standaard"/>
-    <w:pPr>
-      <w:pBdr>
-        <w:bottom w:val="single" w:sz="6" w:space="4" w:color="CCCCCC"/>
-      </w:pBdr>
-      <w:spacing w:before="480" w:after="200"/>
-    </w:pPr>
-    <w:rPr>
-      <w:rFonts w:ascii="Aptos Display" w:hAnsi="Aptos Display"/>
-      <w:caps/>
-      <w:color w:val="555555"/>
-      <w:spacing w:val="20"/>
-      <w:sz w:val="28"/>
-      <w:szCs w:val="28"/>
-    </w:rPr>
-  </w:style>
   <w:style w:type="paragraph" w:customStyle="1" w:styleId="sector-titel">
     <w:name w:val="sector-titel"/>
     <w:basedOn w:val="Standaard"/>
@@ -3553,7 +3536,7 @@
     <w:link w:val="KoptekstChar"/>
     <w:uiPriority w:val="99"/>
     <w:unhideWhenUsed/>
-    <w:rsid w:val="00894FB3"/>
+    <w:rsid w:val="001B6BD8"/>
     <w:pPr>
       <w:tabs>
         <w:tab w:val="center" w:pos="4536"/>
@@ -3566,7 +3549,7 @@
     <w:basedOn w:val="Standaardalinea-lettertype"/>
     <w:link w:val="Koptekst"/>
     <w:uiPriority w:val="99"/>
-    <w:rsid w:val="00894FB3"/>
+    <w:rsid w:val="001B6BD8"/>
     <w:rPr>
       <w:rFonts w:eastAsiaTheme="minorEastAsia"/>
       <w:sz w:val="24"/>
@@ -3579,7 +3562,7 @@
     <w:link w:val="VoettekstChar"/>
     <w:uiPriority w:val="99"/>
     <w:unhideWhenUsed/>
-    <w:rsid w:val="00894FB3"/>
+    <w:rsid w:val="001B6BD8"/>
     <w:pPr>
       <w:tabs>
         <w:tab w:val="center" w:pos="4536"/>
@@ -3592,7 +3575,7 @@
     <w:basedOn w:val="Standaardalinea-lettertype"/>
     <w:link w:val="Voettekst"/>
     <w:uiPriority w:val="99"/>
-    <w:rsid w:val="00894FB3"/>
+    <w:rsid w:val="001B6BD8"/>
     <w:rPr>
       <w:rFonts w:eastAsiaTheme="minorEastAsia"/>
       <w:sz w:val="24"/>
@@ -3606,7 +3589,7 @@
     <w:autoRedefine/>
     <w:uiPriority w:val="39"/>
     <w:unhideWhenUsed/>
-    <w:rsid w:val="00894FB3"/>
+    <w:rsid w:val="001B6BD8"/>
     <w:pPr>
       <w:spacing w:after="100"/>
       <w:ind w:left="220"/>
@@ -3619,7 +3602,7 @@
     <w:autoRedefine/>
     <w:uiPriority w:val="39"/>
     <w:unhideWhenUsed/>
-    <w:rsid w:val="00894FB3"/>
+    <w:rsid w:val="001B6BD8"/>
     <w:pPr>
       <w:spacing w:after="100"/>
       <w:ind w:left="440"/>

</xml_diff>

<commit_message>
Update Systeem-Audit NL 06-10-2026 13:42
</commit_message>
<xml_diff>
--- a/nl/docx/document-0.docx
+++ b/nl/docx/document-0.docx
@@ -7,7 +7,7 @@
         <w:spacing w:after="480"/>
         <w:jc w:val="center"/>
         <w:outlineLvl w:val="1"/>
-        <w:divId w:val="435756730"/>
+        <w:divId w:val="335110517"/>
         <w:rPr>
           <w:rFonts w:ascii="Aptos Display" w:eastAsia="Times New Roman" w:hAnsi="Aptos Display"/>
           <w:b/>
@@ -36,7 +36,7 @@
     <w:p>
       <w:pPr>
         <w:pStyle w:val="ondertitel2"/>
-        <w:divId w:val="435756730"/>
+        <w:divId w:val="335110517"/>
         <w:rPr>
           <w:lang w:val="nl-NL"/>
         </w:rPr>
@@ -51,7 +51,7 @@
     <w:p>
       <w:pPr>
         <w:pStyle w:val="documentaanduiding2"/>
-        <w:divId w:val="435756730"/>
+        <w:divId w:val="335110517"/>
         <w:rPr>
           <w:lang w:val="nl-NL"/>
         </w:rPr>
@@ -66,7 +66,7 @@
     <w:p>
       <w:pPr>
         <w:pStyle w:val="auteur2"/>
-        <w:divId w:val="435756730"/>
+        <w:divId w:val="335110517"/>
         <w:rPr>
           <w:lang w:val="nl-NL"/>
         </w:rPr>
@@ -81,23 +81,23 @@
     <w:p>
       <w:pPr>
         <w:pStyle w:val="meta-lijn2"/>
-        <w:divId w:val="435756730"/>
-        <w:rPr>
-          <w:lang w:val="nl-NL"/>
-        </w:rPr>
-      </w:pPr>
-      <w:r>
-        <w:rPr>
-          <w:lang w:val="nl-NL"/>
-        </w:rPr>
-        <w:t>Versie bijgewerkt: 6 oktober 2026, 11:20</w:t>
+        <w:divId w:val="335110517"/>
+        <w:rPr>
+          <w:lang w:val="nl-NL"/>
+        </w:rPr>
+      </w:pPr>
+      <w:r>
+        <w:rPr>
+          <w:lang w:val="nl-NL"/>
+        </w:rPr>
+        <w:t>Versie bijgewerkt: 6 oktober 2026, 13:42</w:t>
       </w:r>
     </w:p>
     <w:p>
       <w:pPr>
         <w:pStyle w:val="marker"/>
         <w:ind w:left="800" w:right="800"/>
-        <w:divId w:val="1951474978"/>
+        <w:divId w:val="735709604"/>
         <w:rPr>
           <w:lang w:val="nl-NL"/>
         </w:rPr>
@@ -110,13 +110,13 @@
       <w:pPr>
         <w:pStyle w:val="Kop2"/>
         <w:pageBreakBefore/>
-        <w:divId w:val="1437558704"/>
+        <w:divId w:val="1925382745"/>
         <w:rPr>
           <w:rFonts w:eastAsia="Times New Roman"/>
           <w:lang w:val="nl-NL"/>
         </w:rPr>
       </w:pPr>
-      <w:bookmarkStart w:id="0" w:name="_Toc242180690"/>
+      <w:bookmarkStart w:id="0" w:name="_Toc242186682"/>
       <w:r>
         <w:rPr>
           <w:rFonts w:eastAsia="Times New Roman"/>
@@ -133,7 +133,7 @@
         <w:tabs>
           <w:tab w:val="right" w:leader="dot" w:pos="9062"/>
         </w:tabs>
-        <w:divId w:val="1437558704"/>
+        <w:divId w:val="1925382745"/>
         <w:rPr>
           <w:rFonts w:asciiTheme="minorHAnsi" w:hAnsiTheme="minorHAnsi" w:cstheme="minorBidi"/>
           <w:noProof/>
@@ -184,7 +184,7 @@
         <w:rPr>
           <w:noProof/>
         </w:rPr>
-        <w:instrText xml:space="preserve"> PAGEREF _Toc242180690 \h </w:instrText>
+        <w:instrText xml:space="preserve"> PAGEREF _Toc242186682 \h </w:instrText>
       </w:r>
       <w:r>
         <w:rPr>
@@ -216,7 +216,7 @@
         <w:tabs>
           <w:tab w:val="right" w:leader="dot" w:pos="9062"/>
         </w:tabs>
-        <w:divId w:val="1437558704"/>
+        <w:divId w:val="1925382745"/>
         <w:rPr>
           <w:rFonts w:asciiTheme="minorHAnsi" w:hAnsiTheme="minorHAnsi" w:cstheme="minorBidi"/>
           <w:noProof/>
@@ -249,7 +249,7 @@
         <w:rPr>
           <w:noProof/>
         </w:rPr>
-        <w:instrText xml:space="preserve"> PAGEREF _Toc242180691 \h </w:instrText>
+        <w:instrText xml:space="preserve"> PAGEREF _Toc242186683 \h </w:instrText>
       </w:r>
       <w:r>
         <w:rPr>
@@ -281,7 +281,7 @@
         <w:tabs>
           <w:tab w:val="right" w:leader="dot" w:pos="9062"/>
         </w:tabs>
-        <w:divId w:val="1437558704"/>
+        <w:divId w:val="1925382745"/>
         <w:rPr>
           <w:rFonts w:asciiTheme="minorHAnsi" w:hAnsiTheme="minorHAnsi" w:cstheme="minorBidi"/>
           <w:noProof/>
@@ -314,7 +314,7 @@
         <w:rPr>
           <w:noProof/>
         </w:rPr>
-        <w:instrText xml:space="preserve"> PAGEREF _Toc242180692 \h </w:instrText>
+        <w:instrText xml:space="preserve"> PAGEREF _Toc242186684 \h </w:instrText>
       </w:r>
       <w:r>
         <w:rPr>
@@ -346,7 +346,7 @@
         <w:tabs>
           <w:tab w:val="right" w:leader="dot" w:pos="9062"/>
         </w:tabs>
-        <w:divId w:val="1437558704"/>
+        <w:divId w:val="1925382745"/>
         <w:rPr>
           <w:rFonts w:asciiTheme="minorHAnsi" w:hAnsiTheme="minorHAnsi" w:cstheme="minorBidi"/>
           <w:noProof/>
@@ -379,7 +379,7 @@
         <w:rPr>
           <w:noProof/>
         </w:rPr>
-        <w:instrText xml:space="preserve"> PAGEREF _Toc242180693 \h </w:instrText>
+        <w:instrText xml:space="preserve"> PAGEREF _Toc242186685 \h </w:instrText>
       </w:r>
       <w:r>
         <w:rPr>
@@ -411,7 +411,7 @@
         <w:tabs>
           <w:tab w:val="right" w:leader="dot" w:pos="9062"/>
         </w:tabs>
-        <w:divId w:val="1437558704"/>
+        <w:divId w:val="1925382745"/>
         <w:rPr>
           <w:rFonts w:asciiTheme="minorHAnsi" w:hAnsiTheme="minorHAnsi" w:cstheme="minorBidi"/>
           <w:noProof/>
@@ -444,7 +444,7 @@
         <w:rPr>
           <w:noProof/>
         </w:rPr>
-        <w:instrText xml:space="preserve"> PAGEREF _Toc242180694 \h </w:instrText>
+        <w:instrText xml:space="preserve"> PAGEREF _Toc242186686 \h </w:instrText>
       </w:r>
       <w:r>
         <w:rPr>
@@ -476,7 +476,7 @@
         <w:tabs>
           <w:tab w:val="right" w:leader="dot" w:pos="9062"/>
         </w:tabs>
-        <w:divId w:val="1437558704"/>
+        <w:divId w:val="1925382745"/>
         <w:rPr>
           <w:rFonts w:asciiTheme="minorHAnsi" w:hAnsiTheme="minorHAnsi" w:cstheme="minorBidi"/>
           <w:noProof/>
@@ -509,7 +509,7 @@
         <w:rPr>
           <w:noProof/>
         </w:rPr>
-        <w:instrText xml:space="preserve"> PAGEREF _Toc242180695 \h </w:instrText>
+        <w:instrText xml:space="preserve"> PAGEREF _Toc242186687 \h </w:instrText>
       </w:r>
       <w:r>
         <w:rPr>
@@ -541,7 +541,7 @@
         <w:tabs>
           <w:tab w:val="right" w:leader="dot" w:pos="9062"/>
         </w:tabs>
-        <w:divId w:val="1437558704"/>
+        <w:divId w:val="1925382745"/>
         <w:rPr>
           <w:rFonts w:asciiTheme="minorHAnsi" w:hAnsiTheme="minorHAnsi" w:cstheme="minorBidi"/>
           <w:noProof/>
@@ -574,7 +574,7 @@
         <w:rPr>
           <w:noProof/>
         </w:rPr>
-        <w:instrText xml:space="preserve"> PAGEREF _Toc242180696 \h </w:instrText>
+        <w:instrText xml:space="preserve"> PAGEREF _Toc242186688 \h </w:instrText>
       </w:r>
       <w:r>
         <w:rPr>
@@ -606,7 +606,7 @@
         <w:tabs>
           <w:tab w:val="right" w:leader="dot" w:pos="9062"/>
         </w:tabs>
-        <w:divId w:val="1437558704"/>
+        <w:divId w:val="1925382745"/>
         <w:rPr>
           <w:rFonts w:asciiTheme="minorHAnsi" w:hAnsiTheme="minorHAnsi" w:cstheme="minorBidi"/>
           <w:noProof/>
@@ -639,7 +639,7 @@
         <w:rPr>
           <w:noProof/>
         </w:rPr>
-        <w:instrText xml:space="preserve"> PAGEREF _Toc242180697 \h </w:instrText>
+        <w:instrText xml:space="preserve"> PAGEREF _Toc242186689 \h </w:instrText>
       </w:r>
       <w:r>
         <w:rPr>
@@ -671,7 +671,7 @@
         <w:tabs>
           <w:tab w:val="right" w:leader="dot" w:pos="9062"/>
         </w:tabs>
-        <w:divId w:val="1437558704"/>
+        <w:divId w:val="1925382745"/>
         <w:rPr>
           <w:rFonts w:asciiTheme="minorHAnsi" w:hAnsiTheme="minorHAnsi" w:cstheme="minorBidi"/>
           <w:noProof/>
@@ -704,7 +704,7 @@
         <w:rPr>
           <w:noProof/>
         </w:rPr>
-        <w:instrText xml:space="preserve"> PAGEREF _Toc242180698 \h </w:instrText>
+        <w:instrText xml:space="preserve"> PAGEREF _Toc242186690 \h </w:instrText>
       </w:r>
       <w:r>
         <w:rPr>
@@ -736,7 +736,7 @@
         <w:tabs>
           <w:tab w:val="right" w:leader="dot" w:pos="9062"/>
         </w:tabs>
-        <w:divId w:val="1437558704"/>
+        <w:divId w:val="1925382745"/>
         <w:rPr>
           <w:rFonts w:asciiTheme="minorHAnsi" w:hAnsiTheme="minorHAnsi" w:cstheme="minorBidi"/>
           <w:noProof/>
@@ -769,7 +769,7 @@
         <w:rPr>
           <w:noProof/>
         </w:rPr>
-        <w:instrText xml:space="preserve"> PAGEREF _Toc242180699 \h </w:instrText>
+        <w:instrText xml:space="preserve"> PAGEREF _Toc242186691 \h </w:instrText>
       </w:r>
       <w:r>
         <w:rPr>
@@ -801,7 +801,7 @@
         <w:tabs>
           <w:tab w:val="right" w:leader="dot" w:pos="9062"/>
         </w:tabs>
-        <w:divId w:val="1437558704"/>
+        <w:divId w:val="1925382745"/>
         <w:rPr>
           <w:rFonts w:asciiTheme="minorHAnsi" w:hAnsiTheme="minorHAnsi" w:cstheme="minorBidi"/>
           <w:noProof/>
@@ -834,7 +834,7 @@
         <w:rPr>
           <w:noProof/>
         </w:rPr>
-        <w:instrText xml:space="preserve"> PAGEREF _Toc242180700 \h </w:instrText>
+        <w:instrText xml:space="preserve"> PAGEREF _Toc242186692 \h </w:instrText>
       </w:r>
       <w:r>
         <w:rPr>
@@ -866,7 +866,7 @@
         <w:tabs>
           <w:tab w:val="right" w:leader="dot" w:pos="9062"/>
         </w:tabs>
-        <w:divId w:val="1437558704"/>
+        <w:divId w:val="1925382745"/>
         <w:rPr>
           <w:rFonts w:asciiTheme="minorHAnsi" w:hAnsiTheme="minorHAnsi" w:cstheme="minorBidi"/>
           <w:noProof/>
@@ -899,7 +899,7 @@
         <w:rPr>
           <w:noProof/>
         </w:rPr>
-        <w:instrText xml:space="preserve"> PAGEREF _Toc242180701 \h </w:instrText>
+        <w:instrText xml:space="preserve"> PAGEREF _Toc242186693 \h </w:instrText>
       </w:r>
       <w:r>
         <w:rPr>
@@ -928,7 +928,7 @@
     <w:p>
       <w:pPr>
         <w:pStyle w:val="marker"/>
-        <w:divId w:val="1437558704"/>
+        <w:divId w:val="1925382745"/>
         <w:rPr>
           <w:lang w:val="nl-NL"/>
         </w:rPr>
@@ -944,7 +944,7 @@
       <w:pPr>
         <w:pStyle w:val="marker"/>
         <w:ind w:left="800" w:right="800"/>
-        <w:divId w:val="1951474978"/>
+        <w:divId w:val="735709604"/>
         <w:rPr>
           <w:lang w:val="nl-NL"/>
         </w:rPr>
@@ -956,13 +956,13 @@
     <w:p>
       <w:pPr>
         <w:pStyle w:val="Kop2"/>
-        <w:divId w:val="1951474978"/>
+        <w:divId w:val="735709604"/>
         <w:rPr>
           <w:rFonts w:eastAsia="Times New Roman"/>
           <w:lang w:val="nl-NL"/>
         </w:rPr>
       </w:pPr>
-      <w:bookmarkStart w:id="1" w:name="_Toc242180691"/>
+      <w:bookmarkStart w:id="1" w:name="_Toc242186683"/>
       <w:r>
         <w:rPr>
           <w:rFonts w:eastAsia="Times New Roman"/>
@@ -975,7 +975,7 @@
     <w:p>
       <w:pPr>
         <w:pStyle w:val="Normaalweb"/>
-        <w:divId w:val="1951474978"/>
+        <w:divId w:val="735709604"/>
         <w:rPr>
           <w:lang w:val="nl-NL"/>
         </w:rPr>
@@ -990,7 +990,7 @@
     <w:p>
       <w:pPr>
         <w:pStyle w:val="Normaalweb"/>
-        <w:divId w:val="1951474978"/>
+        <w:divId w:val="735709604"/>
         <w:rPr>
           <w:lang w:val="nl-NL"/>
         </w:rPr>
@@ -1018,7 +1018,7 @@
     <w:p>
       <w:pPr>
         <w:pStyle w:val="Normaalweb"/>
-        <w:divId w:val="1951474978"/>
+        <w:divId w:val="735709604"/>
         <w:rPr>
           <w:lang w:val="nl-NL"/>
         </w:rPr>
@@ -1039,7 +1039,7 @@
     <w:p>
       <w:pPr>
         <w:pStyle w:val="Normaalweb"/>
-        <w:divId w:val="1951474978"/>
+        <w:divId w:val="735709604"/>
         <w:rPr>
           <w:lang w:val="nl-NL"/>
         </w:rPr>
@@ -1086,7 +1086,7 @@
     <w:p>
       <w:pPr>
         <w:pStyle w:val="Normaalweb"/>
-        <w:divId w:val="1951474978"/>
+        <w:divId w:val="735709604"/>
         <w:rPr>
           <w:lang w:val="nl-NL"/>
         </w:rPr>
@@ -1114,7 +1114,7 @@
     <w:p>
       <w:pPr>
         <w:pStyle w:val="Normaalweb"/>
-        <w:divId w:val="1951474978"/>
+        <w:divId w:val="735709604"/>
         <w:rPr>
           <w:lang w:val="nl-NL"/>
         </w:rPr>
@@ -1148,7 +1148,7 @@
     <w:p>
       <w:pPr>
         <w:pStyle w:val="Normaalweb"/>
-        <w:divId w:val="1951474978"/>
+        <w:divId w:val="735709604"/>
         <w:rPr>
           <w:lang w:val="nl-NL"/>
         </w:rPr>
@@ -1175,7 +1175,7 @@
     <w:p>
       <w:pPr>
         <w:pStyle w:val="Normaalweb"/>
-        <w:divId w:val="1951474978"/>
+        <w:divId w:val="735709604"/>
         <w:rPr>
           <w:lang w:val="nl-NL"/>
         </w:rPr>
@@ -1203,7 +1203,7 @@
     <w:p>
       <w:pPr>
         <w:pStyle w:val="Normaalweb"/>
-        <w:divId w:val="1951474978"/>
+        <w:divId w:val="735709604"/>
         <w:rPr>
           <w:lang w:val="nl-NL"/>
         </w:rPr>
@@ -1218,7 +1218,7 @@
     <w:p>
       <w:pPr>
         <w:pStyle w:val="Normaalweb"/>
-        <w:divId w:val="1951474978"/>
+        <w:divId w:val="735709604"/>
         <w:rPr>
           <w:lang w:val="nl-NL"/>
         </w:rPr>
@@ -1278,7 +1278,7 @@
     <w:p>
       <w:pPr>
         <w:pStyle w:val="Normaalweb"/>
-        <w:divId w:val="1951474978"/>
+        <w:divId w:val="735709604"/>
         <w:rPr>
           <w:lang w:val="nl-NL"/>
         </w:rPr>
@@ -1293,7 +1293,7 @@
     <w:p>
       <w:pPr>
         <w:pStyle w:val="Normaalweb"/>
-        <w:divId w:val="1951474978"/>
+        <w:divId w:val="735709604"/>
         <w:rPr>
           <w:lang w:val="nl-NL"/>
         </w:rPr>
@@ -1321,7 +1321,7 @@
     <w:p>
       <w:pPr>
         <w:pStyle w:val="Normaalweb"/>
-        <w:divId w:val="1951474978"/>
+        <w:divId w:val="735709604"/>
         <w:rPr>
           <w:lang w:val="nl-NL"/>
         </w:rPr>
@@ -1336,7 +1336,7 @@
     <w:p>
       <w:pPr>
         <w:pStyle w:val="Normaalweb"/>
-        <w:divId w:val="1951474978"/>
+        <w:divId w:val="735709604"/>
         <w:rPr>
           <w:lang w:val="nl-NL"/>
         </w:rPr>
@@ -1351,7 +1351,7 @@
     <w:p>
       <w:pPr>
         <w:pStyle w:val="Normaalweb"/>
-        <w:divId w:val="1951474978"/>
+        <w:divId w:val="735709604"/>
         <w:rPr>
           <w:lang w:val="nl-NL"/>
         </w:rPr>
@@ -1366,7 +1366,7 @@
     <w:p>
       <w:pPr>
         <w:spacing w:before="300" w:after="200"/>
-        <w:divId w:val="1951474978"/>
+        <w:divId w:val="735709604"/>
         <w:rPr>
           <w:rFonts w:eastAsia="Times New Roman"/>
           <w:lang w:val="nl-NL"/>
@@ -1377,14 +1377,14 @@
           <w:rFonts w:eastAsia="Times New Roman"/>
           <w:lang w:val="nl-NL"/>
         </w:rPr>
-        <w:pict w14:anchorId="69B036C0">
+        <w:pict w14:anchorId="2C1EF01F">
           <v:rect id="_x0000_i1025" style="width:0;height:1.5pt" o:hralign="center" o:hrstd="t" o:hr="t" fillcolor="#a0a0a0" stroked="f"/>
         </w:pict>
       </w:r>
     </w:p>
     <w:p>
       <w:pPr>
-        <w:divId w:val="1886328103"/>
+        <w:divId w:val="192957588"/>
         <w:rPr>
           <w:color w:val="555555"/>
           <w:sz w:val="20"/>
@@ -1423,7 +1423,7 @@
     </w:p>
     <w:p>
       <w:pPr>
-        <w:divId w:val="1886328103"/>
+        <w:divId w:val="192957588"/>
         <w:rPr>
           <w:color w:val="555555"/>
           <w:sz w:val="20"/>
@@ -1463,7 +1463,7 @@
     </w:p>
     <w:p>
       <w:pPr>
-        <w:divId w:val="1886328103"/>
+        <w:divId w:val="192957588"/>
         <w:rPr>
           <w:color w:val="555555"/>
           <w:sz w:val="20"/>
@@ -1493,7 +1493,7 @@
     </w:p>
     <w:p>
       <w:pPr>
-        <w:divId w:val="1886328103"/>
+        <w:divId w:val="192957588"/>
         <w:rPr>
           <w:color w:val="555555"/>
           <w:sz w:val="20"/>
@@ -1525,7 +1525,7 @@
       <w:pPr>
         <w:pStyle w:val="marker"/>
         <w:ind w:left="800" w:right="800"/>
-        <w:divId w:val="1951474978"/>
+        <w:divId w:val="735709604"/>
         <w:rPr>
           <w:lang w:val="nl-NL"/>
         </w:rPr>
@@ -1537,13 +1537,13 @@
     <w:p>
       <w:pPr>
         <w:pStyle w:val="Kop2"/>
-        <w:divId w:val="1951474978"/>
+        <w:divId w:val="735709604"/>
         <w:rPr>
           <w:rFonts w:eastAsia="Times New Roman"/>
           <w:lang w:val="nl-NL"/>
         </w:rPr>
       </w:pPr>
-      <w:bookmarkStart w:id="2" w:name="_Toc242180692"/>
+      <w:bookmarkStart w:id="2" w:name="_Toc242186684"/>
       <w:r>
         <w:rPr>
           <w:rFonts w:eastAsia="Times New Roman"/>
@@ -1556,7 +1556,7 @@
     <w:p>
       <w:pPr>
         <w:pStyle w:val="Normaalweb"/>
-        <w:divId w:val="1951474978"/>
+        <w:divId w:val="735709604"/>
         <w:rPr>
           <w:lang w:val="nl-NL"/>
         </w:rPr>
@@ -1571,7 +1571,7 @@
     <w:p>
       <w:pPr>
         <w:pStyle w:val="Normaalweb"/>
-        <w:divId w:val="1951474978"/>
+        <w:divId w:val="735709604"/>
         <w:rPr>
           <w:lang w:val="nl-NL"/>
         </w:rPr>
@@ -1586,7 +1586,7 @@
     <w:p>
       <w:pPr>
         <w:pStyle w:val="Normaalweb"/>
-        <w:divId w:val="1951474978"/>
+        <w:divId w:val="735709604"/>
         <w:rPr>
           <w:lang w:val="nl-NL"/>
         </w:rPr>
@@ -1601,13 +1601,13 @@
     <w:p>
       <w:pPr>
         <w:pStyle w:val="Kop2"/>
-        <w:divId w:val="1951474978"/>
+        <w:divId w:val="735709604"/>
         <w:rPr>
           <w:rFonts w:eastAsia="Times New Roman"/>
           <w:lang w:val="nl-NL"/>
         </w:rPr>
       </w:pPr>
-      <w:bookmarkStart w:id="3" w:name="_Toc242180693"/>
+      <w:bookmarkStart w:id="3" w:name="_Toc242186685"/>
       <w:r>
         <w:rPr>
           <w:rFonts w:eastAsia="Times New Roman"/>
@@ -1620,7 +1620,7 @@
     <w:p>
       <w:pPr>
         <w:pStyle w:val="Normaalweb"/>
-        <w:divId w:val="1951474978"/>
+        <w:divId w:val="735709604"/>
         <w:rPr>
           <w:lang w:val="nl-NL"/>
         </w:rPr>
@@ -1635,13 +1635,13 @@
     <w:p>
       <w:pPr>
         <w:pStyle w:val="Kop2"/>
-        <w:divId w:val="1951474978"/>
+        <w:divId w:val="735709604"/>
         <w:rPr>
           <w:rFonts w:eastAsia="Times New Roman"/>
           <w:lang w:val="nl-NL"/>
         </w:rPr>
       </w:pPr>
-      <w:bookmarkStart w:id="4" w:name="_Toc242180694"/>
+      <w:bookmarkStart w:id="4" w:name="_Toc242186686"/>
       <w:r>
         <w:rPr>
           <w:rFonts w:eastAsia="Times New Roman"/>
@@ -1654,7 +1654,7 @@
     <w:p>
       <w:pPr>
         <w:pStyle w:val="Normaalweb"/>
-        <w:divId w:val="1951474978"/>
+        <w:divId w:val="735709604"/>
         <w:rPr>
           <w:lang w:val="nl-NL"/>
         </w:rPr>
@@ -1669,13 +1669,13 @@
     <w:p>
       <w:pPr>
         <w:pStyle w:val="Kop3"/>
-        <w:divId w:val="1951474978"/>
+        <w:divId w:val="735709604"/>
         <w:rPr>
           <w:rFonts w:eastAsia="Times New Roman"/>
           <w:lang w:val="nl-NL"/>
         </w:rPr>
       </w:pPr>
-      <w:bookmarkStart w:id="5" w:name="_Toc242180695"/>
+      <w:bookmarkStart w:id="5" w:name="_Toc242186687"/>
       <w:r>
         <w:rPr>
           <w:rFonts w:eastAsia="Times New Roman"/>
@@ -1688,7 +1688,7 @@
     <w:p>
       <w:pPr>
         <w:pStyle w:val="Normaalweb"/>
-        <w:divId w:val="1951474978"/>
+        <w:divId w:val="735709604"/>
         <w:rPr>
           <w:lang w:val="nl-NL"/>
         </w:rPr>
@@ -1703,13 +1703,13 @@
     <w:p>
       <w:pPr>
         <w:pStyle w:val="Kop3"/>
-        <w:divId w:val="1951474978"/>
+        <w:divId w:val="735709604"/>
         <w:rPr>
           <w:rFonts w:eastAsia="Times New Roman"/>
           <w:lang w:val="nl-NL"/>
         </w:rPr>
       </w:pPr>
-      <w:bookmarkStart w:id="6" w:name="_Toc242180696"/>
+      <w:bookmarkStart w:id="6" w:name="_Toc242186688"/>
       <w:r>
         <w:rPr>
           <w:rFonts w:eastAsia="Times New Roman"/>
@@ -1722,7 +1722,7 @@
     <w:p>
       <w:pPr>
         <w:pStyle w:val="Normaalweb"/>
-        <w:divId w:val="1951474978"/>
+        <w:divId w:val="735709604"/>
         <w:rPr>
           <w:lang w:val="nl-NL"/>
         </w:rPr>
@@ -1737,13 +1737,13 @@
     <w:p>
       <w:pPr>
         <w:pStyle w:val="Kop3"/>
-        <w:divId w:val="1951474978"/>
+        <w:divId w:val="735709604"/>
         <w:rPr>
           <w:rFonts w:eastAsia="Times New Roman"/>
           <w:lang w:val="nl-NL"/>
         </w:rPr>
       </w:pPr>
-      <w:bookmarkStart w:id="7" w:name="_Toc242180697"/>
+      <w:bookmarkStart w:id="7" w:name="_Toc242186689"/>
       <w:r>
         <w:rPr>
           <w:rFonts w:eastAsia="Times New Roman"/>
@@ -1756,7 +1756,7 @@
     <w:p>
       <w:pPr>
         <w:pStyle w:val="Normaalweb"/>
-        <w:divId w:val="1951474978"/>
+        <w:divId w:val="735709604"/>
         <w:rPr>
           <w:lang w:val="nl-NL"/>
         </w:rPr>
@@ -1771,13 +1771,13 @@
     <w:p>
       <w:pPr>
         <w:pStyle w:val="Kop3"/>
-        <w:divId w:val="1951474978"/>
+        <w:divId w:val="735709604"/>
         <w:rPr>
           <w:rFonts w:eastAsia="Times New Roman"/>
           <w:lang w:val="nl-NL"/>
         </w:rPr>
       </w:pPr>
-      <w:bookmarkStart w:id="8" w:name="_Toc242180698"/>
+      <w:bookmarkStart w:id="8" w:name="_Toc242186690"/>
       <w:r>
         <w:rPr>
           <w:rFonts w:eastAsia="Times New Roman"/>
@@ -1790,7 +1790,7 @@
     <w:p>
       <w:pPr>
         <w:pStyle w:val="Normaalweb"/>
-        <w:divId w:val="1951474978"/>
+        <w:divId w:val="735709604"/>
         <w:rPr>
           <w:lang w:val="nl-NL"/>
         </w:rPr>
@@ -1806,13 +1806,13 @@
     <w:p>
       <w:pPr>
         <w:pStyle w:val="Kop2"/>
-        <w:divId w:val="1951474978"/>
+        <w:divId w:val="735709604"/>
         <w:rPr>
           <w:rFonts w:eastAsia="Times New Roman"/>
           <w:lang w:val="nl-NL"/>
         </w:rPr>
       </w:pPr>
-      <w:bookmarkStart w:id="9" w:name="_Toc242180699"/>
+      <w:bookmarkStart w:id="9" w:name="_Toc242186691"/>
       <w:r>
         <w:rPr>
           <w:rFonts w:eastAsia="Times New Roman"/>
@@ -1825,7 +1825,7 @@
     <w:p>
       <w:pPr>
         <w:pStyle w:val="Normaalweb"/>
-        <w:divId w:val="1951474978"/>
+        <w:divId w:val="735709604"/>
         <w:rPr>
           <w:lang w:val="nl-NL"/>
         </w:rPr>
@@ -1840,7 +1840,7 @@
     <w:p>
       <w:pPr>
         <w:pStyle w:val="Normaalweb"/>
-        <w:divId w:val="1951474978"/>
+        <w:divId w:val="735709604"/>
         <w:rPr>
           <w:lang w:val="nl-NL"/>
         </w:rPr>
@@ -1855,7 +1855,7 @@
     <w:p>
       <w:pPr>
         <w:pStyle w:val="Normaalweb"/>
-        <w:divId w:val="1951474978"/>
+        <w:divId w:val="735709604"/>
         <w:rPr>
           <w:lang w:val="nl-NL"/>
         </w:rPr>
@@ -1870,13 +1870,13 @@
     <w:p>
       <w:pPr>
         <w:pStyle w:val="Kop2"/>
-        <w:divId w:val="1951474978"/>
+        <w:divId w:val="735709604"/>
         <w:rPr>
           <w:rFonts w:eastAsia="Times New Roman"/>
           <w:lang w:val="nl-NL"/>
         </w:rPr>
       </w:pPr>
-      <w:bookmarkStart w:id="10" w:name="_Toc242180700"/>
+      <w:bookmarkStart w:id="10" w:name="_Toc242186692"/>
       <w:r>
         <w:rPr>
           <w:rFonts w:eastAsia="Times New Roman"/>
@@ -1889,7 +1889,7 @@
     <w:p>
       <w:pPr>
         <w:pStyle w:val="Normaalweb"/>
-        <w:divId w:val="1951474978"/>
+        <w:divId w:val="735709604"/>
         <w:rPr>
           <w:lang w:val="nl-NL"/>
         </w:rPr>
@@ -1904,7 +1904,7 @@
     <w:p>
       <w:pPr>
         <w:pStyle w:val="Normaalweb"/>
-        <w:divId w:val="1951474978"/>
+        <w:divId w:val="735709604"/>
         <w:rPr>
           <w:lang w:val="nl-NL"/>
         </w:rPr>
@@ -1919,13 +1919,13 @@
     <w:p>
       <w:pPr>
         <w:pStyle w:val="Kop2"/>
-        <w:divId w:val="1951474978"/>
+        <w:divId w:val="735709604"/>
         <w:rPr>
           <w:rFonts w:eastAsia="Times New Roman"/>
           <w:lang w:val="nl-NL"/>
         </w:rPr>
       </w:pPr>
-      <w:bookmarkStart w:id="11" w:name="_Toc242180701"/>
+      <w:bookmarkStart w:id="11" w:name="_Toc242186693"/>
       <w:r>
         <w:rPr>
           <w:rFonts w:eastAsia="Times New Roman"/>
@@ -1938,7 +1938,7 @@
     <w:p>
       <w:pPr>
         <w:pStyle w:val="Normaalweb"/>
-        <w:divId w:val="1951474978"/>
+        <w:divId w:val="735709604"/>
         <w:rPr>
           <w:lang w:val="nl-NL"/>
         </w:rPr>
@@ -1953,7 +1953,7 @@
     <w:p>
       <w:pPr>
         <w:pStyle w:val="Normaalweb"/>
-        <w:divId w:val="1951474978"/>
+        <w:divId w:val="735709604"/>
         <w:rPr>
           <w:lang w:val="nl-NL"/>
         </w:rPr>
@@ -1968,7 +1968,7 @@
     <w:p>
       <w:pPr>
         <w:shd w:val="clear" w:color="auto" w:fill="FFFFFF"/>
-        <w:divId w:val="2092004543"/>
+        <w:divId w:val="1694912916"/>
         <w:rPr>
           <w:szCs w:val="22"/>
           <w:lang w:val="nl-NL"/>
@@ -2236,7 +2236,7 @@
         <w:sz w:val="18"/>
       </w:rPr>
       <w:tab/>
-      <w:t>Laatst gewijzigd: 6 oktober 2026, 11:20</w:t>
+      <w:t>Laatst gewijzigd: 6 oktober 2026, 13:42</w:t>
     </w:r>
   </w:p>
 </w:hdr>
@@ -3536,7 +3536,7 @@
     <w:link w:val="KoptekstChar"/>
     <w:uiPriority w:val="99"/>
     <w:unhideWhenUsed/>
-    <w:rsid w:val="001B6BD8"/>
+    <w:rsid w:val="00D74AD2"/>
     <w:pPr>
       <w:tabs>
         <w:tab w:val="center" w:pos="4536"/>
@@ -3549,7 +3549,7 @@
     <w:basedOn w:val="Standaardalinea-lettertype"/>
     <w:link w:val="Koptekst"/>
     <w:uiPriority w:val="99"/>
-    <w:rsid w:val="001B6BD8"/>
+    <w:rsid w:val="00D74AD2"/>
     <w:rPr>
       <w:rFonts w:eastAsiaTheme="minorEastAsia"/>
       <w:sz w:val="24"/>
@@ -3562,7 +3562,7 @@
     <w:link w:val="VoettekstChar"/>
     <w:uiPriority w:val="99"/>
     <w:unhideWhenUsed/>
-    <w:rsid w:val="001B6BD8"/>
+    <w:rsid w:val="00D74AD2"/>
     <w:pPr>
       <w:tabs>
         <w:tab w:val="center" w:pos="4536"/>
@@ -3575,7 +3575,7 @@
     <w:basedOn w:val="Standaardalinea-lettertype"/>
     <w:link w:val="Voettekst"/>
     <w:uiPriority w:val="99"/>
-    <w:rsid w:val="001B6BD8"/>
+    <w:rsid w:val="00D74AD2"/>
     <w:rPr>
       <w:rFonts w:eastAsiaTheme="minorEastAsia"/>
       <w:sz w:val="24"/>
@@ -3589,7 +3589,7 @@
     <w:autoRedefine/>
     <w:uiPriority w:val="39"/>
     <w:unhideWhenUsed/>
-    <w:rsid w:val="001B6BD8"/>
+    <w:rsid w:val="00D74AD2"/>
     <w:pPr>
       <w:spacing w:after="100"/>
       <w:ind w:left="220"/>
@@ -3602,7 +3602,7 @@
     <w:autoRedefine/>
     <w:uiPriority w:val="39"/>
     <w:unhideWhenUsed/>
-    <w:rsid w:val="001B6BD8"/>
+    <w:rsid w:val="00D74AD2"/>
     <w:pPr>
       <w:spacing w:after="100"/>
       <w:ind w:left="440"/>

</xml_diff>

<commit_message>
Update Systeem-Audit NL 06-10-2026 13:54
</commit_message>
<xml_diff>
--- a/nl/docx/document-0.docx
+++ b/nl/docx/document-0.docx
@@ -7,7 +7,7 @@
         <w:spacing w:after="480"/>
         <w:jc w:val="center"/>
         <w:outlineLvl w:val="1"/>
-        <w:divId w:val="335110517"/>
+        <w:divId w:val="1920404133"/>
         <w:rPr>
           <w:rFonts w:ascii="Aptos Display" w:eastAsia="Times New Roman" w:hAnsi="Aptos Display"/>
           <w:b/>
@@ -36,7 +36,7 @@
     <w:p>
       <w:pPr>
         <w:pStyle w:val="ondertitel2"/>
-        <w:divId w:val="335110517"/>
+        <w:divId w:val="1920404133"/>
         <w:rPr>
           <w:lang w:val="nl-NL"/>
         </w:rPr>
@@ -51,7 +51,7 @@
     <w:p>
       <w:pPr>
         <w:pStyle w:val="documentaanduiding2"/>
-        <w:divId w:val="335110517"/>
+        <w:divId w:val="1920404133"/>
         <w:rPr>
           <w:lang w:val="nl-NL"/>
         </w:rPr>
@@ -66,7 +66,7 @@
     <w:p>
       <w:pPr>
         <w:pStyle w:val="auteur2"/>
-        <w:divId w:val="335110517"/>
+        <w:divId w:val="1920404133"/>
         <w:rPr>
           <w:lang w:val="nl-NL"/>
         </w:rPr>
@@ -81,23 +81,23 @@
     <w:p>
       <w:pPr>
         <w:pStyle w:val="meta-lijn2"/>
-        <w:divId w:val="335110517"/>
-        <w:rPr>
-          <w:lang w:val="nl-NL"/>
-        </w:rPr>
-      </w:pPr>
-      <w:r>
-        <w:rPr>
-          <w:lang w:val="nl-NL"/>
-        </w:rPr>
-        <w:t>Versie bijgewerkt: 6 oktober 2026, 13:42</w:t>
+        <w:divId w:val="1920404133"/>
+        <w:rPr>
+          <w:lang w:val="nl-NL"/>
+        </w:rPr>
+      </w:pPr>
+      <w:r>
+        <w:rPr>
+          <w:lang w:val="nl-NL"/>
+        </w:rPr>
+        <w:t>Versie bijgewerkt: 6 oktober 2026, 13:54</w:t>
       </w:r>
     </w:p>
     <w:p>
       <w:pPr>
         <w:pStyle w:val="marker"/>
         <w:ind w:left="800" w:right="800"/>
-        <w:divId w:val="735709604"/>
+        <w:divId w:val="1527910376"/>
         <w:rPr>
           <w:lang w:val="nl-NL"/>
         </w:rPr>
@@ -110,13 +110,13 @@
       <w:pPr>
         <w:pStyle w:val="Kop2"/>
         <w:pageBreakBefore/>
-        <w:divId w:val="1925382745"/>
+        <w:divId w:val="1476874937"/>
         <w:rPr>
           <w:rFonts w:eastAsia="Times New Roman"/>
           <w:lang w:val="nl-NL"/>
         </w:rPr>
       </w:pPr>
-      <w:bookmarkStart w:id="0" w:name="_Toc242186682"/>
+      <w:bookmarkStart w:id="0" w:name="_Toc242187390"/>
       <w:r>
         <w:rPr>
           <w:rFonts w:eastAsia="Times New Roman"/>
@@ -133,7 +133,7 @@
         <w:tabs>
           <w:tab w:val="right" w:leader="dot" w:pos="9062"/>
         </w:tabs>
-        <w:divId w:val="1925382745"/>
+        <w:divId w:val="1476874937"/>
         <w:rPr>
           <w:rFonts w:asciiTheme="minorHAnsi" w:hAnsiTheme="minorHAnsi" w:cstheme="minorBidi"/>
           <w:noProof/>
@@ -184,7 +184,7 @@
         <w:rPr>
           <w:noProof/>
         </w:rPr>
-        <w:instrText xml:space="preserve"> PAGEREF _Toc242186682 \h </w:instrText>
+        <w:instrText xml:space="preserve"> PAGEREF _Toc242187390 \h </w:instrText>
       </w:r>
       <w:r>
         <w:rPr>
@@ -216,7 +216,7 @@
         <w:tabs>
           <w:tab w:val="right" w:leader="dot" w:pos="9062"/>
         </w:tabs>
-        <w:divId w:val="1925382745"/>
+        <w:divId w:val="1476874937"/>
         <w:rPr>
           <w:rFonts w:asciiTheme="minorHAnsi" w:hAnsiTheme="minorHAnsi" w:cstheme="minorBidi"/>
           <w:noProof/>
@@ -249,7 +249,7 @@
         <w:rPr>
           <w:noProof/>
         </w:rPr>
-        <w:instrText xml:space="preserve"> PAGEREF _Toc242186683 \h </w:instrText>
+        <w:instrText xml:space="preserve"> PAGEREF _Toc242187391 \h </w:instrText>
       </w:r>
       <w:r>
         <w:rPr>
@@ -281,7 +281,7 @@
         <w:tabs>
           <w:tab w:val="right" w:leader="dot" w:pos="9062"/>
         </w:tabs>
-        <w:divId w:val="1925382745"/>
+        <w:divId w:val="1476874937"/>
         <w:rPr>
           <w:rFonts w:asciiTheme="minorHAnsi" w:hAnsiTheme="minorHAnsi" w:cstheme="minorBidi"/>
           <w:noProof/>
@@ -314,7 +314,7 @@
         <w:rPr>
           <w:noProof/>
         </w:rPr>
-        <w:instrText xml:space="preserve"> PAGEREF _Toc242186684 \h </w:instrText>
+        <w:instrText xml:space="preserve"> PAGEREF _Toc242187392 \h </w:instrText>
       </w:r>
       <w:r>
         <w:rPr>
@@ -346,7 +346,7 @@
         <w:tabs>
           <w:tab w:val="right" w:leader="dot" w:pos="9062"/>
         </w:tabs>
-        <w:divId w:val="1925382745"/>
+        <w:divId w:val="1476874937"/>
         <w:rPr>
           <w:rFonts w:asciiTheme="minorHAnsi" w:hAnsiTheme="minorHAnsi" w:cstheme="minorBidi"/>
           <w:noProof/>
@@ -379,7 +379,7 @@
         <w:rPr>
           <w:noProof/>
         </w:rPr>
-        <w:instrText xml:space="preserve"> PAGEREF _Toc242186685 \h </w:instrText>
+        <w:instrText xml:space="preserve"> PAGEREF _Toc242187393 \h </w:instrText>
       </w:r>
       <w:r>
         <w:rPr>
@@ -411,7 +411,7 @@
         <w:tabs>
           <w:tab w:val="right" w:leader="dot" w:pos="9062"/>
         </w:tabs>
-        <w:divId w:val="1925382745"/>
+        <w:divId w:val="1476874937"/>
         <w:rPr>
           <w:rFonts w:asciiTheme="minorHAnsi" w:hAnsiTheme="minorHAnsi" w:cstheme="minorBidi"/>
           <w:noProof/>
@@ -444,7 +444,7 @@
         <w:rPr>
           <w:noProof/>
         </w:rPr>
-        <w:instrText xml:space="preserve"> PAGEREF _Toc242186686 \h </w:instrText>
+        <w:instrText xml:space="preserve"> PAGEREF _Toc242187394 \h </w:instrText>
       </w:r>
       <w:r>
         <w:rPr>
@@ -476,7 +476,7 @@
         <w:tabs>
           <w:tab w:val="right" w:leader="dot" w:pos="9062"/>
         </w:tabs>
-        <w:divId w:val="1925382745"/>
+        <w:divId w:val="1476874937"/>
         <w:rPr>
           <w:rFonts w:asciiTheme="minorHAnsi" w:hAnsiTheme="minorHAnsi" w:cstheme="minorBidi"/>
           <w:noProof/>
@@ -509,7 +509,7 @@
         <w:rPr>
           <w:noProof/>
         </w:rPr>
-        <w:instrText xml:space="preserve"> PAGEREF _Toc242186687 \h </w:instrText>
+        <w:instrText xml:space="preserve"> PAGEREF _Toc242187395 \h </w:instrText>
       </w:r>
       <w:r>
         <w:rPr>
@@ -541,7 +541,7 @@
         <w:tabs>
           <w:tab w:val="right" w:leader="dot" w:pos="9062"/>
         </w:tabs>
-        <w:divId w:val="1925382745"/>
+        <w:divId w:val="1476874937"/>
         <w:rPr>
           <w:rFonts w:asciiTheme="minorHAnsi" w:hAnsiTheme="minorHAnsi" w:cstheme="minorBidi"/>
           <w:noProof/>
@@ -574,7 +574,7 @@
         <w:rPr>
           <w:noProof/>
         </w:rPr>
-        <w:instrText xml:space="preserve"> PAGEREF _Toc242186688 \h </w:instrText>
+        <w:instrText xml:space="preserve"> PAGEREF _Toc242187396 \h </w:instrText>
       </w:r>
       <w:r>
         <w:rPr>
@@ -606,7 +606,7 @@
         <w:tabs>
           <w:tab w:val="right" w:leader="dot" w:pos="9062"/>
         </w:tabs>
-        <w:divId w:val="1925382745"/>
+        <w:divId w:val="1476874937"/>
         <w:rPr>
           <w:rFonts w:asciiTheme="minorHAnsi" w:hAnsiTheme="minorHAnsi" w:cstheme="minorBidi"/>
           <w:noProof/>
@@ -639,7 +639,7 @@
         <w:rPr>
           <w:noProof/>
         </w:rPr>
-        <w:instrText xml:space="preserve"> PAGEREF _Toc242186689 \h </w:instrText>
+        <w:instrText xml:space="preserve"> PAGEREF _Toc242187397 \h </w:instrText>
       </w:r>
       <w:r>
         <w:rPr>
@@ -671,7 +671,7 @@
         <w:tabs>
           <w:tab w:val="right" w:leader="dot" w:pos="9062"/>
         </w:tabs>
-        <w:divId w:val="1925382745"/>
+        <w:divId w:val="1476874937"/>
         <w:rPr>
           <w:rFonts w:asciiTheme="minorHAnsi" w:hAnsiTheme="minorHAnsi" w:cstheme="minorBidi"/>
           <w:noProof/>
@@ -704,7 +704,7 @@
         <w:rPr>
           <w:noProof/>
         </w:rPr>
-        <w:instrText xml:space="preserve"> PAGEREF _Toc242186690 \h </w:instrText>
+        <w:instrText xml:space="preserve"> PAGEREF _Toc242187398 \h </w:instrText>
       </w:r>
       <w:r>
         <w:rPr>
@@ -736,7 +736,7 @@
         <w:tabs>
           <w:tab w:val="right" w:leader="dot" w:pos="9062"/>
         </w:tabs>
-        <w:divId w:val="1925382745"/>
+        <w:divId w:val="1476874937"/>
         <w:rPr>
           <w:rFonts w:asciiTheme="minorHAnsi" w:hAnsiTheme="minorHAnsi" w:cstheme="minorBidi"/>
           <w:noProof/>
@@ -769,7 +769,7 @@
         <w:rPr>
           <w:noProof/>
         </w:rPr>
-        <w:instrText xml:space="preserve"> PAGEREF _Toc242186691 \h </w:instrText>
+        <w:instrText xml:space="preserve"> PAGEREF _Toc242187399 \h </w:instrText>
       </w:r>
       <w:r>
         <w:rPr>
@@ -801,7 +801,7 @@
         <w:tabs>
           <w:tab w:val="right" w:leader="dot" w:pos="9062"/>
         </w:tabs>
-        <w:divId w:val="1925382745"/>
+        <w:divId w:val="1476874937"/>
         <w:rPr>
           <w:rFonts w:asciiTheme="minorHAnsi" w:hAnsiTheme="minorHAnsi" w:cstheme="minorBidi"/>
           <w:noProof/>
@@ -834,7 +834,7 @@
         <w:rPr>
           <w:noProof/>
         </w:rPr>
-        <w:instrText xml:space="preserve"> PAGEREF _Toc242186692 \h </w:instrText>
+        <w:instrText xml:space="preserve"> PAGEREF _Toc242187400 \h </w:instrText>
       </w:r>
       <w:r>
         <w:rPr>
@@ -866,7 +866,7 @@
         <w:tabs>
           <w:tab w:val="right" w:leader="dot" w:pos="9062"/>
         </w:tabs>
-        <w:divId w:val="1925382745"/>
+        <w:divId w:val="1476874937"/>
         <w:rPr>
           <w:rFonts w:asciiTheme="minorHAnsi" w:hAnsiTheme="minorHAnsi" w:cstheme="minorBidi"/>
           <w:noProof/>
@@ -899,7 +899,7 @@
         <w:rPr>
           <w:noProof/>
         </w:rPr>
-        <w:instrText xml:space="preserve"> PAGEREF _Toc242186693 \h </w:instrText>
+        <w:instrText xml:space="preserve"> PAGEREF _Toc242187401 \h </w:instrText>
       </w:r>
       <w:r>
         <w:rPr>
@@ -928,7 +928,7 @@
     <w:p>
       <w:pPr>
         <w:pStyle w:val="marker"/>
-        <w:divId w:val="1925382745"/>
+        <w:divId w:val="1476874937"/>
         <w:rPr>
           <w:lang w:val="nl-NL"/>
         </w:rPr>
@@ -944,7 +944,7 @@
       <w:pPr>
         <w:pStyle w:val="marker"/>
         <w:ind w:left="800" w:right="800"/>
-        <w:divId w:val="735709604"/>
+        <w:divId w:val="1527910376"/>
         <w:rPr>
           <w:lang w:val="nl-NL"/>
         </w:rPr>
@@ -956,13 +956,13 @@
     <w:p>
       <w:pPr>
         <w:pStyle w:val="Kop2"/>
-        <w:divId w:val="735709604"/>
+        <w:divId w:val="1527910376"/>
         <w:rPr>
           <w:rFonts w:eastAsia="Times New Roman"/>
           <w:lang w:val="nl-NL"/>
         </w:rPr>
       </w:pPr>
-      <w:bookmarkStart w:id="1" w:name="_Toc242186683"/>
+      <w:bookmarkStart w:id="1" w:name="_Toc242187391"/>
       <w:r>
         <w:rPr>
           <w:rFonts w:eastAsia="Times New Roman"/>
@@ -975,7 +975,7 @@
     <w:p>
       <w:pPr>
         <w:pStyle w:val="Normaalweb"/>
-        <w:divId w:val="735709604"/>
+        <w:divId w:val="1527910376"/>
         <w:rPr>
           <w:lang w:val="nl-NL"/>
         </w:rPr>
@@ -990,7 +990,7 @@
     <w:p>
       <w:pPr>
         <w:pStyle w:val="Normaalweb"/>
-        <w:divId w:val="735709604"/>
+        <w:divId w:val="1527910376"/>
         <w:rPr>
           <w:lang w:val="nl-NL"/>
         </w:rPr>
@@ -1018,7 +1018,7 @@
     <w:p>
       <w:pPr>
         <w:pStyle w:val="Normaalweb"/>
-        <w:divId w:val="735709604"/>
+        <w:divId w:val="1527910376"/>
         <w:rPr>
           <w:lang w:val="nl-NL"/>
         </w:rPr>
@@ -1039,7 +1039,7 @@
     <w:p>
       <w:pPr>
         <w:pStyle w:val="Normaalweb"/>
-        <w:divId w:val="735709604"/>
+        <w:divId w:val="1527910376"/>
         <w:rPr>
           <w:lang w:val="nl-NL"/>
         </w:rPr>
@@ -1086,7 +1086,7 @@
     <w:p>
       <w:pPr>
         <w:pStyle w:val="Normaalweb"/>
-        <w:divId w:val="735709604"/>
+        <w:divId w:val="1527910376"/>
         <w:rPr>
           <w:lang w:val="nl-NL"/>
         </w:rPr>
@@ -1114,7 +1114,7 @@
     <w:p>
       <w:pPr>
         <w:pStyle w:val="Normaalweb"/>
-        <w:divId w:val="735709604"/>
+        <w:divId w:val="1527910376"/>
         <w:rPr>
           <w:lang w:val="nl-NL"/>
         </w:rPr>
@@ -1148,7 +1148,7 @@
     <w:p>
       <w:pPr>
         <w:pStyle w:val="Normaalweb"/>
-        <w:divId w:val="735709604"/>
+        <w:divId w:val="1527910376"/>
         <w:rPr>
           <w:lang w:val="nl-NL"/>
         </w:rPr>
@@ -1175,7 +1175,7 @@
     <w:p>
       <w:pPr>
         <w:pStyle w:val="Normaalweb"/>
-        <w:divId w:val="735709604"/>
+        <w:divId w:val="1527910376"/>
         <w:rPr>
           <w:lang w:val="nl-NL"/>
         </w:rPr>
@@ -1203,7 +1203,7 @@
     <w:p>
       <w:pPr>
         <w:pStyle w:val="Normaalweb"/>
-        <w:divId w:val="735709604"/>
+        <w:divId w:val="1527910376"/>
         <w:rPr>
           <w:lang w:val="nl-NL"/>
         </w:rPr>
@@ -1218,7 +1218,7 @@
     <w:p>
       <w:pPr>
         <w:pStyle w:val="Normaalweb"/>
-        <w:divId w:val="735709604"/>
+        <w:divId w:val="1527910376"/>
         <w:rPr>
           <w:lang w:val="nl-NL"/>
         </w:rPr>
@@ -1278,7 +1278,7 @@
     <w:p>
       <w:pPr>
         <w:pStyle w:val="Normaalweb"/>
-        <w:divId w:val="735709604"/>
+        <w:divId w:val="1527910376"/>
         <w:rPr>
           <w:lang w:val="nl-NL"/>
         </w:rPr>
@@ -1293,7 +1293,7 @@
     <w:p>
       <w:pPr>
         <w:pStyle w:val="Normaalweb"/>
-        <w:divId w:val="735709604"/>
+        <w:divId w:val="1527910376"/>
         <w:rPr>
           <w:lang w:val="nl-NL"/>
         </w:rPr>
@@ -1321,7 +1321,7 @@
     <w:p>
       <w:pPr>
         <w:pStyle w:val="Normaalweb"/>
-        <w:divId w:val="735709604"/>
+        <w:divId w:val="1527910376"/>
         <w:rPr>
           <w:lang w:val="nl-NL"/>
         </w:rPr>
@@ -1336,7 +1336,7 @@
     <w:p>
       <w:pPr>
         <w:pStyle w:val="Normaalweb"/>
-        <w:divId w:val="735709604"/>
+        <w:divId w:val="1527910376"/>
         <w:rPr>
           <w:lang w:val="nl-NL"/>
         </w:rPr>
@@ -1351,7 +1351,7 @@
     <w:p>
       <w:pPr>
         <w:pStyle w:val="Normaalweb"/>
-        <w:divId w:val="735709604"/>
+        <w:divId w:val="1527910376"/>
         <w:rPr>
           <w:lang w:val="nl-NL"/>
         </w:rPr>
@@ -1366,7 +1366,7 @@
     <w:p>
       <w:pPr>
         <w:spacing w:before="300" w:after="200"/>
-        <w:divId w:val="735709604"/>
+        <w:divId w:val="1527910376"/>
         <w:rPr>
           <w:rFonts w:eastAsia="Times New Roman"/>
           <w:lang w:val="nl-NL"/>
@@ -1377,14 +1377,14 @@
           <w:rFonts w:eastAsia="Times New Roman"/>
           <w:lang w:val="nl-NL"/>
         </w:rPr>
-        <w:pict w14:anchorId="2C1EF01F">
+        <w:pict w14:anchorId="31E70B13">
           <v:rect id="_x0000_i1025" style="width:0;height:1.5pt" o:hralign="center" o:hrstd="t" o:hr="t" fillcolor="#a0a0a0" stroked="f"/>
         </w:pict>
       </w:r>
     </w:p>
     <w:p>
       <w:pPr>
-        <w:divId w:val="192957588"/>
+        <w:divId w:val="686105223"/>
         <w:rPr>
           <w:color w:val="555555"/>
           <w:sz w:val="20"/>
@@ -1423,7 +1423,7 @@
     </w:p>
     <w:p>
       <w:pPr>
-        <w:divId w:val="192957588"/>
+        <w:divId w:val="686105223"/>
         <w:rPr>
           <w:color w:val="555555"/>
           <w:sz w:val="20"/>
@@ -1463,7 +1463,7 @@
     </w:p>
     <w:p>
       <w:pPr>
-        <w:divId w:val="192957588"/>
+        <w:divId w:val="686105223"/>
         <w:rPr>
           <w:color w:val="555555"/>
           <w:sz w:val="20"/>
@@ -1493,7 +1493,7 @@
     </w:p>
     <w:p>
       <w:pPr>
-        <w:divId w:val="192957588"/>
+        <w:divId w:val="686105223"/>
         <w:rPr>
           <w:color w:val="555555"/>
           <w:sz w:val="20"/>
@@ -1525,7 +1525,7 @@
       <w:pPr>
         <w:pStyle w:val="marker"/>
         <w:ind w:left="800" w:right="800"/>
-        <w:divId w:val="735709604"/>
+        <w:divId w:val="1527910376"/>
         <w:rPr>
           <w:lang w:val="nl-NL"/>
         </w:rPr>
@@ -1537,13 +1537,13 @@
     <w:p>
       <w:pPr>
         <w:pStyle w:val="Kop2"/>
-        <w:divId w:val="735709604"/>
+        <w:divId w:val="1527910376"/>
         <w:rPr>
           <w:rFonts w:eastAsia="Times New Roman"/>
           <w:lang w:val="nl-NL"/>
         </w:rPr>
       </w:pPr>
-      <w:bookmarkStart w:id="2" w:name="_Toc242186684"/>
+      <w:bookmarkStart w:id="2" w:name="_Toc242187392"/>
       <w:r>
         <w:rPr>
           <w:rFonts w:eastAsia="Times New Roman"/>
@@ -1556,7 +1556,7 @@
     <w:p>
       <w:pPr>
         <w:pStyle w:val="Normaalweb"/>
-        <w:divId w:val="735709604"/>
+        <w:divId w:val="1527910376"/>
         <w:rPr>
           <w:lang w:val="nl-NL"/>
         </w:rPr>
@@ -1571,7 +1571,7 @@
     <w:p>
       <w:pPr>
         <w:pStyle w:val="Normaalweb"/>
-        <w:divId w:val="735709604"/>
+        <w:divId w:val="1527910376"/>
         <w:rPr>
           <w:lang w:val="nl-NL"/>
         </w:rPr>
@@ -1586,7 +1586,7 @@
     <w:p>
       <w:pPr>
         <w:pStyle w:val="Normaalweb"/>
-        <w:divId w:val="735709604"/>
+        <w:divId w:val="1527910376"/>
         <w:rPr>
           <w:lang w:val="nl-NL"/>
         </w:rPr>
@@ -1601,13 +1601,13 @@
     <w:p>
       <w:pPr>
         <w:pStyle w:val="Kop2"/>
-        <w:divId w:val="735709604"/>
+        <w:divId w:val="1527910376"/>
         <w:rPr>
           <w:rFonts w:eastAsia="Times New Roman"/>
           <w:lang w:val="nl-NL"/>
         </w:rPr>
       </w:pPr>
-      <w:bookmarkStart w:id="3" w:name="_Toc242186685"/>
+      <w:bookmarkStart w:id="3" w:name="_Toc242187393"/>
       <w:r>
         <w:rPr>
           <w:rFonts w:eastAsia="Times New Roman"/>
@@ -1620,7 +1620,7 @@
     <w:p>
       <w:pPr>
         <w:pStyle w:val="Normaalweb"/>
-        <w:divId w:val="735709604"/>
+        <w:divId w:val="1527910376"/>
         <w:rPr>
           <w:lang w:val="nl-NL"/>
         </w:rPr>
@@ -1635,13 +1635,13 @@
     <w:p>
       <w:pPr>
         <w:pStyle w:val="Kop2"/>
-        <w:divId w:val="735709604"/>
+        <w:divId w:val="1527910376"/>
         <w:rPr>
           <w:rFonts w:eastAsia="Times New Roman"/>
           <w:lang w:val="nl-NL"/>
         </w:rPr>
       </w:pPr>
-      <w:bookmarkStart w:id="4" w:name="_Toc242186686"/>
+      <w:bookmarkStart w:id="4" w:name="_Toc242187394"/>
       <w:r>
         <w:rPr>
           <w:rFonts w:eastAsia="Times New Roman"/>
@@ -1654,7 +1654,7 @@
     <w:p>
       <w:pPr>
         <w:pStyle w:val="Normaalweb"/>
-        <w:divId w:val="735709604"/>
+        <w:divId w:val="1527910376"/>
         <w:rPr>
           <w:lang w:val="nl-NL"/>
         </w:rPr>
@@ -1669,13 +1669,13 @@
     <w:p>
       <w:pPr>
         <w:pStyle w:val="Kop3"/>
-        <w:divId w:val="735709604"/>
+        <w:divId w:val="1527910376"/>
         <w:rPr>
           <w:rFonts w:eastAsia="Times New Roman"/>
           <w:lang w:val="nl-NL"/>
         </w:rPr>
       </w:pPr>
-      <w:bookmarkStart w:id="5" w:name="_Toc242186687"/>
+      <w:bookmarkStart w:id="5" w:name="_Toc242187395"/>
       <w:r>
         <w:rPr>
           <w:rFonts w:eastAsia="Times New Roman"/>
@@ -1688,7 +1688,7 @@
     <w:p>
       <w:pPr>
         <w:pStyle w:val="Normaalweb"/>
-        <w:divId w:val="735709604"/>
+        <w:divId w:val="1527910376"/>
         <w:rPr>
           <w:lang w:val="nl-NL"/>
         </w:rPr>
@@ -1703,13 +1703,13 @@
     <w:p>
       <w:pPr>
         <w:pStyle w:val="Kop3"/>
-        <w:divId w:val="735709604"/>
+        <w:divId w:val="1527910376"/>
         <w:rPr>
           <w:rFonts w:eastAsia="Times New Roman"/>
           <w:lang w:val="nl-NL"/>
         </w:rPr>
       </w:pPr>
-      <w:bookmarkStart w:id="6" w:name="_Toc242186688"/>
+      <w:bookmarkStart w:id="6" w:name="_Toc242187396"/>
       <w:r>
         <w:rPr>
           <w:rFonts w:eastAsia="Times New Roman"/>
@@ -1722,7 +1722,7 @@
     <w:p>
       <w:pPr>
         <w:pStyle w:val="Normaalweb"/>
-        <w:divId w:val="735709604"/>
+        <w:divId w:val="1527910376"/>
         <w:rPr>
           <w:lang w:val="nl-NL"/>
         </w:rPr>
@@ -1737,13 +1737,13 @@
     <w:p>
       <w:pPr>
         <w:pStyle w:val="Kop3"/>
-        <w:divId w:val="735709604"/>
+        <w:divId w:val="1527910376"/>
         <w:rPr>
           <w:rFonts w:eastAsia="Times New Roman"/>
           <w:lang w:val="nl-NL"/>
         </w:rPr>
       </w:pPr>
-      <w:bookmarkStart w:id="7" w:name="_Toc242186689"/>
+      <w:bookmarkStart w:id="7" w:name="_Toc242187397"/>
       <w:r>
         <w:rPr>
           <w:rFonts w:eastAsia="Times New Roman"/>
@@ -1756,7 +1756,7 @@
     <w:p>
       <w:pPr>
         <w:pStyle w:val="Normaalweb"/>
-        <w:divId w:val="735709604"/>
+        <w:divId w:val="1527910376"/>
         <w:rPr>
           <w:lang w:val="nl-NL"/>
         </w:rPr>
@@ -1771,13 +1771,13 @@
     <w:p>
       <w:pPr>
         <w:pStyle w:val="Kop3"/>
-        <w:divId w:val="735709604"/>
+        <w:divId w:val="1527910376"/>
         <w:rPr>
           <w:rFonts w:eastAsia="Times New Roman"/>
           <w:lang w:val="nl-NL"/>
         </w:rPr>
       </w:pPr>
-      <w:bookmarkStart w:id="8" w:name="_Toc242186690"/>
+      <w:bookmarkStart w:id="8" w:name="_Toc242187398"/>
       <w:r>
         <w:rPr>
           <w:rFonts w:eastAsia="Times New Roman"/>
@@ -1790,7 +1790,7 @@
     <w:p>
       <w:pPr>
         <w:pStyle w:val="Normaalweb"/>
-        <w:divId w:val="735709604"/>
+        <w:divId w:val="1527910376"/>
         <w:rPr>
           <w:lang w:val="nl-NL"/>
         </w:rPr>
@@ -1806,13 +1806,13 @@
     <w:p>
       <w:pPr>
         <w:pStyle w:val="Kop2"/>
-        <w:divId w:val="735709604"/>
+        <w:divId w:val="1527910376"/>
         <w:rPr>
           <w:rFonts w:eastAsia="Times New Roman"/>
           <w:lang w:val="nl-NL"/>
         </w:rPr>
       </w:pPr>
-      <w:bookmarkStart w:id="9" w:name="_Toc242186691"/>
+      <w:bookmarkStart w:id="9" w:name="_Toc242187399"/>
       <w:r>
         <w:rPr>
           <w:rFonts w:eastAsia="Times New Roman"/>
@@ -1825,7 +1825,7 @@
     <w:p>
       <w:pPr>
         <w:pStyle w:val="Normaalweb"/>
-        <w:divId w:val="735709604"/>
+        <w:divId w:val="1527910376"/>
         <w:rPr>
           <w:lang w:val="nl-NL"/>
         </w:rPr>
@@ -1840,7 +1840,7 @@
     <w:p>
       <w:pPr>
         <w:pStyle w:val="Normaalweb"/>
-        <w:divId w:val="735709604"/>
+        <w:divId w:val="1527910376"/>
         <w:rPr>
           <w:lang w:val="nl-NL"/>
         </w:rPr>
@@ -1855,7 +1855,7 @@
     <w:p>
       <w:pPr>
         <w:pStyle w:val="Normaalweb"/>
-        <w:divId w:val="735709604"/>
+        <w:divId w:val="1527910376"/>
         <w:rPr>
           <w:lang w:val="nl-NL"/>
         </w:rPr>
@@ -1870,13 +1870,13 @@
     <w:p>
       <w:pPr>
         <w:pStyle w:val="Kop2"/>
-        <w:divId w:val="735709604"/>
+        <w:divId w:val="1527910376"/>
         <w:rPr>
           <w:rFonts w:eastAsia="Times New Roman"/>
           <w:lang w:val="nl-NL"/>
         </w:rPr>
       </w:pPr>
-      <w:bookmarkStart w:id="10" w:name="_Toc242186692"/>
+      <w:bookmarkStart w:id="10" w:name="_Toc242187400"/>
       <w:r>
         <w:rPr>
           <w:rFonts w:eastAsia="Times New Roman"/>
@@ -1889,7 +1889,7 @@
     <w:p>
       <w:pPr>
         <w:pStyle w:val="Normaalweb"/>
-        <w:divId w:val="735709604"/>
+        <w:divId w:val="1527910376"/>
         <w:rPr>
           <w:lang w:val="nl-NL"/>
         </w:rPr>
@@ -1904,7 +1904,7 @@
     <w:p>
       <w:pPr>
         <w:pStyle w:val="Normaalweb"/>
-        <w:divId w:val="735709604"/>
+        <w:divId w:val="1527910376"/>
         <w:rPr>
           <w:lang w:val="nl-NL"/>
         </w:rPr>
@@ -1919,13 +1919,13 @@
     <w:p>
       <w:pPr>
         <w:pStyle w:val="Kop2"/>
-        <w:divId w:val="735709604"/>
+        <w:divId w:val="1527910376"/>
         <w:rPr>
           <w:rFonts w:eastAsia="Times New Roman"/>
           <w:lang w:val="nl-NL"/>
         </w:rPr>
       </w:pPr>
-      <w:bookmarkStart w:id="11" w:name="_Toc242186693"/>
+      <w:bookmarkStart w:id="11" w:name="_Toc242187401"/>
       <w:r>
         <w:rPr>
           <w:rFonts w:eastAsia="Times New Roman"/>
@@ -1938,7 +1938,7 @@
     <w:p>
       <w:pPr>
         <w:pStyle w:val="Normaalweb"/>
-        <w:divId w:val="735709604"/>
+        <w:divId w:val="1527910376"/>
         <w:rPr>
           <w:lang w:val="nl-NL"/>
         </w:rPr>
@@ -1953,7 +1953,7 @@
     <w:p>
       <w:pPr>
         <w:pStyle w:val="Normaalweb"/>
-        <w:divId w:val="735709604"/>
+        <w:divId w:val="1527910376"/>
         <w:rPr>
           <w:lang w:val="nl-NL"/>
         </w:rPr>
@@ -1968,7 +1968,7 @@
     <w:p>
       <w:pPr>
         <w:shd w:val="clear" w:color="auto" w:fill="FFFFFF"/>
-        <w:divId w:val="1694912916"/>
+        <w:divId w:val="417677209"/>
         <w:rPr>
           <w:szCs w:val="22"/>
           <w:lang w:val="nl-NL"/>
@@ -2101,7 +2101,7 @@
         <w:color w:val="808080"/>
         <w:sz w:val="18"/>
       </w:rPr>
-      <w:t>1</w:t>
+      <w:t>2</w:t>
     </w:r>
     <w:r>
       <w:rPr>
@@ -2236,7 +2236,7 @@
         <w:sz w:val="18"/>
       </w:rPr>
       <w:tab/>
-      <w:t>Laatst gewijzigd: 6 oktober 2026, 13:42</w:t>
+      <w:t>Laatst gewijzigd: 6 oktober 2026, 13:54</w:t>
     </w:r>
   </w:p>
 </w:hdr>
@@ -3536,7 +3536,7 @@
     <w:link w:val="KoptekstChar"/>
     <w:uiPriority w:val="99"/>
     <w:unhideWhenUsed/>
-    <w:rsid w:val="00D74AD2"/>
+    <w:rsid w:val="00AB78D4"/>
     <w:pPr>
       <w:tabs>
         <w:tab w:val="center" w:pos="4536"/>
@@ -3549,7 +3549,7 @@
     <w:basedOn w:val="Standaardalinea-lettertype"/>
     <w:link w:val="Koptekst"/>
     <w:uiPriority w:val="99"/>
-    <w:rsid w:val="00D74AD2"/>
+    <w:rsid w:val="00AB78D4"/>
     <w:rPr>
       <w:rFonts w:eastAsiaTheme="minorEastAsia"/>
       <w:sz w:val="24"/>
@@ -3562,7 +3562,7 @@
     <w:link w:val="VoettekstChar"/>
     <w:uiPriority w:val="99"/>
     <w:unhideWhenUsed/>
-    <w:rsid w:val="00D74AD2"/>
+    <w:rsid w:val="00AB78D4"/>
     <w:pPr>
       <w:tabs>
         <w:tab w:val="center" w:pos="4536"/>
@@ -3575,7 +3575,7 @@
     <w:basedOn w:val="Standaardalinea-lettertype"/>
     <w:link w:val="Voettekst"/>
     <w:uiPriority w:val="99"/>
-    <w:rsid w:val="00D74AD2"/>
+    <w:rsid w:val="00AB78D4"/>
     <w:rPr>
       <w:rFonts w:eastAsiaTheme="minorEastAsia"/>
       <w:sz w:val="24"/>
@@ -3589,7 +3589,7 @@
     <w:autoRedefine/>
     <w:uiPriority w:val="39"/>
     <w:unhideWhenUsed/>
-    <w:rsid w:val="00D74AD2"/>
+    <w:rsid w:val="00AB78D4"/>
     <w:pPr>
       <w:spacing w:after="100"/>
       <w:ind w:left="220"/>
@@ -3602,7 +3602,7 @@
     <w:autoRedefine/>
     <w:uiPriority w:val="39"/>
     <w:unhideWhenUsed/>
-    <w:rsid w:val="00D74AD2"/>
+    <w:rsid w:val="00AB78D4"/>
     <w:pPr>
       <w:spacing w:after="100"/>
       <w:ind w:left="440"/>

</xml_diff>

<commit_message>
Update Systeem-Audit NL 06-10-2026 14:20
</commit_message>
<xml_diff>
--- a/nl/docx/document-0.docx
+++ b/nl/docx/document-0.docx
@@ -7,7 +7,7 @@
         <w:spacing w:after="480"/>
         <w:jc w:val="center"/>
         <w:outlineLvl w:val="1"/>
-        <w:divId w:val="1920404133"/>
+        <w:divId w:val="1423530983"/>
         <w:rPr>
           <w:rFonts w:ascii="Aptos Display" w:eastAsia="Times New Roman" w:hAnsi="Aptos Display"/>
           <w:b/>
@@ -36,7 +36,7 @@
     <w:p>
       <w:pPr>
         <w:pStyle w:val="ondertitel2"/>
-        <w:divId w:val="1920404133"/>
+        <w:divId w:val="1423530983"/>
         <w:rPr>
           <w:lang w:val="nl-NL"/>
         </w:rPr>
@@ -51,7 +51,7 @@
     <w:p>
       <w:pPr>
         <w:pStyle w:val="documentaanduiding2"/>
-        <w:divId w:val="1920404133"/>
+        <w:divId w:val="1423530983"/>
         <w:rPr>
           <w:lang w:val="nl-NL"/>
         </w:rPr>
@@ -66,7 +66,7 @@
     <w:p>
       <w:pPr>
         <w:pStyle w:val="auteur2"/>
-        <w:divId w:val="1920404133"/>
+        <w:divId w:val="1423530983"/>
         <w:rPr>
           <w:lang w:val="nl-NL"/>
         </w:rPr>
@@ -81,23 +81,23 @@
     <w:p>
       <w:pPr>
         <w:pStyle w:val="meta-lijn2"/>
-        <w:divId w:val="1920404133"/>
-        <w:rPr>
-          <w:lang w:val="nl-NL"/>
-        </w:rPr>
-      </w:pPr>
-      <w:r>
-        <w:rPr>
-          <w:lang w:val="nl-NL"/>
-        </w:rPr>
-        <w:t>Versie bijgewerkt: 6 oktober 2026, 13:54</w:t>
+        <w:divId w:val="1423530983"/>
+        <w:rPr>
+          <w:lang w:val="nl-NL"/>
+        </w:rPr>
+      </w:pPr>
+      <w:r>
+        <w:rPr>
+          <w:lang w:val="nl-NL"/>
+        </w:rPr>
+        <w:t>Versie bijgewerkt: 6 oktober 2026, 14:20</w:t>
       </w:r>
     </w:p>
     <w:p>
       <w:pPr>
         <w:pStyle w:val="marker"/>
         <w:ind w:left="800" w:right="800"/>
-        <w:divId w:val="1527910376"/>
+        <w:divId w:val="511190921"/>
         <w:rPr>
           <w:lang w:val="nl-NL"/>
         </w:rPr>
@@ -110,13 +110,13 @@
       <w:pPr>
         <w:pStyle w:val="Kop2"/>
         <w:pageBreakBefore/>
-        <w:divId w:val="1476874937"/>
+        <w:divId w:val="1614703469"/>
         <w:rPr>
           <w:rFonts w:eastAsia="Times New Roman"/>
           <w:lang w:val="nl-NL"/>
         </w:rPr>
       </w:pPr>
-      <w:bookmarkStart w:id="0" w:name="_Toc242187390"/>
+      <w:bookmarkStart w:id="0" w:name="_Toc242188925"/>
       <w:r>
         <w:rPr>
           <w:rFonts w:eastAsia="Times New Roman"/>
@@ -133,7 +133,7 @@
         <w:tabs>
           <w:tab w:val="right" w:leader="dot" w:pos="9062"/>
         </w:tabs>
-        <w:divId w:val="1476874937"/>
+        <w:divId w:val="1614703469"/>
         <w:rPr>
           <w:rFonts w:asciiTheme="minorHAnsi" w:hAnsiTheme="minorHAnsi" w:cstheme="minorBidi"/>
           <w:noProof/>
@@ -184,7 +184,7 @@
         <w:rPr>
           <w:noProof/>
         </w:rPr>
-        <w:instrText xml:space="preserve"> PAGEREF _Toc242187390 \h </w:instrText>
+        <w:instrText xml:space="preserve"> PAGEREF _Toc242188925 \h </w:instrText>
       </w:r>
       <w:r>
         <w:rPr>
@@ -216,7 +216,7 @@
         <w:tabs>
           <w:tab w:val="right" w:leader="dot" w:pos="9062"/>
         </w:tabs>
-        <w:divId w:val="1476874937"/>
+        <w:divId w:val="1614703469"/>
         <w:rPr>
           <w:rFonts w:asciiTheme="minorHAnsi" w:hAnsiTheme="minorHAnsi" w:cstheme="minorBidi"/>
           <w:noProof/>
@@ -249,7 +249,7 @@
         <w:rPr>
           <w:noProof/>
         </w:rPr>
-        <w:instrText xml:space="preserve"> PAGEREF _Toc242187391 \h </w:instrText>
+        <w:instrText xml:space="preserve"> PAGEREF _Toc242188926 \h </w:instrText>
       </w:r>
       <w:r>
         <w:rPr>
@@ -281,7 +281,7 @@
         <w:tabs>
           <w:tab w:val="right" w:leader="dot" w:pos="9062"/>
         </w:tabs>
-        <w:divId w:val="1476874937"/>
+        <w:divId w:val="1614703469"/>
         <w:rPr>
           <w:rFonts w:asciiTheme="minorHAnsi" w:hAnsiTheme="minorHAnsi" w:cstheme="minorBidi"/>
           <w:noProof/>
@@ -314,7 +314,7 @@
         <w:rPr>
           <w:noProof/>
         </w:rPr>
-        <w:instrText xml:space="preserve"> PAGEREF _Toc242187392 \h </w:instrText>
+        <w:instrText xml:space="preserve"> PAGEREF _Toc242188927 \h </w:instrText>
       </w:r>
       <w:r>
         <w:rPr>
@@ -346,7 +346,7 @@
         <w:tabs>
           <w:tab w:val="right" w:leader="dot" w:pos="9062"/>
         </w:tabs>
-        <w:divId w:val="1476874937"/>
+        <w:divId w:val="1614703469"/>
         <w:rPr>
           <w:rFonts w:asciiTheme="minorHAnsi" w:hAnsiTheme="minorHAnsi" w:cstheme="minorBidi"/>
           <w:noProof/>
@@ -379,7 +379,7 @@
         <w:rPr>
           <w:noProof/>
         </w:rPr>
-        <w:instrText xml:space="preserve"> PAGEREF _Toc242187393 \h </w:instrText>
+        <w:instrText xml:space="preserve"> PAGEREF _Toc242188928 \h </w:instrText>
       </w:r>
       <w:r>
         <w:rPr>
@@ -411,7 +411,7 @@
         <w:tabs>
           <w:tab w:val="right" w:leader="dot" w:pos="9062"/>
         </w:tabs>
-        <w:divId w:val="1476874937"/>
+        <w:divId w:val="1614703469"/>
         <w:rPr>
           <w:rFonts w:asciiTheme="minorHAnsi" w:hAnsiTheme="minorHAnsi" w:cstheme="minorBidi"/>
           <w:noProof/>
@@ -444,7 +444,7 @@
         <w:rPr>
           <w:noProof/>
         </w:rPr>
-        <w:instrText xml:space="preserve"> PAGEREF _Toc242187394 \h </w:instrText>
+        <w:instrText xml:space="preserve"> PAGEREF _Toc242188929 \h </w:instrText>
       </w:r>
       <w:r>
         <w:rPr>
@@ -476,7 +476,7 @@
         <w:tabs>
           <w:tab w:val="right" w:leader="dot" w:pos="9062"/>
         </w:tabs>
-        <w:divId w:val="1476874937"/>
+        <w:divId w:val="1614703469"/>
         <w:rPr>
           <w:rFonts w:asciiTheme="minorHAnsi" w:hAnsiTheme="minorHAnsi" w:cstheme="minorBidi"/>
           <w:noProof/>
@@ -509,7 +509,7 @@
         <w:rPr>
           <w:noProof/>
         </w:rPr>
-        <w:instrText xml:space="preserve"> PAGEREF _Toc242187395 \h </w:instrText>
+        <w:instrText xml:space="preserve"> PAGEREF _Toc242188930 \h </w:instrText>
       </w:r>
       <w:r>
         <w:rPr>
@@ -541,7 +541,7 @@
         <w:tabs>
           <w:tab w:val="right" w:leader="dot" w:pos="9062"/>
         </w:tabs>
-        <w:divId w:val="1476874937"/>
+        <w:divId w:val="1614703469"/>
         <w:rPr>
           <w:rFonts w:asciiTheme="minorHAnsi" w:hAnsiTheme="minorHAnsi" w:cstheme="minorBidi"/>
           <w:noProof/>
@@ -574,7 +574,7 @@
         <w:rPr>
           <w:noProof/>
         </w:rPr>
-        <w:instrText xml:space="preserve"> PAGEREF _Toc242187396 \h </w:instrText>
+        <w:instrText xml:space="preserve"> PAGEREF _Toc242188931 \h </w:instrText>
       </w:r>
       <w:r>
         <w:rPr>
@@ -606,7 +606,7 @@
         <w:tabs>
           <w:tab w:val="right" w:leader="dot" w:pos="9062"/>
         </w:tabs>
-        <w:divId w:val="1476874937"/>
+        <w:divId w:val="1614703469"/>
         <w:rPr>
           <w:rFonts w:asciiTheme="minorHAnsi" w:hAnsiTheme="minorHAnsi" w:cstheme="minorBidi"/>
           <w:noProof/>
@@ -639,7 +639,7 @@
         <w:rPr>
           <w:noProof/>
         </w:rPr>
-        <w:instrText xml:space="preserve"> PAGEREF _Toc242187397 \h </w:instrText>
+        <w:instrText xml:space="preserve"> PAGEREF _Toc242188932 \h </w:instrText>
       </w:r>
       <w:r>
         <w:rPr>
@@ -671,7 +671,7 @@
         <w:tabs>
           <w:tab w:val="right" w:leader="dot" w:pos="9062"/>
         </w:tabs>
-        <w:divId w:val="1476874937"/>
+        <w:divId w:val="1614703469"/>
         <w:rPr>
           <w:rFonts w:asciiTheme="minorHAnsi" w:hAnsiTheme="minorHAnsi" w:cstheme="minorBidi"/>
           <w:noProof/>
@@ -704,7 +704,7 @@
         <w:rPr>
           <w:noProof/>
         </w:rPr>
-        <w:instrText xml:space="preserve"> PAGEREF _Toc242187398 \h </w:instrText>
+        <w:instrText xml:space="preserve"> PAGEREF _Toc242188933 \h </w:instrText>
       </w:r>
       <w:r>
         <w:rPr>
@@ -736,7 +736,7 @@
         <w:tabs>
           <w:tab w:val="right" w:leader="dot" w:pos="9062"/>
         </w:tabs>
-        <w:divId w:val="1476874937"/>
+        <w:divId w:val="1614703469"/>
         <w:rPr>
           <w:rFonts w:asciiTheme="minorHAnsi" w:hAnsiTheme="minorHAnsi" w:cstheme="minorBidi"/>
           <w:noProof/>
@@ -769,7 +769,7 @@
         <w:rPr>
           <w:noProof/>
         </w:rPr>
-        <w:instrText xml:space="preserve"> PAGEREF _Toc242187399 \h </w:instrText>
+        <w:instrText xml:space="preserve"> PAGEREF _Toc242188934 \h </w:instrText>
       </w:r>
       <w:r>
         <w:rPr>
@@ -801,7 +801,7 @@
         <w:tabs>
           <w:tab w:val="right" w:leader="dot" w:pos="9062"/>
         </w:tabs>
-        <w:divId w:val="1476874937"/>
+        <w:divId w:val="1614703469"/>
         <w:rPr>
           <w:rFonts w:asciiTheme="minorHAnsi" w:hAnsiTheme="minorHAnsi" w:cstheme="minorBidi"/>
           <w:noProof/>
@@ -834,7 +834,7 @@
         <w:rPr>
           <w:noProof/>
         </w:rPr>
-        <w:instrText xml:space="preserve"> PAGEREF _Toc242187400 \h </w:instrText>
+        <w:instrText xml:space="preserve"> PAGEREF _Toc242188935 \h </w:instrText>
       </w:r>
       <w:r>
         <w:rPr>
@@ -866,7 +866,7 @@
         <w:tabs>
           <w:tab w:val="right" w:leader="dot" w:pos="9062"/>
         </w:tabs>
-        <w:divId w:val="1476874937"/>
+        <w:divId w:val="1614703469"/>
         <w:rPr>
           <w:rFonts w:asciiTheme="minorHAnsi" w:hAnsiTheme="minorHAnsi" w:cstheme="minorBidi"/>
           <w:noProof/>
@@ -899,7 +899,7 @@
         <w:rPr>
           <w:noProof/>
         </w:rPr>
-        <w:instrText xml:space="preserve"> PAGEREF _Toc242187401 \h </w:instrText>
+        <w:instrText xml:space="preserve"> PAGEREF _Toc242188936 \h </w:instrText>
       </w:r>
       <w:r>
         <w:rPr>
@@ -928,7 +928,7 @@
     <w:p>
       <w:pPr>
         <w:pStyle w:val="marker"/>
-        <w:divId w:val="1476874937"/>
+        <w:divId w:val="1614703469"/>
         <w:rPr>
           <w:lang w:val="nl-NL"/>
         </w:rPr>
@@ -944,7 +944,7 @@
       <w:pPr>
         <w:pStyle w:val="marker"/>
         <w:ind w:left="800" w:right="800"/>
-        <w:divId w:val="1527910376"/>
+        <w:divId w:val="511190921"/>
         <w:rPr>
           <w:lang w:val="nl-NL"/>
         </w:rPr>
@@ -956,13 +956,13 @@
     <w:p>
       <w:pPr>
         <w:pStyle w:val="Kop2"/>
-        <w:divId w:val="1527910376"/>
+        <w:divId w:val="511190921"/>
         <w:rPr>
           <w:rFonts w:eastAsia="Times New Roman"/>
           <w:lang w:val="nl-NL"/>
         </w:rPr>
       </w:pPr>
-      <w:bookmarkStart w:id="1" w:name="_Toc242187391"/>
+      <w:bookmarkStart w:id="1" w:name="_Toc242188926"/>
       <w:r>
         <w:rPr>
           <w:rFonts w:eastAsia="Times New Roman"/>
@@ -975,7 +975,7 @@
     <w:p>
       <w:pPr>
         <w:pStyle w:val="Normaalweb"/>
-        <w:divId w:val="1527910376"/>
+        <w:divId w:val="511190921"/>
         <w:rPr>
           <w:lang w:val="nl-NL"/>
         </w:rPr>
@@ -990,7 +990,7 @@
     <w:p>
       <w:pPr>
         <w:pStyle w:val="Normaalweb"/>
-        <w:divId w:val="1527910376"/>
+        <w:divId w:val="511190921"/>
         <w:rPr>
           <w:lang w:val="nl-NL"/>
         </w:rPr>
@@ -1018,7 +1018,7 @@
     <w:p>
       <w:pPr>
         <w:pStyle w:val="Normaalweb"/>
-        <w:divId w:val="1527910376"/>
+        <w:divId w:val="511190921"/>
         <w:rPr>
           <w:lang w:val="nl-NL"/>
         </w:rPr>
@@ -1039,7 +1039,7 @@
     <w:p>
       <w:pPr>
         <w:pStyle w:val="Normaalweb"/>
-        <w:divId w:val="1527910376"/>
+        <w:divId w:val="511190921"/>
         <w:rPr>
           <w:lang w:val="nl-NL"/>
         </w:rPr>
@@ -1086,7 +1086,7 @@
     <w:p>
       <w:pPr>
         <w:pStyle w:val="Normaalweb"/>
-        <w:divId w:val="1527910376"/>
+        <w:divId w:val="511190921"/>
         <w:rPr>
           <w:lang w:val="nl-NL"/>
         </w:rPr>
@@ -1114,7 +1114,7 @@
     <w:p>
       <w:pPr>
         <w:pStyle w:val="Normaalweb"/>
-        <w:divId w:val="1527910376"/>
+        <w:divId w:val="511190921"/>
         <w:rPr>
           <w:lang w:val="nl-NL"/>
         </w:rPr>
@@ -1148,7 +1148,7 @@
     <w:p>
       <w:pPr>
         <w:pStyle w:val="Normaalweb"/>
-        <w:divId w:val="1527910376"/>
+        <w:divId w:val="511190921"/>
         <w:rPr>
           <w:lang w:val="nl-NL"/>
         </w:rPr>
@@ -1175,7 +1175,7 @@
     <w:p>
       <w:pPr>
         <w:pStyle w:val="Normaalweb"/>
-        <w:divId w:val="1527910376"/>
+        <w:divId w:val="511190921"/>
         <w:rPr>
           <w:lang w:val="nl-NL"/>
         </w:rPr>
@@ -1203,7 +1203,7 @@
     <w:p>
       <w:pPr>
         <w:pStyle w:val="Normaalweb"/>
-        <w:divId w:val="1527910376"/>
+        <w:divId w:val="511190921"/>
         <w:rPr>
           <w:lang w:val="nl-NL"/>
         </w:rPr>
@@ -1218,7 +1218,7 @@
     <w:p>
       <w:pPr>
         <w:pStyle w:val="Normaalweb"/>
-        <w:divId w:val="1527910376"/>
+        <w:divId w:val="511190921"/>
         <w:rPr>
           <w:lang w:val="nl-NL"/>
         </w:rPr>
@@ -1278,7 +1278,7 @@
     <w:p>
       <w:pPr>
         <w:pStyle w:val="Normaalweb"/>
-        <w:divId w:val="1527910376"/>
+        <w:divId w:val="511190921"/>
         <w:rPr>
           <w:lang w:val="nl-NL"/>
         </w:rPr>
@@ -1293,7 +1293,7 @@
     <w:p>
       <w:pPr>
         <w:pStyle w:val="Normaalweb"/>
-        <w:divId w:val="1527910376"/>
+        <w:divId w:val="511190921"/>
         <w:rPr>
           <w:lang w:val="nl-NL"/>
         </w:rPr>
@@ -1321,7 +1321,7 @@
     <w:p>
       <w:pPr>
         <w:pStyle w:val="Normaalweb"/>
-        <w:divId w:val="1527910376"/>
+        <w:divId w:val="511190921"/>
         <w:rPr>
           <w:lang w:val="nl-NL"/>
         </w:rPr>
@@ -1336,7 +1336,7 @@
     <w:p>
       <w:pPr>
         <w:pStyle w:val="Normaalweb"/>
-        <w:divId w:val="1527910376"/>
+        <w:divId w:val="511190921"/>
         <w:rPr>
           <w:lang w:val="nl-NL"/>
         </w:rPr>
@@ -1351,7 +1351,7 @@
     <w:p>
       <w:pPr>
         <w:pStyle w:val="Normaalweb"/>
-        <w:divId w:val="1527910376"/>
+        <w:divId w:val="511190921"/>
         <w:rPr>
           <w:lang w:val="nl-NL"/>
         </w:rPr>
@@ -1366,7 +1366,7 @@
     <w:p>
       <w:pPr>
         <w:spacing w:before="300" w:after="200"/>
-        <w:divId w:val="1527910376"/>
+        <w:divId w:val="511190921"/>
         <w:rPr>
           <w:rFonts w:eastAsia="Times New Roman"/>
           <w:lang w:val="nl-NL"/>
@@ -1377,14 +1377,14 @@
           <w:rFonts w:eastAsia="Times New Roman"/>
           <w:lang w:val="nl-NL"/>
         </w:rPr>
-        <w:pict w14:anchorId="31E70B13">
+        <w:pict w14:anchorId="6DF72933">
           <v:rect id="_x0000_i1025" style="width:0;height:1.5pt" o:hralign="center" o:hrstd="t" o:hr="t" fillcolor="#a0a0a0" stroked="f"/>
         </w:pict>
       </w:r>
     </w:p>
     <w:p>
       <w:pPr>
-        <w:divId w:val="686105223"/>
+        <w:divId w:val="1464927376"/>
         <w:rPr>
           <w:color w:val="555555"/>
           <w:sz w:val="20"/>
@@ -1423,7 +1423,7 @@
     </w:p>
     <w:p>
       <w:pPr>
-        <w:divId w:val="686105223"/>
+        <w:divId w:val="1464927376"/>
         <w:rPr>
           <w:color w:val="555555"/>
           <w:sz w:val="20"/>
@@ -1463,7 +1463,7 @@
     </w:p>
     <w:p>
       <w:pPr>
-        <w:divId w:val="686105223"/>
+        <w:divId w:val="1464927376"/>
         <w:rPr>
           <w:color w:val="555555"/>
           <w:sz w:val="20"/>
@@ -1493,7 +1493,7 @@
     </w:p>
     <w:p>
       <w:pPr>
-        <w:divId w:val="686105223"/>
+        <w:divId w:val="1464927376"/>
         <w:rPr>
           <w:color w:val="555555"/>
           <w:sz w:val="20"/>
@@ -1525,7 +1525,7 @@
       <w:pPr>
         <w:pStyle w:val="marker"/>
         <w:ind w:left="800" w:right="800"/>
-        <w:divId w:val="1527910376"/>
+        <w:divId w:val="511190921"/>
         <w:rPr>
           <w:lang w:val="nl-NL"/>
         </w:rPr>
@@ -1537,13 +1537,13 @@
     <w:p>
       <w:pPr>
         <w:pStyle w:val="Kop2"/>
-        <w:divId w:val="1527910376"/>
+        <w:divId w:val="511190921"/>
         <w:rPr>
           <w:rFonts w:eastAsia="Times New Roman"/>
           <w:lang w:val="nl-NL"/>
         </w:rPr>
       </w:pPr>
-      <w:bookmarkStart w:id="2" w:name="_Toc242187392"/>
+      <w:bookmarkStart w:id="2" w:name="_Toc242188927"/>
       <w:r>
         <w:rPr>
           <w:rFonts w:eastAsia="Times New Roman"/>
@@ -1556,7 +1556,7 @@
     <w:p>
       <w:pPr>
         <w:pStyle w:val="Normaalweb"/>
-        <w:divId w:val="1527910376"/>
+        <w:divId w:val="511190921"/>
         <w:rPr>
           <w:lang w:val="nl-NL"/>
         </w:rPr>
@@ -1571,7 +1571,7 @@
     <w:p>
       <w:pPr>
         <w:pStyle w:val="Normaalweb"/>
-        <w:divId w:val="1527910376"/>
+        <w:divId w:val="511190921"/>
         <w:rPr>
           <w:lang w:val="nl-NL"/>
         </w:rPr>
@@ -1586,7 +1586,7 @@
     <w:p>
       <w:pPr>
         <w:pStyle w:val="Normaalweb"/>
-        <w:divId w:val="1527910376"/>
+        <w:divId w:val="511190921"/>
         <w:rPr>
           <w:lang w:val="nl-NL"/>
         </w:rPr>
@@ -1601,13 +1601,13 @@
     <w:p>
       <w:pPr>
         <w:pStyle w:val="Kop2"/>
-        <w:divId w:val="1527910376"/>
+        <w:divId w:val="511190921"/>
         <w:rPr>
           <w:rFonts w:eastAsia="Times New Roman"/>
           <w:lang w:val="nl-NL"/>
         </w:rPr>
       </w:pPr>
-      <w:bookmarkStart w:id="3" w:name="_Toc242187393"/>
+      <w:bookmarkStart w:id="3" w:name="_Toc242188928"/>
       <w:r>
         <w:rPr>
           <w:rFonts w:eastAsia="Times New Roman"/>
@@ -1620,7 +1620,7 @@
     <w:p>
       <w:pPr>
         <w:pStyle w:val="Normaalweb"/>
-        <w:divId w:val="1527910376"/>
+        <w:divId w:val="511190921"/>
         <w:rPr>
           <w:lang w:val="nl-NL"/>
         </w:rPr>
@@ -1635,13 +1635,13 @@
     <w:p>
       <w:pPr>
         <w:pStyle w:val="Kop2"/>
-        <w:divId w:val="1527910376"/>
+        <w:divId w:val="511190921"/>
         <w:rPr>
           <w:rFonts w:eastAsia="Times New Roman"/>
           <w:lang w:val="nl-NL"/>
         </w:rPr>
       </w:pPr>
-      <w:bookmarkStart w:id="4" w:name="_Toc242187394"/>
+      <w:bookmarkStart w:id="4" w:name="_Toc242188929"/>
       <w:r>
         <w:rPr>
           <w:rFonts w:eastAsia="Times New Roman"/>
@@ -1654,7 +1654,7 @@
     <w:p>
       <w:pPr>
         <w:pStyle w:val="Normaalweb"/>
-        <w:divId w:val="1527910376"/>
+        <w:divId w:val="511190921"/>
         <w:rPr>
           <w:lang w:val="nl-NL"/>
         </w:rPr>
@@ -1669,13 +1669,13 @@
     <w:p>
       <w:pPr>
         <w:pStyle w:val="Kop3"/>
-        <w:divId w:val="1527910376"/>
+        <w:divId w:val="511190921"/>
         <w:rPr>
           <w:rFonts w:eastAsia="Times New Roman"/>
           <w:lang w:val="nl-NL"/>
         </w:rPr>
       </w:pPr>
-      <w:bookmarkStart w:id="5" w:name="_Toc242187395"/>
+      <w:bookmarkStart w:id="5" w:name="_Toc242188930"/>
       <w:r>
         <w:rPr>
           <w:rFonts w:eastAsia="Times New Roman"/>
@@ -1688,7 +1688,7 @@
     <w:p>
       <w:pPr>
         <w:pStyle w:val="Normaalweb"/>
-        <w:divId w:val="1527910376"/>
+        <w:divId w:val="511190921"/>
         <w:rPr>
           <w:lang w:val="nl-NL"/>
         </w:rPr>
@@ -1703,13 +1703,13 @@
     <w:p>
       <w:pPr>
         <w:pStyle w:val="Kop3"/>
-        <w:divId w:val="1527910376"/>
+        <w:divId w:val="511190921"/>
         <w:rPr>
           <w:rFonts w:eastAsia="Times New Roman"/>
           <w:lang w:val="nl-NL"/>
         </w:rPr>
       </w:pPr>
-      <w:bookmarkStart w:id="6" w:name="_Toc242187396"/>
+      <w:bookmarkStart w:id="6" w:name="_Toc242188931"/>
       <w:r>
         <w:rPr>
           <w:rFonts w:eastAsia="Times New Roman"/>
@@ -1722,7 +1722,7 @@
     <w:p>
       <w:pPr>
         <w:pStyle w:val="Normaalweb"/>
-        <w:divId w:val="1527910376"/>
+        <w:divId w:val="511190921"/>
         <w:rPr>
           <w:lang w:val="nl-NL"/>
         </w:rPr>
@@ -1737,13 +1737,13 @@
     <w:p>
       <w:pPr>
         <w:pStyle w:val="Kop3"/>
-        <w:divId w:val="1527910376"/>
+        <w:divId w:val="511190921"/>
         <w:rPr>
           <w:rFonts w:eastAsia="Times New Roman"/>
           <w:lang w:val="nl-NL"/>
         </w:rPr>
       </w:pPr>
-      <w:bookmarkStart w:id="7" w:name="_Toc242187397"/>
+      <w:bookmarkStart w:id="7" w:name="_Toc242188932"/>
       <w:r>
         <w:rPr>
           <w:rFonts w:eastAsia="Times New Roman"/>
@@ -1756,7 +1756,7 @@
     <w:p>
       <w:pPr>
         <w:pStyle w:val="Normaalweb"/>
-        <w:divId w:val="1527910376"/>
+        <w:divId w:val="511190921"/>
         <w:rPr>
           <w:lang w:val="nl-NL"/>
         </w:rPr>
@@ -1771,13 +1771,13 @@
     <w:p>
       <w:pPr>
         <w:pStyle w:val="Kop3"/>
-        <w:divId w:val="1527910376"/>
+        <w:divId w:val="511190921"/>
         <w:rPr>
           <w:rFonts w:eastAsia="Times New Roman"/>
           <w:lang w:val="nl-NL"/>
         </w:rPr>
       </w:pPr>
-      <w:bookmarkStart w:id="8" w:name="_Toc242187398"/>
+      <w:bookmarkStart w:id="8" w:name="_Toc242188933"/>
       <w:r>
         <w:rPr>
           <w:rFonts w:eastAsia="Times New Roman"/>
@@ -1790,7 +1790,7 @@
     <w:p>
       <w:pPr>
         <w:pStyle w:val="Normaalweb"/>
-        <w:divId w:val="1527910376"/>
+        <w:divId w:val="511190921"/>
         <w:rPr>
           <w:lang w:val="nl-NL"/>
         </w:rPr>
@@ -1806,13 +1806,13 @@
     <w:p>
       <w:pPr>
         <w:pStyle w:val="Kop2"/>
-        <w:divId w:val="1527910376"/>
+        <w:divId w:val="511190921"/>
         <w:rPr>
           <w:rFonts w:eastAsia="Times New Roman"/>
           <w:lang w:val="nl-NL"/>
         </w:rPr>
       </w:pPr>
-      <w:bookmarkStart w:id="9" w:name="_Toc242187399"/>
+      <w:bookmarkStart w:id="9" w:name="_Toc242188934"/>
       <w:r>
         <w:rPr>
           <w:rFonts w:eastAsia="Times New Roman"/>
@@ -1825,7 +1825,7 @@
     <w:p>
       <w:pPr>
         <w:pStyle w:val="Normaalweb"/>
-        <w:divId w:val="1527910376"/>
+        <w:divId w:val="511190921"/>
         <w:rPr>
           <w:lang w:val="nl-NL"/>
         </w:rPr>
@@ -1840,7 +1840,7 @@
     <w:p>
       <w:pPr>
         <w:pStyle w:val="Normaalweb"/>
-        <w:divId w:val="1527910376"/>
+        <w:divId w:val="511190921"/>
         <w:rPr>
           <w:lang w:val="nl-NL"/>
         </w:rPr>
@@ -1855,7 +1855,7 @@
     <w:p>
       <w:pPr>
         <w:pStyle w:val="Normaalweb"/>
-        <w:divId w:val="1527910376"/>
+        <w:divId w:val="511190921"/>
         <w:rPr>
           <w:lang w:val="nl-NL"/>
         </w:rPr>
@@ -1870,13 +1870,13 @@
     <w:p>
       <w:pPr>
         <w:pStyle w:val="Kop2"/>
-        <w:divId w:val="1527910376"/>
+        <w:divId w:val="511190921"/>
         <w:rPr>
           <w:rFonts w:eastAsia="Times New Roman"/>
           <w:lang w:val="nl-NL"/>
         </w:rPr>
       </w:pPr>
-      <w:bookmarkStart w:id="10" w:name="_Toc242187400"/>
+      <w:bookmarkStart w:id="10" w:name="_Toc242188935"/>
       <w:r>
         <w:rPr>
           <w:rFonts w:eastAsia="Times New Roman"/>
@@ -1889,7 +1889,7 @@
     <w:p>
       <w:pPr>
         <w:pStyle w:val="Normaalweb"/>
-        <w:divId w:val="1527910376"/>
+        <w:divId w:val="511190921"/>
         <w:rPr>
           <w:lang w:val="nl-NL"/>
         </w:rPr>
@@ -1904,7 +1904,7 @@
     <w:p>
       <w:pPr>
         <w:pStyle w:val="Normaalweb"/>
-        <w:divId w:val="1527910376"/>
+        <w:divId w:val="511190921"/>
         <w:rPr>
           <w:lang w:val="nl-NL"/>
         </w:rPr>
@@ -1919,13 +1919,13 @@
     <w:p>
       <w:pPr>
         <w:pStyle w:val="Kop2"/>
-        <w:divId w:val="1527910376"/>
+        <w:divId w:val="511190921"/>
         <w:rPr>
           <w:rFonts w:eastAsia="Times New Roman"/>
           <w:lang w:val="nl-NL"/>
         </w:rPr>
       </w:pPr>
-      <w:bookmarkStart w:id="11" w:name="_Toc242187401"/>
+      <w:bookmarkStart w:id="11" w:name="_Toc242188936"/>
       <w:r>
         <w:rPr>
           <w:rFonts w:eastAsia="Times New Roman"/>
@@ -1938,7 +1938,7 @@
     <w:p>
       <w:pPr>
         <w:pStyle w:val="Normaalweb"/>
-        <w:divId w:val="1527910376"/>
+        <w:divId w:val="511190921"/>
         <w:rPr>
           <w:lang w:val="nl-NL"/>
         </w:rPr>
@@ -1953,7 +1953,7 @@
     <w:p>
       <w:pPr>
         <w:pStyle w:val="Normaalweb"/>
-        <w:divId w:val="1527910376"/>
+        <w:divId w:val="511190921"/>
         <w:rPr>
           <w:lang w:val="nl-NL"/>
         </w:rPr>
@@ -1968,7 +1968,7 @@
     <w:p>
       <w:pPr>
         <w:shd w:val="clear" w:color="auto" w:fill="FFFFFF"/>
-        <w:divId w:val="417677209"/>
+        <w:divId w:val="542208636"/>
         <w:rPr>
           <w:szCs w:val="22"/>
           <w:lang w:val="nl-NL"/>
@@ -2101,7 +2101,7 @@
         <w:color w:val="808080"/>
         <w:sz w:val="18"/>
       </w:rPr>
-      <w:t>2</w:t>
+      <w:t>1</w:t>
     </w:r>
     <w:r>
       <w:rPr>
@@ -2236,7 +2236,7 @@
         <w:sz w:val="18"/>
       </w:rPr>
       <w:tab/>
-      <w:t>Laatst gewijzigd: 6 oktober 2026, 13:54</w:t>
+      <w:t>Laatst gewijzigd: 6 oktober 2026, 14:20</w:t>
     </w:r>
   </w:p>
 </w:hdr>
@@ -3536,7 +3536,7 @@
     <w:link w:val="KoptekstChar"/>
     <w:uiPriority w:val="99"/>
     <w:unhideWhenUsed/>
-    <w:rsid w:val="00AB78D4"/>
+    <w:rsid w:val="005164B0"/>
     <w:pPr>
       <w:tabs>
         <w:tab w:val="center" w:pos="4536"/>
@@ -3549,7 +3549,7 @@
     <w:basedOn w:val="Standaardalinea-lettertype"/>
     <w:link w:val="Koptekst"/>
     <w:uiPriority w:val="99"/>
-    <w:rsid w:val="00AB78D4"/>
+    <w:rsid w:val="005164B0"/>
     <w:rPr>
       <w:rFonts w:eastAsiaTheme="minorEastAsia"/>
       <w:sz w:val="24"/>
@@ -3562,7 +3562,7 @@
     <w:link w:val="VoettekstChar"/>
     <w:uiPriority w:val="99"/>
     <w:unhideWhenUsed/>
-    <w:rsid w:val="00AB78D4"/>
+    <w:rsid w:val="005164B0"/>
     <w:pPr>
       <w:tabs>
         <w:tab w:val="center" w:pos="4536"/>
@@ -3575,7 +3575,7 @@
     <w:basedOn w:val="Standaardalinea-lettertype"/>
     <w:link w:val="Voettekst"/>
     <w:uiPriority w:val="99"/>
-    <w:rsid w:val="00AB78D4"/>
+    <w:rsid w:val="005164B0"/>
     <w:rPr>
       <w:rFonts w:eastAsiaTheme="minorEastAsia"/>
       <w:sz w:val="24"/>
@@ -3589,7 +3589,7 @@
     <w:autoRedefine/>
     <w:uiPriority w:val="39"/>
     <w:unhideWhenUsed/>
-    <w:rsid w:val="00AB78D4"/>
+    <w:rsid w:val="005164B0"/>
     <w:pPr>
       <w:spacing w:after="100"/>
       <w:ind w:left="220"/>
@@ -3602,7 +3602,7 @@
     <w:autoRedefine/>
     <w:uiPriority w:val="39"/>
     <w:unhideWhenUsed/>
-    <w:rsid w:val="00AB78D4"/>
+    <w:rsid w:val="005164B0"/>
     <w:pPr>
       <w:spacing w:after="100"/>
       <w:ind w:left="440"/>

</xml_diff>

<commit_message>
Update Systeem-Audit NL 13-10-2026 19:35
</commit_message>
<xml_diff>
--- a/nl/docx/document-0.docx
+++ b/nl/docx/document-0.docx
@@ -7,7 +7,7 @@
         <w:spacing w:after="480"/>
         <w:jc w:val="center"/>
         <w:outlineLvl w:val="1"/>
-        <w:divId w:val="1423530983"/>
+        <w:divId w:val="896236938"/>
         <w:rPr>
           <w:rFonts w:ascii="Aptos Display" w:eastAsia="Times New Roman" w:hAnsi="Aptos Display"/>
           <w:b/>
@@ -36,7 +36,7 @@
     <w:p>
       <w:pPr>
         <w:pStyle w:val="ondertitel2"/>
-        <w:divId w:val="1423530983"/>
+        <w:divId w:val="896236938"/>
         <w:rPr>
           <w:lang w:val="nl-NL"/>
         </w:rPr>
@@ -51,7 +51,7 @@
     <w:p>
       <w:pPr>
         <w:pStyle w:val="documentaanduiding2"/>
-        <w:divId w:val="1423530983"/>
+        <w:divId w:val="896236938"/>
         <w:rPr>
           <w:lang w:val="nl-NL"/>
         </w:rPr>
@@ -66,7 +66,7 @@
     <w:p>
       <w:pPr>
         <w:pStyle w:val="auteur2"/>
-        <w:divId w:val="1423530983"/>
+        <w:divId w:val="896236938"/>
         <w:rPr>
           <w:lang w:val="nl-NL"/>
         </w:rPr>
@@ -81,23 +81,23 @@
     <w:p>
       <w:pPr>
         <w:pStyle w:val="meta-lijn2"/>
-        <w:divId w:val="1423530983"/>
-        <w:rPr>
-          <w:lang w:val="nl-NL"/>
-        </w:rPr>
-      </w:pPr>
-      <w:r>
-        <w:rPr>
-          <w:lang w:val="nl-NL"/>
-        </w:rPr>
-        <w:t>Versie bijgewerkt: 6 oktober 2026, 14:20</w:t>
+        <w:divId w:val="896236938"/>
+        <w:rPr>
+          <w:lang w:val="nl-NL"/>
+        </w:rPr>
+      </w:pPr>
+      <w:r>
+        <w:rPr>
+          <w:lang w:val="nl-NL"/>
+        </w:rPr>
+        <w:t>Versie bijgewerkt: 13 oktober 2026, 19:35</w:t>
       </w:r>
     </w:p>
     <w:p>
       <w:pPr>
         <w:pStyle w:val="marker"/>
         <w:ind w:left="800" w:right="800"/>
-        <w:divId w:val="511190921"/>
+        <w:divId w:val="584264109"/>
         <w:rPr>
           <w:lang w:val="nl-NL"/>
         </w:rPr>
@@ -110,13 +110,13 @@
       <w:pPr>
         <w:pStyle w:val="Kop2"/>
         <w:pageBreakBefore/>
-        <w:divId w:val="1614703469"/>
+        <w:divId w:val="849680067"/>
         <w:rPr>
           <w:rFonts w:eastAsia="Times New Roman"/>
           <w:lang w:val="nl-NL"/>
         </w:rPr>
       </w:pPr>
-      <w:bookmarkStart w:id="0" w:name="_Toc242188925"/>
+      <w:bookmarkStart w:id="0" w:name="_Toc242812624"/>
       <w:r>
         <w:rPr>
           <w:rFonts w:eastAsia="Times New Roman"/>
@@ -133,7 +133,7 @@
         <w:tabs>
           <w:tab w:val="right" w:leader="dot" w:pos="9062"/>
         </w:tabs>
-        <w:divId w:val="1614703469"/>
+        <w:divId w:val="849680067"/>
         <w:rPr>
           <w:rFonts w:asciiTheme="minorHAnsi" w:hAnsiTheme="minorHAnsi" w:cstheme="minorBidi"/>
           <w:noProof/>
@@ -184,7 +184,7 @@
         <w:rPr>
           <w:noProof/>
         </w:rPr>
-        <w:instrText xml:space="preserve"> PAGEREF _Toc242188925 \h </w:instrText>
+        <w:instrText xml:space="preserve"> PAGEREF _Toc242812624 \h </w:instrText>
       </w:r>
       <w:r>
         <w:rPr>
@@ -216,7 +216,7 @@
         <w:tabs>
           <w:tab w:val="right" w:leader="dot" w:pos="9062"/>
         </w:tabs>
-        <w:divId w:val="1614703469"/>
+        <w:divId w:val="849680067"/>
         <w:rPr>
           <w:rFonts w:asciiTheme="minorHAnsi" w:hAnsiTheme="minorHAnsi" w:cstheme="minorBidi"/>
           <w:noProof/>
@@ -249,7 +249,7 @@
         <w:rPr>
           <w:noProof/>
         </w:rPr>
-        <w:instrText xml:space="preserve"> PAGEREF _Toc242188926 \h </w:instrText>
+        <w:instrText xml:space="preserve"> PAGEREF _Toc242812625 \h </w:instrText>
       </w:r>
       <w:r>
         <w:rPr>
@@ -281,7 +281,7 @@
         <w:tabs>
           <w:tab w:val="right" w:leader="dot" w:pos="9062"/>
         </w:tabs>
-        <w:divId w:val="1614703469"/>
+        <w:divId w:val="849680067"/>
         <w:rPr>
           <w:rFonts w:asciiTheme="minorHAnsi" w:hAnsiTheme="minorHAnsi" w:cstheme="minorBidi"/>
           <w:noProof/>
@@ -314,7 +314,7 @@
         <w:rPr>
           <w:noProof/>
         </w:rPr>
-        <w:instrText xml:space="preserve"> PAGEREF _Toc242188927 \h </w:instrText>
+        <w:instrText xml:space="preserve"> PAGEREF _Toc242812626 \h </w:instrText>
       </w:r>
       <w:r>
         <w:rPr>
@@ -346,7 +346,7 @@
         <w:tabs>
           <w:tab w:val="right" w:leader="dot" w:pos="9062"/>
         </w:tabs>
-        <w:divId w:val="1614703469"/>
+        <w:divId w:val="849680067"/>
         <w:rPr>
           <w:rFonts w:asciiTheme="minorHAnsi" w:hAnsiTheme="minorHAnsi" w:cstheme="minorBidi"/>
           <w:noProof/>
@@ -379,7 +379,7 @@
         <w:rPr>
           <w:noProof/>
         </w:rPr>
-        <w:instrText xml:space="preserve"> PAGEREF _Toc242188928 \h </w:instrText>
+        <w:instrText xml:space="preserve"> PAGEREF _Toc242812627 \h </w:instrText>
       </w:r>
       <w:r>
         <w:rPr>
@@ -411,7 +411,7 @@
         <w:tabs>
           <w:tab w:val="right" w:leader="dot" w:pos="9062"/>
         </w:tabs>
-        <w:divId w:val="1614703469"/>
+        <w:divId w:val="849680067"/>
         <w:rPr>
           <w:rFonts w:asciiTheme="minorHAnsi" w:hAnsiTheme="minorHAnsi" w:cstheme="minorBidi"/>
           <w:noProof/>
@@ -444,7 +444,7 @@
         <w:rPr>
           <w:noProof/>
         </w:rPr>
-        <w:instrText xml:space="preserve"> PAGEREF _Toc242188929 \h </w:instrText>
+        <w:instrText xml:space="preserve"> PAGEREF _Toc242812628 \h </w:instrText>
       </w:r>
       <w:r>
         <w:rPr>
@@ -476,7 +476,7 @@
         <w:tabs>
           <w:tab w:val="right" w:leader="dot" w:pos="9062"/>
         </w:tabs>
-        <w:divId w:val="1614703469"/>
+        <w:divId w:val="849680067"/>
         <w:rPr>
           <w:rFonts w:asciiTheme="minorHAnsi" w:hAnsiTheme="minorHAnsi" w:cstheme="minorBidi"/>
           <w:noProof/>
@@ -509,7 +509,7 @@
         <w:rPr>
           <w:noProof/>
         </w:rPr>
-        <w:instrText xml:space="preserve"> PAGEREF _Toc242188930 \h </w:instrText>
+        <w:instrText xml:space="preserve"> PAGEREF _Toc242812629 \h </w:instrText>
       </w:r>
       <w:r>
         <w:rPr>
@@ -541,7 +541,7 @@
         <w:tabs>
           <w:tab w:val="right" w:leader="dot" w:pos="9062"/>
         </w:tabs>
-        <w:divId w:val="1614703469"/>
+        <w:divId w:val="849680067"/>
         <w:rPr>
           <w:rFonts w:asciiTheme="minorHAnsi" w:hAnsiTheme="minorHAnsi" w:cstheme="minorBidi"/>
           <w:noProof/>
@@ -574,7 +574,7 @@
         <w:rPr>
           <w:noProof/>
         </w:rPr>
-        <w:instrText xml:space="preserve"> PAGEREF _Toc242188931 \h </w:instrText>
+        <w:instrText xml:space="preserve"> PAGEREF _Toc242812630 \h </w:instrText>
       </w:r>
       <w:r>
         <w:rPr>
@@ -606,7 +606,7 @@
         <w:tabs>
           <w:tab w:val="right" w:leader="dot" w:pos="9062"/>
         </w:tabs>
-        <w:divId w:val="1614703469"/>
+        <w:divId w:val="849680067"/>
         <w:rPr>
           <w:rFonts w:asciiTheme="minorHAnsi" w:hAnsiTheme="minorHAnsi" w:cstheme="minorBidi"/>
           <w:noProof/>
@@ -639,7 +639,7 @@
         <w:rPr>
           <w:noProof/>
         </w:rPr>
-        <w:instrText xml:space="preserve"> PAGEREF _Toc242188932 \h </w:instrText>
+        <w:instrText xml:space="preserve"> PAGEREF _Toc242812631 \h </w:instrText>
       </w:r>
       <w:r>
         <w:rPr>
@@ -671,7 +671,7 @@
         <w:tabs>
           <w:tab w:val="right" w:leader="dot" w:pos="9062"/>
         </w:tabs>
-        <w:divId w:val="1614703469"/>
+        <w:divId w:val="849680067"/>
         <w:rPr>
           <w:rFonts w:asciiTheme="minorHAnsi" w:hAnsiTheme="minorHAnsi" w:cstheme="minorBidi"/>
           <w:noProof/>
@@ -704,7 +704,7 @@
         <w:rPr>
           <w:noProof/>
         </w:rPr>
-        <w:instrText xml:space="preserve"> PAGEREF _Toc242188933 \h </w:instrText>
+        <w:instrText xml:space="preserve"> PAGEREF _Toc242812632 \h </w:instrText>
       </w:r>
       <w:r>
         <w:rPr>
@@ -736,7 +736,7 @@
         <w:tabs>
           <w:tab w:val="right" w:leader="dot" w:pos="9062"/>
         </w:tabs>
-        <w:divId w:val="1614703469"/>
+        <w:divId w:val="849680067"/>
         <w:rPr>
           <w:rFonts w:asciiTheme="minorHAnsi" w:hAnsiTheme="minorHAnsi" w:cstheme="minorBidi"/>
           <w:noProof/>
@@ -769,7 +769,7 @@
         <w:rPr>
           <w:noProof/>
         </w:rPr>
-        <w:instrText xml:space="preserve"> PAGEREF _Toc242188934 \h </w:instrText>
+        <w:instrText xml:space="preserve"> PAGEREF _Toc242812633 \h </w:instrText>
       </w:r>
       <w:r>
         <w:rPr>
@@ -801,7 +801,7 @@
         <w:tabs>
           <w:tab w:val="right" w:leader="dot" w:pos="9062"/>
         </w:tabs>
-        <w:divId w:val="1614703469"/>
+        <w:divId w:val="849680067"/>
         <w:rPr>
           <w:rFonts w:asciiTheme="minorHAnsi" w:hAnsiTheme="minorHAnsi" w:cstheme="minorBidi"/>
           <w:noProof/>
@@ -834,7 +834,7 @@
         <w:rPr>
           <w:noProof/>
         </w:rPr>
-        <w:instrText xml:space="preserve"> PAGEREF _Toc242188935 \h </w:instrText>
+        <w:instrText xml:space="preserve"> PAGEREF _Toc242812634 \h </w:instrText>
       </w:r>
       <w:r>
         <w:rPr>
@@ -866,7 +866,7 @@
         <w:tabs>
           <w:tab w:val="right" w:leader="dot" w:pos="9062"/>
         </w:tabs>
-        <w:divId w:val="1614703469"/>
+        <w:divId w:val="849680067"/>
         <w:rPr>
           <w:rFonts w:asciiTheme="minorHAnsi" w:hAnsiTheme="minorHAnsi" w:cstheme="minorBidi"/>
           <w:noProof/>
@@ -899,7 +899,7 @@
         <w:rPr>
           <w:noProof/>
         </w:rPr>
-        <w:instrText xml:space="preserve"> PAGEREF _Toc242188936 \h </w:instrText>
+        <w:instrText xml:space="preserve"> PAGEREF _Toc242812635 \h </w:instrText>
       </w:r>
       <w:r>
         <w:rPr>
@@ -928,7 +928,7 @@
     <w:p>
       <w:pPr>
         <w:pStyle w:val="marker"/>
-        <w:divId w:val="1614703469"/>
+        <w:divId w:val="849680067"/>
         <w:rPr>
           <w:lang w:val="nl-NL"/>
         </w:rPr>
@@ -944,7 +944,7 @@
       <w:pPr>
         <w:pStyle w:val="marker"/>
         <w:ind w:left="800" w:right="800"/>
-        <w:divId w:val="511190921"/>
+        <w:divId w:val="584264109"/>
         <w:rPr>
           <w:lang w:val="nl-NL"/>
         </w:rPr>
@@ -956,13 +956,13 @@
     <w:p>
       <w:pPr>
         <w:pStyle w:val="Kop2"/>
-        <w:divId w:val="511190921"/>
+        <w:divId w:val="584264109"/>
         <w:rPr>
           <w:rFonts w:eastAsia="Times New Roman"/>
           <w:lang w:val="nl-NL"/>
         </w:rPr>
       </w:pPr>
-      <w:bookmarkStart w:id="1" w:name="_Toc242188926"/>
+      <w:bookmarkStart w:id="1" w:name="_Toc242812625"/>
       <w:r>
         <w:rPr>
           <w:rFonts w:eastAsia="Times New Roman"/>
@@ -975,7 +975,7 @@
     <w:p>
       <w:pPr>
         <w:pStyle w:val="Normaalweb"/>
-        <w:divId w:val="511190921"/>
+        <w:divId w:val="584264109"/>
         <w:rPr>
           <w:lang w:val="nl-NL"/>
         </w:rPr>
@@ -990,7 +990,7 @@
     <w:p>
       <w:pPr>
         <w:pStyle w:val="Normaalweb"/>
-        <w:divId w:val="511190921"/>
+        <w:divId w:val="584264109"/>
         <w:rPr>
           <w:lang w:val="nl-NL"/>
         </w:rPr>
@@ -1018,7 +1018,7 @@
     <w:p>
       <w:pPr>
         <w:pStyle w:val="Normaalweb"/>
-        <w:divId w:val="511190921"/>
+        <w:divId w:val="584264109"/>
         <w:rPr>
           <w:lang w:val="nl-NL"/>
         </w:rPr>
@@ -1039,7 +1039,7 @@
     <w:p>
       <w:pPr>
         <w:pStyle w:val="Normaalweb"/>
-        <w:divId w:val="511190921"/>
+        <w:divId w:val="584264109"/>
         <w:rPr>
           <w:lang w:val="nl-NL"/>
         </w:rPr>
@@ -1086,7 +1086,7 @@
     <w:p>
       <w:pPr>
         <w:pStyle w:val="Normaalweb"/>
-        <w:divId w:val="511190921"/>
+        <w:divId w:val="584264109"/>
         <w:rPr>
           <w:lang w:val="nl-NL"/>
         </w:rPr>
@@ -1114,7 +1114,7 @@
     <w:p>
       <w:pPr>
         <w:pStyle w:val="Normaalweb"/>
-        <w:divId w:val="511190921"/>
+        <w:divId w:val="584264109"/>
         <w:rPr>
           <w:lang w:val="nl-NL"/>
         </w:rPr>
@@ -1148,7 +1148,7 @@
     <w:p>
       <w:pPr>
         <w:pStyle w:val="Normaalweb"/>
-        <w:divId w:val="511190921"/>
+        <w:divId w:val="584264109"/>
         <w:rPr>
           <w:lang w:val="nl-NL"/>
         </w:rPr>
@@ -1175,7 +1175,7 @@
     <w:p>
       <w:pPr>
         <w:pStyle w:val="Normaalweb"/>
-        <w:divId w:val="511190921"/>
+        <w:divId w:val="584264109"/>
         <w:rPr>
           <w:lang w:val="nl-NL"/>
         </w:rPr>
@@ -1203,7 +1203,7 @@
     <w:p>
       <w:pPr>
         <w:pStyle w:val="Normaalweb"/>
-        <w:divId w:val="511190921"/>
+        <w:divId w:val="584264109"/>
         <w:rPr>
           <w:lang w:val="nl-NL"/>
         </w:rPr>
@@ -1218,7 +1218,7 @@
     <w:p>
       <w:pPr>
         <w:pStyle w:val="Normaalweb"/>
-        <w:divId w:val="511190921"/>
+        <w:divId w:val="584264109"/>
         <w:rPr>
           <w:lang w:val="nl-NL"/>
         </w:rPr>
@@ -1278,7 +1278,7 @@
     <w:p>
       <w:pPr>
         <w:pStyle w:val="Normaalweb"/>
-        <w:divId w:val="511190921"/>
+        <w:divId w:val="584264109"/>
         <w:rPr>
           <w:lang w:val="nl-NL"/>
         </w:rPr>
@@ -1293,7 +1293,7 @@
     <w:p>
       <w:pPr>
         <w:pStyle w:val="Normaalweb"/>
-        <w:divId w:val="511190921"/>
+        <w:divId w:val="584264109"/>
         <w:rPr>
           <w:lang w:val="nl-NL"/>
         </w:rPr>
@@ -1321,7 +1321,7 @@
     <w:p>
       <w:pPr>
         <w:pStyle w:val="Normaalweb"/>
-        <w:divId w:val="511190921"/>
+        <w:divId w:val="584264109"/>
         <w:rPr>
           <w:lang w:val="nl-NL"/>
         </w:rPr>
@@ -1336,7 +1336,7 @@
     <w:p>
       <w:pPr>
         <w:pStyle w:val="Normaalweb"/>
-        <w:divId w:val="511190921"/>
+        <w:divId w:val="584264109"/>
         <w:rPr>
           <w:lang w:val="nl-NL"/>
         </w:rPr>
@@ -1351,7 +1351,7 @@
     <w:p>
       <w:pPr>
         <w:pStyle w:val="Normaalweb"/>
-        <w:divId w:val="511190921"/>
+        <w:divId w:val="584264109"/>
         <w:rPr>
           <w:lang w:val="nl-NL"/>
         </w:rPr>
@@ -1366,7 +1366,7 @@
     <w:p>
       <w:pPr>
         <w:spacing w:before="300" w:after="200"/>
-        <w:divId w:val="511190921"/>
+        <w:divId w:val="584264109"/>
         <w:rPr>
           <w:rFonts w:eastAsia="Times New Roman"/>
           <w:lang w:val="nl-NL"/>
@@ -1377,14 +1377,14 @@
           <w:rFonts w:eastAsia="Times New Roman"/>
           <w:lang w:val="nl-NL"/>
         </w:rPr>
-        <w:pict w14:anchorId="6DF72933">
+        <w:pict w14:anchorId="7256836A">
           <v:rect id="_x0000_i1025" style="width:0;height:1.5pt" o:hralign="center" o:hrstd="t" o:hr="t" fillcolor="#a0a0a0" stroked="f"/>
         </w:pict>
       </w:r>
     </w:p>
     <w:p>
       <w:pPr>
-        <w:divId w:val="1464927376"/>
+        <w:divId w:val="1213618817"/>
         <w:rPr>
           <w:color w:val="555555"/>
           <w:sz w:val="20"/>
@@ -1423,7 +1423,7 @@
     </w:p>
     <w:p>
       <w:pPr>
-        <w:divId w:val="1464927376"/>
+        <w:divId w:val="1213618817"/>
         <w:rPr>
           <w:color w:val="555555"/>
           <w:sz w:val="20"/>
@@ -1463,7 +1463,7 @@
     </w:p>
     <w:p>
       <w:pPr>
-        <w:divId w:val="1464927376"/>
+        <w:divId w:val="1213618817"/>
         <w:rPr>
           <w:color w:val="555555"/>
           <w:sz w:val="20"/>
@@ -1493,7 +1493,7 @@
     </w:p>
     <w:p>
       <w:pPr>
-        <w:divId w:val="1464927376"/>
+        <w:divId w:val="1213618817"/>
         <w:rPr>
           <w:color w:val="555555"/>
           <w:sz w:val="20"/>
@@ -1525,7 +1525,7 @@
       <w:pPr>
         <w:pStyle w:val="marker"/>
         <w:ind w:left="800" w:right="800"/>
-        <w:divId w:val="511190921"/>
+        <w:divId w:val="584264109"/>
         <w:rPr>
           <w:lang w:val="nl-NL"/>
         </w:rPr>
@@ -1537,13 +1537,13 @@
     <w:p>
       <w:pPr>
         <w:pStyle w:val="Kop2"/>
-        <w:divId w:val="511190921"/>
+        <w:divId w:val="584264109"/>
         <w:rPr>
           <w:rFonts w:eastAsia="Times New Roman"/>
           <w:lang w:val="nl-NL"/>
         </w:rPr>
       </w:pPr>
-      <w:bookmarkStart w:id="2" w:name="_Toc242188927"/>
+      <w:bookmarkStart w:id="2" w:name="_Toc242812626"/>
       <w:r>
         <w:rPr>
           <w:rFonts w:eastAsia="Times New Roman"/>
@@ -1556,7 +1556,7 @@
     <w:p>
       <w:pPr>
         <w:pStyle w:val="Normaalweb"/>
-        <w:divId w:val="511190921"/>
+        <w:divId w:val="584264109"/>
         <w:rPr>
           <w:lang w:val="nl-NL"/>
         </w:rPr>
@@ -1571,7 +1571,7 @@
     <w:p>
       <w:pPr>
         <w:pStyle w:val="Normaalweb"/>
-        <w:divId w:val="511190921"/>
+        <w:divId w:val="584264109"/>
         <w:rPr>
           <w:lang w:val="nl-NL"/>
         </w:rPr>
@@ -1586,7 +1586,7 @@
     <w:p>
       <w:pPr>
         <w:pStyle w:val="Normaalweb"/>
-        <w:divId w:val="511190921"/>
+        <w:divId w:val="584264109"/>
         <w:rPr>
           <w:lang w:val="nl-NL"/>
         </w:rPr>
@@ -1601,13 +1601,13 @@
     <w:p>
       <w:pPr>
         <w:pStyle w:val="Kop2"/>
-        <w:divId w:val="511190921"/>
+        <w:divId w:val="584264109"/>
         <w:rPr>
           <w:rFonts w:eastAsia="Times New Roman"/>
           <w:lang w:val="nl-NL"/>
         </w:rPr>
       </w:pPr>
-      <w:bookmarkStart w:id="3" w:name="_Toc242188928"/>
+      <w:bookmarkStart w:id="3" w:name="_Toc242812627"/>
       <w:r>
         <w:rPr>
           <w:rFonts w:eastAsia="Times New Roman"/>
@@ -1620,7 +1620,7 @@
     <w:p>
       <w:pPr>
         <w:pStyle w:val="Normaalweb"/>
-        <w:divId w:val="511190921"/>
+        <w:divId w:val="584264109"/>
         <w:rPr>
           <w:lang w:val="nl-NL"/>
         </w:rPr>
@@ -1635,13 +1635,13 @@
     <w:p>
       <w:pPr>
         <w:pStyle w:val="Kop2"/>
-        <w:divId w:val="511190921"/>
+        <w:divId w:val="584264109"/>
         <w:rPr>
           <w:rFonts w:eastAsia="Times New Roman"/>
           <w:lang w:val="nl-NL"/>
         </w:rPr>
       </w:pPr>
-      <w:bookmarkStart w:id="4" w:name="_Toc242188929"/>
+      <w:bookmarkStart w:id="4" w:name="_Toc242812628"/>
       <w:r>
         <w:rPr>
           <w:rFonts w:eastAsia="Times New Roman"/>
@@ -1654,7 +1654,7 @@
     <w:p>
       <w:pPr>
         <w:pStyle w:val="Normaalweb"/>
-        <w:divId w:val="511190921"/>
+        <w:divId w:val="584264109"/>
         <w:rPr>
           <w:lang w:val="nl-NL"/>
         </w:rPr>
@@ -1669,13 +1669,13 @@
     <w:p>
       <w:pPr>
         <w:pStyle w:val="Kop3"/>
-        <w:divId w:val="511190921"/>
+        <w:divId w:val="584264109"/>
         <w:rPr>
           <w:rFonts w:eastAsia="Times New Roman"/>
           <w:lang w:val="nl-NL"/>
         </w:rPr>
       </w:pPr>
-      <w:bookmarkStart w:id="5" w:name="_Toc242188930"/>
+      <w:bookmarkStart w:id="5" w:name="_Toc242812629"/>
       <w:r>
         <w:rPr>
           <w:rFonts w:eastAsia="Times New Roman"/>
@@ -1688,7 +1688,7 @@
     <w:p>
       <w:pPr>
         <w:pStyle w:val="Normaalweb"/>
-        <w:divId w:val="511190921"/>
+        <w:divId w:val="584264109"/>
         <w:rPr>
           <w:lang w:val="nl-NL"/>
         </w:rPr>
@@ -1703,13 +1703,13 @@
     <w:p>
       <w:pPr>
         <w:pStyle w:val="Kop3"/>
-        <w:divId w:val="511190921"/>
+        <w:divId w:val="584264109"/>
         <w:rPr>
           <w:rFonts w:eastAsia="Times New Roman"/>
           <w:lang w:val="nl-NL"/>
         </w:rPr>
       </w:pPr>
-      <w:bookmarkStart w:id="6" w:name="_Toc242188931"/>
+      <w:bookmarkStart w:id="6" w:name="_Toc242812630"/>
       <w:r>
         <w:rPr>
           <w:rFonts w:eastAsia="Times New Roman"/>
@@ -1722,7 +1722,7 @@
     <w:p>
       <w:pPr>
         <w:pStyle w:val="Normaalweb"/>
-        <w:divId w:val="511190921"/>
+        <w:divId w:val="584264109"/>
         <w:rPr>
           <w:lang w:val="nl-NL"/>
         </w:rPr>
@@ -1737,13 +1737,13 @@
     <w:p>
       <w:pPr>
         <w:pStyle w:val="Kop3"/>
-        <w:divId w:val="511190921"/>
+        <w:divId w:val="584264109"/>
         <w:rPr>
           <w:rFonts w:eastAsia="Times New Roman"/>
           <w:lang w:val="nl-NL"/>
         </w:rPr>
       </w:pPr>
-      <w:bookmarkStart w:id="7" w:name="_Toc242188932"/>
+      <w:bookmarkStart w:id="7" w:name="_Toc242812631"/>
       <w:r>
         <w:rPr>
           <w:rFonts w:eastAsia="Times New Roman"/>
@@ -1756,7 +1756,7 @@
     <w:p>
       <w:pPr>
         <w:pStyle w:val="Normaalweb"/>
-        <w:divId w:val="511190921"/>
+        <w:divId w:val="584264109"/>
         <w:rPr>
           <w:lang w:val="nl-NL"/>
         </w:rPr>
@@ -1771,13 +1771,13 @@
     <w:p>
       <w:pPr>
         <w:pStyle w:val="Kop3"/>
-        <w:divId w:val="511190921"/>
+        <w:divId w:val="584264109"/>
         <w:rPr>
           <w:rFonts w:eastAsia="Times New Roman"/>
           <w:lang w:val="nl-NL"/>
         </w:rPr>
       </w:pPr>
-      <w:bookmarkStart w:id="8" w:name="_Toc242188933"/>
+      <w:bookmarkStart w:id="8" w:name="_Toc242812632"/>
       <w:r>
         <w:rPr>
           <w:rFonts w:eastAsia="Times New Roman"/>
@@ -1790,7 +1790,7 @@
     <w:p>
       <w:pPr>
         <w:pStyle w:val="Normaalweb"/>
-        <w:divId w:val="511190921"/>
+        <w:divId w:val="584264109"/>
         <w:rPr>
           <w:lang w:val="nl-NL"/>
         </w:rPr>
@@ -1806,13 +1806,13 @@
     <w:p>
       <w:pPr>
         <w:pStyle w:val="Kop2"/>
-        <w:divId w:val="511190921"/>
+        <w:divId w:val="584264109"/>
         <w:rPr>
           <w:rFonts w:eastAsia="Times New Roman"/>
           <w:lang w:val="nl-NL"/>
         </w:rPr>
       </w:pPr>
-      <w:bookmarkStart w:id="9" w:name="_Toc242188934"/>
+      <w:bookmarkStart w:id="9" w:name="_Toc242812633"/>
       <w:r>
         <w:rPr>
           <w:rFonts w:eastAsia="Times New Roman"/>
@@ -1825,7 +1825,7 @@
     <w:p>
       <w:pPr>
         <w:pStyle w:val="Normaalweb"/>
-        <w:divId w:val="511190921"/>
+        <w:divId w:val="584264109"/>
         <w:rPr>
           <w:lang w:val="nl-NL"/>
         </w:rPr>
@@ -1840,7 +1840,7 @@
     <w:p>
       <w:pPr>
         <w:pStyle w:val="Normaalweb"/>
-        <w:divId w:val="511190921"/>
+        <w:divId w:val="584264109"/>
         <w:rPr>
           <w:lang w:val="nl-NL"/>
         </w:rPr>
@@ -1855,7 +1855,7 @@
     <w:p>
       <w:pPr>
         <w:pStyle w:val="Normaalweb"/>
-        <w:divId w:val="511190921"/>
+        <w:divId w:val="584264109"/>
         <w:rPr>
           <w:lang w:val="nl-NL"/>
         </w:rPr>
@@ -1870,13 +1870,13 @@
     <w:p>
       <w:pPr>
         <w:pStyle w:val="Kop2"/>
-        <w:divId w:val="511190921"/>
+        <w:divId w:val="584264109"/>
         <w:rPr>
           <w:rFonts w:eastAsia="Times New Roman"/>
           <w:lang w:val="nl-NL"/>
         </w:rPr>
       </w:pPr>
-      <w:bookmarkStart w:id="10" w:name="_Toc242188935"/>
+      <w:bookmarkStart w:id="10" w:name="_Toc242812634"/>
       <w:r>
         <w:rPr>
           <w:rFonts w:eastAsia="Times New Roman"/>
@@ -1889,7 +1889,7 @@
     <w:p>
       <w:pPr>
         <w:pStyle w:val="Normaalweb"/>
-        <w:divId w:val="511190921"/>
+        <w:divId w:val="584264109"/>
         <w:rPr>
           <w:lang w:val="nl-NL"/>
         </w:rPr>
@@ -1904,7 +1904,7 @@
     <w:p>
       <w:pPr>
         <w:pStyle w:val="Normaalweb"/>
-        <w:divId w:val="511190921"/>
+        <w:divId w:val="584264109"/>
         <w:rPr>
           <w:lang w:val="nl-NL"/>
         </w:rPr>
@@ -1919,13 +1919,13 @@
     <w:p>
       <w:pPr>
         <w:pStyle w:val="Kop2"/>
-        <w:divId w:val="511190921"/>
+        <w:divId w:val="584264109"/>
         <w:rPr>
           <w:rFonts w:eastAsia="Times New Roman"/>
           <w:lang w:val="nl-NL"/>
         </w:rPr>
       </w:pPr>
-      <w:bookmarkStart w:id="11" w:name="_Toc242188936"/>
+      <w:bookmarkStart w:id="11" w:name="_Toc242812635"/>
       <w:r>
         <w:rPr>
           <w:rFonts w:eastAsia="Times New Roman"/>
@@ -1938,7 +1938,7 @@
     <w:p>
       <w:pPr>
         <w:pStyle w:val="Normaalweb"/>
-        <w:divId w:val="511190921"/>
+        <w:divId w:val="584264109"/>
         <w:rPr>
           <w:lang w:val="nl-NL"/>
         </w:rPr>
@@ -1953,7 +1953,7 @@
     <w:p>
       <w:pPr>
         <w:pStyle w:val="Normaalweb"/>
-        <w:divId w:val="511190921"/>
+        <w:divId w:val="584264109"/>
         <w:rPr>
           <w:lang w:val="nl-NL"/>
         </w:rPr>
@@ -1968,7 +1968,7 @@
     <w:p>
       <w:pPr>
         <w:shd w:val="clear" w:color="auto" w:fill="FFFFFF"/>
-        <w:divId w:val="542208636"/>
+        <w:divId w:val="1002313747"/>
         <w:rPr>
           <w:szCs w:val="22"/>
           <w:lang w:val="nl-NL"/>
@@ -2144,7 +2144,7 @@
         <w:color w:val="808080"/>
         <w:sz w:val="18"/>
       </w:rPr>
-      <w:t>2</w:t>
+      <w:t>3</w:t>
     </w:r>
     <w:r>
       <w:rPr>
@@ -2236,7 +2236,7 @@
         <w:sz w:val="18"/>
       </w:rPr>
       <w:tab/>
-      <w:t>Laatst gewijzigd: 6 oktober 2026, 14:20</w:t>
+      <w:t>Laatst gewijzigd: 13 oktober 2026, 19:35</w:t>
     </w:r>
   </w:p>
 </w:hdr>
@@ -3040,6 +3040,73 @@
       <w:color w:val="555555"/>
     </w:rPr>
   </w:style>
+  <w:style w:type="paragraph" w:customStyle="1" w:styleId="richting">
+    <w:name w:val="richting"/>
+    <w:basedOn w:val="Standaard"/>
+    <w:pPr>
+      <w:spacing w:before="100" w:beforeAutospacing="1" w:after="100" w:afterAutospacing="1"/>
+      <w:ind w:right="60"/>
+    </w:pPr>
+    <w:rPr>
+      <w:b/>
+      <w:bCs/>
+      <w:spacing w:val="8"/>
+      <w:sz w:val="20"/>
+      <w:szCs w:val="20"/>
+    </w:rPr>
+  </w:style>
+  <w:style w:type="paragraph" w:customStyle="1" w:styleId="richting-ontvangen">
+    <w:name w:val="richting-ontvangen"/>
+    <w:basedOn w:val="Standaard"/>
+    <w:pPr>
+      <w:spacing w:before="100" w:beforeAutospacing="1" w:after="100" w:afterAutospacing="1"/>
+    </w:pPr>
+    <w:rPr>
+      <w:color w:val="1A3C6E"/>
+    </w:rPr>
+  </w:style>
+  <w:style w:type="paragraph" w:customStyle="1" w:styleId="richting-verzonden">
+    <w:name w:val="richting-verzonden"/>
+    <w:basedOn w:val="Standaard"/>
+    <w:pPr>
+      <w:spacing w:before="100" w:beforeAutospacing="1" w:after="100" w:afterAutospacing="1"/>
+    </w:pPr>
+    <w:rPr>
+      <w:color w:val="8B1E1E"/>
+    </w:rPr>
+  </w:style>
+  <w:style w:type="paragraph" w:customStyle="1" w:styleId="oorsprong">
+    <w:name w:val="oorsprong"/>
+    <w:basedOn w:val="Standaard"/>
+    <w:pPr>
+      <w:spacing w:before="100" w:beforeAutospacing="1" w:after="100" w:afterAutospacing="1"/>
+    </w:pPr>
+    <w:rPr>
+      <w:i/>
+      <w:iCs/>
+      <w:color w:val="555555"/>
+      <w:sz w:val="21"/>
+      <w:szCs w:val="21"/>
+    </w:rPr>
+  </w:style>
+  <w:style w:type="paragraph" w:customStyle="1" w:styleId="technisch-notice">
+    <w:name w:val="technisch-notice"/>
+    <w:basedOn w:val="Standaard"/>
+    <w:pPr>
+      <w:pBdr>
+        <w:left w:val="single" w:sz="36" w:space="14" w:color="D5D0C5"/>
+      </w:pBdr>
+      <w:shd w:val="clear" w:color="auto" w:fill="F7F5F1"/>
+      <w:spacing w:before="240" w:after="400"/>
+    </w:pPr>
+    <w:rPr>
+      <w:i/>
+      <w:iCs/>
+      <w:color w:val="555555"/>
+      <w:sz w:val="21"/>
+      <w:szCs w:val="21"/>
+    </w:rPr>
+  </w:style>
   <w:style w:type="paragraph" w:customStyle="1" w:styleId="figure">
     <w:name w:val="figure"/>
     <w:basedOn w:val="Standaard"/>
@@ -3536,7 +3603,7 @@
     <w:link w:val="KoptekstChar"/>
     <w:uiPriority w:val="99"/>
     <w:unhideWhenUsed/>
-    <w:rsid w:val="005164B0"/>
+    <w:rsid w:val="00E57A46"/>
     <w:pPr>
       <w:tabs>
         <w:tab w:val="center" w:pos="4536"/>
@@ -3549,7 +3616,7 @@
     <w:basedOn w:val="Standaardalinea-lettertype"/>
     <w:link w:val="Koptekst"/>
     <w:uiPriority w:val="99"/>
-    <w:rsid w:val="005164B0"/>
+    <w:rsid w:val="00E57A46"/>
     <w:rPr>
       <w:rFonts w:eastAsiaTheme="minorEastAsia"/>
       <w:sz w:val="24"/>
@@ -3562,7 +3629,7 @@
     <w:link w:val="VoettekstChar"/>
     <w:uiPriority w:val="99"/>
     <w:unhideWhenUsed/>
-    <w:rsid w:val="005164B0"/>
+    <w:rsid w:val="00E57A46"/>
     <w:pPr>
       <w:tabs>
         <w:tab w:val="center" w:pos="4536"/>
@@ -3575,7 +3642,7 @@
     <w:basedOn w:val="Standaardalinea-lettertype"/>
     <w:link w:val="Voettekst"/>
     <w:uiPriority w:val="99"/>
-    <w:rsid w:val="005164B0"/>
+    <w:rsid w:val="00E57A46"/>
     <w:rPr>
       <w:rFonts w:eastAsiaTheme="minorEastAsia"/>
       <w:sz w:val="24"/>
@@ -3589,7 +3656,7 @@
     <w:autoRedefine/>
     <w:uiPriority w:val="39"/>
     <w:unhideWhenUsed/>
-    <w:rsid w:val="005164B0"/>
+    <w:rsid w:val="00E57A46"/>
     <w:pPr>
       <w:spacing w:after="100"/>
       <w:ind w:left="220"/>
@@ -3602,7 +3669,7 @@
     <w:autoRedefine/>
     <w:uiPriority w:val="39"/>
     <w:unhideWhenUsed/>
-    <w:rsid w:val="005164B0"/>
+    <w:rsid w:val="00E57A46"/>
     <w:pPr>
       <w:spacing w:after="100"/>
       <w:ind w:left="440"/>

</xml_diff>

<commit_message>
Update Systeem-Audit NL 13-10-2026 19:50
</commit_message>
<xml_diff>
--- a/nl/docx/document-0.docx
+++ b/nl/docx/document-0.docx
@@ -7,7 +7,7 @@
         <w:spacing w:after="480"/>
         <w:jc w:val="center"/>
         <w:outlineLvl w:val="1"/>
-        <w:divId w:val="896236938"/>
+        <w:divId w:val="2042314064"/>
         <w:rPr>
           <w:rFonts w:ascii="Aptos Display" w:eastAsia="Times New Roman" w:hAnsi="Aptos Display"/>
           <w:b/>
@@ -36,7 +36,7 @@
     <w:p>
       <w:pPr>
         <w:pStyle w:val="ondertitel2"/>
-        <w:divId w:val="896236938"/>
+        <w:divId w:val="2042314064"/>
         <w:rPr>
           <w:lang w:val="nl-NL"/>
         </w:rPr>
@@ -51,7 +51,7 @@
     <w:p>
       <w:pPr>
         <w:pStyle w:val="documentaanduiding2"/>
-        <w:divId w:val="896236938"/>
+        <w:divId w:val="2042314064"/>
         <w:rPr>
           <w:lang w:val="nl-NL"/>
         </w:rPr>
@@ -66,7 +66,7 @@
     <w:p>
       <w:pPr>
         <w:pStyle w:val="auteur2"/>
-        <w:divId w:val="896236938"/>
+        <w:divId w:val="2042314064"/>
         <w:rPr>
           <w:lang w:val="nl-NL"/>
         </w:rPr>
@@ -81,23 +81,23 @@
     <w:p>
       <w:pPr>
         <w:pStyle w:val="meta-lijn2"/>
-        <w:divId w:val="896236938"/>
-        <w:rPr>
-          <w:lang w:val="nl-NL"/>
-        </w:rPr>
-      </w:pPr>
-      <w:r>
-        <w:rPr>
-          <w:lang w:val="nl-NL"/>
-        </w:rPr>
-        <w:t>Versie bijgewerkt: 13 oktober 2026, 19:35</w:t>
+        <w:divId w:val="2042314064"/>
+        <w:rPr>
+          <w:lang w:val="nl-NL"/>
+        </w:rPr>
+      </w:pPr>
+      <w:r>
+        <w:rPr>
+          <w:lang w:val="nl-NL"/>
+        </w:rPr>
+        <w:t>Versie bijgewerkt: 13 oktober 2026, 19:50</w:t>
       </w:r>
     </w:p>
     <w:p>
       <w:pPr>
         <w:pStyle w:val="marker"/>
         <w:ind w:left="800" w:right="800"/>
-        <w:divId w:val="584264109"/>
+        <w:divId w:val="664822662"/>
         <w:rPr>
           <w:lang w:val="nl-NL"/>
         </w:rPr>
@@ -110,13 +110,13 @@
       <w:pPr>
         <w:pStyle w:val="Kop2"/>
         <w:pageBreakBefore/>
-        <w:divId w:val="849680067"/>
+        <w:divId w:val="1167211462"/>
         <w:rPr>
           <w:rFonts w:eastAsia="Times New Roman"/>
           <w:lang w:val="nl-NL"/>
         </w:rPr>
       </w:pPr>
-      <w:bookmarkStart w:id="0" w:name="_Toc242812624"/>
+      <w:bookmarkStart w:id="0" w:name="_Toc242813523"/>
       <w:r>
         <w:rPr>
           <w:rFonts w:eastAsia="Times New Roman"/>
@@ -133,7 +133,7 @@
         <w:tabs>
           <w:tab w:val="right" w:leader="dot" w:pos="9062"/>
         </w:tabs>
-        <w:divId w:val="849680067"/>
+        <w:divId w:val="1167211462"/>
         <w:rPr>
           <w:rFonts w:asciiTheme="minorHAnsi" w:hAnsiTheme="minorHAnsi" w:cstheme="minorBidi"/>
           <w:noProof/>
@@ -184,7 +184,7 @@
         <w:rPr>
           <w:noProof/>
         </w:rPr>
-        <w:instrText xml:space="preserve"> PAGEREF _Toc242812624 \h </w:instrText>
+        <w:instrText xml:space="preserve"> PAGEREF _Toc242813523 \h </w:instrText>
       </w:r>
       <w:r>
         <w:rPr>
@@ -216,7 +216,7 @@
         <w:tabs>
           <w:tab w:val="right" w:leader="dot" w:pos="9062"/>
         </w:tabs>
-        <w:divId w:val="849680067"/>
+        <w:divId w:val="1167211462"/>
         <w:rPr>
           <w:rFonts w:asciiTheme="minorHAnsi" w:hAnsiTheme="minorHAnsi" w:cstheme="minorBidi"/>
           <w:noProof/>
@@ -249,7 +249,7 @@
         <w:rPr>
           <w:noProof/>
         </w:rPr>
-        <w:instrText xml:space="preserve"> PAGEREF _Toc242812625 \h </w:instrText>
+        <w:instrText xml:space="preserve"> PAGEREF _Toc242813524 \h </w:instrText>
       </w:r>
       <w:r>
         <w:rPr>
@@ -281,7 +281,7 @@
         <w:tabs>
           <w:tab w:val="right" w:leader="dot" w:pos="9062"/>
         </w:tabs>
-        <w:divId w:val="849680067"/>
+        <w:divId w:val="1167211462"/>
         <w:rPr>
           <w:rFonts w:asciiTheme="minorHAnsi" w:hAnsiTheme="minorHAnsi" w:cstheme="minorBidi"/>
           <w:noProof/>
@@ -314,7 +314,7 @@
         <w:rPr>
           <w:noProof/>
         </w:rPr>
-        <w:instrText xml:space="preserve"> PAGEREF _Toc242812626 \h </w:instrText>
+        <w:instrText xml:space="preserve"> PAGEREF _Toc242813525 \h </w:instrText>
       </w:r>
       <w:r>
         <w:rPr>
@@ -346,7 +346,7 @@
         <w:tabs>
           <w:tab w:val="right" w:leader="dot" w:pos="9062"/>
         </w:tabs>
-        <w:divId w:val="849680067"/>
+        <w:divId w:val="1167211462"/>
         <w:rPr>
           <w:rFonts w:asciiTheme="minorHAnsi" w:hAnsiTheme="minorHAnsi" w:cstheme="minorBidi"/>
           <w:noProof/>
@@ -379,7 +379,7 @@
         <w:rPr>
           <w:noProof/>
         </w:rPr>
-        <w:instrText xml:space="preserve"> PAGEREF _Toc242812627 \h </w:instrText>
+        <w:instrText xml:space="preserve"> PAGEREF _Toc242813526 \h </w:instrText>
       </w:r>
       <w:r>
         <w:rPr>
@@ -411,7 +411,7 @@
         <w:tabs>
           <w:tab w:val="right" w:leader="dot" w:pos="9062"/>
         </w:tabs>
-        <w:divId w:val="849680067"/>
+        <w:divId w:val="1167211462"/>
         <w:rPr>
           <w:rFonts w:asciiTheme="minorHAnsi" w:hAnsiTheme="minorHAnsi" w:cstheme="minorBidi"/>
           <w:noProof/>
@@ -444,7 +444,7 @@
         <w:rPr>
           <w:noProof/>
         </w:rPr>
-        <w:instrText xml:space="preserve"> PAGEREF _Toc242812628 \h </w:instrText>
+        <w:instrText xml:space="preserve"> PAGEREF _Toc242813527 \h </w:instrText>
       </w:r>
       <w:r>
         <w:rPr>
@@ -476,7 +476,7 @@
         <w:tabs>
           <w:tab w:val="right" w:leader="dot" w:pos="9062"/>
         </w:tabs>
-        <w:divId w:val="849680067"/>
+        <w:divId w:val="1167211462"/>
         <w:rPr>
           <w:rFonts w:asciiTheme="minorHAnsi" w:hAnsiTheme="minorHAnsi" w:cstheme="minorBidi"/>
           <w:noProof/>
@@ -509,7 +509,7 @@
         <w:rPr>
           <w:noProof/>
         </w:rPr>
-        <w:instrText xml:space="preserve"> PAGEREF _Toc242812629 \h </w:instrText>
+        <w:instrText xml:space="preserve"> PAGEREF _Toc242813528 \h </w:instrText>
       </w:r>
       <w:r>
         <w:rPr>
@@ -541,7 +541,7 @@
         <w:tabs>
           <w:tab w:val="right" w:leader="dot" w:pos="9062"/>
         </w:tabs>
-        <w:divId w:val="849680067"/>
+        <w:divId w:val="1167211462"/>
         <w:rPr>
           <w:rFonts w:asciiTheme="minorHAnsi" w:hAnsiTheme="minorHAnsi" w:cstheme="minorBidi"/>
           <w:noProof/>
@@ -574,7 +574,7 @@
         <w:rPr>
           <w:noProof/>
         </w:rPr>
-        <w:instrText xml:space="preserve"> PAGEREF _Toc242812630 \h </w:instrText>
+        <w:instrText xml:space="preserve"> PAGEREF _Toc242813529 \h </w:instrText>
       </w:r>
       <w:r>
         <w:rPr>
@@ -606,7 +606,7 @@
         <w:tabs>
           <w:tab w:val="right" w:leader="dot" w:pos="9062"/>
         </w:tabs>
-        <w:divId w:val="849680067"/>
+        <w:divId w:val="1167211462"/>
         <w:rPr>
           <w:rFonts w:asciiTheme="minorHAnsi" w:hAnsiTheme="minorHAnsi" w:cstheme="minorBidi"/>
           <w:noProof/>
@@ -639,7 +639,7 @@
         <w:rPr>
           <w:noProof/>
         </w:rPr>
-        <w:instrText xml:space="preserve"> PAGEREF _Toc242812631 \h </w:instrText>
+        <w:instrText xml:space="preserve"> PAGEREF _Toc242813530 \h </w:instrText>
       </w:r>
       <w:r>
         <w:rPr>
@@ -671,7 +671,7 @@
         <w:tabs>
           <w:tab w:val="right" w:leader="dot" w:pos="9062"/>
         </w:tabs>
-        <w:divId w:val="849680067"/>
+        <w:divId w:val="1167211462"/>
         <w:rPr>
           <w:rFonts w:asciiTheme="minorHAnsi" w:hAnsiTheme="minorHAnsi" w:cstheme="minorBidi"/>
           <w:noProof/>
@@ -704,7 +704,7 @@
         <w:rPr>
           <w:noProof/>
         </w:rPr>
-        <w:instrText xml:space="preserve"> PAGEREF _Toc242812632 \h </w:instrText>
+        <w:instrText xml:space="preserve"> PAGEREF _Toc242813531 \h </w:instrText>
       </w:r>
       <w:r>
         <w:rPr>
@@ -736,7 +736,7 @@
         <w:tabs>
           <w:tab w:val="right" w:leader="dot" w:pos="9062"/>
         </w:tabs>
-        <w:divId w:val="849680067"/>
+        <w:divId w:val="1167211462"/>
         <w:rPr>
           <w:rFonts w:asciiTheme="minorHAnsi" w:hAnsiTheme="minorHAnsi" w:cstheme="minorBidi"/>
           <w:noProof/>
@@ -769,7 +769,7 @@
         <w:rPr>
           <w:noProof/>
         </w:rPr>
-        <w:instrText xml:space="preserve"> PAGEREF _Toc242812633 \h </w:instrText>
+        <w:instrText xml:space="preserve"> PAGEREF _Toc242813532 \h </w:instrText>
       </w:r>
       <w:r>
         <w:rPr>
@@ -801,7 +801,7 @@
         <w:tabs>
           <w:tab w:val="right" w:leader="dot" w:pos="9062"/>
         </w:tabs>
-        <w:divId w:val="849680067"/>
+        <w:divId w:val="1167211462"/>
         <w:rPr>
           <w:rFonts w:asciiTheme="minorHAnsi" w:hAnsiTheme="minorHAnsi" w:cstheme="minorBidi"/>
           <w:noProof/>
@@ -834,7 +834,7 @@
         <w:rPr>
           <w:noProof/>
         </w:rPr>
-        <w:instrText xml:space="preserve"> PAGEREF _Toc242812634 \h </w:instrText>
+        <w:instrText xml:space="preserve"> PAGEREF _Toc242813533 \h </w:instrText>
       </w:r>
       <w:r>
         <w:rPr>
@@ -866,7 +866,7 @@
         <w:tabs>
           <w:tab w:val="right" w:leader="dot" w:pos="9062"/>
         </w:tabs>
-        <w:divId w:val="849680067"/>
+        <w:divId w:val="1167211462"/>
         <w:rPr>
           <w:rFonts w:asciiTheme="minorHAnsi" w:hAnsiTheme="minorHAnsi" w:cstheme="minorBidi"/>
           <w:noProof/>
@@ -899,7 +899,7 @@
         <w:rPr>
           <w:noProof/>
         </w:rPr>
-        <w:instrText xml:space="preserve"> PAGEREF _Toc242812635 \h </w:instrText>
+        <w:instrText xml:space="preserve"> PAGEREF _Toc242813534 \h </w:instrText>
       </w:r>
       <w:r>
         <w:rPr>
@@ -928,7 +928,7 @@
     <w:p>
       <w:pPr>
         <w:pStyle w:val="marker"/>
-        <w:divId w:val="849680067"/>
+        <w:divId w:val="1167211462"/>
         <w:rPr>
           <w:lang w:val="nl-NL"/>
         </w:rPr>
@@ -944,7 +944,7 @@
       <w:pPr>
         <w:pStyle w:val="marker"/>
         <w:ind w:left="800" w:right="800"/>
-        <w:divId w:val="584264109"/>
+        <w:divId w:val="664822662"/>
         <w:rPr>
           <w:lang w:val="nl-NL"/>
         </w:rPr>
@@ -956,13 +956,13 @@
     <w:p>
       <w:pPr>
         <w:pStyle w:val="Kop2"/>
-        <w:divId w:val="584264109"/>
+        <w:divId w:val="664822662"/>
         <w:rPr>
           <w:rFonts w:eastAsia="Times New Roman"/>
           <w:lang w:val="nl-NL"/>
         </w:rPr>
       </w:pPr>
-      <w:bookmarkStart w:id="1" w:name="_Toc242812625"/>
+      <w:bookmarkStart w:id="1" w:name="_Toc242813524"/>
       <w:r>
         <w:rPr>
           <w:rFonts w:eastAsia="Times New Roman"/>
@@ -975,7 +975,7 @@
     <w:p>
       <w:pPr>
         <w:pStyle w:val="Normaalweb"/>
-        <w:divId w:val="584264109"/>
+        <w:divId w:val="664822662"/>
         <w:rPr>
           <w:lang w:val="nl-NL"/>
         </w:rPr>
@@ -990,7 +990,7 @@
     <w:p>
       <w:pPr>
         <w:pStyle w:val="Normaalweb"/>
-        <w:divId w:val="584264109"/>
+        <w:divId w:val="664822662"/>
         <w:rPr>
           <w:lang w:val="nl-NL"/>
         </w:rPr>
@@ -1018,7 +1018,7 @@
     <w:p>
       <w:pPr>
         <w:pStyle w:val="Normaalweb"/>
-        <w:divId w:val="584264109"/>
+        <w:divId w:val="664822662"/>
         <w:rPr>
           <w:lang w:val="nl-NL"/>
         </w:rPr>
@@ -1039,7 +1039,7 @@
     <w:p>
       <w:pPr>
         <w:pStyle w:val="Normaalweb"/>
-        <w:divId w:val="584264109"/>
+        <w:divId w:val="664822662"/>
         <w:rPr>
           <w:lang w:val="nl-NL"/>
         </w:rPr>
@@ -1086,7 +1086,7 @@
     <w:p>
       <w:pPr>
         <w:pStyle w:val="Normaalweb"/>
-        <w:divId w:val="584264109"/>
+        <w:divId w:val="664822662"/>
         <w:rPr>
           <w:lang w:val="nl-NL"/>
         </w:rPr>
@@ -1114,7 +1114,7 @@
     <w:p>
       <w:pPr>
         <w:pStyle w:val="Normaalweb"/>
-        <w:divId w:val="584264109"/>
+        <w:divId w:val="664822662"/>
         <w:rPr>
           <w:lang w:val="nl-NL"/>
         </w:rPr>
@@ -1148,7 +1148,7 @@
     <w:p>
       <w:pPr>
         <w:pStyle w:val="Normaalweb"/>
-        <w:divId w:val="584264109"/>
+        <w:divId w:val="664822662"/>
         <w:rPr>
           <w:lang w:val="nl-NL"/>
         </w:rPr>
@@ -1175,7 +1175,7 @@
     <w:p>
       <w:pPr>
         <w:pStyle w:val="Normaalweb"/>
-        <w:divId w:val="584264109"/>
+        <w:divId w:val="664822662"/>
         <w:rPr>
           <w:lang w:val="nl-NL"/>
         </w:rPr>
@@ -1203,7 +1203,7 @@
     <w:p>
       <w:pPr>
         <w:pStyle w:val="Normaalweb"/>
-        <w:divId w:val="584264109"/>
+        <w:divId w:val="664822662"/>
         <w:rPr>
           <w:lang w:val="nl-NL"/>
         </w:rPr>
@@ -1218,7 +1218,7 @@
     <w:p>
       <w:pPr>
         <w:pStyle w:val="Normaalweb"/>
-        <w:divId w:val="584264109"/>
+        <w:divId w:val="664822662"/>
         <w:rPr>
           <w:lang w:val="nl-NL"/>
         </w:rPr>
@@ -1278,7 +1278,7 @@
     <w:p>
       <w:pPr>
         <w:pStyle w:val="Normaalweb"/>
-        <w:divId w:val="584264109"/>
+        <w:divId w:val="664822662"/>
         <w:rPr>
           <w:lang w:val="nl-NL"/>
         </w:rPr>
@@ -1293,7 +1293,7 @@
     <w:p>
       <w:pPr>
         <w:pStyle w:val="Normaalweb"/>
-        <w:divId w:val="584264109"/>
+        <w:divId w:val="664822662"/>
         <w:rPr>
           <w:lang w:val="nl-NL"/>
         </w:rPr>
@@ -1321,7 +1321,7 @@
     <w:p>
       <w:pPr>
         <w:pStyle w:val="Normaalweb"/>
-        <w:divId w:val="584264109"/>
+        <w:divId w:val="664822662"/>
         <w:rPr>
           <w:lang w:val="nl-NL"/>
         </w:rPr>
@@ -1336,7 +1336,7 @@
     <w:p>
       <w:pPr>
         <w:pStyle w:val="Normaalweb"/>
-        <w:divId w:val="584264109"/>
+        <w:divId w:val="664822662"/>
         <w:rPr>
           <w:lang w:val="nl-NL"/>
         </w:rPr>
@@ -1351,7 +1351,7 @@
     <w:p>
       <w:pPr>
         <w:pStyle w:val="Normaalweb"/>
-        <w:divId w:val="584264109"/>
+        <w:divId w:val="664822662"/>
         <w:rPr>
           <w:lang w:val="nl-NL"/>
         </w:rPr>
@@ -1366,7 +1366,7 @@
     <w:p>
       <w:pPr>
         <w:spacing w:before="300" w:after="200"/>
-        <w:divId w:val="584264109"/>
+        <w:divId w:val="664822662"/>
         <w:rPr>
           <w:rFonts w:eastAsia="Times New Roman"/>
           <w:lang w:val="nl-NL"/>
@@ -1377,14 +1377,14 @@
           <w:rFonts w:eastAsia="Times New Roman"/>
           <w:lang w:val="nl-NL"/>
         </w:rPr>
-        <w:pict w14:anchorId="7256836A">
+        <w:pict w14:anchorId="10A4D95E">
           <v:rect id="_x0000_i1025" style="width:0;height:1.5pt" o:hralign="center" o:hrstd="t" o:hr="t" fillcolor="#a0a0a0" stroked="f"/>
         </w:pict>
       </w:r>
     </w:p>
     <w:p>
       <w:pPr>
-        <w:divId w:val="1213618817"/>
+        <w:divId w:val="1003356192"/>
         <w:rPr>
           <w:color w:val="555555"/>
           <w:sz w:val="20"/>
@@ -1423,7 +1423,7 @@
     </w:p>
     <w:p>
       <w:pPr>
-        <w:divId w:val="1213618817"/>
+        <w:divId w:val="1003356192"/>
         <w:rPr>
           <w:color w:val="555555"/>
           <w:sz w:val="20"/>
@@ -1463,7 +1463,7 @@
     </w:p>
     <w:p>
       <w:pPr>
-        <w:divId w:val="1213618817"/>
+        <w:divId w:val="1003356192"/>
         <w:rPr>
           <w:color w:val="555555"/>
           <w:sz w:val="20"/>
@@ -1493,7 +1493,7 @@
     </w:p>
     <w:p>
       <w:pPr>
-        <w:divId w:val="1213618817"/>
+        <w:divId w:val="1003356192"/>
         <w:rPr>
           <w:color w:val="555555"/>
           <w:sz w:val="20"/>
@@ -1525,7 +1525,7 @@
       <w:pPr>
         <w:pStyle w:val="marker"/>
         <w:ind w:left="800" w:right="800"/>
-        <w:divId w:val="584264109"/>
+        <w:divId w:val="664822662"/>
         <w:rPr>
           <w:lang w:val="nl-NL"/>
         </w:rPr>
@@ -1537,13 +1537,13 @@
     <w:p>
       <w:pPr>
         <w:pStyle w:val="Kop2"/>
-        <w:divId w:val="584264109"/>
+        <w:divId w:val="664822662"/>
         <w:rPr>
           <w:rFonts w:eastAsia="Times New Roman"/>
           <w:lang w:val="nl-NL"/>
         </w:rPr>
       </w:pPr>
-      <w:bookmarkStart w:id="2" w:name="_Toc242812626"/>
+      <w:bookmarkStart w:id="2" w:name="_Toc242813525"/>
       <w:r>
         <w:rPr>
           <w:rFonts w:eastAsia="Times New Roman"/>
@@ -1556,7 +1556,7 @@
     <w:p>
       <w:pPr>
         <w:pStyle w:val="Normaalweb"/>
-        <w:divId w:val="584264109"/>
+        <w:divId w:val="664822662"/>
         <w:rPr>
           <w:lang w:val="nl-NL"/>
         </w:rPr>
@@ -1571,7 +1571,7 @@
     <w:p>
       <w:pPr>
         <w:pStyle w:val="Normaalweb"/>
-        <w:divId w:val="584264109"/>
+        <w:divId w:val="664822662"/>
         <w:rPr>
           <w:lang w:val="nl-NL"/>
         </w:rPr>
@@ -1586,7 +1586,7 @@
     <w:p>
       <w:pPr>
         <w:pStyle w:val="Normaalweb"/>
-        <w:divId w:val="584264109"/>
+        <w:divId w:val="664822662"/>
         <w:rPr>
           <w:lang w:val="nl-NL"/>
         </w:rPr>
@@ -1601,13 +1601,13 @@
     <w:p>
       <w:pPr>
         <w:pStyle w:val="Kop2"/>
-        <w:divId w:val="584264109"/>
+        <w:divId w:val="664822662"/>
         <w:rPr>
           <w:rFonts w:eastAsia="Times New Roman"/>
           <w:lang w:val="nl-NL"/>
         </w:rPr>
       </w:pPr>
-      <w:bookmarkStart w:id="3" w:name="_Toc242812627"/>
+      <w:bookmarkStart w:id="3" w:name="_Toc242813526"/>
       <w:r>
         <w:rPr>
           <w:rFonts w:eastAsia="Times New Roman"/>
@@ -1620,7 +1620,7 @@
     <w:p>
       <w:pPr>
         <w:pStyle w:val="Normaalweb"/>
-        <w:divId w:val="584264109"/>
+        <w:divId w:val="664822662"/>
         <w:rPr>
           <w:lang w:val="nl-NL"/>
         </w:rPr>
@@ -1635,13 +1635,13 @@
     <w:p>
       <w:pPr>
         <w:pStyle w:val="Kop2"/>
-        <w:divId w:val="584264109"/>
+        <w:divId w:val="664822662"/>
         <w:rPr>
           <w:rFonts w:eastAsia="Times New Roman"/>
           <w:lang w:val="nl-NL"/>
         </w:rPr>
       </w:pPr>
-      <w:bookmarkStart w:id="4" w:name="_Toc242812628"/>
+      <w:bookmarkStart w:id="4" w:name="_Toc242813527"/>
       <w:r>
         <w:rPr>
           <w:rFonts w:eastAsia="Times New Roman"/>
@@ -1654,7 +1654,7 @@
     <w:p>
       <w:pPr>
         <w:pStyle w:val="Normaalweb"/>
-        <w:divId w:val="584264109"/>
+        <w:divId w:val="664822662"/>
         <w:rPr>
           <w:lang w:val="nl-NL"/>
         </w:rPr>
@@ -1669,13 +1669,13 @@
     <w:p>
       <w:pPr>
         <w:pStyle w:val="Kop3"/>
-        <w:divId w:val="584264109"/>
+        <w:divId w:val="664822662"/>
         <w:rPr>
           <w:rFonts w:eastAsia="Times New Roman"/>
           <w:lang w:val="nl-NL"/>
         </w:rPr>
       </w:pPr>
-      <w:bookmarkStart w:id="5" w:name="_Toc242812629"/>
+      <w:bookmarkStart w:id="5" w:name="_Toc242813528"/>
       <w:r>
         <w:rPr>
           <w:rFonts w:eastAsia="Times New Roman"/>
@@ -1688,7 +1688,7 @@
     <w:p>
       <w:pPr>
         <w:pStyle w:val="Normaalweb"/>
-        <w:divId w:val="584264109"/>
+        <w:divId w:val="664822662"/>
         <w:rPr>
           <w:lang w:val="nl-NL"/>
         </w:rPr>
@@ -1703,13 +1703,13 @@
     <w:p>
       <w:pPr>
         <w:pStyle w:val="Kop3"/>
-        <w:divId w:val="584264109"/>
+        <w:divId w:val="664822662"/>
         <w:rPr>
           <w:rFonts w:eastAsia="Times New Roman"/>
           <w:lang w:val="nl-NL"/>
         </w:rPr>
       </w:pPr>
-      <w:bookmarkStart w:id="6" w:name="_Toc242812630"/>
+      <w:bookmarkStart w:id="6" w:name="_Toc242813529"/>
       <w:r>
         <w:rPr>
           <w:rFonts w:eastAsia="Times New Roman"/>
@@ -1722,7 +1722,7 @@
     <w:p>
       <w:pPr>
         <w:pStyle w:val="Normaalweb"/>
-        <w:divId w:val="584264109"/>
+        <w:divId w:val="664822662"/>
         <w:rPr>
           <w:lang w:val="nl-NL"/>
         </w:rPr>
@@ -1737,13 +1737,13 @@
     <w:p>
       <w:pPr>
         <w:pStyle w:val="Kop3"/>
-        <w:divId w:val="584264109"/>
+        <w:divId w:val="664822662"/>
         <w:rPr>
           <w:rFonts w:eastAsia="Times New Roman"/>
           <w:lang w:val="nl-NL"/>
         </w:rPr>
       </w:pPr>
-      <w:bookmarkStart w:id="7" w:name="_Toc242812631"/>
+      <w:bookmarkStart w:id="7" w:name="_Toc242813530"/>
       <w:r>
         <w:rPr>
           <w:rFonts w:eastAsia="Times New Roman"/>
@@ -1756,7 +1756,7 @@
     <w:p>
       <w:pPr>
         <w:pStyle w:val="Normaalweb"/>
-        <w:divId w:val="584264109"/>
+        <w:divId w:val="664822662"/>
         <w:rPr>
           <w:lang w:val="nl-NL"/>
         </w:rPr>
@@ -1771,13 +1771,13 @@
     <w:p>
       <w:pPr>
         <w:pStyle w:val="Kop3"/>
-        <w:divId w:val="584264109"/>
+        <w:divId w:val="664822662"/>
         <w:rPr>
           <w:rFonts w:eastAsia="Times New Roman"/>
           <w:lang w:val="nl-NL"/>
         </w:rPr>
       </w:pPr>
-      <w:bookmarkStart w:id="8" w:name="_Toc242812632"/>
+      <w:bookmarkStart w:id="8" w:name="_Toc242813531"/>
       <w:r>
         <w:rPr>
           <w:rFonts w:eastAsia="Times New Roman"/>
@@ -1790,7 +1790,7 @@
     <w:p>
       <w:pPr>
         <w:pStyle w:val="Normaalweb"/>
-        <w:divId w:val="584264109"/>
+        <w:divId w:val="664822662"/>
         <w:rPr>
           <w:lang w:val="nl-NL"/>
         </w:rPr>
@@ -1806,13 +1806,13 @@
     <w:p>
       <w:pPr>
         <w:pStyle w:val="Kop2"/>
-        <w:divId w:val="584264109"/>
+        <w:divId w:val="664822662"/>
         <w:rPr>
           <w:rFonts w:eastAsia="Times New Roman"/>
           <w:lang w:val="nl-NL"/>
         </w:rPr>
       </w:pPr>
-      <w:bookmarkStart w:id="9" w:name="_Toc242812633"/>
+      <w:bookmarkStart w:id="9" w:name="_Toc242813532"/>
       <w:r>
         <w:rPr>
           <w:rFonts w:eastAsia="Times New Roman"/>
@@ -1825,7 +1825,7 @@
     <w:p>
       <w:pPr>
         <w:pStyle w:val="Normaalweb"/>
-        <w:divId w:val="584264109"/>
+        <w:divId w:val="664822662"/>
         <w:rPr>
           <w:lang w:val="nl-NL"/>
         </w:rPr>
@@ -1840,7 +1840,7 @@
     <w:p>
       <w:pPr>
         <w:pStyle w:val="Normaalweb"/>
-        <w:divId w:val="584264109"/>
+        <w:divId w:val="664822662"/>
         <w:rPr>
           <w:lang w:val="nl-NL"/>
         </w:rPr>
@@ -1855,7 +1855,7 @@
     <w:p>
       <w:pPr>
         <w:pStyle w:val="Normaalweb"/>
-        <w:divId w:val="584264109"/>
+        <w:divId w:val="664822662"/>
         <w:rPr>
           <w:lang w:val="nl-NL"/>
         </w:rPr>
@@ -1870,13 +1870,13 @@
     <w:p>
       <w:pPr>
         <w:pStyle w:val="Kop2"/>
-        <w:divId w:val="584264109"/>
+        <w:divId w:val="664822662"/>
         <w:rPr>
           <w:rFonts w:eastAsia="Times New Roman"/>
           <w:lang w:val="nl-NL"/>
         </w:rPr>
       </w:pPr>
-      <w:bookmarkStart w:id="10" w:name="_Toc242812634"/>
+      <w:bookmarkStart w:id="10" w:name="_Toc242813533"/>
       <w:r>
         <w:rPr>
           <w:rFonts w:eastAsia="Times New Roman"/>
@@ -1889,7 +1889,7 @@
     <w:p>
       <w:pPr>
         <w:pStyle w:val="Normaalweb"/>
-        <w:divId w:val="584264109"/>
+        <w:divId w:val="664822662"/>
         <w:rPr>
           <w:lang w:val="nl-NL"/>
         </w:rPr>
@@ -1904,7 +1904,7 @@
     <w:p>
       <w:pPr>
         <w:pStyle w:val="Normaalweb"/>
-        <w:divId w:val="584264109"/>
+        <w:divId w:val="664822662"/>
         <w:rPr>
           <w:lang w:val="nl-NL"/>
         </w:rPr>
@@ -1919,13 +1919,13 @@
     <w:p>
       <w:pPr>
         <w:pStyle w:val="Kop2"/>
-        <w:divId w:val="584264109"/>
+        <w:divId w:val="664822662"/>
         <w:rPr>
           <w:rFonts w:eastAsia="Times New Roman"/>
           <w:lang w:val="nl-NL"/>
         </w:rPr>
       </w:pPr>
-      <w:bookmarkStart w:id="11" w:name="_Toc242812635"/>
+      <w:bookmarkStart w:id="11" w:name="_Toc242813534"/>
       <w:r>
         <w:rPr>
           <w:rFonts w:eastAsia="Times New Roman"/>
@@ -1938,7 +1938,7 @@
     <w:p>
       <w:pPr>
         <w:pStyle w:val="Normaalweb"/>
-        <w:divId w:val="584264109"/>
+        <w:divId w:val="664822662"/>
         <w:rPr>
           <w:lang w:val="nl-NL"/>
         </w:rPr>
@@ -1953,7 +1953,7 @@
     <w:p>
       <w:pPr>
         <w:pStyle w:val="Normaalweb"/>
-        <w:divId w:val="584264109"/>
+        <w:divId w:val="664822662"/>
         <w:rPr>
           <w:lang w:val="nl-NL"/>
         </w:rPr>
@@ -1968,7 +1968,7 @@
     <w:p>
       <w:pPr>
         <w:shd w:val="clear" w:color="auto" w:fill="FFFFFF"/>
-        <w:divId w:val="1002313747"/>
+        <w:divId w:val="1631399310"/>
         <w:rPr>
           <w:szCs w:val="22"/>
           <w:lang w:val="nl-NL"/>
@@ -2236,7 +2236,7 @@
         <w:sz w:val="18"/>
       </w:rPr>
       <w:tab/>
-      <w:t>Laatst gewijzigd: 13 oktober 2026, 19:35</w:t>
+      <w:t>Laatst gewijzigd: 13 oktober 2026, 19:50</w:t>
     </w:r>
   </w:p>
 </w:hdr>
@@ -3603,7 +3603,7 @@
     <w:link w:val="KoptekstChar"/>
     <w:uiPriority w:val="99"/>
     <w:unhideWhenUsed/>
-    <w:rsid w:val="00E57A46"/>
+    <w:rsid w:val="00B13736"/>
     <w:pPr>
       <w:tabs>
         <w:tab w:val="center" w:pos="4536"/>
@@ -3616,7 +3616,7 @@
     <w:basedOn w:val="Standaardalinea-lettertype"/>
     <w:link w:val="Koptekst"/>
     <w:uiPriority w:val="99"/>
-    <w:rsid w:val="00E57A46"/>
+    <w:rsid w:val="00B13736"/>
     <w:rPr>
       <w:rFonts w:eastAsiaTheme="minorEastAsia"/>
       <w:sz w:val="24"/>
@@ -3629,7 +3629,7 @@
     <w:link w:val="VoettekstChar"/>
     <w:uiPriority w:val="99"/>
     <w:unhideWhenUsed/>
-    <w:rsid w:val="00E57A46"/>
+    <w:rsid w:val="00B13736"/>
     <w:pPr>
       <w:tabs>
         <w:tab w:val="center" w:pos="4536"/>
@@ -3642,7 +3642,7 @@
     <w:basedOn w:val="Standaardalinea-lettertype"/>
     <w:link w:val="Voettekst"/>
     <w:uiPriority w:val="99"/>
-    <w:rsid w:val="00E57A46"/>
+    <w:rsid w:val="00B13736"/>
     <w:rPr>
       <w:rFonts w:eastAsiaTheme="minorEastAsia"/>
       <w:sz w:val="24"/>
@@ -3656,7 +3656,7 @@
     <w:autoRedefine/>
     <w:uiPriority w:val="39"/>
     <w:unhideWhenUsed/>
-    <w:rsid w:val="00E57A46"/>
+    <w:rsid w:val="00B13736"/>
     <w:pPr>
       <w:spacing w:after="100"/>
       <w:ind w:left="220"/>
@@ -3669,7 +3669,7 @@
     <w:autoRedefine/>
     <w:uiPriority w:val="39"/>
     <w:unhideWhenUsed/>
-    <w:rsid w:val="00E57A46"/>
+    <w:rsid w:val="00B13736"/>
     <w:pPr>
       <w:spacing w:after="100"/>
       <w:ind w:left="440"/>

</xml_diff>

<commit_message>
Update Systeem-Audit NL 13-10-2026 20:03
</commit_message>
<xml_diff>
--- a/nl/docx/document-0.docx
+++ b/nl/docx/document-0.docx
@@ -7,7 +7,7 @@
         <w:spacing w:after="480"/>
         <w:jc w:val="center"/>
         <w:outlineLvl w:val="1"/>
-        <w:divId w:val="2042314064"/>
+        <w:divId w:val="570506238"/>
         <w:rPr>
           <w:rFonts w:ascii="Aptos Display" w:eastAsia="Times New Roman" w:hAnsi="Aptos Display"/>
           <w:b/>
@@ -36,7 +36,7 @@
     <w:p>
       <w:pPr>
         <w:pStyle w:val="ondertitel2"/>
-        <w:divId w:val="2042314064"/>
+        <w:divId w:val="570506238"/>
         <w:rPr>
           <w:lang w:val="nl-NL"/>
         </w:rPr>
@@ -51,7 +51,7 @@
     <w:p>
       <w:pPr>
         <w:pStyle w:val="documentaanduiding2"/>
-        <w:divId w:val="2042314064"/>
+        <w:divId w:val="570506238"/>
         <w:rPr>
           <w:lang w:val="nl-NL"/>
         </w:rPr>
@@ -66,7 +66,7 @@
     <w:p>
       <w:pPr>
         <w:pStyle w:val="auteur2"/>
-        <w:divId w:val="2042314064"/>
+        <w:divId w:val="570506238"/>
         <w:rPr>
           <w:lang w:val="nl-NL"/>
         </w:rPr>
@@ -81,23 +81,23 @@
     <w:p>
       <w:pPr>
         <w:pStyle w:val="meta-lijn2"/>
-        <w:divId w:val="2042314064"/>
-        <w:rPr>
-          <w:lang w:val="nl-NL"/>
-        </w:rPr>
-      </w:pPr>
-      <w:r>
-        <w:rPr>
-          <w:lang w:val="nl-NL"/>
-        </w:rPr>
-        <w:t>Versie bijgewerkt: 13 oktober 2026, 19:50</w:t>
+        <w:divId w:val="570506238"/>
+        <w:rPr>
+          <w:lang w:val="nl-NL"/>
+        </w:rPr>
+      </w:pPr>
+      <w:r>
+        <w:rPr>
+          <w:lang w:val="nl-NL"/>
+        </w:rPr>
+        <w:t>Versie bijgewerkt: 13 oktober 2026, 20:03</w:t>
       </w:r>
     </w:p>
     <w:p>
       <w:pPr>
         <w:pStyle w:val="marker"/>
         <w:ind w:left="800" w:right="800"/>
-        <w:divId w:val="664822662"/>
+        <w:divId w:val="1813713723"/>
         <w:rPr>
           <w:lang w:val="nl-NL"/>
         </w:rPr>
@@ -110,13 +110,13 @@
       <w:pPr>
         <w:pStyle w:val="Kop2"/>
         <w:pageBreakBefore/>
-        <w:divId w:val="1167211462"/>
+        <w:divId w:val="706639823"/>
         <w:rPr>
           <w:rFonts w:eastAsia="Times New Roman"/>
           <w:lang w:val="nl-NL"/>
         </w:rPr>
       </w:pPr>
-      <w:bookmarkStart w:id="0" w:name="_Toc242813523"/>
+      <w:bookmarkStart w:id="0" w:name="_Toc242814348"/>
       <w:r>
         <w:rPr>
           <w:rFonts w:eastAsia="Times New Roman"/>
@@ -133,7 +133,7 @@
         <w:tabs>
           <w:tab w:val="right" w:leader="dot" w:pos="9062"/>
         </w:tabs>
-        <w:divId w:val="1167211462"/>
+        <w:divId w:val="706639823"/>
         <w:rPr>
           <w:rFonts w:asciiTheme="minorHAnsi" w:hAnsiTheme="minorHAnsi" w:cstheme="minorBidi"/>
           <w:noProof/>
@@ -184,7 +184,7 @@
         <w:rPr>
           <w:noProof/>
         </w:rPr>
-        <w:instrText xml:space="preserve"> PAGEREF _Toc242813523 \h </w:instrText>
+        <w:instrText xml:space="preserve"> PAGEREF _Toc242814348 \h </w:instrText>
       </w:r>
       <w:r>
         <w:rPr>
@@ -216,7 +216,7 @@
         <w:tabs>
           <w:tab w:val="right" w:leader="dot" w:pos="9062"/>
         </w:tabs>
-        <w:divId w:val="1167211462"/>
+        <w:divId w:val="706639823"/>
         <w:rPr>
           <w:rFonts w:asciiTheme="minorHAnsi" w:hAnsiTheme="minorHAnsi" w:cstheme="minorBidi"/>
           <w:noProof/>
@@ -249,7 +249,7 @@
         <w:rPr>
           <w:noProof/>
         </w:rPr>
-        <w:instrText xml:space="preserve"> PAGEREF _Toc242813524 \h </w:instrText>
+        <w:instrText xml:space="preserve"> PAGEREF _Toc242814349 \h </w:instrText>
       </w:r>
       <w:r>
         <w:rPr>
@@ -281,7 +281,7 @@
         <w:tabs>
           <w:tab w:val="right" w:leader="dot" w:pos="9062"/>
         </w:tabs>
-        <w:divId w:val="1167211462"/>
+        <w:divId w:val="706639823"/>
         <w:rPr>
           <w:rFonts w:asciiTheme="minorHAnsi" w:hAnsiTheme="minorHAnsi" w:cstheme="minorBidi"/>
           <w:noProof/>
@@ -314,7 +314,7 @@
         <w:rPr>
           <w:noProof/>
         </w:rPr>
-        <w:instrText xml:space="preserve"> PAGEREF _Toc242813525 \h </w:instrText>
+        <w:instrText xml:space="preserve"> PAGEREF _Toc242814350 \h </w:instrText>
       </w:r>
       <w:r>
         <w:rPr>
@@ -346,7 +346,7 @@
         <w:tabs>
           <w:tab w:val="right" w:leader="dot" w:pos="9062"/>
         </w:tabs>
-        <w:divId w:val="1167211462"/>
+        <w:divId w:val="706639823"/>
         <w:rPr>
           <w:rFonts w:asciiTheme="minorHAnsi" w:hAnsiTheme="minorHAnsi" w:cstheme="minorBidi"/>
           <w:noProof/>
@@ -379,7 +379,7 @@
         <w:rPr>
           <w:noProof/>
         </w:rPr>
-        <w:instrText xml:space="preserve"> PAGEREF _Toc242813526 \h </w:instrText>
+        <w:instrText xml:space="preserve"> PAGEREF _Toc242814351 \h </w:instrText>
       </w:r>
       <w:r>
         <w:rPr>
@@ -411,7 +411,7 @@
         <w:tabs>
           <w:tab w:val="right" w:leader="dot" w:pos="9062"/>
         </w:tabs>
-        <w:divId w:val="1167211462"/>
+        <w:divId w:val="706639823"/>
         <w:rPr>
           <w:rFonts w:asciiTheme="minorHAnsi" w:hAnsiTheme="minorHAnsi" w:cstheme="minorBidi"/>
           <w:noProof/>
@@ -444,7 +444,7 @@
         <w:rPr>
           <w:noProof/>
         </w:rPr>
-        <w:instrText xml:space="preserve"> PAGEREF _Toc242813527 \h </w:instrText>
+        <w:instrText xml:space="preserve"> PAGEREF _Toc242814352 \h </w:instrText>
       </w:r>
       <w:r>
         <w:rPr>
@@ -476,7 +476,7 @@
         <w:tabs>
           <w:tab w:val="right" w:leader="dot" w:pos="9062"/>
         </w:tabs>
-        <w:divId w:val="1167211462"/>
+        <w:divId w:val="706639823"/>
         <w:rPr>
           <w:rFonts w:asciiTheme="minorHAnsi" w:hAnsiTheme="minorHAnsi" w:cstheme="minorBidi"/>
           <w:noProof/>
@@ -509,7 +509,7 @@
         <w:rPr>
           <w:noProof/>
         </w:rPr>
-        <w:instrText xml:space="preserve"> PAGEREF _Toc242813528 \h </w:instrText>
+        <w:instrText xml:space="preserve"> PAGEREF _Toc242814353 \h </w:instrText>
       </w:r>
       <w:r>
         <w:rPr>
@@ -541,7 +541,7 @@
         <w:tabs>
           <w:tab w:val="right" w:leader="dot" w:pos="9062"/>
         </w:tabs>
-        <w:divId w:val="1167211462"/>
+        <w:divId w:val="706639823"/>
         <w:rPr>
           <w:rFonts w:asciiTheme="minorHAnsi" w:hAnsiTheme="minorHAnsi" w:cstheme="minorBidi"/>
           <w:noProof/>
@@ -574,7 +574,7 @@
         <w:rPr>
           <w:noProof/>
         </w:rPr>
-        <w:instrText xml:space="preserve"> PAGEREF _Toc242813529 \h </w:instrText>
+        <w:instrText xml:space="preserve"> PAGEREF _Toc242814354 \h </w:instrText>
       </w:r>
       <w:r>
         <w:rPr>
@@ -606,7 +606,7 @@
         <w:tabs>
           <w:tab w:val="right" w:leader="dot" w:pos="9062"/>
         </w:tabs>
-        <w:divId w:val="1167211462"/>
+        <w:divId w:val="706639823"/>
         <w:rPr>
           <w:rFonts w:asciiTheme="minorHAnsi" w:hAnsiTheme="minorHAnsi" w:cstheme="minorBidi"/>
           <w:noProof/>
@@ -639,7 +639,7 @@
         <w:rPr>
           <w:noProof/>
         </w:rPr>
-        <w:instrText xml:space="preserve"> PAGEREF _Toc242813530 \h </w:instrText>
+        <w:instrText xml:space="preserve"> PAGEREF _Toc242814355 \h </w:instrText>
       </w:r>
       <w:r>
         <w:rPr>
@@ -671,7 +671,7 @@
         <w:tabs>
           <w:tab w:val="right" w:leader="dot" w:pos="9062"/>
         </w:tabs>
-        <w:divId w:val="1167211462"/>
+        <w:divId w:val="706639823"/>
         <w:rPr>
           <w:rFonts w:asciiTheme="minorHAnsi" w:hAnsiTheme="minorHAnsi" w:cstheme="minorBidi"/>
           <w:noProof/>
@@ -704,7 +704,7 @@
         <w:rPr>
           <w:noProof/>
         </w:rPr>
-        <w:instrText xml:space="preserve"> PAGEREF _Toc242813531 \h </w:instrText>
+        <w:instrText xml:space="preserve"> PAGEREF _Toc242814356 \h </w:instrText>
       </w:r>
       <w:r>
         <w:rPr>
@@ -736,7 +736,7 @@
         <w:tabs>
           <w:tab w:val="right" w:leader="dot" w:pos="9062"/>
         </w:tabs>
-        <w:divId w:val="1167211462"/>
+        <w:divId w:val="706639823"/>
         <w:rPr>
           <w:rFonts w:asciiTheme="minorHAnsi" w:hAnsiTheme="minorHAnsi" w:cstheme="minorBidi"/>
           <w:noProof/>
@@ -769,7 +769,7 @@
         <w:rPr>
           <w:noProof/>
         </w:rPr>
-        <w:instrText xml:space="preserve"> PAGEREF _Toc242813532 \h </w:instrText>
+        <w:instrText xml:space="preserve"> PAGEREF _Toc242814357 \h </w:instrText>
       </w:r>
       <w:r>
         <w:rPr>
@@ -801,7 +801,7 @@
         <w:tabs>
           <w:tab w:val="right" w:leader="dot" w:pos="9062"/>
         </w:tabs>
-        <w:divId w:val="1167211462"/>
+        <w:divId w:val="706639823"/>
         <w:rPr>
           <w:rFonts w:asciiTheme="minorHAnsi" w:hAnsiTheme="minorHAnsi" w:cstheme="minorBidi"/>
           <w:noProof/>
@@ -834,7 +834,7 @@
         <w:rPr>
           <w:noProof/>
         </w:rPr>
-        <w:instrText xml:space="preserve"> PAGEREF _Toc242813533 \h </w:instrText>
+        <w:instrText xml:space="preserve"> PAGEREF _Toc242814358 \h </w:instrText>
       </w:r>
       <w:r>
         <w:rPr>
@@ -866,7 +866,7 @@
         <w:tabs>
           <w:tab w:val="right" w:leader="dot" w:pos="9062"/>
         </w:tabs>
-        <w:divId w:val="1167211462"/>
+        <w:divId w:val="706639823"/>
         <w:rPr>
           <w:rFonts w:asciiTheme="minorHAnsi" w:hAnsiTheme="minorHAnsi" w:cstheme="minorBidi"/>
           <w:noProof/>
@@ -899,7 +899,7 @@
         <w:rPr>
           <w:noProof/>
         </w:rPr>
-        <w:instrText xml:space="preserve"> PAGEREF _Toc242813534 \h </w:instrText>
+        <w:instrText xml:space="preserve"> PAGEREF _Toc242814359 \h </w:instrText>
       </w:r>
       <w:r>
         <w:rPr>
@@ -928,7 +928,7 @@
     <w:p>
       <w:pPr>
         <w:pStyle w:val="marker"/>
-        <w:divId w:val="1167211462"/>
+        <w:divId w:val="706639823"/>
         <w:rPr>
           <w:lang w:val="nl-NL"/>
         </w:rPr>
@@ -944,7 +944,7 @@
       <w:pPr>
         <w:pStyle w:val="marker"/>
         <w:ind w:left="800" w:right="800"/>
-        <w:divId w:val="664822662"/>
+        <w:divId w:val="1813713723"/>
         <w:rPr>
           <w:lang w:val="nl-NL"/>
         </w:rPr>
@@ -956,13 +956,13 @@
     <w:p>
       <w:pPr>
         <w:pStyle w:val="Kop2"/>
-        <w:divId w:val="664822662"/>
+        <w:divId w:val="1813713723"/>
         <w:rPr>
           <w:rFonts w:eastAsia="Times New Roman"/>
           <w:lang w:val="nl-NL"/>
         </w:rPr>
       </w:pPr>
-      <w:bookmarkStart w:id="1" w:name="_Toc242813524"/>
+      <w:bookmarkStart w:id="1" w:name="_Toc242814349"/>
       <w:r>
         <w:rPr>
           <w:rFonts w:eastAsia="Times New Roman"/>
@@ -975,7 +975,7 @@
     <w:p>
       <w:pPr>
         <w:pStyle w:val="Normaalweb"/>
-        <w:divId w:val="664822662"/>
+        <w:divId w:val="1813713723"/>
         <w:rPr>
           <w:lang w:val="nl-NL"/>
         </w:rPr>
@@ -990,7 +990,7 @@
     <w:p>
       <w:pPr>
         <w:pStyle w:val="Normaalweb"/>
-        <w:divId w:val="664822662"/>
+        <w:divId w:val="1813713723"/>
         <w:rPr>
           <w:lang w:val="nl-NL"/>
         </w:rPr>
@@ -1018,7 +1018,7 @@
     <w:p>
       <w:pPr>
         <w:pStyle w:val="Normaalweb"/>
-        <w:divId w:val="664822662"/>
+        <w:divId w:val="1813713723"/>
         <w:rPr>
           <w:lang w:val="nl-NL"/>
         </w:rPr>
@@ -1039,7 +1039,7 @@
     <w:p>
       <w:pPr>
         <w:pStyle w:val="Normaalweb"/>
-        <w:divId w:val="664822662"/>
+        <w:divId w:val="1813713723"/>
         <w:rPr>
           <w:lang w:val="nl-NL"/>
         </w:rPr>
@@ -1086,7 +1086,7 @@
     <w:p>
       <w:pPr>
         <w:pStyle w:val="Normaalweb"/>
-        <w:divId w:val="664822662"/>
+        <w:divId w:val="1813713723"/>
         <w:rPr>
           <w:lang w:val="nl-NL"/>
         </w:rPr>
@@ -1114,7 +1114,7 @@
     <w:p>
       <w:pPr>
         <w:pStyle w:val="Normaalweb"/>
-        <w:divId w:val="664822662"/>
+        <w:divId w:val="1813713723"/>
         <w:rPr>
           <w:lang w:val="nl-NL"/>
         </w:rPr>
@@ -1148,7 +1148,7 @@
     <w:p>
       <w:pPr>
         <w:pStyle w:val="Normaalweb"/>
-        <w:divId w:val="664822662"/>
+        <w:divId w:val="1813713723"/>
         <w:rPr>
           <w:lang w:val="nl-NL"/>
         </w:rPr>
@@ -1175,7 +1175,7 @@
     <w:p>
       <w:pPr>
         <w:pStyle w:val="Normaalweb"/>
-        <w:divId w:val="664822662"/>
+        <w:divId w:val="1813713723"/>
         <w:rPr>
           <w:lang w:val="nl-NL"/>
         </w:rPr>
@@ -1203,7 +1203,7 @@
     <w:p>
       <w:pPr>
         <w:pStyle w:val="Normaalweb"/>
-        <w:divId w:val="664822662"/>
+        <w:divId w:val="1813713723"/>
         <w:rPr>
           <w:lang w:val="nl-NL"/>
         </w:rPr>
@@ -1218,7 +1218,7 @@
     <w:p>
       <w:pPr>
         <w:pStyle w:val="Normaalweb"/>
-        <w:divId w:val="664822662"/>
+        <w:divId w:val="1813713723"/>
         <w:rPr>
           <w:lang w:val="nl-NL"/>
         </w:rPr>
@@ -1278,7 +1278,7 @@
     <w:p>
       <w:pPr>
         <w:pStyle w:val="Normaalweb"/>
-        <w:divId w:val="664822662"/>
+        <w:divId w:val="1813713723"/>
         <w:rPr>
           <w:lang w:val="nl-NL"/>
         </w:rPr>
@@ -1293,7 +1293,7 @@
     <w:p>
       <w:pPr>
         <w:pStyle w:val="Normaalweb"/>
-        <w:divId w:val="664822662"/>
+        <w:divId w:val="1813713723"/>
         <w:rPr>
           <w:lang w:val="nl-NL"/>
         </w:rPr>
@@ -1321,7 +1321,7 @@
     <w:p>
       <w:pPr>
         <w:pStyle w:val="Normaalweb"/>
-        <w:divId w:val="664822662"/>
+        <w:divId w:val="1813713723"/>
         <w:rPr>
           <w:lang w:val="nl-NL"/>
         </w:rPr>
@@ -1336,7 +1336,7 @@
     <w:p>
       <w:pPr>
         <w:pStyle w:val="Normaalweb"/>
-        <w:divId w:val="664822662"/>
+        <w:divId w:val="1813713723"/>
         <w:rPr>
           <w:lang w:val="nl-NL"/>
         </w:rPr>
@@ -1351,7 +1351,7 @@
     <w:p>
       <w:pPr>
         <w:pStyle w:val="Normaalweb"/>
-        <w:divId w:val="664822662"/>
+        <w:divId w:val="1813713723"/>
         <w:rPr>
           <w:lang w:val="nl-NL"/>
         </w:rPr>
@@ -1366,7 +1366,7 @@
     <w:p>
       <w:pPr>
         <w:spacing w:before="300" w:after="200"/>
-        <w:divId w:val="664822662"/>
+        <w:divId w:val="1813713723"/>
         <w:rPr>
           <w:rFonts w:eastAsia="Times New Roman"/>
           <w:lang w:val="nl-NL"/>
@@ -1377,14 +1377,14 @@
           <w:rFonts w:eastAsia="Times New Roman"/>
           <w:lang w:val="nl-NL"/>
         </w:rPr>
-        <w:pict w14:anchorId="10A4D95E">
+        <w:pict w14:anchorId="1A69E306">
           <v:rect id="_x0000_i1025" style="width:0;height:1.5pt" o:hralign="center" o:hrstd="t" o:hr="t" fillcolor="#a0a0a0" stroked="f"/>
         </w:pict>
       </w:r>
     </w:p>
     <w:p>
       <w:pPr>
-        <w:divId w:val="1003356192"/>
+        <w:divId w:val="2116708963"/>
         <w:rPr>
           <w:color w:val="555555"/>
           <w:sz w:val="20"/>
@@ -1423,7 +1423,7 @@
     </w:p>
     <w:p>
       <w:pPr>
-        <w:divId w:val="1003356192"/>
+        <w:divId w:val="2116708963"/>
         <w:rPr>
           <w:color w:val="555555"/>
           <w:sz w:val="20"/>
@@ -1463,7 +1463,7 @@
     </w:p>
     <w:p>
       <w:pPr>
-        <w:divId w:val="1003356192"/>
+        <w:divId w:val="2116708963"/>
         <w:rPr>
           <w:color w:val="555555"/>
           <w:sz w:val="20"/>
@@ -1493,7 +1493,7 @@
     </w:p>
     <w:p>
       <w:pPr>
-        <w:divId w:val="1003356192"/>
+        <w:divId w:val="2116708963"/>
         <w:rPr>
           <w:color w:val="555555"/>
           <w:sz w:val="20"/>
@@ -1525,7 +1525,7 @@
       <w:pPr>
         <w:pStyle w:val="marker"/>
         <w:ind w:left="800" w:right="800"/>
-        <w:divId w:val="664822662"/>
+        <w:divId w:val="1813713723"/>
         <w:rPr>
           <w:lang w:val="nl-NL"/>
         </w:rPr>
@@ -1537,13 +1537,13 @@
     <w:p>
       <w:pPr>
         <w:pStyle w:val="Kop2"/>
-        <w:divId w:val="664822662"/>
+        <w:divId w:val="1813713723"/>
         <w:rPr>
           <w:rFonts w:eastAsia="Times New Roman"/>
           <w:lang w:val="nl-NL"/>
         </w:rPr>
       </w:pPr>
-      <w:bookmarkStart w:id="2" w:name="_Toc242813525"/>
+      <w:bookmarkStart w:id="2" w:name="_Toc242814350"/>
       <w:r>
         <w:rPr>
           <w:rFonts w:eastAsia="Times New Roman"/>
@@ -1556,7 +1556,7 @@
     <w:p>
       <w:pPr>
         <w:pStyle w:val="Normaalweb"/>
-        <w:divId w:val="664822662"/>
+        <w:divId w:val="1813713723"/>
         <w:rPr>
           <w:lang w:val="nl-NL"/>
         </w:rPr>
@@ -1571,7 +1571,7 @@
     <w:p>
       <w:pPr>
         <w:pStyle w:val="Normaalweb"/>
-        <w:divId w:val="664822662"/>
+        <w:divId w:val="1813713723"/>
         <w:rPr>
           <w:lang w:val="nl-NL"/>
         </w:rPr>
@@ -1586,7 +1586,7 @@
     <w:p>
       <w:pPr>
         <w:pStyle w:val="Normaalweb"/>
-        <w:divId w:val="664822662"/>
+        <w:divId w:val="1813713723"/>
         <w:rPr>
           <w:lang w:val="nl-NL"/>
         </w:rPr>
@@ -1601,13 +1601,13 @@
     <w:p>
       <w:pPr>
         <w:pStyle w:val="Kop2"/>
-        <w:divId w:val="664822662"/>
+        <w:divId w:val="1813713723"/>
         <w:rPr>
           <w:rFonts w:eastAsia="Times New Roman"/>
           <w:lang w:val="nl-NL"/>
         </w:rPr>
       </w:pPr>
-      <w:bookmarkStart w:id="3" w:name="_Toc242813526"/>
+      <w:bookmarkStart w:id="3" w:name="_Toc242814351"/>
       <w:r>
         <w:rPr>
           <w:rFonts w:eastAsia="Times New Roman"/>
@@ -1620,7 +1620,7 @@
     <w:p>
       <w:pPr>
         <w:pStyle w:val="Normaalweb"/>
-        <w:divId w:val="664822662"/>
+        <w:divId w:val="1813713723"/>
         <w:rPr>
           <w:lang w:val="nl-NL"/>
         </w:rPr>
@@ -1635,13 +1635,13 @@
     <w:p>
       <w:pPr>
         <w:pStyle w:val="Kop2"/>
-        <w:divId w:val="664822662"/>
+        <w:divId w:val="1813713723"/>
         <w:rPr>
           <w:rFonts w:eastAsia="Times New Roman"/>
           <w:lang w:val="nl-NL"/>
         </w:rPr>
       </w:pPr>
-      <w:bookmarkStart w:id="4" w:name="_Toc242813527"/>
+      <w:bookmarkStart w:id="4" w:name="_Toc242814352"/>
       <w:r>
         <w:rPr>
           <w:rFonts w:eastAsia="Times New Roman"/>
@@ -1654,7 +1654,7 @@
     <w:p>
       <w:pPr>
         <w:pStyle w:val="Normaalweb"/>
-        <w:divId w:val="664822662"/>
+        <w:divId w:val="1813713723"/>
         <w:rPr>
           <w:lang w:val="nl-NL"/>
         </w:rPr>
@@ -1669,13 +1669,13 @@
     <w:p>
       <w:pPr>
         <w:pStyle w:val="Kop3"/>
-        <w:divId w:val="664822662"/>
+        <w:divId w:val="1813713723"/>
         <w:rPr>
           <w:rFonts w:eastAsia="Times New Roman"/>
           <w:lang w:val="nl-NL"/>
         </w:rPr>
       </w:pPr>
-      <w:bookmarkStart w:id="5" w:name="_Toc242813528"/>
+      <w:bookmarkStart w:id="5" w:name="_Toc242814353"/>
       <w:r>
         <w:rPr>
           <w:rFonts w:eastAsia="Times New Roman"/>
@@ -1688,7 +1688,7 @@
     <w:p>
       <w:pPr>
         <w:pStyle w:val="Normaalweb"/>
-        <w:divId w:val="664822662"/>
+        <w:divId w:val="1813713723"/>
         <w:rPr>
           <w:lang w:val="nl-NL"/>
         </w:rPr>
@@ -1703,13 +1703,13 @@
     <w:p>
       <w:pPr>
         <w:pStyle w:val="Kop3"/>
-        <w:divId w:val="664822662"/>
+        <w:divId w:val="1813713723"/>
         <w:rPr>
           <w:rFonts w:eastAsia="Times New Roman"/>
           <w:lang w:val="nl-NL"/>
         </w:rPr>
       </w:pPr>
-      <w:bookmarkStart w:id="6" w:name="_Toc242813529"/>
+      <w:bookmarkStart w:id="6" w:name="_Toc242814354"/>
       <w:r>
         <w:rPr>
           <w:rFonts w:eastAsia="Times New Roman"/>
@@ -1722,7 +1722,7 @@
     <w:p>
       <w:pPr>
         <w:pStyle w:val="Normaalweb"/>
-        <w:divId w:val="664822662"/>
+        <w:divId w:val="1813713723"/>
         <w:rPr>
           <w:lang w:val="nl-NL"/>
         </w:rPr>
@@ -1737,13 +1737,13 @@
     <w:p>
       <w:pPr>
         <w:pStyle w:val="Kop3"/>
-        <w:divId w:val="664822662"/>
+        <w:divId w:val="1813713723"/>
         <w:rPr>
           <w:rFonts w:eastAsia="Times New Roman"/>
           <w:lang w:val="nl-NL"/>
         </w:rPr>
       </w:pPr>
-      <w:bookmarkStart w:id="7" w:name="_Toc242813530"/>
+      <w:bookmarkStart w:id="7" w:name="_Toc242814355"/>
       <w:r>
         <w:rPr>
           <w:rFonts w:eastAsia="Times New Roman"/>
@@ -1756,7 +1756,7 @@
     <w:p>
       <w:pPr>
         <w:pStyle w:val="Normaalweb"/>
-        <w:divId w:val="664822662"/>
+        <w:divId w:val="1813713723"/>
         <w:rPr>
           <w:lang w:val="nl-NL"/>
         </w:rPr>
@@ -1771,13 +1771,13 @@
     <w:p>
       <w:pPr>
         <w:pStyle w:val="Kop3"/>
-        <w:divId w:val="664822662"/>
+        <w:divId w:val="1813713723"/>
         <w:rPr>
           <w:rFonts w:eastAsia="Times New Roman"/>
           <w:lang w:val="nl-NL"/>
         </w:rPr>
       </w:pPr>
-      <w:bookmarkStart w:id="8" w:name="_Toc242813531"/>
+      <w:bookmarkStart w:id="8" w:name="_Toc242814356"/>
       <w:r>
         <w:rPr>
           <w:rFonts w:eastAsia="Times New Roman"/>
@@ -1790,7 +1790,7 @@
     <w:p>
       <w:pPr>
         <w:pStyle w:val="Normaalweb"/>
-        <w:divId w:val="664822662"/>
+        <w:divId w:val="1813713723"/>
         <w:rPr>
           <w:lang w:val="nl-NL"/>
         </w:rPr>
@@ -1806,13 +1806,13 @@
     <w:p>
       <w:pPr>
         <w:pStyle w:val="Kop2"/>
-        <w:divId w:val="664822662"/>
+        <w:divId w:val="1813713723"/>
         <w:rPr>
           <w:rFonts w:eastAsia="Times New Roman"/>
           <w:lang w:val="nl-NL"/>
         </w:rPr>
       </w:pPr>
-      <w:bookmarkStart w:id="9" w:name="_Toc242813532"/>
+      <w:bookmarkStart w:id="9" w:name="_Toc242814357"/>
       <w:r>
         <w:rPr>
           <w:rFonts w:eastAsia="Times New Roman"/>
@@ -1825,7 +1825,7 @@
     <w:p>
       <w:pPr>
         <w:pStyle w:val="Normaalweb"/>
-        <w:divId w:val="664822662"/>
+        <w:divId w:val="1813713723"/>
         <w:rPr>
           <w:lang w:val="nl-NL"/>
         </w:rPr>
@@ -1840,7 +1840,7 @@
     <w:p>
       <w:pPr>
         <w:pStyle w:val="Normaalweb"/>
-        <w:divId w:val="664822662"/>
+        <w:divId w:val="1813713723"/>
         <w:rPr>
           <w:lang w:val="nl-NL"/>
         </w:rPr>
@@ -1855,7 +1855,7 @@
     <w:p>
       <w:pPr>
         <w:pStyle w:val="Normaalweb"/>
-        <w:divId w:val="664822662"/>
+        <w:divId w:val="1813713723"/>
         <w:rPr>
           <w:lang w:val="nl-NL"/>
         </w:rPr>
@@ -1870,13 +1870,13 @@
     <w:p>
       <w:pPr>
         <w:pStyle w:val="Kop2"/>
-        <w:divId w:val="664822662"/>
+        <w:divId w:val="1813713723"/>
         <w:rPr>
           <w:rFonts w:eastAsia="Times New Roman"/>
           <w:lang w:val="nl-NL"/>
         </w:rPr>
       </w:pPr>
-      <w:bookmarkStart w:id="10" w:name="_Toc242813533"/>
+      <w:bookmarkStart w:id="10" w:name="_Toc242814358"/>
       <w:r>
         <w:rPr>
           <w:rFonts w:eastAsia="Times New Roman"/>
@@ -1889,7 +1889,7 @@
     <w:p>
       <w:pPr>
         <w:pStyle w:val="Normaalweb"/>
-        <w:divId w:val="664822662"/>
+        <w:divId w:val="1813713723"/>
         <w:rPr>
           <w:lang w:val="nl-NL"/>
         </w:rPr>
@@ -1904,7 +1904,7 @@
     <w:p>
       <w:pPr>
         <w:pStyle w:val="Normaalweb"/>
-        <w:divId w:val="664822662"/>
+        <w:divId w:val="1813713723"/>
         <w:rPr>
           <w:lang w:val="nl-NL"/>
         </w:rPr>
@@ -1919,13 +1919,13 @@
     <w:p>
       <w:pPr>
         <w:pStyle w:val="Kop2"/>
-        <w:divId w:val="664822662"/>
+        <w:divId w:val="1813713723"/>
         <w:rPr>
           <w:rFonts w:eastAsia="Times New Roman"/>
           <w:lang w:val="nl-NL"/>
         </w:rPr>
       </w:pPr>
-      <w:bookmarkStart w:id="11" w:name="_Toc242813534"/>
+      <w:bookmarkStart w:id="11" w:name="_Toc242814359"/>
       <w:r>
         <w:rPr>
           <w:rFonts w:eastAsia="Times New Roman"/>
@@ -1938,7 +1938,7 @@
     <w:p>
       <w:pPr>
         <w:pStyle w:val="Normaalweb"/>
-        <w:divId w:val="664822662"/>
+        <w:divId w:val="1813713723"/>
         <w:rPr>
           <w:lang w:val="nl-NL"/>
         </w:rPr>
@@ -1953,7 +1953,7 @@
     <w:p>
       <w:pPr>
         <w:pStyle w:val="Normaalweb"/>
-        <w:divId w:val="664822662"/>
+        <w:divId w:val="1813713723"/>
         <w:rPr>
           <w:lang w:val="nl-NL"/>
         </w:rPr>
@@ -1968,7 +1968,7 @@
     <w:p>
       <w:pPr>
         <w:shd w:val="clear" w:color="auto" w:fill="FFFFFF"/>
-        <w:divId w:val="1631399310"/>
+        <w:divId w:val="22903065"/>
         <w:rPr>
           <w:szCs w:val="22"/>
           <w:lang w:val="nl-NL"/>
@@ -2236,7 +2236,7 @@
         <w:sz w:val="18"/>
       </w:rPr>
       <w:tab/>
-      <w:t>Laatst gewijzigd: 13 oktober 2026, 19:50</w:t>
+      <w:t>Laatst gewijzigd: 13 oktober 2026, 20:03</w:t>
     </w:r>
   </w:p>
 </w:hdr>
@@ -3603,7 +3603,7 @@
     <w:link w:val="KoptekstChar"/>
     <w:uiPriority w:val="99"/>
     <w:unhideWhenUsed/>
-    <w:rsid w:val="00B13736"/>
+    <w:rsid w:val="006E7213"/>
     <w:pPr>
       <w:tabs>
         <w:tab w:val="center" w:pos="4536"/>
@@ -3616,7 +3616,7 @@
     <w:basedOn w:val="Standaardalinea-lettertype"/>
     <w:link w:val="Koptekst"/>
     <w:uiPriority w:val="99"/>
-    <w:rsid w:val="00B13736"/>
+    <w:rsid w:val="006E7213"/>
     <w:rPr>
       <w:rFonts w:eastAsiaTheme="minorEastAsia"/>
       <w:sz w:val="24"/>
@@ -3629,7 +3629,7 @@
     <w:link w:val="VoettekstChar"/>
     <w:uiPriority w:val="99"/>
     <w:unhideWhenUsed/>
-    <w:rsid w:val="00B13736"/>
+    <w:rsid w:val="006E7213"/>
     <w:pPr>
       <w:tabs>
         <w:tab w:val="center" w:pos="4536"/>
@@ -3642,7 +3642,7 @@
     <w:basedOn w:val="Standaardalinea-lettertype"/>
     <w:link w:val="Voettekst"/>
     <w:uiPriority w:val="99"/>
-    <w:rsid w:val="00B13736"/>
+    <w:rsid w:val="006E7213"/>
     <w:rPr>
       <w:rFonts w:eastAsiaTheme="minorEastAsia"/>
       <w:sz w:val="24"/>
@@ -3656,7 +3656,7 @@
     <w:autoRedefine/>
     <w:uiPriority w:val="39"/>
     <w:unhideWhenUsed/>
-    <w:rsid w:val="00B13736"/>
+    <w:rsid w:val="006E7213"/>
     <w:pPr>
       <w:spacing w:after="100"/>
       <w:ind w:left="220"/>
@@ -3669,7 +3669,7 @@
     <w:autoRedefine/>
     <w:uiPriority w:val="39"/>
     <w:unhideWhenUsed/>
-    <w:rsid w:val="00B13736"/>
+    <w:rsid w:val="006E7213"/>
     <w:pPr>
       <w:spacing w:after="100"/>
       <w:ind w:left="440"/>

</xml_diff>

<commit_message>
Update Systeem-Audit NL 13-10-2026 20:12
</commit_message>
<xml_diff>
--- a/nl/docx/document-0.docx
+++ b/nl/docx/document-0.docx
@@ -7,7 +7,7 @@
         <w:spacing w:after="480"/>
         <w:jc w:val="center"/>
         <w:outlineLvl w:val="1"/>
-        <w:divId w:val="570506238"/>
+        <w:divId w:val="2137603451"/>
         <w:rPr>
           <w:rFonts w:ascii="Aptos Display" w:eastAsia="Times New Roman" w:hAnsi="Aptos Display"/>
           <w:b/>
@@ -36,7 +36,7 @@
     <w:p>
       <w:pPr>
         <w:pStyle w:val="ondertitel2"/>
-        <w:divId w:val="570506238"/>
+        <w:divId w:val="2137603451"/>
         <w:rPr>
           <w:lang w:val="nl-NL"/>
         </w:rPr>
@@ -51,7 +51,7 @@
     <w:p>
       <w:pPr>
         <w:pStyle w:val="documentaanduiding2"/>
-        <w:divId w:val="570506238"/>
+        <w:divId w:val="2137603451"/>
         <w:rPr>
           <w:lang w:val="nl-NL"/>
         </w:rPr>
@@ -66,7 +66,7 @@
     <w:p>
       <w:pPr>
         <w:pStyle w:val="auteur2"/>
-        <w:divId w:val="570506238"/>
+        <w:divId w:val="2137603451"/>
         <w:rPr>
           <w:lang w:val="nl-NL"/>
         </w:rPr>
@@ -81,23 +81,23 @@
     <w:p>
       <w:pPr>
         <w:pStyle w:val="meta-lijn2"/>
-        <w:divId w:val="570506238"/>
-        <w:rPr>
-          <w:lang w:val="nl-NL"/>
-        </w:rPr>
-      </w:pPr>
-      <w:r>
-        <w:rPr>
-          <w:lang w:val="nl-NL"/>
-        </w:rPr>
-        <w:t>Versie bijgewerkt: 13 oktober 2026, 20:03</w:t>
+        <w:divId w:val="2137603451"/>
+        <w:rPr>
+          <w:lang w:val="nl-NL"/>
+        </w:rPr>
+      </w:pPr>
+      <w:r>
+        <w:rPr>
+          <w:lang w:val="nl-NL"/>
+        </w:rPr>
+        <w:t>Versie bijgewerkt: 13 oktober 2026, 20:12</w:t>
       </w:r>
     </w:p>
     <w:p>
       <w:pPr>
         <w:pStyle w:val="marker"/>
         <w:ind w:left="800" w:right="800"/>
-        <w:divId w:val="1813713723"/>
+        <w:divId w:val="2022662291"/>
         <w:rPr>
           <w:lang w:val="nl-NL"/>
         </w:rPr>
@@ -110,13 +110,13 @@
       <w:pPr>
         <w:pStyle w:val="Kop2"/>
         <w:pageBreakBefore/>
-        <w:divId w:val="706639823"/>
+        <w:divId w:val="1085610764"/>
         <w:rPr>
           <w:rFonts w:eastAsia="Times New Roman"/>
           <w:lang w:val="nl-NL"/>
         </w:rPr>
       </w:pPr>
-      <w:bookmarkStart w:id="0" w:name="_Toc242814348"/>
+      <w:bookmarkStart w:id="0" w:name="_Toc242814878"/>
       <w:r>
         <w:rPr>
           <w:rFonts w:eastAsia="Times New Roman"/>
@@ -133,7 +133,7 @@
         <w:tabs>
           <w:tab w:val="right" w:leader="dot" w:pos="9062"/>
         </w:tabs>
-        <w:divId w:val="706639823"/>
+        <w:divId w:val="1085610764"/>
         <w:rPr>
           <w:rFonts w:asciiTheme="minorHAnsi" w:hAnsiTheme="minorHAnsi" w:cstheme="minorBidi"/>
           <w:noProof/>
@@ -184,7 +184,7 @@
         <w:rPr>
           <w:noProof/>
         </w:rPr>
-        <w:instrText xml:space="preserve"> PAGEREF _Toc242814348 \h </w:instrText>
+        <w:instrText xml:space="preserve"> PAGEREF _Toc242814878 \h </w:instrText>
       </w:r>
       <w:r>
         <w:rPr>
@@ -216,7 +216,7 @@
         <w:tabs>
           <w:tab w:val="right" w:leader="dot" w:pos="9062"/>
         </w:tabs>
-        <w:divId w:val="706639823"/>
+        <w:divId w:val="1085610764"/>
         <w:rPr>
           <w:rFonts w:asciiTheme="minorHAnsi" w:hAnsiTheme="minorHAnsi" w:cstheme="minorBidi"/>
           <w:noProof/>
@@ -249,7 +249,7 @@
         <w:rPr>
           <w:noProof/>
         </w:rPr>
-        <w:instrText xml:space="preserve"> PAGEREF _Toc242814349 \h </w:instrText>
+        <w:instrText xml:space="preserve"> PAGEREF _Toc242814879 \h </w:instrText>
       </w:r>
       <w:r>
         <w:rPr>
@@ -281,7 +281,7 @@
         <w:tabs>
           <w:tab w:val="right" w:leader="dot" w:pos="9062"/>
         </w:tabs>
-        <w:divId w:val="706639823"/>
+        <w:divId w:val="1085610764"/>
         <w:rPr>
           <w:rFonts w:asciiTheme="minorHAnsi" w:hAnsiTheme="minorHAnsi" w:cstheme="minorBidi"/>
           <w:noProof/>
@@ -314,7 +314,7 @@
         <w:rPr>
           <w:noProof/>
         </w:rPr>
-        <w:instrText xml:space="preserve"> PAGEREF _Toc242814350 \h </w:instrText>
+        <w:instrText xml:space="preserve"> PAGEREF _Toc242814880 \h </w:instrText>
       </w:r>
       <w:r>
         <w:rPr>
@@ -346,7 +346,7 @@
         <w:tabs>
           <w:tab w:val="right" w:leader="dot" w:pos="9062"/>
         </w:tabs>
-        <w:divId w:val="706639823"/>
+        <w:divId w:val="1085610764"/>
         <w:rPr>
           <w:rFonts w:asciiTheme="minorHAnsi" w:hAnsiTheme="minorHAnsi" w:cstheme="minorBidi"/>
           <w:noProof/>
@@ -379,7 +379,7 @@
         <w:rPr>
           <w:noProof/>
         </w:rPr>
-        <w:instrText xml:space="preserve"> PAGEREF _Toc242814351 \h </w:instrText>
+        <w:instrText xml:space="preserve"> PAGEREF _Toc242814881 \h </w:instrText>
       </w:r>
       <w:r>
         <w:rPr>
@@ -411,7 +411,7 @@
         <w:tabs>
           <w:tab w:val="right" w:leader="dot" w:pos="9062"/>
         </w:tabs>
-        <w:divId w:val="706639823"/>
+        <w:divId w:val="1085610764"/>
         <w:rPr>
           <w:rFonts w:asciiTheme="minorHAnsi" w:hAnsiTheme="minorHAnsi" w:cstheme="minorBidi"/>
           <w:noProof/>
@@ -444,7 +444,7 @@
         <w:rPr>
           <w:noProof/>
         </w:rPr>
-        <w:instrText xml:space="preserve"> PAGEREF _Toc242814352 \h </w:instrText>
+        <w:instrText xml:space="preserve"> PAGEREF _Toc242814882 \h </w:instrText>
       </w:r>
       <w:r>
         <w:rPr>
@@ -476,7 +476,7 @@
         <w:tabs>
           <w:tab w:val="right" w:leader="dot" w:pos="9062"/>
         </w:tabs>
-        <w:divId w:val="706639823"/>
+        <w:divId w:val="1085610764"/>
         <w:rPr>
           <w:rFonts w:asciiTheme="minorHAnsi" w:hAnsiTheme="minorHAnsi" w:cstheme="minorBidi"/>
           <w:noProof/>
@@ -509,7 +509,7 @@
         <w:rPr>
           <w:noProof/>
         </w:rPr>
-        <w:instrText xml:space="preserve"> PAGEREF _Toc242814353 \h </w:instrText>
+        <w:instrText xml:space="preserve"> PAGEREF _Toc242814883 \h </w:instrText>
       </w:r>
       <w:r>
         <w:rPr>
@@ -541,7 +541,7 @@
         <w:tabs>
           <w:tab w:val="right" w:leader="dot" w:pos="9062"/>
         </w:tabs>
-        <w:divId w:val="706639823"/>
+        <w:divId w:val="1085610764"/>
         <w:rPr>
           <w:rFonts w:asciiTheme="minorHAnsi" w:hAnsiTheme="minorHAnsi" w:cstheme="minorBidi"/>
           <w:noProof/>
@@ -574,7 +574,7 @@
         <w:rPr>
           <w:noProof/>
         </w:rPr>
-        <w:instrText xml:space="preserve"> PAGEREF _Toc242814354 \h </w:instrText>
+        <w:instrText xml:space="preserve"> PAGEREF _Toc242814884 \h </w:instrText>
       </w:r>
       <w:r>
         <w:rPr>
@@ -606,7 +606,7 @@
         <w:tabs>
           <w:tab w:val="right" w:leader="dot" w:pos="9062"/>
         </w:tabs>
-        <w:divId w:val="706639823"/>
+        <w:divId w:val="1085610764"/>
         <w:rPr>
           <w:rFonts w:asciiTheme="minorHAnsi" w:hAnsiTheme="minorHAnsi" w:cstheme="minorBidi"/>
           <w:noProof/>
@@ -639,7 +639,7 @@
         <w:rPr>
           <w:noProof/>
         </w:rPr>
-        <w:instrText xml:space="preserve"> PAGEREF _Toc242814355 \h </w:instrText>
+        <w:instrText xml:space="preserve"> PAGEREF _Toc242814885 \h </w:instrText>
       </w:r>
       <w:r>
         <w:rPr>
@@ -671,7 +671,7 @@
         <w:tabs>
           <w:tab w:val="right" w:leader="dot" w:pos="9062"/>
         </w:tabs>
-        <w:divId w:val="706639823"/>
+        <w:divId w:val="1085610764"/>
         <w:rPr>
           <w:rFonts w:asciiTheme="minorHAnsi" w:hAnsiTheme="minorHAnsi" w:cstheme="minorBidi"/>
           <w:noProof/>
@@ -704,7 +704,7 @@
         <w:rPr>
           <w:noProof/>
         </w:rPr>
-        <w:instrText xml:space="preserve"> PAGEREF _Toc242814356 \h </w:instrText>
+        <w:instrText xml:space="preserve"> PAGEREF _Toc242814886 \h </w:instrText>
       </w:r>
       <w:r>
         <w:rPr>
@@ -736,7 +736,7 @@
         <w:tabs>
           <w:tab w:val="right" w:leader="dot" w:pos="9062"/>
         </w:tabs>
-        <w:divId w:val="706639823"/>
+        <w:divId w:val="1085610764"/>
         <w:rPr>
           <w:rFonts w:asciiTheme="minorHAnsi" w:hAnsiTheme="minorHAnsi" w:cstheme="minorBidi"/>
           <w:noProof/>
@@ -769,7 +769,7 @@
         <w:rPr>
           <w:noProof/>
         </w:rPr>
-        <w:instrText xml:space="preserve"> PAGEREF _Toc242814357 \h </w:instrText>
+        <w:instrText xml:space="preserve"> PAGEREF _Toc242814887 \h </w:instrText>
       </w:r>
       <w:r>
         <w:rPr>
@@ -801,7 +801,7 @@
         <w:tabs>
           <w:tab w:val="right" w:leader="dot" w:pos="9062"/>
         </w:tabs>
-        <w:divId w:val="706639823"/>
+        <w:divId w:val="1085610764"/>
         <w:rPr>
           <w:rFonts w:asciiTheme="minorHAnsi" w:hAnsiTheme="minorHAnsi" w:cstheme="minorBidi"/>
           <w:noProof/>
@@ -834,7 +834,7 @@
         <w:rPr>
           <w:noProof/>
         </w:rPr>
-        <w:instrText xml:space="preserve"> PAGEREF _Toc242814358 \h </w:instrText>
+        <w:instrText xml:space="preserve"> PAGEREF _Toc242814888 \h </w:instrText>
       </w:r>
       <w:r>
         <w:rPr>
@@ -866,7 +866,7 @@
         <w:tabs>
           <w:tab w:val="right" w:leader="dot" w:pos="9062"/>
         </w:tabs>
-        <w:divId w:val="706639823"/>
+        <w:divId w:val="1085610764"/>
         <w:rPr>
           <w:rFonts w:asciiTheme="minorHAnsi" w:hAnsiTheme="minorHAnsi" w:cstheme="minorBidi"/>
           <w:noProof/>
@@ -899,7 +899,7 @@
         <w:rPr>
           <w:noProof/>
         </w:rPr>
-        <w:instrText xml:space="preserve"> PAGEREF _Toc242814359 \h </w:instrText>
+        <w:instrText xml:space="preserve"> PAGEREF _Toc242814889 \h </w:instrText>
       </w:r>
       <w:r>
         <w:rPr>
@@ -928,7 +928,7 @@
     <w:p>
       <w:pPr>
         <w:pStyle w:val="marker"/>
-        <w:divId w:val="706639823"/>
+        <w:divId w:val="1085610764"/>
         <w:rPr>
           <w:lang w:val="nl-NL"/>
         </w:rPr>
@@ -944,7 +944,7 @@
       <w:pPr>
         <w:pStyle w:val="marker"/>
         <w:ind w:left="800" w:right="800"/>
-        <w:divId w:val="1813713723"/>
+        <w:divId w:val="2022662291"/>
         <w:rPr>
           <w:lang w:val="nl-NL"/>
         </w:rPr>
@@ -956,13 +956,13 @@
     <w:p>
       <w:pPr>
         <w:pStyle w:val="Kop2"/>
-        <w:divId w:val="1813713723"/>
+        <w:divId w:val="2022662291"/>
         <w:rPr>
           <w:rFonts w:eastAsia="Times New Roman"/>
           <w:lang w:val="nl-NL"/>
         </w:rPr>
       </w:pPr>
-      <w:bookmarkStart w:id="1" w:name="_Toc242814349"/>
+      <w:bookmarkStart w:id="1" w:name="_Toc242814879"/>
       <w:r>
         <w:rPr>
           <w:rFonts w:eastAsia="Times New Roman"/>
@@ -975,7 +975,7 @@
     <w:p>
       <w:pPr>
         <w:pStyle w:val="Normaalweb"/>
-        <w:divId w:val="1813713723"/>
+        <w:divId w:val="2022662291"/>
         <w:rPr>
           <w:lang w:val="nl-NL"/>
         </w:rPr>
@@ -990,7 +990,7 @@
     <w:p>
       <w:pPr>
         <w:pStyle w:val="Normaalweb"/>
-        <w:divId w:val="1813713723"/>
+        <w:divId w:val="2022662291"/>
         <w:rPr>
           <w:lang w:val="nl-NL"/>
         </w:rPr>
@@ -1018,7 +1018,7 @@
     <w:p>
       <w:pPr>
         <w:pStyle w:val="Normaalweb"/>
-        <w:divId w:val="1813713723"/>
+        <w:divId w:val="2022662291"/>
         <w:rPr>
           <w:lang w:val="nl-NL"/>
         </w:rPr>
@@ -1039,7 +1039,7 @@
     <w:p>
       <w:pPr>
         <w:pStyle w:val="Normaalweb"/>
-        <w:divId w:val="1813713723"/>
+        <w:divId w:val="2022662291"/>
         <w:rPr>
           <w:lang w:val="nl-NL"/>
         </w:rPr>
@@ -1086,7 +1086,7 @@
     <w:p>
       <w:pPr>
         <w:pStyle w:val="Normaalweb"/>
-        <w:divId w:val="1813713723"/>
+        <w:divId w:val="2022662291"/>
         <w:rPr>
           <w:lang w:val="nl-NL"/>
         </w:rPr>
@@ -1114,7 +1114,7 @@
     <w:p>
       <w:pPr>
         <w:pStyle w:val="Normaalweb"/>
-        <w:divId w:val="1813713723"/>
+        <w:divId w:val="2022662291"/>
         <w:rPr>
           <w:lang w:val="nl-NL"/>
         </w:rPr>
@@ -1148,7 +1148,7 @@
     <w:p>
       <w:pPr>
         <w:pStyle w:val="Normaalweb"/>
-        <w:divId w:val="1813713723"/>
+        <w:divId w:val="2022662291"/>
         <w:rPr>
           <w:lang w:val="nl-NL"/>
         </w:rPr>
@@ -1175,7 +1175,7 @@
     <w:p>
       <w:pPr>
         <w:pStyle w:val="Normaalweb"/>
-        <w:divId w:val="1813713723"/>
+        <w:divId w:val="2022662291"/>
         <w:rPr>
           <w:lang w:val="nl-NL"/>
         </w:rPr>
@@ -1203,7 +1203,7 @@
     <w:p>
       <w:pPr>
         <w:pStyle w:val="Normaalweb"/>
-        <w:divId w:val="1813713723"/>
+        <w:divId w:val="2022662291"/>
         <w:rPr>
           <w:lang w:val="nl-NL"/>
         </w:rPr>
@@ -1218,7 +1218,7 @@
     <w:p>
       <w:pPr>
         <w:pStyle w:val="Normaalweb"/>
-        <w:divId w:val="1813713723"/>
+        <w:divId w:val="2022662291"/>
         <w:rPr>
           <w:lang w:val="nl-NL"/>
         </w:rPr>
@@ -1278,7 +1278,7 @@
     <w:p>
       <w:pPr>
         <w:pStyle w:val="Normaalweb"/>
-        <w:divId w:val="1813713723"/>
+        <w:divId w:val="2022662291"/>
         <w:rPr>
           <w:lang w:val="nl-NL"/>
         </w:rPr>
@@ -1293,7 +1293,7 @@
     <w:p>
       <w:pPr>
         <w:pStyle w:val="Normaalweb"/>
-        <w:divId w:val="1813713723"/>
+        <w:divId w:val="2022662291"/>
         <w:rPr>
           <w:lang w:val="nl-NL"/>
         </w:rPr>
@@ -1321,7 +1321,7 @@
     <w:p>
       <w:pPr>
         <w:pStyle w:val="Normaalweb"/>
-        <w:divId w:val="1813713723"/>
+        <w:divId w:val="2022662291"/>
         <w:rPr>
           <w:lang w:val="nl-NL"/>
         </w:rPr>
@@ -1336,7 +1336,7 @@
     <w:p>
       <w:pPr>
         <w:pStyle w:val="Normaalweb"/>
-        <w:divId w:val="1813713723"/>
+        <w:divId w:val="2022662291"/>
         <w:rPr>
           <w:lang w:val="nl-NL"/>
         </w:rPr>
@@ -1351,7 +1351,7 @@
     <w:p>
       <w:pPr>
         <w:pStyle w:val="Normaalweb"/>
-        <w:divId w:val="1813713723"/>
+        <w:divId w:val="2022662291"/>
         <w:rPr>
           <w:lang w:val="nl-NL"/>
         </w:rPr>
@@ -1366,7 +1366,7 @@
     <w:p>
       <w:pPr>
         <w:spacing w:before="300" w:after="200"/>
-        <w:divId w:val="1813713723"/>
+        <w:divId w:val="2022662291"/>
         <w:rPr>
           <w:rFonts w:eastAsia="Times New Roman"/>
           <w:lang w:val="nl-NL"/>
@@ -1377,14 +1377,14 @@
           <w:rFonts w:eastAsia="Times New Roman"/>
           <w:lang w:val="nl-NL"/>
         </w:rPr>
-        <w:pict w14:anchorId="1A69E306">
+        <w:pict w14:anchorId="5BE1B71F">
           <v:rect id="_x0000_i1025" style="width:0;height:1.5pt" o:hralign="center" o:hrstd="t" o:hr="t" fillcolor="#a0a0a0" stroked="f"/>
         </w:pict>
       </w:r>
     </w:p>
     <w:p>
       <w:pPr>
-        <w:divId w:val="2116708963"/>
+        <w:divId w:val="447554783"/>
         <w:rPr>
           <w:color w:val="555555"/>
           <w:sz w:val="20"/>
@@ -1423,7 +1423,7 @@
     </w:p>
     <w:p>
       <w:pPr>
-        <w:divId w:val="2116708963"/>
+        <w:divId w:val="447554783"/>
         <w:rPr>
           <w:color w:val="555555"/>
           <w:sz w:val="20"/>
@@ -1463,7 +1463,7 @@
     </w:p>
     <w:p>
       <w:pPr>
-        <w:divId w:val="2116708963"/>
+        <w:divId w:val="447554783"/>
         <w:rPr>
           <w:color w:val="555555"/>
           <w:sz w:val="20"/>
@@ -1493,7 +1493,7 @@
     </w:p>
     <w:p>
       <w:pPr>
-        <w:divId w:val="2116708963"/>
+        <w:divId w:val="447554783"/>
         <w:rPr>
           <w:color w:val="555555"/>
           <w:sz w:val="20"/>
@@ -1525,7 +1525,7 @@
       <w:pPr>
         <w:pStyle w:val="marker"/>
         <w:ind w:left="800" w:right="800"/>
-        <w:divId w:val="1813713723"/>
+        <w:divId w:val="2022662291"/>
         <w:rPr>
           <w:lang w:val="nl-NL"/>
         </w:rPr>
@@ -1537,13 +1537,13 @@
     <w:p>
       <w:pPr>
         <w:pStyle w:val="Kop2"/>
-        <w:divId w:val="1813713723"/>
+        <w:divId w:val="2022662291"/>
         <w:rPr>
           <w:rFonts w:eastAsia="Times New Roman"/>
           <w:lang w:val="nl-NL"/>
         </w:rPr>
       </w:pPr>
-      <w:bookmarkStart w:id="2" w:name="_Toc242814350"/>
+      <w:bookmarkStart w:id="2" w:name="_Toc242814880"/>
       <w:r>
         <w:rPr>
           <w:rFonts w:eastAsia="Times New Roman"/>
@@ -1556,7 +1556,7 @@
     <w:p>
       <w:pPr>
         <w:pStyle w:val="Normaalweb"/>
-        <w:divId w:val="1813713723"/>
+        <w:divId w:val="2022662291"/>
         <w:rPr>
           <w:lang w:val="nl-NL"/>
         </w:rPr>
@@ -1571,7 +1571,7 @@
     <w:p>
       <w:pPr>
         <w:pStyle w:val="Normaalweb"/>
-        <w:divId w:val="1813713723"/>
+        <w:divId w:val="2022662291"/>
         <w:rPr>
           <w:lang w:val="nl-NL"/>
         </w:rPr>
@@ -1586,7 +1586,7 @@
     <w:p>
       <w:pPr>
         <w:pStyle w:val="Normaalweb"/>
-        <w:divId w:val="1813713723"/>
+        <w:divId w:val="2022662291"/>
         <w:rPr>
           <w:lang w:val="nl-NL"/>
         </w:rPr>
@@ -1601,13 +1601,13 @@
     <w:p>
       <w:pPr>
         <w:pStyle w:val="Kop2"/>
-        <w:divId w:val="1813713723"/>
+        <w:divId w:val="2022662291"/>
         <w:rPr>
           <w:rFonts w:eastAsia="Times New Roman"/>
           <w:lang w:val="nl-NL"/>
         </w:rPr>
       </w:pPr>
-      <w:bookmarkStart w:id="3" w:name="_Toc242814351"/>
+      <w:bookmarkStart w:id="3" w:name="_Toc242814881"/>
       <w:r>
         <w:rPr>
           <w:rFonts w:eastAsia="Times New Roman"/>
@@ -1620,7 +1620,7 @@
     <w:p>
       <w:pPr>
         <w:pStyle w:val="Normaalweb"/>
-        <w:divId w:val="1813713723"/>
+        <w:divId w:val="2022662291"/>
         <w:rPr>
           <w:lang w:val="nl-NL"/>
         </w:rPr>
@@ -1635,13 +1635,13 @@
     <w:p>
       <w:pPr>
         <w:pStyle w:val="Kop2"/>
-        <w:divId w:val="1813713723"/>
+        <w:divId w:val="2022662291"/>
         <w:rPr>
           <w:rFonts w:eastAsia="Times New Roman"/>
           <w:lang w:val="nl-NL"/>
         </w:rPr>
       </w:pPr>
-      <w:bookmarkStart w:id="4" w:name="_Toc242814352"/>
+      <w:bookmarkStart w:id="4" w:name="_Toc242814882"/>
       <w:r>
         <w:rPr>
           <w:rFonts w:eastAsia="Times New Roman"/>
@@ -1654,7 +1654,7 @@
     <w:p>
       <w:pPr>
         <w:pStyle w:val="Normaalweb"/>
-        <w:divId w:val="1813713723"/>
+        <w:divId w:val="2022662291"/>
         <w:rPr>
           <w:lang w:val="nl-NL"/>
         </w:rPr>
@@ -1669,13 +1669,13 @@
     <w:p>
       <w:pPr>
         <w:pStyle w:val="Kop3"/>
-        <w:divId w:val="1813713723"/>
+        <w:divId w:val="2022662291"/>
         <w:rPr>
           <w:rFonts w:eastAsia="Times New Roman"/>
           <w:lang w:val="nl-NL"/>
         </w:rPr>
       </w:pPr>
-      <w:bookmarkStart w:id="5" w:name="_Toc242814353"/>
+      <w:bookmarkStart w:id="5" w:name="_Toc242814883"/>
       <w:r>
         <w:rPr>
           <w:rFonts w:eastAsia="Times New Roman"/>
@@ -1688,7 +1688,7 @@
     <w:p>
       <w:pPr>
         <w:pStyle w:val="Normaalweb"/>
-        <w:divId w:val="1813713723"/>
+        <w:divId w:val="2022662291"/>
         <w:rPr>
           <w:lang w:val="nl-NL"/>
         </w:rPr>
@@ -1703,13 +1703,13 @@
     <w:p>
       <w:pPr>
         <w:pStyle w:val="Kop3"/>
-        <w:divId w:val="1813713723"/>
+        <w:divId w:val="2022662291"/>
         <w:rPr>
           <w:rFonts w:eastAsia="Times New Roman"/>
           <w:lang w:val="nl-NL"/>
         </w:rPr>
       </w:pPr>
-      <w:bookmarkStart w:id="6" w:name="_Toc242814354"/>
+      <w:bookmarkStart w:id="6" w:name="_Toc242814884"/>
       <w:r>
         <w:rPr>
           <w:rFonts w:eastAsia="Times New Roman"/>
@@ -1722,7 +1722,7 @@
     <w:p>
       <w:pPr>
         <w:pStyle w:val="Normaalweb"/>
-        <w:divId w:val="1813713723"/>
+        <w:divId w:val="2022662291"/>
         <w:rPr>
           <w:lang w:val="nl-NL"/>
         </w:rPr>
@@ -1737,13 +1737,13 @@
     <w:p>
       <w:pPr>
         <w:pStyle w:val="Kop3"/>
-        <w:divId w:val="1813713723"/>
+        <w:divId w:val="2022662291"/>
         <w:rPr>
           <w:rFonts w:eastAsia="Times New Roman"/>
           <w:lang w:val="nl-NL"/>
         </w:rPr>
       </w:pPr>
-      <w:bookmarkStart w:id="7" w:name="_Toc242814355"/>
+      <w:bookmarkStart w:id="7" w:name="_Toc242814885"/>
       <w:r>
         <w:rPr>
           <w:rFonts w:eastAsia="Times New Roman"/>
@@ -1756,7 +1756,7 @@
     <w:p>
       <w:pPr>
         <w:pStyle w:val="Normaalweb"/>
-        <w:divId w:val="1813713723"/>
+        <w:divId w:val="2022662291"/>
         <w:rPr>
           <w:lang w:val="nl-NL"/>
         </w:rPr>
@@ -1771,13 +1771,13 @@
     <w:p>
       <w:pPr>
         <w:pStyle w:val="Kop3"/>
-        <w:divId w:val="1813713723"/>
+        <w:divId w:val="2022662291"/>
         <w:rPr>
           <w:rFonts w:eastAsia="Times New Roman"/>
           <w:lang w:val="nl-NL"/>
         </w:rPr>
       </w:pPr>
-      <w:bookmarkStart w:id="8" w:name="_Toc242814356"/>
+      <w:bookmarkStart w:id="8" w:name="_Toc242814886"/>
       <w:r>
         <w:rPr>
           <w:rFonts w:eastAsia="Times New Roman"/>
@@ -1790,7 +1790,7 @@
     <w:p>
       <w:pPr>
         <w:pStyle w:val="Normaalweb"/>
-        <w:divId w:val="1813713723"/>
+        <w:divId w:val="2022662291"/>
         <w:rPr>
           <w:lang w:val="nl-NL"/>
         </w:rPr>
@@ -1806,13 +1806,13 @@
     <w:p>
       <w:pPr>
         <w:pStyle w:val="Kop2"/>
-        <w:divId w:val="1813713723"/>
+        <w:divId w:val="2022662291"/>
         <w:rPr>
           <w:rFonts w:eastAsia="Times New Roman"/>
           <w:lang w:val="nl-NL"/>
         </w:rPr>
       </w:pPr>
-      <w:bookmarkStart w:id="9" w:name="_Toc242814357"/>
+      <w:bookmarkStart w:id="9" w:name="_Toc242814887"/>
       <w:r>
         <w:rPr>
           <w:rFonts w:eastAsia="Times New Roman"/>
@@ -1825,7 +1825,7 @@
     <w:p>
       <w:pPr>
         <w:pStyle w:val="Normaalweb"/>
-        <w:divId w:val="1813713723"/>
+        <w:divId w:val="2022662291"/>
         <w:rPr>
           <w:lang w:val="nl-NL"/>
         </w:rPr>
@@ -1840,7 +1840,7 @@
     <w:p>
       <w:pPr>
         <w:pStyle w:val="Normaalweb"/>
-        <w:divId w:val="1813713723"/>
+        <w:divId w:val="2022662291"/>
         <w:rPr>
           <w:lang w:val="nl-NL"/>
         </w:rPr>
@@ -1855,7 +1855,7 @@
     <w:p>
       <w:pPr>
         <w:pStyle w:val="Normaalweb"/>
-        <w:divId w:val="1813713723"/>
+        <w:divId w:val="2022662291"/>
         <w:rPr>
           <w:lang w:val="nl-NL"/>
         </w:rPr>
@@ -1870,13 +1870,13 @@
     <w:p>
       <w:pPr>
         <w:pStyle w:val="Kop2"/>
-        <w:divId w:val="1813713723"/>
+        <w:divId w:val="2022662291"/>
         <w:rPr>
           <w:rFonts w:eastAsia="Times New Roman"/>
           <w:lang w:val="nl-NL"/>
         </w:rPr>
       </w:pPr>
-      <w:bookmarkStart w:id="10" w:name="_Toc242814358"/>
+      <w:bookmarkStart w:id="10" w:name="_Toc242814888"/>
       <w:r>
         <w:rPr>
           <w:rFonts w:eastAsia="Times New Roman"/>
@@ -1889,7 +1889,7 @@
     <w:p>
       <w:pPr>
         <w:pStyle w:val="Normaalweb"/>
-        <w:divId w:val="1813713723"/>
+        <w:divId w:val="2022662291"/>
         <w:rPr>
           <w:lang w:val="nl-NL"/>
         </w:rPr>
@@ -1904,7 +1904,7 @@
     <w:p>
       <w:pPr>
         <w:pStyle w:val="Normaalweb"/>
-        <w:divId w:val="1813713723"/>
+        <w:divId w:val="2022662291"/>
         <w:rPr>
           <w:lang w:val="nl-NL"/>
         </w:rPr>
@@ -1919,13 +1919,13 @@
     <w:p>
       <w:pPr>
         <w:pStyle w:val="Kop2"/>
-        <w:divId w:val="1813713723"/>
+        <w:divId w:val="2022662291"/>
         <w:rPr>
           <w:rFonts w:eastAsia="Times New Roman"/>
           <w:lang w:val="nl-NL"/>
         </w:rPr>
       </w:pPr>
-      <w:bookmarkStart w:id="11" w:name="_Toc242814359"/>
+      <w:bookmarkStart w:id="11" w:name="_Toc242814889"/>
       <w:r>
         <w:rPr>
           <w:rFonts w:eastAsia="Times New Roman"/>
@@ -1938,7 +1938,7 @@
     <w:p>
       <w:pPr>
         <w:pStyle w:val="Normaalweb"/>
-        <w:divId w:val="1813713723"/>
+        <w:divId w:val="2022662291"/>
         <w:rPr>
           <w:lang w:val="nl-NL"/>
         </w:rPr>
@@ -1953,7 +1953,7 @@
     <w:p>
       <w:pPr>
         <w:pStyle w:val="Normaalweb"/>
-        <w:divId w:val="1813713723"/>
+        <w:divId w:val="2022662291"/>
         <w:rPr>
           <w:lang w:val="nl-NL"/>
         </w:rPr>
@@ -1968,7 +1968,7 @@
     <w:p>
       <w:pPr>
         <w:shd w:val="clear" w:color="auto" w:fill="FFFFFF"/>
-        <w:divId w:val="22903065"/>
+        <w:divId w:val="434860977"/>
         <w:rPr>
           <w:szCs w:val="22"/>
           <w:lang w:val="nl-NL"/>
@@ -2236,7 +2236,7 @@
         <w:sz w:val="18"/>
       </w:rPr>
       <w:tab/>
-      <w:t>Laatst gewijzigd: 13 oktober 2026, 20:03</w:t>
+      <w:t>Laatst gewijzigd: 13 oktober 2026, 20:12</w:t>
     </w:r>
   </w:p>
 </w:hdr>
@@ -3603,7 +3603,7 @@
     <w:link w:val="KoptekstChar"/>
     <w:uiPriority w:val="99"/>
     <w:unhideWhenUsed/>
-    <w:rsid w:val="006E7213"/>
+    <w:rsid w:val="00A21639"/>
     <w:pPr>
       <w:tabs>
         <w:tab w:val="center" w:pos="4536"/>
@@ -3616,7 +3616,7 @@
     <w:basedOn w:val="Standaardalinea-lettertype"/>
     <w:link w:val="Koptekst"/>
     <w:uiPriority w:val="99"/>
-    <w:rsid w:val="006E7213"/>
+    <w:rsid w:val="00A21639"/>
     <w:rPr>
       <w:rFonts w:eastAsiaTheme="minorEastAsia"/>
       <w:sz w:val="24"/>
@@ -3629,7 +3629,7 @@
     <w:link w:val="VoettekstChar"/>
     <w:uiPriority w:val="99"/>
     <w:unhideWhenUsed/>
-    <w:rsid w:val="006E7213"/>
+    <w:rsid w:val="00A21639"/>
     <w:pPr>
       <w:tabs>
         <w:tab w:val="center" w:pos="4536"/>
@@ -3642,7 +3642,7 @@
     <w:basedOn w:val="Standaardalinea-lettertype"/>
     <w:link w:val="Voettekst"/>
     <w:uiPriority w:val="99"/>
-    <w:rsid w:val="006E7213"/>
+    <w:rsid w:val="00A21639"/>
     <w:rPr>
       <w:rFonts w:eastAsiaTheme="minorEastAsia"/>
       <w:sz w:val="24"/>
@@ -3656,7 +3656,7 @@
     <w:autoRedefine/>
     <w:uiPriority w:val="39"/>
     <w:unhideWhenUsed/>
-    <w:rsid w:val="006E7213"/>
+    <w:rsid w:val="00A21639"/>
     <w:pPr>
       <w:spacing w:after="100"/>
       <w:ind w:left="220"/>
@@ -3669,7 +3669,7 @@
     <w:autoRedefine/>
     <w:uiPriority w:val="39"/>
     <w:unhideWhenUsed/>
-    <w:rsid w:val="006E7213"/>
+    <w:rsid w:val="00A21639"/>
     <w:pPr>
       <w:spacing w:after="100"/>
       <w:ind w:left="440"/>

</xml_diff>

<commit_message>
Update Systeem-Audit NL 13-10-2026 20:31
</commit_message>
<xml_diff>
--- a/nl/docx/document-0.docx
+++ b/nl/docx/document-0.docx
@@ -7,7 +7,7 @@
         <w:spacing w:after="480"/>
         <w:jc w:val="center"/>
         <w:outlineLvl w:val="1"/>
-        <w:divId w:val="2137603451"/>
+        <w:divId w:val="1926107574"/>
         <w:rPr>
           <w:rFonts w:ascii="Aptos Display" w:eastAsia="Times New Roman" w:hAnsi="Aptos Display"/>
           <w:b/>
@@ -36,7 +36,7 @@
     <w:p>
       <w:pPr>
         <w:pStyle w:val="ondertitel2"/>
-        <w:divId w:val="2137603451"/>
+        <w:divId w:val="1926107574"/>
         <w:rPr>
           <w:lang w:val="nl-NL"/>
         </w:rPr>
@@ -51,7 +51,7 @@
     <w:p>
       <w:pPr>
         <w:pStyle w:val="documentaanduiding2"/>
-        <w:divId w:val="2137603451"/>
+        <w:divId w:val="1926107574"/>
         <w:rPr>
           <w:lang w:val="nl-NL"/>
         </w:rPr>
@@ -66,7 +66,7 @@
     <w:p>
       <w:pPr>
         <w:pStyle w:val="auteur2"/>
-        <w:divId w:val="2137603451"/>
+        <w:divId w:val="1926107574"/>
         <w:rPr>
           <w:lang w:val="nl-NL"/>
         </w:rPr>
@@ -81,23 +81,23 @@
     <w:p>
       <w:pPr>
         <w:pStyle w:val="meta-lijn2"/>
-        <w:divId w:val="2137603451"/>
-        <w:rPr>
-          <w:lang w:val="nl-NL"/>
-        </w:rPr>
-      </w:pPr>
-      <w:r>
-        <w:rPr>
-          <w:lang w:val="nl-NL"/>
-        </w:rPr>
-        <w:t>Versie bijgewerkt: 13 oktober 2026, 20:12</w:t>
+        <w:divId w:val="1926107574"/>
+        <w:rPr>
+          <w:lang w:val="nl-NL"/>
+        </w:rPr>
+      </w:pPr>
+      <w:r>
+        <w:rPr>
+          <w:lang w:val="nl-NL"/>
+        </w:rPr>
+        <w:t>Versie bijgewerkt: 13 oktober 2026, 20:31</w:t>
       </w:r>
     </w:p>
     <w:p>
       <w:pPr>
         <w:pStyle w:val="marker"/>
         <w:ind w:left="800" w:right="800"/>
-        <w:divId w:val="2022662291"/>
+        <w:divId w:val="1521626345"/>
         <w:rPr>
           <w:lang w:val="nl-NL"/>
         </w:rPr>
@@ -110,13 +110,13 @@
       <w:pPr>
         <w:pStyle w:val="Kop2"/>
         <w:pageBreakBefore/>
-        <w:divId w:val="1085610764"/>
+        <w:divId w:val="205997245"/>
         <w:rPr>
           <w:rFonts w:eastAsia="Times New Roman"/>
           <w:lang w:val="nl-NL"/>
         </w:rPr>
       </w:pPr>
-      <w:bookmarkStart w:id="0" w:name="_Toc242814878"/>
+      <w:bookmarkStart w:id="0" w:name="_Toc242816026"/>
       <w:r>
         <w:rPr>
           <w:rFonts w:eastAsia="Times New Roman"/>
@@ -133,7 +133,7 @@
         <w:tabs>
           <w:tab w:val="right" w:leader="dot" w:pos="9062"/>
         </w:tabs>
-        <w:divId w:val="1085610764"/>
+        <w:divId w:val="205997245"/>
         <w:rPr>
           <w:rFonts w:asciiTheme="minorHAnsi" w:hAnsiTheme="minorHAnsi" w:cstheme="minorBidi"/>
           <w:noProof/>
@@ -184,7 +184,7 @@
         <w:rPr>
           <w:noProof/>
         </w:rPr>
-        <w:instrText xml:space="preserve"> PAGEREF _Toc242814878 \h </w:instrText>
+        <w:instrText xml:space="preserve"> PAGEREF _Toc242816026 \h </w:instrText>
       </w:r>
       <w:r>
         <w:rPr>
@@ -216,7 +216,7 @@
         <w:tabs>
           <w:tab w:val="right" w:leader="dot" w:pos="9062"/>
         </w:tabs>
-        <w:divId w:val="1085610764"/>
+        <w:divId w:val="205997245"/>
         <w:rPr>
           <w:rFonts w:asciiTheme="minorHAnsi" w:hAnsiTheme="minorHAnsi" w:cstheme="minorBidi"/>
           <w:noProof/>
@@ -249,7 +249,7 @@
         <w:rPr>
           <w:noProof/>
         </w:rPr>
-        <w:instrText xml:space="preserve"> PAGEREF _Toc242814879 \h </w:instrText>
+        <w:instrText xml:space="preserve"> PAGEREF _Toc242816027 \h </w:instrText>
       </w:r>
       <w:r>
         <w:rPr>
@@ -281,7 +281,7 @@
         <w:tabs>
           <w:tab w:val="right" w:leader="dot" w:pos="9062"/>
         </w:tabs>
-        <w:divId w:val="1085610764"/>
+        <w:divId w:val="205997245"/>
         <w:rPr>
           <w:rFonts w:asciiTheme="minorHAnsi" w:hAnsiTheme="minorHAnsi" w:cstheme="minorBidi"/>
           <w:noProof/>
@@ -314,7 +314,7 @@
         <w:rPr>
           <w:noProof/>
         </w:rPr>
-        <w:instrText xml:space="preserve"> PAGEREF _Toc242814880 \h </w:instrText>
+        <w:instrText xml:space="preserve"> PAGEREF _Toc242816028 \h </w:instrText>
       </w:r>
       <w:r>
         <w:rPr>
@@ -346,7 +346,7 @@
         <w:tabs>
           <w:tab w:val="right" w:leader="dot" w:pos="9062"/>
         </w:tabs>
-        <w:divId w:val="1085610764"/>
+        <w:divId w:val="205997245"/>
         <w:rPr>
           <w:rFonts w:asciiTheme="minorHAnsi" w:hAnsiTheme="minorHAnsi" w:cstheme="minorBidi"/>
           <w:noProof/>
@@ -379,7 +379,7 @@
         <w:rPr>
           <w:noProof/>
         </w:rPr>
-        <w:instrText xml:space="preserve"> PAGEREF _Toc242814881 \h </w:instrText>
+        <w:instrText xml:space="preserve"> PAGEREF _Toc242816029 \h </w:instrText>
       </w:r>
       <w:r>
         <w:rPr>
@@ -411,7 +411,7 @@
         <w:tabs>
           <w:tab w:val="right" w:leader="dot" w:pos="9062"/>
         </w:tabs>
-        <w:divId w:val="1085610764"/>
+        <w:divId w:val="205997245"/>
         <w:rPr>
           <w:rFonts w:asciiTheme="minorHAnsi" w:hAnsiTheme="minorHAnsi" w:cstheme="minorBidi"/>
           <w:noProof/>
@@ -444,7 +444,7 @@
         <w:rPr>
           <w:noProof/>
         </w:rPr>
-        <w:instrText xml:space="preserve"> PAGEREF _Toc242814882 \h </w:instrText>
+        <w:instrText xml:space="preserve"> PAGEREF _Toc242816030 \h </w:instrText>
       </w:r>
       <w:r>
         <w:rPr>
@@ -476,7 +476,7 @@
         <w:tabs>
           <w:tab w:val="right" w:leader="dot" w:pos="9062"/>
         </w:tabs>
-        <w:divId w:val="1085610764"/>
+        <w:divId w:val="205997245"/>
         <w:rPr>
           <w:rFonts w:asciiTheme="minorHAnsi" w:hAnsiTheme="minorHAnsi" w:cstheme="minorBidi"/>
           <w:noProof/>
@@ -509,7 +509,7 @@
         <w:rPr>
           <w:noProof/>
         </w:rPr>
-        <w:instrText xml:space="preserve"> PAGEREF _Toc242814883 \h </w:instrText>
+        <w:instrText xml:space="preserve"> PAGEREF _Toc242816031 \h </w:instrText>
       </w:r>
       <w:r>
         <w:rPr>
@@ -541,7 +541,7 @@
         <w:tabs>
           <w:tab w:val="right" w:leader="dot" w:pos="9062"/>
         </w:tabs>
-        <w:divId w:val="1085610764"/>
+        <w:divId w:val="205997245"/>
         <w:rPr>
           <w:rFonts w:asciiTheme="minorHAnsi" w:hAnsiTheme="minorHAnsi" w:cstheme="minorBidi"/>
           <w:noProof/>
@@ -574,7 +574,7 @@
         <w:rPr>
           <w:noProof/>
         </w:rPr>
-        <w:instrText xml:space="preserve"> PAGEREF _Toc242814884 \h </w:instrText>
+        <w:instrText xml:space="preserve"> PAGEREF _Toc242816032 \h </w:instrText>
       </w:r>
       <w:r>
         <w:rPr>
@@ -606,7 +606,7 @@
         <w:tabs>
           <w:tab w:val="right" w:leader="dot" w:pos="9062"/>
         </w:tabs>
-        <w:divId w:val="1085610764"/>
+        <w:divId w:val="205997245"/>
         <w:rPr>
           <w:rFonts w:asciiTheme="minorHAnsi" w:hAnsiTheme="minorHAnsi" w:cstheme="minorBidi"/>
           <w:noProof/>
@@ -639,7 +639,7 @@
         <w:rPr>
           <w:noProof/>
         </w:rPr>
-        <w:instrText xml:space="preserve"> PAGEREF _Toc242814885 \h </w:instrText>
+        <w:instrText xml:space="preserve"> PAGEREF _Toc242816033 \h </w:instrText>
       </w:r>
       <w:r>
         <w:rPr>
@@ -671,7 +671,7 @@
         <w:tabs>
           <w:tab w:val="right" w:leader="dot" w:pos="9062"/>
         </w:tabs>
-        <w:divId w:val="1085610764"/>
+        <w:divId w:val="205997245"/>
         <w:rPr>
           <w:rFonts w:asciiTheme="minorHAnsi" w:hAnsiTheme="minorHAnsi" w:cstheme="minorBidi"/>
           <w:noProof/>
@@ -704,7 +704,7 @@
         <w:rPr>
           <w:noProof/>
         </w:rPr>
-        <w:instrText xml:space="preserve"> PAGEREF _Toc242814886 \h </w:instrText>
+        <w:instrText xml:space="preserve"> PAGEREF _Toc242816034 \h </w:instrText>
       </w:r>
       <w:r>
         <w:rPr>
@@ -736,7 +736,7 @@
         <w:tabs>
           <w:tab w:val="right" w:leader="dot" w:pos="9062"/>
         </w:tabs>
-        <w:divId w:val="1085610764"/>
+        <w:divId w:val="205997245"/>
         <w:rPr>
           <w:rFonts w:asciiTheme="minorHAnsi" w:hAnsiTheme="minorHAnsi" w:cstheme="minorBidi"/>
           <w:noProof/>
@@ -769,7 +769,7 @@
         <w:rPr>
           <w:noProof/>
         </w:rPr>
-        <w:instrText xml:space="preserve"> PAGEREF _Toc242814887 \h </w:instrText>
+        <w:instrText xml:space="preserve"> PAGEREF _Toc242816035 \h </w:instrText>
       </w:r>
       <w:r>
         <w:rPr>
@@ -801,7 +801,7 @@
         <w:tabs>
           <w:tab w:val="right" w:leader="dot" w:pos="9062"/>
         </w:tabs>
-        <w:divId w:val="1085610764"/>
+        <w:divId w:val="205997245"/>
         <w:rPr>
           <w:rFonts w:asciiTheme="minorHAnsi" w:hAnsiTheme="minorHAnsi" w:cstheme="minorBidi"/>
           <w:noProof/>
@@ -834,7 +834,7 @@
         <w:rPr>
           <w:noProof/>
         </w:rPr>
-        <w:instrText xml:space="preserve"> PAGEREF _Toc242814888 \h </w:instrText>
+        <w:instrText xml:space="preserve"> PAGEREF _Toc242816036 \h </w:instrText>
       </w:r>
       <w:r>
         <w:rPr>
@@ -866,7 +866,7 @@
         <w:tabs>
           <w:tab w:val="right" w:leader="dot" w:pos="9062"/>
         </w:tabs>
-        <w:divId w:val="1085610764"/>
+        <w:divId w:val="205997245"/>
         <w:rPr>
           <w:rFonts w:asciiTheme="minorHAnsi" w:hAnsiTheme="minorHAnsi" w:cstheme="minorBidi"/>
           <w:noProof/>
@@ -899,7 +899,7 @@
         <w:rPr>
           <w:noProof/>
         </w:rPr>
-        <w:instrText xml:space="preserve"> PAGEREF _Toc242814889 \h </w:instrText>
+        <w:instrText xml:space="preserve"> PAGEREF _Toc242816037 \h </w:instrText>
       </w:r>
       <w:r>
         <w:rPr>
@@ -928,7 +928,7 @@
     <w:p>
       <w:pPr>
         <w:pStyle w:val="marker"/>
-        <w:divId w:val="1085610764"/>
+        <w:divId w:val="205997245"/>
         <w:rPr>
           <w:lang w:val="nl-NL"/>
         </w:rPr>
@@ -944,7 +944,7 @@
       <w:pPr>
         <w:pStyle w:val="marker"/>
         <w:ind w:left="800" w:right="800"/>
-        <w:divId w:val="2022662291"/>
+        <w:divId w:val="1521626345"/>
         <w:rPr>
           <w:lang w:val="nl-NL"/>
         </w:rPr>
@@ -956,13 +956,13 @@
     <w:p>
       <w:pPr>
         <w:pStyle w:val="Kop2"/>
-        <w:divId w:val="2022662291"/>
+        <w:divId w:val="1521626345"/>
         <w:rPr>
           <w:rFonts w:eastAsia="Times New Roman"/>
           <w:lang w:val="nl-NL"/>
         </w:rPr>
       </w:pPr>
-      <w:bookmarkStart w:id="1" w:name="_Toc242814879"/>
+      <w:bookmarkStart w:id="1" w:name="_Toc242816027"/>
       <w:r>
         <w:rPr>
           <w:rFonts w:eastAsia="Times New Roman"/>
@@ -975,7 +975,7 @@
     <w:p>
       <w:pPr>
         <w:pStyle w:val="Normaalweb"/>
-        <w:divId w:val="2022662291"/>
+        <w:divId w:val="1521626345"/>
         <w:rPr>
           <w:lang w:val="nl-NL"/>
         </w:rPr>
@@ -990,7 +990,7 @@
     <w:p>
       <w:pPr>
         <w:pStyle w:val="Normaalweb"/>
-        <w:divId w:val="2022662291"/>
+        <w:divId w:val="1521626345"/>
         <w:rPr>
           <w:lang w:val="nl-NL"/>
         </w:rPr>
@@ -1018,7 +1018,7 @@
     <w:p>
       <w:pPr>
         <w:pStyle w:val="Normaalweb"/>
-        <w:divId w:val="2022662291"/>
+        <w:divId w:val="1521626345"/>
         <w:rPr>
           <w:lang w:val="nl-NL"/>
         </w:rPr>
@@ -1039,7 +1039,7 @@
     <w:p>
       <w:pPr>
         <w:pStyle w:val="Normaalweb"/>
-        <w:divId w:val="2022662291"/>
+        <w:divId w:val="1521626345"/>
         <w:rPr>
           <w:lang w:val="nl-NL"/>
         </w:rPr>
@@ -1086,7 +1086,7 @@
     <w:p>
       <w:pPr>
         <w:pStyle w:val="Normaalweb"/>
-        <w:divId w:val="2022662291"/>
+        <w:divId w:val="1521626345"/>
         <w:rPr>
           <w:lang w:val="nl-NL"/>
         </w:rPr>
@@ -1114,7 +1114,7 @@
     <w:p>
       <w:pPr>
         <w:pStyle w:val="Normaalweb"/>
-        <w:divId w:val="2022662291"/>
+        <w:divId w:val="1521626345"/>
         <w:rPr>
           <w:lang w:val="nl-NL"/>
         </w:rPr>
@@ -1148,7 +1148,7 @@
     <w:p>
       <w:pPr>
         <w:pStyle w:val="Normaalweb"/>
-        <w:divId w:val="2022662291"/>
+        <w:divId w:val="1521626345"/>
         <w:rPr>
           <w:lang w:val="nl-NL"/>
         </w:rPr>
@@ -1175,7 +1175,7 @@
     <w:p>
       <w:pPr>
         <w:pStyle w:val="Normaalweb"/>
-        <w:divId w:val="2022662291"/>
+        <w:divId w:val="1521626345"/>
         <w:rPr>
           <w:lang w:val="nl-NL"/>
         </w:rPr>
@@ -1203,7 +1203,7 @@
     <w:p>
       <w:pPr>
         <w:pStyle w:val="Normaalweb"/>
-        <w:divId w:val="2022662291"/>
+        <w:divId w:val="1521626345"/>
         <w:rPr>
           <w:lang w:val="nl-NL"/>
         </w:rPr>
@@ -1218,7 +1218,7 @@
     <w:p>
       <w:pPr>
         <w:pStyle w:val="Normaalweb"/>
-        <w:divId w:val="2022662291"/>
+        <w:divId w:val="1521626345"/>
         <w:rPr>
           <w:lang w:val="nl-NL"/>
         </w:rPr>
@@ -1278,7 +1278,7 @@
     <w:p>
       <w:pPr>
         <w:pStyle w:val="Normaalweb"/>
-        <w:divId w:val="2022662291"/>
+        <w:divId w:val="1521626345"/>
         <w:rPr>
           <w:lang w:val="nl-NL"/>
         </w:rPr>
@@ -1293,7 +1293,7 @@
     <w:p>
       <w:pPr>
         <w:pStyle w:val="Normaalweb"/>
-        <w:divId w:val="2022662291"/>
+        <w:divId w:val="1521626345"/>
         <w:rPr>
           <w:lang w:val="nl-NL"/>
         </w:rPr>
@@ -1321,7 +1321,7 @@
     <w:p>
       <w:pPr>
         <w:pStyle w:val="Normaalweb"/>
-        <w:divId w:val="2022662291"/>
+        <w:divId w:val="1521626345"/>
         <w:rPr>
           <w:lang w:val="nl-NL"/>
         </w:rPr>
@@ -1336,7 +1336,7 @@
     <w:p>
       <w:pPr>
         <w:pStyle w:val="Normaalweb"/>
-        <w:divId w:val="2022662291"/>
+        <w:divId w:val="1521626345"/>
         <w:rPr>
           <w:lang w:val="nl-NL"/>
         </w:rPr>
@@ -1351,7 +1351,7 @@
     <w:p>
       <w:pPr>
         <w:pStyle w:val="Normaalweb"/>
-        <w:divId w:val="2022662291"/>
+        <w:divId w:val="1521626345"/>
         <w:rPr>
           <w:lang w:val="nl-NL"/>
         </w:rPr>
@@ -1366,7 +1366,7 @@
     <w:p>
       <w:pPr>
         <w:spacing w:before="300" w:after="200"/>
-        <w:divId w:val="2022662291"/>
+        <w:divId w:val="1521626345"/>
         <w:rPr>
           <w:rFonts w:eastAsia="Times New Roman"/>
           <w:lang w:val="nl-NL"/>
@@ -1377,14 +1377,14 @@
           <w:rFonts w:eastAsia="Times New Roman"/>
           <w:lang w:val="nl-NL"/>
         </w:rPr>
-        <w:pict w14:anchorId="5BE1B71F">
+        <w:pict w14:anchorId="299D84BA">
           <v:rect id="_x0000_i1025" style="width:0;height:1.5pt" o:hralign="center" o:hrstd="t" o:hr="t" fillcolor="#a0a0a0" stroked="f"/>
         </w:pict>
       </w:r>
     </w:p>
     <w:p>
       <w:pPr>
-        <w:divId w:val="447554783"/>
+        <w:divId w:val="797064970"/>
         <w:rPr>
           <w:color w:val="555555"/>
           <w:sz w:val="20"/>
@@ -1423,7 +1423,7 @@
     </w:p>
     <w:p>
       <w:pPr>
-        <w:divId w:val="447554783"/>
+        <w:divId w:val="797064970"/>
         <w:rPr>
           <w:color w:val="555555"/>
           <w:sz w:val="20"/>
@@ -1463,7 +1463,7 @@
     </w:p>
     <w:p>
       <w:pPr>
-        <w:divId w:val="447554783"/>
+        <w:divId w:val="797064970"/>
         <w:rPr>
           <w:color w:val="555555"/>
           <w:sz w:val="20"/>
@@ -1493,7 +1493,7 @@
     </w:p>
     <w:p>
       <w:pPr>
-        <w:divId w:val="447554783"/>
+        <w:divId w:val="797064970"/>
         <w:rPr>
           <w:color w:val="555555"/>
           <w:sz w:val="20"/>
@@ -1525,7 +1525,7 @@
       <w:pPr>
         <w:pStyle w:val="marker"/>
         <w:ind w:left="800" w:right="800"/>
-        <w:divId w:val="2022662291"/>
+        <w:divId w:val="1521626345"/>
         <w:rPr>
           <w:lang w:val="nl-NL"/>
         </w:rPr>
@@ -1537,13 +1537,13 @@
     <w:p>
       <w:pPr>
         <w:pStyle w:val="Kop2"/>
-        <w:divId w:val="2022662291"/>
+        <w:divId w:val="1521626345"/>
         <w:rPr>
           <w:rFonts w:eastAsia="Times New Roman"/>
           <w:lang w:val="nl-NL"/>
         </w:rPr>
       </w:pPr>
-      <w:bookmarkStart w:id="2" w:name="_Toc242814880"/>
+      <w:bookmarkStart w:id="2" w:name="_Toc242816028"/>
       <w:r>
         <w:rPr>
           <w:rFonts w:eastAsia="Times New Roman"/>
@@ -1556,7 +1556,7 @@
     <w:p>
       <w:pPr>
         <w:pStyle w:val="Normaalweb"/>
-        <w:divId w:val="2022662291"/>
+        <w:divId w:val="1521626345"/>
         <w:rPr>
           <w:lang w:val="nl-NL"/>
         </w:rPr>
@@ -1571,7 +1571,7 @@
     <w:p>
       <w:pPr>
         <w:pStyle w:val="Normaalweb"/>
-        <w:divId w:val="2022662291"/>
+        <w:divId w:val="1521626345"/>
         <w:rPr>
           <w:lang w:val="nl-NL"/>
         </w:rPr>
@@ -1586,7 +1586,7 @@
     <w:p>
       <w:pPr>
         <w:pStyle w:val="Normaalweb"/>
-        <w:divId w:val="2022662291"/>
+        <w:divId w:val="1521626345"/>
         <w:rPr>
           <w:lang w:val="nl-NL"/>
         </w:rPr>
@@ -1601,13 +1601,13 @@
     <w:p>
       <w:pPr>
         <w:pStyle w:val="Kop2"/>
-        <w:divId w:val="2022662291"/>
+        <w:divId w:val="1521626345"/>
         <w:rPr>
           <w:rFonts w:eastAsia="Times New Roman"/>
           <w:lang w:val="nl-NL"/>
         </w:rPr>
       </w:pPr>
-      <w:bookmarkStart w:id="3" w:name="_Toc242814881"/>
+      <w:bookmarkStart w:id="3" w:name="_Toc242816029"/>
       <w:r>
         <w:rPr>
           <w:rFonts w:eastAsia="Times New Roman"/>
@@ -1620,7 +1620,7 @@
     <w:p>
       <w:pPr>
         <w:pStyle w:val="Normaalweb"/>
-        <w:divId w:val="2022662291"/>
+        <w:divId w:val="1521626345"/>
         <w:rPr>
           <w:lang w:val="nl-NL"/>
         </w:rPr>
@@ -1635,13 +1635,13 @@
     <w:p>
       <w:pPr>
         <w:pStyle w:val="Kop2"/>
-        <w:divId w:val="2022662291"/>
+        <w:divId w:val="1521626345"/>
         <w:rPr>
           <w:rFonts w:eastAsia="Times New Roman"/>
           <w:lang w:val="nl-NL"/>
         </w:rPr>
       </w:pPr>
-      <w:bookmarkStart w:id="4" w:name="_Toc242814882"/>
+      <w:bookmarkStart w:id="4" w:name="_Toc242816030"/>
       <w:r>
         <w:rPr>
           <w:rFonts w:eastAsia="Times New Roman"/>
@@ -1654,7 +1654,7 @@
     <w:p>
       <w:pPr>
         <w:pStyle w:val="Normaalweb"/>
-        <w:divId w:val="2022662291"/>
+        <w:divId w:val="1521626345"/>
         <w:rPr>
           <w:lang w:val="nl-NL"/>
         </w:rPr>
@@ -1669,13 +1669,13 @@
     <w:p>
       <w:pPr>
         <w:pStyle w:val="Kop3"/>
-        <w:divId w:val="2022662291"/>
+        <w:divId w:val="1521626345"/>
         <w:rPr>
           <w:rFonts w:eastAsia="Times New Roman"/>
           <w:lang w:val="nl-NL"/>
         </w:rPr>
       </w:pPr>
-      <w:bookmarkStart w:id="5" w:name="_Toc242814883"/>
+      <w:bookmarkStart w:id="5" w:name="_Toc242816031"/>
       <w:r>
         <w:rPr>
           <w:rFonts w:eastAsia="Times New Roman"/>
@@ -1688,7 +1688,7 @@
     <w:p>
       <w:pPr>
         <w:pStyle w:val="Normaalweb"/>
-        <w:divId w:val="2022662291"/>
+        <w:divId w:val="1521626345"/>
         <w:rPr>
           <w:lang w:val="nl-NL"/>
         </w:rPr>
@@ -1703,13 +1703,13 @@
     <w:p>
       <w:pPr>
         <w:pStyle w:val="Kop3"/>
-        <w:divId w:val="2022662291"/>
+        <w:divId w:val="1521626345"/>
         <w:rPr>
           <w:rFonts w:eastAsia="Times New Roman"/>
           <w:lang w:val="nl-NL"/>
         </w:rPr>
       </w:pPr>
-      <w:bookmarkStart w:id="6" w:name="_Toc242814884"/>
+      <w:bookmarkStart w:id="6" w:name="_Toc242816032"/>
       <w:r>
         <w:rPr>
           <w:rFonts w:eastAsia="Times New Roman"/>
@@ -1722,7 +1722,7 @@
     <w:p>
       <w:pPr>
         <w:pStyle w:val="Normaalweb"/>
-        <w:divId w:val="2022662291"/>
+        <w:divId w:val="1521626345"/>
         <w:rPr>
           <w:lang w:val="nl-NL"/>
         </w:rPr>
@@ -1737,13 +1737,13 @@
     <w:p>
       <w:pPr>
         <w:pStyle w:val="Kop3"/>
-        <w:divId w:val="2022662291"/>
+        <w:divId w:val="1521626345"/>
         <w:rPr>
           <w:rFonts w:eastAsia="Times New Roman"/>
           <w:lang w:val="nl-NL"/>
         </w:rPr>
       </w:pPr>
-      <w:bookmarkStart w:id="7" w:name="_Toc242814885"/>
+      <w:bookmarkStart w:id="7" w:name="_Toc242816033"/>
       <w:r>
         <w:rPr>
           <w:rFonts w:eastAsia="Times New Roman"/>
@@ -1756,7 +1756,7 @@
     <w:p>
       <w:pPr>
         <w:pStyle w:val="Normaalweb"/>
-        <w:divId w:val="2022662291"/>
+        <w:divId w:val="1521626345"/>
         <w:rPr>
           <w:lang w:val="nl-NL"/>
         </w:rPr>
@@ -1771,13 +1771,13 @@
     <w:p>
       <w:pPr>
         <w:pStyle w:val="Kop3"/>
-        <w:divId w:val="2022662291"/>
+        <w:divId w:val="1521626345"/>
         <w:rPr>
           <w:rFonts w:eastAsia="Times New Roman"/>
           <w:lang w:val="nl-NL"/>
         </w:rPr>
       </w:pPr>
-      <w:bookmarkStart w:id="8" w:name="_Toc242814886"/>
+      <w:bookmarkStart w:id="8" w:name="_Toc242816034"/>
       <w:r>
         <w:rPr>
           <w:rFonts w:eastAsia="Times New Roman"/>
@@ -1790,7 +1790,7 @@
     <w:p>
       <w:pPr>
         <w:pStyle w:val="Normaalweb"/>
-        <w:divId w:val="2022662291"/>
+        <w:divId w:val="1521626345"/>
         <w:rPr>
           <w:lang w:val="nl-NL"/>
         </w:rPr>
@@ -1806,13 +1806,13 @@
     <w:p>
       <w:pPr>
         <w:pStyle w:val="Kop2"/>
-        <w:divId w:val="2022662291"/>
+        <w:divId w:val="1521626345"/>
         <w:rPr>
           <w:rFonts w:eastAsia="Times New Roman"/>
           <w:lang w:val="nl-NL"/>
         </w:rPr>
       </w:pPr>
-      <w:bookmarkStart w:id="9" w:name="_Toc242814887"/>
+      <w:bookmarkStart w:id="9" w:name="_Toc242816035"/>
       <w:r>
         <w:rPr>
           <w:rFonts w:eastAsia="Times New Roman"/>
@@ -1825,7 +1825,7 @@
     <w:p>
       <w:pPr>
         <w:pStyle w:val="Normaalweb"/>
-        <w:divId w:val="2022662291"/>
+        <w:divId w:val="1521626345"/>
         <w:rPr>
           <w:lang w:val="nl-NL"/>
         </w:rPr>
@@ -1840,7 +1840,7 @@
     <w:p>
       <w:pPr>
         <w:pStyle w:val="Normaalweb"/>
-        <w:divId w:val="2022662291"/>
+        <w:divId w:val="1521626345"/>
         <w:rPr>
           <w:lang w:val="nl-NL"/>
         </w:rPr>
@@ -1855,7 +1855,7 @@
     <w:p>
       <w:pPr>
         <w:pStyle w:val="Normaalweb"/>
-        <w:divId w:val="2022662291"/>
+        <w:divId w:val="1521626345"/>
         <w:rPr>
           <w:lang w:val="nl-NL"/>
         </w:rPr>
@@ -1870,13 +1870,13 @@
     <w:p>
       <w:pPr>
         <w:pStyle w:val="Kop2"/>
-        <w:divId w:val="2022662291"/>
+        <w:divId w:val="1521626345"/>
         <w:rPr>
           <w:rFonts w:eastAsia="Times New Roman"/>
           <w:lang w:val="nl-NL"/>
         </w:rPr>
       </w:pPr>
-      <w:bookmarkStart w:id="10" w:name="_Toc242814888"/>
+      <w:bookmarkStart w:id="10" w:name="_Toc242816036"/>
       <w:r>
         <w:rPr>
           <w:rFonts w:eastAsia="Times New Roman"/>
@@ -1889,7 +1889,7 @@
     <w:p>
       <w:pPr>
         <w:pStyle w:val="Normaalweb"/>
-        <w:divId w:val="2022662291"/>
+        <w:divId w:val="1521626345"/>
         <w:rPr>
           <w:lang w:val="nl-NL"/>
         </w:rPr>
@@ -1904,7 +1904,7 @@
     <w:p>
       <w:pPr>
         <w:pStyle w:val="Normaalweb"/>
-        <w:divId w:val="2022662291"/>
+        <w:divId w:val="1521626345"/>
         <w:rPr>
           <w:lang w:val="nl-NL"/>
         </w:rPr>
@@ -1919,13 +1919,13 @@
     <w:p>
       <w:pPr>
         <w:pStyle w:val="Kop2"/>
-        <w:divId w:val="2022662291"/>
+        <w:divId w:val="1521626345"/>
         <w:rPr>
           <w:rFonts w:eastAsia="Times New Roman"/>
           <w:lang w:val="nl-NL"/>
         </w:rPr>
       </w:pPr>
-      <w:bookmarkStart w:id="11" w:name="_Toc242814889"/>
+      <w:bookmarkStart w:id="11" w:name="_Toc242816037"/>
       <w:r>
         <w:rPr>
           <w:rFonts w:eastAsia="Times New Roman"/>
@@ -1938,7 +1938,7 @@
     <w:p>
       <w:pPr>
         <w:pStyle w:val="Normaalweb"/>
-        <w:divId w:val="2022662291"/>
+        <w:divId w:val="1521626345"/>
         <w:rPr>
           <w:lang w:val="nl-NL"/>
         </w:rPr>
@@ -1953,7 +1953,7 @@
     <w:p>
       <w:pPr>
         <w:pStyle w:val="Normaalweb"/>
-        <w:divId w:val="2022662291"/>
+        <w:divId w:val="1521626345"/>
         <w:rPr>
           <w:lang w:val="nl-NL"/>
         </w:rPr>
@@ -1968,7 +1968,7 @@
     <w:p>
       <w:pPr>
         <w:shd w:val="clear" w:color="auto" w:fill="FFFFFF"/>
-        <w:divId w:val="434860977"/>
+        <w:divId w:val="230316501"/>
         <w:rPr>
           <w:szCs w:val="22"/>
           <w:lang w:val="nl-NL"/>
@@ -2144,7 +2144,7 @@
         <w:color w:val="808080"/>
         <w:sz w:val="18"/>
       </w:rPr>
-      <w:t>3</w:t>
+      <w:t>5</w:t>
     </w:r>
     <w:r>
       <w:rPr>
@@ -2236,7 +2236,7 @@
         <w:sz w:val="18"/>
       </w:rPr>
       <w:tab/>
-      <w:t>Laatst gewijzigd: 13 oktober 2026, 20:12</w:t>
+      <w:t>Laatst gewijzigd: 13 oktober 2026, 20:31</w:t>
     </w:r>
   </w:p>
 </w:hdr>
@@ -3603,7 +3603,7 @@
     <w:link w:val="KoptekstChar"/>
     <w:uiPriority w:val="99"/>
     <w:unhideWhenUsed/>
-    <w:rsid w:val="00A21639"/>
+    <w:rsid w:val="001339A9"/>
     <w:pPr>
       <w:tabs>
         <w:tab w:val="center" w:pos="4536"/>
@@ -3616,7 +3616,7 @@
     <w:basedOn w:val="Standaardalinea-lettertype"/>
     <w:link w:val="Koptekst"/>
     <w:uiPriority w:val="99"/>
-    <w:rsid w:val="00A21639"/>
+    <w:rsid w:val="001339A9"/>
     <w:rPr>
       <w:rFonts w:eastAsiaTheme="minorEastAsia"/>
       <w:sz w:val="24"/>
@@ -3629,7 +3629,7 @@
     <w:link w:val="VoettekstChar"/>
     <w:uiPriority w:val="99"/>
     <w:unhideWhenUsed/>
-    <w:rsid w:val="00A21639"/>
+    <w:rsid w:val="001339A9"/>
     <w:pPr>
       <w:tabs>
         <w:tab w:val="center" w:pos="4536"/>
@@ -3642,7 +3642,7 @@
     <w:basedOn w:val="Standaardalinea-lettertype"/>
     <w:link w:val="Voettekst"/>
     <w:uiPriority w:val="99"/>
-    <w:rsid w:val="00A21639"/>
+    <w:rsid w:val="001339A9"/>
     <w:rPr>
       <w:rFonts w:eastAsiaTheme="minorEastAsia"/>
       <w:sz w:val="24"/>
@@ -3656,7 +3656,7 @@
     <w:autoRedefine/>
     <w:uiPriority w:val="39"/>
     <w:unhideWhenUsed/>
-    <w:rsid w:val="00A21639"/>
+    <w:rsid w:val="001339A9"/>
     <w:pPr>
       <w:spacing w:after="100"/>
       <w:ind w:left="220"/>
@@ -3669,7 +3669,7 @@
     <w:autoRedefine/>
     <w:uiPriority w:val="39"/>
     <w:unhideWhenUsed/>
-    <w:rsid w:val="00A21639"/>
+    <w:rsid w:val="001339A9"/>
     <w:pPr>
       <w:spacing w:after="100"/>
       <w:ind w:left="440"/>

</xml_diff>

<commit_message>
Update Systeem-Audit NL 13-10-2026 20:41
</commit_message>
<xml_diff>
--- a/nl/docx/document-0.docx
+++ b/nl/docx/document-0.docx
@@ -7,7 +7,7 @@
         <w:spacing w:after="480"/>
         <w:jc w:val="center"/>
         <w:outlineLvl w:val="1"/>
-        <w:divId w:val="1926107574"/>
+        <w:divId w:val="794981832"/>
         <w:rPr>
           <w:rFonts w:ascii="Aptos Display" w:eastAsia="Times New Roman" w:hAnsi="Aptos Display"/>
           <w:b/>
@@ -36,7 +36,7 @@
     <w:p>
       <w:pPr>
         <w:pStyle w:val="ondertitel2"/>
-        <w:divId w:val="1926107574"/>
+        <w:divId w:val="794981832"/>
         <w:rPr>
           <w:lang w:val="nl-NL"/>
         </w:rPr>
@@ -51,7 +51,7 @@
     <w:p>
       <w:pPr>
         <w:pStyle w:val="documentaanduiding2"/>
-        <w:divId w:val="1926107574"/>
+        <w:divId w:val="794981832"/>
         <w:rPr>
           <w:lang w:val="nl-NL"/>
         </w:rPr>
@@ -66,7 +66,7 @@
     <w:p>
       <w:pPr>
         <w:pStyle w:val="auteur2"/>
-        <w:divId w:val="1926107574"/>
+        <w:divId w:val="794981832"/>
         <w:rPr>
           <w:lang w:val="nl-NL"/>
         </w:rPr>
@@ -81,23 +81,23 @@
     <w:p>
       <w:pPr>
         <w:pStyle w:val="meta-lijn2"/>
-        <w:divId w:val="1926107574"/>
-        <w:rPr>
-          <w:lang w:val="nl-NL"/>
-        </w:rPr>
-      </w:pPr>
-      <w:r>
-        <w:rPr>
-          <w:lang w:val="nl-NL"/>
-        </w:rPr>
-        <w:t>Versie bijgewerkt: 13 oktober 2026, 20:31</w:t>
+        <w:divId w:val="794981832"/>
+        <w:rPr>
+          <w:lang w:val="nl-NL"/>
+        </w:rPr>
+      </w:pPr>
+      <w:r>
+        <w:rPr>
+          <w:lang w:val="nl-NL"/>
+        </w:rPr>
+        <w:t>Versie bijgewerkt: 13 oktober 2026, 20:41</w:t>
       </w:r>
     </w:p>
     <w:p>
       <w:pPr>
         <w:pStyle w:val="marker"/>
         <w:ind w:left="800" w:right="800"/>
-        <w:divId w:val="1521626345"/>
+        <w:divId w:val="1726875716"/>
         <w:rPr>
           <w:lang w:val="nl-NL"/>
         </w:rPr>
@@ -110,13 +110,13 @@
       <w:pPr>
         <w:pStyle w:val="Kop2"/>
         <w:pageBreakBefore/>
-        <w:divId w:val="205997245"/>
+        <w:divId w:val="892232803"/>
         <w:rPr>
           <w:rFonts w:eastAsia="Times New Roman"/>
           <w:lang w:val="nl-NL"/>
         </w:rPr>
       </w:pPr>
-      <w:bookmarkStart w:id="0" w:name="_Toc242816026"/>
+      <w:bookmarkStart w:id="0" w:name="_Toc242816568"/>
       <w:r>
         <w:rPr>
           <w:rFonts w:eastAsia="Times New Roman"/>
@@ -133,7 +133,7 @@
         <w:tabs>
           <w:tab w:val="right" w:leader="dot" w:pos="9062"/>
         </w:tabs>
-        <w:divId w:val="205997245"/>
+        <w:divId w:val="892232803"/>
         <w:rPr>
           <w:rFonts w:asciiTheme="minorHAnsi" w:hAnsiTheme="minorHAnsi" w:cstheme="minorBidi"/>
           <w:noProof/>
@@ -184,7 +184,7 @@
         <w:rPr>
           <w:noProof/>
         </w:rPr>
-        <w:instrText xml:space="preserve"> PAGEREF _Toc242816026 \h </w:instrText>
+        <w:instrText xml:space="preserve"> PAGEREF _Toc242816568 \h </w:instrText>
       </w:r>
       <w:r>
         <w:rPr>
@@ -216,7 +216,7 @@
         <w:tabs>
           <w:tab w:val="right" w:leader="dot" w:pos="9062"/>
         </w:tabs>
-        <w:divId w:val="205997245"/>
+        <w:divId w:val="892232803"/>
         <w:rPr>
           <w:rFonts w:asciiTheme="minorHAnsi" w:hAnsiTheme="minorHAnsi" w:cstheme="minorBidi"/>
           <w:noProof/>
@@ -249,7 +249,7 @@
         <w:rPr>
           <w:noProof/>
         </w:rPr>
-        <w:instrText xml:space="preserve"> PAGEREF _Toc242816027 \h </w:instrText>
+        <w:instrText xml:space="preserve"> PAGEREF _Toc242816569 \h </w:instrText>
       </w:r>
       <w:r>
         <w:rPr>
@@ -281,7 +281,7 @@
         <w:tabs>
           <w:tab w:val="right" w:leader="dot" w:pos="9062"/>
         </w:tabs>
-        <w:divId w:val="205997245"/>
+        <w:divId w:val="892232803"/>
         <w:rPr>
           <w:rFonts w:asciiTheme="minorHAnsi" w:hAnsiTheme="minorHAnsi" w:cstheme="minorBidi"/>
           <w:noProof/>
@@ -314,7 +314,7 @@
         <w:rPr>
           <w:noProof/>
         </w:rPr>
-        <w:instrText xml:space="preserve"> PAGEREF _Toc242816028 \h </w:instrText>
+        <w:instrText xml:space="preserve"> PAGEREF _Toc242816570 \h </w:instrText>
       </w:r>
       <w:r>
         <w:rPr>
@@ -346,7 +346,7 @@
         <w:tabs>
           <w:tab w:val="right" w:leader="dot" w:pos="9062"/>
         </w:tabs>
-        <w:divId w:val="205997245"/>
+        <w:divId w:val="892232803"/>
         <w:rPr>
           <w:rFonts w:asciiTheme="minorHAnsi" w:hAnsiTheme="minorHAnsi" w:cstheme="minorBidi"/>
           <w:noProof/>
@@ -379,7 +379,7 @@
         <w:rPr>
           <w:noProof/>
         </w:rPr>
-        <w:instrText xml:space="preserve"> PAGEREF _Toc242816029 \h </w:instrText>
+        <w:instrText xml:space="preserve"> PAGEREF _Toc242816571 \h </w:instrText>
       </w:r>
       <w:r>
         <w:rPr>
@@ -411,7 +411,7 @@
         <w:tabs>
           <w:tab w:val="right" w:leader="dot" w:pos="9062"/>
         </w:tabs>
-        <w:divId w:val="205997245"/>
+        <w:divId w:val="892232803"/>
         <w:rPr>
           <w:rFonts w:asciiTheme="minorHAnsi" w:hAnsiTheme="minorHAnsi" w:cstheme="minorBidi"/>
           <w:noProof/>
@@ -444,7 +444,7 @@
         <w:rPr>
           <w:noProof/>
         </w:rPr>
-        <w:instrText xml:space="preserve"> PAGEREF _Toc242816030 \h </w:instrText>
+        <w:instrText xml:space="preserve"> PAGEREF _Toc242816572 \h </w:instrText>
       </w:r>
       <w:r>
         <w:rPr>
@@ -476,7 +476,7 @@
         <w:tabs>
           <w:tab w:val="right" w:leader="dot" w:pos="9062"/>
         </w:tabs>
-        <w:divId w:val="205997245"/>
+        <w:divId w:val="892232803"/>
         <w:rPr>
           <w:rFonts w:asciiTheme="minorHAnsi" w:hAnsiTheme="minorHAnsi" w:cstheme="minorBidi"/>
           <w:noProof/>
@@ -509,7 +509,7 @@
         <w:rPr>
           <w:noProof/>
         </w:rPr>
-        <w:instrText xml:space="preserve"> PAGEREF _Toc242816031 \h </w:instrText>
+        <w:instrText xml:space="preserve"> PAGEREF _Toc242816573 \h </w:instrText>
       </w:r>
       <w:r>
         <w:rPr>
@@ -541,7 +541,7 @@
         <w:tabs>
           <w:tab w:val="right" w:leader="dot" w:pos="9062"/>
         </w:tabs>
-        <w:divId w:val="205997245"/>
+        <w:divId w:val="892232803"/>
         <w:rPr>
           <w:rFonts w:asciiTheme="minorHAnsi" w:hAnsiTheme="minorHAnsi" w:cstheme="minorBidi"/>
           <w:noProof/>
@@ -574,7 +574,7 @@
         <w:rPr>
           <w:noProof/>
         </w:rPr>
-        <w:instrText xml:space="preserve"> PAGEREF _Toc242816032 \h </w:instrText>
+        <w:instrText xml:space="preserve"> PAGEREF _Toc242816574 \h </w:instrText>
       </w:r>
       <w:r>
         <w:rPr>
@@ -606,7 +606,7 @@
         <w:tabs>
           <w:tab w:val="right" w:leader="dot" w:pos="9062"/>
         </w:tabs>
-        <w:divId w:val="205997245"/>
+        <w:divId w:val="892232803"/>
         <w:rPr>
           <w:rFonts w:asciiTheme="minorHAnsi" w:hAnsiTheme="minorHAnsi" w:cstheme="minorBidi"/>
           <w:noProof/>
@@ -639,7 +639,7 @@
         <w:rPr>
           <w:noProof/>
         </w:rPr>
-        <w:instrText xml:space="preserve"> PAGEREF _Toc242816033 \h </w:instrText>
+        <w:instrText xml:space="preserve"> PAGEREF _Toc242816575 \h </w:instrText>
       </w:r>
       <w:r>
         <w:rPr>
@@ -671,7 +671,7 @@
         <w:tabs>
           <w:tab w:val="right" w:leader="dot" w:pos="9062"/>
         </w:tabs>
-        <w:divId w:val="205997245"/>
+        <w:divId w:val="892232803"/>
         <w:rPr>
           <w:rFonts w:asciiTheme="minorHAnsi" w:hAnsiTheme="minorHAnsi" w:cstheme="minorBidi"/>
           <w:noProof/>
@@ -704,7 +704,7 @@
         <w:rPr>
           <w:noProof/>
         </w:rPr>
-        <w:instrText xml:space="preserve"> PAGEREF _Toc242816034 \h </w:instrText>
+        <w:instrText xml:space="preserve"> PAGEREF _Toc242816576 \h </w:instrText>
       </w:r>
       <w:r>
         <w:rPr>
@@ -736,7 +736,7 @@
         <w:tabs>
           <w:tab w:val="right" w:leader="dot" w:pos="9062"/>
         </w:tabs>
-        <w:divId w:val="205997245"/>
+        <w:divId w:val="892232803"/>
         <w:rPr>
           <w:rFonts w:asciiTheme="minorHAnsi" w:hAnsiTheme="minorHAnsi" w:cstheme="minorBidi"/>
           <w:noProof/>
@@ -769,7 +769,7 @@
         <w:rPr>
           <w:noProof/>
         </w:rPr>
-        <w:instrText xml:space="preserve"> PAGEREF _Toc242816035 \h </w:instrText>
+        <w:instrText xml:space="preserve"> PAGEREF _Toc242816577 \h </w:instrText>
       </w:r>
       <w:r>
         <w:rPr>
@@ -801,7 +801,7 @@
         <w:tabs>
           <w:tab w:val="right" w:leader="dot" w:pos="9062"/>
         </w:tabs>
-        <w:divId w:val="205997245"/>
+        <w:divId w:val="892232803"/>
         <w:rPr>
           <w:rFonts w:asciiTheme="minorHAnsi" w:hAnsiTheme="minorHAnsi" w:cstheme="minorBidi"/>
           <w:noProof/>
@@ -834,7 +834,7 @@
         <w:rPr>
           <w:noProof/>
         </w:rPr>
-        <w:instrText xml:space="preserve"> PAGEREF _Toc242816036 \h </w:instrText>
+        <w:instrText xml:space="preserve"> PAGEREF _Toc242816578 \h </w:instrText>
       </w:r>
       <w:r>
         <w:rPr>
@@ -866,7 +866,7 @@
         <w:tabs>
           <w:tab w:val="right" w:leader="dot" w:pos="9062"/>
         </w:tabs>
-        <w:divId w:val="205997245"/>
+        <w:divId w:val="892232803"/>
         <w:rPr>
           <w:rFonts w:asciiTheme="minorHAnsi" w:hAnsiTheme="minorHAnsi" w:cstheme="minorBidi"/>
           <w:noProof/>
@@ -899,7 +899,7 @@
         <w:rPr>
           <w:noProof/>
         </w:rPr>
-        <w:instrText xml:space="preserve"> PAGEREF _Toc242816037 \h </w:instrText>
+        <w:instrText xml:space="preserve"> PAGEREF _Toc242816579 \h </w:instrText>
       </w:r>
       <w:r>
         <w:rPr>
@@ -928,7 +928,7 @@
     <w:p>
       <w:pPr>
         <w:pStyle w:val="marker"/>
-        <w:divId w:val="205997245"/>
+        <w:divId w:val="892232803"/>
         <w:rPr>
           <w:lang w:val="nl-NL"/>
         </w:rPr>
@@ -944,7 +944,7 @@
       <w:pPr>
         <w:pStyle w:val="marker"/>
         <w:ind w:left="800" w:right="800"/>
-        <w:divId w:val="1521626345"/>
+        <w:divId w:val="1726875716"/>
         <w:rPr>
           <w:lang w:val="nl-NL"/>
         </w:rPr>
@@ -956,13 +956,13 @@
     <w:p>
       <w:pPr>
         <w:pStyle w:val="Kop2"/>
-        <w:divId w:val="1521626345"/>
+        <w:divId w:val="1726875716"/>
         <w:rPr>
           <w:rFonts w:eastAsia="Times New Roman"/>
           <w:lang w:val="nl-NL"/>
         </w:rPr>
       </w:pPr>
-      <w:bookmarkStart w:id="1" w:name="_Toc242816027"/>
+      <w:bookmarkStart w:id="1" w:name="_Toc242816569"/>
       <w:r>
         <w:rPr>
           <w:rFonts w:eastAsia="Times New Roman"/>
@@ -975,7 +975,7 @@
     <w:p>
       <w:pPr>
         <w:pStyle w:val="Normaalweb"/>
-        <w:divId w:val="1521626345"/>
+        <w:divId w:val="1726875716"/>
         <w:rPr>
           <w:lang w:val="nl-NL"/>
         </w:rPr>
@@ -990,7 +990,7 @@
     <w:p>
       <w:pPr>
         <w:pStyle w:val="Normaalweb"/>
-        <w:divId w:val="1521626345"/>
+        <w:divId w:val="1726875716"/>
         <w:rPr>
           <w:lang w:val="nl-NL"/>
         </w:rPr>
@@ -1018,7 +1018,7 @@
     <w:p>
       <w:pPr>
         <w:pStyle w:val="Normaalweb"/>
-        <w:divId w:val="1521626345"/>
+        <w:divId w:val="1726875716"/>
         <w:rPr>
           <w:lang w:val="nl-NL"/>
         </w:rPr>
@@ -1039,7 +1039,7 @@
     <w:p>
       <w:pPr>
         <w:pStyle w:val="Normaalweb"/>
-        <w:divId w:val="1521626345"/>
+        <w:divId w:val="1726875716"/>
         <w:rPr>
           <w:lang w:val="nl-NL"/>
         </w:rPr>
@@ -1086,7 +1086,7 @@
     <w:p>
       <w:pPr>
         <w:pStyle w:val="Normaalweb"/>
-        <w:divId w:val="1521626345"/>
+        <w:divId w:val="1726875716"/>
         <w:rPr>
           <w:lang w:val="nl-NL"/>
         </w:rPr>
@@ -1114,7 +1114,7 @@
     <w:p>
       <w:pPr>
         <w:pStyle w:val="Normaalweb"/>
-        <w:divId w:val="1521626345"/>
+        <w:divId w:val="1726875716"/>
         <w:rPr>
           <w:lang w:val="nl-NL"/>
         </w:rPr>
@@ -1148,7 +1148,7 @@
     <w:p>
       <w:pPr>
         <w:pStyle w:val="Normaalweb"/>
-        <w:divId w:val="1521626345"/>
+        <w:divId w:val="1726875716"/>
         <w:rPr>
           <w:lang w:val="nl-NL"/>
         </w:rPr>
@@ -1175,7 +1175,7 @@
     <w:p>
       <w:pPr>
         <w:pStyle w:val="Normaalweb"/>
-        <w:divId w:val="1521626345"/>
+        <w:divId w:val="1726875716"/>
         <w:rPr>
           <w:lang w:val="nl-NL"/>
         </w:rPr>
@@ -1203,7 +1203,7 @@
     <w:p>
       <w:pPr>
         <w:pStyle w:val="Normaalweb"/>
-        <w:divId w:val="1521626345"/>
+        <w:divId w:val="1726875716"/>
         <w:rPr>
           <w:lang w:val="nl-NL"/>
         </w:rPr>
@@ -1218,7 +1218,7 @@
     <w:p>
       <w:pPr>
         <w:pStyle w:val="Normaalweb"/>
-        <w:divId w:val="1521626345"/>
+        <w:divId w:val="1726875716"/>
         <w:rPr>
           <w:lang w:val="nl-NL"/>
         </w:rPr>
@@ -1278,7 +1278,7 @@
     <w:p>
       <w:pPr>
         <w:pStyle w:val="Normaalweb"/>
-        <w:divId w:val="1521626345"/>
+        <w:divId w:val="1726875716"/>
         <w:rPr>
           <w:lang w:val="nl-NL"/>
         </w:rPr>
@@ -1293,7 +1293,7 @@
     <w:p>
       <w:pPr>
         <w:pStyle w:val="Normaalweb"/>
-        <w:divId w:val="1521626345"/>
+        <w:divId w:val="1726875716"/>
         <w:rPr>
           <w:lang w:val="nl-NL"/>
         </w:rPr>
@@ -1321,7 +1321,7 @@
     <w:p>
       <w:pPr>
         <w:pStyle w:val="Normaalweb"/>
-        <w:divId w:val="1521626345"/>
+        <w:divId w:val="1726875716"/>
         <w:rPr>
           <w:lang w:val="nl-NL"/>
         </w:rPr>
@@ -1336,7 +1336,7 @@
     <w:p>
       <w:pPr>
         <w:pStyle w:val="Normaalweb"/>
-        <w:divId w:val="1521626345"/>
+        <w:divId w:val="1726875716"/>
         <w:rPr>
           <w:lang w:val="nl-NL"/>
         </w:rPr>
@@ -1351,7 +1351,7 @@
     <w:p>
       <w:pPr>
         <w:pStyle w:val="Normaalweb"/>
-        <w:divId w:val="1521626345"/>
+        <w:divId w:val="1726875716"/>
         <w:rPr>
           <w:lang w:val="nl-NL"/>
         </w:rPr>
@@ -1366,7 +1366,7 @@
     <w:p>
       <w:pPr>
         <w:spacing w:before="300" w:after="200"/>
-        <w:divId w:val="1521626345"/>
+        <w:divId w:val="1726875716"/>
         <w:rPr>
           <w:rFonts w:eastAsia="Times New Roman"/>
           <w:lang w:val="nl-NL"/>
@@ -1377,14 +1377,14 @@
           <w:rFonts w:eastAsia="Times New Roman"/>
           <w:lang w:val="nl-NL"/>
         </w:rPr>
-        <w:pict w14:anchorId="299D84BA">
+        <w:pict w14:anchorId="5666EFDC">
           <v:rect id="_x0000_i1025" style="width:0;height:1.5pt" o:hralign="center" o:hrstd="t" o:hr="t" fillcolor="#a0a0a0" stroked="f"/>
         </w:pict>
       </w:r>
     </w:p>
     <w:p>
       <w:pPr>
-        <w:divId w:val="797064970"/>
+        <w:divId w:val="1599291919"/>
         <w:rPr>
           <w:color w:val="555555"/>
           <w:sz w:val="20"/>
@@ -1423,7 +1423,7 @@
     </w:p>
     <w:p>
       <w:pPr>
-        <w:divId w:val="797064970"/>
+        <w:divId w:val="1599291919"/>
         <w:rPr>
           <w:color w:val="555555"/>
           <w:sz w:val="20"/>
@@ -1463,7 +1463,7 @@
     </w:p>
     <w:p>
       <w:pPr>
-        <w:divId w:val="797064970"/>
+        <w:divId w:val="1599291919"/>
         <w:rPr>
           <w:color w:val="555555"/>
           <w:sz w:val="20"/>
@@ -1493,7 +1493,7 @@
     </w:p>
     <w:p>
       <w:pPr>
-        <w:divId w:val="797064970"/>
+        <w:divId w:val="1599291919"/>
         <w:rPr>
           <w:color w:val="555555"/>
           <w:sz w:val="20"/>
@@ -1525,7 +1525,7 @@
       <w:pPr>
         <w:pStyle w:val="marker"/>
         <w:ind w:left="800" w:right="800"/>
-        <w:divId w:val="1521626345"/>
+        <w:divId w:val="1726875716"/>
         <w:rPr>
           <w:lang w:val="nl-NL"/>
         </w:rPr>
@@ -1537,13 +1537,13 @@
     <w:p>
       <w:pPr>
         <w:pStyle w:val="Kop2"/>
-        <w:divId w:val="1521626345"/>
+        <w:divId w:val="1726875716"/>
         <w:rPr>
           <w:rFonts w:eastAsia="Times New Roman"/>
           <w:lang w:val="nl-NL"/>
         </w:rPr>
       </w:pPr>
-      <w:bookmarkStart w:id="2" w:name="_Toc242816028"/>
+      <w:bookmarkStart w:id="2" w:name="_Toc242816570"/>
       <w:r>
         <w:rPr>
           <w:rFonts w:eastAsia="Times New Roman"/>
@@ -1556,7 +1556,7 @@
     <w:p>
       <w:pPr>
         <w:pStyle w:val="Normaalweb"/>
-        <w:divId w:val="1521626345"/>
+        <w:divId w:val="1726875716"/>
         <w:rPr>
           <w:lang w:val="nl-NL"/>
         </w:rPr>
@@ -1571,7 +1571,7 @@
     <w:p>
       <w:pPr>
         <w:pStyle w:val="Normaalweb"/>
-        <w:divId w:val="1521626345"/>
+        <w:divId w:val="1726875716"/>
         <w:rPr>
           <w:lang w:val="nl-NL"/>
         </w:rPr>
@@ -1586,7 +1586,7 @@
     <w:p>
       <w:pPr>
         <w:pStyle w:val="Normaalweb"/>
-        <w:divId w:val="1521626345"/>
+        <w:divId w:val="1726875716"/>
         <w:rPr>
           <w:lang w:val="nl-NL"/>
         </w:rPr>
@@ -1601,13 +1601,13 @@
     <w:p>
       <w:pPr>
         <w:pStyle w:val="Kop2"/>
-        <w:divId w:val="1521626345"/>
+        <w:divId w:val="1726875716"/>
         <w:rPr>
           <w:rFonts w:eastAsia="Times New Roman"/>
           <w:lang w:val="nl-NL"/>
         </w:rPr>
       </w:pPr>
-      <w:bookmarkStart w:id="3" w:name="_Toc242816029"/>
+      <w:bookmarkStart w:id="3" w:name="_Toc242816571"/>
       <w:r>
         <w:rPr>
           <w:rFonts w:eastAsia="Times New Roman"/>
@@ -1620,7 +1620,7 @@
     <w:p>
       <w:pPr>
         <w:pStyle w:val="Normaalweb"/>
-        <w:divId w:val="1521626345"/>
+        <w:divId w:val="1726875716"/>
         <w:rPr>
           <w:lang w:val="nl-NL"/>
         </w:rPr>
@@ -1635,13 +1635,13 @@
     <w:p>
       <w:pPr>
         <w:pStyle w:val="Kop2"/>
-        <w:divId w:val="1521626345"/>
+        <w:divId w:val="1726875716"/>
         <w:rPr>
           <w:rFonts w:eastAsia="Times New Roman"/>
           <w:lang w:val="nl-NL"/>
         </w:rPr>
       </w:pPr>
-      <w:bookmarkStart w:id="4" w:name="_Toc242816030"/>
+      <w:bookmarkStart w:id="4" w:name="_Toc242816572"/>
       <w:r>
         <w:rPr>
           <w:rFonts w:eastAsia="Times New Roman"/>
@@ -1654,7 +1654,7 @@
     <w:p>
       <w:pPr>
         <w:pStyle w:val="Normaalweb"/>
-        <w:divId w:val="1521626345"/>
+        <w:divId w:val="1726875716"/>
         <w:rPr>
           <w:lang w:val="nl-NL"/>
         </w:rPr>
@@ -1669,13 +1669,13 @@
     <w:p>
       <w:pPr>
         <w:pStyle w:val="Kop3"/>
-        <w:divId w:val="1521626345"/>
+        <w:divId w:val="1726875716"/>
         <w:rPr>
           <w:rFonts w:eastAsia="Times New Roman"/>
           <w:lang w:val="nl-NL"/>
         </w:rPr>
       </w:pPr>
-      <w:bookmarkStart w:id="5" w:name="_Toc242816031"/>
+      <w:bookmarkStart w:id="5" w:name="_Toc242816573"/>
       <w:r>
         <w:rPr>
           <w:rFonts w:eastAsia="Times New Roman"/>
@@ -1688,7 +1688,7 @@
     <w:p>
       <w:pPr>
         <w:pStyle w:val="Normaalweb"/>
-        <w:divId w:val="1521626345"/>
+        <w:divId w:val="1726875716"/>
         <w:rPr>
           <w:lang w:val="nl-NL"/>
         </w:rPr>
@@ -1703,13 +1703,13 @@
     <w:p>
       <w:pPr>
         <w:pStyle w:val="Kop3"/>
-        <w:divId w:val="1521626345"/>
+        <w:divId w:val="1726875716"/>
         <w:rPr>
           <w:rFonts w:eastAsia="Times New Roman"/>
           <w:lang w:val="nl-NL"/>
         </w:rPr>
       </w:pPr>
-      <w:bookmarkStart w:id="6" w:name="_Toc242816032"/>
+      <w:bookmarkStart w:id="6" w:name="_Toc242816574"/>
       <w:r>
         <w:rPr>
           <w:rFonts w:eastAsia="Times New Roman"/>
@@ -1722,7 +1722,7 @@
     <w:p>
       <w:pPr>
         <w:pStyle w:val="Normaalweb"/>
-        <w:divId w:val="1521626345"/>
+        <w:divId w:val="1726875716"/>
         <w:rPr>
           <w:lang w:val="nl-NL"/>
         </w:rPr>
@@ -1737,13 +1737,13 @@
     <w:p>
       <w:pPr>
         <w:pStyle w:val="Kop3"/>
-        <w:divId w:val="1521626345"/>
+        <w:divId w:val="1726875716"/>
         <w:rPr>
           <w:rFonts w:eastAsia="Times New Roman"/>
           <w:lang w:val="nl-NL"/>
         </w:rPr>
       </w:pPr>
-      <w:bookmarkStart w:id="7" w:name="_Toc242816033"/>
+      <w:bookmarkStart w:id="7" w:name="_Toc242816575"/>
       <w:r>
         <w:rPr>
           <w:rFonts w:eastAsia="Times New Roman"/>
@@ -1756,7 +1756,7 @@
     <w:p>
       <w:pPr>
         <w:pStyle w:val="Normaalweb"/>
-        <w:divId w:val="1521626345"/>
+        <w:divId w:val="1726875716"/>
         <w:rPr>
           <w:lang w:val="nl-NL"/>
         </w:rPr>
@@ -1771,13 +1771,13 @@
     <w:p>
       <w:pPr>
         <w:pStyle w:val="Kop3"/>
-        <w:divId w:val="1521626345"/>
+        <w:divId w:val="1726875716"/>
         <w:rPr>
           <w:rFonts w:eastAsia="Times New Roman"/>
           <w:lang w:val="nl-NL"/>
         </w:rPr>
       </w:pPr>
-      <w:bookmarkStart w:id="8" w:name="_Toc242816034"/>
+      <w:bookmarkStart w:id="8" w:name="_Toc242816576"/>
       <w:r>
         <w:rPr>
           <w:rFonts w:eastAsia="Times New Roman"/>
@@ -1790,7 +1790,7 @@
     <w:p>
       <w:pPr>
         <w:pStyle w:val="Normaalweb"/>
-        <w:divId w:val="1521626345"/>
+        <w:divId w:val="1726875716"/>
         <w:rPr>
           <w:lang w:val="nl-NL"/>
         </w:rPr>
@@ -1806,13 +1806,13 @@
     <w:p>
       <w:pPr>
         <w:pStyle w:val="Kop2"/>
-        <w:divId w:val="1521626345"/>
+        <w:divId w:val="1726875716"/>
         <w:rPr>
           <w:rFonts w:eastAsia="Times New Roman"/>
           <w:lang w:val="nl-NL"/>
         </w:rPr>
       </w:pPr>
-      <w:bookmarkStart w:id="9" w:name="_Toc242816035"/>
+      <w:bookmarkStart w:id="9" w:name="_Toc242816577"/>
       <w:r>
         <w:rPr>
           <w:rFonts w:eastAsia="Times New Roman"/>
@@ -1825,7 +1825,7 @@
     <w:p>
       <w:pPr>
         <w:pStyle w:val="Normaalweb"/>
-        <w:divId w:val="1521626345"/>
+        <w:divId w:val="1726875716"/>
         <w:rPr>
           <w:lang w:val="nl-NL"/>
         </w:rPr>
@@ -1840,7 +1840,7 @@
     <w:p>
       <w:pPr>
         <w:pStyle w:val="Normaalweb"/>
-        <w:divId w:val="1521626345"/>
+        <w:divId w:val="1726875716"/>
         <w:rPr>
           <w:lang w:val="nl-NL"/>
         </w:rPr>
@@ -1855,7 +1855,7 @@
     <w:p>
       <w:pPr>
         <w:pStyle w:val="Normaalweb"/>
-        <w:divId w:val="1521626345"/>
+        <w:divId w:val="1726875716"/>
         <w:rPr>
           <w:lang w:val="nl-NL"/>
         </w:rPr>
@@ -1870,13 +1870,13 @@
     <w:p>
       <w:pPr>
         <w:pStyle w:val="Kop2"/>
-        <w:divId w:val="1521626345"/>
+        <w:divId w:val="1726875716"/>
         <w:rPr>
           <w:rFonts w:eastAsia="Times New Roman"/>
           <w:lang w:val="nl-NL"/>
         </w:rPr>
       </w:pPr>
-      <w:bookmarkStart w:id="10" w:name="_Toc242816036"/>
+      <w:bookmarkStart w:id="10" w:name="_Toc242816578"/>
       <w:r>
         <w:rPr>
           <w:rFonts w:eastAsia="Times New Roman"/>
@@ -1889,7 +1889,7 @@
     <w:p>
       <w:pPr>
         <w:pStyle w:val="Normaalweb"/>
-        <w:divId w:val="1521626345"/>
+        <w:divId w:val="1726875716"/>
         <w:rPr>
           <w:lang w:val="nl-NL"/>
         </w:rPr>
@@ -1904,7 +1904,7 @@
     <w:p>
       <w:pPr>
         <w:pStyle w:val="Normaalweb"/>
-        <w:divId w:val="1521626345"/>
+        <w:divId w:val="1726875716"/>
         <w:rPr>
           <w:lang w:val="nl-NL"/>
         </w:rPr>
@@ -1919,13 +1919,13 @@
     <w:p>
       <w:pPr>
         <w:pStyle w:val="Kop2"/>
-        <w:divId w:val="1521626345"/>
+        <w:divId w:val="1726875716"/>
         <w:rPr>
           <w:rFonts w:eastAsia="Times New Roman"/>
           <w:lang w:val="nl-NL"/>
         </w:rPr>
       </w:pPr>
-      <w:bookmarkStart w:id="11" w:name="_Toc242816037"/>
+      <w:bookmarkStart w:id="11" w:name="_Toc242816579"/>
       <w:r>
         <w:rPr>
           <w:rFonts w:eastAsia="Times New Roman"/>
@@ -1938,7 +1938,7 @@
     <w:p>
       <w:pPr>
         <w:pStyle w:val="Normaalweb"/>
-        <w:divId w:val="1521626345"/>
+        <w:divId w:val="1726875716"/>
         <w:rPr>
           <w:lang w:val="nl-NL"/>
         </w:rPr>
@@ -1953,7 +1953,7 @@
     <w:p>
       <w:pPr>
         <w:pStyle w:val="Normaalweb"/>
-        <w:divId w:val="1521626345"/>
+        <w:divId w:val="1726875716"/>
         <w:rPr>
           <w:lang w:val="nl-NL"/>
         </w:rPr>
@@ -1968,7 +1968,7 @@
     <w:p>
       <w:pPr>
         <w:shd w:val="clear" w:color="auto" w:fill="FFFFFF"/>
-        <w:divId w:val="230316501"/>
+        <w:divId w:val="1627660286"/>
         <w:rPr>
           <w:szCs w:val="22"/>
           <w:lang w:val="nl-NL"/>
@@ -2144,7 +2144,7 @@
         <w:color w:val="808080"/>
         <w:sz w:val="18"/>
       </w:rPr>
-      <w:t>5</w:t>
+      <w:t>3</w:t>
     </w:r>
     <w:r>
       <w:rPr>
@@ -2236,7 +2236,7 @@
         <w:sz w:val="18"/>
       </w:rPr>
       <w:tab/>
-      <w:t>Laatst gewijzigd: 13 oktober 2026, 20:31</w:t>
+      <w:t>Laatst gewijzigd: 13 oktober 2026, 20:41</w:t>
     </w:r>
   </w:p>
 </w:hdr>
@@ -3603,7 +3603,7 @@
     <w:link w:val="KoptekstChar"/>
     <w:uiPriority w:val="99"/>
     <w:unhideWhenUsed/>
-    <w:rsid w:val="001339A9"/>
+    <w:rsid w:val="003B3E74"/>
     <w:pPr>
       <w:tabs>
         <w:tab w:val="center" w:pos="4536"/>
@@ -3616,7 +3616,7 @@
     <w:basedOn w:val="Standaardalinea-lettertype"/>
     <w:link w:val="Koptekst"/>
     <w:uiPriority w:val="99"/>
-    <w:rsid w:val="001339A9"/>
+    <w:rsid w:val="003B3E74"/>
     <w:rPr>
       <w:rFonts w:eastAsiaTheme="minorEastAsia"/>
       <w:sz w:val="24"/>
@@ -3629,7 +3629,7 @@
     <w:link w:val="VoettekstChar"/>
     <w:uiPriority w:val="99"/>
     <w:unhideWhenUsed/>
-    <w:rsid w:val="001339A9"/>
+    <w:rsid w:val="003B3E74"/>
     <w:pPr>
       <w:tabs>
         <w:tab w:val="center" w:pos="4536"/>
@@ -3642,7 +3642,7 @@
     <w:basedOn w:val="Standaardalinea-lettertype"/>
     <w:link w:val="Voettekst"/>
     <w:uiPriority w:val="99"/>
-    <w:rsid w:val="001339A9"/>
+    <w:rsid w:val="003B3E74"/>
     <w:rPr>
       <w:rFonts w:eastAsiaTheme="minorEastAsia"/>
       <w:sz w:val="24"/>
@@ -3656,7 +3656,7 @@
     <w:autoRedefine/>
     <w:uiPriority w:val="39"/>
     <w:unhideWhenUsed/>
-    <w:rsid w:val="001339A9"/>
+    <w:rsid w:val="003B3E74"/>
     <w:pPr>
       <w:spacing w:after="100"/>
       <w:ind w:left="220"/>
@@ -3669,7 +3669,7 @@
     <w:autoRedefine/>
     <w:uiPriority w:val="39"/>
     <w:unhideWhenUsed/>
-    <w:rsid w:val="001339A9"/>
+    <w:rsid w:val="003B3E74"/>
     <w:pPr>
       <w:spacing w:after="100"/>
       <w:ind w:left="440"/>

</xml_diff>

<commit_message>
Update Systeem-Audit NL 13-10-2026 20:58
</commit_message>
<xml_diff>
--- a/nl/docx/document-0.docx
+++ b/nl/docx/document-0.docx
@@ -7,7 +7,7 @@
         <w:spacing w:after="480"/>
         <w:jc w:val="center"/>
         <w:outlineLvl w:val="1"/>
-        <w:divId w:val="794981832"/>
+        <w:divId w:val="1771924858"/>
         <w:rPr>
           <w:rFonts w:ascii="Aptos Display" w:eastAsia="Times New Roman" w:hAnsi="Aptos Display"/>
           <w:b/>
@@ -36,7 +36,7 @@
     <w:p>
       <w:pPr>
         <w:pStyle w:val="ondertitel2"/>
-        <w:divId w:val="794981832"/>
+        <w:divId w:val="1771924858"/>
         <w:rPr>
           <w:lang w:val="nl-NL"/>
         </w:rPr>
@@ -51,7 +51,7 @@
     <w:p>
       <w:pPr>
         <w:pStyle w:val="documentaanduiding2"/>
-        <w:divId w:val="794981832"/>
+        <w:divId w:val="1771924858"/>
         <w:rPr>
           <w:lang w:val="nl-NL"/>
         </w:rPr>
@@ -66,7 +66,7 @@
     <w:p>
       <w:pPr>
         <w:pStyle w:val="auteur2"/>
-        <w:divId w:val="794981832"/>
+        <w:divId w:val="1771924858"/>
         <w:rPr>
           <w:lang w:val="nl-NL"/>
         </w:rPr>
@@ -81,23 +81,23 @@
     <w:p>
       <w:pPr>
         <w:pStyle w:val="meta-lijn2"/>
-        <w:divId w:val="794981832"/>
-        <w:rPr>
-          <w:lang w:val="nl-NL"/>
-        </w:rPr>
-      </w:pPr>
-      <w:r>
-        <w:rPr>
-          <w:lang w:val="nl-NL"/>
-        </w:rPr>
-        <w:t>Versie bijgewerkt: 13 oktober 2026, 20:41</w:t>
+        <w:divId w:val="1771924858"/>
+        <w:rPr>
+          <w:lang w:val="nl-NL"/>
+        </w:rPr>
+      </w:pPr>
+      <w:r>
+        <w:rPr>
+          <w:lang w:val="nl-NL"/>
+        </w:rPr>
+        <w:t>Versie bijgewerkt: 13 oktober 2026, 20:58</w:t>
       </w:r>
     </w:p>
     <w:p>
       <w:pPr>
         <w:pStyle w:val="marker"/>
         <w:ind w:left="800" w:right="800"/>
-        <w:divId w:val="1726875716"/>
+        <w:divId w:val="990987062"/>
         <w:rPr>
           <w:lang w:val="nl-NL"/>
         </w:rPr>
@@ -110,13 +110,13 @@
       <w:pPr>
         <w:pStyle w:val="Kop2"/>
         <w:pageBreakBefore/>
-        <w:divId w:val="892232803"/>
+        <w:divId w:val="25836344"/>
         <w:rPr>
           <w:rFonts w:eastAsia="Times New Roman"/>
           <w:lang w:val="nl-NL"/>
         </w:rPr>
       </w:pPr>
-      <w:bookmarkStart w:id="0" w:name="_Toc242816568"/>
+      <w:bookmarkStart w:id="0" w:name="_Toc242817601"/>
       <w:r>
         <w:rPr>
           <w:rFonts w:eastAsia="Times New Roman"/>
@@ -133,7 +133,7 @@
         <w:tabs>
           <w:tab w:val="right" w:leader="dot" w:pos="9062"/>
         </w:tabs>
-        <w:divId w:val="892232803"/>
+        <w:divId w:val="25836344"/>
         <w:rPr>
           <w:rFonts w:asciiTheme="minorHAnsi" w:hAnsiTheme="minorHAnsi" w:cstheme="minorBidi"/>
           <w:noProof/>
@@ -184,7 +184,7 @@
         <w:rPr>
           <w:noProof/>
         </w:rPr>
-        <w:instrText xml:space="preserve"> PAGEREF _Toc242816568 \h </w:instrText>
+        <w:instrText xml:space="preserve"> PAGEREF _Toc242817601 \h </w:instrText>
       </w:r>
       <w:r>
         <w:rPr>
@@ -216,7 +216,7 @@
         <w:tabs>
           <w:tab w:val="right" w:leader="dot" w:pos="9062"/>
         </w:tabs>
-        <w:divId w:val="892232803"/>
+        <w:divId w:val="25836344"/>
         <w:rPr>
           <w:rFonts w:asciiTheme="minorHAnsi" w:hAnsiTheme="minorHAnsi" w:cstheme="minorBidi"/>
           <w:noProof/>
@@ -249,7 +249,7 @@
         <w:rPr>
           <w:noProof/>
         </w:rPr>
-        <w:instrText xml:space="preserve"> PAGEREF _Toc242816569 \h </w:instrText>
+        <w:instrText xml:space="preserve"> PAGEREF _Toc242817602 \h </w:instrText>
       </w:r>
       <w:r>
         <w:rPr>
@@ -281,7 +281,7 @@
         <w:tabs>
           <w:tab w:val="right" w:leader="dot" w:pos="9062"/>
         </w:tabs>
-        <w:divId w:val="892232803"/>
+        <w:divId w:val="25836344"/>
         <w:rPr>
           <w:rFonts w:asciiTheme="minorHAnsi" w:hAnsiTheme="minorHAnsi" w:cstheme="minorBidi"/>
           <w:noProof/>
@@ -314,7 +314,7 @@
         <w:rPr>
           <w:noProof/>
         </w:rPr>
-        <w:instrText xml:space="preserve"> PAGEREF _Toc242816570 \h </w:instrText>
+        <w:instrText xml:space="preserve"> PAGEREF _Toc242817603 \h </w:instrText>
       </w:r>
       <w:r>
         <w:rPr>
@@ -346,7 +346,7 @@
         <w:tabs>
           <w:tab w:val="right" w:leader="dot" w:pos="9062"/>
         </w:tabs>
-        <w:divId w:val="892232803"/>
+        <w:divId w:val="25836344"/>
         <w:rPr>
           <w:rFonts w:asciiTheme="minorHAnsi" w:hAnsiTheme="minorHAnsi" w:cstheme="minorBidi"/>
           <w:noProof/>
@@ -379,7 +379,7 @@
         <w:rPr>
           <w:noProof/>
         </w:rPr>
-        <w:instrText xml:space="preserve"> PAGEREF _Toc242816571 \h </w:instrText>
+        <w:instrText xml:space="preserve"> PAGEREF _Toc242817604 \h </w:instrText>
       </w:r>
       <w:r>
         <w:rPr>
@@ -411,7 +411,7 @@
         <w:tabs>
           <w:tab w:val="right" w:leader="dot" w:pos="9062"/>
         </w:tabs>
-        <w:divId w:val="892232803"/>
+        <w:divId w:val="25836344"/>
         <w:rPr>
           <w:rFonts w:asciiTheme="minorHAnsi" w:hAnsiTheme="minorHAnsi" w:cstheme="minorBidi"/>
           <w:noProof/>
@@ -444,7 +444,7 @@
         <w:rPr>
           <w:noProof/>
         </w:rPr>
-        <w:instrText xml:space="preserve"> PAGEREF _Toc242816572 \h </w:instrText>
+        <w:instrText xml:space="preserve"> PAGEREF _Toc242817605 \h </w:instrText>
       </w:r>
       <w:r>
         <w:rPr>
@@ -476,7 +476,7 @@
         <w:tabs>
           <w:tab w:val="right" w:leader="dot" w:pos="9062"/>
         </w:tabs>
-        <w:divId w:val="892232803"/>
+        <w:divId w:val="25836344"/>
         <w:rPr>
           <w:rFonts w:asciiTheme="minorHAnsi" w:hAnsiTheme="minorHAnsi" w:cstheme="minorBidi"/>
           <w:noProof/>
@@ -509,7 +509,7 @@
         <w:rPr>
           <w:noProof/>
         </w:rPr>
-        <w:instrText xml:space="preserve"> PAGEREF _Toc242816573 \h </w:instrText>
+        <w:instrText xml:space="preserve"> PAGEREF _Toc242817606 \h </w:instrText>
       </w:r>
       <w:r>
         <w:rPr>
@@ -541,7 +541,7 @@
         <w:tabs>
           <w:tab w:val="right" w:leader="dot" w:pos="9062"/>
         </w:tabs>
-        <w:divId w:val="892232803"/>
+        <w:divId w:val="25836344"/>
         <w:rPr>
           <w:rFonts w:asciiTheme="minorHAnsi" w:hAnsiTheme="minorHAnsi" w:cstheme="minorBidi"/>
           <w:noProof/>
@@ -574,7 +574,7 @@
         <w:rPr>
           <w:noProof/>
         </w:rPr>
-        <w:instrText xml:space="preserve"> PAGEREF _Toc242816574 \h </w:instrText>
+        <w:instrText xml:space="preserve"> PAGEREF _Toc242817607 \h </w:instrText>
       </w:r>
       <w:r>
         <w:rPr>
@@ -606,7 +606,7 @@
         <w:tabs>
           <w:tab w:val="right" w:leader="dot" w:pos="9062"/>
         </w:tabs>
-        <w:divId w:val="892232803"/>
+        <w:divId w:val="25836344"/>
         <w:rPr>
           <w:rFonts w:asciiTheme="minorHAnsi" w:hAnsiTheme="minorHAnsi" w:cstheme="minorBidi"/>
           <w:noProof/>
@@ -639,7 +639,7 @@
         <w:rPr>
           <w:noProof/>
         </w:rPr>
-        <w:instrText xml:space="preserve"> PAGEREF _Toc242816575 \h </w:instrText>
+        <w:instrText xml:space="preserve"> PAGEREF _Toc242817608 \h </w:instrText>
       </w:r>
       <w:r>
         <w:rPr>
@@ -671,7 +671,7 @@
         <w:tabs>
           <w:tab w:val="right" w:leader="dot" w:pos="9062"/>
         </w:tabs>
-        <w:divId w:val="892232803"/>
+        <w:divId w:val="25836344"/>
         <w:rPr>
           <w:rFonts w:asciiTheme="minorHAnsi" w:hAnsiTheme="minorHAnsi" w:cstheme="minorBidi"/>
           <w:noProof/>
@@ -704,7 +704,7 @@
         <w:rPr>
           <w:noProof/>
         </w:rPr>
-        <w:instrText xml:space="preserve"> PAGEREF _Toc242816576 \h </w:instrText>
+        <w:instrText xml:space="preserve"> PAGEREF _Toc242817609 \h </w:instrText>
       </w:r>
       <w:r>
         <w:rPr>
@@ -736,7 +736,7 @@
         <w:tabs>
           <w:tab w:val="right" w:leader="dot" w:pos="9062"/>
         </w:tabs>
-        <w:divId w:val="892232803"/>
+        <w:divId w:val="25836344"/>
         <w:rPr>
           <w:rFonts w:asciiTheme="minorHAnsi" w:hAnsiTheme="minorHAnsi" w:cstheme="minorBidi"/>
           <w:noProof/>
@@ -769,7 +769,7 @@
         <w:rPr>
           <w:noProof/>
         </w:rPr>
-        <w:instrText xml:space="preserve"> PAGEREF _Toc242816577 \h </w:instrText>
+        <w:instrText xml:space="preserve"> PAGEREF _Toc242817610 \h </w:instrText>
       </w:r>
       <w:r>
         <w:rPr>
@@ -801,7 +801,7 @@
         <w:tabs>
           <w:tab w:val="right" w:leader="dot" w:pos="9062"/>
         </w:tabs>
-        <w:divId w:val="892232803"/>
+        <w:divId w:val="25836344"/>
         <w:rPr>
           <w:rFonts w:asciiTheme="minorHAnsi" w:hAnsiTheme="minorHAnsi" w:cstheme="minorBidi"/>
           <w:noProof/>
@@ -834,7 +834,7 @@
         <w:rPr>
           <w:noProof/>
         </w:rPr>
-        <w:instrText xml:space="preserve"> PAGEREF _Toc242816578 \h </w:instrText>
+        <w:instrText xml:space="preserve"> PAGEREF _Toc242817611 \h </w:instrText>
       </w:r>
       <w:r>
         <w:rPr>
@@ -866,7 +866,7 @@
         <w:tabs>
           <w:tab w:val="right" w:leader="dot" w:pos="9062"/>
         </w:tabs>
-        <w:divId w:val="892232803"/>
+        <w:divId w:val="25836344"/>
         <w:rPr>
           <w:rFonts w:asciiTheme="minorHAnsi" w:hAnsiTheme="minorHAnsi" w:cstheme="minorBidi"/>
           <w:noProof/>
@@ -899,7 +899,7 @@
         <w:rPr>
           <w:noProof/>
         </w:rPr>
-        <w:instrText xml:space="preserve"> PAGEREF _Toc242816579 \h </w:instrText>
+        <w:instrText xml:space="preserve"> PAGEREF _Toc242817612 \h </w:instrText>
       </w:r>
       <w:r>
         <w:rPr>
@@ -928,7 +928,7 @@
     <w:p>
       <w:pPr>
         <w:pStyle w:val="marker"/>
-        <w:divId w:val="892232803"/>
+        <w:divId w:val="25836344"/>
         <w:rPr>
           <w:lang w:val="nl-NL"/>
         </w:rPr>
@@ -944,7 +944,7 @@
       <w:pPr>
         <w:pStyle w:val="marker"/>
         <w:ind w:left="800" w:right="800"/>
-        <w:divId w:val="1726875716"/>
+        <w:divId w:val="990987062"/>
         <w:rPr>
           <w:lang w:val="nl-NL"/>
         </w:rPr>
@@ -956,13 +956,13 @@
     <w:p>
       <w:pPr>
         <w:pStyle w:val="Kop2"/>
-        <w:divId w:val="1726875716"/>
+        <w:divId w:val="990987062"/>
         <w:rPr>
           <w:rFonts w:eastAsia="Times New Roman"/>
           <w:lang w:val="nl-NL"/>
         </w:rPr>
       </w:pPr>
-      <w:bookmarkStart w:id="1" w:name="_Toc242816569"/>
+      <w:bookmarkStart w:id="1" w:name="_Toc242817602"/>
       <w:r>
         <w:rPr>
           <w:rFonts w:eastAsia="Times New Roman"/>
@@ -975,7 +975,7 @@
     <w:p>
       <w:pPr>
         <w:pStyle w:val="Normaalweb"/>
-        <w:divId w:val="1726875716"/>
+        <w:divId w:val="990987062"/>
         <w:rPr>
           <w:lang w:val="nl-NL"/>
         </w:rPr>
@@ -990,7 +990,7 @@
     <w:p>
       <w:pPr>
         <w:pStyle w:val="Normaalweb"/>
-        <w:divId w:val="1726875716"/>
+        <w:divId w:val="990987062"/>
         <w:rPr>
           <w:lang w:val="nl-NL"/>
         </w:rPr>
@@ -1018,7 +1018,7 @@
     <w:p>
       <w:pPr>
         <w:pStyle w:val="Normaalweb"/>
-        <w:divId w:val="1726875716"/>
+        <w:divId w:val="990987062"/>
         <w:rPr>
           <w:lang w:val="nl-NL"/>
         </w:rPr>
@@ -1039,7 +1039,7 @@
     <w:p>
       <w:pPr>
         <w:pStyle w:val="Normaalweb"/>
-        <w:divId w:val="1726875716"/>
+        <w:divId w:val="990987062"/>
         <w:rPr>
           <w:lang w:val="nl-NL"/>
         </w:rPr>
@@ -1086,7 +1086,7 @@
     <w:p>
       <w:pPr>
         <w:pStyle w:val="Normaalweb"/>
-        <w:divId w:val="1726875716"/>
+        <w:divId w:val="990987062"/>
         <w:rPr>
           <w:lang w:val="nl-NL"/>
         </w:rPr>
@@ -1114,7 +1114,7 @@
     <w:p>
       <w:pPr>
         <w:pStyle w:val="Normaalweb"/>
-        <w:divId w:val="1726875716"/>
+        <w:divId w:val="990987062"/>
         <w:rPr>
           <w:lang w:val="nl-NL"/>
         </w:rPr>
@@ -1148,7 +1148,7 @@
     <w:p>
       <w:pPr>
         <w:pStyle w:val="Normaalweb"/>
-        <w:divId w:val="1726875716"/>
+        <w:divId w:val="990987062"/>
         <w:rPr>
           <w:lang w:val="nl-NL"/>
         </w:rPr>
@@ -1175,7 +1175,7 @@
     <w:p>
       <w:pPr>
         <w:pStyle w:val="Normaalweb"/>
-        <w:divId w:val="1726875716"/>
+        <w:divId w:val="990987062"/>
         <w:rPr>
           <w:lang w:val="nl-NL"/>
         </w:rPr>
@@ -1203,7 +1203,7 @@
     <w:p>
       <w:pPr>
         <w:pStyle w:val="Normaalweb"/>
-        <w:divId w:val="1726875716"/>
+        <w:divId w:val="990987062"/>
         <w:rPr>
           <w:lang w:val="nl-NL"/>
         </w:rPr>
@@ -1218,7 +1218,7 @@
     <w:p>
       <w:pPr>
         <w:pStyle w:val="Normaalweb"/>
-        <w:divId w:val="1726875716"/>
+        <w:divId w:val="990987062"/>
         <w:rPr>
           <w:lang w:val="nl-NL"/>
         </w:rPr>
@@ -1278,7 +1278,7 @@
     <w:p>
       <w:pPr>
         <w:pStyle w:val="Normaalweb"/>
-        <w:divId w:val="1726875716"/>
+        <w:divId w:val="990987062"/>
         <w:rPr>
           <w:lang w:val="nl-NL"/>
         </w:rPr>
@@ -1293,7 +1293,7 @@
     <w:p>
       <w:pPr>
         <w:pStyle w:val="Normaalweb"/>
-        <w:divId w:val="1726875716"/>
+        <w:divId w:val="990987062"/>
         <w:rPr>
           <w:lang w:val="nl-NL"/>
         </w:rPr>
@@ -1321,7 +1321,7 @@
     <w:p>
       <w:pPr>
         <w:pStyle w:val="Normaalweb"/>
-        <w:divId w:val="1726875716"/>
+        <w:divId w:val="990987062"/>
         <w:rPr>
           <w:lang w:val="nl-NL"/>
         </w:rPr>
@@ -1336,7 +1336,7 @@
     <w:p>
       <w:pPr>
         <w:pStyle w:val="Normaalweb"/>
-        <w:divId w:val="1726875716"/>
+        <w:divId w:val="990987062"/>
         <w:rPr>
           <w:lang w:val="nl-NL"/>
         </w:rPr>
@@ -1351,7 +1351,7 @@
     <w:p>
       <w:pPr>
         <w:pStyle w:val="Normaalweb"/>
-        <w:divId w:val="1726875716"/>
+        <w:divId w:val="990987062"/>
         <w:rPr>
           <w:lang w:val="nl-NL"/>
         </w:rPr>
@@ -1366,7 +1366,7 @@
     <w:p>
       <w:pPr>
         <w:spacing w:before="300" w:after="200"/>
-        <w:divId w:val="1726875716"/>
+        <w:divId w:val="990987062"/>
         <w:rPr>
           <w:rFonts w:eastAsia="Times New Roman"/>
           <w:lang w:val="nl-NL"/>
@@ -1377,14 +1377,14 @@
           <w:rFonts w:eastAsia="Times New Roman"/>
           <w:lang w:val="nl-NL"/>
         </w:rPr>
-        <w:pict w14:anchorId="5666EFDC">
+        <w:pict w14:anchorId="6CED380B">
           <v:rect id="_x0000_i1025" style="width:0;height:1.5pt" o:hralign="center" o:hrstd="t" o:hr="t" fillcolor="#a0a0a0" stroked="f"/>
         </w:pict>
       </w:r>
     </w:p>
     <w:p>
       <w:pPr>
-        <w:divId w:val="1599291919"/>
+        <w:divId w:val="1884051110"/>
         <w:rPr>
           <w:color w:val="555555"/>
           <w:sz w:val="20"/>
@@ -1423,7 +1423,7 @@
     </w:p>
     <w:p>
       <w:pPr>
-        <w:divId w:val="1599291919"/>
+        <w:divId w:val="1884051110"/>
         <w:rPr>
           <w:color w:val="555555"/>
           <w:sz w:val="20"/>
@@ -1463,7 +1463,7 @@
     </w:p>
     <w:p>
       <w:pPr>
-        <w:divId w:val="1599291919"/>
+        <w:divId w:val="1884051110"/>
         <w:rPr>
           <w:color w:val="555555"/>
           <w:sz w:val="20"/>
@@ -1493,7 +1493,7 @@
     </w:p>
     <w:p>
       <w:pPr>
-        <w:divId w:val="1599291919"/>
+        <w:divId w:val="1884051110"/>
         <w:rPr>
           <w:color w:val="555555"/>
           <w:sz w:val="20"/>
@@ -1525,7 +1525,7 @@
       <w:pPr>
         <w:pStyle w:val="marker"/>
         <w:ind w:left="800" w:right="800"/>
-        <w:divId w:val="1726875716"/>
+        <w:divId w:val="990987062"/>
         <w:rPr>
           <w:lang w:val="nl-NL"/>
         </w:rPr>
@@ -1537,13 +1537,13 @@
     <w:p>
       <w:pPr>
         <w:pStyle w:val="Kop2"/>
-        <w:divId w:val="1726875716"/>
+        <w:divId w:val="990987062"/>
         <w:rPr>
           <w:rFonts w:eastAsia="Times New Roman"/>
           <w:lang w:val="nl-NL"/>
         </w:rPr>
       </w:pPr>
-      <w:bookmarkStart w:id="2" w:name="_Toc242816570"/>
+      <w:bookmarkStart w:id="2" w:name="_Toc242817603"/>
       <w:r>
         <w:rPr>
           <w:rFonts w:eastAsia="Times New Roman"/>
@@ -1556,7 +1556,7 @@
     <w:p>
       <w:pPr>
         <w:pStyle w:val="Normaalweb"/>
-        <w:divId w:val="1726875716"/>
+        <w:divId w:val="990987062"/>
         <w:rPr>
           <w:lang w:val="nl-NL"/>
         </w:rPr>
@@ -1571,7 +1571,7 @@
     <w:p>
       <w:pPr>
         <w:pStyle w:val="Normaalweb"/>
-        <w:divId w:val="1726875716"/>
+        <w:divId w:val="990987062"/>
         <w:rPr>
           <w:lang w:val="nl-NL"/>
         </w:rPr>
@@ -1586,7 +1586,7 @@
     <w:p>
       <w:pPr>
         <w:pStyle w:val="Normaalweb"/>
-        <w:divId w:val="1726875716"/>
+        <w:divId w:val="990987062"/>
         <w:rPr>
           <w:lang w:val="nl-NL"/>
         </w:rPr>
@@ -1601,13 +1601,13 @@
     <w:p>
       <w:pPr>
         <w:pStyle w:val="Kop2"/>
-        <w:divId w:val="1726875716"/>
+        <w:divId w:val="990987062"/>
         <w:rPr>
           <w:rFonts w:eastAsia="Times New Roman"/>
           <w:lang w:val="nl-NL"/>
         </w:rPr>
       </w:pPr>
-      <w:bookmarkStart w:id="3" w:name="_Toc242816571"/>
+      <w:bookmarkStart w:id="3" w:name="_Toc242817604"/>
       <w:r>
         <w:rPr>
           <w:rFonts w:eastAsia="Times New Roman"/>
@@ -1620,7 +1620,7 @@
     <w:p>
       <w:pPr>
         <w:pStyle w:val="Normaalweb"/>
-        <w:divId w:val="1726875716"/>
+        <w:divId w:val="990987062"/>
         <w:rPr>
           <w:lang w:val="nl-NL"/>
         </w:rPr>
@@ -1635,13 +1635,13 @@
     <w:p>
       <w:pPr>
         <w:pStyle w:val="Kop2"/>
-        <w:divId w:val="1726875716"/>
+        <w:divId w:val="990987062"/>
         <w:rPr>
           <w:rFonts w:eastAsia="Times New Roman"/>
           <w:lang w:val="nl-NL"/>
         </w:rPr>
       </w:pPr>
-      <w:bookmarkStart w:id="4" w:name="_Toc242816572"/>
+      <w:bookmarkStart w:id="4" w:name="_Toc242817605"/>
       <w:r>
         <w:rPr>
           <w:rFonts w:eastAsia="Times New Roman"/>
@@ -1654,7 +1654,7 @@
     <w:p>
       <w:pPr>
         <w:pStyle w:val="Normaalweb"/>
-        <w:divId w:val="1726875716"/>
+        <w:divId w:val="990987062"/>
         <w:rPr>
           <w:lang w:val="nl-NL"/>
         </w:rPr>
@@ -1669,13 +1669,13 @@
     <w:p>
       <w:pPr>
         <w:pStyle w:val="Kop3"/>
-        <w:divId w:val="1726875716"/>
+        <w:divId w:val="990987062"/>
         <w:rPr>
           <w:rFonts w:eastAsia="Times New Roman"/>
           <w:lang w:val="nl-NL"/>
         </w:rPr>
       </w:pPr>
-      <w:bookmarkStart w:id="5" w:name="_Toc242816573"/>
+      <w:bookmarkStart w:id="5" w:name="_Toc242817606"/>
       <w:r>
         <w:rPr>
           <w:rFonts w:eastAsia="Times New Roman"/>
@@ -1688,7 +1688,7 @@
     <w:p>
       <w:pPr>
         <w:pStyle w:val="Normaalweb"/>
-        <w:divId w:val="1726875716"/>
+        <w:divId w:val="990987062"/>
         <w:rPr>
           <w:lang w:val="nl-NL"/>
         </w:rPr>
@@ -1703,13 +1703,13 @@
     <w:p>
       <w:pPr>
         <w:pStyle w:val="Kop3"/>
-        <w:divId w:val="1726875716"/>
+        <w:divId w:val="990987062"/>
         <w:rPr>
           <w:rFonts w:eastAsia="Times New Roman"/>
           <w:lang w:val="nl-NL"/>
         </w:rPr>
       </w:pPr>
-      <w:bookmarkStart w:id="6" w:name="_Toc242816574"/>
+      <w:bookmarkStart w:id="6" w:name="_Toc242817607"/>
       <w:r>
         <w:rPr>
           <w:rFonts w:eastAsia="Times New Roman"/>
@@ -1722,7 +1722,7 @@
     <w:p>
       <w:pPr>
         <w:pStyle w:val="Normaalweb"/>
-        <w:divId w:val="1726875716"/>
+        <w:divId w:val="990987062"/>
         <w:rPr>
           <w:lang w:val="nl-NL"/>
         </w:rPr>
@@ -1737,13 +1737,13 @@
     <w:p>
       <w:pPr>
         <w:pStyle w:val="Kop3"/>
-        <w:divId w:val="1726875716"/>
+        <w:divId w:val="990987062"/>
         <w:rPr>
           <w:rFonts w:eastAsia="Times New Roman"/>
           <w:lang w:val="nl-NL"/>
         </w:rPr>
       </w:pPr>
-      <w:bookmarkStart w:id="7" w:name="_Toc242816575"/>
+      <w:bookmarkStart w:id="7" w:name="_Toc242817608"/>
       <w:r>
         <w:rPr>
           <w:rFonts w:eastAsia="Times New Roman"/>
@@ -1756,7 +1756,7 @@
     <w:p>
       <w:pPr>
         <w:pStyle w:val="Normaalweb"/>
-        <w:divId w:val="1726875716"/>
+        <w:divId w:val="990987062"/>
         <w:rPr>
           <w:lang w:val="nl-NL"/>
         </w:rPr>
@@ -1771,13 +1771,13 @@
     <w:p>
       <w:pPr>
         <w:pStyle w:val="Kop3"/>
-        <w:divId w:val="1726875716"/>
+        <w:divId w:val="990987062"/>
         <w:rPr>
           <w:rFonts w:eastAsia="Times New Roman"/>
           <w:lang w:val="nl-NL"/>
         </w:rPr>
       </w:pPr>
-      <w:bookmarkStart w:id="8" w:name="_Toc242816576"/>
+      <w:bookmarkStart w:id="8" w:name="_Toc242817609"/>
       <w:r>
         <w:rPr>
           <w:rFonts w:eastAsia="Times New Roman"/>
@@ -1790,7 +1790,7 @@
     <w:p>
       <w:pPr>
         <w:pStyle w:val="Normaalweb"/>
-        <w:divId w:val="1726875716"/>
+        <w:divId w:val="990987062"/>
         <w:rPr>
           <w:lang w:val="nl-NL"/>
         </w:rPr>
@@ -1806,13 +1806,13 @@
     <w:p>
       <w:pPr>
         <w:pStyle w:val="Kop2"/>
-        <w:divId w:val="1726875716"/>
+        <w:divId w:val="990987062"/>
         <w:rPr>
           <w:rFonts w:eastAsia="Times New Roman"/>
           <w:lang w:val="nl-NL"/>
         </w:rPr>
       </w:pPr>
-      <w:bookmarkStart w:id="9" w:name="_Toc242816577"/>
+      <w:bookmarkStart w:id="9" w:name="_Toc242817610"/>
       <w:r>
         <w:rPr>
           <w:rFonts w:eastAsia="Times New Roman"/>
@@ -1825,7 +1825,7 @@
     <w:p>
       <w:pPr>
         <w:pStyle w:val="Normaalweb"/>
-        <w:divId w:val="1726875716"/>
+        <w:divId w:val="990987062"/>
         <w:rPr>
           <w:lang w:val="nl-NL"/>
         </w:rPr>
@@ -1840,7 +1840,7 @@
     <w:p>
       <w:pPr>
         <w:pStyle w:val="Normaalweb"/>
-        <w:divId w:val="1726875716"/>
+        <w:divId w:val="990987062"/>
         <w:rPr>
           <w:lang w:val="nl-NL"/>
         </w:rPr>
@@ -1855,7 +1855,7 @@
     <w:p>
       <w:pPr>
         <w:pStyle w:val="Normaalweb"/>
-        <w:divId w:val="1726875716"/>
+        <w:divId w:val="990987062"/>
         <w:rPr>
           <w:lang w:val="nl-NL"/>
         </w:rPr>
@@ -1870,13 +1870,13 @@
     <w:p>
       <w:pPr>
         <w:pStyle w:val="Kop2"/>
-        <w:divId w:val="1726875716"/>
+        <w:divId w:val="990987062"/>
         <w:rPr>
           <w:rFonts w:eastAsia="Times New Roman"/>
           <w:lang w:val="nl-NL"/>
         </w:rPr>
       </w:pPr>
-      <w:bookmarkStart w:id="10" w:name="_Toc242816578"/>
+      <w:bookmarkStart w:id="10" w:name="_Toc242817611"/>
       <w:r>
         <w:rPr>
           <w:rFonts w:eastAsia="Times New Roman"/>
@@ -1889,7 +1889,7 @@
     <w:p>
       <w:pPr>
         <w:pStyle w:val="Normaalweb"/>
-        <w:divId w:val="1726875716"/>
+        <w:divId w:val="990987062"/>
         <w:rPr>
           <w:lang w:val="nl-NL"/>
         </w:rPr>
@@ -1904,7 +1904,7 @@
     <w:p>
       <w:pPr>
         <w:pStyle w:val="Normaalweb"/>
-        <w:divId w:val="1726875716"/>
+        <w:divId w:val="990987062"/>
         <w:rPr>
           <w:lang w:val="nl-NL"/>
         </w:rPr>
@@ -1919,13 +1919,13 @@
     <w:p>
       <w:pPr>
         <w:pStyle w:val="Kop2"/>
-        <w:divId w:val="1726875716"/>
+        <w:divId w:val="990987062"/>
         <w:rPr>
           <w:rFonts w:eastAsia="Times New Roman"/>
           <w:lang w:val="nl-NL"/>
         </w:rPr>
       </w:pPr>
-      <w:bookmarkStart w:id="11" w:name="_Toc242816579"/>
+      <w:bookmarkStart w:id="11" w:name="_Toc242817612"/>
       <w:r>
         <w:rPr>
           <w:rFonts w:eastAsia="Times New Roman"/>
@@ -1938,7 +1938,7 @@
     <w:p>
       <w:pPr>
         <w:pStyle w:val="Normaalweb"/>
-        <w:divId w:val="1726875716"/>
+        <w:divId w:val="990987062"/>
         <w:rPr>
           <w:lang w:val="nl-NL"/>
         </w:rPr>
@@ -1953,7 +1953,7 @@
     <w:p>
       <w:pPr>
         <w:pStyle w:val="Normaalweb"/>
-        <w:divId w:val="1726875716"/>
+        <w:divId w:val="990987062"/>
         <w:rPr>
           <w:lang w:val="nl-NL"/>
         </w:rPr>
@@ -1968,7 +1968,7 @@
     <w:p>
       <w:pPr>
         <w:shd w:val="clear" w:color="auto" w:fill="FFFFFF"/>
-        <w:divId w:val="1627660286"/>
+        <w:divId w:val="913205510"/>
         <w:rPr>
           <w:szCs w:val="22"/>
           <w:lang w:val="nl-NL"/>
@@ -2236,7 +2236,7 @@
         <w:sz w:val="18"/>
       </w:rPr>
       <w:tab/>
-      <w:t>Laatst gewijzigd: 13 oktober 2026, 20:41</w:t>
+      <w:t>Laatst gewijzigd: 13 oktober 2026, 20:58</w:t>
     </w:r>
   </w:p>
 </w:hdr>
@@ -3603,7 +3603,7 @@
     <w:link w:val="KoptekstChar"/>
     <w:uiPriority w:val="99"/>
     <w:unhideWhenUsed/>
-    <w:rsid w:val="003B3E74"/>
+    <w:rsid w:val="003E27EF"/>
     <w:pPr>
       <w:tabs>
         <w:tab w:val="center" w:pos="4536"/>
@@ -3616,7 +3616,7 @@
     <w:basedOn w:val="Standaardalinea-lettertype"/>
     <w:link w:val="Koptekst"/>
     <w:uiPriority w:val="99"/>
-    <w:rsid w:val="003B3E74"/>
+    <w:rsid w:val="003E27EF"/>
     <w:rPr>
       <w:rFonts w:eastAsiaTheme="minorEastAsia"/>
       <w:sz w:val="24"/>
@@ -3629,7 +3629,7 @@
     <w:link w:val="VoettekstChar"/>
     <w:uiPriority w:val="99"/>
     <w:unhideWhenUsed/>
-    <w:rsid w:val="003B3E74"/>
+    <w:rsid w:val="003E27EF"/>
     <w:pPr>
       <w:tabs>
         <w:tab w:val="center" w:pos="4536"/>
@@ -3642,7 +3642,7 @@
     <w:basedOn w:val="Standaardalinea-lettertype"/>
     <w:link w:val="Voettekst"/>
     <w:uiPriority w:val="99"/>
-    <w:rsid w:val="003B3E74"/>
+    <w:rsid w:val="003E27EF"/>
     <w:rPr>
       <w:rFonts w:eastAsiaTheme="minorEastAsia"/>
       <w:sz w:val="24"/>
@@ -3656,7 +3656,7 @@
     <w:autoRedefine/>
     <w:uiPriority w:val="39"/>
     <w:unhideWhenUsed/>
-    <w:rsid w:val="003B3E74"/>
+    <w:rsid w:val="003E27EF"/>
     <w:pPr>
       <w:spacing w:after="100"/>
       <w:ind w:left="220"/>
@@ -3669,7 +3669,7 @@
     <w:autoRedefine/>
     <w:uiPriority w:val="39"/>
     <w:unhideWhenUsed/>
-    <w:rsid w:val="003B3E74"/>
+    <w:rsid w:val="003E27EF"/>
     <w:pPr>
       <w:spacing w:after="100"/>
       <w:ind w:left="440"/>

</xml_diff>

<commit_message>
Update Systeem-Audit NL 14-10-2026 07:57
</commit_message>
<xml_diff>
--- a/nl/docx/document-0.docx
+++ b/nl/docx/document-0.docx
@@ -7,7 +7,7 @@
         <w:spacing w:after="480"/>
         <w:jc w:val="center"/>
         <w:outlineLvl w:val="1"/>
-        <w:divId w:val="1771924858"/>
+        <w:divId w:val="646595777"/>
         <w:rPr>
           <w:rFonts w:ascii="Aptos Display" w:eastAsia="Times New Roman" w:hAnsi="Aptos Display"/>
           <w:b/>
@@ -36,7 +36,7 @@
     <w:p>
       <w:pPr>
         <w:pStyle w:val="ondertitel2"/>
-        <w:divId w:val="1771924858"/>
+        <w:divId w:val="646595777"/>
         <w:rPr>
           <w:lang w:val="nl-NL"/>
         </w:rPr>
@@ -51,7 +51,7 @@
     <w:p>
       <w:pPr>
         <w:pStyle w:val="documentaanduiding2"/>
-        <w:divId w:val="1771924858"/>
+        <w:divId w:val="646595777"/>
         <w:rPr>
           <w:lang w:val="nl-NL"/>
         </w:rPr>
@@ -66,7 +66,7 @@
     <w:p>
       <w:pPr>
         <w:pStyle w:val="auteur2"/>
-        <w:divId w:val="1771924858"/>
+        <w:divId w:val="646595777"/>
         <w:rPr>
           <w:lang w:val="nl-NL"/>
         </w:rPr>
@@ -81,23 +81,23 @@
     <w:p>
       <w:pPr>
         <w:pStyle w:val="meta-lijn2"/>
-        <w:divId w:val="1771924858"/>
-        <w:rPr>
-          <w:lang w:val="nl-NL"/>
-        </w:rPr>
-      </w:pPr>
-      <w:r>
-        <w:rPr>
-          <w:lang w:val="nl-NL"/>
-        </w:rPr>
-        <w:t>Versie bijgewerkt: 13 oktober 2026, 20:58</w:t>
+        <w:divId w:val="646595777"/>
+        <w:rPr>
+          <w:lang w:val="nl-NL"/>
+        </w:rPr>
+      </w:pPr>
+      <w:r>
+        <w:rPr>
+          <w:lang w:val="nl-NL"/>
+        </w:rPr>
+        <w:t>Versie bijgewerkt: 14 oktober 2026, 07:57</w:t>
       </w:r>
     </w:p>
     <w:p>
       <w:pPr>
         <w:pStyle w:val="marker"/>
         <w:ind w:left="800" w:right="800"/>
-        <w:divId w:val="990987062"/>
+        <w:divId w:val="942886274"/>
         <w:rPr>
           <w:lang w:val="nl-NL"/>
         </w:rPr>
@@ -110,13 +110,13 @@
       <w:pPr>
         <w:pStyle w:val="Kop2"/>
         <w:pageBreakBefore/>
-        <w:divId w:val="25836344"/>
+        <w:divId w:val="899292205"/>
         <w:rPr>
           <w:rFonts w:eastAsia="Times New Roman"/>
           <w:lang w:val="nl-NL"/>
         </w:rPr>
       </w:pPr>
-      <w:bookmarkStart w:id="0" w:name="_Toc242817601"/>
+      <w:bookmarkStart w:id="0" w:name="_Toc242857142"/>
       <w:r>
         <w:rPr>
           <w:rFonts w:eastAsia="Times New Roman"/>
@@ -133,7 +133,7 @@
         <w:tabs>
           <w:tab w:val="right" w:leader="dot" w:pos="9062"/>
         </w:tabs>
-        <w:divId w:val="25836344"/>
+        <w:divId w:val="899292205"/>
         <w:rPr>
           <w:rFonts w:asciiTheme="minorHAnsi" w:hAnsiTheme="minorHAnsi" w:cstheme="minorBidi"/>
           <w:noProof/>
@@ -184,7 +184,7 @@
         <w:rPr>
           <w:noProof/>
         </w:rPr>
-        <w:instrText xml:space="preserve"> PAGEREF _Toc242817601 \h </w:instrText>
+        <w:instrText xml:space="preserve"> PAGEREF _Toc242857142 \h </w:instrText>
       </w:r>
       <w:r>
         <w:rPr>
@@ -216,7 +216,7 @@
         <w:tabs>
           <w:tab w:val="right" w:leader="dot" w:pos="9062"/>
         </w:tabs>
-        <w:divId w:val="25836344"/>
+        <w:divId w:val="899292205"/>
         <w:rPr>
           <w:rFonts w:asciiTheme="minorHAnsi" w:hAnsiTheme="minorHAnsi" w:cstheme="minorBidi"/>
           <w:noProof/>
@@ -249,7 +249,7 @@
         <w:rPr>
           <w:noProof/>
         </w:rPr>
-        <w:instrText xml:space="preserve"> PAGEREF _Toc242817602 \h </w:instrText>
+        <w:instrText xml:space="preserve"> PAGEREF _Toc242857143 \h </w:instrText>
       </w:r>
       <w:r>
         <w:rPr>
@@ -281,7 +281,7 @@
         <w:tabs>
           <w:tab w:val="right" w:leader="dot" w:pos="9062"/>
         </w:tabs>
-        <w:divId w:val="25836344"/>
+        <w:divId w:val="899292205"/>
         <w:rPr>
           <w:rFonts w:asciiTheme="minorHAnsi" w:hAnsiTheme="minorHAnsi" w:cstheme="minorBidi"/>
           <w:noProof/>
@@ -314,7 +314,7 @@
         <w:rPr>
           <w:noProof/>
         </w:rPr>
-        <w:instrText xml:space="preserve"> PAGEREF _Toc242817603 \h </w:instrText>
+        <w:instrText xml:space="preserve"> PAGEREF _Toc242857144 \h </w:instrText>
       </w:r>
       <w:r>
         <w:rPr>
@@ -346,7 +346,7 @@
         <w:tabs>
           <w:tab w:val="right" w:leader="dot" w:pos="9062"/>
         </w:tabs>
-        <w:divId w:val="25836344"/>
+        <w:divId w:val="899292205"/>
         <w:rPr>
           <w:rFonts w:asciiTheme="minorHAnsi" w:hAnsiTheme="minorHAnsi" w:cstheme="minorBidi"/>
           <w:noProof/>
@@ -379,7 +379,7 @@
         <w:rPr>
           <w:noProof/>
         </w:rPr>
-        <w:instrText xml:space="preserve"> PAGEREF _Toc242817604 \h </w:instrText>
+        <w:instrText xml:space="preserve"> PAGEREF _Toc242857145 \h </w:instrText>
       </w:r>
       <w:r>
         <w:rPr>
@@ -411,7 +411,7 @@
         <w:tabs>
           <w:tab w:val="right" w:leader="dot" w:pos="9062"/>
         </w:tabs>
-        <w:divId w:val="25836344"/>
+        <w:divId w:val="899292205"/>
         <w:rPr>
           <w:rFonts w:asciiTheme="minorHAnsi" w:hAnsiTheme="minorHAnsi" w:cstheme="minorBidi"/>
           <w:noProof/>
@@ -444,7 +444,7 @@
         <w:rPr>
           <w:noProof/>
         </w:rPr>
-        <w:instrText xml:space="preserve"> PAGEREF _Toc242817605 \h </w:instrText>
+        <w:instrText xml:space="preserve"> PAGEREF _Toc242857146 \h </w:instrText>
       </w:r>
       <w:r>
         <w:rPr>
@@ -476,7 +476,7 @@
         <w:tabs>
           <w:tab w:val="right" w:leader="dot" w:pos="9062"/>
         </w:tabs>
-        <w:divId w:val="25836344"/>
+        <w:divId w:val="899292205"/>
         <w:rPr>
           <w:rFonts w:asciiTheme="minorHAnsi" w:hAnsiTheme="minorHAnsi" w:cstheme="minorBidi"/>
           <w:noProof/>
@@ -509,7 +509,7 @@
         <w:rPr>
           <w:noProof/>
         </w:rPr>
-        <w:instrText xml:space="preserve"> PAGEREF _Toc242817606 \h </w:instrText>
+        <w:instrText xml:space="preserve"> PAGEREF _Toc242857147 \h </w:instrText>
       </w:r>
       <w:r>
         <w:rPr>
@@ -541,7 +541,7 @@
         <w:tabs>
           <w:tab w:val="right" w:leader="dot" w:pos="9062"/>
         </w:tabs>
-        <w:divId w:val="25836344"/>
+        <w:divId w:val="899292205"/>
         <w:rPr>
           <w:rFonts w:asciiTheme="minorHAnsi" w:hAnsiTheme="minorHAnsi" w:cstheme="minorBidi"/>
           <w:noProof/>
@@ -574,7 +574,7 @@
         <w:rPr>
           <w:noProof/>
         </w:rPr>
-        <w:instrText xml:space="preserve"> PAGEREF _Toc242817607 \h </w:instrText>
+        <w:instrText xml:space="preserve"> PAGEREF _Toc242857148 \h </w:instrText>
       </w:r>
       <w:r>
         <w:rPr>
@@ -606,7 +606,7 @@
         <w:tabs>
           <w:tab w:val="right" w:leader="dot" w:pos="9062"/>
         </w:tabs>
-        <w:divId w:val="25836344"/>
+        <w:divId w:val="899292205"/>
         <w:rPr>
           <w:rFonts w:asciiTheme="minorHAnsi" w:hAnsiTheme="minorHAnsi" w:cstheme="minorBidi"/>
           <w:noProof/>
@@ -639,7 +639,7 @@
         <w:rPr>
           <w:noProof/>
         </w:rPr>
-        <w:instrText xml:space="preserve"> PAGEREF _Toc242817608 \h </w:instrText>
+        <w:instrText xml:space="preserve"> PAGEREF _Toc242857149 \h </w:instrText>
       </w:r>
       <w:r>
         <w:rPr>
@@ -671,7 +671,7 @@
         <w:tabs>
           <w:tab w:val="right" w:leader="dot" w:pos="9062"/>
         </w:tabs>
-        <w:divId w:val="25836344"/>
+        <w:divId w:val="899292205"/>
         <w:rPr>
           <w:rFonts w:asciiTheme="minorHAnsi" w:hAnsiTheme="minorHAnsi" w:cstheme="minorBidi"/>
           <w:noProof/>
@@ -704,7 +704,7 @@
         <w:rPr>
           <w:noProof/>
         </w:rPr>
-        <w:instrText xml:space="preserve"> PAGEREF _Toc242817609 \h </w:instrText>
+        <w:instrText xml:space="preserve"> PAGEREF _Toc242857150 \h </w:instrText>
       </w:r>
       <w:r>
         <w:rPr>
@@ -736,7 +736,7 @@
         <w:tabs>
           <w:tab w:val="right" w:leader="dot" w:pos="9062"/>
         </w:tabs>
-        <w:divId w:val="25836344"/>
+        <w:divId w:val="899292205"/>
         <w:rPr>
           <w:rFonts w:asciiTheme="minorHAnsi" w:hAnsiTheme="minorHAnsi" w:cstheme="minorBidi"/>
           <w:noProof/>
@@ -769,7 +769,7 @@
         <w:rPr>
           <w:noProof/>
         </w:rPr>
-        <w:instrText xml:space="preserve"> PAGEREF _Toc242817610 \h </w:instrText>
+        <w:instrText xml:space="preserve"> PAGEREF _Toc242857151 \h </w:instrText>
       </w:r>
       <w:r>
         <w:rPr>
@@ -801,7 +801,7 @@
         <w:tabs>
           <w:tab w:val="right" w:leader="dot" w:pos="9062"/>
         </w:tabs>
-        <w:divId w:val="25836344"/>
+        <w:divId w:val="899292205"/>
         <w:rPr>
           <w:rFonts w:asciiTheme="minorHAnsi" w:hAnsiTheme="minorHAnsi" w:cstheme="minorBidi"/>
           <w:noProof/>
@@ -834,7 +834,7 @@
         <w:rPr>
           <w:noProof/>
         </w:rPr>
-        <w:instrText xml:space="preserve"> PAGEREF _Toc242817611 \h </w:instrText>
+        <w:instrText xml:space="preserve"> PAGEREF _Toc242857152 \h </w:instrText>
       </w:r>
       <w:r>
         <w:rPr>
@@ -866,7 +866,7 @@
         <w:tabs>
           <w:tab w:val="right" w:leader="dot" w:pos="9062"/>
         </w:tabs>
-        <w:divId w:val="25836344"/>
+        <w:divId w:val="899292205"/>
         <w:rPr>
           <w:rFonts w:asciiTheme="minorHAnsi" w:hAnsiTheme="minorHAnsi" w:cstheme="minorBidi"/>
           <w:noProof/>
@@ -899,7 +899,7 @@
         <w:rPr>
           <w:noProof/>
         </w:rPr>
-        <w:instrText xml:space="preserve"> PAGEREF _Toc242817612 \h </w:instrText>
+        <w:instrText xml:space="preserve"> PAGEREF _Toc242857153 \h </w:instrText>
       </w:r>
       <w:r>
         <w:rPr>
@@ -928,7 +928,7 @@
     <w:p>
       <w:pPr>
         <w:pStyle w:val="marker"/>
-        <w:divId w:val="25836344"/>
+        <w:divId w:val="899292205"/>
         <w:rPr>
           <w:lang w:val="nl-NL"/>
         </w:rPr>
@@ -944,7 +944,7 @@
       <w:pPr>
         <w:pStyle w:val="marker"/>
         <w:ind w:left="800" w:right="800"/>
-        <w:divId w:val="990987062"/>
+        <w:divId w:val="942886274"/>
         <w:rPr>
           <w:lang w:val="nl-NL"/>
         </w:rPr>
@@ -956,13 +956,13 @@
     <w:p>
       <w:pPr>
         <w:pStyle w:val="Kop2"/>
-        <w:divId w:val="990987062"/>
+        <w:divId w:val="942886274"/>
         <w:rPr>
           <w:rFonts w:eastAsia="Times New Roman"/>
           <w:lang w:val="nl-NL"/>
         </w:rPr>
       </w:pPr>
-      <w:bookmarkStart w:id="1" w:name="_Toc242817602"/>
+      <w:bookmarkStart w:id="1" w:name="_Toc242857143"/>
       <w:r>
         <w:rPr>
           <w:rFonts w:eastAsia="Times New Roman"/>
@@ -975,7 +975,7 @@
     <w:p>
       <w:pPr>
         <w:pStyle w:val="Normaalweb"/>
-        <w:divId w:val="990987062"/>
+        <w:divId w:val="942886274"/>
         <w:rPr>
           <w:lang w:val="nl-NL"/>
         </w:rPr>
@@ -990,7 +990,7 @@
     <w:p>
       <w:pPr>
         <w:pStyle w:val="Normaalweb"/>
-        <w:divId w:val="990987062"/>
+        <w:divId w:val="942886274"/>
         <w:rPr>
           <w:lang w:val="nl-NL"/>
         </w:rPr>
@@ -1018,7 +1018,7 @@
     <w:p>
       <w:pPr>
         <w:pStyle w:val="Normaalweb"/>
-        <w:divId w:val="990987062"/>
+        <w:divId w:val="942886274"/>
         <w:rPr>
           <w:lang w:val="nl-NL"/>
         </w:rPr>
@@ -1039,7 +1039,7 @@
     <w:p>
       <w:pPr>
         <w:pStyle w:val="Normaalweb"/>
-        <w:divId w:val="990987062"/>
+        <w:divId w:val="942886274"/>
         <w:rPr>
           <w:lang w:val="nl-NL"/>
         </w:rPr>
@@ -1086,7 +1086,7 @@
     <w:p>
       <w:pPr>
         <w:pStyle w:val="Normaalweb"/>
-        <w:divId w:val="990987062"/>
+        <w:divId w:val="942886274"/>
         <w:rPr>
           <w:lang w:val="nl-NL"/>
         </w:rPr>
@@ -1114,7 +1114,7 @@
     <w:p>
       <w:pPr>
         <w:pStyle w:val="Normaalweb"/>
-        <w:divId w:val="990987062"/>
+        <w:divId w:val="942886274"/>
         <w:rPr>
           <w:lang w:val="nl-NL"/>
         </w:rPr>
@@ -1148,7 +1148,7 @@
     <w:p>
       <w:pPr>
         <w:pStyle w:val="Normaalweb"/>
-        <w:divId w:val="990987062"/>
+        <w:divId w:val="942886274"/>
         <w:rPr>
           <w:lang w:val="nl-NL"/>
         </w:rPr>
@@ -1175,7 +1175,7 @@
     <w:p>
       <w:pPr>
         <w:pStyle w:val="Normaalweb"/>
-        <w:divId w:val="990987062"/>
+        <w:divId w:val="942886274"/>
         <w:rPr>
           <w:lang w:val="nl-NL"/>
         </w:rPr>
@@ -1203,7 +1203,7 @@
     <w:p>
       <w:pPr>
         <w:pStyle w:val="Normaalweb"/>
-        <w:divId w:val="990987062"/>
+        <w:divId w:val="942886274"/>
         <w:rPr>
           <w:lang w:val="nl-NL"/>
         </w:rPr>
@@ -1218,7 +1218,7 @@
     <w:p>
       <w:pPr>
         <w:pStyle w:val="Normaalweb"/>
-        <w:divId w:val="990987062"/>
+        <w:divId w:val="942886274"/>
         <w:rPr>
           <w:lang w:val="nl-NL"/>
         </w:rPr>
@@ -1278,7 +1278,7 @@
     <w:p>
       <w:pPr>
         <w:pStyle w:val="Normaalweb"/>
-        <w:divId w:val="990987062"/>
+        <w:divId w:val="942886274"/>
         <w:rPr>
           <w:lang w:val="nl-NL"/>
         </w:rPr>
@@ -1293,7 +1293,7 @@
     <w:p>
       <w:pPr>
         <w:pStyle w:val="Normaalweb"/>
-        <w:divId w:val="990987062"/>
+        <w:divId w:val="942886274"/>
         <w:rPr>
           <w:lang w:val="nl-NL"/>
         </w:rPr>
@@ -1321,7 +1321,7 @@
     <w:p>
       <w:pPr>
         <w:pStyle w:val="Normaalweb"/>
-        <w:divId w:val="990987062"/>
+        <w:divId w:val="942886274"/>
         <w:rPr>
           <w:lang w:val="nl-NL"/>
         </w:rPr>
@@ -1336,7 +1336,7 @@
     <w:p>
       <w:pPr>
         <w:pStyle w:val="Normaalweb"/>
-        <w:divId w:val="990987062"/>
+        <w:divId w:val="942886274"/>
         <w:rPr>
           <w:lang w:val="nl-NL"/>
         </w:rPr>
@@ -1351,7 +1351,7 @@
     <w:p>
       <w:pPr>
         <w:pStyle w:val="Normaalweb"/>
-        <w:divId w:val="990987062"/>
+        <w:divId w:val="942886274"/>
         <w:rPr>
           <w:lang w:val="nl-NL"/>
         </w:rPr>
@@ -1366,7 +1366,7 @@
     <w:p>
       <w:pPr>
         <w:spacing w:before="300" w:after="200"/>
-        <w:divId w:val="990987062"/>
+        <w:divId w:val="942886274"/>
         <w:rPr>
           <w:rFonts w:eastAsia="Times New Roman"/>
           <w:lang w:val="nl-NL"/>
@@ -1377,14 +1377,14 @@
           <w:rFonts w:eastAsia="Times New Roman"/>
           <w:lang w:val="nl-NL"/>
         </w:rPr>
-        <w:pict w14:anchorId="6CED380B">
+        <w:pict w14:anchorId="1DB9B4CA">
           <v:rect id="_x0000_i1025" style="width:0;height:1.5pt" o:hralign="center" o:hrstd="t" o:hr="t" fillcolor="#a0a0a0" stroked="f"/>
         </w:pict>
       </w:r>
     </w:p>
     <w:p>
       <w:pPr>
-        <w:divId w:val="1884051110"/>
+        <w:divId w:val="2120563263"/>
         <w:rPr>
           <w:color w:val="555555"/>
           <w:sz w:val="20"/>
@@ -1423,7 +1423,7 @@
     </w:p>
     <w:p>
       <w:pPr>
-        <w:divId w:val="1884051110"/>
+        <w:divId w:val="2120563263"/>
         <w:rPr>
           <w:color w:val="555555"/>
           <w:sz w:val="20"/>
@@ -1463,7 +1463,7 @@
     </w:p>
     <w:p>
       <w:pPr>
-        <w:divId w:val="1884051110"/>
+        <w:divId w:val="2120563263"/>
         <w:rPr>
           <w:color w:val="555555"/>
           <w:sz w:val="20"/>
@@ -1493,7 +1493,7 @@
     </w:p>
     <w:p>
       <w:pPr>
-        <w:divId w:val="1884051110"/>
+        <w:divId w:val="2120563263"/>
         <w:rPr>
           <w:color w:val="555555"/>
           <w:sz w:val="20"/>
@@ -1525,7 +1525,7 @@
       <w:pPr>
         <w:pStyle w:val="marker"/>
         <w:ind w:left="800" w:right="800"/>
-        <w:divId w:val="990987062"/>
+        <w:divId w:val="942886274"/>
         <w:rPr>
           <w:lang w:val="nl-NL"/>
         </w:rPr>
@@ -1537,13 +1537,13 @@
     <w:p>
       <w:pPr>
         <w:pStyle w:val="Kop2"/>
-        <w:divId w:val="990987062"/>
+        <w:divId w:val="942886274"/>
         <w:rPr>
           <w:rFonts w:eastAsia="Times New Roman"/>
           <w:lang w:val="nl-NL"/>
         </w:rPr>
       </w:pPr>
-      <w:bookmarkStart w:id="2" w:name="_Toc242817603"/>
+      <w:bookmarkStart w:id="2" w:name="_Toc242857144"/>
       <w:r>
         <w:rPr>
           <w:rFonts w:eastAsia="Times New Roman"/>
@@ -1556,7 +1556,7 @@
     <w:p>
       <w:pPr>
         <w:pStyle w:val="Normaalweb"/>
-        <w:divId w:val="990987062"/>
+        <w:divId w:val="942886274"/>
         <w:rPr>
           <w:lang w:val="nl-NL"/>
         </w:rPr>
@@ -1571,7 +1571,7 @@
     <w:p>
       <w:pPr>
         <w:pStyle w:val="Normaalweb"/>
-        <w:divId w:val="990987062"/>
+        <w:divId w:val="942886274"/>
         <w:rPr>
           <w:lang w:val="nl-NL"/>
         </w:rPr>
@@ -1586,7 +1586,7 @@
     <w:p>
       <w:pPr>
         <w:pStyle w:val="Normaalweb"/>
-        <w:divId w:val="990987062"/>
+        <w:divId w:val="942886274"/>
         <w:rPr>
           <w:lang w:val="nl-NL"/>
         </w:rPr>
@@ -1601,13 +1601,13 @@
     <w:p>
       <w:pPr>
         <w:pStyle w:val="Kop2"/>
-        <w:divId w:val="990987062"/>
+        <w:divId w:val="942886274"/>
         <w:rPr>
           <w:rFonts w:eastAsia="Times New Roman"/>
           <w:lang w:val="nl-NL"/>
         </w:rPr>
       </w:pPr>
-      <w:bookmarkStart w:id="3" w:name="_Toc242817604"/>
+      <w:bookmarkStart w:id="3" w:name="_Toc242857145"/>
       <w:r>
         <w:rPr>
           <w:rFonts w:eastAsia="Times New Roman"/>
@@ -1620,7 +1620,7 @@
     <w:p>
       <w:pPr>
         <w:pStyle w:val="Normaalweb"/>
-        <w:divId w:val="990987062"/>
+        <w:divId w:val="942886274"/>
         <w:rPr>
           <w:lang w:val="nl-NL"/>
         </w:rPr>
@@ -1635,13 +1635,13 @@
     <w:p>
       <w:pPr>
         <w:pStyle w:val="Kop2"/>
-        <w:divId w:val="990987062"/>
+        <w:divId w:val="942886274"/>
         <w:rPr>
           <w:rFonts w:eastAsia="Times New Roman"/>
           <w:lang w:val="nl-NL"/>
         </w:rPr>
       </w:pPr>
-      <w:bookmarkStart w:id="4" w:name="_Toc242817605"/>
+      <w:bookmarkStart w:id="4" w:name="_Toc242857146"/>
       <w:r>
         <w:rPr>
           <w:rFonts w:eastAsia="Times New Roman"/>
@@ -1654,7 +1654,7 @@
     <w:p>
       <w:pPr>
         <w:pStyle w:val="Normaalweb"/>
-        <w:divId w:val="990987062"/>
+        <w:divId w:val="942886274"/>
         <w:rPr>
           <w:lang w:val="nl-NL"/>
         </w:rPr>
@@ -1669,13 +1669,13 @@
     <w:p>
       <w:pPr>
         <w:pStyle w:val="Kop3"/>
-        <w:divId w:val="990987062"/>
+        <w:divId w:val="942886274"/>
         <w:rPr>
           <w:rFonts w:eastAsia="Times New Roman"/>
           <w:lang w:val="nl-NL"/>
         </w:rPr>
       </w:pPr>
-      <w:bookmarkStart w:id="5" w:name="_Toc242817606"/>
+      <w:bookmarkStart w:id="5" w:name="_Toc242857147"/>
       <w:r>
         <w:rPr>
           <w:rFonts w:eastAsia="Times New Roman"/>
@@ -1688,7 +1688,7 @@
     <w:p>
       <w:pPr>
         <w:pStyle w:val="Normaalweb"/>
-        <w:divId w:val="990987062"/>
+        <w:divId w:val="942886274"/>
         <w:rPr>
           <w:lang w:val="nl-NL"/>
         </w:rPr>
@@ -1703,13 +1703,13 @@
     <w:p>
       <w:pPr>
         <w:pStyle w:val="Kop3"/>
-        <w:divId w:val="990987062"/>
+        <w:divId w:val="942886274"/>
         <w:rPr>
           <w:rFonts w:eastAsia="Times New Roman"/>
           <w:lang w:val="nl-NL"/>
         </w:rPr>
       </w:pPr>
-      <w:bookmarkStart w:id="6" w:name="_Toc242817607"/>
+      <w:bookmarkStart w:id="6" w:name="_Toc242857148"/>
       <w:r>
         <w:rPr>
           <w:rFonts w:eastAsia="Times New Roman"/>
@@ -1722,7 +1722,7 @@
     <w:p>
       <w:pPr>
         <w:pStyle w:val="Normaalweb"/>
-        <w:divId w:val="990987062"/>
+        <w:divId w:val="942886274"/>
         <w:rPr>
           <w:lang w:val="nl-NL"/>
         </w:rPr>
@@ -1737,13 +1737,13 @@
     <w:p>
       <w:pPr>
         <w:pStyle w:val="Kop3"/>
-        <w:divId w:val="990987062"/>
+        <w:divId w:val="942886274"/>
         <w:rPr>
           <w:rFonts w:eastAsia="Times New Roman"/>
           <w:lang w:val="nl-NL"/>
         </w:rPr>
       </w:pPr>
-      <w:bookmarkStart w:id="7" w:name="_Toc242817608"/>
+      <w:bookmarkStart w:id="7" w:name="_Toc242857149"/>
       <w:r>
         <w:rPr>
           <w:rFonts w:eastAsia="Times New Roman"/>
@@ -1756,7 +1756,7 @@
     <w:p>
       <w:pPr>
         <w:pStyle w:val="Normaalweb"/>
-        <w:divId w:val="990987062"/>
+        <w:divId w:val="942886274"/>
         <w:rPr>
           <w:lang w:val="nl-NL"/>
         </w:rPr>
@@ -1771,13 +1771,13 @@
     <w:p>
       <w:pPr>
         <w:pStyle w:val="Kop3"/>
-        <w:divId w:val="990987062"/>
+        <w:divId w:val="942886274"/>
         <w:rPr>
           <w:rFonts w:eastAsia="Times New Roman"/>
           <w:lang w:val="nl-NL"/>
         </w:rPr>
       </w:pPr>
-      <w:bookmarkStart w:id="8" w:name="_Toc242817609"/>
+      <w:bookmarkStart w:id="8" w:name="_Toc242857150"/>
       <w:r>
         <w:rPr>
           <w:rFonts w:eastAsia="Times New Roman"/>
@@ -1790,7 +1790,7 @@
     <w:p>
       <w:pPr>
         <w:pStyle w:val="Normaalweb"/>
-        <w:divId w:val="990987062"/>
+        <w:divId w:val="942886274"/>
         <w:rPr>
           <w:lang w:val="nl-NL"/>
         </w:rPr>
@@ -1806,13 +1806,13 @@
     <w:p>
       <w:pPr>
         <w:pStyle w:val="Kop2"/>
-        <w:divId w:val="990987062"/>
+        <w:divId w:val="942886274"/>
         <w:rPr>
           <w:rFonts w:eastAsia="Times New Roman"/>
           <w:lang w:val="nl-NL"/>
         </w:rPr>
       </w:pPr>
-      <w:bookmarkStart w:id="9" w:name="_Toc242817610"/>
+      <w:bookmarkStart w:id="9" w:name="_Toc242857151"/>
       <w:r>
         <w:rPr>
           <w:rFonts w:eastAsia="Times New Roman"/>
@@ -1825,7 +1825,7 @@
     <w:p>
       <w:pPr>
         <w:pStyle w:val="Normaalweb"/>
-        <w:divId w:val="990987062"/>
+        <w:divId w:val="942886274"/>
         <w:rPr>
           <w:lang w:val="nl-NL"/>
         </w:rPr>
@@ -1840,7 +1840,7 @@
     <w:p>
       <w:pPr>
         <w:pStyle w:val="Normaalweb"/>
-        <w:divId w:val="990987062"/>
+        <w:divId w:val="942886274"/>
         <w:rPr>
           <w:lang w:val="nl-NL"/>
         </w:rPr>
@@ -1855,7 +1855,7 @@
     <w:p>
       <w:pPr>
         <w:pStyle w:val="Normaalweb"/>
-        <w:divId w:val="990987062"/>
+        <w:divId w:val="942886274"/>
         <w:rPr>
           <w:lang w:val="nl-NL"/>
         </w:rPr>
@@ -1870,13 +1870,13 @@
     <w:p>
       <w:pPr>
         <w:pStyle w:val="Kop2"/>
-        <w:divId w:val="990987062"/>
+        <w:divId w:val="942886274"/>
         <w:rPr>
           <w:rFonts w:eastAsia="Times New Roman"/>
           <w:lang w:val="nl-NL"/>
         </w:rPr>
       </w:pPr>
-      <w:bookmarkStart w:id="10" w:name="_Toc242817611"/>
+      <w:bookmarkStart w:id="10" w:name="_Toc242857152"/>
       <w:r>
         <w:rPr>
           <w:rFonts w:eastAsia="Times New Roman"/>
@@ -1889,7 +1889,7 @@
     <w:p>
       <w:pPr>
         <w:pStyle w:val="Normaalweb"/>
-        <w:divId w:val="990987062"/>
+        <w:divId w:val="942886274"/>
         <w:rPr>
           <w:lang w:val="nl-NL"/>
         </w:rPr>
@@ -1904,7 +1904,7 @@
     <w:p>
       <w:pPr>
         <w:pStyle w:val="Normaalweb"/>
-        <w:divId w:val="990987062"/>
+        <w:divId w:val="942886274"/>
         <w:rPr>
           <w:lang w:val="nl-NL"/>
         </w:rPr>
@@ -1919,13 +1919,13 @@
     <w:p>
       <w:pPr>
         <w:pStyle w:val="Kop2"/>
-        <w:divId w:val="990987062"/>
+        <w:divId w:val="942886274"/>
         <w:rPr>
           <w:rFonts w:eastAsia="Times New Roman"/>
           <w:lang w:val="nl-NL"/>
         </w:rPr>
       </w:pPr>
-      <w:bookmarkStart w:id="11" w:name="_Toc242817612"/>
+      <w:bookmarkStart w:id="11" w:name="_Toc242857153"/>
       <w:r>
         <w:rPr>
           <w:rFonts w:eastAsia="Times New Roman"/>
@@ -1938,7 +1938,7 @@
     <w:p>
       <w:pPr>
         <w:pStyle w:val="Normaalweb"/>
-        <w:divId w:val="990987062"/>
+        <w:divId w:val="942886274"/>
         <w:rPr>
           <w:lang w:val="nl-NL"/>
         </w:rPr>
@@ -1953,7 +1953,7 @@
     <w:p>
       <w:pPr>
         <w:pStyle w:val="Normaalweb"/>
-        <w:divId w:val="990987062"/>
+        <w:divId w:val="942886274"/>
         <w:rPr>
           <w:lang w:val="nl-NL"/>
         </w:rPr>
@@ -1968,7 +1968,7 @@
     <w:p>
       <w:pPr>
         <w:shd w:val="clear" w:color="auto" w:fill="FFFFFF"/>
-        <w:divId w:val="913205510"/>
+        <w:divId w:val="499202247"/>
         <w:rPr>
           <w:szCs w:val="22"/>
           <w:lang w:val="nl-NL"/>
@@ -2236,7 +2236,7 @@
         <w:sz w:val="18"/>
       </w:rPr>
       <w:tab/>
-      <w:t>Laatst gewijzigd: 13 oktober 2026, 20:58</w:t>
+      <w:t>Laatst gewijzigd: 14 oktober 2026, 07:57</w:t>
     </w:r>
   </w:p>
 </w:hdr>
@@ -3603,7 +3603,7 @@
     <w:link w:val="KoptekstChar"/>
     <w:uiPriority w:val="99"/>
     <w:unhideWhenUsed/>
-    <w:rsid w:val="003E27EF"/>
+    <w:rsid w:val="00440EA6"/>
     <w:pPr>
       <w:tabs>
         <w:tab w:val="center" w:pos="4536"/>
@@ -3616,7 +3616,7 @@
     <w:basedOn w:val="Standaardalinea-lettertype"/>
     <w:link w:val="Koptekst"/>
     <w:uiPriority w:val="99"/>
-    <w:rsid w:val="003E27EF"/>
+    <w:rsid w:val="00440EA6"/>
     <w:rPr>
       <w:rFonts w:eastAsiaTheme="minorEastAsia"/>
       <w:sz w:val="24"/>
@@ -3629,7 +3629,7 @@
     <w:link w:val="VoettekstChar"/>
     <w:uiPriority w:val="99"/>
     <w:unhideWhenUsed/>
-    <w:rsid w:val="003E27EF"/>
+    <w:rsid w:val="00440EA6"/>
     <w:pPr>
       <w:tabs>
         <w:tab w:val="center" w:pos="4536"/>
@@ -3642,7 +3642,7 @@
     <w:basedOn w:val="Standaardalinea-lettertype"/>
     <w:link w:val="Voettekst"/>
     <w:uiPriority w:val="99"/>
-    <w:rsid w:val="003E27EF"/>
+    <w:rsid w:val="00440EA6"/>
     <w:rPr>
       <w:rFonts w:eastAsiaTheme="minorEastAsia"/>
       <w:sz w:val="24"/>
@@ -3656,7 +3656,7 @@
     <w:autoRedefine/>
     <w:uiPriority w:val="39"/>
     <w:unhideWhenUsed/>
-    <w:rsid w:val="003E27EF"/>
+    <w:rsid w:val="00440EA6"/>
     <w:pPr>
       <w:spacing w:after="100"/>
       <w:ind w:left="220"/>
@@ -3669,7 +3669,7 @@
     <w:autoRedefine/>
     <w:uiPriority w:val="39"/>
     <w:unhideWhenUsed/>
-    <w:rsid w:val="003E27EF"/>
+    <w:rsid w:val="00440EA6"/>
     <w:pPr>
       <w:spacing w:after="100"/>
       <w:ind w:left="440"/>

</xml_diff>

<commit_message>
Update Systeem-Audit NL 14-10-2026 08:14
</commit_message>
<xml_diff>
--- a/nl/docx/document-0.docx
+++ b/nl/docx/document-0.docx
@@ -7,7 +7,7 @@
         <w:spacing w:after="480"/>
         <w:jc w:val="center"/>
         <w:outlineLvl w:val="1"/>
-        <w:divId w:val="646595777"/>
+        <w:divId w:val="1569225879"/>
         <w:rPr>
           <w:rFonts w:ascii="Aptos Display" w:eastAsia="Times New Roman" w:hAnsi="Aptos Display"/>
           <w:b/>
@@ -36,7 +36,7 @@
     <w:p>
       <w:pPr>
         <w:pStyle w:val="ondertitel2"/>
-        <w:divId w:val="646595777"/>
+        <w:divId w:val="1569225879"/>
         <w:rPr>
           <w:lang w:val="nl-NL"/>
         </w:rPr>
@@ -51,7 +51,7 @@
     <w:p>
       <w:pPr>
         <w:pStyle w:val="documentaanduiding2"/>
-        <w:divId w:val="646595777"/>
+        <w:divId w:val="1569225879"/>
         <w:rPr>
           <w:lang w:val="nl-NL"/>
         </w:rPr>
@@ -66,7 +66,7 @@
     <w:p>
       <w:pPr>
         <w:pStyle w:val="auteur2"/>
-        <w:divId w:val="646595777"/>
+        <w:divId w:val="1569225879"/>
         <w:rPr>
           <w:lang w:val="nl-NL"/>
         </w:rPr>
@@ -81,23 +81,23 @@
     <w:p>
       <w:pPr>
         <w:pStyle w:val="meta-lijn2"/>
-        <w:divId w:val="646595777"/>
-        <w:rPr>
-          <w:lang w:val="nl-NL"/>
-        </w:rPr>
-      </w:pPr>
-      <w:r>
-        <w:rPr>
-          <w:lang w:val="nl-NL"/>
-        </w:rPr>
-        <w:t>Versie bijgewerkt: 14 oktober 2026, 07:57</w:t>
+        <w:divId w:val="1569225879"/>
+        <w:rPr>
+          <w:lang w:val="nl-NL"/>
+        </w:rPr>
+      </w:pPr>
+      <w:r>
+        <w:rPr>
+          <w:lang w:val="nl-NL"/>
+        </w:rPr>
+        <w:t>Versie bijgewerkt: 14 oktober 2026, 08:14</w:t>
       </w:r>
     </w:p>
     <w:p>
       <w:pPr>
         <w:pStyle w:val="marker"/>
         <w:ind w:left="800" w:right="800"/>
-        <w:divId w:val="942886274"/>
+        <w:divId w:val="1722904862"/>
         <w:rPr>
           <w:lang w:val="nl-NL"/>
         </w:rPr>
@@ -110,13 +110,13 @@
       <w:pPr>
         <w:pStyle w:val="Kop2"/>
         <w:pageBreakBefore/>
-        <w:divId w:val="899292205"/>
+        <w:divId w:val="1418676789"/>
         <w:rPr>
           <w:rFonts w:eastAsia="Times New Roman"/>
           <w:lang w:val="nl-NL"/>
         </w:rPr>
       </w:pPr>
-      <w:bookmarkStart w:id="0" w:name="_Toc242857142"/>
+      <w:bookmarkStart w:id="0" w:name="_Toc242858167"/>
       <w:r>
         <w:rPr>
           <w:rFonts w:eastAsia="Times New Roman"/>
@@ -133,7 +133,7 @@
         <w:tabs>
           <w:tab w:val="right" w:leader="dot" w:pos="9062"/>
         </w:tabs>
-        <w:divId w:val="899292205"/>
+        <w:divId w:val="1418676789"/>
         <w:rPr>
           <w:rFonts w:asciiTheme="minorHAnsi" w:hAnsiTheme="minorHAnsi" w:cstheme="minorBidi"/>
           <w:noProof/>
@@ -184,7 +184,7 @@
         <w:rPr>
           <w:noProof/>
         </w:rPr>
-        <w:instrText xml:space="preserve"> PAGEREF _Toc242857142 \h </w:instrText>
+        <w:instrText xml:space="preserve"> PAGEREF _Toc242858167 \h </w:instrText>
       </w:r>
       <w:r>
         <w:rPr>
@@ -216,7 +216,7 @@
         <w:tabs>
           <w:tab w:val="right" w:leader="dot" w:pos="9062"/>
         </w:tabs>
-        <w:divId w:val="899292205"/>
+        <w:divId w:val="1418676789"/>
         <w:rPr>
           <w:rFonts w:asciiTheme="minorHAnsi" w:hAnsiTheme="minorHAnsi" w:cstheme="minorBidi"/>
           <w:noProof/>
@@ -249,7 +249,7 @@
         <w:rPr>
           <w:noProof/>
         </w:rPr>
-        <w:instrText xml:space="preserve"> PAGEREF _Toc242857143 \h </w:instrText>
+        <w:instrText xml:space="preserve"> PAGEREF _Toc242858168 \h </w:instrText>
       </w:r>
       <w:r>
         <w:rPr>
@@ -281,7 +281,7 @@
         <w:tabs>
           <w:tab w:val="right" w:leader="dot" w:pos="9062"/>
         </w:tabs>
-        <w:divId w:val="899292205"/>
+        <w:divId w:val="1418676789"/>
         <w:rPr>
           <w:rFonts w:asciiTheme="minorHAnsi" w:hAnsiTheme="minorHAnsi" w:cstheme="minorBidi"/>
           <w:noProof/>
@@ -314,7 +314,7 @@
         <w:rPr>
           <w:noProof/>
         </w:rPr>
-        <w:instrText xml:space="preserve"> PAGEREF _Toc242857144 \h </w:instrText>
+        <w:instrText xml:space="preserve"> PAGEREF _Toc242858169 \h </w:instrText>
       </w:r>
       <w:r>
         <w:rPr>
@@ -346,7 +346,7 @@
         <w:tabs>
           <w:tab w:val="right" w:leader="dot" w:pos="9062"/>
         </w:tabs>
-        <w:divId w:val="899292205"/>
+        <w:divId w:val="1418676789"/>
         <w:rPr>
           <w:rFonts w:asciiTheme="minorHAnsi" w:hAnsiTheme="minorHAnsi" w:cstheme="minorBidi"/>
           <w:noProof/>
@@ -379,7 +379,7 @@
         <w:rPr>
           <w:noProof/>
         </w:rPr>
-        <w:instrText xml:space="preserve"> PAGEREF _Toc242857145 \h </w:instrText>
+        <w:instrText xml:space="preserve"> PAGEREF _Toc242858170 \h </w:instrText>
       </w:r>
       <w:r>
         <w:rPr>
@@ -411,7 +411,7 @@
         <w:tabs>
           <w:tab w:val="right" w:leader="dot" w:pos="9062"/>
         </w:tabs>
-        <w:divId w:val="899292205"/>
+        <w:divId w:val="1418676789"/>
         <w:rPr>
           <w:rFonts w:asciiTheme="minorHAnsi" w:hAnsiTheme="minorHAnsi" w:cstheme="minorBidi"/>
           <w:noProof/>
@@ -444,7 +444,7 @@
         <w:rPr>
           <w:noProof/>
         </w:rPr>
-        <w:instrText xml:space="preserve"> PAGEREF _Toc242857146 \h </w:instrText>
+        <w:instrText xml:space="preserve"> PAGEREF _Toc242858171 \h </w:instrText>
       </w:r>
       <w:r>
         <w:rPr>
@@ -476,7 +476,7 @@
         <w:tabs>
           <w:tab w:val="right" w:leader="dot" w:pos="9062"/>
         </w:tabs>
-        <w:divId w:val="899292205"/>
+        <w:divId w:val="1418676789"/>
         <w:rPr>
           <w:rFonts w:asciiTheme="minorHAnsi" w:hAnsiTheme="minorHAnsi" w:cstheme="minorBidi"/>
           <w:noProof/>
@@ -509,7 +509,7 @@
         <w:rPr>
           <w:noProof/>
         </w:rPr>
-        <w:instrText xml:space="preserve"> PAGEREF _Toc242857147 \h </w:instrText>
+        <w:instrText xml:space="preserve"> PAGEREF _Toc242858172 \h </w:instrText>
       </w:r>
       <w:r>
         <w:rPr>
@@ -541,7 +541,7 @@
         <w:tabs>
           <w:tab w:val="right" w:leader="dot" w:pos="9062"/>
         </w:tabs>
-        <w:divId w:val="899292205"/>
+        <w:divId w:val="1418676789"/>
         <w:rPr>
           <w:rFonts w:asciiTheme="minorHAnsi" w:hAnsiTheme="minorHAnsi" w:cstheme="minorBidi"/>
           <w:noProof/>
@@ -574,7 +574,7 @@
         <w:rPr>
           <w:noProof/>
         </w:rPr>
-        <w:instrText xml:space="preserve"> PAGEREF _Toc242857148 \h </w:instrText>
+        <w:instrText xml:space="preserve"> PAGEREF _Toc242858173 \h </w:instrText>
       </w:r>
       <w:r>
         <w:rPr>
@@ -606,7 +606,7 @@
         <w:tabs>
           <w:tab w:val="right" w:leader="dot" w:pos="9062"/>
         </w:tabs>
-        <w:divId w:val="899292205"/>
+        <w:divId w:val="1418676789"/>
         <w:rPr>
           <w:rFonts w:asciiTheme="minorHAnsi" w:hAnsiTheme="minorHAnsi" w:cstheme="minorBidi"/>
           <w:noProof/>
@@ -639,7 +639,7 @@
         <w:rPr>
           <w:noProof/>
         </w:rPr>
-        <w:instrText xml:space="preserve"> PAGEREF _Toc242857149 \h </w:instrText>
+        <w:instrText xml:space="preserve"> PAGEREF _Toc242858174 \h </w:instrText>
       </w:r>
       <w:r>
         <w:rPr>
@@ -671,7 +671,7 @@
         <w:tabs>
           <w:tab w:val="right" w:leader="dot" w:pos="9062"/>
         </w:tabs>
-        <w:divId w:val="899292205"/>
+        <w:divId w:val="1418676789"/>
         <w:rPr>
           <w:rFonts w:asciiTheme="minorHAnsi" w:hAnsiTheme="minorHAnsi" w:cstheme="minorBidi"/>
           <w:noProof/>
@@ -704,7 +704,7 @@
         <w:rPr>
           <w:noProof/>
         </w:rPr>
-        <w:instrText xml:space="preserve"> PAGEREF _Toc242857150 \h </w:instrText>
+        <w:instrText xml:space="preserve"> PAGEREF _Toc242858175 \h </w:instrText>
       </w:r>
       <w:r>
         <w:rPr>
@@ -736,7 +736,7 @@
         <w:tabs>
           <w:tab w:val="right" w:leader="dot" w:pos="9062"/>
         </w:tabs>
-        <w:divId w:val="899292205"/>
+        <w:divId w:val="1418676789"/>
         <w:rPr>
           <w:rFonts w:asciiTheme="minorHAnsi" w:hAnsiTheme="minorHAnsi" w:cstheme="minorBidi"/>
           <w:noProof/>
@@ -769,7 +769,7 @@
         <w:rPr>
           <w:noProof/>
         </w:rPr>
-        <w:instrText xml:space="preserve"> PAGEREF _Toc242857151 \h </w:instrText>
+        <w:instrText xml:space="preserve"> PAGEREF _Toc242858176 \h </w:instrText>
       </w:r>
       <w:r>
         <w:rPr>
@@ -801,7 +801,7 @@
         <w:tabs>
           <w:tab w:val="right" w:leader="dot" w:pos="9062"/>
         </w:tabs>
-        <w:divId w:val="899292205"/>
+        <w:divId w:val="1418676789"/>
         <w:rPr>
           <w:rFonts w:asciiTheme="minorHAnsi" w:hAnsiTheme="minorHAnsi" w:cstheme="minorBidi"/>
           <w:noProof/>
@@ -834,7 +834,7 @@
         <w:rPr>
           <w:noProof/>
         </w:rPr>
-        <w:instrText xml:space="preserve"> PAGEREF _Toc242857152 \h </w:instrText>
+        <w:instrText xml:space="preserve"> PAGEREF _Toc242858177 \h </w:instrText>
       </w:r>
       <w:r>
         <w:rPr>
@@ -866,7 +866,7 @@
         <w:tabs>
           <w:tab w:val="right" w:leader="dot" w:pos="9062"/>
         </w:tabs>
-        <w:divId w:val="899292205"/>
+        <w:divId w:val="1418676789"/>
         <w:rPr>
           <w:rFonts w:asciiTheme="minorHAnsi" w:hAnsiTheme="minorHAnsi" w:cstheme="minorBidi"/>
           <w:noProof/>
@@ -899,7 +899,7 @@
         <w:rPr>
           <w:noProof/>
         </w:rPr>
-        <w:instrText xml:space="preserve"> PAGEREF _Toc242857153 \h </w:instrText>
+        <w:instrText xml:space="preserve"> PAGEREF _Toc242858178 \h </w:instrText>
       </w:r>
       <w:r>
         <w:rPr>
@@ -928,7 +928,7 @@
     <w:p>
       <w:pPr>
         <w:pStyle w:val="marker"/>
-        <w:divId w:val="899292205"/>
+        <w:divId w:val="1418676789"/>
         <w:rPr>
           <w:lang w:val="nl-NL"/>
         </w:rPr>
@@ -944,7 +944,7 @@
       <w:pPr>
         <w:pStyle w:val="marker"/>
         <w:ind w:left="800" w:right="800"/>
-        <w:divId w:val="942886274"/>
+        <w:divId w:val="1722904862"/>
         <w:rPr>
           <w:lang w:val="nl-NL"/>
         </w:rPr>
@@ -956,13 +956,13 @@
     <w:p>
       <w:pPr>
         <w:pStyle w:val="Kop2"/>
-        <w:divId w:val="942886274"/>
+        <w:divId w:val="1722904862"/>
         <w:rPr>
           <w:rFonts w:eastAsia="Times New Roman"/>
           <w:lang w:val="nl-NL"/>
         </w:rPr>
       </w:pPr>
-      <w:bookmarkStart w:id="1" w:name="_Toc242857143"/>
+      <w:bookmarkStart w:id="1" w:name="_Toc242858168"/>
       <w:r>
         <w:rPr>
           <w:rFonts w:eastAsia="Times New Roman"/>
@@ -975,7 +975,7 @@
     <w:p>
       <w:pPr>
         <w:pStyle w:val="Normaalweb"/>
-        <w:divId w:val="942886274"/>
+        <w:divId w:val="1722904862"/>
         <w:rPr>
           <w:lang w:val="nl-NL"/>
         </w:rPr>
@@ -990,7 +990,7 @@
     <w:p>
       <w:pPr>
         <w:pStyle w:val="Normaalweb"/>
-        <w:divId w:val="942886274"/>
+        <w:divId w:val="1722904862"/>
         <w:rPr>
           <w:lang w:val="nl-NL"/>
         </w:rPr>
@@ -1018,7 +1018,7 @@
     <w:p>
       <w:pPr>
         <w:pStyle w:val="Normaalweb"/>
-        <w:divId w:val="942886274"/>
+        <w:divId w:val="1722904862"/>
         <w:rPr>
           <w:lang w:val="nl-NL"/>
         </w:rPr>
@@ -1039,7 +1039,7 @@
     <w:p>
       <w:pPr>
         <w:pStyle w:val="Normaalweb"/>
-        <w:divId w:val="942886274"/>
+        <w:divId w:val="1722904862"/>
         <w:rPr>
           <w:lang w:val="nl-NL"/>
         </w:rPr>
@@ -1086,7 +1086,7 @@
     <w:p>
       <w:pPr>
         <w:pStyle w:val="Normaalweb"/>
-        <w:divId w:val="942886274"/>
+        <w:divId w:val="1722904862"/>
         <w:rPr>
           <w:lang w:val="nl-NL"/>
         </w:rPr>
@@ -1114,7 +1114,7 @@
     <w:p>
       <w:pPr>
         <w:pStyle w:val="Normaalweb"/>
-        <w:divId w:val="942886274"/>
+        <w:divId w:val="1722904862"/>
         <w:rPr>
           <w:lang w:val="nl-NL"/>
         </w:rPr>
@@ -1148,7 +1148,7 @@
     <w:p>
       <w:pPr>
         <w:pStyle w:val="Normaalweb"/>
-        <w:divId w:val="942886274"/>
+        <w:divId w:val="1722904862"/>
         <w:rPr>
           <w:lang w:val="nl-NL"/>
         </w:rPr>
@@ -1175,7 +1175,7 @@
     <w:p>
       <w:pPr>
         <w:pStyle w:val="Normaalweb"/>
-        <w:divId w:val="942886274"/>
+        <w:divId w:val="1722904862"/>
         <w:rPr>
           <w:lang w:val="nl-NL"/>
         </w:rPr>
@@ -1203,7 +1203,7 @@
     <w:p>
       <w:pPr>
         <w:pStyle w:val="Normaalweb"/>
-        <w:divId w:val="942886274"/>
+        <w:divId w:val="1722904862"/>
         <w:rPr>
           <w:lang w:val="nl-NL"/>
         </w:rPr>
@@ -1218,7 +1218,7 @@
     <w:p>
       <w:pPr>
         <w:pStyle w:val="Normaalweb"/>
-        <w:divId w:val="942886274"/>
+        <w:divId w:val="1722904862"/>
         <w:rPr>
           <w:lang w:val="nl-NL"/>
         </w:rPr>
@@ -1278,7 +1278,7 @@
     <w:p>
       <w:pPr>
         <w:pStyle w:val="Normaalweb"/>
-        <w:divId w:val="942886274"/>
+        <w:divId w:val="1722904862"/>
         <w:rPr>
           <w:lang w:val="nl-NL"/>
         </w:rPr>
@@ -1293,7 +1293,7 @@
     <w:p>
       <w:pPr>
         <w:pStyle w:val="Normaalweb"/>
-        <w:divId w:val="942886274"/>
+        <w:divId w:val="1722904862"/>
         <w:rPr>
           <w:lang w:val="nl-NL"/>
         </w:rPr>
@@ -1321,7 +1321,7 @@
     <w:p>
       <w:pPr>
         <w:pStyle w:val="Normaalweb"/>
-        <w:divId w:val="942886274"/>
+        <w:divId w:val="1722904862"/>
         <w:rPr>
           <w:lang w:val="nl-NL"/>
         </w:rPr>
@@ -1336,7 +1336,7 @@
     <w:p>
       <w:pPr>
         <w:pStyle w:val="Normaalweb"/>
-        <w:divId w:val="942886274"/>
+        <w:divId w:val="1722904862"/>
         <w:rPr>
           <w:lang w:val="nl-NL"/>
         </w:rPr>
@@ -1351,7 +1351,7 @@
     <w:p>
       <w:pPr>
         <w:pStyle w:val="Normaalweb"/>
-        <w:divId w:val="942886274"/>
+        <w:divId w:val="1722904862"/>
         <w:rPr>
           <w:lang w:val="nl-NL"/>
         </w:rPr>
@@ -1366,7 +1366,7 @@
     <w:p>
       <w:pPr>
         <w:spacing w:before="300" w:after="200"/>
-        <w:divId w:val="942886274"/>
+        <w:divId w:val="1722904862"/>
         <w:rPr>
           <w:rFonts w:eastAsia="Times New Roman"/>
           <w:lang w:val="nl-NL"/>
@@ -1377,14 +1377,14 @@
           <w:rFonts w:eastAsia="Times New Roman"/>
           <w:lang w:val="nl-NL"/>
         </w:rPr>
-        <w:pict w14:anchorId="1DB9B4CA">
+        <w:pict w14:anchorId="3208B9BD">
           <v:rect id="_x0000_i1025" style="width:0;height:1.5pt" o:hralign="center" o:hrstd="t" o:hr="t" fillcolor="#a0a0a0" stroked="f"/>
         </w:pict>
       </w:r>
     </w:p>
     <w:p>
       <w:pPr>
-        <w:divId w:val="2120563263"/>
+        <w:divId w:val="2001928975"/>
         <w:rPr>
           <w:color w:val="555555"/>
           <w:sz w:val="20"/>
@@ -1423,7 +1423,7 @@
     </w:p>
     <w:p>
       <w:pPr>
-        <w:divId w:val="2120563263"/>
+        <w:divId w:val="2001928975"/>
         <w:rPr>
           <w:color w:val="555555"/>
           <w:sz w:val="20"/>
@@ -1463,7 +1463,7 @@
     </w:p>
     <w:p>
       <w:pPr>
-        <w:divId w:val="2120563263"/>
+        <w:divId w:val="2001928975"/>
         <w:rPr>
           <w:color w:val="555555"/>
           <w:sz w:val="20"/>
@@ -1493,7 +1493,7 @@
     </w:p>
     <w:p>
       <w:pPr>
-        <w:divId w:val="2120563263"/>
+        <w:divId w:val="2001928975"/>
         <w:rPr>
           <w:color w:val="555555"/>
           <w:sz w:val="20"/>
@@ -1525,7 +1525,7 @@
       <w:pPr>
         <w:pStyle w:val="marker"/>
         <w:ind w:left="800" w:right="800"/>
-        <w:divId w:val="942886274"/>
+        <w:divId w:val="1722904862"/>
         <w:rPr>
           <w:lang w:val="nl-NL"/>
         </w:rPr>
@@ -1537,13 +1537,13 @@
     <w:p>
       <w:pPr>
         <w:pStyle w:val="Kop2"/>
-        <w:divId w:val="942886274"/>
+        <w:divId w:val="1722904862"/>
         <w:rPr>
           <w:rFonts w:eastAsia="Times New Roman"/>
           <w:lang w:val="nl-NL"/>
         </w:rPr>
       </w:pPr>
-      <w:bookmarkStart w:id="2" w:name="_Toc242857144"/>
+      <w:bookmarkStart w:id="2" w:name="_Toc242858169"/>
       <w:r>
         <w:rPr>
           <w:rFonts w:eastAsia="Times New Roman"/>
@@ -1556,7 +1556,7 @@
     <w:p>
       <w:pPr>
         <w:pStyle w:val="Normaalweb"/>
-        <w:divId w:val="942886274"/>
+        <w:divId w:val="1722904862"/>
         <w:rPr>
           <w:lang w:val="nl-NL"/>
         </w:rPr>
@@ -1571,7 +1571,7 @@
     <w:p>
       <w:pPr>
         <w:pStyle w:val="Normaalweb"/>
-        <w:divId w:val="942886274"/>
+        <w:divId w:val="1722904862"/>
         <w:rPr>
           <w:lang w:val="nl-NL"/>
         </w:rPr>
@@ -1586,7 +1586,7 @@
     <w:p>
       <w:pPr>
         <w:pStyle w:val="Normaalweb"/>
-        <w:divId w:val="942886274"/>
+        <w:divId w:val="1722904862"/>
         <w:rPr>
           <w:lang w:val="nl-NL"/>
         </w:rPr>
@@ -1601,13 +1601,13 @@
     <w:p>
       <w:pPr>
         <w:pStyle w:val="Kop2"/>
-        <w:divId w:val="942886274"/>
+        <w:divId w:val="1722904862"/>
         <w:rPr>
           <w:rFonts w:eastAsia="Times New Roman"/>
           <w:lang w:val="nl-NL"/>
         </w:rPr>
       </w:pPr>
-      <w:bookmarkStart w:id="3" w:name="_Toc242857145"/>
+      <w:bookmarkStart w:id="3" w:name="_Toc242858170"/>
       <w:r>
         <w:rPr>
           <w:rFonts w:eastAsia="Times New Roman"/>
@@ -1620,7 +1620,7 @@
     <w:p>
       <w:pPr>
         <w:pStyle w:val="Normaalweb"/>
-        <w:divId w:val="942886274"/>
+        <w:divId w:val="1722904862"/>
         <w:rPr>
           <w:lang w:val="nl-NL"/>
         </w:rPr>
@@ -1635,13 +1635,13 @@
     <w:p>
       <w:pPr>
         <w:pStyle w:val="Kop2"/>
-        <w:divId w:val="942886274"/>
+        <w:divId w:val="1722904862"/>
         <w:rPr>
           <w:rFonts w:eastAsia="Times New Roman"/>
           <w:lang w:val="nl-NL"/>
         </w:rPr>
       </w:pPr>
-      <w:bookmarkStart w:id="4" w:name="_Toc242857146"/>
+      <w:bookmarkStart w:id="4" w:name="_Toc242858171"/>
       <w:r>
         <w:rPr>
           <w:rFonts w:eastAsia="Times New Roman"/>
@@ -1654,7 +1654,7 @@
     <w:p>
       <w:pPr>
         <w:pStyle w:val="Normaalweb"/>
-        <w:divId w:val="942886274"/>
+        <w:divId w:val="1722904862"/>
         <w:rPr>
           <w:lang w:val="nl-NL"/>
         </w:rPr>
@@ -1669,13 +1669,13 @@
     <w:p>
       <w:pPr>
         <w:pStyle w:val="Kop3"/>
-        <w:divId w:val="942886274"/>
+        <w:divId w:val="1722904862"/>
         <w:rPr>
           <w:rFonts w:eastAsia="Times New Roman"/>
           <w:lang w:val="nl-NL"/>
         </w:rPr>
       </w:pPr>
-      <w:bookmarkStart w:id="5" w:name="_Toc242857147"/>
+      <w:bookmarkStart w:id="5" w:name="_Toc242858172"/>
       <w:r>
         <w:rPr>
           <w:rFonts w:eastAsia="Times New Roman"/>
@@ -1688,7 +1688,7 @@
     <w:p>
       <w:pPr>
         <w:pStyle w:val="Normaalweb"/>
-        <w:divId w:val="942886274"/>
+        <w:divId w:val="1722904862"/>
         <w:rPr>
           <w:lang w:val="nl-NL"/>
         </w:rPr>
@@ -1703,13 +1703,13 @@
     <w:p>
       <w:pPr>
         <w:pStyle w:val="Kop3"/>
-        <w:divId w:val="942886274"/>
+        <w:divId w:val="1722904862"/>
         <w:rPr>
           <w:rFonts w:eastAsia="Times New Roman"/>
           <w:lang w:val="nl-NL"/>
         </w:rPr>
       </w:pPr>
-      <w:bookmarkStart w:id="6" w:name="_Toc242857148"/>
+      <w:bookmarkStart w:id="6" w:name="_Toc242858173"/>
       <w:r>
         <w:rPr>
           <w:rFonts w:eastAsia="Times New Roman"/>
@@ -1722,7 +1722,7 @@
     <w:p>
       <w:pPr>
         <w:pStyle w:val="Normaalweb"/>
-        <w:divId w:val="942886274"/>
+        <w:divId w:val="1722904862"/>
         <w:rPr>
           <w:lang w:val="nl-NL"/>
         </w:rPr>
@@ -1737,13 +1737,13 @@
     <w:p>
       <w:pPr>
         <w:pStyle w:val="Kop3"/>
-        <w:divId w:val="942886274"/>
+        <w:divId w:val="1722904862"/>
         <w:rPr>
           <w:rFonts w:eastAsia="Times New Roman"/>
           <w:lang w:val="nl-NL"/>
         </w:rPr>
       </w:pPr>
-      <w:bookmarkStart w:id="7" w:name="_Toc242857149"/>
+      <w:bookmarkStart w:id="7" w:name="_Toc242858174"/>
       <w:r>
         <w:rPr>
           <w:rFonts w:eastAsia="Times New Roman"/>
@@ -1756,7 +1756,7 @@
     <w:p>
       <w:pPr>
         <w:pStyle w:val="Normaalweb"/>
-        <w:divId w:val="942886274"/>
+        <w:divId w:val="1722904862"/>
         <w:rPr>
           <w:lang w:val="nl-NL"/>
         </w:rPr>
@@ -1771,13 +1771,13 @@
     <w:p>
       <w:pPr>
         <w:pStyle w:val="Kop3"/>
-        <w:divId w:val="942886274"/>
+        <w:divId w:val="1722904862"/>
         <w:rPr>
           <w:rFonts w:eastAsia="Times New Roman"/>
           <w:lang w:val="nl-NL"/>
         </w:rPr>
       </w:pPr>
-      <w:bookmarkStart w:id="8" w:name="_Toc242857150"/>
+      <w:bookmarkStart w:id="8" w:name="_Toc242858175"/>
       <w:r>
         <w:rPr>
           <w:rFonts w:eastAsia="Times New Roman"/>
@@ -1790,7 +1790,7 @@
     <w:p>
       <w:pPr>
         <w:pStyle w:val="Normaalweb"/>
-        <w:divId w:val="942886274"/>
+        <w:divId w:val="1722904862"/>
         <w:rPr>
           <w:lang w:val="nl-NL"/>
         </w:rPr>
@@ -1806,13 +1806,13 @@
     <w:p>
       <w:pPr>
         <w:pStyle w:val="Kop2"/>
-        <w:divId w:val="942886274"/>
+        <w:divId w:val="1722904862"/>
         <w:rPr>
           <w:rFonts w:eastAsia="Times New Roman"/>
           <w:lang w:val="nl-NL"/>
         </w:rPr>
       </w:pPr>
-      <w:bookmarkStart w:id="9" w:name="_Toc242857151"/>
+      <w:bookmarkStart w:id="9" w:name="_Toc242858176"/>
       <w:r>
         <w:rPr>
           <w:rFonts w:eastAsia="Times New Roman"/>
@@ -1825,7 +1825,7 @@
     <w:p>
       <w:pPr>
         <w:pStyle w:val="Normaalweb"/>
-        <w:divId w:val="942886274"/>
+        <w:divId w:val="1722904862"/>
         <w:rPr>
           <w:lang w:val="nl-NL"/>
         </w:rPr>
@@ -1840,7 +1840,7 @@
     <w:p>
       <w:pPr>
         <w:pStyle w:val="Normaalweb"/>
-        <w:divId w:val="942886274"/>
+        <w:divId w:val="1722904862"/>
         <w:rPr>
           <w:lang w:val="nl-NL"/>
         </w:rPr>
@@ -1855,7 +1855,7 @@
     <w:p>
       <w:pPr>
         <w:pStyle w:val="Normaalweb"/>
-        <w:divId w:val="942886274"/>
+        <w:divId w:val="1722904862"/>
         <w:rPr>
           <w:lang w:val="nl-NL"/>
         </w:rPr>
@@ -1870,13 +1870,13 @@
     <w:p>
       <w:pPr>
         <w:pStyle w:val="Kop2"/>
-        <w:divId w:val="942886274"/>
+        <w:divId w:val="1722904862"/>
         <w:rPr>
           <w:rFonts w:eastAsia="Times New Roman"/>
           <w:lang w:val="nl-NL"/>
         </w:rPr>
       </w:pPr>
-      <w:bookmarkStart w:id="10" w:name="_Toc242857152"/>
+      <w:bookmarkStart w:id="10" w:name="_Toc242858177"/>
       <w:r>
         <w:rPr>
           <w:rFonts w:eastAsia="Times New Roman"/>
@@ -1889,7 +1889,7 @@
     <w:p>
       <w:pPr>
         <w:pStyle w:val="Normaalweb"/>
-        <w:divId w:val="942886274"/>
+        <w:divId w:val="1722904862"/>
         <w:rPr>
           <w:lang w:val="nl-NL"/>
         </w:rPr>
@@ -1904,7 +1904,7 @@
     <w:p>
       <w:pPr>
         <w:pStyle w:val="Normaalweb"/>
-        <w:divId w:val="942886274"/>
+        <w:divId w:val="1722904862"/>
         <w:rPr>
           <w:lang w:val="nl-NL"/>
         </w:rPr>
@@ -1919,13 +1919,13 @@
     <w:p>
       <w:pPr>
         <w:pStyle w:val="Kop2"/>
-        <w:divId w:val="942886274"/>
+        <w:divId w:val="1722904862"/>
         <w:rPr>
           <w:rFonts w:eastAsia="Times New Roman"/>
           <w:lang w:val="nl-NL"/>
         </w:rPr>
       </w:pPr>
-      <w:bookmarkStart w:id="11" w:name="_Toc242857153"/>
+      <w:bookmarkStart w:id="11" w:name="_Toc242858178"/>
       <w:r>
         <w:rPr>
           <w:rFonts w:eastAsia="Times New Roman"/>
@@ -1938,7 +1938,7 @@
     <w:p>
       <w:pPr>
         <w:pStyle w:val="Normaalweb"/>
-        <w:divId w:val="942886274"/>
+        <w:divId w:val="1722904862"/>
         <w:rPr>
           <w:lang w:val="nl-NL"/>
         </w:rPr>
@@ -1953,7 +1953,7 @@
     <w:p>
       <w:pPr>
         <w:pStyle w:val="Normaalweb"/>
-        <w:divId w:val="942886274"/>
+        <w:divId w:val="1722904862"/>
         <w:rPr>
           <w:lang w:val="nl-NL"/>
         </w:rPr>
@@ -1968,7 +1968,7 @@
     <w:p>
       <w:pPr>
         <w:shd w:val="clear" w:color="auto" w:fill="FFFFFF"/>
-        <w:divId w:val="499202247"/>
+        <w:divId w:val="1374386450"/>
         <w:rPr>
           <w:szCs w:val="22"/>
           <w:lang w:val="nl-NL"/>
@@ -2236,7 +2236,7 @@
         <w:sz w:val="18"/>
       </w:rPr>
       <w:tab/>
-      <w:t>Laatst gewijzigd: 14 oktober 2026, 07:57</w:t>
+      <w:t>Laatst gewijzigd: 14 oktober 2026, 08:14</w:t>
     </w:r>
   </w:p>
 </w:hdr>
@@ -3603,7 +3603,7 @@
     <w:link w:val="KoptekstChar"/>
     <w:uiPriority w:val="99"/>
     <w:unhideWhenUsed/>
-    <w:rsid w:val="00440EA6"/>
+    <w:rsid w:val="00253642"/>
     <w:pPr>
       <w:tabs>
         <w:tab w:val="center" w:pos="4536"/>
@@ -3616,7 +3616,7 @@
     <w:basedOn w:val="Standaardalinea-lettertype"/>
     <w:link w:val="Koptekst"/>
     <w:uiPriority w:val="99"/>
-    <w:rsid w:val="00440EA6"/>
+    <w:rsid w:val="00253642"/>
     <w:rPr>
       <w:rFonts w:eastAsiaTheme="minorEastAsia"/>
       <w:sz w:val="24"/>
@@ -3629,7 +3629,7 @@
     <w:link w:val="VoettekstChar"/>
     <w:uiPriority w:val="99"/>
     <w:unhideWhenUsed/>
-    <w:rsid w:val="00440EA6"/>
+    <w:rsid w:val="00253642"/>
     <w:pPr>
       <w:tabs>
         <w:tab w:val="center" w:pos="4536"/>
@@ -3642,7 +3642,7 @@
     <w:basedOn w:val="Standaardalinea-lettertype"/>
     <w:link w:val="Voettekst"/>
     <w:uiPriority w:val="99"/>
-    <w:rsid w:val="00440EA6"/>
+    <w:rsid w:val="00253642"/>
     <w:rPr>
       <w:rFonts w:eastAsiaTheme="minorEastAsia"/>
       <w:sz w:val="24"/>
@@ -3656,7 +3656,7 @@
     <w:autoRedefine/>
     <w:uiPriority w:val="39"/>
     <w:unhideWhenUsed/>
-    <w:rsid w:val="00440EA6"/>
+    <w:rsid w:val="00253642"/>
     <w:pPr>
       <w:spacing w:after="100"/>
       <w:ind w:left="220"/>
@@ -3669,7 +3669,7 @@
     <w:autoRedefine/>
     <w:uiPriority w:val="39"/>
     <w:unhideWhenUsed/>
-    <w:rsid w:val="00440EA6"/>
+    <w:rsid w:val="00253642"/>
     <w:pPr>
       <w:spacing w:after="100"/>
       <w:ind w:left="440"/>

</xml_diff>

<commit_message>
Update Systeem-Audit NL 26-10-2026 20:33
</commit_message>
<xml_diff>
--- a/nl/docx/document-0.docx
+++ b/nl/docx/document-0.docx
@@ -4,18 +4,18 @@
   <w:body>
     <w:p>
       <w:pPr>
-        <w:spacing w:after="480"/>
+        <w:spacing w:after="400"/>
         <w:jc w:val="center"/>
         <w:outlineLvl w:val="1"/>
-        <w:divId w:val="1569225879"/>
+        <w:divId w:val="1068454602"/>
         <w:rPr>
           <w:rFonts w:ascii="Aptos Display" w:eastAsia="Times New Roman" w:hAnsi="Aptos Display"/>
           <w:b/>
           <w:bCs/>
           <w:color w:val="8B1E1E"/>
           <w:kern w:val="36"/>
-          <w:sz w:val="72"/>
-          <w:szCs w:val="72"/>
+          <w:sz w:val="68"/>
+          <w:szCs w:val="68"/>
           <w:lang w:val="nl-NL"/>
         </w:rPr>
       </w:pPr>
@@ -26,8 +26,8 @@
           <w:bCs/>
           <w:color w:val="8B1E1E"/>
           <w:kern w:val="36"/>
-          <w:sz w:val="72"/>
-          <w:szCs w:val="72"/>
+          <w:sz w:val="68"/>
+          <w:szCs w:val="68"/>
           <w:lang w:val="nl-NL"/>
         </w:rPr>
         <w:t>Systeem-Audit</w:t>
@@ -36,7 +36,7 @@
     <w:p>
       <w:pPr>
         <w:pStyle w:val="ondertitel2"/>
-        <w:divId w:val="1569225879"/>
+        <w:divId w:val="1068454602"/>
         <w:rPr>
           <w:lang w:val="nl-NL"/>
         </w:rPr>
@@ -51,7 +51,7 @@
     <w:p>
       <w:pPr>
         <w:pStyle w:val="documentaanduiding2"/>
-        <w:divId w:val="1569225879"/>
+        <w:divId w:val="1068454602"/>
         <w:rPr>
           <w:lang w:val="nl-NL"/>
         </w:rPr>
@@ -66,7 +66,7 @@
     <w:p>
       <w:pPr>
         <w:pStyle w:val="auteur2"/>
-        <w:divId w:val="1569225879"/>
+        <w:divId w:val="1068454602"/>
         <w:rPr>
           <w:lang w:val="nl-NL"/>
         </w:rPr>
@@ -81,27 +81,18 @@
     <w:p>
       <w:pPr>
         <w:pStyle w:val="meta-lijn2"/>
-        <w:divId w:val="1569225879"/>
-        <w:rPr>
-          <w:lang w:val="nl-NL"/>
-        </w:rPr>
-      </w:pPr>
-      <w:r>
-        <w:rPr>
-          <w:lang w:val="nl-NL"/>
-        </w:rPr>
-        <w:t>Versie bijgewerkt: 14 oktober 2026, 08:14</w:t>
-      </w:r>
-    </w:p>
-    <w:p>
-      <w:pPr>
-        <w:pStyle w:val="marker"/>
         <w:ind w:left="800" w:right="800"/>
-        <w:divId w:val="1722904862"/>
-        <w:rPr>
-          <w:lang w:val="nl-NL"/>
-        </w:rPr>
-      </w:pPr>
+        <w:divId w:val="1068454602"/>
+        <w:rPr>
+          <w:lang w:val="nl-NL"/>
+        </w:rPr>
+      </w:pPr>
+      <w:r>
+        <w:rPr>
+          <w:lang w:val="nl-NL"/>
+        </w:rPr>
+        <w:t>Versie bijgewerkt: 26 oktober 2026, 15:36</w:t>
+      </w:r>
       <w:r>
         <w:br w:type="page"/>
       </w:r>
@@ -109,20 +100,18 @@
     <w:p>
       <w:pPr>
         <w:pStyle w:val="Kop2"/>
-        <w:pageBreakBefore/>
-        <w:divId w:val="1418676789"/>
-        <w:rPr>
-          <w:rFonts w:eastAsia="Times New Roman"/>
-          <w:lang w:val="nl-NL"/>
-        </w:rPr>
-      </w:pPr>
-      <w:bookmarkStart w:id="0" w:name="_Toc242858167"/>
-      <w:r>
-        <w:rPr>
-          <w:rFonts w:eastAsia="Times New Roman"/>
-          <w:lang w:val="nl-NL"/>
-        </w:rPr>
-        <w:lastRenderedPageBreak/>
+        <w:divId w:val="886840144"/>
+        <w:rPr>
+          <w:rFonts w:eastAsia="Times New Roman"/>
+          <w:lang w:val="nl-NL"/>
+        </w:rPr>
+      </w:pPr>
+      <w:bookmarkStart w:id="0" w:name="_Toc243921505"/>
+      <w:r>
+        <w:rPr>
+          <w:rFonts w:eastAsia="Times New Roman"/>
+          <w:lang w:val="nl-NL"/>
+        </w:rPr>
         <w:t>Inhoudsopgave</w:t>
       </w:r>
       <w:bookmarkEnd w:id="0"/>
@@ -133,7 +122,7 @@
         <w:tabs>
           <w:tab w:val="right" w:leader="dot" w:pos="9062"/>
         </w:tabs>
-        <w:divId w:val="1418676789"/>
+        <w:divId w:val="886840144"/>
         <w:rPr>
           <w:rFonts w:asciiTheme="minorHAnsi" w:hAnsiTheme="minorHAnsi" w:cstheme="minorBidi"/>
           <w:noProof/>
@@ -184,7 +173,7 @@
         <w:rPr>
           <w:noProof/>
         </w:rPr>
-        <w:instrText xml:space="preserve"> PAGEREF _Toc242858167 \h </w:instrText>
+        <w:instrText xml:space="preserve"> PAGEREF _Toc243921505 \h </w:instrText>
       </w:r>
       <w:r>
         <w:rPr>
@@ -201,7 +190,7 @@
         <w:rPr>
           <w:noProof/>
         </w:rPr>
-        <w:t>3</w:t>
+        <w:t>2</w:t>
       </w:r>
       <w:r>
         <w:rPr>
@@ -216,7 +205,7 @@
         <w:tabs>
           <w:tab w:val="right" w:leader="dot" w:pos="9062"/>
         </w:tabs>
-        <w:divId w:val="1418676789"/>
+        <w:divId w:val="886840144"/>
         <w:rPr>
           <w:rFonts w:asciiTheme="minorHAnsi" w:hAnsiTheme="minorHAnsi" w:cstheme="minorBidi"/>
           <w:noProof/>
@@ -249,7 +238,7 @@
         <w:rPr>
           <w:noProof/>
         </w:rPr>
-        <w:instrText xml:space="preserve"> PAGEREF _Toc242858168 \h </w:instrText>
+        <w:instrText xml:space="preserve"> PAGEREF _Toc243921506 \h </w:instrText>
       </w:r>
       <w:r>
         <w:rPr>
@@ -266,7 +255,7 @@
         <w:rPr>
           <w:noProof/>
         </w:rPr>
-        <w:t>4</w:t>
+        <w:t>3</w:t>
       </w:r>
       <w:r>
         <w:rPr>
@@ -281,7 +270,7 @@
         <w:tabs>
           <w:tab w:val="right" w:leader="dot" w:pos="9062"/>
         </w:tabs>
-        <w:divId w:val="1418676789"/>
+        <w:divId w:val="886840144"/>
         <w:rPr>
           <w:rFonts w:asciiTheme="minorHAnsi" w:hAnsiTheme="minorHAnsi" w:cstheme="minorBidi"/>
           <w:noProof/>
@@ -314,7 +303,7 @@
         <w:rPr>
           <w:noProof/>
         </w:rPr>
-        <w:instrText xml:space="preserve"> PAGEREF _Toc242858169 \h </w:instrText>
+        <w:instrText xml:space="preserve"> PAGEREF _Toc243921507 \h </w:instrText>
       </w:r>
       <w:r>
         <w:rPr>
@@ -331,7 +320,7 @@
         <w:rPr>
           <w:noProof/>
         </w:rPr>
-        <w:t>8</w:t>
+        <w:t>7</w:t>
       </w:r>
       <w:r>
         <w:rPr>
@@ -346,7 +335,7 @@
         <w:tabs>
           <w:tab w:val="right" w:leader="dot" w:pos="9062"/>
         </w:tabs>
-        <w:divId w:val="1418676789"/>
+        <w:divId w:val="886840144"/>
         <w:rPr>
           <w:rFonts w:asciiTheme="minorHAnsi" w:hAnsiTheme="minorHAnsi" w:cstheme="minorBidi"/>
           <w:noProof/>
@@ -379,7 +368,7 @@
         <w:rPr>
           <w:noProof/>
         </w:rPr>
-        <w:instrText xml:space="preserve"> PAGEREF _Toc242858170 \h </w:instrText>
+        <w:instrText xml:space="preserve"> PAGEREF _Toc243921508 \h </w:instrText>
       </w:r>
       <w:r>
         <w:rPr>
@@ -396,7 +385,7 @@
         <w:rPr>
           <w:noProof/>
         </w:rPr>
-        <w:t>8</w:t>
+        <w:t>7</w:t>
       </w:r>
       <w:r>
         <w:rPr>
@@ -411,7 +400,7 @@
         <w:tabs>
           <w:tab w:val="right" w:leader="dot" w:pos="9062"/>
         </w:tabs>
-        <w:divId w:val="1418676789"/>
+        <w:divId w:val="886840144"/>
         <w:rPr>
           <w:rFonts w:asciiTheme="minorHAnsi" w:hAnsiTheme="minorHAnsi" w:cstheme="minorBidi"/>
           <w:noProof/>
@@ -426,7 +415,7 @@
           <w:noProof/>
           <w:lang w:val="nl-NL"/>
         </w:rPr>
-        <w:t>De vijf documenten</w:t>
+        <w:t>De zes documenten</w:t>
       </w:r>
       <w:r>
         <w:rPr>
@@ -444,7 +433,7 @@
         <w:rPr>
           <w:noProof/>
         </w:rPr>
-        <w:instrText xml:space="preserve"> PAGEREF _Toc242858171 \h </w:instrText>
+        <w:instrText xml:space="preserve"> PAGEREF _Toc243921509 \h </w:instrText>
       </w:r>
       <w:r>
         <w:rPr>
@@ -461,7 +450,7 @@
         <w:rPr>
           <w:noProof/>
         </w:rPr>
-        <w:t>8</w:t>
+        <w:t>7</w:t>
       </w:r>
       <w:r>
         <w:rPr>
@@ -476,7 +465,7 @@
         <w:tabs>
           <w:tab w:val="right" w:leader="dot" w:pos="9062"/>
         </w:tabs>
-        <w:divId w:val="1418676789"/>
+        <w:divId w:val="886840144"/>
         <w:rPr>
           <w:rFonts w:asciiTheme="minorHAnsi" w:hAnsiTheme="minorHAnsi" w:cstheme="minorBidi"/>
           <w:noProof/>
@@ -491,7 +480,7 @@
           <w:noProof/>
           <w:lang w:val="nl-NL"/>
         </w:rPr>
-        <w:t>Document A — De narratieve audit</w:t>
+        <w:t>Document 0 — De inleiding en leeswijzer</w:t>
       </w:r>
       <w:r>
         <w:rPr>
@@ -509,7 +498,7 @@
         <w:rPr>
           <w:noProof/>
         </w:rPr>
-        <w:instrText xml:space="preserve"> PAGEREF _Toc242858172 \h </w:instrText>
+        <w:instrText xml:space="preserve"> PAGEREF _Toc243921510 \h </w:instrText>
       </w:r>
       <w:r>
         <w:rPr>
@@ -526,7 +515,7 @@
         <w:rPr>
           <w:noProof/>
         </w:rPr>
-        <w:t>8</w:t>
+        <w:t>7</w:t>
       </w:r>
       <w:r>
         <w:rPr>
@@ -541,7 +530,7 @@
         <w:tabs>
           <w:tab w:val="right" w:leader="dot" w:pos="9062"/>
         </w:tabs>
-        <w:divId w:val="1418676789"/>
+        <w:divId w:val="886840144"/>
         <w:rPr>
           <w:rFonts w:asciiTheme="minorHAnsi" w:hAnsiTheme="minorHAnsi" w:cstheme="minorBidi"/>
           <w:noProof/>
@@ -556,7 +545,7 @@
           <w:noProof/>
           <w:lang w:val="nl-NL"/>
         </w:rPr>
-        <w:t>Document B — De data-matrix</w:t>
+        <w:t>Document A — De narratieve audit</w:t>
       </w:r>
       <w:r>
         <w:rPr>
@@ -574,7 +563,7 @@
         <w:rPr>
           <w:noProof/>
         </w:rPr>
-        <w:instrText xml:space="preserve"> PAGEREF _Toc242858173 \h </w:instrText>
+        <w:instrText xml:space="preserve"> PAGEREF _Toc243921511 \h </w:instrText>
       </w:r>
       <w:r>
         <w:rPr>
@@ -591,7 +580,7 @@
         <w:rPr>
           <w:noProof/>
         </w:rPr>
-        <w:t>8</w:t>
+        <w:t>7</w:t>
       </w:r>
       <w:r>
         <w:rPr>
@@ -606,7 +595,7 @@
         <w:tabs>
           <w:tab w:val="right" w:leader="dot" w:pos="9062"/>
         </w:tabs>
-        <w:divId w:val="1418676789"/>
+        <w:divId w:val="886840144"/>
         <w:rPr>
           <w:rFonts w:asciiTheme="minorHAnsi" w:hAnsiTheme="minorHAnsi" w:cstheme="minorBidi"/>
           <w:noProof/>
@@ -621,7 +610,7 @@
           <w:noProof/>
           <w:lang w:val="nl-NL"/>
         </w:rPr>
-        <w:t>Document C — De visuele architectuur</w:t>
+        <w:t>Document B — De data-matrix</w:t>
       </w:r>
       <w:r>
         <w:rPr>
@@ -639,7 +628,7 @@
         <w:rPr>
           <w:noProof/>
         </w:rPr>
-        <w:instrText xml:space="preserve"> PAGEREF _Toc242858174 \h </w:instrText>
+        <w:instrText xml:space="preserve"> PAGEREF _Toc243921512 \h </w:instrText>
       </w:r>
       <w:r>
         <w:rPr>
@@ -656,7 +645,7 @@
         <w:rPr>
           <w:noProof/>
         </w:rPr>
-        <w:t>8</w:t>
+        <w:t>7</w:t>
       </w:r>
       <w:r>
         <w:rPr>
@@ -671,7 +660,7 @@
         <w:tabs>
           <w:tab w:val="right" w:leader="dot" w:pos="9062"/>
         </w:tabs>
-        <w:divId w:val="1418676789"/>
+        <w:divId w:val="886840144"/>
         <w:rPr>
           <w:rFonts w:asciiTheme="minorHAnsi" w:hAnsiTheme="minorHAnsi" w:cstheme="minorBidi"/>
           <w:noProof/>
@@ -686,6 +675,71 @@
           <w:noProof/>
           <w:lang w:val="nl-NL"/>
         </w:rPr>
+        <w:t>Document C — De visuele architectuur</w:t>
+      </w:r>
+      <w:r>
+        <w:rPr>
+          <w:noProof/>
+        </w:rPr>
+        <w:tab/>
+      </w:r>
+      <w:r>
+        <w:rPr>
+          <w:noProof/>
+        </w:rPr>
+        <w:fldChar w:fldCharType="begin"/>
+      </w:r>
+      <w:r>
+        <w:rPr>
+          <w:noProof/>
+        </w:rPr>
+        <w:instrText xml:space="preserve"> PAGEREF _Toc243921513 \h </w:instrText>
+      </w:r>
+      <w:r>
+        <w:rPr>
+          <w:noProof/>
+        </w:rPr>
+      </w:r>
+      <w:r>
+        <w:rPr>
+          <w:noProof/>
+        </w:rPr>
+        <w:fldChar w:fldCharType="separate"/>
+      </w:r>
+      <w:r>
+        <w:rPr>
+          <w:noProof/>
+        </w:rPr>
+        <w:t>8</w:t>
+      </w:r>
+      <w:r>
+        <w:rPr>
+          <w:noProof/>
+        </w:rPr>
+        <w:fldChar w:fldCharType="end"/>
+      </w:r>
+    </w:p>
+    <w:p>
+      <w:pPr>
+        <w:pStyle w:val="Inhopg3"/>
+        <w:tabs>
+          <w:tab w:val="right" w:leader="dot" w:pos="9062"/>
+        </w:tabs>
+        <w:divId w:val="886840144"/>
+        <w:rPr>
+          <w:rFonts w:asciiTheme="minorHAnsi" w:hAnsiTheme="minorHAnsi" w:cstheme="minorBidi"/>
+          <w:noProof/>
+          <w:kern w:val="2"/>
+          <w:sz w:val="24"/>
+          <w14:ligatures w14:val="standardContextual"/>
+        </w:rPr>
+      </w:pPr>
+      <w:r>
+        <w:rPr>
+          <w:rFonts w:eastAsia="Times New Roman"/>
+          <w:noProof/>
+          <w:lang w:val="nl-NL"/>
+        </w:rPr>
         <w:t>Document D — De synthese</w:t>
       </w:r>
       <w:r>
@@ -704,7 +758,72 @@
         <w:rPr>
           <w:noProof/>
         </w:rPr>
-        <w:instrText xml:space="preserve"> PAGEREF _Toc242858175 \h </w:instrText>
+        <w:instrText xml:space="preserve"> PAGEREF _Toc243921514 \h </w:instrText>
+      </w:r>
+      <w:r>
+        <w:rPr>
+          <w:noProof/>
+        </w:rPr>
+      </w:r>
+      <w:r>
+        <w:rPr>
+          <w:noProof/>
+        </w:rPr>
+        <w:fldChar w:fldCharType="separate"/>
+      </w:r>
+      <w:r>
+        <w:rPr>
+          <w:noProof/>
+        </w:rPr>
+        <w:t>8</w:t>
+      </w:r>
+      <w:r>
+        <w:rPr>
+          <w:noProof/>
+        </w:rPr>
+        <w:fldChar w:fldCharType="end"/>
+      </w:r>
+    </w:p>
+    <w:p>
+      <w:pPr>
+        <w:pStyle w:val="Inhopg3"/>
+        <w:tabs>
+          <w:tab w:val="right" w:leader="dot" w:pos="9062"/>
+        </w:tabs>
+        <w:divId w:val="886840144"/>
+        <w:rPr>
+          <w:rFonts w:asciiTheme="minorHAnsi" w:hAnsiTheme="minorHAnsi" w:cstheme="minorBidi"/>
+          <w:noProof/>
+          <w:kern w:val="2"/>
+          <w:sz w:val="24"/>
+          <w14:ligatures w14:val="standardContextual"/>
+        </w:rPr>
+      </w:pPr>
+      <w:r>
+        <w:rPr>
+          <w:rFonts w:eastAsia="Times New Roman"/>
+          <w:noProof/>
+          <w:lang w:val="nl-NL"/>
+        </w:rPr>
+        <w:t>Document E — Het rechtenoverzicht</w:t>
+      </w:r>
+      <w:r>
+        <w:rPr>
+          <w:noProof/>
+        </w:rPr>
+        <w:tab/>
+      </w:r>
+      <w:r>
+        <w:rPr>
+          <w:noProof/>
+        </w:rPr>
+        <w:fldChar w:fldCharType="begin"/>
+      </w:r>
+      <w:r>
+        <w:rPr>
+          <w:noProof/>
+        </w:rPr>
+        <w:instrText xml:space="preserve"> PAGEREF _Toc243921515 \h </w:instrText>
       </w:r>
       <w:r>
         <w:rPr>
@@ -736,7 +855,7 @@
         <w:tabs>
           <w:tab w:val="right" w:leader="dot" w:pos="9062"/>
         </w:tabs>
-        <w:divId w:val="1418676789"/>
+        <w:divId w:val="886840144"/>
         <w:rPr>
           <w:rFonts w:asciiTheme="minorHAnsi" w:hAnsiTheme="minorHAnsi" w:cstheme="minorBidi"/>
           <w:noProof/>
@@ -769,7 +888,7 @@
         <w:rPr>
           <w:noProof/>
         </w:rPr>
-        <w:instrText xml:space="preserve"> PAGEREF _Toc242858176 \h </w:instrText>
+        <w:instrText xml:space="preserve"> PAGEREF _Toc243921516 \h </w:instrText>
       </w:r>
       <w:r>
         <w:rPr>
@@ -786,7 +905,7 @@
         <w:rPr>
           <w:noProof/>
         </w:rPr>
-        <w:t>9</w:t>
+        <w:t>8</w:t>
       </w:r>
       <w:r>
         <w:rPr>
@@ -801,7 +920,7 @@
         <w:tabs>
           <w:tab w:val="right" w:leader="dot" w:pos="9062"/>
         </w:tabs>
-        <w:divId w:val="1418676789"/>
+        <w:divId w:val="886840144"/>
         <w:rPr>
           <w:rFonts w:asciiTheme="minorHAnsi" w:hAnsiTheme="minorHAnsi" w:cstheme="minorBidi"/>
           <w:noProof/>
@@ -834,7 +953,7 @@
         <w:rPr>
           <w:noProof/>
         </w:rPr>
-        <w:instrText xml:space="preserve"> PAGEREF _Toc242858177 \h </w:instrText>
+        <w:instrText xml:space="preserve"> PAGEREF _Toc243921517 \h </w:instrText>
       </w:r>
       <w:r>
         <w:rPr>
@@ -851,7 +970,7 @@
         <w:rPr>
           <w:noProof/>
         </w:rPr>
-        <w:t>9</w:t>
+        <w:t>8</w:t>
       </w:r>
       <w:r>
         <w:rPr>
@@ -866,7 +985,7 @@
         <w:tabs>
           <w:tab w:val="right" w:leader="dot" w:pos="9062"/>
         </w:tabs>
-        <w:divId w:val="1418676789"/>
+        <w:divId w:val="886840144"/>
         <w:rPr>
           <w:rFonts w:asciiTheme="minorHAnsi" w:hAnsiTheme="minorHAnsi" w:cstheme="minorBidi"/>
           <w:noProof/>
@@ -899,7 +1018,7 @@
         <w:rPr>
           <w:noProof/>
         </w:rPr>
-        <w:instrText xml:space="preserve"> PAGEREF _Toc242858178 \h </w:instrText>
+        <w:instrText xml:space="preserve"> PAGEREF _Toc243921518 \h </w:instrText>
       </w:r>
       <w:r>
         <w:rPr>
@@ -916,26 +1035,11 @@
         <w:rPr>
           <w:noProof/>
         </w:rPr>
-        <w:t>9</w:t>
-      </w:r>
-      <w:r>
-        <w:rPr>
-          <w:noProof/>
-        </w:rPr>
-        <w:fldChar w:fldCharType="end"/>
-      </w:r>
-    </w:p>
-    <w:p>
-      <w:pPr>
-        <w:pStyle w:val="marker"/>
-        <w:divId w:val="1418676789"/>
-        <w:rPr>
-          <w:lang w:val="nl-NL"/>
-        </w:rPr>
-      </w:pPr>
-      <w:r>
-        <w:rPr>
-          <w:lang w:val="nl-NL"/>
+        <w:t>8</w:t>
+      </w:r>
+      <w:r>
+        <w:rPr>
+          <w:noProof/>
         </w:rPr>
         <w:fldChar w:fldCharType="end"/>
       </w:r>
@@ -944,11 +1048,17 @@
       <w:pPr>
         <w:pStyle w:val="marker"/>
         <w:ind w:left="800" w:right="800"/>
-        <w:divId w:val="1722904862"/>
-        <w:rPr>
-          <w:lang w:val="nl-NL"/>
-        </w:rPr>
-      </w:pPr>
+        <w:divId w:val="886840144"/>
+        <w:rPr>
+          <w:lang w:val="nl-NL"/>
+        </w:rPr>
+      </w:pPr>
+      <w:r>
+        <w:rPr>
+          <w:lang w:val="nl-NL"/>
+        </w:rPr>
+        <w:fldChar w:fldCharType="end"/>
+      </w:r>
       <w:r>
         <w:br w:type="page"/>
       </w:r>
@@ -956,13 +1066,13 @@
     <w:p>
       <w:pPr>
         <w:pStyle w:val="Kop2"/>
-        <w:divId w:val="1722904862"/>
-        <w:rPr>
-          <w:rFonts w:eastAsia="Times New Roman"/>
-          <w:lang w:val="nl-NL"/>
-        </w:rPr>
-      </w:pPr>
-      <w:bookmarkStart w:id="1" w:name="_Toc242858168"/>
+        <w:divId w:val="361521702"/>
+        <w:rPr>
+          <w:rFonts w:eastAsia="Times New Roman"/>
+          <w:lang w:val="nl-NL"/>
+        </w:rPr>
+      </w:pPr>
+      <w:bookmarkStart w:id="1" w:name="_Toc243921506"/>
       <w:r>
         <w:rPr>
           <w:rFonts w:eastAsia="Times New Roman"/>
@@ -975,7 +1085,7 @@
     <w:p>
       <w:pPr>
         <w:pStyle w:val="Normaalweb"/>
-        <w:divId w:val="1722904862"/>
+        <w:divId w:val="361521702"/>
         <w:rPr>
           <w:lang w:val="nl-NL"/>
         </w:rPr>
@@ -990,7 +1100,7 @@
     <w:p>
       <w:pPr>
         <w:pStyle w:val="Normaalweb"/>
-        <w:divId w:val="1722904862"/>
+        <w:divId w:val="361521702"/>
         <w:rPr>
           <w:lang w:val="nl-NL"/>
         </w:rPr>
@@ -1018,7 +1128,7 @@
     <w:p>
       <w:pPr>
         <w:pStyle w:val="Normaalweb"/>
-        <w:divId w:val="1722904862"/>
+        <w:divId w:val="361521702"/>
         <w:rPr>
           <w:lang w:val="nl-NL"/>
         </w:rPr>
@@ -1039,7 +1149,7 @@
     <w:p>
       <w:pPr>
         <w:pStyle w:val="Normaalweb"/>
-        <w:divId w:val="1722904862"/>
+        <w:divId w:val="361521702"/>
         <w:rPr>
           <w:lang w:val="nl-NL"/>
         </w:rPr>
@@ -1086,7 +1196,7 @@
     <w:p>
       <w:pPr>
         <w:pStyle w:val="Normaalweb"/>
-        <w:divId w:val="1722904862"/>
+        <w:divId w:val="361521702"/>
         <w:rPr>
           <w:lang w:val="nl-NL"/>
         </w:rPr>
@@ -1101,257 +1211,257 @@
         <w:rPr>
           <w:lang w:val="nl-NL"/>
         </w:rPr>
-        <w:t xml:space="preserve"> Elke nieuwe gemeente eist een nieuwe inschrijving. Met elke verhuizing groeit de eenheid: van één naar </w:t>
-      </w:r>
+        <w:t xml:space="preserve"> Elke nieuwe gemeente eist een nieuwe inschrijving. Met elke verhuizing groeit de eenheid: van één naar twee. Twee mensen, twee dossiers, twee administratieve identiteiten die vanaf nu samen door de bureaucratie moeten.</w:t>
+      </w:r>
+    </w:p>
+    <w:p>
+      <w:pPr>
+        <w:pStyle w:val="Normaalweb"/>
+        <w:divId w:val="361521702"/>
+        <w:rPr>
+          <w:lang w:val="nl-NL"/>
+        </w:rPr>
+      </w:pPr>
       <w:r>
         <w:rPr>
           <w:lang w:val="nl-NL"/>
         </w:rPr>
         <w:lastRenderedPageBreak/>
-        <w:t>twee. Twee mensen, twee dossiers, twee administratieve identiteiten die vanaf nu samen door de bureaucratie moeten.</w:t>
+        <w:t>In 2014 verhuizen zij samen naar Zeeuws-Vlaanderen in Nederland. Europa telt dan 28 lidstaten. De fysieke grens is opgelost; je rijdt zonder remmen van België naar Nederland. Maar de administratieve grens is onzichtbaar opgetrokken. Daar begint de eerste wrijving. Hun Belgische rijbewijs is geldig in de hele Europese Unie, het Nederlandse ook. Toch moeten ze het Belgische inleveren. Nederland staat maar één geldig document per persoon toe.</w:t>
+      </w:r>
+      <w:r>
+        <w:rPr>
+          <w:vertAlign w:val="superscript"/>
+          <w:lang w:val="nl-NL"/>
+        </w:rPr>
+        <w:t>***</w:t>
+      </w:r>
+      <w:r>
+        <w:rPr>
+          <w:lang w:val="nl-NL"/>
+        </w:rPr>
+        <w:t xml:space="preserve"> Ze geven het af bij de gemeente en krijgen het nooit terug. Wat ze in de plaats krijgen, is een Nederlands document met exact dezelfde Europese geldigheid. Alleen het land van uitgifte is veranderd. Vanaf dat moment dragen ze de paradox in hun eigen portemonnee. Een Belgische identiteitskaart voor hun identiteit. Een Nederlands rijbewijs voor hun mobiliteit, dat in Nederland dient als wettig legitimatiebewijs. In België wordt datzelfde rijbewijs niet als identiteitsbewijs aanvaard; daar geldt uitsluiten</w:t>
+      </w:r>
+      <w:r>
+        <w:rPr>
+          <w:lang w:val="nl-NL"/>
+        </w:rPr>
+        <w:t>d de Belgische kaart. Twee documenten, twee landen, één mens. Hun leven verdeelt zich over twee staten: wonen in het ene, verzekerd zijn in het andere. In theorie horen ze zo bij beide landen en zou hun bestaan zich naadloos over de grens moeten plooien. In de praktijk is het administratieve systeem geprogrammeerd om telkens maar één land tegelijk te lezen. Zodra de systemen niet met elkaar spreken, word je onleesbaar.</w:t>
       </w:r>
     </w:p>
     <w:p>
       <w:pPr>
         <w:pStyle w:val="Normaalweb"/>
-        <w:divId w:val="1722904862"/>
-        <w:rPr>
-          <w:lang w:val="nl-NL"/>
-        </w:rPr>
-      </w:pPr>
-      <w:r>
-        <w:rPr>
-          <w:lang w:val="nl-NL"/>
-        </w:rPr>
-        <w:t>In 2014 verhuizen zij samen naar Zeeuws-Vlaanderen in Nederland. Europa telt dan 28 lidstaten. De fysieke grens is opgelost; je rijdt zonder remmen van België naar Nederland. Maar de administratieve grens is onzichtbaar opgetrokken. Daar begint de eerste wrijving. Hun Belgische rijbewijs is geldig in de hele Europese Unie, het Nederlandse ook. Toch moeten ze het Belgische inleveren. Nederland staat maar één geldig document per persoon toe.</w:t>
+        <w:divId w:val="361521702"/>
+        <w:rPr>
+          <w:lang w:val="nl-NL"/>
+        </w:rPr>
+      </w:pPr>
+      <w:r>
+        <w:rPr>
+          <w:lang w:val="nl-NL"/>
+        </w:rPr>
+        <w:t>In 2016 wordt hun zoon geboren. Een kind dat in zich draagt wat zijn ouders en grootouders hem hebben doorgegeven. De Vlaamse wortels van zijn moeder. De talen van zijn grootouders — niet als nationaliteit, maar als oorsprong, als klank, als bloed. En Zeeuws-Vlaams omdat hij er woont, de lucht inademt en er vrienden maakt. Vier werelden in één lichaam. Vier oorsprongen in één kind. Hij steekt elke dag de grens over. Niet voor werk, zoals zijn ouders, maar voor school. Hij woont in Nederland, maar leert leze</w:t>
+      </w:r>
+      <w:r>
+        <w:rPr>
+          <w:lang w:val="nl-NL"/>
+        </w:rPr>
+        <w:t>n en schrijven in Vlaanderen. Op school leert hij de taal van zijn moeder, maar zijn bed staat in Hulst. En daar begint het onvermijdelijke. Voor de Vlamingen is hij een Nederlander, rijdend in een auto met een geel kenteken. Voor de Nederlanders is hij een Vlaming, herkenbaar aan zijn tongval. Op het speelplein steken de andere kinderen hem in het vakje 'Belg'. Niet omdat iemand hem dat gevraagd heeft. Niet omdat hij een keuze heeft gemaakt. Maar omdat de kinderen om hem heen al geleerd hebben dat er vakje</w:t>
+      </w:r>
+      <w:r>
+        <w:rPr>
+          <w:lang w:val="nl-NL"/>
+        </w:rPr>
+        <w:t>s bestaan, en dat alles wat afwijkt, geclassificeerd moet worden. Drie mensen, drie dossiers, twee landen, één gezin.</w:t>
+      </w:r>
+    </w:p>
+    <w:p>
+      <w:pPr>
+        <w:pStyle w:val="Normaalweb"/>
+        <w:divId w:val="361521702"/>
+        <w:rPr>
+          <w:lang w:val="nl-NL"/>
+        </w:rPr>
+      </w:pPr>
+      <w:r>
+        <w:rPr>
+          <w:lang w:val="nl-NL"/>
+        </w:rPr>
+        <w:t xml:space="preserve">Uiteindelijk krijgt ook hij een plastieken kaartje dat hem moet vertellen wie hij is. Daarop staat opnieuw dat ene woord. </w:t>
+      </w:r>
+      <w:r>
+        <w:rPr>
+          <w:rStyle w:val="Zwaar"/>
+          <w:lang w:val="nl-NL"/>
+        </w:rPr>
+        <w:t>BELG.</w:t>
+      </w:r>
+      <w:r>
+        <w:rPr>
+          <w:lang w:val="nl-NL"/>
+        </w:rPr>
+        <w:t xml:space="preserve"> De kleine Europese vlag in de hoek is het enige wat rest van het grotere ideaal. De rest is onzichtbaar gemaakt. Het systeem registreert één dimensie, terwijl het kind er vier draagt.</w:t>
+      </w:r>
+    </w:p>
+    <w:p>
+      <w:pPr>
+        <w:pStyle w:val="Normaalweb"/>
+        <w:divId w:val="361521702"/>
+        <w:rPr>
+          <w:lang w:val="nl-NL"/>
+        </w:rPr>
+      </w:pPr>
+      <w:r>
+        <w:rPr>
+          <w:lang w:val="nl-NL"/>
+        </w:rPr>
+        <w:t>Zo werkt het algoritme van de staat. Het ziet geen gezin. Het ziet geen organisme dat over twee landen is gegroeid. Het ziet uitsluitend losse eenheden in losse vakjes in losse landen. Wie niet in het vakje past, valt tussen de regels door.</w:t>
+      </w:r>
+    </w:p>
+    <w:p>
+      <w:pPr>
+        <w:pStyle w:val="Normaalweb"/>
+        <w:divId w:val="361521702"/>
+        <w:rPr>
+          <w:lang w:val="nl-NL"/>
+        </w:rPr>
+      </w:pPr>
+      <w:r>
+        <w:rPr>
+          <w:lang w:val="nl-NL"/>
+        </w:rPr>
+        <w:t xml:space="preserve">Het is 2025. De Europese Unie telt 27 lidstaten, na de uittreding van het Verenigd Koninkrijk. De overheden zijn gedigitaliseerd, datastromen verbinden de hoofdsteden en de theorie belooft een frictieloze unie. En het kind uit 1981? Hij is inmiddels vierenveertig. Hij wordt ernstig ziek en belandt in de kliniek. De tol van de suikerziekte is onomkeerbaar: de amputatie van twee tenen en het verlies van zicht in één oog. De Belgische artsen oordelen helder: u mag niet meer rijden. Hij kan en wil dat ook niet </w:t>
+      </w:r>
+      <w:r>
+        <w:rPr>
+          <w:lang w:val="nl-NL"/>
+        </w:rPr>
+        <w:t xml:space="preserve">meer. De Nederlandse artsen in zijn </w:t>
+      </w:r>
+      <w:r>
+        <w:rPr>
+          <w:lang w:val="nl-NL"/>
+        </w:rPr>
+        <w:lastRenderedPageBreak/>
+        <w:t>woonland kennen hem niet, en mógen hem door de strikte wetgeving rond dubbele inschrijvingen niet eens kennen. Hoewel het Nederlandse rijbewijs tot de volgende oogtest fysiek nog in zijn portemonnee zit — Nederland weet nog van niets, omdat de database domweg weigert de Belgische medische realiteit in te lezen — is zijn grensoverschrijdende mobiliteit feitelijk voorbij. Straks, wanneer dat document onvermijdelijk vervalt, wist het systeem de enige kaart uit die hem in Ned</w:t>
+      </w:r>
+      <w:r>
+        <w:rPr>
+          <w:lang w:val="nl-NL"/>
+        </w:rPr>
+        <w:t xml:space="preserve">erland nog een administratieve weerspiegeling gaf. Wat overblijft, is de Belgische identiteitskaart. Eén woord. </w:t>
+      </w:r>
+      <w:r>
+        <w:rPr>
+          <w:rStyle w:val="Zwaar"/>
+          <w:lang w:val="nl-NL"/>
+        </w:rPr>
+        <w:t>BELG.</w:t>
+      </w:r>
+      <w:r>
+        <w:rPr>
+          <w:lang w:val="nl-NL"/>
+        </w:rPr>
+        <w:t xml:space="preserve"> De man die zijn hele leven over grenzen bewoog, die zijn Italiaanse en Franse identiteit vrijwillig opgaf om Belg te worden, maar de wereld van zijn vader en moeder nooit kon uitwissen, wordt aan het einde van zijn rit genadeloos teruggebracht tot één land. Het systeem heeft hem ingehaald. De cirkel is rond. Hij is weer uitsluitend Belg. En zijn zoon, die vier werelden in zich draagt, staat </w:t>
+      </w:r>
+      <w:r>
+        <w:rPr>
+          <w:lang w:val="nl-NL"/>
+        </w:rPr>
+        <w:t xml:space="preserve">met exact datzelfde woord in de database. </w:t>
+      </w:r>
+      <w:r>
+        <w:rPr>
+          <w:rStyle w:val="Zwaar"/>
+          <w:lang w:val="nl-NL"/>
+        </w:rPr>
+        <w:t>BELG.</w:t>
+      </w:r>
+      <w:r>
+        <w:rPr>
+          <w:lang w:val="nl-NL"/>
+        </w:rPr>
+        <w:t xml:space="preserve"> Niets meer. Een kleine Europese vlag in de hoek.</w:t>
+      </w:r>
+    </w:p>
+    <w:p>
+      <w:pPr>
+        <w:pStyle w:val="Normaalweb"/>
+        <w:divId w:val="361521702"/>
+        <w:rPr>
+          <w:lang w:val="nl-NL"/>
+        </w:rPr>
+      </w:pPr>
+      <w:r>
+        <w:rPr>
+          <w:lang w:val="nl-NL"/>
+        </w:rPr>
+        <w:t>Drie generaties. Drie identiteitskaarten. Eén woord. Het systeem reduceert iedereen tot een enkel datapunt. Zelfs degene die het probeerde te ontstijgen.</w:t>
+      </w:r>
+    </w:p>
+    <w:p>
+      <w:pPr>
+        <w:pStyle w:val="Normaalweb"/>
+        <w:divId w:val="361521702"/>
+        <w:rPr>
+          <w:lang w:val="nl-NL"/>
+        </w:rPr>
+      </w:pPr>
+      <w:r>
+        <w:rPr>
+          <w:lang w:val="nl-NL"/>
+        </w:rPr>
+        <w:t>Het is nu najaar 2026. Terwijl hij deze audit uittypt, valt er een traan op het toetsenbord. Niet uit zelfmedelijden, maar uit de pure, loden uitputting van een gevecht tegen de leegte. De bittere tragiek is dat Europa de fout inmiddels kent. In april 2026 bereikte de Europese wetgever in Brussel een politiek akkoord over de langverwachte herziening van de oude coördinatieregels; in juli 2026 werd de herziene tekst formeel aangenomen.</w:t>
       </w:r>
       <w:r>
         <w:rPr>
           <w:vertAlign w:val="superscript"/>
           <w:lang w:val="nl-NL"/>
         </w:rPr>
-        <w:t>***</w:t>
-      </w:r>
-      <w:r>
-        <w:rPr>
-          <w:lang w:val="nl-NL"/>
-        </w:rPr>
-        <w:t xml:space="preserve"> Ze geven het af bij de gemeente en krijgen het nooit terug. Wat ze in de plaats krijgen, is een Nederlands document met exact dezelfde Europese geldigheid. Alleen het land van uitgifte is veranderd. Vanaf dat moment dragen ze de paradox in hun eigen portemonnee. Een Belgische identiteitskaart voor hun identiteit. Een Nederlands rijbewijs voor hun mobiliteit, dat in Nederland dient als wettig legitimatiebewijs. In België wordt datzelfde rijbewijs niet als identiteitsbewijs aanvaard; daar geldt uitsluiten</w:t>
-      </w:r>
-      <w:r>
-        <w:rPr>
-          <w:lang w:val="nl-NL"/>
-        </w:rPr>
-        <w:t>d de Belgische kaart. Twee documenten, twee landen, één mens. Hun leven verdeelt zich over twee staten: wonen in het ene, verzekerd zijn in het andere. In theorie horen ze zo bij beide landen en zou hun bestaan zich naadloos over de grens moeten plooien. In de praktijk is het administratieve systeem geprogrammeerd om telkens maar één land tegelijk te lezen. Zodra de systemen niet met elkaar spreken, word je onleesbaar.</w:t>
+        <w:t>****</w:t>
+      </w:r>
+      <w:r>
+        <w:rPr>
+          <w:lang w:val="nl-NL"/>
+        </w:rPr>
+        <w:t xml:space="preserve"> De weeffouten worden erkend, het bevoegdheidsvacuüm is benoemd. Maar de inkt van de politiek stroomt eindeloos veel trager dan het bloed van de burger. De systemen worden pas omstreeks 2030 daadwerkelijk aangepast. Tot die tijd is de grensarbeider van vlees en bloed de enige overgebleven schokdemper voor de falende systemen van de staat.</w:t>
       </w:r>
     </w:p>
     <w:p>
       <w:pPr>
         <w:pStyle w:val="Normaalweb"/>
-        <w:divId w:val="1722904862"/>
-        <w:rPr>
-          <w:lang w:val="nl-NL"/>
-        </w:rPr>
-      </w:pPr>
-      <w:r>
-        <w:rPr>
-          <w:lang w:val="nl-NL"/>
-        </w:rPr>
-        <w:t>In 2016 wordt hun zoon geboren. Een kind dat in zich draagt wat zijn ouders en grootouders hem hebben doorgegeven. De Vlaamse wortels van zijn moeder. De talen van zijn grootouders — niet als nationaliteit, maar als oorsprong, als klank, als bloed. En Zeeuws-Vlaams omdat hij er woont, de lucht inademt en er vrienden maakt. Vier werelden in één lichaam. Vier oorsprongen in één kind. Hij steekt elke dag de grens over. Niet voor werk, zoals zijn ouders, maar voor school. Hij woont in Nederland, maar leert leze</w:t>
-      </w:r>
-      <w:r>
-        <w:rPr>
-          <w:lang w:val="nl-NL"/>
-        </w:rPr>
-        <w:t>n en schrijven in Vlaanderen. Op school leert hij de taal van zijn moeder, maar zijn bed staat in Hulst. En daar begint het onvermijdelijke. Voor de Vlamingen is hij een Nederlander, rijdend in een auto met een geel kenteken. Voor de Nederlanders is hij een Vlaming, herkenbaar aan zijn tongval. Op het speelplein steken de andere kinderen hem in het vakje 'Belg'. Niet omdat iemand hem dat gevraagd heeft. Niet omdat hij een keuze heeft gemaakt. Maar omdat de kinderen om hem heen al geleerd hebben dat er vakje</w:t>
-      </w:r>
-      <w:r>
-        <w:rPr>
-          <w:lang w:val="nl-NL"/>
-        </w:rPr>
-        <w:t>s bestaan, en dat alles wat afwijkt, geclassificeerd moet worden. Drie mensen, drie dossiers, twee landen, één gezin.</w:t>
+        <w:divId w:val="361521702"/>
+        <w:rPr>
+          <w:lang w:val="nl-NL"/>
+        </w:rPr>
+      </w:pPr>
+      <w:r>
+        <w:rPr>
+          <w:lang w:val="nl-NL"/>
+        </w:rPr>
+        <w:t>En zelfs dán, in 2030, vormen die nieuwe regels slechts een technologische pleister op een veel diepere institutionele wonde. Zolang de natiestaten krampachtig vasthouden aan hun eigen gesloten loketten, blijft de grensarbeider in de kern de onbedoelde foutmelding van een half afgewerkt ontwerp.</w:t>
       </w:r>
     </w:p>
     <w:p>
       <w:pPr>
         <w:pStyle w:val="Normaalweb"/>
-        <w:divId w:val="1722904862"/>
-        <w:rPr>
-          <w:lang w:val="nl-NL"/>
-        </w:rPr>
-      </w:pPr>
-      <w:r>
-        <w:rPr>
-          <w:lang w:val="nl-NL"/>
-        </w:rPr>
-        <w:t xml:space="preserve">Uiteindelijk krijgt ook hij een plastieken kaartje dat hem moet vertellen wie hij is. Daarop staat opnieuw dat ene woord. </w:t>
-      </w:r>
-      <w:r>
-        <w:rPr>
-          <w:rStyle w:val="Zwaar"/>
-          <w:lang w:val="nl-NL"/>
-        </w:rPr>
-        <w:t>BELG.</w:t>
-      </w:r>
-      <w:r>
-        <w:rPr>
-          <w:lang w:val="nl-NL"/>
-        </w:rPr>
-        <w:t xml:space="preserve"> De kleine Europese vlag in de hoek is het enige wat rest van het grotere ideaal. De rest is onzichtbaar gemaakt. Het systeem registreert één dimensie, terwijl het kind er vier draagt.</w:t>
+        <w:divId w:val="361521702"/>
+        <w:rPr>
+          <w:lang w:val="nl-NL"/>
+        </w:rPr>
+      </w:pPr>
+      <w:r>
+        <w:rPr>
+          <w:lang w:val="nl-NL"/>
+        </w:rPr>
+        <w:t>Dat is wat dit dossier onderzoekt. Niet de nationaliteit als juridisch statuut. Wel de oorsprong als menselijke werkelijkheid. En de vraag waarom een systeem dat zichzelf Europees noemt, de Europese werkelijkheid van zijn eigen burgers reduceert tot een eendimensionaal veld op een identiteitskaart.</w:t>
       </w:r>
     </w:p>
     <w:p>
       <w:pPr>
         <w:pStyle w:val="Normaalweb"/>
-        <w:divId w:val="1722904862"/>
-        <w:rPr>
-          <w:lang w:val="nl-NL"/>
-        </w:rPr>
-      </w:pPr>
-      <w:r>
-        <w:rPr>
-          <w:lang w:val="nl-NL"/>
-        </w:rPr>
-        <w:t>Zo werkt het algoritme van de staat. Het ziet geen gezin. Het ziet geen organisme dat over twee landen is gegroeid. Het ziet uitsluitend losse eenheden in losse vakjes in losse landen. Wie niet in het vakje past, valt tussen de regels door.</w:t>
-      </w:r>
-    </w:p>
-    <w:p>
-      <w:pPr>
-        <w:pStyle w:val="Normaalweb"/>
-        <w:divId w:val="1722904862"/>
-        <w:rPr>
-          <w:lang w:val="nl-NL"/>
-        </w:rPr>
-      </w:pPr>
-      <w:r>
-        <w:rPr>
-          <w:lang w:val="nl-NL"/>
-        </w:rPr>
-        <w:t xml:space="preserve">Het is 2025. De Europese Unie telt 27 lidstaten, na de uittreding van het Verenigd Koninkrijk. De overheden zijn gedigitaliseerd, datastromen verbinden de hoofdsteden en de theorie belooft een frictieloze unie. En het kind uit 1981? Hij is inmiddels vierenveertig. Hij wordt ernstig ziek en belandt in de kliniek. De tol van de suikerziekte is onomkeerbaar: de amputatie van twee tenen en het </w:t>
-      </w:r>
-      <w:r>
-        <w:rPr>
-          <w:lang w:val="nl-NL"/>
-        </w:rPr>
-        <w:lastRenderedPageBreak/>
-        <w:t>verlies van zicht in één oog. De Belgische artsen oordelen helder: u mag niet meer rijden. Hij kan en wil dat ook niet meer. De Nederlandse artsen in zijn woonland kennen hem niet, en mógen hem door de strikte wetgeving rond dubbele inschrijvingen niet eens kennen. Hoewel het Nederlandse rijbewijs tot de volgende oogtest fysiek nog in zijn portemonnee zit — Nederland weet nog van niets, omdat de database domweg weigert de Belgische medische realiteit in te lezen — is zijn grensoverschrijdende mobiliteit fei</w:t>
-      </w:r>
-      <w:r>
-        <w:rPr>
-          <w:lang w:val="nl-NL"/>
-        </w:rPr>
-        <w:t xml:space="preserve">telijk voorbij. Straks, wanneer dat document onvermijdelijk vervalt, wist het systeem de enige kaart uit die hem in Nederland nog een administratieve weerspiegeling gaf. Wat overblijft, is de Belgische identiteitskaart. Eén woord. </w:t>
-      </w:r>
-      <w:r>
-        <w:rPr>
-          <w:rStyle w:val="Zwaar"/>
-          <w:lang w:val="nl-NL"/>
-        </w:rPr>
-        <w:t>BELG.</w:t>
-      </w:r>
-      <w:r>
-        <w:rPr>
-          <w:lang w:val="nl-NL"/>
-        </w:rPr>
-        <w:t xml:space="preserve"> De man die zijn hele leven over grenzen bewoog, die zijn Italiaanse en Franse identiteit vrijwillig opgaf om Belg te worden, maar de wereld van zijn vader en moeder nooit kon uitwissen, wordt aan het einde van zijn rit genadeloos teruggebracht tot één land. Het systeem heeft</w:t>
-      </w:r>
-      <w:r>
-        <w:rPr>
-          <w:lang w:val="nl-NL"/>
-        </w:rPr>
-        <w:t xml:space="preserve"> hem ingehaald. De cirkel is rond. Hij is weer uitsluitend Belg. En zijn zoon, die vier werelden in zich draagt, staat met exact datzelfde woord in de database. </w:t>
-      </w:r>
-      <w:r>
-        <w:rPr>
-          <w:rStyle w:val="Zwaar"/>
-          <w:lang w:val="nl-NL"/>
-        </w:rPr>
-        <w:t>BELG.</w:t>
-      </w:r>
-      <w:r>
-        <w:rPr>
-          <w:lang w:val="nl-NL"/>
-        </w:rPr>
-        <w:t xml:space="preserve"> Niets meer. Een kleine Europese vlag in de hoek.</w:t>
-      </w:r>
-    </w:p>
-    <w:p>
-      <w:pPr>
-        <w:pStyle w:val="Normaalweb"/>
-        <w:divId w:val="1722904862"/>
-        <w:rPr>
-          <w:lang w:val="nl-NL"/>
-        </w:rPr>
-      </w:pPr>
-      <w:r>
-        <w:rPr>
-          <w:lang w:val="nl-NL"/>
-        </w:rPr>
-        <w:t>Drie generaties. Drie identiteitskaarten. Eén woord. Het systeem reduceert iedereen tot een enkel datapunt. Zelfs degene die het probeerde te ontstijgen.</w:t>
-      </w:r>
-    </w:p>
-    <w:p>
-      <w:pPr>
-        <w:pStyle w:val="Normaalweb"/>
-        <w:divId w:val="1722904862"/>
-        <w:rPr>
-          <w:lang w:val="nl-NL"/>
-        </w:rPr>
-      </w:pPr>
-      <w:r>
-        <w:rPr>
-          <w:lang w:val="nl-NL"/>
-        </w:rPr>
-        <w:t>Het is nu najaar 2026. Terwijl hij deze audit uittypt, valt er een traan op het toetsenbord. Niet uit zelfmedelijden, maar uit de pure, loden uitputting van een gevecht tegen de leegte. De bittere tragiek is dat Europa de fout inmiddels kent. In april 2026 bereikte de Europese wetgever in Brussel een politiek akkoord over de langverwachte herziening van de oude coördinatieregels; in juli 2026 werd de herziene tekst formeel aangenomen.</w:t>
-      </w:r>
-      <w:r>
-        <w:rPr>
-          <w:vertAlign w:val="superscript"/>
-          <w:lang w:val="nl-NL"/>
-        </w:rPr>
-        <w:t>****</w:t>
-      </w:r>
-      <w:r>
-        <w:rPr>
-          <w:lang w:val="nl-NL"/>
-        </w:rPr>
-        <w:t xml:space="preserve"> De weeffouten worden erkend, het bevoegdheidsvacuüm is benoemd. Maar de inkt van de politiek stroomt eindeloos veel trager dan het bloed van de burger. De systemen worden pas omstreeks 2030 daadwerkelijk aangepast. Tot die tijd is de grensarbeider van vlees en bloed de enige overgebleven schokdemper voor de falende systemen van de staat.</w:t>
-      </w:r>
-    </w:p>
-    <w:p>
-      <w:pPr>
-        <w:pStyle w:val="Normaalweb"/>
-        <w:divId w:val="1722904862"/>
-        <w:rPr>
-          <w:lang w:val="nl-NL"/>
-        </w:rPr>
-      </w:pPr>
-      <w:r>
-        <w:rPr>
-          <w:lang w:val="nl-NL"/>
-        </w:rPr>
-        <w:t>En zelfs dán, in 2030, vormen die nieuwe regels slechts een technologische pleister op een veel diepere institutionele wonde. Zolang de natiestaten krampachtig vasthouden aan hun eigen gesloten loketten, blijft de grensarbeider in de kern de onbedoelde foutmelding van een half afgewerkt ontwerp.</w:t>
-      </w:r>
-    </w:p>
-    <w:p>
-      <w:pPr>
-        <w:pStyle w:val="Normaalweb"/>
-        <w:divId w:val="1722904862"/>
-        <w:rPr>
-          <w:lang w:val="nl-NL"/>
-        </w:rPr>
-      </w:pPr>
-      <w:r>
-        <w:rPr>
-          <w:lang w:val="nl-NL"/>
-        </w:rPr>
-        <w:t>Dat is wat dit dossier onderzoekt. Niet de nationaliteit als juridisch statuut. Wel de oorsprong als menselijke werkelijkheid. En de vraag waarom een systeem dat zichzelf Europees noemt, de Europese werkelijkheid van zijn eigen burgers reduceert tot een eendimensionaal veld op een identiteitskaart.</w:t>
-      </w:r>
-    </w:p>
-    <w:p>
-      <w:pPr>
-        <w:pStyle w:val="Normaalweb"/>
-        <w:divId w:val="1722904862"/>
+        <w:divId w:val="361521702"/>
         <w:rPr>
           <w:lang w:val="nl-NL"/>
         </w:rPr>
@@ -1366,25 +1476,25 @@
     <w:p>
       <w:pPr>
         <w:spacing w:before="300" w:after="200"/>
-        <w:divId w:val="1722904862"/>
-        <w:rPr>
-          <w:rFonts w:eastAsia="Times New Roman"/>
-          <w:lang w:val="nl-NL"/>
-        </w:rPr>
-      </w:pPr>
-      <w:r>
-        <w:rPr>
-          <w:rFonts w:eastAsia="Times New Roman"/>
-          <w:lang w:val="nl-NL"/>
-        </w:rPr>
-        <w:pict w14:anchorId="3208B9BD">
+        <w:divId w:val="361521702"/>
+        <w:rPr>
+          <w:rFonts w:eastAsia="Times New Roman"/>
+          <w:lang w:val="nl-NL"/>
+        </w:rPr>
+      </w:pPr>
+      <w:r>
+        <w:rPr>
+          <w:rFonts w:eastAsia="Times New Roman"/>
+          <w:lang w:val="nl-NL"/>
+        </w:rPr>
+        <w:pict w14:anchorId="067F8BC6">
           <v:rect id="_x0000_i1025" style="width:0;height:1.5pt" o:hralign="center" o:hrstd="t" o:hr="t" fillcolor="#a0a0a0" stroked="f"/>
         </w:pict>
       </w:r>
     </w:p>
     <w:p>
       <w:pPr>
-        <w:divId w:val="2001928975"/>
+        <w:divId w:val="1598903379"/>
         <w:rPr>
           <w:color w:val="555555"/>
           <w:sz w:val="20"/>
@@ -1423,7 +1533,7 @@
     </w:p>
     <w:p>
       <w:pPr>
-        <w:divId w:val="2001928975"/>
+        <w:divId w:val="1598903379"/>
         <w:rPr>
           <w:color w:val="555555"/>
           <w:sz w:val="20"/>
@@ -1448,22 +1558,12 @@
           <w:szCs w:val="20"/>
           <w:lang w:val="nl-NL"/>
         </w:rPr>
-        <w:t xml:space="preserve"> Met het Verdrag van Maastricht (getekend in 1992, in werking getreden eind 1993) werd het "Burgerschap van de Europese Unie" formeel ingevoerd. Elke persoon die de nationaliteit van een lidstaat bezit, is automatisch ook burger van de Unie, met het </w:t>
-      </w:r>
-      <w:r>
-        <w:rPr>
-          <w:color w:val="555555"/>
-          <w:sz w:val="20"/>
-          <w:szCs w:val="20"/>
-          <w:lang w:val="nl-NL"/>
-        </w:rPr>
-        <w:lastRenderedPageBreak/>
-        <w:t>recht om vrij te reizen en te verblijven. Toch blijft de nationale administratieve uitvoering in de praktijk dominant over dit Europese basisrecht.</w:t>
-      </w:r>
-    </w:p>
-    <w:p>
-      <w:pPr>
-        <w:divId w:val="2001928975"/>
+        <w:t xml:space="preserve"> Met het Verdrag van Maastricht (getekend in 1992, in werking getreden eind 1993) werd het "Burgerschap van de Europese Unie" formeel ingevoerd. Elke persoon die de nationaliteit van een lidstaat bezit, is automatisch ook burger van de Unie, met het recht om vrij te reizen en te verblijven. Toch blijft de nationale administratieve uitvoering in de praktijk dominant over dit Europese basisrecht.</w:t>
+      </w:r>
+    </w:p>
+    <w:p>
+      <w:pPr>
+        <w:divId w:val="1598903379"/>
         <w:rPr>
           <w:color w:val="555555"/>
           <w:sz w:val="20"/>
@@ -1479,6 +1579,7 @@
           <w:szCs w:val="20"/>
           <w:lang w:val="nl-NL"/>
         </w:rPr>
+        <w:lastRenderedPageBreak/>
         <w:t>***</w:t>
       </w:r>
       <w:r>
@@ -1493,7 +1594,8 @@
     </w:p>
     <w:p>
       <w:pPr>
-        <w:divId w:val="2001928975"/>
+        <w:ind w:left="800" w:right="800"/>
+        <w:divId w:val="1598903379"/>
         <w:rPr>
           <w:color w:val="555555"/>
           <w:sz w:val="20"/>
@@ -1520,16 +1622,6 @@
         </w:rPr>
         <w:t xml:space="preserve"> In april 2026 werd na jarenlange triloog-onderhandelingen een voorlopig politiek akkoord bereikt over het 'Labour Mobility Package' (herziening van Verordening 883/2004 en 987/2009); in juli 2026 volgde de formele aanname. De wetgever erkent hierin de institutionele leemtes voor grensarbeiders, maar door de benodigde IT-aanpassingen worden de structurele oplossingen pas tegen 2030 operationeel afdwingbaar.</w:t>
       </w:r>
-    </w:p>
-    <w:p>
-      <w:pPr>
-        <w:pStyle w:val="marker"/>
-        <w:ind w:left="800" w:right="800"/>
-        <w:divId w:val="1722904862"/>
-        <w:rPr>
-          <w:lang w:val="nl-NL"/>
-        </w:rPr>
-      </w:pPr>
       <w:r>
         <w:br w:type="page"/>
       </w:r>
@@ -1537,13 +1629,13 @@
     <w:p>
       <w:pPr>
         <w:pStyle w:val="Kop2"/>
-        <w:divId w:val="1722904862"/>
-        <w:rPr>
-          <w:rFonts w:eastAsia="Times New Roman"/>
-          <w:lang w:val="nl-NL"/>
-        </w:rPr>
-      </w:pPr>
-      <w:bookmarkStart w:id="2" w:name="_Toc242858169"/>
+        <w:divId w:val="361521702"/>
+        <w:rPr>
+          <w:rFonts w:eastAsia="Times New Roman"/>
+          <w:lang w:val="nl-NL"/>
+        </w:rPr>
+      </w:pPr>
+      <w:bookmarkStart w:id="2" w:name="_Toc243921507"/>
       <w:r>
         <w:rPr>
           <w:rFonts w:eastAsia="Times New Roman"/>
@@ -1556,7 +1648,7 @@
     <w:p>
       <w:pPr>
         <w:pStyle w:val="Normaalweb"/>
-        <w:divId w:val="1722904862"/>
+        <w:divId w:val="361521702"/>
         <w:rPr>
           <w:lang w:val="nl-NL"/>
         </w:rPr>
@@ -1571,7 +1663,7 @@
     <w:p>
       <w:pPr>
         <w:pStyle w:val="Normaalweb"/>
-        <w:divId w:val="1722904862"/>
+        <w:divId w:val="361521702"/>
         <w:rPr>
           <w:lang w:val="nl-NL"/>
         </w:rPr>
@@ -1586,7 +1678,7 @@
     <w:p>
       <w:pPr>
         <w:pStyle w:val="Normaalweb"/>
-        <w:divId w:val="1722904862"/>
+        <w:divId w:val="361521702"/>
         <w:rPr>
           <w:lang w:val="nl-NL"/>
         </w:rPr>
@@ -1601,13 +1693,13 @@
     <w:p>
       <w:pPr>
         <w:pStyle w:val="Kop2"/>
-        <w:divId w:val="1722904862"/>
-        <w:rPr>
-          <w:rFonts w:eastAsia="Times New Roman"/>
-          <w:lang w:val="nl-NL"/>
-        </w:rPr>
-      </w:pPr>
-      <w:bookmarkStart w:id="3" w:name="_Toc242858170"/>
+        <w:divId w:val="361521702"/>
+        <w:rPr>
+          <w:rFonts w:eastAsia="Times New Roman"/>
+          <w:lang w:val="nl-NL"/>
+        </w:rPr>
+      </w:pPr>
+      <w:bookmarkStart w:id="3" w:name="_Toc243921508"/>
       <w:r>
         <w:rPr>
           <w:rFonts w:eastAsia="Times New Roman"/>
@@ -1620,7 +1712,7 @@
     <w:p>
       <w:pPr>
         <w:pStyle w:val="Normaalweb"/>
-        <w:divId w:val="1722904862"/>
+        <w:divId w:val="361521702"/>
         <w:rPr>
           <w:lang w:val="nl-NL"/>
         </w:rPr>
@@ -1635,47 +1727,81 @@
     <w:p>
       <w:pPr>
         <w:pStyle w:val="Kop2"/>
-        <w:divId w:val="1722904862"/>
-        <w:rPr>
-          <w:rFonts w:eastAsia="Times New Roman"/>
-          <w:lang w:val="nl-NL"/>
-        </w:rPr>
-      </w:pPr>
-      <w:bookmarkStart w:id="4" w:name="_Toc242858171"/>
-      <w:r>
-        <w:rPr>
-          <w:rFonts w:eastAsia="Times New Roman"/>
-          <w:lang w:val="nl-NL"/>
-        </w:rPr>
-        <w:t>De vijf documenten</w:t>
+        <w:divId w:val="361521702"/>
+        <w:rPr>
+          <w:rFonts w:eastAsia="Times New Roman"/>
+          <w:lang w:val="nl-NL"/>
+        </w:rPr>
+      </w:pPr>
+      <w:bookmarkStart w:id="4" w:name="_Toc243921509"/>
+      <w:r>
+        <w:rPr>
+          <w:rFonts w:eastAsia="Times New Roman"/>
+          <w:lang w:val="nl-NL"/>
+        </w:rPr>
+        <w:t>De zes documenten</w:t>
       </w:r>
       <w:bookmarkEnd w:id="4"/>
     </w:p>
     <w:p>
       <w:pPr>
         <w:pStyle w:val="Normaalweb"/>
-        <w:divId w:val="1722904862"/>
-        <w:rPr>
-          <w:lang w:val="nl-NL"/>
-        </w:rPr>
-      </w:pPr>
-      <w:r>
-        <w:rPr>
-          <w:lang w:val="nl-NL"/>
-        </w:rPr>
-        <w:t>Elk document is zelfstandig leesbaar. Elk belicht hetzelfde materiaal vanuit een andere hoek.</w:t>
+        <w:divId w:val="361521702"/>
+        <w:rPr>
+          <w:lang w:val="nl-NL"/>
+        </w:rPr>
+      </w:pPr>
+      <w:r>
+        <w:rPr>
+          <w:lang w:val="nl-NL"/>
+        </w:rPr>
+        <w:t>Elk document is zelfstandig leesbaar. Elk belicht hetzelfde materiaal vanuit een andere hoek — van de macro-architectuur van Europese verdragen tot de micro-uitvoering aan het loket.</w:t>
       </w:r>
     </w:p>
     <w:p>
       <w:pPr>
         <w:pStyle w:val="Kop3"/>
-        <w:divId w:val="1722904862"/>
-        <w:rPr>
-          <w:rFonts w:eastAsia="Times New Roman"/>
-          <w:lang w:val="nl-NL"/>
-        </w:rPr>
-      </w:pPr>
-      <w:bookmarkStart w:id="5" w:name="_Toc242858172"/>
+        <w:divId w:val="361521702"/>
+        <w:rPr>
+          <w:rFonts w:eastAsia="Times New Roman"/>
+          <w:lang w:val="nl-NL"/>
+        </w:rPr>
+      </w:pPr>
+      <w:bookmarkStart w:id="5" w:name="_Toc243921510"/>
+      <w:r>
+        <w:rPr>
+          <w:rFonts w:eastAsia="Times New Roman"/>
+          <w:lang w:val="nl-NL"/>
+        </w:rPr>
+        <w:t>Document 0 — De inleiding en leeswijzer</w:t>
+      </w:r>
+      <w:bookmarkEnd w:id="5"/>
+    </w:p>
+    <w:p>
+      <w:pPr>
+        <w:pStyle w:val="Normaalweb"/>
+        <w:divId w:val="361521702"/>
+        <w:rPr>
+          <w:lang w:val="nl-NL"/>
+        </w:rPr>
+      </w:pPr>
+      <w:r>
+        <w:rPr>
+          <w:lang w:val="nl-NL"/>
+        </w:rPr>
+        <w:t>Schetst het uitgangspunt, de kaders en de opbouw van de audit. Voor wie wil weten vanuit welke feitelijke positie dit dossier vertrekt en hoe de verschillende lagen op elkaar ingrijpen.</w:t>
+      </w:r>
+    </w:p>
+    <w:p>
+      <w:pPr>
+        <w:pStyle w:val="Kop3"/>
+        <w:divId w:val="361521702"/>
+        <w:rPr>
+          <w:rFonts w:eastAsia="Times New Roman"/>
+          <w:lang w:val="nl-NL"/>
+        </w:rPr>
+      </w:pPr>
+      <w:bookmarkStart w:id="6" w:name="_Toc243921511"/>
       <w:r>
         <w:rPr>
           <w:rFonts w:eastAsia="Times New Roman"/>
@@ -1683,33 +1809,33 @@
         </w:rPr>
         <w:t>Document A — De narratieve audit</w:t>
       </w:r>
-      <w:bookmarkEnd w:id="5"/>
+      <w:bookmarkEnd w:id="6"/>
     </w:p>
     <w:p>
       <w:pPr>
         <w:pStyle w:val="Normaalweb"/>
-        <w:divId w:val="1722904862"/>
-        <w:rPr>
-          <w:lang w:val="nl-NL"/>
-        </w:rPr>
-      </w:pPr>
-      <w:r>
-        <w:rPr>
-          <w:lang w:val="nl-NL"/>
-        </w:rPr>
-        <w:t>Vertelt het verhaal van de organisaties die samen het systeem vormen. Wat ze doen, waarom het misloopt, hoe het doorwerkt op de volgende schakel. Voor wie het geheel wil begrijpen zonder de onderliggende data te doorlopen.</w:t>
+        <w:divId w:val="361521702"/>
+        <w:rPr>
+          <w:lang w:val="nl-NL"/>
+        </w:rPr>
+      </w:pPr>
+      <w:r>
+        <w:rPr>
+          <w:lang w:val="nl-NL"/>
+        </w:rPr>
+        <w:t>Vertelt het verhaal van de organisaties die samen het systeem vormen. Wat ze doen, volgens welke logica ze werken, waar hun mandaat eindigt en hoe een beslissing doorwerkt op de volgende schakel. Voor wie het geheel wil begrijpen zonder direct de onderliggende data te doorlopen.</w:t>
       </w:r>
     </w:p>
     <w:p>
       <w:pPr>
         <w:pStyle w:val="Kop3"/>
-        <w:divId w:val="1722904862"/>
-        <w:rPr>
-          <w:rFonts w:eastAsia="Times New Roman"/>
-          <w:lang w:val="nl-NL"/>
-        </w:rPr>
-      </w:pPr>
-      <w:bookmarkStart w:id="6" w:name="_Toc242858173"/>
+        <w:divId w:val="361521702"/>
+        <w:rPr>
+          <w:rFonts w:eastAsia="Times New Roman"/>
+          <w:lang w:val="nl-NL"/>
+        </w:rPr>
+      </w:pPr>
+      <w:bookmarkStart w:id="7" w:name="_Toc243921512"/>
       <w:r>
         <w:rPr>
           <w:rFonts w:eastAsia="Times New Roman"/>
@@ -1717,67 +1843,68 @@
         </w:rPr>
         <w:t>Document B — De data-matrix</w:t>
       </w:r>
-      <w:bookmarkEnd w:id="6"/>
+      <w:bookmarkEnd w:id="7"/>
     </w:p>
     <w:p>
       <w:pPr>
         <w:pStyle w:val="Normaalweb"/>
-        <w:divId w:val="1722904862"/>
-        <w:rPr>
-          <w:lang w:val="nl-NL"/>
-        </w:rPr>
-      </w:pPr>
-      <w:r>
-        <w:rPr>
-          <w:lang w:val="nl-NL"/>
-        </w:rPr>
-        <w:t>Bevat alle feiten: datums, referentienummers, correspondentie, tijdlijnen. De ruwe laag waarop de andere documenten zijn gebouwd. Voor wie wil verifiëren wat er precies is gebeurd.</w:t>
+        <w:divId w:val="361521702"/>
+        <w:rPr>
+          <w:lang w:val="nl-NL"/>
+        </w:rPr>
+      </w:pPr>
+      <w:r>
+        <w:rPr>
+          <w:lang w:val="nl-NL"/>
+        </w:rPr>
+        <w:t>Bevat alle feiten in chronologische volgorde per organisatie: datums, referentienummers, correspondentie, beslissingen en primaire bronkoppelingen. De forensische bewijslaag waarop alle andere documenten zijn gebouwd. Voor wie wil verifiëren wat er precies is gebeurd.</w:t>
       </w:r>
     </w:p>
     <w:p>
       <w:pPr>
         <w:pStyle w:val="Kop3"/>
-        <w:divId w:val="1722904862"/>
-        <w:rPr>
-          <w:rFonts w:eastAsia="Times New Roman"/>
-          <w:lang w:val="nl-NL"/>
-        </w:rPr>
-      </w:pPr>
-      <w:bookmarkStart w:id="7" w:name="_Toc242858174"/>
-      <w:r>
-        <w:rPr>
-          <w:rFonts w:eastAsia="Times New Roman"/>
-          <w:lang w:val="nl-NL"/>
-        </w:rPr>
+        <w:divId w:val="361521702"/>
+        <w:rPr>
+          <w:rFonts w:eastAsia="Times New Roman"/>
+          <w:lang w:val="nl-NL"/>
+        </w:rPr>
+      </w:pPr>
+      <w:bookmarkStart w:id="8" w:name="_Toc243921513"/>
+      <w:r>
+        <w:rPr>
+          <w:rFonts w:eastAsia="Times New Roman"/>
+          <w:lang w:val="nl-NL"/>
+        </w:rPr>
+        <w:lastRenderedPageBreak/>
         <w:t>Document C — De visuele architectuur</w:t>
       </w:r>
-      <w:bookmarkEnd w:id="7"/>
+      <w:bookmarkEnd w:id="8"/>
     </w:p>
     <w:p>
       <w:pPr>
         <w:pStyle w:val="Normaalweb"/>
-        <w:divId w:val="1722904862"/>
-        <w:rPr>
-          <w:lang w:val="nl-NL"/>
-        </w:rPr>
-      </w:pPr>
-      <w:r>
-        <w:rPr>
-          <w:lang w:val="nl-NL"/>
-        </w:rPr>
-        <w:t>Toont de structuren, netwerken en datastromen die aan het falen ten grondslag liggen. Schema's en mechanismen in beeld — wat in tekst onzichtbaar blijft. Voor wie wil begrijpen waarom de feiten tot deze conclusies leiden.</w:t>
+        <w:divId w:val="361521702"/>
+        <w:rPr>
+          <w:lang w:val="nl-NL"/>
+        </w:rPr>
+      </w:pPr>
+      <w:r>
+        <w:rPr>
+          <w:lang w:val="nl-NL"/>
+        </w:rPr>
+        <w:t>Toont de structuren, netwerken en datastromen die aan het vastlopen ten grondslag liggen. Brengt de systeemdynamiek tussen België, Nederland en de Europese Unie in beeld: waar de knooppunten zitten, hoe terugkoppelingen werken en hoe het bovenliggende verdrag zich spiegelt in de uitvoering beneden aan het loket. Voor wie wil zien waarom de feiten tot deze uitkomst leiden.</w:t>
       </w:r>
     </w:p>
     <w:p>
       <w:pPr>
         <w:pStyle w:val="Kop3"/>
-        <w:divId w:val="1722904862"/>
-        <w:rPr>
-          <w:rFonts w:eastAsia="Times New Roman"/>
-          <w:lang w:val="nl-NL"/>
-        </w:rPr>
-      </w:pPr>
-      <w:bookmarkStart w:id="8" w:name="_Toc242858175"/>
+        <w:divId w:val="361521702"/>
+        <w:rPr>
+          <w:rFonts w:eastAsia="Times New Roman"/>
+          <w:lang w:val="nl-NL"/>
+        </w:rPr>
+      </w:pPr>
+      <w:bookmarkStart w:id="9" w:name="_Toc243921514"/>
       <w:r>
         <w:rPr>
           <w:rFonts w:eastAsia="Times New Roman"/>
@@ -1785,12 +1912,208 @@
         </w:rPr>
         <w:t>Document D — De synthese</w:t>
       </w:r>
-      <w:bookmarkEnd w:id="8"/>
+      <w:bookmarkEnd w:id="9"/>
     </w:p>
     <w:p>
       <w:pPr>
         <w:pStyle w:val="Normaalweb"/>
-        <w:divId w:val="1722904862"/>
+        <w:divId w:val="361521702"/>
+        <w:rPr>
+          <w:lang w:val="nl-NL"/>
+        </w:rPr>
+      </w:pPr>
+      <w:r>
+        <w:rPr>
+          <w:lang w:val="nl-NL"/>
+        </w:rPr>
+        <w:t>Brengt de patronen samen die uit het materiaal naar voren komen. Hoe de twee werkelijkheden — de fysieke en de administratieve — uit elkaar groeien, welke mechanismen steeds terugkeren en welke structurele sleutels het verschil maken tussen stilstand en oplossing. Voor wie de optelsom wil.</w:t>
+      </w:r>
+    </w:p>
+    <w:p>
+      <w:pPr>
+        <w:pStyle w:val="Kop3"/>
+        <w:divId w:val="361521702"/>
+        <w:rPr>
+          <w:rFonts w:eastAsia="Times New Roman"/>
+          <w:lang w:val="nl-NL"/>
+        </w:rPr>
+      </w:pPr>
+      <w:bookmarkStart w:id="10" w:name="_Toc243921515"/>
+      <w:r>
+        <w:rPr>
+          <w:rFonts w:eastAsia="Times New Roman"/>
+          <w:lang w:val="nl-NL"/>
+        </w:rPr>
+        <w:t>Document E — Het rechtenoverzicht</w:t>
+      </w:r>
+      <w:bookmarkEnd w:id="10"/>
+    </w:p>
+    <w:p>
+      <w:pPr>
+        <w:pStyle w:val="Normaalweb"/>
+        <w:divId w:val="361521702"/>
+        <w:rPr>
+          <w:lang w:val="nl-NL"/>
+        </w:rPr>
+      </w:pPr>
+      <w:r>
+        <w:rPr>
+          <w:lang w:val="nl-NL"/>
+        </w:rPr>
+        <w:t>Toetst per sociaal recht wat de wet belooft, waarom het bij een grensarbeider vastloopt in een Catch-22 of gesloten deur, welke alternatieve route er bestaat en wat het in de praktijk oplevert of nog laat aanslepen. Voor wie per recht de concrete status en uitwerking wil overzien.</w:t>
+      </w:r>
+    </w:p>
+    <w:p>
+      <w:pPr>
+        <w:pStyle w:val="Kop2"/>
+        <w:divId w:val="361521702"/>
+        <w:rPr>
+          <w:rFonts w:eastAsia="Times New Roman"/>
+          <w:lang w:val="nl-NL"/>
+        </w:rPr>
+      </w:pPr>
+      <w:bookmarkStart w:id="11" w:name="_Toc243921516"/>
+      <w:r>
+        <w:rPr>
+          <w:rFonts w:eastAsia="Times New Roman"/>
+          <w:lang w:val="nl-NL"/>
+        </w:rPr>
+        <w:t>Hoe je ze gebruikt</w:t>
+      </w:r>
+      <w:bookmarkEnd w:id="11"/>
+    </w:p>
+    <w:p>
+      <w:pPr>
+        <w:pStyle w:val="Normaalweb"/>
+        <w:divId w:val="361521702"/>
+        <w:rPr>
+          <w:lang w:val="nl-NL"/>
+        </w:rPr>
+      </w:pPr>
+      <w:r>
+        <w:rPr>
+          <w:lang w:val="nl-NL"/>
+        </w:rPr>
+        <w:t>Begin waar je begint. Elk document staat op zichzelf.</w:t>
+      </w:r>
+    </w:p>
+    <w:p>
+      <w:pPr>
+        <w:pStyle w:val="Normaalweb"/>
+        <w:divId w:val="361521702"/>
+        <w:rPr>
+          <w:lang w:val="nl-NL"/>
+        </w:rPr>
+      </w:pPr>
+      <w:r>
+        <w:rPr>
+          <w:lang w:val="nl-NL"/>
+        </w:rPr>
+        <w:t>Wie alleen het verhaal per organisatie wil: Document A. Wie de feiten en bewijsstukken wil: Document B. Wie het visuele systeemoverzicht wil: Document C. Wie de overkoepelende synthese wil: Document D. Wie per sociaal recht wil zien waar het vastloopt, wat er nog loopt en welke route overblijft: Document E.</w:t>
+      </w:r>
+    </w:p>
+    <w:p>
+      <w:pPr>
+        <w:pStyle w:val="Normaalweb"/>
+        <w:divId w:val="361521702"/>
+        <w:rPr>
+          <w:lang w:val="nl-NL"/>
+        </w:rPr>
+      </w:pPr>
+      <w:r>
+        <w:rPr>
+          <w:lang w:val="nl-NL"/>
+        </w:rPr>
+        <w:t>Wie alles in samenhang wil lezen, begint bij Document 0, gaat dan naar Document A voor de organisaties, naar Document B voor de onderliggende feiten, naar Document C voor de systeemarchitectuur, naar Document D voor de synthese, en sluit af met Document E voor het actuele rechtenoverzicht.</w:t>
+      </w:r>
+    </w:p>
+    <w:p>
+      <w:pPr>
+        <w:pStyle w:val="Kop2"/>
+        <w:divId w:val="361521702"/>
+        <w:rPr>
+          <w:rFonts w:eastAsia="Times New Roman"/>
+          <w:lang w:val="nl-NL"/>
+        </w:rPr>
+      </w:pPr>
+      <w:bookmarkStart w:id="12" w:name="_Toc243921517"/>
+      <w:r>
+        <w:rPr>
+          <w:rFonts w:eastAsia="Times New Roman"/>
+          <w:lang w:val="nl-NL"/>
+        </w:rPr>
+        <w:t>Voor wie</w:t>
+      </w:r>
+      <w:bookmarkEnd w:id="12"/>
+    </w:p>
+    <w:p>
+      <w:pPr>
+        <w:pStyle w:val="Normaalweb"/>
+        <w:divId w:val="361521702"/>
+        <w:rPr>
+          <w:lang w:val="nl-NL"/>
+        </w:rPr>
+      </w:pPr>
+      <w:r>
+        <w:rPr>
+          <w:lang w:val="nl-NL"/>
+        </w:rPr>
+        <w:t>Voor iedereen die wil begrijpen hoe een modern verzorgingsstelsel vastloopt op zijn eigen grenzen. Beleidsmakers, juristen, academici, journalisten, uitvoeringsambtenaren, en de grensarbeiders die hetzelfde meemaken.</w:t>
+      </w:r>
+    </w:p>
+    <w:p>
+      <w:pPr>
+        <w:pStyle w:val="Normaalweb"/>
+        <w:divId w:val="361521702"/>
+        <w:rPr>
+          <w:lang w:val="nl-NL"/>
+        </w:rPr>
+      </w:pPr>
+      <w:r>
+        <w:rPr>
+          <w:lang w:val="nl-NL"/>
+        </w:rPr>
+        <w:t>Het materiaal is openbaar en vrij te gebruiken. Wie eruit citeert, citeert Document B als de bron van de feiten.</w:t>
+      </w:r>
+    </w:p>
+    <w:p>
+      <w:pPr>
+        <w:pStyle w:val="Kop2"/>
+        <w:divId w:val="361521702"/>
+        <w:rPr>
+          <w:rFonts w:eastAsia="Times New Roman"/>
+          <w:lang w:val="nl-NL"/>
+        </w:rPr>
+      </w:pPr>
+      <w:bookmarkStart w:id="13" w:name="_Toc243921518"/>
+      <w:r>
+        <w:rPr>
+          <w:rFonts w:eastAsia="Times New Roman"/>
+          <w:lang w:val="nl-NL"/>
+        </w:rPr>
+        <w:t>Bron en verificatie</w:t>
+      </w:r>
+      <w:bookmarkEnd w:id="13"/>
+    </w:p>
+    <w:p>
+      <w:pPr>
+        <w:pStyle w:val="Normaalweb"/>
+        <w:divId w:val="361521702"/>
+        <w:rPr>
+          <w:lang w:val="nl-NL"/>
+        </w:rPr>
+      </w:pPr>
+      <w:r>
+        <w:rPr>
+          <w:lang w:val="nl-NL"/>
+        </w:rPr>
+        <w:t>Alle vastleggingen in dit project zijn gebaseerd op originele correspondentie, medische verslagen, referentienummers en logbestanden. Waar iets niet verifieerbaar is, wordt dat expliciet vermeld. Waar iets onduidelijk blijft, wordt dat als onduidelijk opgeschreven en niet als vermoeden gepresenteerd.</w:t>
+      </w:r>
+    </w:p>
+    <w:p>
+      <w:pPr>
+        <w:pStyle w:val="Normaalweb"/>
+        <w:divId w:val="361521702"/>
         <w:rPr>
           <w:lang w:val="nl-NL"/>
         </w:rPr>
@@ -1800,175 +2123,13 @@
           <w:lang w:val="nl-NL"/>
         </w:rPr>
         <w:lastRenderedPageBreak/>
-        <w:t>Brengt de patronen samen die uit het materiaal naar voren komen. Welke paradoxen komen terug, welke breuklijnen zijn systemisch, welke rol speelt de Europese Unie. Voor wie de optelsom wil.</w:t>
-      </w:r>
-    </w:p>
-    <w:p>
-      <w:pPr>
-        <w:pStyle w:val="Kop2"/>
-        <w:divId w:val="1722904862"/>
-        <w:rPr>
-          <w:rFonts w:eastAsia="Times New Roman"/>
-          <w:lang w:val="nl-NL"/>
-        </w:rPr>
-      </w:pPr>
-      <w:bookmarkStart w:id="9" w:name="_Toc242858176"/>
-      <w:r>
-        <w:rPr>
-          <w:rFonts w:eastAsia="Times New Roman"/>
-          <w:lang w:val="nl-NL"/>
-        </w:rPr>
-        <w:t>Hoe je ze gebruikt</w:t>
-      </w:r>
-      <w:bookmarkEnd w:id="9"/>
-    </w:p>
-    <w:p>
-      <w:pPr>
-        <w:pStyle w:val="Normaalweb"/>
-        <w:divId w:val="1722904862"/>
-        <w:rPr>
-          <w:lang w:val="nl-NL"/>
-        </w:rPr>
-      </w:pPr>
-      <w:r>
-        <w:rPr>
-          <w:lang w:val="nl-NL"/>
-        </w:rPr>
-        <w:t>Begin waar je begint. Elk document staat op zichzelf.</w:t>
-      </w:r>
-    </w:p>
-    <w:p>
-      <w:pPr>
-        <w:pStyle w:val="Normaalweb"/>
-        <w:divId w:val="1722904862"/>
-        <w:rPr>
-          <w:lang w:val="nl-NL"/>
-        </w:rPr>
-      </w:pPr>
-      <w:r>
-        <w:rPr>
-          <w:lang w:val="nl-NL"/>
-        </w:rPr>
-        <w:t>Wie alleen het verhaal wil: Document A. Wie de feiten wil: Document B. Wie het visuele overzicht wil: Document C. Wie de conclusie wil: Document D.</w:t>
-      </w:r>
-    </w:p>
-    <w:p>
-      <w:pPr>
-        <w:pStyle w:val="Normaalweb"/>
-        <w:divId w:val="1722904862"/>
-        <w:rPr>
-          <w:lang w:val="nl-NL"/>
-        </w:rPr>
-      </w:pPr>
-      <w:r>
-        <w:rPr>
-          <w:lang w:val="nl-NL"/>
-        </w:rPr>
-        <w:t>Wie alles wil lezen, begint bij Document 0, gaat dan naar Document A, dan naar Document B voor de onderliggende feiten, dan naar Document C voor de architectuur, en sluit af met Document D.</w:t>
-      </w:r>
-    </w:p>
-    <w:p>
-      <w:pPr>
-        <w:pStyle w:val="Kop2"/>
-        <w:divId w:val="1722904862"/>
-        <w:rPr>
-          <w:rFonts w:eastAsia="Times New Roman"/>
-          <w:lang w:val="nl-NL"/>
-        </w:rPr>
-      </w:pPr>
-      <w:bookmarkStart w:id="10" w:name="_Toc242858177"/>
-      <w:r>
-        <w:rPr>
-          <w:rFonts w:eastAsia="Times New Roman"/>
-          <w:lang w:val="nl-NL"/>
-        </w:rPr>
-        <w:t>Voor wie</w:t>
-      </w:r>
-      <w:bookmarkEnd w:id="10"/>
-    </w:p>
-    <w:p>
-      <w:pPr>
-        <w:pStyle w:val="Normaalweb"/>
-        <w:divId w:val="1722904862"/>
-        <w:rPr>
-          <w:lang w:val="nl-NL"/>
-        </w:rPr>
-      </w:pPr>
-      <w:r>
-        <w:rPr>
-          <w:lang w:val="nl-NL"/>
-        </w:rPr>
-        <w:t>Voor iedereen die wil begrijpen hoe een modern verzorgingsstelsel vastloopt op zijn eigen grenzen. Beleidsmakers, juristen, academici, journalisten, uitvoeringsambtenaren, en de grensarbeiders die hetzelfde meemaken.</w:t>
-      </w:r>
-    </w:p>
-    <w:p>
-      <w:pPr>
-        <w:pStyle w:val="Normaalweb"/>
-        <w:divId w:val="1722904862"/>
-        <w:rPr>
-          <w:lang w:val="nl-NL"/>
-        </w:rPr>
-      </w:pPr>
-      <w:r>
-        <w:rPr>
-          <w:lang w:val="nl-NL"/>
-        </w:rPr>
-        <w:t>Het materiaal is openbaar en vrij te gebruiken. Wie eruit citeert, citeert Document B als de bron van de feiten.</w:t>
-      </w:r>
-    </w:p>
-    <w:p>
-      <w:pPr>
-        <w:pStyle w:val="Kop2"/>
-        <w:divId w:val="1722904862"/>
-        <w:rPr>
-          <w:rFonts w:eastAsia="Times New Roman"/>
-          <w:lang w:val="nl-NL"/>
-        </w:rPr>
-      </w:pPr>
-      <w:bookmarkStart w:id="11" w:name="_Toc242858178"/>
-      <w:r>
-        <w:rPr>
-          <w:rFonts w:eastAsia="Times New Roman"/>
-          <w:lang w:val="nl-NL"/>
-        </w:rPr>
-        <w:t>Bron en verificatie</w:t>
-      </w:r>
-      <w:bookmarkEnd w:id="11"/>
-    </w:p>
-    <w:p>
-      <w:pPr>
-        <w:pStyle w:val="Normaalweb"/>
-        <w:divId w:val="1722904862"/>
-        <w:rPr>
-          <w:lang w:val="nl-NL"/>
-        </w:rPr>
-      </w:pPr>
-      <w:r>
-        <w:rPr>
-          <w:lang w:val="nl-NL"/>
-        </w:rPr>
-        <w:t>Alle vastleggingen in dit project zijn gebaseerd op originele correspondentie, medische verslagen, referentienummers en logbestanden. Waar iets niet verifieerbaar is, wordt dat expliciet vermeld. Waar iets onduidelijk blijft, wordt dat als onduidelijk opgeschreven en niet als vermoeden gepresenteerd.</w:t>
-      </w:r>
-    </w:p>
-    <w:p>
-      <w:pPr>
-        <w:pStyle w:val="Normaalweb"/>
-        <w:divId w:val="1722904862"/>
-        <w:rPr>
-          <w:lang w:val="nl-NL"/>
-        </w:rPr>
-      </w:pPr>
-      <w:r>
-        <w:rPr>
-          <w:lang w:val="nl-NL"/>
-        </w:rPr>
         <w:t>De feiten zijn vastgelegd in Document B. De andere documenten zijn daarop gebaseerd en volgen dezelfde bron.</w:t>
       </w:r>
     </w:p>
     <w:p>
       <w:pPr>
         <w:shd w:val="clear" w:color="auto" w:fill="FFFFFF"/>
-        <w:divId w:val="1374386450"/>
+        <w:divId w:val="165244202"/>
         <w:rPr>
           <w:szCs w:val="22"/>
           <w:lang w:val="nl-NL"/>
@@ -2220,7 +2381,7 @@
         <w:color w:val="808080"/>
         <w:sz w:val="18"/>
       </w:rPr>
-      <w:t>Eric Messa - Systeem-Audit</w:t>
+      <w:t>Systeem-Audit</w:t>
     </w:r>
     <w:r>
       <w:rPr>
@@ -2236,7 +2397,7 @@
         <w:sz w:val="18"/>
       </w:rPr>
       <w:tab/>
-      <w:t>Laatst gewijzigd: 14 oktober 2026, 08:14</w:t>
+      <w:t>Laatst gewijzigd: 26 oktober 2026, 15:36</w:t>
     </w:r>
   </w:p>
 </w:hdr>
@@ -2896,6 +3057,17 @@
       <w:spacing w:after="160"/>
     </w:pPr>
   </w:style>
+  <w:style w:type="paragraph" w:customStyle="1" w:styleId="marker">
+    <w:name w:val="marker"/>
+    <w:basedOn w:val="Standaard"/>
+    <w:pPr>
+      <w:spacing w:line="20" w:lineRule="exact"/>
+    </w:pPr>
+    <w:rPr>
+      <w:sz w:val="2"/>
+      <w:szCs w:val="2"/>
+    </w:rPr>
+  </w:style>
   <w:style w:type="paragraph" w:customStyle="1" w:styleId="subtitel">
     <w:name w:val="subtitel"/>
     <w:basedOn w:val="Standaard"/>
@@ -3001,8 +3173,12 @@
     <w:name w:val="entry"/>
     <w:basedOn w:val="Standaard"/>
     <w:pPr>
-      <w:spacing w:before="100" w:beforeAutospacing="1" w:after="80"/>
-    </w:pPr>
+      <w:spacing w:before="100" w:beforeAutospacing="1"/>
+    </w:pPr>
+    <w:rPr>
+      <w:sz w:val="21"/>
+      <w:szCs w:val="21"/>
+    </w:rPr>
   </w:style>
   <w:style w:type="paragraph" w:customStyle="1" w:styleId="datum">
     <w:name w:val="datum"/>
@@ -3028,6 +3204,18 @@
       <w:caps/>
     </w:rPr>
   </w:style>
+  <w:style w:type="paragraph" w:customStyle="1" w:styleId="entry-titel">
+    <w:name w:val="entry-titel"/>
+    <w:basedOn w:val="Standaard"/>
+    <w:pPr>
+      <w:spacing w:before="100" w:beforeAutospacing="1" w:after="100" w:afterAutospacing="1"/>
+    </w:pPr>
+    <w:rPr>
+      <w:b/>
+      <w:bCs/>
+      <w:caps/>
+    </w:rPr>
+  </w:style>
   <w:style w:type="paragraph" w:customStyle="1" w:styleId="opvolging">
     <w:name w:val="opvolging"/>
     <w:basedOn w:val="Standaard"/>
@@ -3039,6 +3227,31 @@
       <w:iCs/>
       <w:color w:val="555555"/>
     </w:rPr>
+  </w:style>
+  <w:style w:type="paragraph" w:customStyle="1" w:styleId="entry-in">
+    <w:name w:val="entry-in"/>
+    <w:basedOn w:val="Standaard"/>
+    <w:pPr>
+      <w:pBdr>
+        <w:left w:val="single" w:sz="24" w:space="0" w:color="1A3C6E"/>
+      </w:pBdr>
+      <w:shd w:val="clear" w:color="auto" w:fill="F0F4F9"/>
+      <w:spacing w:before="100" w:beforeAutospacing="1" w:after="100" w:afterAutospacing="1"/>
+      <w:ind w:right="1428"/>
+    </w:pPr>
+  </w:style>
+  <w:style w:type="paragraph" w:customStyle="1" w:styleId="entry-uit">
+    <w:name w:val="entry-uit"/>
+    <w:basedOn w:val="Standaard"/>
+    <w:pPr>
+      <w:pBdr>
+        <w:right w:val="single" w:sz="24" w:space="0" w:color="8B1E1E"/>
+      </w:pBdr>
+      <w:shd w:val="clear" w:color="auto" w:fill="FAF0F2"/>
+      <w:spacing w:before="100" w:beforeAutospacing="1" w:after="100" w:afterAutospacing="1"/>
+      <w:ind w:left="1428"/>
+      <w:jc w:val="right"/>
+    </w:pPr>
   </w:style>
   <w:style w:type="paragraph" w:customStyle="1" w:styleId="richting">
     <w:name w:val="richting"/>
@@ -3085,8 +3298,30 @@
       <w:i/>
       <w:iCs/>
       <w:color w:val="555555"/>
-      <w:sz w:val="21"/>
-      <w:szCs w:val="21"/>
+      <w:sz w:val="20"/>
+      <w:szCs w:val="20"/>
+    </w:rPr>
+  </w:style>
+  <w:style w:type="paragraph" w:customStyle="1" w:styleId="audit-bewijs">
+    <w:name w:val="audit-bewijs"/>
+    <w:basedOn w:val="Standaard"/>
+    <w:pPr>
+      <w:pBdr>
+        <w:top w:val="single" w:sz="6" w:space="1" w:color="DCD7CC"/>
+        <w:left w:val="single" w:sz="6" w:space="6" w:color="DCD7CC"/>
+        <w:bottom w:val="single" w:sz="6" w:space="1" w:color="DCD7CC"/>
+        <w:right w:val="single" w:sz="6" w:space="6" w:color="DCD7CC"/>
+      </w:pBdr>
+      <w:shd w:val="clear" w:color="auto" w:fill="F0EEE9"/>
+      <w:spacing w:before="100" w:beforeAutospacing="1" w:after="100" w:afterAutospacing="1"/>
+      <w:ind w:left="120"/>
+      <w:textAlignment w:val="baseline"/>
+    </w:pPr>
+    <w:rPr>
+      <w:rFonts w:ascii="Consolas" w:hAnsi="Consolas"/>
+      <w:color w:val="4A5568"/>
+      <w:sz w:val="17"/>
+      <w:szCs w:val="17"/>
     </w:rPr>
   </w:style>
   <w:style w:type="paragraph" w:customStyle="1" w:styleId="technisch-notice">
@@ -3378,7 +3613,7 @@
     <w:name w:val="titelblad"/>
     <w:basedOn w:val="Standaard"/>
     <w:pPr>
-      <w:spacing w:before="4000" w:after="100" w:afterAutospacing="1"/>
+      <w:spacing w:before="2600" w:after="100" w:afterAutospacing="1"/>
       <w:jc w:val="center"/>
     </w:pPr>
   </w:style>
@@ -3490,32 +3725,56 @@
       <w:spacing w:before="100" w:beforeAutospacing="1" w:after="100" w:afterAutospacing="1"/>
     </w:pPr>
   </w:style>
+  <w:style w:type="paragraph" w:customStyle="1" w:styleId="datum1">
+    <w:name w:val="datum1"/>
+    <w:basedOn w:val="Standaard"/>
+    <w:pPr>
+      <w:spacing w:after="160"/>
+    </w:pPr>
+    <w:rPr>
+      <w:b/>
+      <w:bCs/>
+      <w:color w:val="1A3C6E"/>
+    </w:rPr>
+  </w:style>
+  <w:style w:type="paragraph" w:customStyle="1" w:styleId="datum2">
+    <w:name w:val="datum2"/>
+    <w:basedOn w:val="Standaard"/>
+    <w:pPr>
+      <w:spacing w:after="160"/>
+    </w:pPr>
+    <w:rPr>
+      <w:b/>
+      <w:bCs/>
+      <w:color w:val="8B1E1E"/>
+    </w:rPr>
+  </w:style>
   <w:style w:type="paragraph" w:customStyle="1" w:styleId="ondertitel1">
     <w:name w:val="ondertitel1"/>
     <w:basedOn w:val="Standaard"/>
     <w:pPr>
-      <w:spacing w:after="1200"/>
+      <w:spacing w:after="800"/>
     </w:pPr>
     <w:rPr>
       <w:rFonts w:ascii="Aptos Display" w:hAnsi="Aptos Display"/>
       <w:color w:val="333333"/>
-      <w:sz w:val="36"/>
-      <w:szCs w:val="36"/>
+      <w:sz w:val="34"/>
+      <w:szCs w:val="34"/>
     </w:rPr>
   </w:style>
   <w:style w:type="paragraph" w:customStyle="1" w:styleId="documentaanduiding1">
     <w:name w:val="documentaanduiding1"/>
     <w:basedOn w:val="Standaard"/>
     <w:pPr>
-      <w:spacing w:after="1600"/>
+      <w:spacing w:after="1000"/>
     </w:pPr>
     <w:rPr>
       <w:rFonts w:ascii="Aptos Display" w:hAnsi="Aptos Display"/>
       <w:b/>
       <w:bCs/>
       <w:color w:val="8B1E1E"/>
-      <w:sz w:val="44"/>
-      <w:szCs w:val="44"/>
+      <w:sz w:val="42"/>
+      <w:szCs w:val="42"/>
     </w:rPr>
   </w:style>
   <w:style w:type="paragraph" w:customStyle="1" w:styleId="auteur1">
@@ -3540,32 +3799,56 @@
       <w:color w:val="555555"/>
     </w:rPr>
   </w:style>
+  <w:style w:type="paragraph" w:customStyle="1" w:styleId="datum3">
+    <w:name w:val="datum3"/>
+    <w:basedOn w:val="Standaard"/>
+    <w:pPr>
+      <w:spacing w:after="160"/>
+    </w:pPr>
+    <w:rPr>
+      <w:b/>
+      <w:bCs/>
+      <w:color w:val="1A3C6E"/>
+    </w:rPr>
+  </w:style>
+  <w:style w:type="paragraph" w:customStyle="1" w:styleId="datum4">
+    <w:name w:val="datum4"/>
+    <w:basedOn w:val="Standaard"/>
+    <w:pPr>
+      <w:spacing w:after="160"/>
+    </w:pPr>
+    <w:rPr>
+      <w:b/>
+      <w:bCs/>
+      <w:color w:val="8B1E1E"/>
+    </w:rPr>
+  </w:style>
   <w:style w:type="paragraph" w:customStyle="1" w:styleId="ondertitel2">
     <w:name w:val="ondertitel2"/>
     <w:basedOn w:val="Standaard"/>
     <w:pPr>
-      <w:spacing w:after="1200"/>
+      <w:spacing w:after="800"/>
     </w:pPr>
     <w:rPr>
       <w:rFonts w:ascii="Aptos Display" w:hAnsi="Aptos Display"/>
       <w:color w:val="333333"/>
-      <w:sz w:val="36"/>
-      <w:szCs w:val="36"/>
+      <w:sz w:val="34"/>
+      <w:szCs w:val="34"/>
     </w:rPr>
   </w:style>
   <w:style w:type="paragraph" w:customStyle="1" w:styleId="documentaanduiding2">
     <w:name w:val="documentaanduiding2"/>
     <w:basedOn w:val="Standaard"/>
     <w:pPr>
-      <w:spacing w:after="1600"/>
+      <w:spacing w:after="1000"/>
     </w:pPr>
     <w:rPr>
       <w:rFonts w:ascii="Aptos Display" w:hAnsi="Aptos Display"/>
       <w:b/>
       <w:bCs/>
       <w:color w:val="8B1E1E"/>
-      <w:sz w:val="44"/>
-      <w:szCs w:val="44"/>
+      <w:sz w:val="42"/>
+      <w:szCs w:val="42"/>
     </w:rPr>
   </w:style>
   <w:style w:type="paragraph" w:customStyle="1" w:styleId="auteur2">
@@ -3590,20 +3873,13 @@
       <w:color w:val="555555"/>
     </w:rPr>
   </w:style>
-  <w:style w:type="paragraph" w:customStyle="1" w:styleId="marker">
-    <w:name w:val="marker"/>
-    <w:basedOn w:val="Standaard"/>
-    <w:pPr>
-      <w:spacing w:after="160"/>
-    </w:pPr>
-  </w:style>
   <w:style w:type="paragraph" w:styleId="Koptekst">
     <w:name w:val="header"/>
     <w:basedOn w:val="Standaard"/>
     <w:link w:val="KoptekstChar"/>
     <w:uiPriority w:val="99"/>
     <w:unhideWhenUsed/>
-    <w:rsid w:val="00253642"/>
+    <w:rsid w:val="00607527"/>
     <w:pPr>
       <w:tabs>
         <w:tab w:val="center" w:pos="4536"/>
@@ -3616,7 +3892,7 @@
     <w:basedOn w:val="Standaardalinea-lettertype"/>
     <w:link w:val="Koptekst"/>
     <w:uiPriority w:val="99"/>
-    <w:rsid w:val="00253642"/>
+    <w:rsid w:val="00607527"/>
     <w:rPr>
       <w:rFonts w:eastAsiaTheme="minorEastAsia"/>
       <w:sz w:val="24"/>
@@ -3629,7 +3905,7 @@
     <w:link w:val="VoettekstChar"/>
     <w:uiPriority w:val="99"/>
     <w:unhideWhenUsed/>
-    <w:rsid w:val="00253642"/>
+    <w:rsid w:val="00607527"/>
     <w:pPr>
       <w:tabs>
         <w:tab w:val="center" w:pos="4536"/>
@@ -3642,11 +3918,27 @@
     <w:basedOn w:val="Standaardalinea-lettertype"/>
     <w:link w:val="Voettekst"/>
     <w:uiPriority w:val="99"/>
-    <w:rsid w:val="00253642"/>
+    <w:rsid w:val="00607527"/>
     <w:rPr>
       <w:rFonts w:eastAsiaTheme="minorEastAsia"/>
       <w:sz w:val="24"/>
       <w:szCs w:val="24"/>
+    </w:rPr>
+  </w:style>
+  <w:style w:type="paragraph" w:styleId="Inhopg1">
+    <w:name w:val="toc 1"/>
+    <w:basedOn w:val="Standaard"/>
+    <w:next w:val="Standaard"/>
+    <w:autoRedefine/>
+    <w:uiPriority w:val="39"/>
+    <w:semiHidden/>
+    <w:unhideWhenUsed/>
+    <w:rsid w:val="00607527"/>
+    <w:pPr>
+      <w:spacing w:after="30"/>
+    </w:pPr>
+    <w:rPr>
+      <w:sz w:val="20"/>
     </w:rPr>
   </w:style>
   <w:style w:type="paragraph" w:styleId="Inhopg2">
@@ -3656,11 +3948,14 @@
     <w:autoRedefine/>
     <w:uiPriority w:val="39"/>
     <w:unhideWhenUsed/>
-    <w:rsid w:val="00253642"/>
-    <w:pPr>
-      <w:spacing w:after="100"/>
+    <w:rsid w:val="00607527"/>
+    <w:pPr>
+      <w:spacing w:after="30"/>
       <w:ind w:left="220"/>
     </w:pPr>
+    <w:rPr>
+      <w:sz w:val="20"/>
+    </w:rPr>
   </w:style>
   <w:style w:type="paragraph" w:styleId="Inhopg3">
     <w:name w:val="toc 3"/>
@@ -3669,11 +3964,14 @@
     <w:autoRedefine/>
     <w:uiPriority w:val="39"/>
     <w:unhideWhenUsed/>
-    <w:rsid w:val="00253642"/>
-    <w:pPr>
-      <w:spacing w:after="100"/>
+    <w:rsid w:val="00607527"/>
+    <w:pPr>
+      <w:spacing w:after="30"/>
       <w:ind w:left="440"/>
     </w:pPr>
+    <w:rPr>
+      <w:sz w:val="20"/>
+    </w:rPr>
   </w:style>
 </w:styles>
 </file>

</xml_diff>

<commit_message>
Update Systeem-Audit NL 27-10-2026 09:53
</commit_message>
<xml_diff>
--- a/nl/docx/document-0.docx
+++ b/nl/docx/document-0.docx
@@ -7,7 +7,7 @@
         <w:spacing w:after="400"/>
         <w:jc w:val="center"/>
         <w:outlineLvl w:val="1"/>
-        <w:divId w:val="1068454602"/>
+        <w:divId w:val="86393778"/>
         <w:rPr>
           <w:rFonts w:ascii="Aptos Display" w:eastAsia="Times New Roman" w:hAnsi="Aptos Display"/>
           <w:b/>
@@ -36,7 +36,7 @@
     <w:p>
       <w:pPr>
         <w:pStyle w:val="ondertitel2"/>
-        <w:divId w:val="1068454602"/>
+        <w:divId w:val="86393778"/>
         <w:rPr>
           <w:lang w:val="nl-NL"/>
         </w:rPr>
@@ -51,7 +51,7 @@
     <w:p>
       <w:pPr>
         <w:pStyle w:val="documentaanduiding2"/>
-        <w:divId w:val="1068454602"/>
+        <w:divId w:val="86393778"/>
         <w:rPr>
           <w:lang w:val="nl-NL"/>
         </w:rPr>
@@ -66,7 +66,7 @@
     <w:p>
       <w:pPr>
         <w:pStyle w:val="auteur2"/>
-        <w:divId w:val="1068454602"/>
+        <w:divId w:val="86393778"/>
         <w:rPr>
           <w:lang w:val="nl-NL"/>
         </w:rPr>
@@ -82,16 +82,16 @@
       <w:pPr>
         <w:pStyle w:val="meta-lijn2"/>
         <w:ind w:left="800" w:right="800"/>
-        <w:divId w:val="1068454602"/>
-        <w:rPr>
-          <w:lang w:val="nl-NL"/>
-        </w:rPr>
-      </w:pPr>
-      <w:r>
-        <w:rPr>
-          <w:lang w:val="nl-NL"/>
-        </w:rPr>
-        <w:t>Versie bijgewerkt: 26 oktober 2026, 15:36</w:t>
+        <w:divId w:val="86393778"/>
+        <w:rPr>
+          <w:lang w:val="nl-NL"/>
+        </w:rPr>
+      </w:pPr>
+      <w:r>
+        <w:rPr>
+          <w:lang w:val="nl-NL"/>
+        </w:rPr>
+        <w:t>Versie bijgewerkt: 27 oktober 2026, 09:49</w:t>
       </w:r>
       <w:r>
         <w:br w:type="page"/>
@@ -100,13 +100,13 @@
     <w:p>
       <w:pPr>
         <w:pStyle w:val="Kop2"/>
-        <w:divId w:val="886840144"/>
-        <w:rPr>
-          <w:rFonts w:eastAsia="Times New Roman"/>
-          <w:lang w:val="nl-NL"/>
-        </w:rPr>
-      </w:pPr>
-      <w:bookmarkStart w:id="0" w:name="_Toc243921505"/>
+        <w:divId w:val="322203649"/>
+        <w:rPr>
+          <w:rFonts w:eastAsia="Times New Roman"/>
+          <w:lang w:val="nl-NL"/>
+        </w:rPr>
+      </w:pPr>
+      <w:bookmarkStart w:id="0" w:name="_Toc243987086"/>
       <w:r>
         <w:rPr>
           <w:rFonts w:eastAsia="Times New Roman"/>
@@ -122,7 +122,7 @@
         <w:tabs>
           <w:tab w:val="right" w:leader="dot" w:pos="9062"/>
         </w:tabs>
-        <w:divId w:val="886840144"/>
+        <w:divId w:val="322203649"/>
         <w:rPr>
           <w:rFonts w:asciiTheme="minorHAnsi" w:hAnsiTheme="minorHAnsi" w:cstheme="minorBidi"/>
           <w:noProof/>
@@ -173,7 +173,7 @@
         <w:rPr>
           <w:noProof/>
         </w:rPr>
-        <w:instrText xml:space="preserve"> PAGEREF _Toc243921505 \h </w:instrText>
+        <w:instrText xml:space="preserve"> PAGEREF _Toc243987086 \h </w:instrText>
       </w:r>
       <w:r>
         <w:rPr>
@@ -205,7 +205,7 @@
         <w:tabs>
           <w:tab w:val="right" w:leader="dot" w:pos="9062"/>
         </w:tabs>
-        <w:divId w:val="886840144"/>
+        <w:divId w:val="322203649"/>
         <w:rPr>
           <w:rFonts w:asciiTheme="minorHAnsi" w:hAnsiTheme="minorHAnsi" w:cstheme="minorBidi"/>
           <w:noProof/>
@@ -238,7 +238,7 @@
         <w:rPr>
           <w:noProof/>
         </w:rPr>
-        <w:instrText xml:space="preserve"> PAGEREF _Toc243921506 \h </w:instrText>
+        <w:instrText xml:space="preserve"> PAGEREF _Toc243987087 \h </w:instrText>
       </w:r>
       <w:r>
         <w:rPr>
@@ -270,7 +270,7 @@
         <w:tabs>
           <w:tab w:val="right" w:leader="dot" w:pos="9062"/>
         </w:tabs>
-        <w:divId w:val="886840144"/>
+        <w:divId w:val="322203649"/>
         <w:rPr>
           <w:rFonts w:asciiTheme="minorHAnsi" w:hAnsiTheme="minorHAnsi" w:cstheme="minorBidi"/>
           <w:noProof/>
@@ -303,7 +303,7 @@
         <w:rPr>
           <w:noProof/>
         </w:rPr>
-        <w:instrText xml:space="preserve"> PAGEREF _Toc243921507 \h </w:instrText>
+        <w:instrText xml:space="preserve"> PAGEREF _Toc243987088 \h </w:instrText>
       </w:r>
       <w:r>
         <w:rPr>
@@ -335,7 +335,7 @@
         <w:tabs>
           <w:tab w:val="right" w:leader="dot" w:pos="9062"/>
         </w:tabs>
-        <w:divId w:val="886840144"/>
+        <w:divId w:val="322203649"/>
         <w:rPr>
           <w:rFonts w:asciiTheme="minorHAnsi" w:hAnsiTheme="minorHAnsi" w:cstheme="minorBidi"/>
           <w:noProof/>
@@ -368,7 +368,7 @@
         <w:rPr>
           <w:noProof/>
         </w:rPr>
-        <w:instrText xml:space="preserve"> PAGEREF _Toc243921508 \h </w:instrText>
+        <w:instrText xml:space="preserve"> PAGEREF _Toc243987089 \h </w:instrText>
       </w:r>
       <w:r>
         <w:rPr>
@@ -400,7 +400,7 @@
         <w:tabs>
           <w:tab w:val="right" w:leader="dot" w:pos="9062"/>
         </w:tabs>
-        <w:divId w:val="886840144"/>
+        <w:divId w:val="322203649"/>
         <w:rPr>
           <w:rFonts w:asciiTheme="minorHAnsi" w:hAnsiTheme="minorHAnsi" w:cstheme="minorBidi"/>
           <w:noProof/>
@@ -433,7 +433,7 @@
         <w:rPr>
           <w:noProof/>
         </w:rPr>
-        <w:instrText xml:space="preserve"> PAGEREF _Toc243921509 \h </w:instrText>
+        <w:instrText xml:space="preserve"> PAGEREF _Toc243987090 \h </w:instrText>
       </w:r>
       <w:r>
         <w:rPr>
@@ -465,7 +465,7 @@
         <w:tabs>
           <w:tab w:val="right" w:leader="dot" w:pos="9062"/>
         </w:tabs>
-        <w:divId w:val="886840144"/>
+        <w:divId w:val="322203649"/>
         <w:rPr>
           <w:rFonts w:asciiTheme="minorHAnsi" w:hAnsiTheme="minorHAnsi" w:cstheme="minorBidi"/>
           <w:noProof/>
@@ -498,7 +498,7 @@
         <w:rPr>
           <w:noProof/>
         </w:rPr>
-        <w:instrText xml:space="preserve"> PAGEREF _Toc243921510 \h </w:instrText>
+        <w:instrText xml:space="preserve"> PAGEREF _Toc243987091 \h </w:instrText>
       </w:r>
       <w:r>
         <w:rPr>
@@ -530,7 +530,7 @@
         <w:tabs>
           <w:tab w:val="right" w:leader="dot" w:pos="9062"/>
         </w:tabs>
-        <w:divId w:val="886840144"/>
+        <w:divId w:val="322203649"/>
         <w:rPr>
           <w:rFonts w:asciiTheme="minorHAnsi" w:hAnsiTheme="minorHAnsi" w:cstheme="minorBidi"/>
           <w:noProof/>
@@ -563,7 +563,7 @@
         <w:rPr>
           <w:noProof/>
         </w:rPr>
-        <w:instrText xml:space="preserve"> PAGEREF _Toc243921511 \h </w:instrText>
+        <w:instrText xml:space="preserve"> PAGEREF _Toc243987092 \h </w:instrText>
       </w:r>
       <w:r>
         <w:rPr>
@@ -595,7 +595,7 @@
         <w:tabs>
           <w:tab w:val="right" w:leader="dot" w:pos="9062"/>
         </w:tabs>
-        <w:divId w:val="886840144"/>
+        <w:divId w:val="322203649"/>
         <w:rPr>
           <w:rFonts w:asciiTheme="minorHAnsi" w:hAnsiTheme="minorHAnsi" w:cstheme="minorBidi"/>
           <w:noProof/>
@@ -628,7 +628,7 @@
         <w:rPr>
           <w:noProof/>
         </w:rPr>
-        <w:instrText xml:space="preserve"> PAGEREF _Toc243921512 \h </w:instrText>
+        <w:instrText xml:space="preserve"> PAGEREF _Toc243987093 \h </w:instrText>
       </w:r>
       <w:r>
         <w:rPr>
@@ -660,7 +660,7 @@
         <w:tabs>
           <w:tab w:val="right" w:leader="dot" w:pos="9062"/>
         </w:tabs>
-        <w:divId w:val="886840144"/>
+        <w:divId w:val="322203649"/>
         <w:rPr>
           <w:rFonts w:asciiTheme="minorHAnsi" w:hAnsiTheme="minorHAnsi" w:cstheme="minorBidi"/>
           <w:noProof/>
@@ -693,7 +693,7 @@
         <w:rPr>
           <w:noProof/>
         </w:rPr>
-        <w:instrText xml:space="preserve"> PAGEREF _Toc243921513 \h </w:instrText>
+        <w:instrText xml:space="preserve"> PAGEREF _Toc243987094 \h </w:instrText>
       </w:r>
       <w:r>
         <w:rPr>
@@ -725,7 +725,7 @@
         <w:tabs>
           <w:tab w:val="right" w:leader="dot" w:pos="9062"/>
         </w:tabs>
-        <w:divId w:val="886840144"/>
+        <w:divId w:val="322203649"/>
         <w:rPr>
           <w:rFonts w:asciiTheme="minorHAnsi" w:hAnsiTheme="minorHAnsi" w:cstheme="minorBidi"/>
           <w:noProof/>
@@ -758,7 +758,7 @@
         <w:rPr>
           <w:noProof/>
         </w:rPr>
-        <w:instrText xml:space="preserve"> PAGEREF _Toc243921514 \h </w:instrText>
+        <w:instrText xml:space="preserve"> PAGEREF _Toc243987095 \h </w:instrText>
       </w:r>
       <w:r>
         <w:rPr>
@@ -790,7 +790,7 @@
         <w:tabs>
           <w:tab w:val="right" w:leader="dot" w:pos="9062"/>
         </w:tabs>
-        <w:divId w:val="886840144"/>
+        <w:divId w:val="322203649"/>
         <w:rPr>
           <w:rFonts w:asciiTheme="minorHAnsi" w:hAnsiTheme="minorHAnsi" w:cstheme="minorBidi"/>
           <w:noProof/>
@@ -823,7 +823,7 @@
         <w:rPr>
           <w:noProof/>
         </w:rPr>
-        <w:instrText xml:space="preserve"> PAGEREF _Toc243921515 \h </w:instrText>
+        <w:instrText xml:space="preserve"> PAGEREF _Toc243987096 \h </w:instrText>
       </w:r>
       <w:r>
         <w:rPr>
@@ -855,7 +855,7 @@
         <w:tabs>
           <w:tab w:val="right" w:leader="dot" w:pos="9062"/>
         </w:tabs>
-        <w:divId w:val="886840144"/>
+        <w:divId w:val="322203649"/>
         <w:rPr>
           <w:rFonts w:asciiTheme="minorHAnsi" w:hAnsiTheme="minorHAnsi" w:cstheme="minorBidi"/>
           <w:noProof/>
@@ -888,7 +888,7 @@
         <w:rPr>
           <w:noProof/>
         </w:rPr>
-        <w:instrText xml:space="preserve"> PAGEREF _Toc243921516 \h </w:instrText>
+        <w:instrText xml:space="preserve"> PAGEREF _Toc243987097 \h </w:instrText>
       </w:r>
       <w:r>
         <w:rPr>
@@ -920,7 +920,7 @@
         <w:tabs>
           <w:tab w:val="right" w:leader="dot" w:pos="9062"/>
         </w:tabs>
-        <w:divId w:val="886840144"/>
+        <w:divId w:val="322203649"/>
         <w:rPr>
           <w:rFonts w:asciiTheme="minorHAnsi" w:hAnsiTheme="minorHAnsi" w:cstheme="minorBidi"/>
           <w:noProof/>
@@ -953,7 +953,7 @@
         <w:rPr>
           <w:noProof/>
         </w:rPr>
-        <w:instrText xml:space="preserve"> PAGEREF _Toc243921517 \h </w:instrText>
+        <w:instrText xml:space="preserve"> PAGEREF _Toc243987098 \h </w:instrText>
       </w:r>
       <w:r>
         <w:rPr>
@@ -985,7 +985,7 @@
         <w:tabs>
           <w:tab w:val="right" w:leader="dot" w:pos="9062"/>
         </w:tabs>
-        <w:divId w:val="886840144"/>
+        <w:divId w:val="322203649"/>
         <w:rPr>
           <w:rFonts w:asciiTheme="minorHAnsi" w:hAnsiTheme="minorHAnsi" w:cstheme="minorBidi"/>
           <w:noProof/>
@@ -1018,7 +1018,7 @@
         <w:rPr>
           <w:noProof/>
         </w:rPr>
-        <w:instrText xml:space="preserve"> PAGEREF _Toc243921518 \h </w:instrText>
+        <w:instrText xml:space="preserve"> PAGEREF _Toc243987099 \h </w:instrText>
       </w:r>
       <w:r>
         <w:rPr>
@@ -1048,7 +1048,7 @@
       <w:pPr>
         <w:pStyle w:val="marker"/>
         <w:ind w:left="800" w:right="800"/>
-        <w:divId w:val="886840144"/>
+        <w:divId w:val="322203649"/>
         <w:rPr>
           <w:lang w:val="nl-NL"/>
         </w:rPr>
@@ -1066,13 +1066,13 @@
     <w:p>
       <w:pPr>
         <w:pStyle w:val="Kop2"/>
-        <w:divId w:val="361521702"/>
-        <w:rPr>
-          <w:rFonts w:eastAsia="Times New Roman"/>
-          <w:lang w:val="nl-NL"/>
-        </w:rPr>
-      </w:pPr>
-      <w:bookmarkStart w:id="1" w:name="_Toc243921506"/>
+        <w:divId w:val="469903011"/>
+        <w:rPr>
+          <w:rFonts w:eastAsia="Times New Roman"/>
+          <w:lang w:val="nl-NL"/>
+        </w:rPr>
+      </w:pPr>
+      <w:bookmarkStart w:id="1" w:name="_Toc243987087"/>
       <w:r>
         <w:rPr>
           <w:rFonts w:eastAsia="Times New Roman"/>
@@ -1085,7 +1085,7 @@
     <w:p>
       <w:pPr>
         <w:pStyle w:val="Normaalweb"/>
-        <w:divId w:val="361521702"/>
+        <w:divId w:val="469903011"/>
         <w:rPr>
           <w:lang w:val="nl-NL"/>
         </w:rPr>
@@ -1100,7 +1100,7 @@
     <w:p>
       <w:pPr>
         <w:pStyle w:val="Normaalweb"/>
-        <w:divId w:val="361521702"/>
+        <w:divId w:val="469903011"/>
         <w:rPr>
           <w:lang w:val="nl-NL"/>
         </w:rPr>
@@ -1128,7 +1128,7 @@
     <w:p>
       <w:pPr>
         <w:pStyle w:val="Normaalweb"/>
-        <w:divId w:val="361521702"/>
+        <w:divId w:val="469903011"/>
         <w:rPr>
           <w:lang w:val="nl-NL"/>
         </w:rPr>
@@ -1149,7 +1149,7 @@
     <w:p>
       <w:pPr>
         <w:pStyle w:val="Normaalweb"/>
-        <w:divId w:val="361521702"/>
+        <w:divId w:val="469903011"/>
         <w:rPr>
           <w:lang w:val="nl-NL"/>
         </w:rPr>
@@ -1196,7 +1196,7 @@
     <w:p>
       <w:pPr>
         <w:pStyle w:val="Normaalweb"/>
-        <w:divId w:val="361521702"/>
+        <w:divId w:val="469903011"/>
         <w:rPr>
           <w:lang w:val="nl-NL"/>
         </w:rPr>
@@ -1217,7 +1217,7 @@
     <w:p>
       <w:pPr>
         <w:pStyle w:val="Normaalweb"/>
-        <w:divId w:val="361521702"/>
+        <w:divId w:val="469903011"/>
         <w:rPr>
           <w:lang w:val="nl-NL"/>
         </w:rPr>
@@ -1252,7 +1252,7 @@
     <w:p>
       <w:pPr>
         <w:pStyle w:val="Normaalweb"/>
-        <w:divId w:val="361521702"/>
+        <w:divId w:val="469903011"/>
         <w:rPr>
           <w:lang w:val="nl-NL"/>
         </w:rPr>
@@ -1279,7 +1279,7 @@
     <w:p>
       <w:pPr>
         <w:pStyle w:val="Normaalweb"/>
-        <w:divId w:val="361521702"/>
+        <w:divId w:val="469903011"/>
         <w:rPr>
           <w:lang w:val="nl-NL"/>
         </w:rPr>
@@ -1307,7 +1307,7 @@
     <w:p>
       <w:pPr>
         <w:pStyle w:val="Normaalweb"/>
-        <w:divId w:val="361521702"/>
+        <w:divId w:val="469903011"/>
         <w:rPr>
           <w:lang w:val="nl-NL"/>
         </w:rPr>
@@ -1322,7 +1322,7 @@
     <w:p>
       <w:pPr>
         <w:pStyle w:val="Normaalweb"/>
-        <w:divId w:val="361521702"/>
+        <w:divId w:val="469903011"/>
         <w:rPr>
           <w:lang w:val="nl-NL"/>
         </w:rPr>
@@ -1388,7 +1388,7 @@
     <w:p>
       <w:pPr>
         <w:pStyle w:val="Normaalweb"/>
-        <w:divId w:val="361521702"/>
+        <w:divId w:val="469903011"/>
         <w:rPr>
           <w:lang w:val="nl-NL"/>
         </w:rPr>
@@ -1403,7 +1403,7 @@
     <w:p>
       <w:pPr>
         <w:pStyle w:val="Normaalweb"/>
-        <w:divId w:val="361521702"/>
+        <w:divId w:val="469903011"/>
         <w:rPr>
           <w:lang w:val="nl-NL"/>
         </w:rPr>
@@ -1431,7 +1431,7 @@
     <w:p>
       <w:pPr>
         <w:pStyle w:val="Normaalweb"/>
-        <w:divId w:val="361521702"/>
+        <w:divId w:val="469903011"/>
         <w:rPr>
           <w:lang w:val="nl-NL"/>
         </w:rPr>
@@ -1446,7 +1446,7 @@
     <w:p>
       <w:pPr>
         <w:pStyle w:val="Normaalweb"/>
-        <w:divId w:val="361521702"/>
+        <w:divId w:val="469903011"/>
         <w:rPr>
           <w:lang w:val="nl-NL"/>
         </w:rPr>
@@ -1461,7 +1461,7 @@
     <w:p>
       <w:pPr>
         <w:pStyle w:val="Normaalweb"/>
-        <w:divId w:val="361521702"/>
+        <w:divId w:val="469903011"/>
         <w:rPr>
           <w:lang w:val="nl-NL"/>
         </w:rPr>
@@ -1476,25 +1476,25 @@
     <w:p>
       <w:pPr>
         <w:spacing w:before="300" w:after="200"/>
-        <w:divId w:val="361521702"/>
-        <w:rPr>
-          <w:rFonts w:eastAsia="Times New Roman"/>
-          <w:lang w:val="nl-NL"/>
-        </w:rPr>
-      </w:pPr>
-      <w:r>
-        <w:rPr>
-          <w:rFonts w:eastAsia="Times New Roman"/>
-          <w:lang w:val="nl-NL"/>
-        </w:rPr>
-        <w:pict w14:anchorId="067F8BC6">
+        <w:divId w:val="469903011"/>
+        <w:rPr>
+          <w:rFonts w:eastAsia="Times New Roman"/>
+          <w:lang w:val="nl-NL"/>
+        </w:rPr>
+      </w:pPr>
+      <w:r>
+        <w:rPr>
+          <w:rFonts w:eastAsia="Times New Roman"/>
+          <w:lang w:val="nl-NL"/>
+        </w:rPr>
+        <w:pict w14:anchorId="556B841F">
           <v:rect id="_x0000_i1025" style="width:0;height:1.5pt" o:hralign="center" o:hrstd="t" o:hr="t" fillcolor="#a0a0a0" stroked="f"/>
         </w:pict>
       </w:r>
     </w:p>
     <w:p>
       <w:pPr>
-        <w:divId w:val="1598903379"/>
+        <w:divId w:val="185557048"/>
         <w:rPr>
           <w:color w:val="555555"/>
           <w:sz w:val="20"/>
@@ -1533,7 +1533,7 @@
     </w:p>
     <w:p>
       <w:pPr>
-        <w:divId w:val="1598903379"/>
+        <w:divId w:val="185557048"/>
         <w:rPr>
           <w:color w:val="555555"/>
           <w:sz w:val="20"/>
@@ -1563,7 +1563,7 @@
     </w:p>
     <w:p>
       <w:pPr>
-        <w:divId w:val="1598903379"/>
+        <w:divId w:val="185557048"/>
         <w:rPr>
           <w:color w:val="555555"/>
           <w:sz w:val="20"/>
@@ -1595,7 +1595,7 @@
     <w:p>
       <w:pPr>
         <w:ind w:left="800" w:right="800"/>
-        <w:divId w:val="1598903379"/>
+        <w:divId w:val="185557048"/>
         <w:rPr>
           <w:color w:val="555555"/>
           <w:sz w:val="20"/>
@@ -1629,13 +1629,13 @@
     <w:p>
       <w:pPr>
         <w:pStyle w:val="Kop2"/>
-        <w:divId w:val="361521702"/>
-        <w:rPr>
-          <w:rFonts w:eastAsia="Times New Roman"/>
-          <w:lang w:val="nl-NL"/>
-        </w:rPr>
-      </w:pPr>
-      <w:bookmarkStart w:id="2" w:name="_Toc243921507"/>
+        <w:divId w:val="469903011"/>
+        <w:rPr>
+          <w:rFonts w:eastAsia="Times New Roman"/>
+          <w:lang w:val="nl-NL"/>
+        </w:rPr>
+      </w:pPr>
+      <w:bookmarkStart w:id="2" w:name="_Toc243987088"/>
       <w:r>
         <w:rPr>
           <w:rFonts w:eastAsia="Times New Roman"/>
@@ -1648,7 +1648,7 @@
     <w:p>
       <w:pPr>
         <w:pStyle w:val="Normaalweb"/>
-        <w:divId w:val="361521702"/>
+        <w:divId w:val="469903011"/>
         <w:rPr>
           <w:lang w:val="nl-NL"/>
         </w:rPr>
@@ -1663,7 +1663,7 @@
     <w:p>
       <w:pPr>
         <w:pStyle w:val="Normaalweb"/>
-        <w:divId w:val="361521702"/>
+        <w:divId w:val="469903011"/>
         <w:rPr>
           <w:lang w:val="nl-NL"/>
         </w:rPr>
@@ -1678,7 +1678,7 @@
     <w:p>
       <w:pPr>
         <w:pStyle w:val="Normaalweb"/>
-        <w:divId w:val="361521702"/>
+        <w:divId w:val="469903011"/>
         <w:rPr>
           <w:lang w:val="nl-NL"/>
         </w:rPr>
@@ -1693,13 +1693,13 @@
     <w:p>
       <w:pPr>
         <w:pStyle w:val="Kop2"/>
-        <w:divId w:val="361521702"/>
-        <w:rPr>
-          <w:rFonts w:eastAsia="Times New Roman"/>
-          <w:lang w:val="nl-NL"/>
-        </w:rPr>
-      </w:pPr>
-      <w:bookmarkStart w:id="3" w:name="_Toc243921508"/>
+        <w:divId w:val="469903011"/>
+        <w:rPr>
+          <w:rFonts w:eastAsia="Times New Roman"/>
+          <w:lang w:val="nl-NL"/>
+        </w:rPr>
+      </w:pPr>
+      <w:bookmarkStart w:id="3" w:name="_Toc243987089"/>
       <w:r>
         <w:rPr>
           <w:rFonts w:eastAsia="Times New Roman"/>
@@ -1712,7 +1712,7 @@
     <w:p>
       <w:pPr>
         <w:pStyle w:val="Normaalweb"/>
-        <w:divId w:val="361521702"/>
+        <w:divId w:val="469903011"/>
         <w:rPr>
           <w:lang w:val="nl-NL"/>
         </w:rPr>
@@ -1727,13 +1727,13 @@
     <w:p>
       <w:pPr>
         <w:pStyle w:val="Kop2"/>
-        <w:divId w:val="361521702"/>
-        <w:rPr>
-          <w:rFonts w:eastAsia="Times New Roman"/>
-          <w:lang w:val="nl-NL"/>
-        </w:rPr>
-      </w:pPr>
-      <w:bookmarkStart w:id="4" w:name="_Toc243921509"/>
+        <w:divId w:val="469903011"/>
+        <w:rPr>
+          <w:rFonts w:eastAsia="Times New Roman"/>
+          <w:lang w:val="nl-NL"/>
+        </w:rPr>
+      </w:pPr>
+      <w:bookmarkStart w:id="4" w:name="_Toc243987090"/>
       <w:r>
         <w:rPr>
           <w:rFonts w:eastAsia="Times New Roman"/>
@@ -1746,7 +1746,7 @@
     <w:p>
       <w:pPr>
         <w:pStyle w:val="Normaalweb"/>
-        <w:divId w:val="361521702"/>
+        <w:divId w:val="469903011"/>
         <w:rPr>
           <w:lang w:val="nl-NL"/>
         </w:rPr>
@@ -1761,13 +1761,13 @@
     <w:p>
       <w:pPr>
         <w:pStyle w:val="Kop3"/>
-        <w:divId w:val="361521702"/>
-        <w:rPr>
-          <w:rFonts w:eastAsia="Times New Roman"/>
-          <w:lang w:val="nl-NL"/>
-        </w:rPr>
-      </w:pPr>
-      <w:bookmarkStart w:id="5" w:name="_Toc243921510"/>
+        <w:divId w:val="469903011"/>
+        <w:rPr>
+          <w:rFonts w:eastAsia="Times New Roman"/>
+          <w:lang w:val="nl-NL"/>
+        </w:rPr>
+      </w:pPr>
+      <w:bookmarkStart w:id="5" w:name="_Toc243987091"/>
       <w:r>
         <w:rPr>
           <w:rFonts w:eastAsia="Times New Roman"/>
@@ -1780,7 +1780,7 @@
     <w:p>
       <w:pPr>
         <w:pStyle w:val="Normaalweb"/>
-        <w:divId w:val="361521702"/>
+        <w:divId w:val="469903011"/>
         <w:rPr>
           <w:lang w:val="nl-NL"/>
         </w:rPr>
@@ -1795,13 +1795,13 @@
     <w:p>
       <w:pPr>
         <w:pStyle w:val="Kop3"/>
-        <w:divId w:val="361521702"/>
-        <w:rPr>
-          <w:rFonts w:eastAsia="Times New Roman"/>
-          <w:lang w:val="nl-NL"/>
-        </w:rPr>
-      </w:pPr>
-      <w:bookmarkStart w:id="6" w:name="_Toc243921511"/>
+        <w:divId w:val="469903011"/>
+        <w:rPr>
+          <w:rFonts w:eastAsia="Times New Roman"/>
+          <w:lang w:val="nl-NL"/>
+        </w:rPr>
+      </w:pPr>
+      <w:bookmarkStart w:id="6" w:name="_Toc243987092"/>
       <w:r>
         <w:rPr>
           <w:rFonts w:eastAsia="Times New Roman"/>
@@ -1814,7 +1814,7 @@
     <w:p>
       <w:pPr>
         <w:pStyle w:val="Normaalweb"/>
-        <w:divId w:val="361521702"/>
+        <w:divId w:val="469903011"/>
         <w:rPr>
           <w:lang w:val="nl-NL"/>
         </w:rPr>
@@ -1829,13 +1829,13 @@
     <w:p>
       <w:pPr>
         <w:pStyle w:val="Kop3"/>
-        <w:divId w:val="361521702"/>
-        <w:rPr>
-          <w:rFonts w:eastAsia="Times New Roman"/>
-          <w:lang w:val="nl-NL"/>
-        </w:rPr>
-      </w:pPr>
-      <w:bookmarkStart w:id="7" w:name="_Toc243921512"/>
+        <w:divId w:val="469903011"/>
+        <w:rPr>
+          <w:rFonts w:eastAsia="Times New Roman"/>
+          <w:lang w:val="nl-NL"/>
+        </w:rPr>
+      </w:pPr>
+      <w:bookmarkStart w:id="7" w:name="_Toc243987093"/>
       <w:r>
         <w:rPr>
           <w:rFonts w:eastAsia="Times New Roman"/>
@@ -1848,7 +1848,7 @@
     <w:p>
       <w:pPr>
         <w:pStyle w:val="Normaalweb"/>
-        <w:divId w:val="361521702"/>
+        <w:divId w:val="469903011"/>
         <w:rPr>
           <w:lang w:val="nl-NL"/>
         </w:rPr>
@@ -1863,13 +1863,13 @@
     <w:p>
       <w:pPr>
         <w:pStyle w:val="Kop3"/>
-        <w:divId w:val="361521702"/>
-        <w:rPr>
-          <w:rFonts w:eastAsia="Times New Roman"/>
-          <w:lang w:val="nl-NL"/>
-        </w:rPr>
-      </w:pPr>
-      <w:bookmarkStart w:id="8" w:name="_Toc243921513"/>
+        <w:divId w:val="469903011"/>
+        <w:rPr>
+          <w:rFonts w:eastAsia="Times New Roman"/>
+          <w:lang w:val="nl-NL"/>
+        </w:rPr>
+      </w:pPr>
+      <w:bookmarkStart w:id="8" w:name="_Toc243987094"/>
       <w:r>
         <w:rPr>
           <w:rFonts w:eastAsia="Times New Roman"/>
@@ -1883,7 +1883,7 @@
     <w:p>
       <w:pPr>
         <w:pStyle w:val="Normaalweb"/>
-        <w:divId w:val="361521702"/>
+        <w:divId w:val="469903011"/>
         <w:rPr>
           <w:lang w:val="nl-NL"/>
         </w:rPr>
@@ -1898,13 +1898,13 @@
     <w:p>
       <w:pPr>
         <w:pStyle w:val="Kop3"/>
-        <w:divId w:val="361521702"/>
-        <w:rPr>
-          <w:rFonts w:eastAsia="Times New Roman"/>
-          <w:lang w:val="nl-NL"/>
-        </w:rPr>
-      </w:pPr>
-      <w:bookmarkStart w:id="9" w:name="_Toc243921514"/>
+        <w:divId w:val="469903011"/>
+        <w:rPr>
+          <w:rFonts w:eastAsia="Times New Roman"/>
+          <w:lang w:val="nl-NL"/>
+        </w:rPr>
+      </w:pPr>
+      <w:bookmarkStart w:id="9" w:name="_Toc243987095"/>
       <w:r>
         <w:rPr>
           <w:rFonts w:eastAsia="Times New Roman"/>
@@ -1917,7 +1917,7 @@
     <w:p>
       <w:pPr>
         <w:pStyle w:val="Normaalweb"/>
-        <w:divId w:val="361521702"/>
+        <w:divId w:val="469903011"/>
         <w:rPr>
           <w:lang w:val="nl-NL"/>
         </w:rPr>
@@ -1932,13 +1932,13 @@
     <w:p>
       <w:pPr>
         <w:pStyle w:val="Kop3"/>
-        <w:divId w:val="361521702"/>
-        <w:rPr>
-          <w:rFonts w:eastAsia="Times New Roman"/>
-          <w:lang w:val="nl-NL"/>
-        </w:rPr>
-      </w:pPr>
-      <w:bookmarkStart w:id="10" w:name="_Toc243921515"/>
+        <w:divId w:val="469903011"/>
+        <w:rPr>
+          <w:rFonts w:eastAsia="Times New Roman"/>
+          <w:lang w:val="nl-NL"/>
+        </w:rPr>
+      </w:pPr>
+      <w:bookmarkStart w:id="10" w:name="_Toc243987096"/>
       <w:r>
         <w:rPr>
           <w:rFonts w:eastAsia="Times New Roman"/>
@@ -1951,7 +1951,7 @@
     <w:p>
       <w:pPr>
         <w:pStyle w:val="Normaalweb"/>
-        <w:divId w:val="361521702"/>
+        <w:divId w:val="469903011"/>
         <w:rPr>
           <w:lang w:val="nl-NL"/>
         </w:rPr>
@@ -1966,13 +1966,13 @@
     <w:p>
       <w:pPr>
         <w:pStyle w:val="Kop2"/>
-        <w:divId w:val="361521702"/>
-        <w:rPr>
-          <w:rFonts w:eastAsia="Times New Roman"/>
-          <w:lang w:val="nl-NL"/>
-        </w:rPr>
-      </w:pPr>
-      <w:bookmarkStart w:id="11" w:name="_Toc243921516"/>
+        <w:divId w:val="469903011"/>
+        <w:rPr>
+          <w:rFonts w:eastAsia="Times New Roman"/>
+          <w:lang w:val="nl-NL"/>
+        </w:rPr>
+      </w:pPr>
+      <w:bookmarkStart w:id="11" w:name="_Toc243987097"/>
       <w:r>
         <w:rPr>
           <w:rFonts w:eastAsia="Times New Roman"/>
@@ -1985,7 +1985,7 @@
     <w:p>
       <w:pPr>
         <w:pStyle w:val="Normaalweb"/>
-        <w:divId w:val="361521702"/>
+        <w:divId w:val="469903011"/>
         <w:rPr>
           <w:lang w:val="nl-NL"/>
         </w:rPr>
@@ -2000,7 +2000,7 @@
     <w:p>
       <w:pPr>
         <w:pStyle w:val="Normaalweb"/>
-        <w:divId w:val="361521702"/>
+        <w:divId w:val="469903011"/>
         <w:rPr>
           <w:lang w:val="nl-NL"/>
         </w:rPr>
@@ -2015,7 +2015,7 @@
     <w:p>
       <w:pPr>
         <w:pStyle w:val="Normaalweb"/>
-        <w:divId w:val="361521702"/>
+        <w:divId w:val="469903011"/>
         <w:rPr>
           <w:lang w:val="nl-NL"/>
         </w:rPr>
@@ -2030,13 +2030,13 @@
     <w:p>
       <w:pPr>
         <w:pStyle w:val="Kop2"/>
-        <w:divId w:val="361521702"/>
-        <w:rPr>
-          <w:rFonts w:eastAsia="Times New Roman"/>
-          <w:lang w:val="nl-NL"/>
-        </w:rPr>
-      </w:pPr>
-      <w:bookmarkStart w:id="12" w:name="_Toc243921517"/>
+        <w:divId w:val="469903011"/>
+        <w:rPr>
+          <w:rFonts w:eastAsia="Times New Roman"/>
+          <w:lang w:val="nl-NL"/>
+        </w:rPr>
+      </w:pPr>
+      <w:bookmarkStart w:id="12" w:name="_Toc243987098"/>
       <w:r>
         <w:rPr>
           <w:rFonts w:eastAsia="Times New Roman"/>
@@ -2049,7 +2049,7 @@
     <w:p>
       <w:pPr>
         <w:pStyle w:val="Normaalweb"/>
-        <w:divId w:val="361521702"/>
+        <w:divId w:val="469903011"/>
         <w:rPr>
           <w:lang w:val="nl-NL"/>
         </w:rPr>
@@ -2064,7 +2064,7 @@
     <w:p>
       <w:pPr>
         <w:pStyle w:val="Normaalweb"/>
-        <w:divId w:val="361521702"/>
+        <w:divId w:val="469903011"/>
         <w:rPr>
           <w:lang w:val="nl-NL"/>
         </w:rPr>
@@ -2079,13 +2079,13 @@
     <w:p>
       <w:pPr>
         <w:pStyle w:val="Kop2"/>
-        <w:divId w:val="361521702"/>
-        <w:rPr>
-          <w:rFonts w:eastAsia="Times New Roman"/>
-          <w:lang w:val="nl-NL"/>
-        </w:rPr>
-      </w:pPr>
-      <w:bookmarkStart w:id="13" w:name="_Toc243921518"/>
+        <w:divId w:val="469903011"/>
+        <w:rPr>
+          <w:rFonts w:eastAsia="Times New Roman"/>
+          <w:lang w:val="nl-NL"/>
+        </w:rPr>
+      </w:pPr>
+      <w:bookmarkStart w:id="13" w:name="_Toc243987099"/>
       <w:r>
         <w:rPr>
           <w:rFonts w:eastAsia="Times New Roman"/>
@@ -2098,7 +2098,7 @@
     <w:p>
       <w:pPr>
         <w:pStyle w:val="Normaalweb"/>
-        <w:divId w:val="361521702"/>
+        <w:divId w:val="469903011"/>
         <w:rPr>
           <w:lang w:val="nl-NL"/>
         </w:rPr>
@@ -2113,23 +2113,22 @@
     <w:p>
       <w:pPr>
         <w:pStyle w:val="Normaalweb"/>
-        <w:divId w:val="361521702"/>
-        <w:rPr>
-          <w:lang w:val="nl-NL"/>
-        </w:rPr>
-      </w:pPr>
-      <w:r>
-        <w:rPr>
-          <w:lang w:val="nl-NL"/>
-        </w:rPr>
-        <w:lastRenderedPageBreak/>
+        <w:divId w:val="469903011"/>
+        <w:rPr>
+          <w:lang w:val="nl-NL"/>
+        </w:rPr>
+      </w:pPr>
+      <w:r>
+        <w:rPr>
+          <w:lang w:val="nl-NL"/>
+        </w:rPr>
         <w:t>De feiten zijn vastgelegd in Document B. De andere documenten zijn daarop gebaseerd en volgen dezelfde bron.</w:t>
       </w:r>
     </w:p>
     <w:p>
       <w:pPr>
         <w:shd w:val="clear" w:color="auto" w:fill="FFFFFF"/>
-        <w:divId w:val="165244202"/>
+        <w:divId w:val="1617365834"/>
         <w:rPr>
           <w:szCs w:val="22"/>
           <w:lang w:val="nl-NL"/>
@@ -2262,7 +2261,7 @@
         <w:color w:val="808080"/>
         <w:sz w:val="18"/>
       </w:rPr>
-      <w:t>1</w:t>
+      <w:t>7</w:t>
     </w:r>
     <w:r>
       <w:rPr>
@@ -2305,7 +2304,7 @@
         <w:color w:val="808080"/>
         <w:sz w:val="18"/>
       </w:rPr>
-      <w:t>3</w:t>
+      <w:t>7</w:t>
     </w:r>
     <w:r>
       <w:rPr>
@@ -2397,7 +2396,7 @@
         <w:sz w:val="18"/>
       </w:rPr>
       <w:tab/>
-      <w:t>Laatst gewijzigd: 26 oktober 2026, 15:36</w:t>
+      <w:t>Laatst gewijzigd: 27 oktober 2026, 09:49</w:t>
     </w:r>
   </w:p>
 </w:hdr>
@@ -3879,7 +3878,7 @@
     <w:link w:val="KoptekstChar"/>
     <w:uiPriority w:val="99"/>
     <w:unhideWhenUsed/>
-    <w:rsid w:val="00607527"/>
+    <w:rsid w:val="00A00B92"/>
     <w:pPr>
       <w:tabs>
         <w:tab w:val="center" w:pos="4536"/>
@@ -3892,7 +3891,7 @@
     <w:basedOn w:val="Standaardalinea-lettertype"/>
     <w:link w:val="Koptekst"/>
     <w:uiPriority w:val="99"/>
-    <w:rsid w:val="00607527"/>
+    <w:rsid w:val="00A00B92"/>
     <w:rPr>
       <w:rFonts w:eastAsiaTheme="minorEastAsia"/>
       <w:sz w:val="24"/>
@@ -3905,7 +3904,7 @@
     <w:link w:val="VoettekstChar"/>
     <w:uiPriority w:val="99"/>
     <w:unhideWhenUsed/>
-    <w:rsid w:val="00607527"/>
+    <w:rsid w:val="00A00B92"/>
     <w:pPr>
       <w:tabs>
         <w:tab w:val="center" w:pos="4536"/>
@@ -3918,7 +3917,7 @@
     <w:basedOn w:val="Standaardalinea-lettertype"/>
     <w:link w:val="Voettekst"/>
     <w:uiPriority w:val="99"/>
-    <w:rsid w:val="00607527"/>
+    <w:rsid w:val="00A00B92"/>
     <w:rPr>
       <w:rFonts w:eastAsiaTheme="minorEastAsia"/>
       <w:sz w:val="24"/>
@@ -3933,7 +3932,7 @@
     <w:uiPriority w:val="39"/>
     <w:semiHidden/>
     <w:unhideWhenUsed/>
-    <w:rsid w:val="00607527"/>
+    <w:rsid w:val="00A00B92"/>
     <w:pPr>
       <w:spacing w:after="30"/>
     </w:pPr>
@@ -3948,7 +3947,7 @@
     <w:autoRedefine/>
     <w:uiPriority w:val="39"/>
     <w:unhideWhenUsed/>
-    <w:rsid w:val="00607527"/>
+    <w:rsid w:val="00A00B92"/>
     <w:pPr>
       <w:spacing w:after="30"/>
       <w:ind w:left="220"/>
@@ -3964,7 +3963,7 @@
     <w:autoRedefine/>
     <w:uiPriority w:val="39"/>
     <w:unhideWhenUsed/>
-    <w:rsid w:val="00607527"/>
+    <w:rsid w:val="00A00B92"/>
     <w:pPr>
       <w:spacing w:after="30"/>
       <w:ind w:left="440"/>

</xml_diff>

<commit_message>
Update Systeem-Audit NL 31-10-2026 00:37
</commit_message>
<xml_diff>
--- a/nl/docx/document-0.docx
+++ b/nl/docx/document-0.docx
@@ -7,7 +7,7 @@
         <w:spacing w:after="400"/>
         <w:jc w:val="center"/>
         <w:outlineLvl w:val="1"/>
-        <w:divId w:val="1748839094"/>
+        <w:divId w:val="434251830"/>
         <w:rPr>
           <w:rFonts w:ascii="Aptos Display" w:eastAsia="Times New Roman" w:hAnsi="Aptos Display"/>
           <w:b/>
@@ -36,7 +36,7 @@
     <w:p>
       <w:pPr>
         <w:pStyle w:val="ondertitel2"/>
-        <w:divId w:val="1748839094"/>
+        <w:divId w:val="434251830"/>
         <w:rPr>
           <w:lang w:val="nl-NL"/>
         </w:rPr>
@@ -51,7 +51,7 @@
     <w:p>
       <w:pPr>
         <w:pStyle w:val="documentaanduiding2"/>
-        <w:divId w:val="1748839094"/>
+        <w:divId w:val="434251830"/>
         <w:rPr>
           <w:lang w:val="nl-NL"/>
         </w:rPr>
@@ -66,7 +66,7 @@
     <w:p>
       <w:pPr>
         <w:pStyle w:val="auteur2"/>
-        <w:divId w:val="1748839094"/>
+        <w:divId w:val="434251830"/>
         <w:rPr>
           <w:lang w:val="nl-NL"/>
         </w:rPr>
@@ -82,16 +82,16 @@
       <w:pPr>
         <w:pStyle w:val="meta-lijn2"/>
         <w:ind w:left="800" w:right="800"/>
-        <w:divId w:val="1748839094"/>
-        <w:rPr>
-          <w:lang w:val="nl-NL"/>
-        </w:rPr>
-      </w:pPr>
-      <w:r>
-        <w:rPr>
-          <w:lang w:val="nl-NL"/>
-        </w:rPr>
-        <w:t>Versie bijgewerkt: 31 oktober 2026, 00:09</w:t>
+        <w:divId w:val="434251830"/>
+        <w:rPr>
+          <w:lang w:val="nl-NL"/>
+        </w:rPr>
+      </w:pPr>
+      <w:r>
+        <w:rPr>
+          <w:lang w:val="nl-NL"/>
+        </w:rPr>
+        <w:t>Versie bijgewerkt: 31 oktober 2026, 00:36</w:t>
       </w:r>
       <w:r>
         <w:br w:type="page"/>
@@ -100,13 +100,13 @@
     <w:p>
       <w:pPr>
         <w:pStyle w:val="Kop2"/>
-        <w:divId w:val="711808701"/>
+        <w:divId w:val="855730367"/>
         <w:rPr>
           <w:rFonts w:eastAsia="Times New Roman"/>
           <w:lang w:val="nl-NL"/>
         </w:rPr>
       </w:pPr>
-      <w:bookmarkStart w:id="0" w:name="_Toc244297917"/>
+      <w:bookmarkStart w:id="0" w:name="_Toc244299534"/>
       <w:r>
         <w:rPr>
           <w:rFonts w:eastAsia="Times New Roman"/>
@@ -122,7 +122,7 @@
         <w:tabs>
           <w:tab w:val="right" w:leader="dot" w:pos="9062"/>
         </w:tabs>
-        <w:divId w:val="711808701"/>
+        <w:divId w:val="855730367"/>
         <w:rPr>
           <w:rFonts w:asciiTheme="minorHAnsi" w:hAnsiTheme="minorHAnsi" w:cstheme="minorBidi"/>
           <w:noProof/>
@@ -173,7 +173,7 @@
         <w:rPr>
           <w:noProof/>
         </w:rPr>
-        <w:instrText xml:space="preserve"> PAGEREF _Toc244297917 \h </w:instrText>
+        <w:instrText xml:space="preserve"> PAGEREF _Toc244299534 \h </w:instrText>
       </w:r>
       <w:r>
         <w:rPr>
@@ -205,7 +205,7 @@
         <w:tabs>
           <w:tab w:val="right" w:leader="dot" w:pos="9062"/>
         </w:tabs>
-        <w:divId w:val="711808701"/>
+        <w:divId w:val="855730367"/>
         <w:rPr>
           <w:rFonts w:asciiTheme="minorHAnsi" w:hAnsiTheme="minorHAnsi" w:cstheme="minorBidi"/>
           <w:noProof/>
@@ -238,7 +238,7 @@
         <w:rPr>
           <w:noProof/>
         </w:rPr>
-        <w:instrText xml:space="preserve"> PAGEREF _Toc244297918 \h </w:instrText>
+        <w:instrText xml:space="preserve"> PAGEREF _Toc244299535 \h </w:instrText>
       </w:r>
       <w:r>
         <w:rPr>
@@ -270,7 +270,7 @@
         <w:tabs>
           <w:tab w:val="right" w:leader="dot" w:pos="9062"/>
         </w:tabs>
-        <w:divId w:val="711808701"/>
+        <w:divId w:val="855730367"/>
         <w:rPr>
           <w:rFonts w:asciiTheme="minorHAnsi" w:hAnsiTheme="minorHAnsi" w:cstheme="minorBidi"/>
           <w:noProof/>
@@ -303,7 +303,7 @@
         <w:rPr>
           <w:noProof/>
         </w:rPr>
-        <w:instrText xml:space="preserve"> PAGEREF _Toc244297919 \h </w:instrText>
+        <w:instrText xml:space="preserve"> PAGEREF _Toc244299536 \h </w:instrText>
       </w:r>
       <w:r>
         <w:rPr>
@@ -320,7 +320,7 @@
         <w:rPr>
           <w:noProof/>
         </w:rPr>
-        <w:t>10</w:t>
+        <w:t>12</w:t>
       </w:r>
       <w:r>
         <w:rPr>
@@ -335,7 +335,7 @@
         <w:tabs>
           <w:tab w:val="right" w:leader="dot" w:pos="9062"/>
         </w:tabs>
-        <w:divId w:val="711808701"/>
+        <w:divId w:val="855730367"/>
         <w:rPr>
           <w:rFonts w:asciiTheme="minorHAnsi" w:hAnsiTheme="minorHAnsi" w:cstheme="minorBidi"/>
           <w:noProof/>
@@ -368,7 +368,7 @@
         <w:rPr>
           <w:noProof/>
         </w:rPr>
-        <w:instrText xml:space="preserve"> PAGEREF _Toc244297920 \h </w:instrText>
+        <w:instrText xml:space="preserve"> PAGEREF _Toc244299537 \h </w:instrText>
       </w:r>
       <w:r>
         <w:rPr>
@@ -385,7 +385,7 @@
         <w:rPr>
           <w:noProof/>
         </w:rPr>
-        <w:t>10</w:t>
+        <w:t>12</w:t>
       </w:r>
       <w:r>
         <w:rPr>
@@ -400,7 +400,7 @@
         <w:tabs>
           <w:tab w:val="right" w:leader="dot" w:pos="9062"/>
         </w:tabs>
-        <w:divId w:val="711808701"/>
+        <w:divId w:val="855730367"/>
         <w:rPr>
           <w:rFonts w:asciiTheme="minorHAnsi" w:hAnsiTheme="minorHAnsi" w:cstheme="minorBidi"/>
           <w:noProof/>
@@ -433,7 +433,7 @@
         <w:rPr>
           <w:noProof/>
         </w:rPr>
-        <w:instrText xml:space="preserve"> PAGEREF _Toc244297921 \h </w:instrText>
+        <w:instrText xml:space="preserve"> PAGEREF _Toc244299538 \h </w:instrText>
       </w:r>
       <w:r>
         <w:rPr>
@@ -450,7 +450,7 @@
         <w:rPr>
           <w:noProof/>
         </w:rPr>
-        <w:t>10</w:t>
+        <w:t>12</w:t>
       </w:r>
       <w:r>
         <w:rPr>
@@ -465,7 +465,7 @@
         <w:tabs>
           <w:tab w:val="right" w:leader="dot" w:pos="9062"/>
         </w:tabs>
-        <w:divId w:val="711808701"/>
+        <w:divId w:val="855730367"/>
         <w:rPr>
           <w:rFonts w:asciiTheme="minorHAnsi" w:hAnsiTheme="minorHAnsi" w:cstheme="minorBidi"/>
           <w:noProof/>
@@ -498,7 +498,7 @@
         <w:rPr>
           <w:noProof/>
         </w:rPr>
-        <w:instrText xml:space="preserve"> PAGEREF _Toc244297922 \h </w:instrText>
+        <w:instrText xml:space="preserve"> PAGEREF _Toc244299539 \h </w:instrText>
       </w:r>
       <w:r>
         <w:rPr>
@@ -515,7 +515,7 @@
         <w:rPr>
           <w:noProof/>
         </w:rPr>
-        <w:t>10</w:t>
+        <w:t>12</w:t>
       </w:r>
       <w:r>
         <w:rPr>
@@ -530,7 +530,7 @@
         <w:tabs>
           <w:tab w:val="right" w:leader="dot" w:pos="9062"/>
         </w:tabs>
-        <w:divId w:val="711808701"/>
+        <w:divId w:val="855730367"/>
         <w:rPr>
           <w:rFonts w:asciiTheme="minorHAnsi" w:hAnsiTheme="minorHAnsi" w:cstheme="minorBidi"/>
           <w:noProof/>
@@ -563,7 +563,7 @@
         <w:rPr>
           <w:noProof/>
         </w:rPr>
-        <w:instrText xml:space="preserve"> PAGEREF _Toc244297923 \h </w:instrText>
+        <w:instrText xml:space="preserve"> PAGEREF _Toc244299540 \h </w:instrText>
       </w:r>
       <w:r>
         <w:rPr>
@@ -580,7 +580,7 @@
         <w:rPr>
           <w:noProof/>
         </w:rPr>
-        <w:t>10</w:t>
+        <w:t>12</w:t>
       </w:r>
       <w:r>
         <w:rPr>
@@ -595,7 +595,7 @@
         <w:tabs>
           <w:tab w:val="right" w:leader="dot" w:pos="9062"/>
         </w:tabs>
-        <w:divId w:val="711808701"/>
+        <w:divId w:val="855730367"/>
         <w:rPr>
           <w:rFonts w:asciiTheme="minorHAnsi" w:hAnsiTheme="minorHAnsi" w:cstheme="minorBidi"/>
           <w:noProof/>
@@ -628,7 +628,7 @@
         <w:rPr>
           <w:noProof/>
         </w:rPr>
-        <w:instrText xml:space="preserve"> PAGEREF _Toc244297924 \h </w:instrText>
+        <w:instrText xml:space="preserve"> PAGEREF _Toc244299541 \h </w:instrText>
       </w:r>
       <w:r>
         <w:rPr>
@@ -645,7 +645,7 @@
         <w:rPr>
           <w:noProof/>
         </w:rPr>
-        <w:t>10</w:t>
+        <w:t>12</w:t>
       </w:r>
       <w:r>
         <w:rPr>
@@ -660,7 +660,7 @@
         <w:tabs>
           <w:tab w:val="right" w:leader="dot" w:pos="9062"/>
         </w:tabs>
-        <w:divId w:val="711808701"/>
+        <w:divId w:val="855730367"/>
         <w:rPr>
           <w:rFonts w:asciiTheme="minorHAnsi" w:hAnsiTheme="minorHAnsi" w:cstheme="minorBidi"/>
           <w:noProof/>
@@ -693,7 +693,7 @@
         <w:rPr>
           <w:noProof/>
         </w:rPr>
-        <w:instrText xml:space="preserve"> PAGEREF _Toc244297925 \h </w:instrText>
+        <w:instrText xml:space="preserve"> PAGEREF _Toc244299542 \h </w:instrText>
       </w:r>
       <w:r>
         <w:rPr>
@@ -710,7 +710,7 @@
         <w:rPr>
           <w:noProof/>
         </w:rPr>
-        <w:t>11</w:t>
+        <w:t>13</w:t>
       </w:r>
       <w:r>
         <w:rPr>
@@ -725,7 +725,7 @@
         <w:tabs>
           <w:tab w:val="right" w:leader="dot" w:pos="9062"/>
         </w:tabs>
-        <w:divId w:val="711808701"/>
+        <w:divId w:val="855730367"/>
         <w:rPr>
           <w:rFonts w:asciiTheme="minorHAnsi" w:hAnsiTheme="minorHAnsi" w:cstheme="minorBidi"/>
           <w:noProof/>
@@ -758,7 +758,7 @@
         <w:rPr>
           <w:noProof/>
         </w:rPr>
-        <w:instrText xml:space="preserve"> PAGEREF _Toc244297926 \h </w:instrText>
+        <w:instrText xml:space="preserve"> PAGEREF _Toc244299543 \h </w:instrText>
       </w:r>
       <w:r>
         <w:rPr>
@@ -775,7 +775,7 @@
         <w:rPr>
           <w:noProof/>
         </w:rPr>
-        <w:t>11</w:t>
+        <w:t>13</w:t>
       </w:r>
       <w:r>
         <w:rPr>
@@ -790,7 +790,7 @@
         <w:tabs>
           <w:tab w:val="right" w:leader="dot" w:pos="9062"/>
         </w:tabs>
-        <w:divId w:val="711808701"/>
+        <w:divId w:val="855730367"/>
         <w:rPr>
           <w:rFonts w:asciiTheme="minorHAnsi" w:hAnsiTheme="minorHAnsi" w:cstheme="minorBidi"/>
           <w:noProof/>
@@ -823,7 +823,7 @@
         <w:rPr>
           <w:noProof/>
         </w:rPr>
-        <w:instrText xml:space="preserve"> PAGEREF _Toc244297927 \h </w:instrText>
+        <w:instrText xml:space="preserve"> PAGEREF _Toc244299544 \h </w:instrText>
       </w:r>
       <w:r>
         <w:rPr>
@@ -840,7 +840,7 @@
         <w:rPr>
           <w:noProof/>
         </w:rPr>
-        <w:t>11</w:t>
+        <w:t>13</w:t>
       </w:r>
       <w:r>
         <w:rPr>
@@ -855,7 +855,7 @@
         <w:tabs>
           <w:tab w:val="right" w:leader="dot" w:pos="9062"/>
         </w:tabs>
-        <w:divId w:val="711808701"/>
+        <w:divId w:val="855730367"/>
         <w:rPr>
           <w:rFonts w:asciiTheme="minorHAnsi" w:hAnsiTheme="minorHAnsi" w:cstheme="minorBidi"/>
           <w:noProof/>
@@ -888,7 +888,7 @@
         <w:rPr>
           <w:noProof/>
         </w:rPr>
-        <w:instrText xml:space="preserve"> PAGEREF _Toc244297928 \h </w:instrText>
+        <w:instrText xml:space="preserve"> PAGEREF _Toc244299545 \h </w:instrText>
       </w:r>
       <w:r>
         <w:rPr>
@@ -905,7 +905,7 @@
         <w:rPr>
           <w:noProof/>
         </w:rPr>
-        <w:t>11</w:t>
+        <w:t>13</w:t>
       </w:r>
       <w:r>
         <w:rPr>
@@ -920,7 +920,7 @@
         <w:tabs>
           <w:tab w:val="right" w:leader="dot" w:pos="9062"/>
         </w:tabs>
-        <w:divId w:val="711808701"/>
+        <w:divId w:val="855730367"/>
         <w:rPr>
           <w:rFonts w:asciiTheme="minorHAnsi" w:hAnsiTheme="minorHAnsi" w:cstheme="minorBidi"/>
           <w:noProof/>
@@ -953,7 +953,7 @@
         <w:rPr>
           <w:noProof/>
         </w:rPr>
-        <w:instrText xml:space="preserve"> PAGEREF _Toc244297929 \h </w:instrText>
+        <w:instrText xml:space="preserve"> PAGEREF _Toc244299546 \h </w:instrText>
       </w:r>
       <w:r>
         <w:rPr>
@@ -970,7 +970,7 @@
         <w:rPr>
           <w:noProof/>
         </w:rPr>
-        <w:t>11</w:t>
+        <w:t>13</w:t>
       </w:r>
       <w:r>
         <w:rPr>
@@ -985,7 +985,7 @@
         <w:tabs>
           <w:tab w:val="right" w:leader="dot" w:pos="9062"/>
         </w:tabs>
-        <w:divId w:val="711808701"/>
+        <w:divId w:val="855730367"/>
         <w:rPr>
           <w:rFonts w:asciiTheme="minorHAnsi" w:hAnsiTheme="minorHAnsi" w:cstheme="minorBidi"/>
           <w:noProof/>
@@ -1018,7 +1018,7 @@
         <w:rPr>
           <w:noProof/>
         </w:rPr>
-        <w:instrText xml:space="preserve"> PAGEREF _Toc244297930 \h </w:instrText>
+        <w:instrText xml:space="preserve"> PAGEREF _Toc244299547 \h </w:instrText>
       </w:r>
       <w:r>
         <w:rPr>
@@ -1035,7 +1035,7 @@
         <w:rPr>
           <w:noProof/>
         </w:rPr>
-        <w:t>11</w:t>
+        <w:t>13</w:t>
       </w:r>
       <w:r>
         <w:rPr>
@@ -1048,7 +1048,7 @@
       <w:pPr>
         <w:pStyle w:val="marker"/>
         <w:ind w:left="800" w:right="800"/>
-        <w:divId w:val="711808701"/>
+        <w:divId w:val="855730367"/>
         <w:rPr>
           <w:lang w:val="nl-NL"/>
         </w:rPr>
@@ -1066,13 +1066,13 @@
     <w:p>
       <w:pPr>
         <w:pStyle w:val="Kop2"/>
-        <w:divId w:val="556356295"/>
+        <w:divId w:val="1351294750"/>
         <w:rPr>
           <w:rFonts w:eastAsia="Times New Roman"/>
           <w:lang w:val="nl-NL"/>
         </w:rPr>
       </w:pPr>
-      <w:bookmarkStart w:id="1" w:name="_Toc244297918"/>
+      <w:bookmarkStart w:id="1" w:name="_Toc244299535"/>
       <w:r>
         <w:rPr>
           <w:rFonts w:eastAsia="Times New Roman"/>
@@ -1085,31 +1085,147 @@
     <w:p>
       <w:pPr>
         <w:pStyle w:val="Normaalweb"/>
-        <w:divId w:val="556356295"/>
-        <w:rPr>
-          <w:lang w:val="nl-NL"/>
-        </w:rPr>
-      </w:pPr>
-      <w:r>
-        <w:rPr>
-          <w:lang w:val="nl-NL"/>
-        </w:rPr>
-        <w:t>Dit dossier begint niet bij een grens. Het begint bij liefde en werk.</w:t>
+        <w:divId w:val="1351294750"/>
+        <w:rPr>
+          <w:lang w:val="nl-NL"/>
+        </w:rPr>
+      </w:pPr>
+      <w:r>
+        <w:rPr>
+          <w:lang w:val="nl-NL"/>
+        </w:rPr>
+        <w:t>Dit dossier begint niet bij een grens. Het begint bij vlucht, werk en liefde.</w:t>
       </w:r>
     </w:p>
     <w:p>
       <w:pPr>
         <w:pStyle w:val="Normaalweb"/>
-        <w:divId w:val="556356295"/>
-        <w:rPr>
-          <w:lang w:val="nl-NL"/>
-        </w:rPr>
-      </w:pPr>
-      <w:r>
-        <w:rPr>
-          <w:lang w:val="nl-NL"/>
-        </w:rPr>
-        <w:t>Een man uit Lombardije. Hij voelt zich Lombard, niet Italiaan. Een vrouw uit de Elzas. Zij voelt zich Elzasser, niet Française of Duitse. Twee grensgevallen. Ze ontmoeten elkaar in de Elzas. Zij is verpleegster. Hij is arbeider. Hij raakt gewond, belandt in het ziekenhuis, en daar begint het. Ze trouwen. Wanneer het bedrijf waar hij werkt naar België verhuist, verhuizen zij mee. Niet voor avontuur. Voor werk. Het is het begin van de jaren zeventig. De Europese Economische Gemeenschap telt zes lidstaten.</w:t>
+        <w:divId w:val="1351294750"/>
+        <w:rPr>
+          <w:lang w:val="nl-NL"/>
+        </w:rPr>
+      </w:pPr>
+      <w:r>
+        <w:rPr>
+          <w:lang w:val="nl-NL"/>
+        </w:rPr>
+        <w:t xml:space="preserve">Voor de Tweede Wereldoorlog ontvlucht een Noord-Italiaanse familie haar geboortestreek in Lombardije en vestigt zich als migranten onder de rook van Parijs, in Bondy — toen nog gelegen in het oude Franse departement </w:t>
+      </w:r>
+      <w:r>
+        <w:rPr>
+          <w:rStyle w:val="Nadruk"/>
+          <w:lang w:val="nl-NL"/>
+        </w:rPr>
+        <w:t>Seine (75)</w:t>
+      </w:r>
+      <w:r>
+        <w:rPr>
+          <w:lang w:val="nl-NL"/>
+        </w:rPr>
+        <w:t xml:space="preserve"> in </w:t>
+      </w:r>
+      <w:r>
+        <w:rPr>
+          <w:rStyle w:val="Nadruk"/>
+          <w:lang w:val="nl-NL"/>
+        </w:rPr>
+        <w:t>Île-de-France</w:t>
+      </w:r>
+      <w:r>
+        <w:rPr>
+          <w:lang w:val="nl-NL"/>
+        </w:rPr>
+        <w:t xml:space="preserve">, dat pas in 1968 zal worden opgeknipt tot </w:t>
+      </w:r>
+      <w:r>
+        <w:rPr>
+          <w:rStyle w:val="Nadruk"/>
+          <w:lang w:val="nl-NL"/>
+        </w:rPr>
+        <w:t>Seine-Saint-Denis (93)</w:t>
+      </w:r>
+      <w:r>
+        <w:rPr>
+          <w:lang w:val="nl-NL"/>
+        </w:rPr>
+        <w:t>. Daar wordt in 1940 de vader geboren, in een wereld waarin de Verenigde Naties (1945) en de Europese Economische Gemeenschap (1958) nog niet bestaan. Hoewel zijn wieg op Franse bodem staat, telt die geboortegrond op papier niet mee: door het bloedrecht (</w:t>
+      </w:r>
+      <w:r>
+        <w:rPr>
+          <w:rStyle w:val="Nadruk"/>
+          <w:lang w:val="nl-NL"/>
+        </w:rPr>
+        <w:t>ius sanguinis</w:t>
+      </w:r>
+      <w:r>
+        <w:rPr>
+          <w:lang w:val="nl-NL"/>
+        </w:rPr>
+        <w:t>) is hij voor de wet uitsluitend onderdaan van het toenmalige Koninkrijk Italië, dat in 1946 verandert in de Italiaanse Republiek. Na de oorlog keert he</w:t>
+      </w:r>
+      <w:r>
+        <w:rPr>
+          <w:lang w:val="nl-NL"/>
+        </w:rPr>
+        <w:t xml:space="preserve">t gezin terug naar de familiewortels in Vertova, een dorp in de bergvallei </w:t>
+      </w:r>
+      <w:r>
+        <w:rPr>
+          <w:rStyle w:val="Nadruk"/>
+          <w:lang w:val="nl-NL"/>
+        </w:rPr>
+        <w:t>Val Seriana</w:t>
+      </w:r>
+      <w:r>
+        <w:rPr>
+          <w:lang w:val="nl-NL"/>
+        </w:rPr>
+        <w:t xml:space="preserve"> in de provincie Bergamo (Lombardije). Hij groeit er op en voelt zich Lombard, geen Italiaan. Aan de andere kant van de Alpen wordt in 1948 de moeder geboren in Sélestat (departement </w:t>
+      </w:r>
+      <w:r>
+        <w:rPr>
+          <w:rStyle w:val="Nadruk"/>
+          <w:lang w:val="nl-NL"/>
+        </w:rPr>
+        <w:t>Bas-Rhin, 67</w:t>
+      </w:r>
+      <w:r>
+        <w:rPr>
+          <w:lang w:val="nl-NL"/>
+        </w:rPr>
+        <w:t xml:space="preserve">) en groeit zij op in het wijndorp Hattstatt (departement </w:t>
+      </w:r>
+      <w:r>
+        <w:rPr>
+          <w:rStyle w:val="Nadruk"/>
+          <w:lang w:val="nl-NL"/>
+        </w:rPr>
+        <w:t>Haut-Rhin, 68</w:t>
+      </w:r>
+      <w:r>
+        <w:rPr>
+          <w:lang w:val="nl-NL"/>
+        </w:rPr>
+        <w:t>), onder de rood-witte vlag (</w:t>
+      </w:r>
+      <w:r>
+        <w:rPr>
+          <w:rStyle w:val="Nadruk"/>
+          <w:lang w:val="nl-NL"/>
+        </w:rPr>
+        <w:t>Rot un Wiss</w:t>
+      </w:r>
+      <w:r>
+        <w:rPr>
+          <w:lang w:val="nl-NL"/>
+        </w:rPr>
+        <w:t>) van de Elzas. Zij voelt zich Elzasser, niet Française of Duitse, maar draagt op papier de Franse identiteitskaart. Twe</w:t>
+      </w:r>
+      <w:r>
+        <w:rPr>
+          <w:lang w:val="nl-NL"/>
+        </w:rPr>
+        <w:t>e grensgevallen. Wanneer de jonge Lombard opnieuw de grens oversteekt om als arbeider in de Elzas te werken, raakt hij gewond en belandt hij in het ziekenhuis van Colmar. Daar verzorgt zij hem als verpleegster, en daar begint het. Ze trouwen. Wanneer het bedrijf waar hij werkt aan het begin van de jaren zeventig naar België verhuist, verhuizen zij mee. Niet voor avontuur, maar voor werk. De Europese Economische Gemeenschap telt op dat moment zes lidstaten.</w:t>
       </w:r>
       <w:r>
         <w:rPr>
@@ -1122,7 +1238,13 @@
         <w:rPr>
           <w:lang w:val="nl-NL"/>
         </w:rPr>
-        <w:t xml:space="preserve"> Vrij verkeer van werknemers is een principe op papier. In de praktijk reist de arbeider met papieren formulieren, wisselkoersen en de hoop dat de stelsels elkaar zullen vinden. Ze vestigen zich in België.</w:t>
+        <w:t xml:space="preserve"> Vrij verkeer van werknemers is een principe op pap</w:t>
+      </w:r>
+      <w:r>
+        <w:rPr>
+          <w:lang w:val="nl-NL"/>
+        </w:rPr>
+        <w:t>ier; in de praktijk reist de arbeider met papieren formulieren, wisselkoersen en de hoop dat de stelsels elkaar zullen vinden. Ze vestigen zich in België.</w:t>
       </w:r>
     </w:p>
     <w:p>
@@ -1130,19 +1252,20 @@
         <w:pStyle w:val="Normaalweb"/>
         <w:spacing w:before="200" w:after="200"/>
         <w:jc w:val="center"/>
-        <w:divId w:val="556356295"/>
-        <w:rPr>
-          <w:lang w:val="nl-NL"/>
-        </w:rPr>
-      </w:pPr>
-      <w:r>
-        <w:rPr>
-          <w:noProof/>
-          <w:lang w:val="nl-NL"/>
-        </w:rPr>
+        <w:divId w:val="1351294750"/>
+        <w:rPr>
+          <w:lang w:val="nl-NL"/>
+        </w:rPr>
+      </w:pPr>
+      <w:r>
+        <w:rPr>
+          <w:noProof/>
+          <w:lang w:val="nl-NL"/>
+        </w:rPr>
+        <w:lastRenderedPageBreak/>
         <w:drawing>
-          <wp:inline distT="0" distB="0" distL="0" distR="0" wp14:anchorId="63B708C6" wp14:editId="68BAC666">
-            <wp:extent cx="5524500" cy="3714750"/>
+          <wp:inline distT="0" distB="0" distL="0" distR="0" wp14:anchorId="7A1E190B" wp14:editId="0BECA4F0">
+            <wp:extent cx="5524500" cy="4362450"/>
             <wp:effectExtent l="0" t="0" r="0" b="0"/>
             <wp:docPr id="1" name="Afbeelding 1"/>
             <wp:cNvGraphicFramePr>
@@ -1173,7 +1296,7 @@
                   <pic:spPr bwMode="auto">
                     <a:xfrm>
                       <a:off x="0" y="0"/>
-                      <a:ext cx="5524500" cy="3714750"/>
+                      <a:ext cx="5524500" cy="4362450"/>
                     </a:xfrm>
                     <a:prstGeom prst="rect">
                       <a:avLst/>
@@ -1193,22 +1316,68 @@
     <w:p>
       <w:pPr>
         <w:pStyle w:val="Normaalweb"/>
-        <w:divId w:val="556356295"/>
-        <w:rPr>
-          <w:lang w:val="nl-NL"/>
-        </w:rPr>
-      </w:pPr>
-      <w:r>
-        <w:rPr>
-          <w:lang w:val="nl-NL"/>
-        </w:rPr>
-        <w:t>Daar wordt hun kind geboren. In Wilrijk, op 15 september 1981. Het is een ander Europa. Er zijn inmiddels tien lidstaten; Griekenland is op 1 januari van dat jaar toegetreden. Het Akkoord van Schengen bestaat nog niet. Aan elke grens staan douaneposten en paspoortcontroles. Elk land heeft zijn eigen munt. Het Europees Monetair Stelsel van 1979 moet de koersen enigszins temmen. De theorie spreekt over Europese eenwording, maar de realiteit bestaat uit stempels en wachtrijen. Het kind groeit op in Hoboken, in</w:t>
-      </w:r>
-      <w:r>
-        <w:rPr>
-          <w:lang w:val="nl-NL"/>
-        </w:rPr>
-        <w:t xml:space="preserve"> een huis waar uitsluitend Frans wordt gesproken. Maar achter die ene taal liggen drie werelden: de wereld van zijn vader, de wereld van zijn moeder, en de Vlaamse wereld waarin hij opgroeit. Het kind draagt die werelden in zich, nog voor het kan lopen. Op dat moment is het één. Eén lichaam. Eén naam op één dossier.</w:t>
+        <w:divId w:val="1351294750"/>
+        <w:rPr>
+          <w:lang w:val="nl-NL"/>
+        </w:rPr>
+      </w:pPr>
+      <w:r>
+        <w:rPr>
+          <w:lang w:val="nl-NL"/>
+        </w:rPr>
+        <w:t>Daar wordt hun kind geboren. In Wilrijk, op 15 september 1981. Het is een ander Europa. Er zijn inmiddels tien lidstaten nadat Griekenland op 1 januari van dat jaar is toegetreden, al is de blauwe vlag met de twaalf sterren op dat moment nog enkel het symbool van de Raad van Europa en wordt zij pas in 1985 door de EEG overgenomen. Het Akkoord van Schengen bestaat nog niet; aan elke grens staan douaneposten en paspoortcontroles, en het Europees Monetair Stelsel van 1979 moet de nationale munten enigszins tem</w:t>
+      </w:r>
+      <w:r>
+        <w:rPr>
+          <w:lang w:val="nl-NL"/>
+        </w:rPr>
+        <w:t>men. De theorie spreekt over Europese eenwording, maar de realiteit bestaat uit stempels en wachtrijen. Het kind groeit op in Hoboken, in een huis waar uitsluitend Frans wordt gesproken. Maar achter die ene taal liggen drie werelden: de Frans-Lombardische wereld van zijn vader, de Elzassische wereld van zijn moeder, en de Vlaamse wereld waarin hij opgroeit. Het kind draagt die werelden in zich, nog voor het kan lopen. Zelfs de bestuurlijke grenzen om hem heen muteren vrijwel direct: bij zijn geboorte in 198</w:t>
+      </w:r>
+      <w:r>
+        <w:rPr>
+          <w:lang w:val="nl-NL"/>
+        </w:rPr>
+        <w:t xml:space="preserve">1 zijn Wilrijk en Hoboken nog zelfstandige gemeenten in de provincie Antwerpen; op 1 januari 1983 worden zij bij de grote gemeentefusie opgeslokt door de Stad Antwerpen en gedegradeerd tot districten, terwijl België zelf tussen 1980 en 1993 stap voor stap muteert naar een federale staat. Toch krijgt het kind dat in Wilrijk wordt geboren op papier geen Belgische nationaliteit. België weigert het geboorterecht: hij wordt geregistreerd als vreemdeling in zijn eigen geboorteland en krijgt een blauwe Belgische </w:t>
+      </w:r>
+      <w:r>
+        <w:rPr>
+          <w:rStyle w:val="Nadruk"/>
+          <w:lang w:val="nl-NL"/>
+        </w:rPr>
+        <w:t>E</w:t>
+      </w:r>
+      <w:r>
+        <w:rPr>
+          <w:rStyle w:val="Nadruk"/>
+          <w:lang w:val="nl-NL"/>
+        </w:rPr>
+        <w:t>EG-verblijfskaart</w:t>
+      </w:r>
+      <w:r>
+        <w:rPr>
+          <w:lang w:val="nl-NL"/>
+        </w:rPr>
+        <w:t>. Door het patriarchale afstammingsrecht en het Verdrag van Straatsburg uit 1963 wordt daarop slechts één enkele nationaliteit ingevuld: die van zijn vader (</w:t>
+      </w:r>
+      <w:r>
+        <w:rPr>
+          <w:rStyle w:val="Nadruk"/>
+          <w:lang w:val="nl-NL"/>
+        </w:rPr>
+        <w:t>NAT: ITA</w:t>
+      </w:r>
+      <w:r>
+        <w:rPr>
+          <w:lang w:val="nl-NL"/>
+        </w:rPr>
+        <w:t xml:space="preserve">). Via de consulaten heeft hij daarnaast een Italiaans paspoort en een Franse </w:t>
+      </w:r>
+      <w:r>
+        <w:rPr>
+          <w:lang w:val="nl-NL"/>
+        </w:rPr>
+        <w:lastRenderedPageBreak/>
+        <w:t>consulaire identiteitskaart via zijn moeder, maar geen van beide geldt in België als een binnenlandse Belgische identiteitskaart.</w:t>
       </w:r>
     </w:p>
     <w:p>
@@ -1216,21 +1385,20 @@
         <w:pStyle w:val="Normaalweb"/>
         <w:spacing w:before="200" w:after="200"/>
         <w:jc w:val="center"/>
-        <w:divId w:val="556356295"/>
-        <w:rPr>
-          <w:lang w:val="nl-NL"/>
-        </w:rPr>
-      </w:pPr>
-      <w:r>
-        <w:rPr>
-          <w:noProof/>
-          <w:lang w:val="nl-NL"/>
-        </w:rPr>
-        <w:lastRenderedPageBreak/>
+        <w:divId w:val="1351294750"/>
+        <w:rPr>
+          <w:lang w:val="nl-NL"/>
+        </w:rPr>
+      </w:pPr>
+      <w:r>
+        <w:rPr>
+          <w:noProof/>
+          <w:lang w:val="nl-NL"/>
+        </w:rPr>
         <w:drawing>
-          <wp:inline distT="0" distB="0" distL="0" distR="0" wp14:anchorId="2EFA7917" wp14:editId="0F0C105F">
-            <wp:extent cx="5524500" cy="2876550"/>
-            <wp:effectExtent l="0" t="0" r="0" b="0"/>
+          <wp:inline distT="0" distB="0" distL="0" distR="0" wp14:anchorId="5A7823FF" wp14:editId="18E5F3BF">
+            <wp:extent cx="5524500" cy="3003550"/>
+            <wp:effectExtent l="0" t="0" r="0" b="6350"/>
             <wp:docPr id="2" name="Afbeelding 2"/>
             <wp:cNvGraphicFramePr>
               <a:graphicFrameLocks xmlns:a="http://schemas.openxmlformats.org/drawingml/2006/main" noChangeAspect="1"/>
@@ -1260,7 +1428,7 @@
                   <pic:spPr bwMode="auto">
                     <a:xfrm>
                       <a:off x="0" y="0"/>
-                      <a:ext cx="5524500" cy="2876550"/>
+                      <a:ext cx="5524500" cy="3003550"/>
                     </a:xfrm>
                     <a:prstGeom prst="rect">
                       <a:avLst/>
@@ -1280,16 +1448,16 @@
     <w:p>
       <w:pPr>
         <w:pStyle w:val="Normaalweb"/>
-        <w:divId w:val="556356295"/>
-        <w:rPr>
-          <w:lang w:val="nl-NL"/>
-        </w:rPr>
-      </w:pPr>
-      <w:r>
-        <w:rPr>
-          <w:lang w:val="nl-NL"/>
-        </w:rPr>
-        <w:t>Op zijn achttiende, in 1999, verhuist hij alleen naar Berchem. De Europese Unie telt dan vijftien lidstaten. De euro is net ingevoerd voor girale betalingen, Schengen is opgenomen in het Europees recht en het "Europees Burgerschap" is inmiddels wettelijk verankerd.</w:t>
+        <w:divId w:val="1351294750"/>
+        <w:rPr>
+          <w:lang w:val="nl-NL"/>
+        </w:rPr>
+      </w:pPr>
+      <w:r>
+        <w:rPr>
+          <w:lang w:val="nl-NL"/>
+        </w:rPr>
+        <w:t>Op zijn achttiende, in 1999, verhuist hij alleen naar het Antwerpse district Berchem. De Europese Unie telt dan vijftien lidstaten. De euro is net ingevoerd voor girale betalingen, Schengen is opgenomen in het Europees recht en het "Europees Burgerschap" is inmiddels wettelijk verankerd.</w:t>
       </w:r>
       <w:r>
         <w:rPr>
@@ -1302,13 +1470,19 @@
         <w:rPr>
           <w:lang w:val="nl-NL"/>
         </w:rPr>
-        <w:t xml:space="preserve"> De grenzen tussen België en Nederland zijn open. Maar nationaliteit is nog steeds een exclusief bezit. Hij kiest voor volledige integratie en geeft zijn meervoudige oorsprong op. Hij wil Belg zijn. Volkomen. Omdat de dubbele nationaliteit in die jaren nog niet bestaat, betekent dat een harde knip: de Italiaanse nationaliteit opgeven. De Franse nationaliteit opgeven. Alles wat hij van thuis heeft meegekregen aan papieren identiteit uitwissen, om er één terug te krijgen die hij zelf heeft gekozen. Hij is d</w:t>
-      </w:r>
-      <w:r>
-        <w:rPr>
-          <w:lang w:val="nl-NL"/>
-        </w:rPr>
-        <w:t xml:space="preserve">e enige in zijn familie die deze keuze maakt. Zijn zussen behouden hun mix van oorsprongen. Hij niet. Hij kiest voor één. Vrijwillig. Met volle overtuiging, om te integreren. Vanaf dat moment staat er één woord op zijn identiteitskaart: </w:t>
+        <w:t xml:space="preserve"> De grenzen tussen België en Nederland zijn open, maar nationaliteit is onder het Verdrag van Straatsburg nog steeds een exclusief bezit. Hij kiest voor volledige integratie in het land waar hij is geboren en opgegroeid, en geeft zijn meervoudige papieren oorsprong op. Hij wil Belg zijn. Volkomen. Omdat de dubbele nationaliteit in die jaren nog wettelijk verboden is, betekent dat een harde knip: formeel afstand doen van zijn Italiaanse nationaliteit én afstand doen van zijn Franse nationaliteit. Alles wat</w:t>
+      </w:r>
+      <w:r>
+        <w:rPr>
+          <w:lang w:val="nl-NL"/>
+        </w:rPr>
+        <w:t xml:space="preserve"> hij van thuis heeft meegekregen aan papieren identiteit — van Bondy en Vertova tot Sélestat, Hattstatt en Colmar — moet administratief worden uitgewist om er één terug te krijgen die hij zelf heeft gekozen. Hij is de enige in zijn familie die deze keuze maakt. Zijn zussen behouden hun mix van oorsprongen. Hij niet. Hij kiest vrijwillig en met volle overtuiging voor integratie. Terwijl zijn menselijke kern ongewijzigd al die wortels blijft dragen, staat er vanaf dat moment nog maar één enkel woord op zijn g</w:t>
+      </w:r>
+      <w:r>
+        <w:rPr>
+          <w:lang w:val="nl-NL"/>
+        </w:rPr>
+        <w:t xml:space="preserve">roene Belgische identiteitskaart: </w:t>
       </w:r>
       <w:r>
         <w:rPr>
@@ -1329,18 +1503,19 @@
         <w:pStyle w:val="Normaalweb"/>
         <w:spacing w:before="200" w:after="200"/>
         <w:jc w:val="center"/>
-        <w:divId w:val="556356295"/>
-        <w:rPr>
-          <w:lang w:val="nl-NL"/>
-        </w:rPr>
-      </w:pPr>
-      <w:r>
-        <w:rPr>
-          <w:noProof/>
-          <w:lang w:val="nl-NL"/>
-        </w:rPr>
+        <w:divId w:val="1351294750"/>
+        <w:rPr>
+          <w:lang w:val="nl-NL"/>
+        </w:rPr>
+      </w:pPr>
+      <w:r>
+        <w:rPr>
+          <w:noProof/>
+          <w:lang w:val="nl-NL"/>
+        </w:rPr>
+        <w:lastRenderedPageBreak/>
         <w:drawing>
-          <wp:inline distT="0" distB="0" distL="0" distR="0" wp14:anchorId="6EE73C9C" wp14:editId="75D708E1">
+          <wp:inline distT="0" distB="0" distL="0" distR="0" wp14:anchorId="6CE22F31" wp14:editId="07BFC7F9">
             <wp:extent cx="5524500" cy="2781300"/>
             <wp:effectExtent l="0" t="0" r="0" b="0"/>
             <wp:docPr id="3" name="Afbeelding 3"/>
@@ -1392,29 +1567,47 @@
     <w:p>
       <w:pPr>
         <w:pStyle w:val="Normaalweb"/>
-        <w:divId w:val="556356295"/>
-        <w:rPr>
-          <w:lang w:val="nl-NL"/>
-        </w:rPr>
-      </w:pPr>
-      <w:r>
-        <w:rPr>
-          <w:lang w:val="nl-NL"/>
-        </w:rPr>
-        <w:t xml:space="preserve">Daarna verhuist hij naar Gent. Daar leert hij zijn toekomstige vrouw kennen. Ze draagt exact hetzelfde woord op haar identiteitskaart. Twee mensen, één </w:t>
-      </w:r>
-      <w:r>
-        <w:rPr>
-          <w:lang w:val="nl-NL"/>
-        </w:rPr>
-        <w:lastRenderedPageBreak/>
-        <w:t>administratieve nationaliteit. In 2007 trouwen ze. De Unie telt inmiddels 27 lidstaten. De euro is de dagelijkse munt, Schengen is de norm, de fysieke grens is allang verdwenen. Ze wonen in Sint-Niklaas, later in Waasmunster. Vier verhuizingen in België, vier keer een nieuw dossier, vier keer een nieuw loket. Elke verhuizing is een administratieve handeling. Elke nieuwe gemeente eist een nieuwe inschrijving. Met elke verhuizing groeit de eenheid: van één naar twee. Twee mensen, twee dossiers, twee administr</w:t>
-      </w:r>
-      <w:r>
-        <w:rPr>
-          <w:lang w:val="nl-NL"/>
-        </w:rPr>
-        <w:t>atieve identiteiten die vanaf nu samen door de bureaucratie moeten.</w:t>
+        <w:divId w:val="1351294750"/>
+        <w:rPr>
+          <w:lang w:val="nl-NL"/>
+        </w:rPr>
+      </w:pPr>
+      <w:r>
+        <w:rPr>
+          <w:lang w:val="nl-NL"/>
+        </w:rPr>
+        <w:t xml:space="preserve">Daarna verhuist hij naar Gent, in Oost-Vlaanderen. Daar leert hij zijn toekomstige partner kennen. Ze draagt exact hetzelfde woord op haar identiteitskaart: </w:t>
+      </w:r>
+      <w:r>
+        <w:rPr>
+          <w:rStyle w:val="Zwaar"/>
+          <w:lang w:val="nl-NL"/>
+        </w:rPr>
+        <w:t>BELG</w:t>
+      </w:r>
+      <w:r>
+        <w:rPr>
+          <w:lang w:val="nl-NL"/>
+        </w:rPr>
+        <w:t>. Maar achter datzelfde woord ligt bij haar een stamboom die zich volledig binnen de grenzen van België en Vlaanderen heeft afgespeeld: van haar familiewortels in het West-Vlaamse Snellegem (dat bij de gemeentefusie van 1977 opging in de gemeente Jabbeke) tot haar geboorte in het Oost-Vlaamse Lokeren en haar opgroeien in Buggenhout en Elversele (in 1977 gefuseerd met Temse). Ook in haar familiegeschiedenis zijn dorpen administratief samengevoegd tot grotere gemeenten, maar omdat al die mutaties binnen é</w:t>
+      </w:r>
+      <w:r>
+        <w:rPr>
+          <w:lang w:val="nl-NL"/>
+        </w:rPr>
+        <w:t xml:space="preserve">én en dezelfde lidstaat bleven, viel haar menselijke herkomst altijd naadloos samen met dat ene vakje op haar identiteitskaart; ware zij met een streekgenoot getrouwd, dan was die nationale logica nooit op de proef gesteld. Twee mensen, twee totaal verschillende familiegeschiedenissen, één administratieve nationaliteit. In 2007 trouwen ze in Sint-Niklaas, waarna ze in Waasmunster gaan wonen. De Unie telt inmiddels 27 lidstaten. En amper een jaar na hun huwelijk — op 28 april 2008 — volgt een wrange speling </w:t>
+      </w:r>
+      <w:r>
+        <w:rPr>
+          <w:lang w:val="nl-NL"/>
+        </w:rPr>
+        <w:t>van het recht: België zegt het Verdrag van Straatsburg op en heft het verbod op meervoudige nationaliteit op. Wie voortaan Belg wordt, hoeft zijn Italiaanse of Franse nationaliteit niet langer op te geven. Maar de wet heeft geen terugwerkende kracht; de amputatie die hij in 1999 moest ondergaan om volwaardig burger te worden in zijn geboorteland, wordt nooit meer hersteld. Vier verhuizingen in België, vier keer een nieuw dossier, vier keer een nieuw loket: twee mensen die vanaf nu samen door de bureaucratie</w:t>
+      </w:r>
+      <w:r>
+        <w:rPr>
+          <w:lang w:val="nl-NL"/>
+        </w:rPr>
+        <w:t xml:space="preserve"> moeten.</w:t>
       </w:r>
     </w:p>
     <w:p>
@@ -1422,20 +1615,21 @@
         <w:pStyle w:val="Normaalweb"/>
         <w:spacing w:before="200" w:after="200"/>
         <w:jc w:val="center"/>
-        <w:divId w:val="556356295"/>
-        <w:rPr>
-          <w:lang w:val="nl-NL"/>
-        </w:rPr>
-      </w:pPr>
-      <w:r>
-        <w:rPr>
-          <w:noProof/>
-          <w:lang w:val="nl-NL"/>
-        </w:rPr>
+        <w:divId w:val="1351294750"/>
+        <w:rPr>
+          <w:lang w:val="nl-NL"/>
+        </w:rPr>
+      </w:pPr>
+      <w:r>
+        <w:rPr>
+          <w:noProof/>
+          <w:lang w:val="nl-NL"/>
+        </w:rPr>
+        <w:lastRenderedPageBreak/>
         <w:drawing>
-          <wp:inline distT="0" distB="0" distL="0" distR="0" wp14:anchorId="6D0958E9" wp14:editId="7651E435">
-            <wp:extent cx="5524500" cy="3670300"/>
-            <wp:effectExtent l="0" t="0" r="0" b="6350"/>
+          <wp:inline distT="0" distB="0" distL="0" distR="0" wp14:anchorId="7DC5C568" wp14:editId="582B6AD3">
+            <wp:extent cx="5524500" cy="3778250"/>
+            <wp:effectExtent l="0" t="0" r="0" b="0"/>
             <wp:docPr id="4" name="Afbeelding 4"/>
             <wp:cNvGraphicFramePr>
               <a:graphicFrameLocks xmlns:a="http://schemas.openxmlformats.org/drawingml/2006/main" noChangeAspect="1"/>
@@ -1465,7 +1659,7 @@
                   <pic:spPr bwMode="auto">
                     <a:xfrm>
                       <a:off x="0" y="0"/>
-                      <a:ext cx="5524500" cy="3670300"/>
+                      <a:ext cx="5524500" cy="3778250"/>
                     </a:xfrm>
                     <a:prstGeom prst="rect">
                       <a:avLst/>
@@ -1485,16 +1679,22 @@
     <w:p>
       <w:pPr>
         <w:pStyle w:val="Normaalweb"/>
-        <w:divId w:val="556356295"/>
-        <w:rPr>
-          <w:lang w:val="nl-NL"/>
-        </w:rPr>
-      </w:pPr>
-      <w:r>
-        <w:rPr>
-          <w:lang w:val="nl-NL"/>
-        </w:rPr>
-        <w:t>In 2014 verhuizen zij samen naar Zeeuws-Vlaanderen in Nederland. Europa telt dan 28 lidstaten. De fysieke grens is opgelost; je rijdt zonder remmen van België naar Nederland. Maar de administratieve grens is onzichtbaar opgetrokken. Daar begint de eerste wrijving. Hun Belgische rijbewijs is geldig in de hele Europese Unie, het Nederlandse ook. Toch moeten ze het Belgische inleveren. Nederland staat maar één geldig document per persoon toe.</w:t>
+        <w:divId w:val="1351294750"/>
+        <w:rPr>
+          <w:lang w:val="nl-NL"/>
+        </w:rPr>
+      </w:pPr>
+      <w:r>
+        <w:rPr>
+          <w:lang w:val="nl-NL"/>
+        </w:rPr>
+        <w:t>In 2014 steken zij samen de grens over naar Zeeuws-Vlaanderen, in de Nederlandse provincie Zeeland. Ze vestigen zich in het kleine Scheldedorp Paal — historisch onderdeel van de zelfstandige gemeente Graauw en Langendam, die in 1970 werd opgeheven en sinds de gemeentelijke herindeling van 2003 onder de gemeente Hulst valt. Europa telt dan 28 lidstaten. De fysieke grens is opgelost; je rijdt zonder remmen van Waasmunster naar Paal. Maar de administratieve grens is onzichtbaar opgetrokken. Daar begint de eers</w:t>
+      </w:r>
+      <w:r>
+        <w:rPr>
+          <w:lang w:val="nl-NL"/>
+        </w:rPr>
+        <w:t>te wrijving. Hun Belgische rijbewijs is geldig in de hele Europese Unie, het Nederlandse ook. Toch moeten ze het Belgische inleveren. Nederland staat maar één geldig document per persoon toe.</w:t>
       </w:r>
       <w:r>
         <w:rPr>
@@ -1507,26 +1707,25 @@
         <w:rPr>
           <w:lang w:val="nl-NL"/>
         </w:rPr>
-        <w:t xml:space="preserve"> Ze geven het af bij de gemeente en krijgen het nooit terug. Wat ze in de plaats krijgen, is een Nederlands document met exact dezelfde Europese geldigheid. Alleen het land van uitgifte is veranderd. Vanaf dat moment dragen ze de paradox in hun eigen portemonnee. Een Belgische identiteitskaart voor hun identiteit. Een Nederlands rijbewijs voor hun mobiliteit, dat in Nederland dient als wettig legitimatiebewijs. In België wordt datzelfde rijbewijs niet als identiteitsbewijs aanvaard; daar geldt uitsluiten</w:t>
-      </w:r>
-      <w:r>
-        <w:rPr>
-          <w:lang w:val="nl-NL"/>
-        </w:rPr>
-        <w:t>d de Belgische kaart. Maar wie de elektronische chip van die Belgische eID uitleest, stuit op een nog vreemdere fictie: daarop staat niet hun werkelijke woonadres in Nederland geregistreerd, maar het adres van de Belgische ambassade in Den Haag. Volgens hun Belgische kaart horen zij administratief bij de ambassade; volgens hun Nederlandse rijbewijs staat er hooguit waar het document is afgegeven in Nederland (Gemeente Hulst), maar ontbreekt elke vermelding dat zij Belg zijn. Twee documenten, twee landen, éé</w:t>
-      </w:r>
-      <w:r>
-        <w:rPr>
-          <w:lang w:val="nl-NL"/>
-        </w:rPr>
-        <w:t xml:space="preserve">n mens. Hun leven verdeelt zich over twee staten: wonen in het ene, verzekerd zijn in het andere. In theorie horen ze zo bij </w:t>
-      </w:r>
-      <w:r>
-        <w:rPr>
-          <w:lang w:val="nl-NL"/>
-        </w:rPr>
-        <w:lastRenderedPageBreak/>
-        <w:t>beide landen en zou hun bestaan zich naadloos over de grens moeten plooien. In de praktijk is het administratieve systeem geprogrammeerd om telkens maar één land tegelijk te lezen. Zodra de systemen niet met elkaar spreken, word je onleesbaar.</w:t>
+        <w:t xml:space="preserve"> Ze geven het af bij de gemeente Hulst en krijgen het nooit terug. Wat ze in de plaats krijgen, is een Nederlands document met exact dezelfde Europese geldigheid. Alleen het land van uitgifte is veranderd. Vanaf dat moment dragen ze de paradox in hun eigen portemonnee. Een Belgische identiteitskaart voor hun identite</w:t>
+      </w:r>
+      <w:r>
+        <w:rPr>
+          <w:lang w:val="nl-NL"/>
+        </w:rPr>
+        <w:t>it. Een Nederlands rijbewijs voor hun mobiliteit, dat in Nederland dient als wettig legitimatiebewijs. In België wordt datzelfde rijbewijs niet als identiteitsbewijs aanvaard; daar geldt uitsluitend de Belgische kaart. Maar wie de elektronische chip van die Belgische eID uitleest, stuit op een nog vreemdere fictie: daarop staat niet hun werkelijke woonadres in Paal geregistreerd, maar het adres van de Belgische ambassade in Den Haag. Volgens hun Belgische kaart horen zij administratief bij de ambassade; vol</w:t>
+      </w:r>
+      <w:r>
+        <w:rPr>
+          <w:lang w:val="nl-NL"/>
+        </w:rPr>
+        <w:t>gens hun Nederlandse rijbewijs staat er hooguit waar het document is afgegeven in Nederland (Gemeente Hulst), maar ontbreekt elke vermelding dat zij Belg zijn. Twee documenten, twee landen, één mens. Hun leven verdeelt zich over twee staten: wonen in het ene, werken en verzekerd zijn in het andere. In theorie horen ze zo bij beide landen en zou hun bestaan zich naadloos over de grens moeten plooien. In de praktijk is het administratieve systeem geprogrammeerd om telkens maar één land tegelijk te lezen. Zodr</w:t>
+      </w:r>
+      <w:r>
+        <w:rPr>
+          <w:lang w:val="nl-NL"/>
+        </w:rPr>
+        <w:t>a de systemen niet met elkaar spreken, word je onleesbaar.</w:t>
       </w:r>
     </w:p>
     <w:p>
@@ -1534,18 +1733,19 @@
         <w:pStyle w:val="Normaalweb"/>
         <w:spacing w:before="200" w:after="200"/>
         <w:jc w:val="center"/>
-        <w:divId w:val="556356295"/>
-        <w:rPr>
-          <w:lang w:val="nl-NL"/>
-        </w:rPr>
-      </w:pPr>
-      <w:r>
-        <w:rPr>
-          <w:noProof/>
-          <w:lang w:val="nl-NL"/>
-        </w:rPr>
+        <w:divId w:val="1351294750"/>
+        <w:rPr>
+          <w:lang w:val="nl-NL"/>
+        </w:rPr>
+      </w:pPr>
+      <w:r>
+        <w:rPr>
+          <w:noProof/>
+          <w:lang w:val="nl-NL"/>
+        </w:rPr>
+        <w:lastRenderedPageBreak/>
         <w:drawing>
-          <wp:inline distT="0" distB="0" distL="0" distR="0" wp14:anchorId="42B38FC0" wp14:editId="74283883">
+          <wp:inline distT="0" distB="0" distL="0" distR="0" wp14:anchorId="6E465BEB" wp14:editId="24E3F5A6">
             <wp:extent cx="5524500" cy="2781300"/>
             <wp:effectExtent l="0" t="0" r="0" b="0"/>
             <wp:docPr id="5" name="Afbeelding 5"/>
@@ -1597,43 +1797,88 @@
     <w:p>
       <w:pPr>
         <w:pStyle w:val="Normaalweb"/>
-        <w:divId w:val="556356295"/>
-        <w:rPr>
-          <w:lang w:val="nl-NL"/>
-        </w:rPr>
-      </w:pPr>
-      <w:r>
-        <w:rPr>
-          <w:lang w:val="nl-NL"/>
-        </w:rPr>
-        <w:t>In 2016 wordt hun zoon geboren. Een kind dat in zich draagt wat zijn ouders en grootouders hem hebben doorgegeven. De Vlaamse wortels van zijn moeder. De talen van zijn grootouders — niet als nationaliteit, maar als oorsprong, als klank, als bloed. En Zeeuws-Vlaams omdat hij er woont, de lucht inademt en er vrienden maakt. Vier werelden in één lichaam. Vier oorsprongen in één kind. Hij steekt elke dag de grens over. Niet voor werk, zoals zijn ouders, maar voor school. Hij woont in Nederland, maar leert leze</w:t>
-      </w:r>
-      <w:r>
-        <w:rPr>
-          <w:lang w:val="nl-NL"/>
-        </w:rPr>
-        <w:t>n en schrijven in Vlaanderen. Op school leert hij de taal van zijn moeder, maar zijn bed staat in Hulst. En daar begint het onvermijdelijke. Voor de Vlamingen is hij een Nederlander, rijdend in een auto met een geel kenteken. Voor de Nederlanders is hij een Vlaming, herkenbaar aan zijn tongval. Op het speelplein steken de andere kinderen hem in het vakje 'Belg'. Niet omdat iemand hem dat gevraagd heeft. Niet omdat hij een keuze heeft gemaakt. Maar omdat de kinderen om hem heen al geleerd hebben dat er vakje</w:t>
-      </w:r>
-      <w:r>
-        <w:rPr>
-          <w:lang w:val="nl-NL"/>
-        </w:rPr>
-        <w:t>s bestaan, en dat alles wat afwijkt, geclassificeerd moet worden. Drie mensen, drie dossiers, twee landen, één gezin.</w:t>
+        <w:divId w:val="1351294750"/>
+        <w:rPr>
+          <w:lang w:val="nl-NL"/>
+        </w:rPr>
+      </w:pPr>
+      <w:r>
+        <w:rPr>
+          <w:lang w:val="nl-NL"/>
+        </w:rPr>
+        <w:t>Op 12 december 2016 wordt hun zoon geboren in Wilrijk (Antwerpen) — in exact hetzelfde district waar zijn vader vijfendertig jaar eerder ter wereld kwam. Een kind waarin meer dan vijfendertig Europese, regionale en lokale cellen samenkomen. Hij draagt de West- en Oost-Vlaamse wortels van zijn moeder (van Snellegem en Jabbeke tot Lokeren, Buggenhout en Elversele), de Frans-Lombardische en Elzassische wortels van zijn grootouders (van Bondy en Vertova tot Sélestat, Hattstatt en Colmar), zijn eigen Belgische g</w:t>
+      </w:r>
+      <w:r>
+        <w:rPr>
+          <w:lang w:val="nl-NL"/>
+        </w:rPr>
+        <w:t xml:space="preserve">eboortegrond in Wilrijk én het Zeeuws-Vlaamse polderland van Paal en Hulst waar zijn wieg staat, waar hij opgroeit en vrienden maakt. Terwijl het kind wordt geboren, muteren zelfs de bestuurlijke kaarten van Europa opnieuw: in datzelfde geboortejaar 2016 heft Parijs de Elzas van zijn grootmoeder op als zelfstandige regio om haar onder te brengen in de megaregio </w:t>
+      </w:r>
+      <w:r>
+        <w:rPr>
+          <w:rStyle w:val="Nadruk"/>
+          <w:lang w:val="nl-NL"/>
+        </w:rPr>
+        <w:t>Grand Est</w:t>
+      </w:r>
+      <w:r>
+        <w:rPr>
+          <w:lang w:val="nl-NL"/>
+        </w:rPr>
+        <w:t xml:space="preserve"> (waarna Bas-Rhin en Haut-Rhin in 2021 weer samensmelten tot de </w:t>
+      </w:r>
+      <w:r>
+        <w:rPr>
+          <w:rStyle w:val="Nadruk"/>
+          <w:lang w:val="nl-NL"/>
+        </w:rPr>
+        <w:t>Collectivité européenne d'Alsace</w:t>
+      </w:r>
+      <w:r>
+        <w:rPr>
+          <w:lang w:val="nl-NL"/>
+        </w:rPr>
+        <w:t>). Vier werelden in één lichaam. Vier oorsp</w:t>
+      </w:r>
+      <w:r>
+        <w:rPr>
+          <w:lang w:val="nl-NL"/>
+        </w:rPr>
+        <w:t xml:space="preserve">rongen in één kind. Hij steekt elke dag de grens over. Niet voor werk, zoals zijn ouders en grootouders, maar voor school: hij woont in Paal (gemeente Hulst) in Nederland, maar leert lezen en schrijven in Sint-Niklaas, in Oost-Vlaanderen. Op school leert hij de taal van zijn moeder, maar zijn bed staat in Hulst. En daar begint het onvermijdelijke. Voor de Vlamingen is hij een Nederlander, rijdend in een auto met een geel kenteken. Voor de Nederlanders is hij een Vlaming, herkenbaar aan zijn tongval. Op het </w:t>
+      </w:r>
+      <w:r>
+        <w:rPr>
+          <w:lang w:val="nl-NL"/>
+        </w:rPr>
+        <w:t>speelplein steken de andere kinderen hem in het vakje 'Belg'. Niet omdat iemand hem dat gevraagd heeft. Niet omdat hij een keuze heeft gemaakt. Maar omdat de kinderen om hem heen al geleerd hebben dat er vakjes bestaan, en dat alles wat afwijkt, geclassificeerd moet worden. Drie mensen, drie dossiers, twee landen, één gezin.</w:t>
       </w:r>
     </w:p>
     <w:p>
       <w:pPr>
         <w:pStyle w:val="Normaalweb"/>
-        <w:divId w:val="556356295"/>
-        <w:rPr>
-          <w:lang w:val="nl-NL"/>
-        </w:rPr>
-      </w:pPr>
-      <w:r>
-        <w:rPr>
-          <w:lang w:val="nl-NL"/>
-        </w:rPr>
-        <w:t xml:space="preserve">Uiteindelijk krijgt ook hij een plastieken kaartje dat hem moet vertellen wie hij is. Daarop staat opnieuw dat ene woord. </w:t>
+        <w:divId w:val="1351294750"/>
+        <w:rPr>
+          <w:lang w:val="nl-NL"/>
+        </w:rPr>
+      </w:pPr>
+      <w:r>
+        <w:rPr>
+          <w:lang w:val="nl-NL"/>
+        </w:rPr>
+        <w:t xml:space="preserve">Uiteindelijk krijgt ook hij een plastieken kaartje dat hem moet vertellen wie hij is: een Belgische </w:t>
+      </w:r>
+      <w:r>
+        <w:rPr>
+          <w:rStyle w:val="Nadruk"/>
+          <w:lang w:val="nl-NL"/>
+        </w:rPr>
+        <w:t>Kids-ID</w:t>
+      </w:r>
+      <w:r>
+        <w:rPr>
+          <w:lang w:val="nl-NL"/>
+        </w:rPr>
+        <w:t xml:space="preserve">. Daarop staat opnieuw dat ene woord. </w:t>
       </w:r>
       <w:r>
         <w:rPr>
@@ -1646,7 +1891,7 @@
         <w:rPr>
           <w:lang w:val="nl-NL"/>
         </w:rPr>
-        <w:t xml:space="preserve"> En op de chip van die kaart staat niet het huis waar zijn bed staat, maar opnieuw het adres van de Belgische ambassade. De kleine Europese vlag in de hoek is het enige wat rest van het grotere ideaal. De rest is onzichtbaar gemaakt. Het systeem registreert één dimensie, terwijl het kind er vier draagt.</w:t>
+        <w:t xml:space="preserve"> Meer dan vijfendertig menselijke en historische cellen zijn op papier gewist. En op de chip van die kaart staat niet het huis in Paal waar zijn bed staat, maar opnieuw het adres van de Belgische ambassade in Den Haag. De kleine Europese vlag in de hoek is het enige wat rest van het grotere ideaal. De rest is onzichtbaar gemaakt. Het systeem registreert één dimensie, terwijl het kind er vier draagt.</w:t>
       </w:r>
     </w:p>
     <w:p>
@@ -1654,7 +1899,7 @@
         <w:pStyle w:val="Normaalweb"/>
         <w:spacing w:before="200" w:after="200"/>
         <w:jc w:val="center"/>
-        <w:divId w:val="556356295"/>
+        <w:divId w:val="1351294750"/>
         <w:rPr>
           <w:lang w:val="nl-NL"/>
         </w:rPr>
@@ -1666,9 +1911,9 @@
         </w:rPr>
         <w:lastRenderedPageBreak/>
         <w:drawing>
-          <wp:inline distT="0" distB="0" distL="0" distR="0" wp14:anchorId="451D370A" wp14:editId="14DB14A1">
-            <wp:extent cx="5524500" cy="5010150"/>
-            <wp:effectExtent l="0" t="0" r="0" b="0"/>
+          <wp:inline distT="0" distB="0" distL="0" distR="0" wp14:anchorId="0C6607F2" wp14:editId="62D15702">
+            <wp:extent cx="5524500" cy="5384800"/>
+            <wp:effectExtent l="0" t="0" r="0" b="6350"/>
             <wp:docPr id="6" name="Afbeelding 6"/>
             <wp:cNvGraphicFramePr>
               <a:graphicFrameLocks xmlns:a="http://schemas.openxmlformats.org/drawingml/2006/main" noChangeAspect="1"/>
@@ -1698,7 +1943,7 @@
                   <pic:spPr bwMode="auto">
                     <a:xfrm>
                       <a:off x="0" y="0"/>
-                      <a:ext cx="5524500" cy="5010150"/>
+                      <a:ext cx="5524500" cy="5384800"/>
                     </a:xfrm>
                     <a:prstGeom prst="rect">
                       <a:avLst/>
@@ -1718,22 +1963,22 @@
     <w:p>
       <w:pPr>
         <w:pStyle w:val="Normaalweb"/>
-        <w:divId w:val="556356295"/>
-        <w:rPr>
-          <w:lang w:val="nl-NL"/>
-        </w:rPr>
-      </w:pPr>
-      <w:r>
-        <w:rPr>
-          <w:lang w:val="nl-NL"/>
-        </w:rPr>
-        <w:t>Zo werkt het algoritme van de staat. Het ziet geen gezin. Het ziet geen organisme dat over twee landen is gegroeid. Het ziet uitsluitend losse eenheden in losse vakjes in losse landen. Wie niet in het vakje past, valt tussen de regels door.</w:t>
+        <w:divId w:val="1351294750"/>
+        <w:rPr>
+          <w:lang w:val="nl-NL"/>
+        </w:rPr>
+      </w:pPr>
+      <w:r>
+        <w:rPr>
+          <w:lang w:val="nl-NL"/>
+        </w:rPr>
+        <w:t>Zo werkt het algoritme van de staat. Het ziet geen gezin. Het ziet geen organisme dat over meerdere landen is gegroeid. Het ziet uitsluitend losse eenheden in losse vakjes in losse landen. Wie niet in het vakje past, valt tussen de regels door.</w:t>
       </w:r>
     </w:p>
     <w:p>
       <w:pPr>
         <w:pStyle w:val="Normaalweb"/>
-        <w:divId w:val="556356295"/>
+        <w:divId w:val="1351294750"/>
         <w:rPr>
           <w:lang w:val="nl-NL"/>
         </w:rPr>
@@ -1754,14 +1999,14 @@
         <w:rPr>
           <w:lang w:val="nl-NL"/>
         </w:rPr>
-        <w:t xml:space="preserve">mele erkenning van zijn fysieke toestand onvermijdelijk zou dwingen tot het toekennen van Nederlandse arbeidsongeschiktheidsrechten (WIA) en voorzieningen. Het gevolg is een volmaakte bureaucratische patstelling: feitelijk rijdt hij geen meter meer, maar op papier behoudt hij een </w:t>
+        <w:t xml:space="preserve">mele erkenning van zijn fysieke toestand onvermijdelijk zou dwingen tot het toekennen van Nederlandse arbeidsongeschiktheidsrechten </w:t>
       </w:r>
       <w:r>
         <w:rPr>
           <w:lang w:val="nl-NL"/>
         </w:rPr>
         <w:lastRenderedPageBreak/>
-        <w:t>geldig Nederlands rijbewijs.</w:t>
+        <w:t>(WIA) en voorzieningen. Het gevolg is een volmaakte bureaucratische patstelling: feitelijk rijdt hij geen meter meer, maar op papier behoudt hij een geldig Nederlands rijbewijs.</w:t>
       </w:r>
       <w:r>
         <w:rPr>
@@ -1793,13 +2038,13 @@
         <w:rPr>
           <w:lang w:val="nl-NL"/>
         </w:rPr>
-        <w:t xml:space="preserve"> De man die zijn hele leven over grenzen bewoog, die zijn Italiaanse en Franse identiteit vrijwillig opgaf om Belg te worden, maar de wereld van zijn vader en moeder nooit kon uitwissen, zit gevangen tussen twee onvolledige stukjes plastic: een Belgische eID waarvan de chip beweert dat zijn adres de Belgische ambassade is in plaats van zijn werkelijke woning, en een Nederlands</w:t>
-      </w:r>
-      <w:r>
-        <w:rPr>
-          <w:lang w:val="nl-NL"/>
-        </w:rPr>
-        <w:t xml:space="preserve"> rijbewijs waarop hooguit zijn Nederlandse verblijfsgemeente staat maar geen enkele nationaliteit. En zijn zoon, die vier werelden in zich draagt, staat met exact datzelfde woord en datzelfde ambassade-adres in de database. </w:t>
+        <w:t xml:space="preserve"> De man die zijn hele leven over grenzen bewoog, die zijn Italiaanse en Franse identiteit vrijwillig opgaf om Belg te worden, maar de wereld van zijn vader en moeder nooit kon uitwissen, zit gevangen tussen twee onvolledige stukjes plastic: een Belgische eID waarvan de chip beweert dat zijn adres de Belgische ambassade is in plaats van zijn werkelijke woning in Paal, en een Ne</w:t>
+      </w:r>
+      <w:r>
+        <w:rPr>
+          <w:lang w:val="nl-NL"/>
+        </w:rPr>
+        <w:t xml:space="preserve">derlands rijbewijs waarop hooguit zijn Nederlandse gemeente van afgifte (Hulst) staat maar geen enkele nationaliteit. En zijn zoon, die vier werelden in zich draagt, staat met exact datzelfde woord en datzelfde ambassade-adres in de database. </w:t>
       </w:r>
       <w:r>
         <w:rPr>
@@ -1818,7 +2063,7 @@
     <w:p>
       <w:pPr>
         <w:pStyle w:val="Normaalweb"/>
-        <w:divId w:val="556356295"/>
+        <w:divId w:val="1351294750"/>
         <w:rPr>
           <w:lang w:val="nl-NL"/>
         </w:rPr>
@@ -1835,7 +2080,7 @@
         <w:pStyle w:val="Normaalweb"/>
         <w:spacing w:before="200" w:after="200"/>
         <w:jc w:val="center"/>
-        <w:divId w:val="556356295"/>
+        <w:divId w:val="1351294750"/>
         <w:rPr>
           <w:lang w:val="nl-NL"/>
         </w:rPr>
@@ -1846,7 +2091,7 @@
           <w:lang w:val="nl-NL"/>
         </w:rPr>
         <w:drawing>
-          <wp:inline distT="0" distB="0" distL="0" distR="0" wp14:anchorId="6F27B6DA" wp14:editId="31810268">
+          <wp:inline distT="0" distB="0" distL="0" distR="0" wp14:anchorId="0BE104F5" wp14:editId="6104F957">
             <wp:extent cx="5524500" cy="4032250"/>
             <wp:effectExtent l="0" t="0" r="0" b="6350"/>
             <wp:docPr id="7" name="Afbeelding 7"/>
@@ -1898,7 +2143,7 @@
     <w:p>
       <w:pPr>
         <w:pStyle w:val="Normaalweb"/>
-        <w:divId w:val="556356295"/>
+        <w:divId w:val="1351294750"/>
         <w:rPr>
           <w:lang w:val="nl-NL"/>
         </w:rPr>
@@ -1920,13 +2165,20 @@
         <w:rPr>
           <w:lang w:val="nl-NL"/>
         </w:rPr>
-        <w:t xml:space="preserve"> De weeffouten worden erkend, het bevoegdheidsvacuüm is benoemd. Maar de inkt van de politiek stroomt eindeloos veel trager dan het bloed van de burger. De systemen worden pas omstreeks 2030 daadwerkelijk aangepast. Tot die tijd is de grensarbeider van vlees en bloed de enige overgebleven schokdemper voor de falende systemen van de staat.</w:t>
+        <w:t xml:space="preserve"> De weeffouten worden erkend, het bevoegdheidsvacuüm is benoemd. Maar de inkt van de politiek stroomt eindeloos veel trager dan het bloed van de burger. De systemen </w:t>
+      </w:r>
+      <w:r>
+        <w:rPr>
+          <w:lang w:val="nl-NL"/>
+        </w:rPr>
+        <w:lastRenderedPageBreak/>
+        <w:t>worden pas omstreeks 2030 daadwerkelijk aangepast. Tot die tijd is de grensarbeider van vlees en bloed de enige overgebleven schokdemper voor de falende systemen van de staat.</w:t>
       </w:r>
     </w:p>
     <w:p>
       <w:pPr>
         <w:pStyle w:val="Normaalweb"/>
-        <w:divId w:val="556356295"/>
+        <w:divId w:val="1351294750"/>
         <w:rPr>
           <w:lang w:val="nl-NL"/>
         </w:rPr>
@@ -1941,7 +2193,7 @@
     <w:p>
       <w:pPr>
         <w:pStyle w:val="Normaalweb"/>
-        <w:divId w:val="556356295"/>
+        <w:divId w:val="1351294750"/>
         <w:rPr>
           <w:lang w:val="nl-NL"/>
         </w:rPr>
@@ -1956,7 +2208,7 @@
     <w:p>
       <w:pPr>
         <w:pStyle w:val="Normaalweb"/>
-        <w:divId w:val="556356295"/>
+        <w:divId w:val="1351294750"/>
         <w:rPr>
           <w:lang w:val="nl-NL"/>
         </w:rPr>
@@ -1971,7 +2223,7 @@
     <w:p>
       <w:pPr>
         <w:spacing w:before="300" w:after="200"/>
-        <w:divId w:val="556356295"/>
+        <w:divId w:val="1351294750"/>
         <w:rPr>
           <w:rFonts w:eastAsia="Times New Roman"/>
           <w:lang w:val="nl-NL"/>
@@ -1982,14 +2234,14 @@
           <w:rFonts w:eastAsia="Times New Roman"/>
           <w:lang w:val="nl-NL"/>
         </w:rPr>
-        <w:pict w14:anchorId="1FDB4B42">
+        <w:pict w14:anchorId="40B9CE81">
           <v:rect id="_x0000_i1032" style="width:0;height:1.5pt" o:hralign="center" o:hrstd="t" o:hr="t" fillcolor="#a0a0a0" stroked="f"/>
         </w:pict>
       </w:r>
     </w:p>
     <w:p>
       <w:pPr>
-        <w:divId w:val="871576451"/>
+        <w:divId w:val="160589473"/>
         <w:rPr>
           <w:color w:val="555555"/>
           <w:sz w:val="20"/>
@@ -2014,12 +2266,21 @@
           <w:szCs w:val="20"/>
           <w:lang w:val="nl-NL"/>
         </w:rPr>
-        <w:t xml:space="preserve"> Verordening (EEG) nr. 1408/71 van de Raad van 14 juni 1971 betreffende de toepassing van de socialezekerheidsstelsels op werknemers en zelfstandigen en hun gezinsleden die zich binnen de Gemeenschap verplaatsen. Deze verordening verving de oudere Verordeningen nr. 3 en nr. 4 uit 1958 en trad in werking op 1 oktober 1972.</w:t>
-      </w:r>
-    </w:p>
-    <w:p>
-      <w:pPr>
-        <w:divId w:val="871576451"/>
+        <w:t xml:space="preserve"> </w:t>
+      </w:r>
+      <w:r>
+        <w:rPr>
+          <w:color w:val="555555"/>
+          <w:sz w:val="20"/>
+          <w:szCs w:val="20"/>
+          <w:lang w:val="nl-NL"/>
+        </w:rPr>
+        <w:t>Verordening (EEG) nr. 1408/71 van de Raad van 14 juni 1971 betreffende de toepassing van de socialezekerheidsstelsels op werknemers en zelfstandigen en hun gezinsleden die zich binnen de Gemeenschap verplaatsen. Deze verordening verving de oudere Verordeningen nr. 3 en nr. 4 uit 1958 en trad in werking op 1 oktober 1972.</w:t>
+      </w:r>
+    </w:p>
+    <w:p>
+      <w:pPr>
+        <w:divId w:val="160589473"/>
         <w:rPr>
           <w:color w:val="555555"/>
           <w:sz w:val="20"/>
@@ -2049,7 +2310,7 @@
     </w:p>
     <w:p>
       <w:pPr>
-        <w:divId w:val="871576451"/>
+        <w:divId w:val="160589473"/>
         <w:rPr>
           <w:color w:val="555555"/>
           <w:sz w:val="20"/>
@@ -2079,7 +2340,7 @@
     </w:p>
     <w:p>
       <w:pPr>
-        <w:divId w:val="871576451"/>
+        <w:divId w:val="160589473"/>
         <w:rPr>
           <w:color w:val="555555"/>
           <w:sz w:val="20"/>
@@ -2130,7 +2391,7 @@
     <w:p>
       <w:pPr>
         <w:ind w:left="800" w:right="800"/>
-        <w:divId w:val="871576451"/>
+        <w:divId w:val="160589473"/>
         <w:rPr>
           <w:color w:val="555555"/>
           <w:sz w:val="20"/>
@@ -2164,13 +2425,13 @@
     <w:p>
       <w:pPr>
         <w:pStyle w:val="Kop2"/>
-        <w:divId w:val="556356295"/>
+        <w:divId w:val="1351294750"/>
         <w:rPr>
           <w:rFonts w:eastAsia="Times New Roman"/>
           <w:lang w:val="nl-NL"/>
         </w:rPr>
       </w:pPr>
-      <w:bookmarkStart w:id="2" w:name="_Toc244297919"/>
+      <w:bookmarkStart w:id="2" w:name="_Toc244299536"/>
       <w:r>
         <w:rPr>
           <w:rFonts w:eastAsia="Times New Roman"/>
@@ -2183,7 +2444,7 @@
     <w:p>
       <w:pPr>
         <w:pStyle w:val="Normaalweb"/>
-        <w:divId w:val="556356295"/>
+        <w:divId w:val="1351294750"/>
         <w:rPr>
           <w:lang w:val="nl-NL"/>
         </w:rPr>
@@ -2198,7 +2459,7 @@
     <w:p>
       <w:pPr>
         <w:pStyle w:val="Normaalweb"/>
-        <w:divId w:val="556356295"/>
+        <w:divId w:val="1351294750"/>
         <w:rPr>
           <w:lang w:val="nl-NL"/>
         </w:rPr>
@@ -2213,7 +2474,7 @@
     <w:p>
       <w:pPr>
         <w:pStyle w:val="Normaalweb"/>
-        <w:divId w:val="556356295"/>
+        <w:divId w:val="1351294750"/>
         <w:rPr>
           <w:lang w:val="nl-NL"/>
         </w:rPr>
@@ -2228,13 +2489,13 @@
     <w:p>
       <w:pPr>
         <w:pStyle w:val="Kop2"/>
-        <w:divId w:val="556356295"/>
+        <w:divId w:val="1351294750"/>
         <w:rPr>
           <w:rFonts w:eastAsia="Times New Roman"/>
           <w:lang w:val="nl-NL"/>
         </w:rPr>
       </w:pPr>
-      <w:bookmarkStart w:id="3" w:name="_Toc244297920"/>
+      <w:bookmarkStart w:id="3" w:name="_Toc244299537"/>
       <w:r>
         <w:rPr>
           <w:rFonts w:eastAsia="Times New Roman"/>
@@ -2247,7 +2508,7 @@
     <w:p>
       <w:pPr>
         <w:pStyle w:val="Normaalweb"/>
-        <w:divId w:val="556356295"/>
+        <w:divId w:val="1351294750"/>
         <w:rPr>
           <w:lang w:val="nl-NL"/>
         </w:rPr>
@@ -2262,13 +2523,13 @@
     <w:p>
       <w:pPr>
         <w:pStyle w:val="Kop2"/>
-        <w:divId w:val="556356295"/>
+        <w:divId w:val="1351294750"/>
         <w:rPr>
           <w:rFonts w:eastAsia="Times New Roman"/>
           <w:lang w:val="nl-NL"/>
         </w:rPr>
       </w:pPr>
-      <w:bookmarkStart w:id="4" w:name="_Toc244297921"/>
+      <w:bookmarkStart w:id="4" w:name="_Toc244299538"/>
       <w:r>
         <w:rPr>
           <w:rFonts w:eastAsia="Times New Roman"/>
@@ -2281,7 +2542,7 @@
     <w:p>
       <w:pPr>
         <w:pStyle w:val="Normaalweb"/>
-        <w:divId w:val="556356295"/>
+        <w:divId w:val="1351294750"/>
         <w:rPr>
           <w:lang w:val="nl-NL"/>
         </w:rPr>
@@ -2296,13 +2557,13 @@
     <w:p>
       <w:pPr>
         <w:pStyle w:val="Kop3"/>
-        <w:divId w:val="556356295"/>
+        <w:divId w:val="1351294750"/>
         <w:rPr>
           <w:rFonts w:eastAsia="Times New Roman"/>
           <w:lang w:val="nl-NL"/>
         </w:rPr>
       </w:pPr>
-      <w:bookmarkStart w:id="5" w:name="_Toc244297922"/>
+      <w:bookmarkStart w:id="5" w:name="_Toc244299539"/>
       <w:r>
         <w:rPr>
           <w:rFonts w:eastAsia="Times New Roman"/>
@@ -2315,7 +2576,7 @@
     <w:p>
       <w:pPr>
         <w:pStyle w:val="Normaalweb"/>
-        <w:divId w:val="556356295"/>
+        <w:divId w:val="1351294750"/>
         <w:rPr>
           <w:lang w:val="nl-NL"/>
         </w:rPr>
@@ -2330,13 +2591,13 @@
     <w:p>
       <w:pPr>
         <w:pStyle w:val="Kop3"/>
-        <w:divId w:val="556356295"/>
+        <w:divId w:val="1351294750"/>
         <w:rPr>
           <w:rFonts w:eastAsia="Times New Roman"/>
           <w:lang w:val="nl-NL"/>
         </w:rPr>
       </w:pPr>
-      <w:bookmarkStart w:id="6" w:name="_Toc244297923"/>
+      <w:bookmarkStart w:id="6" w:name="_Toc244299540"/>
       <w:r>
         <w:rPr>
           <w:rFonts w:eastAsia="Times New Roman"/>
@@ -2349,7 +2610,7 @@
     <w:p>
       <w:pPr>
         <w:pStyle w:val="Normaalweb"/>
-        <w:divId w:val="556356295"/>
+        <w:divId w:val="1351294750"/>
         <w:rPr>
           <w:lang w:val="nl-NL"/>
         </w:rPr>
@@ -2364,13 +2625,13 @@
     <w:p>
       <w:pPr>
         <w:pStyle w:val="Kop3"/>
-        <w:divId w:val="556356295"/>
+        <w:divId w:val="1351294750"/>
         <w:rPr>
           <w:rFonts w:eastAsia="Times New Roman"/>
           <w:lang w:val="nl-NL"/>
         </w:rPr>
       </w:pPr>
-      <w:bookmarkStart w:id="7" w:name="_Toc244297924"/>
+      <w:bookmarkStart w:id="7" w:name="_Toc244299541"/>
       <w:r>
         <w:rPr>
           <w:rFonts w:eastAsia="Times New Roman"/>
@@ -2383,7 +2644,7 @@
     <w:p>
       <w:pPr>
         <w:pStyle w:val="Normaalweb"/>
-        <w:divId w:val="556356295"/>
+        <w:divId w:val="1351294750"/>
         <w:rPr>
           <w:lang w:val="nl-NL"/>
         </w:rPr>
@@ -2398,13 +2659,13 @@
     <w:p>
       <w:pPr>
         <w:pStyle w:val="Kop3"/>
-        <w:divId w:val="556356295"/>
+        <w:divId w:val="1351294750"/>
         <w:rPr>
           <w:rFonts w:eastAsia="Times New Roman"/>
           <w:lang w:val="nl-NL"/>
         </w:rPr>
       </w:pPr>
-      <w:bookmarkStart w:id="8" w:name="_Toc244297925"/>
+      <w:bookmarkStart w:id="8" w:name="_Toc244299542"/>
       <w:r>
         <w:rPr>
           <w:rFonts w:eastAsia="Times New Roman"/>
@@ -2417,7 +2678,7 @@
     <w:p>
       <w:pPr>
         <w:pStyle w:val="Normaalweb"/>
-        <w:divId w:val="556356295"/>
+        <w:divId w:val="1351294750"/>
         <w:rPr>
           <w:lang w:val="nl-NL"/>
         </w:rPr>
@@ -2432,13 +2693,13 @@
     <w:p>
       <w:pPr>
         <w:pStyle w:val="Kop3"/>
-        <w:divId w:val="556356295"/>
+        <w:divId w:val="1351294750"/>
         <w:rPr>
           <w:rFonts w:eastAsia="Times New Roman"/>
           <w:lang w:val="nl-NL"/>
         </w:rPr>
       </w:pPr>
-      <w:bookmarkStart w:id="9" w:name="_Toc244297926"/>
+      <w:bookmarkStart w:id="9" w:name="_Toc244299543"/>
       <w:r>
         <w:rPr>
           <w:rFonts w:eastAsia="Times New Roman"/>
@@ -2451,7 +2712,7 @@
     <w:p>
       <w:pPr>
         <w:pStyle w:val="Normaalweb"/>
-        <w:divId w:val="556356295"/>
+        <w:divId w:val="1351294750"/>
         <w:rPr>
           <w:lang w:val="nl-NL"/>
         </w:rPr>
@@ -2466,13 +2727,13 @@
     <w:p>
       <w:pPr>
         <w:pStyle w:val="Kop3"/>
-        <w:divId w:val="556356295"/>
+        <w:divId w:val="1351294750"/>
         <w:rPr>
           <w:rFonts w:eastAsia="Times New Roman"/>
           <w:lang w:val="nl-NL"/>
         </w:rPr>
       </w:pPr>
-      <w:bookmarkStart w:id="10" w:name="_Toc244297927"/>
+      <w:bookmarkStart w:id="10" w:name="_Toc244299544"/>
       <w:r>
         <w:rPr>
           <w:rFonts w:eastAsia="Times New Roman"/>
@@ -2485,7 +2746,7 @@
     <w:p>
       <w:pPr>
         <w:pStyle w:val="Normaalweb"/>
-        <w:divId w:val="556356295"/>
+        <w:divId w:val="1351294750"/>
         <w:rPr>
           <w:lang w:val="nl-NL"/>
         </w:rPr>
@@ -2500,13 +2761,13 @@
     <w:p>
       <w:pPr>
         <w:pStyle w:val="Kop2"/>
-        <w:divId w:val="556356295"/>
+        <w:divId w:val="1351294750"/>
         <w:rPr>
           <w:rFonts w:eastAsia="Times New Roman"/>
           <w:lang w:val="nl-NL"/>
         </w:rPr>
       </w:pPr>
-      <w:bookmarkStart w:id="11" w:name="_Toc244297928"/>
+      <w:bookmarkStart w:id="11" w:name="_Toc244299545"/>
       <w:r>
         <w:rPr>
           <w:rFonts w:eastAsia="Times New Roman"/>
@@ -2519,7 +2780,7 @@
     <w:p>
       <w:pPr>
         <w:pStyle w:val="Normaalweb"/>
-        <w:divId w:val="556356295"/>
+        <w:divId w:val="1351294750"/>
         <w:rPr>
           <w:lang w:val="nl-NL"/>
         </w:rPr>
@@ -2534,7 +2795,7 @@
     <w:p>
       <w:pPr>
         <w:pStyle w:val="Normaalweb"/>
-        <w:divId w:val="556356295"/>
+        <w:divId w:val="1351294750"/>
         <w:rPr>
           <w:lang w:val="nl-NL"/>
         </w:rPr>
@@ -2549,7 +2810,7 @@
     <w:p>
       <w:pPr>
         <w:pStyle w:val="Normaalweb"/>
-        <w:divId w:val="556356295"/>
+        <w:divId w:val="1351294750"/>
         <w:rPr>
           <w:lang w:val="nl-NL"/>
         </w:rPr>
@@ -2564,13 +2825,13 @@
     <w:p>
       <w:pPr>
         <w:pStyle w:val="Kop2"/>
-        <w:divId w:val="556356295"/>
+        <w:divId w:val="1351294750"/>
         <w:rPr>
           <w:rFonts w:eastAsia="Times New Roman"/>
           <w:lang w:val="nl-NL"/>
         </w:rPr>
       </w:pPr>
-      <w:bookmarkStart w:id="12" w:name="_Toc244297929"/>
+      <w:bookmarkStart w:id="12" w:name="_Toc244299546"/>
       <w:r>
         <w:rPr>
           <w:rFonts w:eastAsia="Times New Roman"/>
@@ -2583,7 +2844,7 @@
     <w:p>
       <w:pPr>
         <w:pStyle w:val="Normaalweb"/>
-        <w:divId w:val="556356295"/>
+        <w:divId w:val="1351294750"/>
         <w:rPr>
           <w:lang w:val="nl-NL"/>
         </w:rPr>
@@ -2598,7 +2859,7 @@
     <w:p>
       <w:pPr>
         <w:pStyle w:val="Normaalweb"/>
-        <w:divId w:val="556356295"/>
+        <w:divId w:val="1351294750"/>
         <w:rPr>
           <w:lang w:val="nl-NL"/>
         </w:rPr>
@@ -2613,13 +2874,13 @@
     <w:p>
       <w:pPr>
         <w:pStyle w:val="Kop2"/>
-        <w:divId w:val="556356295"/>
+        <w:divId w:val="1351294750"/>
         <w:rPr>
           <w:rFonts w:eastAsia="Times New Roman"/>
           <w:lang w:val="nl-NL"/>
         </w:rPr>
       </w:pPr>
-      <w:bookmarkStart w:id="13" w:name="_Toc244297930"/>
+      <w:bookmarkStart w:id="13" w:name="_Toc244299547"/>
       <w:r>
         <w:rPr>
           <w:rFonts w:eastAsia="Times New Roman"/>
@@ -2632,7 +2893,7 @@
     <w:p>
       <w:pPr>
         <w:pStyle w:val="Normaalweb"/>
-        <w:divId w:val="556356295"/>
+        <w:divId w:val="1351294750"/>
         <w:rPr>
           <w:lang w:val="nl-NL"/>
         </w:rPr>
@@ -2647,7 +2908,7 @@
     <w:p>
       <w:pPr>
         <w:pStyle w:val="Normaalweb"/>
-        <w:divId w:val="556356295"/>
+        <w:divId w:val="1351294750"/>
         <w:rPr>
           <w:lang w:val="nl-NL"/>
         </w:rPr>
@@ -2662,7 +2923,7 @@
     <w:p>
       <w:pPr>
         <w:shd w:val="clear" w:color="auto" w:fill="FFFFFF"/>
-        <w:divId w:val="877934053"/>
+        <w:divId w:val="1640110304"/>
         <w:rPr>
           <w:szCs w:val="22"/>
           <w:lang w:val="nl-NL"/>
@@ -2838,7 +3099,7 @@
         <w:color w:val="808080"/>
         <w:sz w:val="18"/>
       </w:rPr>
-      <w:t>3</w:t>
+      <w:t>11</w:t>
     </w:r>
     <w:r>
       <w:rPr>
@@ -2930,7 +3191,7 @@
         <w:sz w:val="18"/>
       </w:rPr>
       <w:tab/>
-      <w:t>Laatst gewijzigd: 31 oktober 2026, 00:09</w:t>
+      <w:t>Laatst gewijzigd: 31 oktober 2026, 00:36</w:t>
     </w:r>
   </w:p>
 </w:hdr>
@@ -4351,6 +4612,23 @@
       <w:spacing w:before="100" w:beforeAutospacing="1" w:after="100" w:afterAutospacing="1"/>
     </w:pPr>
   </w:style>
+  <w:style w:type="paragraph" w:customStyle="1" w:styleId="d0-branch-banner">
+    <w:name w:val="d0-branch-banner"/>
+    <w:basedOn w:val="Standaard"/>
+    <w:pPr>
+      <w:pBdr>
+        <w:left w:val="single" w:sz="18" w:space="7" w:color="0D7377"/>
+      </w:pBdr>
+      <w:spacing w:before="100" w:beforeAutospacing="1" w:after="40"/>
+    </w:pPr>
+    <w:rPr>
+      <w:b/>
+      <w:bCs/>
+      <w:color w:val="0D7377"/>
+      <w:sz w:val="17"/>
+      <w:szCs w:val="17"/>
+    </w:rPr>
+  </w:style>
   <w:style w:type="paragraph" w:customStyle="1" w:styleId="d0-fb-chip">
     <w:name w:val="d0-fb-chip"/>
     <w:basedOn w:val="Standaard"/>
@@ -5205,13 +5483,23 @@
       <w:szCs w:val="17"/>
     </w:rPr>
   </w:style>
+  <w:style w:type="character" w:styleId="Nadruk">
+    <w:name w:val="Emphasis"/>
+    <w:basedOn w:val="Standaardalinea-lettertype"/>
+    <w:uiPriority w:val="20"/>
+    <w:qFormat/>
+    <w:rPr>
+      <w:i/>
+      <w:iCs/>
+    </w:rPr>
+  </w:style>
   <w:style w:type="paragraph" w:styleId="Koptekst">
     <w:name w:val="header"/>
     <w:basedOn w:val="Standaard"/>
     <w:link w:val="KoptekstChar"/>
     <w:uiPriority w:val="99"/>
     <w:unhideWhenUsed/>
-    <w:rsid w:val="00DF00DC"/>
+    <w:rsid w:val="004E09BE"/>
     <w:pPr>
       <w:tabs>
         <w:tab w:val="center" w:pos="4536"/>
@@ -5224,7 +5512,7 @@
     <w:basedOn w:val="Standaardalinea-lettertype"/>
     <w:link w:val="Koptekst"/>
     <w:uiPriority w:val="99"/>
-    <w:rsid w:val="00DF00DC"/>
+    <w:rsid w:val="004E09BE"/>
     <w:rPr>
       <w:rFonts w:eastAsiaTheme="minorEastAsia"/>
       <w:sz w:val="24"/>
@@ -5237,7 +5525,7 @@
     <w:link w:val="VoettekstChar"/>
     <w:uiPriority w:val="99"/>
     <w:unhideWhenUsed/>
-    <w:rsid w:val="00DF00DC"/>
+    <w:rsid w:val="004E09BE"/>
     <w:pPr>
       <w:tabs>
         <w:tab w:val="center" w:pos="4536"/>
@@ -5250,7 +5538,7 @@
     <w:basedOn w:val="Standaardalinea-lettertype"/>
     <w:link w:val="Voettekst"/>
     <w:uiPriority w:val="99"/>
-    <w:rsid w:val="00DF00DC"/>
+    <w:rsid w:val="004E09BE"/>
     <w:rPr>
       <w:rFonts w:eastAsiaTheme="minorEastAsia"/>
       <w:sz w:val="24"/>
@@ -5265,7 +5553,7 @@
     <w:uiPriority w:val="39"/>
     <w:semiHidden/>
     <w:unhideWhenUsed/>
-    <w:rsid w:val="00DF00DC"/>
+    <w:rsid w:val="004E09BE"/>
     <w:pPr>
       <w:spacing w:after="30"/>
     </w:pPr>
@@ -5280,7 +5568,7 @@
     <w:autoRedefine/>
     <w:uiPriority w:val="39"/>
     <w:unhideWhenUsed/>
-    <w:rsid w:val="00DF00DC"/>
+    <w:rsid w:val="004E09BE"/>
     <w:pPr>
       <w:spacing w:after="30"/>
       <w:ind w:left="220"/>
@@ -5296,7 +5584,7 @@
     <w:autoRedefine/>
     <w:uiPriority w:val="39"/>
     <w:unhideWhenUsed/>
-    <w:rsid w:val="00DF00DC"/>
+    <w:rsid w:val="004E09BE"/>
     <w:pPr>
       <w:spacing w:after="30"/>
       <w:ind w:left="440"/>

</xml_diff>

<commit_message>
Update Systeem-Audit NL 31-10-2026 06:57
</commit_message>
<xml_diff>
--- a/nl/docx/document-0.docx
+++ b/nl/docx/document-0.docx
@@ -7,7 +7,7 @@
         <w:spacing w:after="400"/>
         <w:jc w:val="center"/>
         <w:outlineLvl w:val="1"/>
-        <w:divId w:val="434251830"/>
+        <w:divId w:val="205946384"/>
         <w:rPr>
           <w:rFonts w:ascii="Aptos Display" w:eastAsia="Times New Roman" w:hAnsi="Aptos Display"/>
           <w:b/>
@@ -36,7 +36,7 @@
     <w:p>
       <w:pPr>
         <w:pStyle w:val="ondertitel2"/>
-        <w:divId w:val="434251830"/>
+        <w:divId w:val="205946384"/>
         <w:rPr>
           <w:lang w:val="nl-NL"/>
         </w:rPr>
@@ -51,7 +51,7 @@
     <w:p>
       <w:pPr>
         <w:pStyle w:val="documentaanduiding2"/>
-        <w:divId w:val="434251830"/>
+        <w:divId w:val="205946384"/>
         <w:rPr>
           <w:lang w:val="nl-NL"/>
         </w:rPr>
@@ -66,7 +66,7 @@
     <w:p>
       <w:pPr>
         <w:pStyle w:val="auteur2"/>
-        <w:divId w:val="434251830"/>
+        <w:divId w:val="205946384"/>
         <w:rPr>
           <w:lang w:val="nl-NL"/>
         </w:rPr>
@@ -82,16 +82,16 @@
       <w:pPr>
         <w:pStyle w:val="meta-lijn2"/>
         <w:ind w:left="800" w:right="800"/>
-        <w:divId w:val="434251830"/>
-        <w:rPr>
-          <w:lang w:val="nl-NL"/>
-        </w:rPr>
-      </w:pPr>
-      <w:r>
-        <w:rPr>
-          <w:lang w:val="nl-NL"/>
-        </w:rPr>
-        <w:t>Versie bijgewerkt: 31 oktober 2026, 00:36</w:t>
+        <w:divId w:val="205946384"/>
+        <w:rPr>
+          <w:lang w:val="nl-NL"/>
+        </w:rPr>
+      </w:pPr>
+      <w:r>
+        <w:rPr>
+          <w:lang w:val="nl-NL"/>
+        </w:rPr>
+        <w:t>Versie bijgewerkt: 31 oktober 2026, 06:55</w:t>
       </w:r>
       <w:r>
         <w:br w:type="page"/>
@@ -100,13 +100,13 @@
     <w:p>
       <w:pPr>
         <w:pStyle w:val="Kop2"/>
-        <w:divId w:val="855730367"/>
+        <w:divId w:val="1706325188"/>
         <w:rPr>
           <w:rFonts w:eastAsia="Times New Roman"/>
           <w:lang w:val="nl-NL"/>
         </w:rPr>
       </w:pPr>
-      <w:bookmarkStart w:id="0" w:name="_Toc244299534"/>
+      <w:bookmarkStart w:id="0" w:name="_Toc244322237"/>
       <w:r>
         <w:rPr>
           <w:rFonts w:eastAsia="Times New Roman"/>
@@ -122,7 +122,7 @@
         <w:tabs>
           <w:tab w:val="right" w:leader="dot" w:pos="9062"/>
         </w:tabs>
-        <w:divId w:val="855730367"/>
+        <w:divId w:val="1706325188"/>
         <w:rPr>
           <w:rFonts w:asciiTheme="minorHAnsi" w:hAnsiTheme="minorHAnsi" w:cstheme="minorBidi"/>
           <w:noProof/>
@@ -173,7 +173,7 @@
         <w:rPr>
           <w:noProof/>
         </w:rPr>
-        <w:instrText xml:space="preserve"> PAGEREF _Toc244299534 \h </w:instrText>
+        <w:instrText xml:space="preserve"> PAGEREF _Toc244322237 \h </w:instrText>
       </w:r>
       <w:r>
         <w:rPr>
@@ -205,7 +205,7 @@
         <w:tabs>
           <w:tab w:val="right" w:leader="dot" w:pos="9062"/>
         </w:tabs>
-        <w:divId w:val="855730367"/>
+        <w:divId w:val="1706325188"/>
         <w:rPr>
           <w:rFonts w:asciiTheme="minorHAnsi" w:hAnsiTheme="minorHAnsi" w:cstheme="minorBidi"/>
           <w:noProof/>
@@ -238,7 +238,7 @@
         <w:rPr>
           <w:noProof/>
         </w:rPr>
-        <w:instrText xml:space="preserve"> PAGEREF _Toc244299535 \h </w:instrText>
+        <w:instrText xml:space="preserve"> PAGEREF _Toc244322238 \h </w:instrText>
       </w:r>
       <w:r>
         <w:rPr>
@@ -270,7 +270,7 @@
         <w:tabs>
           <w:tab w:val="right" w:leader="dot" w:pos="9062"/>
         </w:tabs>
-        <w:divId w:val="855730367"/>
+        <w:divId w:val="1706325188"/>
         <w:rPr>
           <w:rFonts w:asciiTheme="minorHAnsi" w:hAnsiTheme="minorHAnsi" w:cstheme="minorBidi"/>
           <w:noProof/>
@@ -303,7 +303,7 @@
         <w:rPr>
           <w:noProof/>
         </w:rPr>
-        <w:instrText xml:space="preserve"> PAGEREF _Toc244299536 \h </w:instrText>
+        <w:instrText xml:space="preserve"> PAGEREF _Toc244322239 \h </w:instrText>
       </w:r>
       <w:r>
         <w:rPr>
@@ -320,7 +320,7 @@
         <w:rPr>
           <w:noProof/>
         </w:rPr>
-        <w:t>12</w:t>
+        <w:t>13</w:t>
       </w:r>
       <w:r>
         <w:rPr>
@@ -335,7 +335,7 @@
         <w:tabs>
           <w:tab w:val="right" w:leader="dot" w:pos="9062"/>
         </w:tabs>
-        <w:divId w:val="855730367"/>
+        <w:divId w:val="1706325188"/>
         <w:rPr>
           <w:rFonts w:asciiTheme="minorHAnsi" w:hAnsiTheme="minorHAnsi" w:cstheme="minorBidi"/>
           <w:noProof/>
@@ -368,7 +368,7 @@
         <w:rPr>
           <w:noProof/>
         </w:rPr>
-        <w:instrText xml:space="preserve"> PAGEREF _Toc244299537 \h </w:instrText>
+        <w:instrText xml:space="preserve"> PAGEREF _Toc244322240 \h </w:instrText>
       </w:r>
       <w:r>
         <w:rPr>
@@ -385,7 +385,7 @@
         <w:rPr>
           <w:noProof/>
         </w:rPr>
-        <w:t>12</w:t>
+        <w:t>13</w:t>
       </w:r>
       <w:r>
         <w:rPr>
@@ -400,7 +400,7 @@
         <w:tabs>
           <w:tab w:val="right" w:leader="dot" w:pos="9062"/>
         </w:tabs>
-        <w:divId w:val="855730367"/>
+        <w:divId w:val="1706325188"/>
         <w:rPr>
           <w:rFonts w:asciiTheme="minorHAnsi" w:hAnsiTheme="minorHAnsi" w:cstheme="minorBidi"/>
           <w:noProof/>
@@ -433,7 +433,7 @@
         <w:rPr>
           <w:noProof/>
         </w:rPr>
-        <w:instrText xml:space="preserve"> PAGEREF _Toc244299538 \h </w:instrText>
+        <w:instrText xml:space="preserve"> PAGEREF _Toc244322241 \h </w:instrText>
       </w:r>
       <w:r>
         <w:rPr>
@@ -450,7 +450,7 @@
         <w:rPr>
           <w:noProof/>
         </w:rPr>
-        <w:t>12</w:t>
+        <w:t>13</w:t>
       </w:r>
       <w:r>
         <w:rPr>
@@ -465,7 +465,7 @@
         <w:tabs>
           <w:tab w:val="right" w:leader="dot" w:pos="9062"/>
         </w:tabs>
-        <w:divId w:val="855730367"/>
+        <w:divId w:val="1706325188"/>
         <w:rPr>
           <w:rFonts w:asciiTheme="minorHAnsi" w:hAnsiTheme="minorHAnsi" w:cstheme="minorBidi"/>
           <w:noProof/>
@@ -498,7 +498,7 @@
         <w:rPr>
           <w:noProof/>
         </w:rPr>
-        <w:instrText xml:space="preserve"> PAGEREF _Toc244299539 \h </w:instrText>
+        <w:instrText xml:space="preserve"> PAGEREF _Toc244322242 \h </w:instrText>
       </w:r>
       <w:r>
         <w:rPr>
@@ -515,7 +515,7 @@
         <w:rPr>
           <w:noProof/>
         </w:rPr>
-        <w:t>12</w:t>
+        <w:t>13</w:t>
       </w:r>
       <w:r>
         <w:rPr>
@@ -530,7 +530,7 @@
         <w:tabs>
           <w:tab w:val="right" w:leader="dot" w:pos="9062"/>
         </w:tabs>
-        <w:divId w:val="855730367"/>
+        <w:divId w:val="1706325188"/>
         <w:rPr>
           <w:rFonts w:asciiTheme="minorHAnsi" w:hAnsiTheme="minorHAnsi" w:cstheme="minorBidi"/>
           <w:noProof/>
@@ -563,7 +563,7 @@
         <w:rPr>
           <w:noProof/>
         </w:rPr>
-        <w:instrText xml:space="preserve"> PAGEREF _Toc244299540 \h </w:instrText>
+        <w:instrText xml:space="preserve"> PAGEREF _Toc244322243 \h </w:instrText>
       </w:r>
       <w:r>
         <w:rPr>
@@ -580,7 +580,7 @@
         <w:rPr>
           <w:noProof/>
         </w:rPr>
-        <w:t>12</w:t>
+        <w:t>13</w:t>
       </w:r>
       <w:r>
         <w:rPr>
@@ -595,7 +595,7 @@
         <w:tabs>
           <w:tab w:val="right" w:leader="dot" w:pos="9062"/>
         </w:tabs>
-        <w:divId w:val="855730367"/>
+        <w:divId w:val="1706325188"/>
         <w:rPr>
           <w:rFonts w:asciiTheme="minorHAnsi" w:hAnsiTheme="minorHAnsi" w:cstheme="minorBidi"/>
           <w:noProof/>
@@ -628,7 +628,7 @@
         <w:rPr>
           <w:noProof/>
         </w:rPr>
-        <w:instrText xml:space="preserve"> PAGEREF _Toc244299541 \h </w:instrText>
+        <w:instrText xml:space="preserve"> PAGEREF _Toc244322244 \h </w:instrText>
       </w:r>
       <w:r>
         <w:rPr>
@@ -645,7 +645,7 @@
         <w:rPr>
           <w:noProof/>
         </w:rPr>
-        <w:t>12</w:t>
+        <w:t>13</w:t>
       </w:r>
       <w:r>
         <w:rPr>
@@ -660,7 +660,7 @@
         <w:tabs>
           <w:tab w:val="right" w:leader="dot" w:pos="9062"/>
         </w:tabs>
-        <w:divId w:val="855730367"/>
+        <w:divId w:val="1706325188"/>
         <w:rPr>
           <w:rFonts w:asciiTheme="minorHAnsi" w:hAnsiTheme="minorHAnsi" w:cstheme="minorBidi"/>
           <w:noProof/>
@@ -693,7 +693,7 @@
         <w:rPr>
           <w:noProof/>
         </w:rPr>
-        <w:instrText xml:space="preserve"> PAGEREF _Toc244299542 \h </w:instrText>
+        <w:instrText xml:space="preserve"> PAGEREF _Toc244322245 \h </w:instrText>
       </w:r>
       <w:r>
         <w:rPr>
@@ -710,7 +710,7 @@
         <w:rPr>
           <w:noProof/>
         </w:rPr>
-        <w:t>13</w:t>
+        <w:t>14</w:t>
       </w:r>
       <w:r>
         <w:rPr>
@@ -725,7 +725,7 @@
         <w:tabs>
           <w:tab w:val="right" w:leader="dot" w:pos="9062"/>
         </w:tabs>
-        <w:divId w:val="855730367"/>
+        <w:divId w:val="1706325188"/>
         <w:rPr>
           <w:rFonts w:asciiTheme="minorHAnsi" w:hAnsiTheme="minorHAnsi" w:cstheme="minorBidi"/>
           <w:noProof/>
@@ -758,7 +758,7 @@
         <w:rPr>
           <w:noProof/>
         </w:rPr>
-        <w:instrText xml:space="preserve"> PAGEREF _Toc244299543 \h </w:instrText>
+        <w:instrText xml:space="preserve"> PAGEREF _Toc244322246 \h </w:instrText>
       </w:r>
       <w:r>
         <w:rPr>
@@ -775,7 +775,7 @@
         <w:rPr>
           <w:noProof/>
         </w:rPr>
-        <w:t>13</w:t>
+        <w:t>14</w:t>
       </w:r>
       <w:r>
         <w:rPr>
@@ -790,7 +790,7 @@
         <w:tabs>
           <w:tab w:val="right" w:leader="dot" w:pos="9062"/>
         </w:tabs>
-        <w:divId w:val="855730367"/>
+        <w:divId w:val="1706325188"/>
         <w:rPr>
           <w:rFonts w:asciiTheme="minorHAnsi" w:hAnsiTheme="minorHAnsi" w:cstheme="minorBidi"/>
           <w:noProof/>
@@ -823,7 +823,7 @@
         <w:rPr>
           <w:noProof/>
         </w:rPr>
-        <w:instrText xml:space="preserve"> PAGEREF _Toc244299544 \h </w:instrText>
+        <w:instrText xml:space="preserve"> PAGEREF _Toc244322247 \h </w:instrText>
       </w:r>
       <w:r>
         <w:rPr>
@@ -840,7 +840,7 @@
         <w:rPr>
           <w:noProof/>
         </w:rPr>
-        <w:t>13</w:t>
+        <w:t>14</w:t>
       </w:r>
       <w:r>
         <w:rPr>
@@ -855,7 +855,7 @@
         <w:tabs>
           <w:tab w:val="right" w:leader="dot" w:pos="9062"/>
         </w:tabs>
-        <w:divId w:val="855730367"/>
+        <w:divId w:val="1706325188"/>
         <w:rPr>
           <w:rFonts w:asciiTheme="minorHAnsi" w:hAnsiTheme="minorHAnsi" w:cstheme="minorBidi"/>
           <w:noProof/>
@@ -888,7 +888,7 @@
         <w:rPr>
           <w:noProof/>
         </w:rPr>
-        <w:instrText xml:space="preserve"> PAGEREF _Toc244299545 \h </w:instrText>
+        <w:instrText xml:space="preserve"> PAGEREF _Toc244322248 \h </w:instrText>
       </w:r>
       <w:r>
         <w:rPr>
@@ -905,7 +905,7 @@
         <w:rPr>
           <w:noProof/>
         </w:rPr>
-        <w:t>13</w:t>
+        <w:t>14</w:t>
       </w:r>
       <w:r>
         <w:rPr>
@@ -920,7 +920,7 @@
         <w:tabs>
           <w:tab w:val="right" w:leader="dot" w:pos="9062"/>
         </w:tabs>
-        <w:divId w:val="855730367"/>
+        <w:divId w:val="1706325188"/>
         <w:rPr>
           <w:rFonts w:asciiTheme="minorHAnsi" w:hAnsiTheme="minorHAnsi" w:cstheme="minorBidi"/>
           <w:noProof/>
@@ -953,7 +953,7 @@
         <w:rPr>
           <w:noProof/>
         </w:rPr>
-        <w:instrText xml:space="preserve"> PAGEREF _Toc244299546 \h </w:instrText>
+        <w:instrText xml:space="preserve"> PAGEREF _Toc244322249 \h </w:instrText>
       </w:r>
       <w:r>
         <w:rPr>
@@ -970,7 +970,7 @@
         <w:rPr>
           <w:noProof/>
         </w:rPr>
-        <w:t>13</w:t>
+        <w:t>14</w:t>
       </w:r>
       <w:r>
         <w:rPr>
@@ -985,7 +985,7 @@
         <w:tabs>
           <w:tab w:val="right" w:leader="dot" w:pos="9062"/>
         </w:tabs>
-        <w:divId w:val="855730367"/>
+        <w:divId w:val="1706325188"/>
         <w:rPr>
           <w:rFonts w:asciiTheme="minorHAnsi" w:hAnsiTheme="minorHAnsi" w:cstheme="minorBidi"/>
           <w:noProof/>
@@ -1018,7 +1018,7 @@
         <w:rPr>
           <w:noProof/>
         </w:rPr>
-        <w:instrText xml:space="preserve"> PAGEREF _Toc244299547 \h </w:instrText>
+        <w:instrText xml:space="preserve"> PAGEREF _Toc244322250 \h </w:instrText>
       </w:r>
       <w:r>
         <w:rPr>
@@ -1035,7 +1035,7 @@
         <w:rPr>
           <w:noProof/>
         </w:rPr>
-        <w:t>13</w:t>
+        <w:t>14</w:t>
       </w:r>
       <w:r>
         <w:rPr>
@@ -1048,7 +1048,7 @@
       <w:pPr>
         <w:pStyle w:val="marker"/>
         <w:ind w:left="800" w:right="800"/>
-        <w:divId w:val="855730367"/>
+        <w:divId w:val="1706325188"/>
         <w:rPr>
           <w:lang w:val="nl-NL"/>
         </w:rPr>
@@ -1066,13 +1066,13 @@
     <w:p>
       <w:pPr>
         <w:pStyle w:val="Kop2"/>
-        <w:divId w:val="1351294750"/>
+        <w:divId w:val="1016224354"/>
         <w:rPr>
           <w:rFonts w:eastAsia="Times New Roman"/>
           <w:lang w:val="nl-NL"/>
         </w:rPr>
       </w:pPr>
-      <w:bookmarkStart w:id="1" w:name="_Toc244299535"/>
+      <w:bookmarkStart w:id="1" w:name="_Toc244322238"/>
       <w:r>
         <w:rPr>
           <w:rFonts w:eastAsia="Times New Roman"/>
@@ -1085,7 +1085,7 @@
     <w:p>
       <w:pPr>
         <w:pStyle w:val="Normaalweb"/>
-        <w:divId w:val="1351294750"/>
+        <w:divId w:val="1016224354"/>
         <w:rPr>
           <w:lang w:val="nl-NL"/>
         </w:rPr>
@@ -1100,7 +1100,7 @@
     <w:p>
       <w:pPr>
         <w:pStyle w:val="Normaalweb"/>
-        <w:divId w:val="1351294750"/>
+        <w:divId w:val="1016224354"/>
         <w:rPr>
           <w:lang w:val="nl-NL"/>
         </w:rPr>
@@ -1148,7 +1148,22 @@
         <w:rPr>
           <w:lang w:val="nl-NL"/>
         </w:rPr>
-        <w:t>. Daar wordt in 1940 de vader geboren, in een wereld waarin de Verenigde Naties (1945) en de Europese Economische Gemeenschap (1958) nog niet bestaan. Hoewel zijn wieg op Franse bodem staat, telt die geboortegrond op papier niet mee: door het bloedrecht (</w:t>
+        <w:t>.</w:t>
+      </w:r>
+    </w:p>
+    <w:p>
+      <w:pPr>
+        <w:pStyle w:val="Normaalweb"/>
+        <w:divId w:val="1016224354"/>
+        <w:rPr>
+          <w:lang w:val="nl-NL"/>
+        </w:rPr>
+      </w:pPr>
+      <w:r>
+        <w:rPr>
+          <w:lang w:val="nl-NL"/>
+        </w:rPr>
+        <w:t>Daar wordt in 1940 de vader geboren, in een wereld waarin de Verenigde Naties (1945) en de Europese Economische Gemeenschap (1958) nog niet bestaan. Hoewel zijn wieg op Franse bodem staat, telt die geboortegrond op papier niet mee: door het bloedrecht (</w:t>
       </w:r>
       <w:r>
         <w:rPr>
@@ -1161,13 +1176,22 @@
         <w:rPr>
           <w:lang w:val="nl-NL"/>
         </w:rPr>
-        <w:t>) is hij voor de wet uitsluitend onderdaan van het toenmalige Koninkrijk Italië, dat in 1946 verandert in de Italiaanse Republiek. Na de oorlog keert he</w:t>
-      </w:r>
-      <w:r>
-        <w:rPr>
-          <w:lang w:val="nl-NL"/>
-        </w:rPr>
-        <w:t xml:space="preserve">t gezin terug naar de familiewortels in Vertova, een dorp in de bergvallei </w:t>
+        <w:t>) is hij voor de wet uitsluitend onderdaan van het toenmalige Koninkrijk Italië, dat in 1946 verandert in de Italiaanse Republiek.</w:t>
+      </w:r>
+    </w:p>
+    <w:p>
+      <w:pPr>
+        <w:pStyle w:val="Normaalweb"/>
+        <w:divId w:val="1016224354"/>
+        <w:rPr>
+          <w:lang w:val="nl-NL"/>
+        </w:rPr>
+      </w:pPr>
+      <w:r>
+        <w:rPr>
+          <w:lang w:val="nl-NL"/>
+        </w:rPr>
+        <w:t xml:space="preserve">Na de oorlog keert het gezin terug naar de familiewortels in Vertova, een dorp in de bergvallei </w:t>
       </w:r>
       <w:r>
         <w:rPr>
@@ -1180,7 +1204,22 @@
         <w:rPr>
           <w:lang w:val="nl-NL"/>
         </w:rPr>
-        <w:t xml:space="preserve"> in de provincie Bergamo (Lombardije). Hij groeit er op en voelt zich Lombard, geen Italiaan. Aan de andere kant van de Alpen wordt in 1948 de moeder geboren in Sélestat (departement </w:t>
+        <w:t xml:space="preserve"> in de provincie Bergamo (Lombardije). Hij groeit er op en voelt zich Lombard, geen Italiaan.</w:t>
+      </w:r>
+    </w:p>
+    <w:p>
+      <w:pPr>
+        <w:pStyle w:val="Normaalweb"/>
+        <w:divId w:val="1016224354"/>
+        <w:rPr>
+          <w:lang w:val="nl-NL"/>
+        </w:rPr>
+      </w:pPr>
+      <w:r>
+        <w:rPr>
+          <w:lang w:val="nl-NL"/>
+        </w:rPr>
+        <w:t xml:space="preserve">Aan de andere kant van de Alpen wordt in 1948 de moeder geboren in Sélestat (departement </w:t>
       </w:r>
       <w:r>
         <w:rPr>
@@ -1219,13 +1258,37 @@
         <w:rPr>
           <w:lang w:val="nl-NL"/>
         </w:rPr>
-        <w:t>) van de Elzas. Zij voelt zich Elzasser, niet Française of Duitse, maar draagt op papier de Franse identiteitskaart. Twe</w:t>
-      </w:r>
-      <w:r>
-        <w:rPr>
-          <w:lang w:val="nl-NL"/>
-        </w:rPr>
-        <w:t>e grensgevallen. Wanneer de jonge Lombard opnieuw de grens oversteekt om als arbeider in de Elzas te werken, raakt hij gewond en belandt hij in het ziekenhuis van Colmar. Daar verzorgt zij hem als verpleegster, en daar begint het. Ze trouwen. Wanneer het bedrijf waar hij werkt aan het begin van de jaren zeventig naar België verhuist, verhuizen zij mee. Niet voor avontuur, maar voor werk. De Europese Economische Gemeenschap telt op dat moment zes lidstaten.</w:t>
+        <w:t>) van de Elzas. Zij voelt zich Elzasser, niet Française of Duitse, maar draagt op papier de Franse identiteitskaart.</w:t>
+      </w:r>
+    </w:p>
+    <w:p>
+      <w:pPr>
+        <w:pStyle w:val="Normaalweb"/>
+        <w:divId w:val="1016224354"/>
+        <w:rPr>
+          <w:lang w:val="nl-NL"/>
+        </w:rPr>
+      </w:pPr>
+      <w:r>
+        <w:rPr>
+          <w:lang w:val="nl-NL"/>
+        </w:rPr>
+        <w:t>Twee grensgevallen. Wanneer de jonge Lombard opnieuw de grens oversteekt om als arbeider in de Elzas te werken, raakt hij gewond en belandt hij in het ziekenhuis van Colmar. Daar verzorgt zij hem als verpleegster, en daar begint het. Ze trouwen.</w:t>
+      </w:r>
+    </w:p>
+    <w:p>
+      <w:pPr>
+        <w:pStyle w:val="Normaalweb"/>
+        <w:divId w:val="1016224354"/>
+        <w:rPr>
+          <w:lang w:val="nl-NL"/>
+        </w:rPr>
+      </w:pPr>
+      <w:r>
+        <w:rPr>
+          <w:lang w:val="nl-NL"/>
+        </w:rPr>
+        <w:t>Wanneer het bedrijf waar hij werkt aan het begin van de jaren zeventig naar België verhuist, verhuizen zij mee. Niet voor avontuur, maar voor werk. De Europese Economische Gemeenschap telt op dat moment zes lidstaten.</w:t>
       </w:r>
       <w:r>
         <w:rPr>
@@ -1238,13 +1301,7 @@
         <w:rPr>
           <w:lang w:val="nl-NL"/>
         </w:rPr>
-        <w:t xml:space="preserve"> Vrij verkeer van werknemers is een principe op pap</w:t>
-      </w:r>
-      <w:r>
-        <w:rPr>
-          <w:lang w:val="nl-NL"/>
-        </w:rPr>
-        <w:t>ier; in de praktijk reist de arbeider met papieren formulieren, wisselkoersen en de hoop dat de stelsels elkaar zullen vinden. Ze vestigen zich in België.</w:t>
+        <w:t xml:space="preserve"> Vrij verkeer van werknemers is een principe op papier; in de praktijk reist de arbeider met papieren formulieren, wisselkoersen en de hoop dat de stelsels elkaar zullen vinden. Ze vestigen zich in België.</w:t>
       </w:r>
     </w:p>
     <w:p>
@@ -1252,7 +1309,7 @@
         <w:pStyle w:val="Normaalweb"/>
         <w:spacing w:before="200" w:after="200"/>
         <w:jc w:val="center"/>
-        <w:divId w:val="1351294750"/>
+        <w:divId w:val="1016224354"/>
         <w:rPr>
           <w:lang w:val="nl-NL"/>
         </w:rPr>
@@ -1264,7 +1321,7 @@
         </w:rPr>
         <w:lastRenderedPageBreak/>
         <w:drawing>
-          <wp:inline distT="0" distB="0" distL="0" distR="0" wp14:anchorId="7A1E190B" wp14:editId="0BECA4F0">
+          <wp:inline distT="0" distB="0" distL="0" distR="0" wp14:anchorId="298122CD" wp14:editId="15D7F957">
             <wp:extent cx="5524500" cy="4362450"/>
             <wp:effectExtent l="0" t="0" r="0" b="0"/>
             <wp:docPr id="1" name="Afbeelding 1"/>
@@ -1316,68 +1373,124 @@
     <w:p>
       <w:pPr>
         <w:pStyle w:val="Normaalweb"/>
-        <w:divId w:val="1351294750"/>
-        <w:rPr>
-          <w:lang w:val="nl-NL"/>
-        </w:rPr>
-      </w:pPr>
-      <w:r>
-        <w:rPr>
-          <w:lang w:val="nl-NL"/>
-        </w:rPr>
-        <w:t>Daar wordt hun kind geboren. In Wilrijk, op 15 september 1981. Het is een ander Europa. Er zijn inmiddels tien lidstaten nadat Griekenland op 1 januari van dat jaar is toegetreden, al is de blauwe vlag met de twaalf sterren op dat moment nog enkel het symbool van de Raad van Europa en wordt zij pas in 1985 door de EEG overgenomen. Het Akkoord van Schengen bestaat nog niet; aan elke grens staan douaneposten en paspoortcontroles, en het Europees Monetair Stelsel van 1979 moet de nationale munten enigszins tem</w:t>
-      </w:r>
-      <w:r>
-        <w:rPr>
-          <w:lang w:val="nl-NL"/>
-        </w:rPr>
-        <w:t>men. De theorie spreekt over Europese eenwording, maar de realiteit bestaat uit stempels en wachtrijen. Het kind groeit op in Hoboken, in een huis waar uitsluitend Frans wordt gesproken. Maar achter die ene taal liggen drie werelden: de Frans-Lombardische wereld van zijn vader, de Elzassische wereld van zijn moeder, en de Vlaamse wereld waarin hij opgroeit. Het kind draagt die werelden in zich, nog voor het kan lopen. Zelfs de bestuurlijke grenzen om hem heen muteren vrijwel direct: bij zijn geboorte in 198</w:t>
-      </w:r>
-      <w:r>
-        <w:rPr>
-          <w:lang w:val="nl-NL"/>
-        </w:rPr>
-        <w:t xml:space="preserve">1 zijn Wilrijk en Hoboken nog zelfstandige gemeenten in de provincie Antwerpen; op 1 januari 1983 worden zij bij de grote gemeentefusie opgeslokt door de Stad Antwerpen en gedegradeerd tot districten, terwijl België zelf tussen 1980 en 1993 stap voor stap muteert naar een federale staat. Toch krijgt het kind dat in Wilrijk wordt geboren op papier geen Belgische nationaliteit. België weigert het geboorterecht: hij wordt geregistreerd als vreemdeling in zijn eigen geboorteland en krijgt een blauwe Belgische </w:t>
+        <w:divId w:val="1016224354"/>
+        <w:rPr>
+          <w:lang w:val="nl-NL"/>
+        </w:rPr>
+      </w:pPr>
+      <w:r>
+        <w:rPr>
+          <w:lang w:val="nl-NL"/>
+        </w:rPr>
+        <w:t>Daar wordt hun kind geboren. In Wilrijk, op 15 september 1981. Het is een ander Europa. Er zijn inmiddels tien lidstaten nadat Griekenland op 1 januari van dat jaar is toegetreden, al is de blauwe vlag met de twaalf sterren op dat moment nog enkel het symbool van de Raad van Europa en wordt zij pas in 1985 door de EEG overgenomen.</w:t>
+      </w:r>
+    </w:p>
+    <w:p>
+      <w:pPr>
+        <w:pStyle w:val="Normaalweb"/>
+        <w:divId w:val="1016224354"/>
+        <w:rPr>
+          <w:lang w:val="nl-NL"/>
+        </w:rPr>
+      </w:pPr>
+      <w:r>
+        <w:rPr>
+          <w:lang w:val="nl-NL"/>
+        </w:rPr>
+        <w:t>Het Akkoord van Schengen bestaat nog niet; aan elke grens staan douaneposten en paspoortcontroles, en het Europees Monetair Stelsel van 1979 moet de nationale munten enigszins temmen. De theorie spreekt over Europese eenwording, maar de realiteit bestaat uit stempels en wachtrijen.</w:t>
+      </w:r>
+    </w:p>
+    <w:p>
+      <w:pPr>
+        <w:pStyle w:val="Normaalweb"/>
+        <w:divId w:val="1016224354"/>
+        <w:rPr>
+          <w:lang w:val="nl-NL"/>
+        </w:rPr>
+      </w:pPr>
+      <w:r>
+        <w:rPr>
+          <w:lang w:val="nl-NL"/>
+        </w:rPr>
+        <w:t>Het kind groeit op in Hoboken, in een huis waar uitsluitend Frans wordt gesproken. Maar achter die ene taal liggen drie werelden: de Frans-Lombardische wereld van zijn vader, de Elzassische wereld van zijn moeder, en de Vlaamse wereld waarin hij opgroeit. Het kind draagt die werelden in zich, nog voor het kan lopen.</w:t>
+      </w:r>
+    </w:p>
+    <w:p>
+      <w:pPr>
+        <w:pStyle w:val="Normaalweb"/>
+        <w:divId w:val="1016224354"/>
+        <w:rPr>
+          <w:lang w:val="nl-NL"/>
+        </w:rPr>
+      </w:pPr>
+      <w:r>
+        <w:rPr>
+          <w:lang w:val="nl-NL"/>
+        </w:rPr>
+        <w:t>Zelfs de bestuurlijke grenzen om hem heen muteren vrijwel direct: bij zijn geboorte in 1981 zijn Wilrijk en Hoboken nog zelfstandige gemeenten in de provincie Antwerpen; op 1 januari 1983 worden zij bij de grote gemeentefusie opgeslokt door de Stad Antwerpen en gedegradeerd tot districten, terwijl België zelf tussen 1980 en 1993 stap voor stap muteert naar een federale staat.</w:t>
+      </w:r>
+    </w:p>
+    <w:p>
+      <w:pPr>
+        <w:pStyle w:val="Normaalweb"/>
+        <w:divId w:val="1016224354"/>
+        <w:rPr>
+          <w:lang w:val="nl-NL"/>
+        </w:rPr>
+      </w:pPr>
+      <w:r>
+        <w:rPr>
+          <w:lang w:val="nl-NL"/>
+        </w:rPr>
+        <w:t xml:space="preserve">Toch krijgt het kind dat in Wilrijk wordt geboren op papier geen Belgische nationaliteit. België weigert het geboorterecht: hij wordt geregistreerd als </w:t>
+      </w:r>
+      <w:r>
+        <w:rPr>
+          <w:lang w:val="nl-NL"/>
+        </w:rPr>
+        <w:lastRenderedPageBreak/>
+        <w:t xml:space="preserve">vreemdeling in zijn eigen geboorteland en krijgt een blauwe Belgische </w:t>
       </w:r>
       <w:r>
         <w:rPr>
           <w:rStyle w:val="Nadruk"/>
           <w:lang w:val="nl-NL"/>
         </w:rPr>
-        <w:t>E</w:t>
+        <w:t>EEG-verblijfskaart</w:t>
+      </w:r>
+      <w:r>
+        <w:rPr>
+          <w:lang w:val="nl-NL"/>
+        </w:rPr>
+        <w:t>.</w:t>
+      </w:r>
+    </w:p>
+    <w:p>
+      <w:pPr>
+        <w:pStyle w:val="Normaalweb"/>
+        <w:divId w:val="1016224354"/>
+        <w:rPr>
+          <w:lang w:val="nl-NL"/>
+        </w:rPr>
+      </w:pPr>
+      <w:r>
+        <w:rPr>
+          <w:lang w:val="nl-NL"/>
+        </w:rPr>
+        <w:t>Door het patriarchale afstammingsrecht en het Verdrag van Straatsburg uit 1963 wordt daarop slechts één enkele nationaliteit ingevuld: die van zijn vader (</w:t>
       </w:r>
       <w:r>
         <w:rPr>
           <w:rStyle w:val="Nadruk"/>
           <w:lang w:val="nl-NL"/>
         </w:rPr>
-        <w:t>EG-verblijfskaart</w:t>
-      </w:r>
-      <w:r>
-        <w:rPr>
-          <w:lang w:val="nl-NL"/>
-        </w:rPr>
-        <w:t>. Door het patriarchale afstammingsrecht en het Verdrag van Straatsburg uit 1963 wordt daarop slechts één enkele nationaliteit ingevuld: die van zijn vader (</w:t>
-      </w:r>
-      <w:r>
-        <w:rPr>
-          <w:rStyle w:val="Nadruk"/>
-          <w:lang w:val="nl-NL"/>
-        </w:rPr>
         <w:t>NAT: ITA</w:t>
       </w:r>
       <w:r>
         <w:rPr>
           <w:lang w:val="nl-NL"/>
         </w:rPr>
-        <w:t xml:space="preserve">). Via de consulaten heeft hij daarnaast een Italiaans paspoort en een Franse </w:t>
-      </w:r>
-      <w:r>
-        <w:rPr>
-          <w:lang w:val="nl-NL"/>
-        </w:rPr>
-        <w:lastRenderedPageBreak/>
-        <w:t>consulaire identiteitskaart via zijn moeder, maar geen van beide geldt in België als een binnenlandse Belgische identiteitskaart.</w:t>
+        <w:t>). Via de consulaten heeft hij daarnaast een Italiaans paspoort en een Franse consulaire identiteitskaart via zijn moeder, maar geen van beide geldt in België als een binnenlandse Belgische identiteitskaart.</w:t>
       </w:r>
     </w:p>
     <w:p>
@@ -1385,7 +1498,7 @@
         <w:pStyle w:val="Normaalweb"/>
         <w:spacing w:before="200" w:after="200"/>
         <w:jc w:val="center"/>
-        <w:divId w:val="1351294750"/>
+        <w:divId w:val="1016224354"/>
         <w:rPr>
           <w:lang w:val="nl-NL"/>
         </w:rPr>
@@ -1396,7 +1509,7 @@
           <w:lang w:val="nl-NL"/>
         </w:rPr>
         <w:drawing>
-          <wp:inline distT="0" distB="0" distL="0" distR="0" wp14:anchorId="5A7823FF" wp14:editId="18E5F3BF">
+          <wp:inline distT="0" distB="0" distL="0" distR="0" wp14:anchorId="3A983BEF" wp14:editId="3A8BAFB8">
             <wp:extent cx="5524500" cy="3003550"/>
             <wp:effectExtent l="0" t="0" r="0" b="6350"/>
             <wp:docPr id="2" name="Afbeelding 2"/>
@@ -1448,7 +1561,7 @@
     <w:p>
       <w:pPr>
         <w:pStyle w:val="Normaalweb"/>
-        <w:divId w:val="1351294750"/>
+        <w:divId w:val="1016224354"/>
         <w:rPr>
           <w:lang w:val="nl-NL"/>
         </w:rPr>
@@ -1466,23 +1579,50 @@
         </w:rPr>
         <w:t>**</w:t>
       </w:r>
-      <w:r>
-        <w:rPr>
-          <w:lang w:val="nl-NL"/>
-        </w:rPr>
-        <w:t xml:space="preserve"> De grenzen tussen België en Nederland zijn open, maar nationaliteit is onder het Verdrag van Straatsburg nog steeds een exclusief bezit. Hij kiest voor volledige integratie in het land waar hij is geboren en opgegroeid, en geeft zijn meervoudige papieren oorsprong op. Hij wil Belg zijn. Volkomen. Omdat de dubbele nationaliteit in die jaren nog wettelijk verboden is, betekent dat een harde knip: formeel afstand doen van zijn Italiaanse nationaliteit én afstand doen van zijn Franse nationaliteit. Alles wat</w:t>
-      </w:r>
-      <w:r>
-        <w:rPr>
-          <w:lang w:val="nl-NL"/>
-        </w:rPr>
-        <w:t xml:space="preserve"> hij van thuis heeft meegekregen aan papieren identiteit — van Bondy en Vertova tot Sélestat, Hattstatt en Colmar — moet administratief worden uitgewist om er één terug te krijgen die hij zelf heeft gekozen. Hij is de enige in zijn familie die deze keuze maakt. Zijn zussen behouden hun mix van oorsprongen. Hij niet. Hij kiest vrijwillig en met volle overtuiging voor integratie. Terwijl zijn menselijke kern ongewijzigd al die wortels blijft dragen, staat er vanaf dat moment nog maar één enkel woord op zijn g</w:t>
-      </w:r>
-      <w:r>
-        <w:rPr>
-          <w:lang w:val="nl-NL"/>
-        </w:rPr>
-        <w:t xml:space="preserve">roene Belgische identiteitskaart: </w:t>
+    </w:p>
+    <w:p>
+      <w:pPr>
+        <w:pStyle w:val="Normaalweb"/>
+        <w:divId w:val="1016224354"/>
+        <w:rPr>
+          <w:lang w:val="nl-NL"/>
+        </w:rPr>
+      </w:pPr>
+      <w:r>
+        <w:rPr>
+          <w:lang w:val="nl-NL"/>
+        </w:rPr>
+        <w:t>De grenzen tussen België en Nederland zijn open, maar nationaliteit is onder het Verdrag van Straatsburg nog steeds een exclusief bezit. Hij kiest voor volledige integratie in het land waar hij is geboren en opgegroeid, en geeft zijn meervoudige papieren oorsprong op. Hij wil Belg zijn. Volkomen.</w:t>
+      </w:r>
+    </w:p>
+    <w:p>
+      <w:pPr>
+        <w:pStyle w:val="Normaalweb"/>
+        <w:divId w:val="1016224354"/>
+        <w:rPr>
+          <w:lang w:val="nl-NL"/>
+        </w:rPr>
+      </w:pPr>
+      <w:r>
+        <w:rPr>
+          <w:lang w:val="nl-NL"/>
+        </w:rPr>
+        <w:t>Omdat de dubbele nationaliteit in die jaren nog wettelijk verboden is, betekent dat een harde knip: formeel afstand doen van zijn Italiaanse nationaliteit én afstand doen van zijn Franse nationaliteit. Alles wat hij van thuis heeft meegekregen aan papieren identiteit — van Bondy en Vertova tot Sélestat, Hattstatt en Colmar — moet administratief worden uitgewist om er één terug te krijgen die hij zelf heeft gekozen.</w:t>
+      </w:r>
+    </w:p>
+    <w:p>
+      <w:pPr>
+        <w:pStyle w:val="Normaalweb"/>
+        <w:divId w:val="1016224354"/>
+        <w:rPr>
+          <w:lang w:val="nl-NL"/>
+        </w:rPr>
+      </w:pPr>
+      <w:r>
+        <w:rPr>
+          <w:lang w:val="nl-NL"/>
+        </w:rPr>
+        <w:t xml:space="preserve">Hij is de enige in zijn familie die deze keuze maakt. Zijn zussen behouden hun mix van oorsprongen. Hij niet. Hij kiest vrijwillig en met volle overtuiging voor integratie. Terwijl zijn menselijke kern ongewijzigd al die wortels blijft dragen, staat er vanaf dat moment nog maar één enkel woord op zijn groene Belgische identiteitskaart: </w:t>
       </w:r>
       <w:r>
         <w:rPr>
@@ -1503,7 +1643,7 @@
         <w:pStyle w:val="Normaalweb"/>
         <w:spacing w:before="200" w:after="200"/>
         <w:jc w:val="center"/>
-        <w:divId w:val="1351294750"/>
+        <w:divId w:val="1016224354"/>
         <w:rPr>
           <w:lang w:val="nl-NL"/>
         </w:rPr>
@@ -1515,7 +1655,7 @@
         </w:rPr>
         <w:lastRenderedPageBreak/>
         <w:drawing>
-          <wp:inline distT="0" distB="0" distL="0" distR="0" wp14:anchorId="6CE22F31" wp14:editId="07BFC7F9">
+          <wp:inline distT="0" distB="0" distL="0" distR="0" wp14:anchorId="20BAAE32" wp14:editId="5B04F7A5">
             <wp:extent cx="5524500" cy="2781300"/>
             <wp:effectExtent l="0" t="0" r="0" b="0"/>
             <wp:docPr id="3" name="Afbeelding 3"/>
@@ -1567,7 +1707,7 @@
     <w:p>
       <w:pPr>
         <w:pStyle w:val="Normaalweb"/>
-        <w:divId w:val="1351294750"/>
+        <w:divId w:val="1016224354"/>
         <w:rPr>
           <w:lang w:val="nl-NL"/>
         </w:rPr>
@@ -1589,25 +1729,82 @@
         <w:rPr>
           <w:lang w:val="nl-NL"/>
         </w:rPr>
-        <w:t>. Maar achter datzelfde woord ligt bij haar een stamboom die zich volledig binnen de grenzen van België en Vlaanderen heeft afgespeeld: van haar familiewortels in het West-Vlaamse Snellegem (dat bij de gemeentefusie van 1977 opging in de gemeente Jabbeke) tot haar geboorte in het Oost-Vlaamse Lokeren en haar opgroeien in Buggenhout en Elversele (in 1977 gefuseerd met Temse). Ook in haar familiegeschiedenis zijn dorpen administratief samengevoegd tot grotere gemeenten, maar omdat al die mutaties binnen é</w:t>
-      </w:r>
-      <w:r>
-        <w:rPr>
-          <w:lang w:val="nl-NL"/>
-        </w:rPr>
-        <w:t xml:space="preserve">én en dezelfde lidstaat bleven, viel haar menselijke herkomst altijd naadloos samen met dat ene vakje op haar identiteitskaart; ware zij met een streekgenoot getrouwd, dan was die nationale logica nooit op de proef gesteld. Twee mensen, twee totaal verschillende familiegeschiedenissen, één administratieve nationaliteit. In 2007 trouwen ze in Sint-Niklaas, waarna ze in Waasmunster gaan wonen. De Unie telt inmiddels 27 lidstaten. En amper een jaar na hun huwelijk — op 28 april 2008 — volgt een wrange speling </w:t>
-      </w:r>
-      <w:r>
-        <w:rPr>
-          <w:lang w:val="nl-NL"/>
-        </w:rPr>
-        <w:t>van het recht: België zegt het Verdrag van Straatsburg op en heft het verbod op meervoudige nationaliteit op. Wie voortaan Belg wordt, hoeft zijn Italiaanse of Franse nationaliteit niet langer op te geven. Maar de wet heeft geen terugwerkende kracht; de amputatie die hij in 1999 moest ondergaan om volwaardig burger te worden in zijn geboorteland, wordt nooit meer hersteld. Vier verhuizingen in België, vier keer een nieuw dossier, vier keer een nieuw loket: twee mensen die vanaf nu samen door de bureaucratie</w:t>
-      </w:r>
-      <w:r>
-        <w:rPr>
-          <w:lang w:val="nl-NL"/>
-        </w:rPr>
-        <w:t xml:space="preserve"> moeten.</w:t>
+        <w:t>.</w:t>
+      </w:r>
+    </w:p>
+    <w:p>
+      <w:pPr>
+        <w:pStyle w:val="Normaalweb"/>
+        <w:divId w:val="1016224354"/>
+        <w:rPr>
+          <w:lang w:val="nl-NL"/>
+        </w:rPr>
+      </w:pPr>
+      <w:r>
+        <w:rPr>
+          <w:lang w:val="nl-NL"/>
+        </w:rPr>
+        <w:t>Maar achter datzelfde woord ligt bij haar een stamboom die zich volledig binnen de grenzen van België en Vlaanderen heeft afgespeeld: van haar familiewortels in het West-Vlaamse Snellegem (dat bij de gemeentefusie van 1977 opging in de gemeente Jabbeke) tot haar geboorte in het Oost-Vlaamse Lokeren en haar opgroeien in Buggenhout en Elversele (in 1977 gefuseerd met Temse).</w:t>
+      </w:r>
+    </w:p>
+    <w:p>
+      <w:pPr>
+        <w:pStyle w:val="Normaalweb"/>
+        <w:divId w:val="1016224354"/>
+        <w:rPr>
+          <w:lang w:val="nl-NL"/>
+        </w:rPr>
+      </w:pPr>
+      <w:r>
+        <w:rPr>
+          <w:lang w:val="nl-NL"/>
+        </w:rPr>
+        <w:t>Ook in haar familiegeschiedenis zijn dorpen administratief samengevoegd tot grotere gemeenten, maar omdat al die mutaties binnen één en dezelfde lidstaat bleven, viel haar menselijke herkomst altijd naadloos samen met dat ene vakje op haar identiteitskaart; ware zij met een streekgenoot getrouwd, dan was die nationale logica nooit op de proef gesteld.</w:t>
+      </w:r>
+    </w:p>
+    <w:p>
+      <w:pPr>
+        <w:pStyle w:val="Normaalweb"/>
+        <w:divId w:val="1016224354"/>
+        <w:rPr>
+          <w:lang w:val="nl-NL"/>
+        </w:rPr>
+      </w:pPr>
+      <w:r>
+        <w:rPr>
+          <w:lang w:val="nl-NL"/>
+        </w:rPr>
+        <w:t>Twee mensen, twee totaal verschillende familiegeschiedenissen, één administratieve nationaliteit. In 2007 trouwen ze in Sint-Niklaas, waarna ze in Waasmunster gaan wonen. De Unie telt inmiddels 27 lidstaten.</w:t>
+      </w:r>
+    </w:p>
+    <w:p>
+      <w:pPr>
+        <w:pStyle w:val="Normaalweb"/>
+        <w:divId w:val="1016224354"/>
+        <w:rPr>
+          <w:lang w:val="nl-NL"/>
+        </w:rPr>
+      </w:pPr>
+      <w:r>
+        <w:rPr>
+          <w:lang w:val="nl-NL"/>
+        </w:rPr>
+        <w:t>En amper een jaar na hun huwelijk — op 28 april 2008 — volgt een wrange speling van het recht: België zegt het Verdrag van Straatsburg op en heft het verbod op meervoudige nationaliteit op. Wie voortaan Belg wordt, hoeft zijn Italiaanse of Franse nationaliteit niet langer op te geven. Maar de wet heeft geen terugwerkende kracht; de amputatie die hij in 1999 moest ondergaan om volwaardig burger te worden in zijn geboorteland, wordt nooit meer hersteld.</w:t>
+      </w:r>
+    </w:p>
+    <w:p>
+      <w:pPr>
+        <w:pStyle w:val="Normaalweb"/>
+        <w:divId w:val="1016224354"/>
+        <w:rPr>
+          <w:lang w:val="nl-NL"/>
+        </w:rPr>
+      </w:pPr>
+      <w:r>
+        <w:rPr>
+          <w:lang w:val="nl-NL"/>
+        </w:rPr>
+        <w:t>Vier verhuizingen in België, vier keer een nieuw dossier, vier keer een nieuw loket: twee mensen die vanaf nu samen door de bureaucratie moeten.</w:t>
       </w:r>
     </w:p>
     <w:p>
@@ -1615,7 +1812,7 @@
         <w:pStyle w:val="Normaalweb"/>
         <w:spacing w:before="200" w:after="200"/>
         <w:jc w:val="center"/>
-        <w:divId w:val="1351294750"/>
+        <w:divId w:val="1016224354"/>
         <w:rPr>
           <w:lang w:val="nl-NL"/>
         </w:rPr>
@@ -1627,7 +1824,7 @@
         </w:rPr>
         <w:lastRenderedPageBreak/>
         <w:drawing>
-          <wp:inline distT="0" distB="0" distL="0" distR="0" wp14:anchorId="7DC5C568" wp14:editId="582B6AD3">
+          <wp:inline distT="0" distB="0" distL="0" distR="0" wp14:anchorId="4CA39861" wp14:editId="2811EE16">
             <wp:extent cx="5524500" cy="3778250"/>
             <wp:effectExtent l="0" t="0" r="0" b="0"/>
             <wp:docPr id="4" name="Afbeelding 4"/>
@@ -1679,22 +1876,46 @@
     <w:p>
       <w:pPr>
         <w:pStyle w:val="Normaalweb"/>
-        <w:divId w:val="1351294750"/>
-        <w:rPr>
-          <w:lang w:val="nl-NL"/>
-        </w:rPr>
-      </w:pPr>
-      <w:r>
-        <w:rPr>
-          <w:lang w:val="nl-NL"/>
-        </w:rPr>
-        <w:t>In 2014 steken zij samen de grens over naar Zeeuws-Vlaanderen, in de Nederlandse provincie Zeeland. Ze vestigen zich in het kleine Scheldedorp Paal — historisch onderdeel van de zelfstandige gemeente Graauw en Langendam, die in 1970 werd opgeheven en sinds de gemeentelijke herindeling van 2003 onder de gemeente Hulst valt. Europa telt dan 28 lidstaten. De fysieke grens is opgelost; je rijdt zonder remmen van Waasmunster naar Paal. Maar de administratieve grens is onzichtbaar opgetrokken. Daar begint de eers</w:t>
-      </w:r>
-      <w:r>
-        <w:rPr>
-          <w:lang w:val="nl-NL"/>
-        </w:rPr>
-        <w:t>te wrijving. Hun Belgische rijbewijs is geldig in de hele Europese Unie, het Nederlandse ook. Toch moeten ze het Belgische inleveren. Nederland staat maar één geldig document per persoon toe.</w:t>
+        <w:divId w:val="1016224354"/>
+        <w:rPr>
+          <w:lang w:val="nl-NL"/>
+        </w:rPr>
+      </w:pPr>
+      <w:r>
+        <w:rPr>
+          <w:lang w:val="nl-NL"/>
+        </w:rPr>
+        <w:t>In 2014 steken zij samen de grens over naar Zeeuws-Vlaanderen, in de Nederlandse provincie Zeeland. Ze vestigen zich in het kleine Scheldedorp Paal — historisch onderdeel van de zelfstandige gemeente Graauw en Langendam, die in 1970 werd opgeheven en sinds de gemeentelijke herindeling van 2003 onder de gemeente Hulst valt.</w:t>
+      </w:r>
+    </w:p>
+    <w:p>
+      <w:pPr>
+        <w:pStyle w:val="Normaalweb"/>
+        <w:divId w:val="1016224354"/>
+        <w:rPr>
+          <w:lang w:val="nl-NL"/>
+        </w:rPr>
+      </w:pPr>
+      <w:r>
+        <w:rPr>
+          <w:lang w:val="nl-NL"/>
+        </w:rPr>
+        <w:t>Europa telt dan 28 lidstaten. De fysieke grens is opgelost; je rijdt zonder remmen van Waasmunster naar Paal. Maar de administratieve grens is onzichtbaar opgetrokken. Daar begint de eerste wrijving.</w:t>
+      </w:r>
+    </w:p>
+    <w:p>
+      <w:pPr>
+        <w:pStyle w:val="Normaalweb"/>
+        <w:divId w:val="1016224354"/>
+        <w:rPr>
+          <w:lang w:val="nl-NL"/>
+        </w:rPr>
+      </w:pPr>
+      <w:r>
+        <w:rPr>
+          <w:lang w:val="nl-NL"/>
+        </w:rPr>
+        <w:t>Hun Belgische rijbewijs is geldig in de hele Europese Unie, het Nederlandse ook. Toch moeten ze het Belgische inleveren. Nederland staat maar één geldig document per persoon toe.</w:t>
       </w:r>
       <w:r>
         <w:rPr>
@@ -1707,25 +1928,53 @@
         <w:rPr>
           <w:lang w:val="nl-NL"/>
         </w:rPr>
-        <w:t xml:space="preserve"> Ze geven het af bij de gemeente Hulst en krijgen het nooit terug. Wat ze in de plaats krijgen, is een Nederlands document met exact dezelfde Europese geldigheid. Alleen het land van uitgifte is veranderd. Vanaf dat moment dragen ze de paradox in hun eigen portemonnee. Een Belgische identiteitskaart voor hun identite</w:t>
-      </w:r>
-      <w:r>
-        <w:rPr>
-          <w:lang w:val="nl-NL"/>
-        </w:rPr>
-        <w:t>it. Een Nederlands rijbewijs voor hun mobiliteit, dat in Nederland dient als wettig legitimatiebewijs. In België wordt datzelfde rijbewijs niet als identiteitsbewijs aanvaard; daar geldt uitsluitend de Belgische kaart. Maar wie de elektronische chip van die Belgische eID uitleest, stuit op een nog vreemdere fictie: daarop staat niet hun werkelijke woonadres in Paal geregistreerd, maar het adres van de Belgische ambassade in Den Haag. Volgens hun Belgische kaart horen zij administratief bij de ambassade; vol</w:t>
-      </w:r>
-      <w:r>
-        <w:rPr>
-          <w:lang w:val="nl-NL"/>
-        </w:rPr>
-        <w:t>gens hun Nederlandse rijbewijs staat er hooguit waar het document is afgegeven in Nederland (Gemeente Hulst), maar ontbreekt elke vermelding dat zij Belg zijn. Twee documenten, twee landen, één mens. Hun leven verdeelt zich over twee staten: wonen in het ene, werken en verzekerd zijn in het andere. In theorie horen ze zo bij beide landen en zou hun bestaan zich naadloos over de grens moeten plooien. In de praktijk is het administratieve systeem geprogrammeerd om telkens maar één land tegelijk te lezen. Zodr</w:t>
-      </w:r>
-      <w:r>
-        <w:rPr>
-          <w:lang w:val="nl-NL"/>
-        </w:rPr>
-        <w:t>a de systemen niet met elkaar spreken, word je onleesbaar.</w:t>
+        <w:t xml:space="preserve"> Ze geven het af bij de gemeente Hulst en krijgen het nooit terug. Wat ze in de plaats krijgen, is een Nederlands document met exact dezelfde Europese geldigheid. Alleen het land van uitgifte is veranderd.</w:t>
+      </w:r>
+    </w:p>
+    <w:p>
+      <w:pPr>
+        <w:pStyle w:val="Normaalweb"/>
+        <w:divId w:val="1016224354"/>
+        <w:rPr>
+          <w:lang w:val="nl-NL"/>
+        </w:rPr>
+      </w:pPr>
+      <w:r>
+        <w:rPr>
+          <w:lang w:val="nl-NL"/>
+        </w:rPr>
+        <w:t>Vanaf dat moment dragen ze de paradox in hun eigen portemonnee. Een Belgische identiteitskaart voor hun identiteit. Een Nederlands rijbewijs voor hun mobiliteit, dat in Nederland dient als wettig legitimatiebewijs. In België wordt datzelfde rijbewijs niet als identiteitsbewijs aanvaard; daar geldt uitsluitend de Belgische kaart.</w:t>
+      </w:r>
+    </w:p>
+    <w:p>
+      <w:pPr>
+        <w:pStyle w:val="Normaalweb"/>
+        <w:divId w:val="1016224354"/>
+        <w:rPr>
+          <w:lang w:val="nl-NL"/>
+        </w:rPr>
+      </w:pPr>
+      <w:r>
+        <w:rPr>
+          <w:lang w:val="nl-NL"/>
+        </w:rPr>
+        <w:t>Maar wie de elektronische chip van die Belgische eID uitleest, stuit op een nog vreemdere fictie: daarop staat niet hun werkelijke woonadres in Paal geregistreerd, maar het adres van de Belgische ambassade in Den Haag. Volgens hun Belgische kaart horen zij administratief bij de ambassade; volgens hun Nederlandse rijbewijs staat er hooguit waar het document is afgegeven in Nederland (Gemeente Hulst), maar ontbreekt elke vermelding dat zij Belg zijn.</w:t>
+      </w:r>
+    </w:p>
+    <w:p>
+      <w:pPr>
+        <w:pStyle w:val="Normaalweb"/>
+        <w:divId w:val="1016224354"/>
+        <w:rPr>
+          <w:lang w:val="nl-NL"/>
+        </w:rPr>
+      </w:pPr>
+      <w:r>
+        <w:rPr>
+          <w:lang w:val="nl-NL"/>
+        </w:rPr>
+        <w:lastRenderedPageBreak/>
+        <w:t>Twee documenten, twee landen, één mens. Hun leven verdeelt zich over twee staten: wonen in het ene, werken en verzekerd zijn in het andere. In theorie horen ze zo bij beide landen en zou hun bestaan zich naadloos over de grens moeten plooien. In de praktijk is het administratieve systeem geprogrammeerd om telkens maar één land tegelijk te lezen. Zodra de systemen niet met elkaar spreken, word je onleesbaar.</w:t>
       </w:r>
     </w:p>
     <w:p>
@@ -1733,19 +1982,18 @@
         <w:pStyle w:val="Normaalweb"/>
         <w:spacing w:before="200" w:after="200"/>
         <w:jc w:val="center"/>
-        <w:divId w:val="1351294750"/>
-        <w:rPr>
-          <w:lang w:val="nl-NL"/>
-        </w:rPr>
-      </w:pPr>
-      <w:r>
-        <w:rPr>
-          <w:noProof/>
-          <w:lang w:val="nl-NL"/>
-        </w:rPr>
-        <w:lastRenderedPageBreak/>
+        <w:divId w:val="1016224354"/>
+        <w:rPr>
+          <w:lang w:val="nl-NL"/>
+        </w:rPr>
+      </w:pPr>
+      <w:r>
+        <w:rPr>
+          <w:noProof/>
+          <w:lang w:val="nl-NL"/>
+        </w:rPr>
         <w:drawing>
-          <wp:inline distT="0" distB="0" distL="0" distR="0" wp14:anchorId="6E465BEB" wp14:editId="24E3F5A6">
+          <wp:inline distT="0" distB="0" distL="0" distR="0" wp14:anchorId="63B7B966" wp14:editId="6E0867E6">
             <wp:extent cx="5524500" cy="2781300"/>
             <wp:effectExtent l="0" t="0" r="0" b="0"/>
             <wp:docPr id="5" name="Afbeelding 5"/>
@@ -1797,22 +2045,46 @@
     <w:p>
       <w:pPr>
         <w:pStyle w:val="Normaalweb"/>
-        <w:divId w:val="1351294750"/>
-        <w:rPr>
-          <w:lang w:val="nl-NL"/>
-        </w:rPr>
-      </w:pPr>
-      <w:r>
-        <w:rPr>
-          <w:lang w:val="nl-NL"/>
-        </w:rPr>
-        <w:t>Op 12 december 2016 wordt hun zoon geboren in Wilrijk (Antwerpen) — in exact hetzelfde district waar zijn vader vijfendertig jaar eerder ter wereld kwam. Een kind waarin meer dan vijfendertig Europese, regionale en lokale cellen samenkomen. Hij draagt de West- en Oost-Vlaamse wortels van zijn moeder (van Snellegem en Jabbeke tot Lokeren, Buggenhout en Elversele), de Frans-Lombardische en Elzassische wortels van zijn grootouders (van Bondy en Vertova tot Sélestat, Hattstatt en Colmar), zijn eigen Belgische g</w:t>
-      </w:r>
-      <w:r>
-        <w:rPr>
-          <w:lang w:val="nl-NL"/>
-        </w:rPr>
-        <w:t xml:space="preserve">eboortegrond in Wilrijk én het Zeeuws-Vlaamse polderland van Paal en Hulst waar zijn wieg staat, waar hij opgroeit en vrienden maakt. Terwijl het kind wordt geboren, muteren zelfs de bestuurlijke kaarten van Europa opnieuw: in datzelfde geboortejaar 2016 heft Parijs de Elzas van zijn grootmoeder op als zelfstandige regio om haar onder te brengen in de megaregio </w:t>
+        <w:divId w:val="1016224354"/>
+        <w:rPr>
+          <w:lang w:val="nl-NL"/>
+        </w:rPr>
+      </w:pPr>
+      <w:r>
+        <w:rPr>
+          <w:lang w:val="nl-NL"/>
+        </w:rPr>
+        <w:t>Op 12 december 2016 wordt hun zoon geboren in Wilrijk (Antwerpen) — in exact hetzelfde district waar zijn vader vijfendertig jaar eerder ter wereld kwam. Een kind waarin meer dan vijfendertig Europese, regionale en lokale cellen samenkomen.</w:t>
+      </w:r>
+    </w:p>
+    <w:p>
+      <w:pPr>
+        <w:pStyle w:val="Normaalweb"/>
+        <w:divId w:val="1016224354"/>
+        <w:rPr>
+          <w:lang w:val="nl-NL"/>
+        </w:rPr>
+      </w:pPr>
+      <w:r>
+        <w:rPr>
+          <w:lang w:val="nl-NL"/>
+        </w:rPr>
+        <w:t>Hij draagt de West- en Oost-Vlaamse wortels van zijn moeder (van Snellegem en Jabbeke tot Lokeren, Buggenhout en Elversele), de Frans-Lombardische en Elzassische wortels van zijn grootouders (van Bondy en Vertova tot Sélestat, Hattstatt en Colmar), zijn eigen Belgische geboortegrond in Wilrijk én het Zeeuws-Vlaamse polderland van Paal en Hulst waar zijn wieg staat, waar hij opgroeit en vrienden maakt.</w:t>
+      </w:r>
+    </w:p>
+    <w:p>
+      <w:pPr>
+        <w:pStyle w:val="Normaalweb"/>
+        <w:divId w:val="1016224354"/>
+        <w:rPr>
+          <w:lang w:val="nl-NL"/>
+        </w:rPr>
+      </w:pPr>
+      <w:r>
+        <w:rPr>
+          <w:lang w:val="nl-NL"/>
+        </w:rPr>
+        <w:t xml:space="preserve">Terwijl het kind wordt geboren, muteren zelfs de bestuurlijke kaarten van Europa opnieuw: in datzelfde geboortejaar 2016 heft Parijs de Elzas van zijn grootmoeder op als zelfstandige regio om haar onder te brengen in de megaregio </w:t>
       </w:r>
       <w:r>
         <w:rPr>
@@ -1838,25 +2110,49 @@
         <w:rPr>
           <w:lang w:val="nl-NL"/>
         </w:rPr>
-        <w:t>). Vier werelden in één lichaam. Vier oorsp</w:t>
-      </w:r>
-      <w:r>
-        <w:rPr>
-          <w:lang w:val="nl-NL"/>
-        </w:rPr>
-        <w:t xml:space="preserve">rongen in één kind. Hij steekt elke dag de grens over. Niet voor werk, zoals zijn ouders en grootouders, maar voor school: hij woont in Paal (gemeente Hulst) in Nederland, maar leert lezen en schrijven in Sint-Niklaas, in Oost-Vlaanderen. Op school leert hij de taal van zijn moeder, maar zijn bed staat in Hulst. En daar begint het onvermijdelijke. Voor de Vlamingen is hij een Nederlander, rijdend in een auto met een geel kenteken. Voor de Nederlanders is hij een Vlaming, herkenbaar aan zijn tongval. Op het </w:t>
-      </w:r>
-      <w:r>
-        <w:rPr>
-          <w:lang w:val="nl-NL"/>
-        </w:rPr>
-        <w:t>speelplein steken de andere kinderen hem in het vakje 'Belg'. Niet omdat iemand hem dat gevraagd heeft. Niet omdat hij een keuze heeft gemaakt. Maar omdat de kinderen om hem heen al geleerd hebben dat er vakjes bestaan, en dat alles wat afwijkt, geclassificeerd moet worden. Drie mensen, drie dossiers, twee landen, één gezin.</w:t>
-      </w:r>
-    </w:p>
-    <w:p>
-      <w:pPr>
-        <w:pStyle w:val="Normaalweb"/>
-        <w:divId w:val="1351294750"/>
+        <w:t>). Vier werelden in één lichaam. Vier oorsprongen in één kind.</w:t>
+      </w:r>
+    </w:p>
+    <w:p>
+      <w:pPr>
+        <w:pStyle w:val="Normaalweb"/>
+        <w:divId w:val="1016224354"/>
+        <w:rPr>
+          <w:lang w:val="nl-NL"/>
+        </w:rPr>
+      </w:pPr>
+      <w:r>
+        <w:rPr>
+          <w:lang w:val="nl-NL"/>
+        </w:rPr>
+        <w:t>Hij steekt elke dag de grens over. Niet voor werk, zoals zijn ouders en grootouders, maar voor school: hij woont in Paal (gemeente Hulst) in Nederland, maar leert lezen en schrijven in Sint-Niklaas, in Oost-Vlaanderen. Op school leert hij de taal van zijn moeder, maar zijn bed staat in Hulst.</w:t>
+      </w:r>
+    </w:p>
+    <w:p>
+      <w:pPr>
+        <w:pStyle w:val="Normaalweb"/>
+        <w:divId w:val="1016224354"/>
+        <w:rPr>
+          <w:lang w:val="nl-NL"/>
+        </w:rPr>
+      </w:pPr>
+      <w:r>
+        <w:rPr>
+          <w:lang w:val="nl-NL"/>
+        </w:rPr>
+        <w:t>En daar begint het onvermijdelijke. Voor de Vlamingen is hij een Nederlander, rijdend in een auto met een geel kenteken. Voor de Nederlanders is hij een Vlaming, herkenbaar aan zijn tongval. Op het speelplein steken de andere kinderen hem in het vakje 'Belg'. Niet omdat iemand hem dat gevraagd heeft. Niet omdat hij een keuze heeft gemaakt. Maar omdat de kinderen om hem heen al geleerd hebben dat er vakjes bestaan, en dat alles wat afwijkt, geclassificeerd moet worden. Drie mensen, drie dossiers, twee landen</w:t>
+      </w:r>
+      <w:r>
+        <w:rPr>
+          <w:lang w:val="nl-NL"/>
+        </w:rPr>
+        <w:t>, één gezin.</w:t>
+      </w:r>
+    </w:p>
+    <w:p>
+      <w:pPr>
+        <w:pStyle w:val="Normaalweb"/>
+        <w:divId w:val="1016224354"/>
         <w:rPr>
           <w:lang w:val="nl-NL"/>
         </w:rPr>
@@ -1878,20 +2174,50 @@
         <w:rPr>
           <w:lang w:val="nl-NL"/>
         </w:rPr>
-        <w:t xml:space="preserve">. Daarop staat opnieuw dat ene woord. </w:t>
+        <w:t xml:space="preserve">. Daarop staat opnieuw dat ene woord: </w:t>
       </w:r>
       <w:r>
         <w:rPr>
           <w:rStyle w:val="Zwaar"/>
           <w:lang w:val="nl-NL"/>
         </w:rPr>
-        <w:t>BELG.</w:t>
-      </w:r>
-      <w:r>
-        <w:rPr>
-          <w:lang w:val="nl-NL"/>
-        </w:rPr>
-        <w:t xml:space="preserve"> Meer dan vijfendertig menselijke en historische cellen zijn op papier gewist. En op de chip van die kaart staat niet het huis in Paal waar zijn bed staat, maar opnieuw het adres van de Belgische ambassade in Den Haag. De kleine Europese vlag in de hoek is het enige wat rest van het grotere ideaal. De rest is onzichtbaar gemaakt. Het systeem registreert één dimensie, terwijl het kind er vier draagt.</w:t>
+        <w:t>BELG</w:t>
+      </w:r>
+      <w:r>
+        <w:rPr>
+          <w:lang w:val="nl-NL"/>
+        </w:rPr>
+        <w:t>. Meer dan vijfendertig menselijke en historische cellen zijn op papier gewist.</w:t>
+      </w:r>
+    </w:p>
+    <w:p>
+      <w:pPr>
+        <w:pStyle w:val="Normaalweb"/>
+        <w:divId w:val="1016224354"/>
+        <w:rPr>
+          <w:lang w:val="nl-NL"/>
+        </w:rPr>
+      </w:pPr>
+      <w:r>
+        <w:rPr>
+          <w:lang w:val="nl-NL"/>
+        </w:rPr>
+        <w:t>En op de chip van die kaart staat niet het huis in Paal waar zijn bed staat, maar opnieuw het adres van de Belgische ambassade in Den Haag. De kleine Europese vlag in de hoek is het enige wat rest van het grotere ideaal. De rest is onzichtbaar gemaakt. Het systeem registreert één dimensie, terwijl het kind er vier draagt.</w:t>
+      </w:r>
+    </w:p>
+    <w:p>
+      <w:pPr>
+        <w:pStyle w:val="Normaalweb"/>
+        <w:divId w:val="1016224354"/>
+        <w:rPr>
+          <w:lang w:val="nl-NL"/>
+        </w:rPr>
+      </w:pPr>
+      <w:r>
+        <w:rPr>
+          <w:lang w:val="nl-NL"/>
+        </w:rPr>
+        <w:t>Zo werkt het algoritme van de staat. Het ziet geen gezin. Het ziet geen organisme dat over meerdere landen is gegroeid. Het ziet uitsluitend losse eenheden in losse vakjes in losse landen. Wie niet in het vakje past, valt tussen de regels door.</w:t>
       </w:r>
     </w:p>
     <w:p>
@@ -1899,19 +2225,18 @@
         <w:pStyle w:val="Normaalweb"/>
         <w:spacing w:before="200" w:after="200"/>
         <w:jc w:val="center"/>
-        <w:divId w:val="1351294750"/>
-        <w:rPr>
-          <w:lang w:val="nl-NL"/>
-        </w:rPr>
-      </w:pPr>
-      <w:r>
-        <w:rPr>
-          <w:noProof/>
-          <w:lang w:val="nl-NL"/>
-        </w:rPr>
-        <w:lastRenderedPageBreak/>
+        <w:divId w:val="1016224354"/>
+        <w:rPr>
+          <w:lang w:val="nl-NL"/>
+        </w:rPr>
+      </w:pPr>
+      <w:r>
+        <w:rPr>
+          <w:noProof/>
+          <w:lang w:val="nl-NL"/>
+        </w:rPr>
         <w:drawing>
-          <wp:inline distT="0" distB="0" distL="0" distR="0" wp14:anchorId="0C6607F2" wp14:editId="62D15702">
+          <wp:inline distT="0" distB="0" distL="0" distR="0" wp14:anchorId="17263F6B" wp14:editId="38DB4481">
             <wp:extent cx="5524500" cy="5384800"/>
             <wp:effectExtent l="0" t="0" r="0" b="6350"/>
             <wp:docPr id="6" name="Afbeelding 6"/>
@@ -1963,50 +2288,76 @@
     <w:p>
       <w:pPr>
         <w:pStyle w:val="Normaalweb"/>
-        <w:divId w:val="1351294750"/>
-        <w:rPr>
-          <w:lang w:val="nl-NL"/>
-        </w:rPr>
-      </w:pPr>
-      <w:r>
-        <w:rPr>
-          <w:lang w:val="nl-NL"/>
-        </w:rPr>
-        <w:t>Zo werkt het algoritme van de staat. Het ziet geen gezin. Het ziet geen organisme dat over meerdere landen is gegroeid. Het ziet uitsluitend losse eenheden in losse vakjes in losse landen. Wie niet in het vakje past, valt tussen de regels door.</w:t>
-      </w:r>
-    </w:p>
-    <w:p>
-      <w:pPr>
-        <w:pStyle w:val="Normaalweb"/>
-        <w:divId w:val="1351294750"/>
-        <w:rPr>
-          <w:lang w:val="nl-NL"/>
-        </w:rPr>
-      </w:pPr>
-      <w:r>
-        <w:rPr>
-          <w:lang w:val="nl-NL"/>
-        </w:rPr>
-        <w:t>Het is 2025. De Europese Unie telt 27 lidstaten, na de uittreding van het Verenigd Koninkrijk. De overheden zijn gedigitaliseerd, datastromen verbinden de hoofdsteden en de theorie belooft een frictieloze unie. En het kind uit 1981? Hij is inmiddels vierenveertig. Hij wordt ernstig ziek en belandt in de kliniek. De tol van de suikerziekte is onomkeerbaar: de amputatie van twee tenen en het verlies van zicht in één oog. De Belgische artsen oordelen helder: u bent medisch niet meer rijgeschikt en mag niet mee</w:t>
-      </w:r>
-      <w:r>
-        <w:rPr>
-          <w:lang w:val="nl-NL"/>
-        </w:rPr>
-        <w:t>r rijden. Hij kan en wil dat ook niet meer. Maar dan voltrekt zich een nieuwe administratieve spagaat. België verklaart hem rijongeschikt, maar kan zijn rijbewijs niet intrekken of opeisen — want dat Belgische rijbewijs heeft Nederland in 2014 ingenomen. Tegelijkertijd kan hij zijn Nederlandse rijbewijs in Nederland niet op medische gronden inleveren zonder dat Nederland eerst zijn medische ongeschiktheid erkent. En precies die medische realiteit weigeren de Nederlandse instanties te erkennen, omdat een for</w:t>
-      </w:r>
-      <w:r>
-        <w:rPr>
-          <w:lang w:val="nl-NL"/>
-        </w:rPr>
-        <w:t xml:space="preserve">mele erkenning van zijn fysieke toestand onvermijdelijk zou dwingen tot het toekennen van Nederlandse arbeidsongeschiktheidsrechten </w:t>
-      </w:r>
-      <w:r>
-        <w:rPr>
-          <w:lang w:val="nl-NL"/>
-        </w:rPr>
-        <w:lastRenderedPageBreak/>
-        <w:t>(WIA) en voorzieningen. Het gevolg is een volmaakte bureaucratische patstelling: feitelijk rijdt hij geen meter meer, maar op papier behoudt hij een geldig Nederlands rijbewijs.</w:t>
+        <w:divId w:val="1016224354"/>
+        <w:rPr>
+          <w:lang w:val="nl-NL"/>
+        </w:rPr>
+      </w:pPr>
+      <w:r>
+        <w:rPr>
+          <w:lang w:val="nl-NL"/>
+        </w:rPr>
+        <w:t>Het is 2025. De Europese Unie telt 27 lidstaten, na de uittreding van het Verenigd Koninkrijk. De overheden zijn gedigitaliseerd, datastromen verbinden de hoofdsteden en de theorie belooft een frictieloze unie.</w:t>
+      </w:r>
+    </w:p>
+    <w:p>
+      <w:pPr>
+        <w:pStyle w:val="Normaalweb"/>
+        <w:divId w:val="1016224354"/>
+        <w:rPr>
+          <w:lang w:val="nl-NL"/>
+        </w:rPr>
+      </w:pPr>
+      <w:r>
+        <w:rPr>
+          <w:lang w:val="nl-NL"/>
+        </w:rPr>
+        <w:t>En het kind uit 1981? Hij is inmiddels vierenveertig. Hij wordt ernstig ziek en belandt in de kliniek. De tol van de suikerziekte is onomkeerbaar: de amputatie van twee tenen en het verlies van zicht in één oog.</w:t>
+      </w:r>
+    </w:p>
+    <w:p>
+      <w:pPr>
+        <w:pStyle w:val="Normaalweb"/>
+        <w:divId w:val="1016224354"/>
+        <w:rPr>
+          <w:lang w:val="nl-NL"/>
+        </w:rPr>
+      </w:pPr>
+      <w:r>
+        <w:rPr>
+          <w:lang w:val="nl-NL"/>
+        </w:rPr>
+        <w:t>De Belgische artsen oordelen helder: u bent medisch niet meer rijgeschikt en mag niet meer rijden. Hij kan en wil dat ook niet meer. Maar dan voltrekt zich een nieuwe administratieve spagaat.</w:t>
+      </w:r>
+    </w:p>
+    <w:p>
+      <w:pPr>
+        <w:pStyle w:val="Normaalweb"/>
+        <w:divId w:val="1016224354"/>
+        <w:rPr>
+          <w:lang w:val="nl-NL"/>
+        </w:rPr>
+      </w:pPr>
+      <w:r>
+        <w:rPr>
+          <w:lang w:val="nl-NL"/>
+        </w:rPr>
+        <w:t>België verklaart hem rijongeschikt, maar kan zijn rijbewijs niet intrekken of opeisen — want dat Belgische rijbewijs heeft Nederland in 2014 ingenomen. Tegelijkertijd kan hij zijn Nederlandse rijbewijs in Nederland niet op medische gronden inleveren zonder dat Nederland eerst zijn medische ongeschiktheid erkent.</w:t>
+      </w:r>
+    </w:p>
+    <w:p>
+      <w:pPr>
+        <w:pStyle w:val="Normaalweb"/>
+        <w:divId w:val="1016224354"/>
+        <w:rPr>
+          <w:lang w:val="nl-NL"/>
+        </w:rPr>
+      </w:pPr>
+      <w:r>
+        <w:rPr>
+          <w:lang w:val="nl-NL"/>
+        </w:rPr>
+        <w:t>En precies die medische realiteit weigeren de Nederlandse instanties te erkennen, omdat een formele erkenning van zijn fysieke toestand onvermijdelijk zou dwingen tot het toekennen van Nederlandse arbeidsongeschiktheidsrechten (WIA) en voorzieningen. Het gevolg is een volmaakte bureaucratische patstelling: feitelijk rijdt hij geen meter meer, maar op papier behoudt hij een geldig Nederlands rijbewijs.</w:t>
       </w:r>
       <w:r>
         <w:rPr>
@@ -2015,55 +2366,97 @@
         </w:rPr>
         <w:t>****</w:t>
       </w:r>
-      <w:r>
-        <w:rPr>
-          <w:lang w:val="nl-NL"/>
-        </w:rPr>
-        <w:t xml:space="preserve"> In het land dat zijn medische toestand erkent, bezit hij geen rijbewijs dat kan worden ingetrokken; in het land dat zijn rijbewijs beheert, mag hij op papier nog altijd rijden omdat het systeem weig</w:t>
-      </w:r>
-      <w:r>
-        <w:rPr>
-          <w:lang w:val="nl-NL"/>
-        </w:rPr>
-        <w:t xml:space="preserve">ert zijn medische realiteit te erkennen. En zijn identiteit? Op zijn Belgische identiteitskaart staat nog altijd dat ene woord: </w:t>
+    </w:p>
+    <w:p>
+      <w:pPr>
+        <w:pStyle w:val="Normaalweb"/>
+        <w:divId w:val="1016224354"/>
+        <w:rPr>
+          <w:lang w:val="nl-NL"/>
+        </w:rPr>
+      </w:pPr>
+      <w:r>
+        <w:rPr>
+          <w:lang w:val="nl-NL"/>
+        </w:rPr>
+        <w:t>In het land dat zijn medische toestand erkent, bezit hij geen rijbewijs dat kan worden ingetrokken; in het land dat zijn rijbewijs beheert, mag hij op papier nog altijd rijden omdat het systeem weigert zijn medische realiteit te erkennen.</w:t>
+      </w:r>
+    </w:p>
+    <w:p>
+      <w:pPr>
+        <w:pStyle w:val="Normaalweb"/>
+        <w:divId w:val="1016224354"/>
+        <w:rPr>
+          <w:lang w:val="nl-NL"/>
+        </w:rPr>
+      </w:pPr>
+      <w:r>
+        <w:rPr>
+          <w:lang w:val="nl-NL"/>
+        </w:rPr>
+        <w:t xml:space="preserve">En zijn identiteit? Op zijn Belgische identiteitskaart staat nog altijd dat ene woord: </w:t>
       </w:r>
       <w:r>
         <w:rPr>
           <w:rStyle w:val="Zwaar"/>
           <w:lang w:val="nl-NL"/>
         </w:rPr>
+        <w:t>BELG</w:t>
+      </w:r>
+      <w:r>
+        <w:rPr>
+          <w:lang w:val="nl-NL"/>
+        </w:rPr>
+        <w:t>.</w:t>
+      </w:r>
+    </w:p>
+    <w:p>
+      <w:pPr>
+        <w:pStyle w:val="Normaalweb"/>
+        <w:divId w:val="1016224354"/>
+        <w:rPr>
+          <w:lang w:val="nl-NL"/>
+        </w:rPr>
+      </w:pPr>
+      <w:r>
+        <w:rPr>
+          <w:lang w:val="nl-NL"/>
+        </w:rPr>
+        <w:t>De man die zijn hele leven over grenzen bewoog, die zijn Italiaanse en Franse identiteit vrijwillig opgaf om Belg te worden, maar de wereld van zijn vader en moeder nooit kon uitwissen, zit gevangen tussen twee onvolledige stukjes plastic: een Belgische eID waarvan de chip beweert dat zijn adres de Belgische ambassade is in plaats van zijn werkelijke woning in Paal, en een Nederlands rijbewijs waarop hooguit zijn Nederlandse gemeente van afgifte (Hulst) staat maar geen enkele nationaliteit.</w:t>
+      </w:r>
+    </w:p>
+    <w:p>
+      <w:pPr>
+        <w:pStyle w:val="Normaalweb"/>
+        <w:divId w:val="1016224354"/>
+        <w:rPr>
+          <w:lang w:val="nl-NL"/>
+        </w:rPr>
+      </w:pPr>
+      <w:r>
+        <w:rPr>
+          <w:lang w:val="nl-NL"/>
+        </w:rPr>
+        <w:t xml:space="preserve">En zijn zoon, die vier werelden in zich draagt, staat met exact datzelfde woord en datzelfde ambassade-adres in de database. </w:t>
+      </w:r>
+      <w:r>
+        <w:rPr>
+          <w:rStyle w:val="Zwaar"/>
+          <w:lang w:val="nl-NL"/>
+        </w:rPr>
         <w:t>BELG.</w:t>
       </w:r>
       <w:r>
         <w:rPr>
           <w:lang w:val="nl-NL"/>
         </w:rPr>
-        <w:t xml:space="preserve"> De man die zijn hele leven over grenzen bewoog, die zijn Italiaanse en Franse identiteit vrijwillig opgaf om Belg te worden, maar de wereld van zijn vader en moeder nooit kon uitwissen, zit gevangen tussen twee onvolledige stukjes plastic: een Belgische eID waarvan de chip beweert dat zijn adres de Belgische ambassade is in plaats van zijn werkelijke woning in Paal, en een Ne</w:t>
-      </w:r>
-      <w:r>
-        <w:rPr>
-          <w:lang w:val="nl-NL"/>
-        </w:rPr>
-        <w:t xml:space="preserve">derlands rijbewijs waarop hooguit zijn Nederlandse gemeente van afgifte (Hulst) staat maar geen enkele nationaliteit. En zijn zoon, die vier werelden in zich draagt, staat met exact datzelfde woord en datzelfde ambassade-adres in de database. </w:t>
-      </w:r>
-      <w:r>
-        <w:rPr>
-          <w:rStyle w:val="Zwaar"/>
-          <w:lang w:val="nl-NL"/>
-        </w:rPr>
-        <w:t>BELG.</w:t>
-      </w:r>
-      <w:r>
-        <w:rPr>
-          <w:lang w:val="nl-NL"/>
-        </w:rPr>
         <w:t xml:space="preserve"> Niets meer. Een kleine Europese vlag in de hoek.</w:t>
       </w:r>
     </w:p>
     <w:p>
       <w:pPr>
         <w:pStyle w:val="Normaalweb"/>
-        <w:divId w:val="1351294750"/>
+        <w:divId w:val="1016224354"/>
         <w:rPr>
           <w:lang w:val="nl-NL"/>
         </w:rPr>
@@ -2080,7 +2473,7 @@
         <w:pStyle w:val="Normaalweb"/>
         <w:spacing w:before="200" w:after="200"/>
         <w:jc w:val="center"/>
-        <w:divId w:val="1351294750"/>
+        <w:divId w:val="1016224354"/>
         <w:rPr>
           <w:lang w:val="nl-NL"/>
         </w:rPr>
@@ -2091,7 +2484,7 @@
           <w:lang w:val="nl-NL"/>
         </w:rPr>
         <w:drawing>
-          <wp:inline distT="0" distB="0" distL="0" distR="0" wp14:anchorId="0BE104F5" wp14:editId="6104F957">
+          <wp:inline distT="0" distB="0" distL="0" distR="0" wp14:anchorId="249518A4" wp14:editId="6BDC49BD">
             <wp:extent cx="5524500" cy="4032250"/>
             <wp:effectExtent l="0" t="0" r="0" b="6350"/>
             <wp:docPr id="7" name="Afbeelding 7"/>
@@ -2143,16 +2536,31 @@
     <w:p>
       <w:pPr>
         <w:pStyle w:val="Normaalweb"/>
-        <w:divId w:val="1351294750"/>
-        <w:rPr>
-          <w:lang w:val="nl-NL"/>
-        </w:rPr>
-      </w:pPr>
-      <w:r>
-        <w:rPr>
-          <w:lang w:val="nl-NL"/>
-        </w:rPr>
-        <w:t>Het is nu najaar 2026. Terwijl hij deze audit uittypt, valt er een traan op het toetsenbord. Niet uit zelfmedelijden, maar uit de pure, loden uitputting van een gevecht tegen de leegte. De bittere tragiek is dat Europa de fout inmiddels kent. In april 2026 bereikte de Europese wetgever in Brussel een politiek akkoord over de langverwachte herziening van de oude coördinatieregels; in juli 2026 werd de herziene tekst formeel aangenomen.</w:t>
+        <w:divId w:val="1016224354"/>
+        <w:rPr>
+          <w:lang w:val="nl-NL"/>
+        </w:rPr>
+      </w:pPr>
+      <w:r>
+        <w:rPr>
+          <w:lang w:val="nl-NL"/>
+        </w:rPr>
+        <w:t>Het is nu najaar 2026. Terwijl hij deze audit uittypt, valt er een traan op het toetsenbord. Niet uit zelfmedelijden, maar uit de pure, loden uitputting van een gevecht tegen de leegte.</w:t>
+      </w:r>
+    </w:p>
+    <w:p>
+      <w:pPr>
+        <w:pStyle w:val="Normaalweb"/>
+        <w:divId w:val="1016224354"/>
+        <w:rPr>
+          <w:lang w:val="nl-NL"/>
+        </w:rPr>
+      </w:pPr>
+      <w:r>
+        <w:rPr>
+          <w:lang w:val="nl-NL"/>
+        </w:rPr>
+        <w:t>De bittere tragiek is dat Europa de fout inmiddels kent. In april 2026 bereikte de Europese wetgever in Brussel een politiek akkoord over de langverwachte herziening van de oude coördinatieregels; in juli 2026 werd de herziene tekst formeel aangenomen.</w:t>
       </w:r>
       <w:r>
         <w:rPr>
@@ -2165,20 +2573,28 @@
         <w:rPr>
           <w:lang w:val="nl-NL"/>
         </w:rPr>
-        <w:t xml:space="preserve"> De weeffouten worden erkend, het bevoegdheidsvacuüm is benoemd. Maar de inkt van de politiek stroomt eindeloos veel trager dan het bloed van de burger. De systemen </w:t>
-      </w:r>
-      <w:r>
-        <w:rPr>
-          <w:lang w:val="nl-NL"/>
-        </w:rPr>
-        <w:lastRenderedPageBreak/>
-        <w:t>worden pas omstreeks 2030 daadwerkelijk aangepast. Tot die tijd is de grensarbeider van vlees en bloed de enige overgebleven schokdemper voor de falende systemen van de staat.</w:t>
-      </w:r>
-    </w:p>
-    <w:p>
-      <w:pPr>
-        <w:pStyle w:val="Normaalweb"/>
-        <w:divId w:val="1351294750"/>
+        <w:t xml:space="preserve"> De weeffouten worden erkend, het bevoegdheidsvacuüm is benoemd.</w:t>
+      </w:r>
+    </w:p>
+    <w:p>
+      <w:pPr>
+        <w:pStyle w:val="Normaalweb"/>
+        <w:divId w:val="1016224354"/>
+        <w:rPr>
+          <w:lang w:val="nl-NL"/>
+        </w:rPr>
+      </w:pPr>
+      <w:r>
+        <w:rPr>
+          <w:lang w:val="nl-NL"/>
+        </w:rPr>
+        <w:t>Maar de inkt van de politiek stroomt eindeloos veel trager dan het bloed van de burger. De systemen worden pas omstreeks 2030 daadwerkelijk aangepast. Tot die tijd is de grensarbeider van vlees en bloed de enige overgebleven schokdemper voor de falende systemen van de staat.</w:t>
+      </w:r>
+    </w:p>
+    <w:p>
+      <w:pPr>
+        <w:pStyle w:val="Normaalweb"/>
+        <w:divId w:val="1016224354"/>
         <w:rPr>
           <w:lang w:val="nl-NL"/>
         </w:rPr>
@@ -2193,7 +2609,7 @@
     <w:p>
       <w:pPr>
         <w:pStyle w:val="Normaalweb"/>
-        <w:divId w:val="1351294750"/>
+        <w:divId w:val="1016224354"/>
         <w:rPr>
           <w:lang w:val="nl-NL"/>
         </w:rPr>
@@ -2208,7 +2624,7 @@
     <w:p>
       <w:pPr>
         <w:pStyle w:val="Normaalweb"/>
-        <w:divId w:val="1351294750"/>
+        <w:divId w:val="1016224354"/>
         <w:rPr>
           <w:lang w:val="nl-NL"/>
         </w:rPr>
@@ -2223,7 +2639,7 @@
     <w:p>
       <w:pPr>
         <w:spacing w:before="300" w:after="200"/>
-        <w:divId w:val="1351294750"/>
+        <w:divId w:val="1016224354"/>
         <w:rPr>
           <w:rFonts w:eastAsia="Times New Roman"/>
           <w:lang w:val="nl-NL"/>
@@ -2234,14 +2650,14 @@
           <w:rFonts w:eastAsia="Times New Roman"/>
           <w:lang w:val="nl-NL"/>
         </w:rPr>
-        <w:pict w14:anchorId="40B9CE81">
+        <w:pict w14:anchorId="38245D22">
           <v:rect id="_x0000_i1032" style="width:0;height:1.5pt" o:hralign="center" o:hrstd="t" o:hr="t" fillcolor="#a0a0a0" stroked="f"/>
         </w:pict>
       </w:r>
     </w:p>
     <w:p>
       <w:pPr>
-        <w:divId w:val="160589473"/>
+        <w:divId w:val="990795831"/>
         <w:rPr>
           <w:color w:val="555555"/>
           <w:sz w:val="20"/>
@@ -2280,7 +2696,7 @@
     </w:p>
     <w:p>
       <w:pPr>
-        <w:divId w:val="160589473"/>
+        <w:divId w:val="990795831"/>
         <w:rPr>
           <w:color w:val="555555"/>
           <w:sz w:val="20"/>
@@ -2310,7 +2726,7 @@
     </w:p>
     <w:p>
       <w:pPr>
-        <w:divId w:val="160589473"/>
+        <w:divId w:val="990795831"/>
         <w:rPr>
           <w:color w:val="555555"/>
           <w:sz w:val="20"/>
@@ -2340,7 +2756,7 @@
     </w:p>
     <w:p>
       <w:pPr>
-        <w:divId w:val="160589473"/>
+        <w:divId w:val="990795831"/>
         <w:rPr>
           <w:color w:val="555555"/>
           <w:sz w:val="20"/>
@@ -2391,7 +2807,7 @@
     <w:p>
       <w:pPr>
         <w:ind w:left="800" w:right="800"/>
-        <w:divId w:val="160589473"/>
+        <w:divId w:val="990795831"/>
         <w:rPr>
           <w:color w:val="555555"/>
           <w:sz w:val="20"/>
@@ -2425,13 +2841,13 @@
     <w:p>
       <w:pPr>
         <w:pStyle w:val="Kop2"/>
-        <w:divId w:val="1351294750"/>
+        <w:divId w:val="1016224354"/>
         <w:rPr>
           <w:rFonts w:eastAsia="Times New Roman"/>
           <w:lang w:val="nl-NL"/>
         </w:rPr>
       </w:pPr>
-      <w:bookmarkStart w:id="2" w:name="_Toc244299536"/>
+      <w:bookmarkStart w:id="2" w:name="_Toc244322239"/>
       <w:r>
         <w:rPr>
           <w:rFonts w:eastAsia="Times New Roman"/>
@@ -2444,7 +2860,7 @@
     <w:p>
       <w:pPr>
         <w:pStyle w:val="Normaalweb"/>
-        <w:divId w:val="1351294750"/>
+        <w:divId w:val="1016224354"/>
         <w:rPr>
           <w:lang w:val="nl-NL"/>
         </w:rPr>
@@ -2459,7 +2875,7 @@
     <w:p>
       <w:pPr>
         <w:pStyle w:val="Normaalweb"/>
-        <w:divId w:val="1351294750"/>
+        <w:divId w:val="1016224354"/>
         <w:rPr>
           <w:lang w:val="nl-NL"/>
         </w:rPr>
@@ -2474,7 +2890,7 @@
     <w:p>
       <w:pPr>
         <w:pStyle w:val="Normaalweb"/>
-        <w:divId w:val="1351294750"/>
+        <w:divId w:val="1016224354"/>
         <w:rPr>
           <w:lang w:val="nl-NL"/>
         </w:rPr>
@@ -2489,13 +2905,13 @@
     <w:p>
       <w:pPr>
         <w:pStyle w:val="Kop2"/>
-        <w:divId w:val="1351294750"/>
+        <w:divId w:val="1016224354"/>
         <w:rPr>
           <w:rFonts w:eastAsia="Times New Roman"/>
           <w:lang w:val="nl-NL"/>
         </w:rPr>
       </w:pPr>
-      <w:bookmarkStart w:id="3" w:name="_Toc244299537"/>
+      <w:bookmarkStart w:id="3" w:name="_Toc244322240"/>
       <w:r>
         <w:rPr>
           <w:rFonts w:eastAsia="Times New Roman"/>
@@ -2508,7 +2924,7 @@
     <w:p>
       <w:pPr>
         <w:pStyle w:val="Normaalweb"/>
-        <w:divId w:val="1351294750"/>
+        <w:divId w:val="1016224354"/>
         <w:rPr>
           <w:lang w:val="nl-NL"/>
         </w:rPr>
@@ -2523,13 +2939,13 @@
     <w:p>
       <w:pPr>
         <w:pStyle w:val="Kop2"/>
-        <w:divId w:val="1351294750"/>
+        <w:divId w:val="1016224354"/>
         <w:rPr>
           <w:rFonts w:eastAsia="Times New Roman"/>
           <w:lang w:val="nl-NL"/>
         </w:rPr>
       </w:pPr>
-      <w:bookmarkStart w:id="4" w:name="_Toc244299538"/>
+      <w:bookmarkStart w:id="4" w:name="_Toc244322241"/>
       <w:r>
         <w:rPr>
           <w:rFonts w:eastAsia="Times New Roman"/>
@@ -2542,7 +2958,7 @@
     <w:p>
       <w:pPr>
         <w:pStyle w:val="Normaalweb"/>
-        <w:divId w:val="1351294750"/>
+        <w:divId w:val="1016224354"/>
         <w:rPr>
           <w:lang w:val="nl-NL"/>
         </w:rPr>
@@ -2557,13 +2973,13 @@
     <w:p>
       <w:pPr>
         <w:pStyle w:val="Kop3"/>
-        <w:divId w:val="1351294750"/>
+        <w:divId w:val="1016224354"/>
         <w:rPr>
           <w:rFonts w:eastAsia="Times New Roman"/>
           <w:lang w:val="nl-NL"/>
         </w:rPr>
       </w:pPr>
-      <w:bookmarkStart w:id="5" w:name="_Toc244299539"/>
+      <w:bookmarkStart w:id="5" w:name="_Toc244322242"/>
       <w:r>
         <w:rPr>
           <w:rFonts w:eastAsia="Times New Roman"/>
@@ -2576,7 +2992,7 @@
     <w:p>
       <w:pPr>
         <w:pStyle w:val="Normaalweb"/>
-        <w:divId w:val="1351294750"/>
+        <w:divId w:val="1016224354"/>
         <w:rPr>
           <w:lang w:val="nl-NL"/>
         </w:rPr>
@@ -2591,13 +3007,13 @@
     <w:p>
       <w:pPr>
         <w:pStyle w:val="Kop3"/>
-        <w:divId w:val="1351294750"/>
+        <w:divId w:val="1016224354"/>
         <w:rPr>
           <w:rFonts w:eastAsia="Times New Roman"/>
           <w:lang w:val="nl-NL"/>
         </w:rPr>
       </w:pPr>
-      <w:bookmarkStart w:id="6" w:name="_Toc244299540"/>
+      <w:bookmarkStart w:id="6" w:name="_Toc244322243"/>
       <w:r>
         <w:rPr>
           <w:rFonts w:eastAsia="Times New Roman"/>
@@ -2610,7 +3026,7 @@
     <w:p>
       <w:pPr>
         <w:pStyle w:val="Normaalweb"/>
-        <w:divId w:val="1351294750"/>
+        <w:divId w:val="1016224354"/>
         <w:rPr>
           <w:lang w:val="nl-NL"/>
         </w:rPr>
@@ -2625,13 +3041,13 @@
     <w:p>
       <w:pPr>
         <w:pStyle w:val="Kop3"/>
-        <w:divId w:val="1351294750"/>
+        <w:divId w:val="1016224354"/>
         <w:rPr>
           <w:rFonts w:eastAsia="Times New Roman"/>
           <w:lang w:val="nl-NL"/>
         </w:rPr>
       </w:pPr>
-      <w:bookmarkStart w:id="7" w:name="_Toc244299541"/>
+      <w:bookmarkStart w:id="7" w:name="_Toc244322244"/>
       <w:r>
         <w:rPr>
           <w:rFonts w:eastAsia="Times New Roman"/>
@@ -2644,7 +3060,7 @@
     <w:p>
       <w:pPr>
         <w:pStyle w:val="Normaalweb"/>
-        <w:divId w:val="1351294750"/>
+        <w:divId w:val="1016224354"/>
         <w:rPr>
           <w:lang w:val="nl-NL"/>
         </w:rPr>
@@ -2659,13 +3075,13 @@
     <w:p>
       <w:pPr>
         <w:pStyle w:val="Kop3"/>
-        <w:divId w:val="1351294750"/>
+        <w:divId w:val="1016224354"/>
         <w:rPr>
           <w:rFonts w:eastAsia="Times New Roman"/>
           <w:lang w:val="nl-NL"/>
         </w:rPr>
       </w:pPr>
-      <w:bookmarkStart w:id="8" w:name="_Toc244299542"/>
+      <w:bookmarkStart w:id="8" w:name="_Toc244322245"/>
       <w:r>
         <w:rPr>
           <w:rFonts w:eastAsia="Times New Roman"/>
@@ -2678,7 +3094,7 @@
     <w:p>
       <w:pPr>
         <w:pStyle w:val="Normaalweb"/>
-        <w:divId w:val="1351294750"/>
+        <w:divId w:val="1016224354"/>
         <w:rPr>
           <w:lang w:val="nl-NL"/>
         </w:rPr>
@@ -2693,13 +3109,13 @@
     <w:p>
       <w:pPr>
         <w:pStyle w:val="Kop3"/>
-        <w:divId w:val="1351294750"/>
+        <w:divId w:val="1016224354"/>
         <w:rPr>
           <w:rFonts w:eastAsia="Times New Roman"/>
           <w:lang w:val="nl-NL"/>
         </w:rPr>
       </w:pPr>
-      <w:bookmarkStart w:id="9" w:name="_Toc244299543"/>
+      <w:bookmarkStart w:id="9" w:name="_Toc244322246"/>
       <w:r>
         <w:rPr>
           <w:rFonts w:eastAsia="Times New Roman"/>
@@ -2712,7 +3128,7 @@
     <w:p>
       <w:pPr>
         <w:pStyle w:val="Normaalweb"/>
-        <w:divId w:val="1351294750"/>
+        <w:divId w:val="1016224354"/>
         <w:rPr>
           <w:lang w:val="nl-NL"/>
         </w:rPr>
@@ -2727,13 +3143,13 @@
     <w:p>
       <w:pPr>
         <w:pStyle w:val="Kop3"/>
-        <w:divId w:val="1351294750"/>
+        <w:divId w:val="1016224354"/>
         <w:rPr>
           <w:rFonts w:eastAsia="Times New Roman"/>
           <w:lang w:val="nl-NL"/>
         </w:rPr>
       </w:pPr>
-      <w:bookmarkStart w:id="10" w:name="_Toc244299544"/>
+      <w:bookmarkStart w:id="10" w:name="_Toc244322247"/>
       <w:r>
         <w:rPr>
           <w:rFonts w:eastAsia="Times New Roman"/>
@@ -2746,7 +3162,7 @@
     <w:p>
       <w:pPr>
         <w:pStyle w:val="Normaalweb"/>
-        <w:divId w:val="1351294750"/>
+        <w:divId w:val="1016224354"/>
         <w:rPr>
           <w:lang w:val="nl-NL"/>
         </w:rPr>
@@ -2761,13 +3177,13 @@
     <w:p>
       <w:pPr>
         <w:pStyle w:val="Kop2"/>
-        <w:divId w:val="1351294750"/>
+        <w:divId w:val="1016224354"/>
         <w:rPr>
           <w:rFonts w:eastAsia="Times New Roman"/>
           <w:lang w:val="nl-NL"/>
         </w:rPr>
       </w:pPr>
-      <w:bookmarkStart w:id="11" w:name="_Toc244299545"/>
+      <w:bookmarkStart w:id="11" w:name="_Toc244322248"/>
       <w:r>
         <w:rPr>
           <w:rFonts w:eastAsia="Times New Roman"/>
@@ -2780,7 +3196,7 @@
     <w:p>
       <w:pPr>
         <w:pStyle w:val="Normaalweb"/>
-        <w:divId w:val="1351294750"/>
+        <w:divId w:val="1016224354"/>
         <w:rPr>
           <w:lang w:val="nl-NL"/>
         </w:rPr>
@@ -2795,7 +3211,7 @@
     <w:p>
       <w:pPr>
         <w:pStyle w:val="Normaalweb"/>
-        <w:divId w:val="1351294750"/>
+        <w:divId w:val="1016224354"/>
         <w:rPr>
           <w:lang w:val="nl-NL"/>
         </w:rPr>
@@ -2810,7 +3226,7 @@
     <w:p>
       <w:pPr>
         <w:pStyle w:val="Normaalweb"/>
-        <w:divId w:val="1351294750"/>
+        <w:divId w:val="1016224354"/>
         <w:rPr>
           <w:lang w:val="nl-NL"/>
         </w:rPr>
@@ -2825,13 +3241,13 @@
     <w:p>
       <w:pPr>
         <w:pStyle w:val="Kop2"/>
-        <w:divId w:val="1351294750"/>
+        <w:divId w:val="1016224354"/>
         <w:rPr>
           <w:rFonts w:eastAsia="Times New Roman"/>
           <w:lang w:val="nl-NL"/>
         </w:rPr>
       </w:pPr>
-      <w:bookmarkStart w:id="12" w:name="_Toc244299546"/>
+      <w:bookmarkStart w:id="12" w:name="_Toc244322249"/>
       <w:r>
         <w:rPr>
           <w:rFonts w:eastAsia="Times New Roman"/>
@@ -2844,7 +3260,7 @@
     <w:p>
       <w:pPr>
         <w:pStyle w:val="Normaalweb"/>
-        <w:divId w:val="1351294750"/>
+        <w:divId w:val="1016224354"/>
         <w:rPr>
           <w:lang w:val="nl-NL"/>
         </w:rPr>
@@ -2859,7 +3275,7 @@
     <w:p>
       <w:pPr>
         <w:pStyle w:val="Normaalweb"/>
-        <w:divId w:val="1351294750"/>
+        <w:divId w:val="1016224354"/>
         <w:rPr>
           <w:lang w:val="nl-NL"/>
         </w:rPr>
@@ -2874,13 +3290,13 @@
     <w:p>
       <w:pPr>
         <w:pStyle w:val="Kop2"/>
-        <w:divId w:val="1351294750"/>
+        <w:divId w:val="1016224354"/>
         <w:rPr>
           <w:rFonts w:eastAsia="Times New Roman"/>
           <w:lang w:val="nl-NL"/>
         </w:rPr>
       </w:pPr>
-      <w:bookmarkStart w:id="13" w:name="_Toc244299547"/>
+      <w:bookmarkStart w:id="13" w:name="_Toc244322250"/>
       <w:r>
         <w:rPr>
           <w:rFonts w:eastAsia="Times New Roman"/>
@@ -2893,7 +3309,7 @@
     <w:p>
       <w:pPr>
         <w:pStyle w:val="Normaalweb"/>
-        <w:divId w:val="1351294750"/>
+        <w:divId w:val="1016224354"/>
         <w:rPr>
           <w:lang w:val="nl-NL"/>
         </w:rPr>
@@ -2908,7 +3324,7 @@
     <w:p>
       <w:pPr>
         <w:pStyle w:val="Normaalweb"/>
-        <w:divId w:val="1351294750"/>
+        <w:divId w:val="1016224354"/>
         <w:rPr>
           <w:lang w:val="nl-NL"/>
         </w:rPr>
@@ -2923,7 +3339,7 @@
     <w:p>
       <w:pPr>
         <w:shd w:val="clear" w:color="auto" w:fill="FFFFFF"/>
-        <w:divId w:val="1640110304"/>
+        <w:divId w:val="1737128013"/>
         <w:rPr>
           <w:szCs w:val="22"/>
           <w:lang w:val="nl-NL"/>
@@ -3099,7 +3515,7 @@
         <w:color w:val="808080"/>
         <w:sz w:val="18"/>
       </w:rPr>
-      <w:t>11</w:t>
+      <w:t>6</w:t>
     </w:r>
     <w:r>
       <w:rPr>
@@ -3191,7 +3607,7 @@
         <w:sz w:val="18"/>
       </w:rPr>
       <w:tab/>
-      <w:t>Laatst gewijzigd: 31 oktober 2026, 00:36</w:t>
+      <w:t>Laatst gewijzigd: 31 oktober 2026, 06:55</w:t>
     </w:r>
   </w:p>
 </w:hdr>
@@ -3838,7 +4254,7 @@
     <w:name w:val="msonormal"/>
     <w:basedOn w:val="Standaard"/>
     <w:pPr>
-      <w:spacing w:after="160"/>
+      <w:spacing w:after="240"/>
     </w:pPr>
   </w:style>
   <w:style w:type="paragraph" w:styleId="Normaalweb">
@@ -3848,7 +4264,7 @@
     <w:semiHidden/>
     <w:unhideWhenUsed/>
     <w:pPr>
-      <w:spacing w:after="160"/>
+      <w:spacing w:after="240"/>
     </w:pPr>
   </w:style>
   <w:style w:type="paragraph" w:customStyle="1" w:styleId="marker">
@@ -4850,8 +5266,9 @@
       <w:b/>
       <w:bCs/>
       <w:caps/>
-      <w:sz w:val="12"/>
-      <w:szCs w:val="12"/>
+      <w:spacing w:val="-3"/>
+      <w:sz w:val="11"/>
+      <w:szCs w:val="11"/>
     </w:rPr>
   </w:style>
   <w:style w:type="paragraph" w:customStyle="1" w:styleId="d0-rc-chip">
@@ -5203,7 +5620,7 @@
     <w:name w:val="datum1"/>
     <w:basedOn w:val="Standaard"/>
     <w:pPr>
-      <w:spacing w:after="160"/>
+      <w:spacing w:after="240"/>
     </w:pPr>
     <w:rPr>
       <w:b/>
@@ -5215,7 +5632,7 @@
     <w:name w:val="datum2"/>
     <w:basedOn w:val="Standaard"/>
     <w:pPr>
-      <w:spacing w:after="160"/>
+      <w:spacing w:after="240"/>
     </w:pPr>
     <w:rPr>
       <w:b/>
@@ -5277,7 +5694,7 @@
     <w:name w:val="d0-fb-img1"/>
     <w:basedOn w:val="Standaard"/>
     <w:pPr>
-      <w:spacing w:after="160"/>
+      <w:spacing w:after="240"/>
     </w:pPr>
   </w:style>
   <w:style w:type="paragraph" w:customStyle="1" w:styleId="d0-eu-corner1">
@@ -5285,21 +5702,21 @@
     <w:basedOn w:val="Standaard"/>
     <w:pPr>
       <w:shd w:val="clear" w:color="auto" w:fill="003399"/>
-      <w:spacing w:after="160"/>
+      <w:spacing w:after="240"/>
     </w:pPr>
   </w:style>
   <w:style w:type="paragraph" w:customStyle="1" w:styleId="d0-eu-stars1">
     <w:name w:val="d0-eu-stars1"/>
     <w:basedOn w:val="Standaard"/>
     <w:pPr>
-      <w:spacing w:after="160"/>
+      <w:spacing w:after="240"/>
     </w:pPr>
   </w:style>
   <w:style w:type="paragraph" w:customStyle="1" w:styleId="d0-eu-code1">
     <w:name w:val="d0-eu-code1"/>
     <w:basedOn w:val="Standaard"/>
     <w:pPr>
-      <w:spacing w:after="160"/>
+      <w:spacing w:after="240"/>
     </w:pPr>
     <w:rPr>
       <w:b/>
@@ -5345,7 +5762,7 @@
     <w:name w:val="datum3"/>
     <w:basedOn w:val="Standaard"/>
     <w:pPr>
-      <w:spacing w:after="160"/>
+      <w:spacing w:after="240"/>
     </w:pPr>
     <w:rPr>
       <w:b/>
@@ -5357,7 +5774,7 @@
     <w:name w:val="datum4"/>
     <w:basedOn w:val="Standaard"/>
     <w:pPr>
-      <w:spacing w:after="160"/>
+      <w:spacing w:after="240"/>
     </w:pPr>
     <w:rPr>
       <w:b/>
@@ -5419,7 +5836,7 @@
     <w:name w:val="d0-fb-img2"/>
     <w:basedOn w:val="Standaard"/>
     <w:pPr>
-      <w:spacing w:after="160"/>
+      <w:spacing w:after="240"/>
     </w:pPr>
   </w:style>
   <w:style w:type="paragraph" w:customStyle="1" w:styleId="d0-eu-corner2">
@@ -5427,21 +5844,21 @@
     <w:basedOn w:val="Standaard"/>
     <w:pPr>
       <w:shd w:val="clear" w:color="auto" w:fill="003399"/>
-      <w:spacing w:after="160"/>
+      <w:spacing w:after="240"/>
     </w:pPr>
   </w:style>
   <w:style w:type="paragraph" w:customStyle="1" w:styleId="d0-eu-stars2">
     <w:name w:val="d0-eu-stars2"/>
     <w:basedOn w:val="Standaard"/>
     <w:pPr>
-      <w:spacing w:after="160"/>
+      <w:spacing w:after="240"/>
     </w:pPr>
   </w:style>
   <w:style w:type="paragraph" w:customStyle="1" w:styleId="d0-eu-code2">
     <w:name w:val="d0-eu-code2"/>
     <w:basedOn w:val="Standaard"/>
     <w:pPr>
-      <w:spacing w:after="160"/>
+      <w:spacing w:after="240"/>
     </w:pPr>
     <w:rPr>
       <w:b/>
@@ -5499,7 +5916,7 @@
     <w:link w:val="KoptekstChar"/>
     <w:uiPriority w:val="99"/>
     <w:unhideWhenUsed/>
-    <w:rsid w:val="004E09BE"/>
+    <w:rsid w:val="003D5603"/>
     <w:pPr>
       <w:tabs>
         <w:tab w:val="center" w:pos="4536"/>
@@ -5512,7 +5929,7 @@
     <w:basedOn w:val="Standaardalinea-lettertype"/>
     <w:link w:val="Koptekst"/>
     <w:uiPriority w:val="99"/>
-    <w:rsid w:val="004E09BE"/>
+    <w:rsid w:val="003D5603"/>
     <w:rPr>
       <w:rFonts w:eastAsiaTheme="minorEastAsia"/>
       <w:sz w:val="24"/>
@@ -5525,7 +5942,7 @@
     <w:link w:val="VoettekstChar"/>
     <w:uiPriority w:val="99"/>
     <w:unhideWhenUsed/>
-    <w:rsid w:val="004E09BE"/>
+    <w:rsid w:val="003D5603"/>
     <w:pPr>
       <w:tabs>
         <w:tab w:val="center" w:pos="4536"/>
@@ -5538,7 +5955,7 @@
     <w:basedOn w:val="Standaardalinea-lettertype"/>
     <w:link w:val="Voettekst"/>
     <w:uiPriority w:val="99"/>
-    <w:rsid w:val="004E09BE"/>
+    <w:rsid w:val="003D5603"/>
     <w:rPr>
       <w:rFonts w:eastAsiaTheme="minorEastAsia"/>
       <w:sz w:val="24"/>
@@ -5553,7 +5970,7 @@
     <w:uiPriority w:val="39"/>
     <w:semiHidden/>
     <w:unhideWhenUsed/>
-    <w:rsid w:val="004E09BE"/>
+    <w:rsid w:val="003D5603"/>
     <w:pPr>
       <w:spacing w:after="30"/>
     </w:pPr>
@@ -5568,7 +5985,7 @@
     <w:autoRedefine/>
     <w:uiPriority w:val="39"/>
     <w:unhideWhenUsed/>
-    <w:rsid w:val="004E09BE"/>
+    <w:rsid w:val="003D5603"/>
     <w:pPr>
       <w:spacing w:after="30"/>
       <w:ind w:left="220"/>
@@ -5584,7 +6001,7 @@
     <w:autoRedefine/>
     <w:uiPriority w:val="39"/>
     <w:unhideWhenUsed/>
-    <w:rsid w:val="004E09BE"/>
+    <w:rsid w:val="003D5603"/>
     <w:pPr>
       <w:spacing w:after="30"/>
       <w:ind w:left="440"/>

</xml_diff>